<commit_message>
Regenerate Word export after splitting Adiyat Yasin and 12-rak'ah
Co-Authored-By: Claude Sonnet 5 <noreply@anthropic.com>
Claude-Session: https://claude.ai/code/session_015v8MN6VZjbnhmn7ju2JYhZ
</commit_message>
<xml_diff>
--- a/خزانة الأدعية.docx
+++ b/خزانة الأدعية.docx
@@ -1705,7 +1705,7 @@
           <w:szCs w:val="24"/>
           <w:rtl/>
         </w:rPr>
-        <w:t xml:space="preserve">عِدّية يس (قراءة سورة يس مع تكرار آيات وأدعية بينية، لقضاء الحاجة والحماية من الحسد والكفاية من الناس): 1. تُقرأ الآية الأولى «يس ۚ وَالْقُرْآنِ الْحَكِيمِ» (7 مرات)، ثم تُكمل قراءة السورة عاديًا حتى نهاية الآية 8. 2. بعد الآية 8، تُدعى: «اللهم بيمن نوره وسره في خلقه وسره في الجسد، أخفِ عني أعين الناظرين وقلوب الحاسدين والباغين، واحفظني كما حفظت الروح في الجسد، إنك على كل شيء قدير» 3. تُقرأ الآية 9 «سَوَاءٌ عَلَيْهِمْ أَأَنذَرْتَهُمْ أَمْ لَمْ تُنذِرْهُمْ لَا يُؤْمِنُونَ» (3 مرات)، ثم تُكمل القراءة حتى نهاية الآية 27. 4. بعد الآية 27، تُدعى: «اللهم أكرمني بقضاء حاجتي» (وتُسمّى الحاجة) «واكرمني بطاعتك يا ذا الجلال والإكرام» — يُكرر هذا الدعاء 3 مرات. 5. تُكمل القراءة حتى نهاية الآية 37، ثم تُردد هذه الآية «وَآيَةٌ لَّهُمُ اللَّيْلُ نَسْلَخُ مِنْهُ النَّهَارَ...» (14 مرة)، ثم تُدعى: «اللهم إني أسألك من فضلك الواسع وجودك السابغ أن تُغنيني عن جميع خلقك بالله» — يُكرر 3 مرات. 6. تُكمل القراءة حتى نهاية الآية 57، ثم تُردد هذه الآية «سَلَامٌ قَوْلًا مِّن رَّبٍّ رَّحِيمٍ» (16 مرة)، ثم تُدعى: «اللهم سلّمنا من آفات الدنيا وفتنها يا رب العالمين» 7. تُكمل قراءة باقي السورة حتى الآية 83 (آخرها). 8. يُختم بالدعاء التالي: «سبحان المنفّس عن كل مهموم، سبحان العليم بما كان وما يكون، سبحان من إذا أراد شيئًا قال له كن فيكون، سبحان الذي بيده ملكوت كل شيء وإليه تُرجعون، يا صمد يا إلهي، يا صمد معتمدي، اقضِ حاجتي» (وتُذكر الحاجة) «... بحق يس، ومن أنزلها، ومن نزلت عليه، ومن نزلت به»</w:t>
+        <w:t xml:space="preserve">دعاء سورة يس: «بسم الله الرحمن الرحيم، اللهم صلِّ وسلم وبارك على سيدنا محمد بقدر حبك فيه، وبجاهه فرِّج عني ما أنا فيه» (7 مرات)، «وبسر يس والقرآن الكريم ... يا مفرِّج، يا مفرِّج، يا مفرِّج، يا مفرِّج، يا مفرِّج، فرِّج عني ما أنا فيه»، «سبحان مجري الماء في العيون، سبحان العالم لكل مكنون ومخزون، سبحان من جعل خزائنه بين الكاف والنون»، «اللهم إني أسألك وأتوجه إليك بحبيبك ونبيك ورسولك سيدنا محمد صلى الله عليه وسلم أن تسخّر لي قلب من أحوجتني إليه، وأن تكفيني شر من يقدر علي ولا أقدر عليه ... أسألك اللهم بحرمة القرآن الكريم وبالسر الذي أودعته في سورة يس وبحق من أنزلها أن تسخّر لي قلوب عبادك الصالحين يقضوا لي بأمرك جميع المطالب، واجعلني في كل شدة وفي كل أمر أنا الغالب، ومنّ علي يا سيدي بالإجابة»</w:t>
       </w:r>
     </w:p>
     <w:p>
@@ -1739,7 +1739,7 @@
           <w:szCs w:val="24"/>
           <w:rtl/>
         </w:rPr>
-        <w:t xml:space="preserve">دعاء سورة يس: «بسم الله الرحمن الرحيم، اللهم صلِّ وسلم وبارك على سيدنا محمد بقدر حبك فيه، وبجاهه فرِّج عني ما أنا فيه» (7 مرات)، «وبسر يس والقرآن الكريم ... يا مفرِّج، يا مفرِّج، يا مفرِّج، يا مفرِّج، يا مفرِّج، فرِّج عني ما أنا فيه»، «سبحان مجري الماء في العيون، سبحان العالم لكل مكنون ومخزون، سبحان من جعل خزائنه بين الكاف والنون»، «اللهم إني أسألك وأتوجه إليك بحبيبك ونبيك ورسولك سيدنا محمد صلى الله عليه وسلم أن تسخّر لي قلب من أحوجتني إليه، وأن تكفيني شر من يقدر علي ولا أقدر عليه ... أسألك اللهم بحرمة القرآن الكريم وبالسر الذي أودعته في سورة يس وبحق من أنزلها أن تسخّر لي قلوب عبادك الصالحين يقضوا لي بأمرك جميع المطالب، واجعلني في كل شدة وفي كل أمر أنا الغالب، ومنّ علي يا سيدي بالإجابة»</w:t>
+        <w:t xml:space="preserve">سورة الفاتحة ودعاؤها: تُقرأ البسملة 19 مرة، ثم الصلاة على النبي: «اللهم صلِّ على سيدنا محمد النبي الأمي وعلى آله وصحبه وسلم» (7 مرات)، ثم تُقرأ الفاتحة 40 مرة، والدعاء: «إلهي علمك كافٍ عن السؤال فاكفني بحق الفاتحة السؤال، وكرمك كافٍ عن المقال فارزقني بحق الفاتحة مقال، وحصّل لي ما في ضميري» (ثم تُذكر الحاجة)</w:t>
       </w:r>
     </w:p>
     <w:p>
@@ -1773,7 +1773,7 @@
           <w:szCs w:val="24"/>
           <w:rtl/>
         </w:rPr>
-        <w:t xml:space="preserve">سورة الفاتحة ودعاؤها: تُقرأ البسملة 19 مرة، ثم الصلاة على النبي: «اللهم صلِّ على سيدنا محمد النبي الأمي وعلى آله وصحبه وسلم» (7 مرات)، ثم تُقرأ الفاتحة 40 مرة، والدعاء: «إلهي علمك كافٍ عن السؤال فاكفني بحق الفاتحة السؤال، وكرمك كافٍ عن المقال فارزقني بحق الفاتحة مقال، وحصّل لي ما في ضميري» (ثم تُذكر الحاجة)</w:t>
+        <w:t xml:space="preserve">دعاء سورة يس (نسخة أخرى، تُقال بعد قراءة السورة كاملة): «سبحان العالم لكل مكنون، والقاضي لكل الديون، سبحان من خزائنه بين الكاف والنون، سبحان من قوله كن فيكون. اللهم ربي إني أسألك وأتوجه إليك بحبيبك نبينا وسيدنا محمد صلى الله عليه وسلم أن تسخّر لي قلب من أحوجتني إليه، ومن بيده من البشر قضاء حاجتي، وأن تكفيني اللهم شر من يقدر علي ولا أقدر عليه، يا من بيده ملكوت كل شيء أنت العالم به والقادر عليه. اللهم بحق نبيك سيدنا محمد صلى الله عليه وسلم الذي أنزلت عليه سورة يس، أسألك يا ربي أن تجعلني في كل أمر وشدة غالبًا، وأن تمنّ علي ربي بسرعة العطاء وتحقيق الرجاء. اللهم صلِّ وسلم وبارك على سيدنا محمد بقدر حبك فيه، وبجاهه فرِّج علي ما أنا فيه، جئت أتوسل إليك بقدر النبي الكريم، وبسر بسم الله الرحمن الرحيم، وبسر يس والقرآن الحكيم، يا رب العالمين» (وتُذكر الحاجة)</w:t>
       </w:r>
     </w:p>
     <w:p>
@@ -1807,7 +1807,7 @@
           <w:szCs w:val="24"/>
           <w:rtl/>
         </w:rPr>
-        <w:t xml:space="preserve">دعاء سورة يس (نسخة أخرى، تُقال بعد قراءة السورة كاملة): «سبحان العالم لكل مكنون، والقاضي لكل الديون، سبحان من خزائنه بين الكاف والنون، سبحان من قوله كن فيكون. اللهم ربي إني أسألك وأتوجه إليك بحبيبك نبينا وسيدنا محمد صلى الله عليه وسلم أن تسخّر لي قلب من أحوجتني إليه، ومن بيده من البشر قضاء حاجتي، وأن تكفيني اللهم شر من يقدر علي ولا أقدر عليه، يا من بيده ملكوت كل شيء أنت العالم به والقادر عليه. اللهم بحق نبيك سيدنا محمد صلى الله عليه وسلم الذي أنزلت عليه سورة يس، أسألك يا ربي أن تجعلني في كل أمر وشدة غالبًا، وأن تمنّ علي ربي بسرعة العطاء وتحقيق الرجاء. اللهم صلِّ وسلم وبارك على سيدنا محمد بقدر حبك فيه، وبجاهه فرِّج علي ما أنا فيه، جئت أتوسل إليك بقدر النبي الكريم، وبسر بسم الله الرحمن الرحيم، وبسر يس والقرآن الحكيم، يا رب العالمين» (وتُذكر الحاجة)</w:t>
+        <w:t xml:space="preserve">ابدأ بهذه الكلمات حتى تُستجاب دعوتك: «اللهم صلِّ على محمد وعلى آل محمد كما صليت على إبراهيم وعلى آل إبراهيم، وبارك على محمد وعلى آل محمد كما باركت على آل إبراهيم في العالمين، إنك حميد مجيد. اللهم يا حنان يا منان يا بديع السماوات والأرض، يا ذا الجلال والإكرام، يا الله يا أحد يا واحد يا صمد، يا من لم يلد ولم يولد ولم يكن له كفوًا أحد، يا حي يا قيوم» ثم الدعاء</w:t>
       </w:r>
     </w:p>
     <w:p>
@@ -1841,7 +1841,7 @@
           <w:szCs w:val="24"/>
           <w:rtl/>
         </w:rPr>
-        <w:t xml:space="preserve">ابدأ بهذه الكلمات حتى تُستجاب دعوتك: «اللهم صلِّ على محمد وعلى آل محمد كما صليت على إبراهيم وعلى آل إبراهيم، وبارك على محمد وعلى آل محمد كما باركت على آل إبراهيم في العالمين، إنك حميد مجيد. اللهم يا حنان يا منان يا بديع السماوات والأرض، يا ذا الجلال والإكرام، يا الله يا أحد يا واحد يا صمد، يا من لم يلد ولم يولد ولم يكن له كفوًا أحد، يا حي يا قيوم» ثم الدعاء</w:t>
+        <w:t xml:space="preserve">يُدعى به في الشدة والفاقة ولسعة الرزق: «اللهم يا أول الأولين، ويا آخر الآخرين، ويا ذا القوة المتين، ويا راحم المساكين، ويا أرحم الراحمين» ثم الدعاء</w:t>
       </w:r>
     </w:p>
     <w:p>
@@ -1875,7 +1875,7 @@
           <w:szCs w:val="24"/>
           <w:rtl/>
         </w:rPr>
-        <w:t xml:space="preserve">يُدعى به في الشدة والفاقة ولسعة الرزق: «اللهم يا أول الأولين، ويا آخر الآخرين، ويا ذا القوة المتين، ويا راحم المساكين، ويا أرحم الراحمين» ثم الدعاء</w:t>
+        <w:t xml:space="preserve">لطلب المستحيل، دعاء فيه اسم الله الأعظم: «اللهم إني أسألك بأني أشهد أنك أنت الله لا إله إلا أنت، الأحد الصمد الذي لم يلد ولم يولد ولم يكن له كفوًا أحد» ثم ادعُ على يقين. وأيضًا: «اللهم إني أسألك بأن لك الحمد، لا إله إلا أنت، المنان بديع السماوات والأرض، يا ذا الجلال والإكرام، يا حي يا قيوم» ثم اطلب ما تريد</w:t>
       </w:r>
     </w:p>
     <w:p>
@@ -1909,7 +1909,7 @@
           <w:szCs w:val="24"/>
           <w:rtl/>
         </w:rPr>
-        <w:t xml:space="preserve">لطلب المستحيل، دعاء فيه اسم الله الأعظم: «اللهم إني أسألك بأني أشهد أنك أنت الله لا إله إلا أنت، الأحد الصمد الذي لم يلد ولم يولد ولم يكن له كفوًا أحد» ثم ادعُ على يقين. وأيضًا: «اللهم إني أسألك بأن لك الحمد، لا إله إلا أنت، المنان بديع السماوات والأرض، يا ذا الجلال والإكرام، يا حي يا قيوم» ثم اطلب ما تريد</w:t>
+        <w:t xml:space="preserve">عند الإحساس بالظلم في أي موقف، أو اليأس، أو انغلاق أبواب الرزق، لتفريج الكربات وتأمين القلوب وتفويض الأمر لله (100 مرة): «حسبنا الله سيؤتينا الله من فضله، إنا إلى الله راغبون» و«إن ولي الله الذي نزل الكتاب وهو يتولى الصالحين»</w:t>
       </w:r>
     </w:p>
     <w:p>
@@ -1943,7 +1943,7 @@
           <w:szCs w:val="24"/>
           <w:rtl/>
         </w:rPr>
-        <w:t xml:space="preserve">عند الإحساس بالظلم في أي موقف، أو اليأس، أو انغلاق أبواب الرزق، لتفريج الكربات وتأمين القلوب وتفويض الأمر لله (100 مرة): «حسبنا الله سيؤتينا الله من فضله، إنا إلى الله راغبون» و«إن ولي الله الذي نزل الكتاب وهو يتولى الصالحين»</w:t>
+        <w:t xml:space="preserve">دعاء يحقق لك المستحيل: كل ما استعصى عليكم الأمر، فرددوا: «يأتِ بها الله، إن الله لطيف خبير»</w:t>
       </w:r>
     </w:p>
     <w:p>
@@ -1977,7 +1977,7 @@
           <w:szCs w:val="24"/>
           <w:rtl/>
         </w:rPr>
-        <w:t xml:space="preserve">دعاء يحقق لك المستحيل: كل ما استعصى عليكم الأمر، فرددوا: «يأتِ بها الله، إن الله لطيف خبير»</w:t>
+        <w:t xml:space="preserve">«آيات فك الكرب وزيادة الرزق»: ﴿أَفَحَسِبْتُمْ أَنَّمَا خَلَقْنَاكُمْ عَبَثًا وَأَنَّكُمْ إِلَيْنَا لَا تُرْجَعُونَ * فَتَعَالَى اللَّهُ الْمَلِكُ الْحَقُّ لَا إِلَٰهَ إِلَّا هُوَ رَبُّ الْعَرْشِ الْكَرِيمِ * وَمَن يَدْعُ مَعَ اللَّهِ إِلَٰهًا آخَرَ لَا بُرْهَانَ لَهُ بِهِ فَإِنَّمَا حِسَابُهُ عِندَ رَبِّهِ إِنَّهُ لَا يُفْلِحُ الْكَافِرُونَ﴾ ثم ﴿وَقُل رَّبِّ اغْفِرْ وَارْحَمْ وَأَنتَ خَيْرُ الرَّاحِمِينَ﴾</w:t>
       </w:r>
     </w:p>
     <w:p>
@@ -2011,7 +2011,7 @@
           <w:szCs w:val="24"/>
           <w:rtl/>
         </w:rPr>
-        <w:t xml:space="preserve">«آيات فك الكرب وزيادة الرزق»: ﴿أَفَحَسِبْتُمْ أَنَّمَا خَلَقْنَاكُمْ عَبَثًا وَأَنَّكُمْ إِلَيْنَا لَا تُرْجَعُونَ * فَتَعَالَى اللَّهُ الْمَلِكُ الْحَقُّ لَا إِلَٰهَ إِلَّا هُوَ رَبُّ الْعَرْشِ الْكَرِيمِ * وَمَن يَدْعُ مَعَ اللَّهِ إِلَٰهًا آخَرَ لَا بُرْهَانَ لَهُ بِهِ فَإِنَّمَا حِسَابُهُ عِندَ رَبِّهِ إِنَّهُ لَا يُفْلِحُ الْكَافِرُونَ﴾ ثم ﴿وَقُل رَّبِّ اغْفِرْ وَارْحَمْ وَأَنتَ خَيْرُ الرَّاحِمِينَ﴾</w:t>
+        <w:t xml:space="preserve">إذا كثرت المشاكل، فعليك بآية 123 من سورة هود: ﴿وَلِلَّهِ غَيْبُ السَّمَاوَاتِ وَالْأَرْضِ وَإِلَيْهِ يُرْجَعُ الْأَمْرُ كُلُّهُ فَاعْبُدْهُ وَتَوَكَّلْ عَلَيْهِ وَمَا رَبُّكَ بِغَافِلٍ عَمَّا تَعْمَلُونَ﴾</w:t>
       </w:r>
     </w:p>
     <w:p>
@@ -2045,7 +2045,7 @@
           <w:szCs w:val="24"/>
           <w:rtl/>
         </w:rPr>
-        <w:t xml:space="preserve">إذا كثرت المشاكل، فعليك بآية 123 من سورة هود: ﴿وَلِلَّهِ غَيْبُ السَّمَاوَاتِ وَالْأَرْضِ وَإِلَيْهِ يُرْجَعُ الْأَمْرُ كُلُّهُ فَاعْبُدْهُ وَتَوَكَّلْ عَلَيْهِ وَمَا رَبُّكَ بِغَافِلٍ عَمَّا تَعْمَلُونَ﴾</w:t>
+        <w:t xml:space="preserve">فائدة مجرَّبة لقضاء الحوائج وتفريج الكرب: «يا من لا تغيب عني ولا تنساني، أرسل من يحل فرجي وأنا في مكاني» (7 مرات)، «يا عالي يا متعالي، يا دائم يا كبير يا قدوس، يا حي يا قاضي الحاجات، ارمِ مفتاحك وحل قفلي» (3 مرات)</w:t>
       </w:r>
     </w:p>
     <w:p>
@@ -2079,7 +2079,7 @@
           <w:szCs w:val="24"/>
           <w:rtl/>
         </w:rPr>
-        <w:t xml:space="preserve">فائدة مجرَّبة لقضاء الحوائج وتفريج الكرب: «يا من لا تغيب عني ولا تنساني، أرسل من يحل فرجي وأنا في مكاني» (7 مرات)، «يا عالي يا متعالي، يا دائم يا كبير يا قدوس، يا حي يا قاضي الحاجات، ارمِ مفتاحك وحل قفلي» (3 مرات)</w:t>
+        <w:t xml:space="preserve">دعاء الضيق: اللهم خفف عني ثقل هذه الأيام، وارزقني قوة الصبر، واشرح صدري وانزع منه ما استثقلته نفسي، اللهم أرح قلبي يا رب العالمين</w:t>
       </w:r>
     </w:p>
     <w:p>
@@ -2113,7 +2113,7 @@
           <w:szCs w:val="24"/>
           <w:rtl/>
         </w:rPr>
-        <w:t xml:space="preserve">دعاء الضيق: اللهم خفف عني ثقل هذه الأيام، وارزقني قوة الصبر، واشرح صدري وانزع منه ما استثقلته نفسي، اللهم أرح قلبي يا رب العالمين</w:t>
+        <w:t xml:space="preserve">لو كنت خائفًا من حاجة تحصل لك وقلقانًا منها، فعليك بهذا الدعاء: «اللهم لا يأتي بالحسنات إلا أنت، ولا يدفع السيئات إلا أنت، ولا حول ولا قوة إلا بك»</w:t>
       </w:r>
     </w:p>
     <w:p>
@@ -2147,7 +2147,7 @@
           <w:szCs w:val="24"/>
           <w:rtl/>
         </w:rPr>
-        <w:t xml:space="preserve">لو كنت خائفًا من حاجة تحصل لك وقلقانًا منها، فعليك بهذا الدعاء: «اللهم لا يأتي بالحسنات إلا أنت، ولا يدفع السيئات إلا أنت، ولا حول ولا قوة إلا بك»</w:t>
+        <w:t xml:space="preserve">«يا حي يا قيوم برحمتك أستغيث، أصلح لي شأني كله ولا تكلني لنفسي طرفة عين» — دعاء مأثور لإصلاح جميع الأمور</w:t>
       </w:r>
     </w:p>
     <w:p>
@@ -2181,7 +2181,7 @@
           <w:szCs w:val="24"/>
           <w:rtl/>
         </w:rPr>
-        <w:t xml:space="preserve">«يا حي يا قيوم برحمتك أستغيث، أصلح لي شأني كله ولا تكلني لنفسي طرفة عين» — دعاء مأثور لإصلاح جميع الأمور</w:t>
+        <w:t xml:space="preserve">إذا ضاقت الدنيا بك، فردد هذا الدعاء: «اللهم بحق قولك ليس لها من دون الله كاشفة، يا عالم كل خفية، ويا صارف كل بلية، اللهم بك أستغيث، أدعوك دعاء من اشتدت فاقته وضعفت قوته وقلّت حيلته، اللهم بك ملاذي وعياذي، باسمك الواحد الأحد الفرد الصمد أسألك أن تفرّج عني ما أمسيت فيه وأصبحت فيه، اللهم اقضِ حاجتي وأنت أعلم بها يا راحم الراحمين ويا أكرم الأكرمين، يا الله» (آمين)</w:t>
       </w:r>
     </w:p>
     <w:p>
@@ -2215,7 +2215,7 @@
           <w:szCs w:val="24"/>
           <w:rtl/>
         </w:rPr>
-        <w:t xml:space="preserve">إذا ضاقت الدنيا بك، فردد هذا الدعاء: «اللهم بحق قولك ليس لها من دون الله كاشفة، يا عالم كل خفية، ويا صارف كل بلية، اللهم بك أستغيث، أدعوك دعاء من اشتدت فاقته وضعفت قوته وقلّت حيلته، اللهم بك ملاذي وعياذي، باسمك الواحد الأحد الفرد الصمد أسألك أن تفرّج عني ما أمسيت فيه وأصبحت فيه، اللهم اقضِ حاجتي وأنت أعلم بها يا راحم الراحمين ويا أكرم الأكرمين، يا الله» (آمين)</w:t>
+        <w:t xml:space="preserve">«عُبيدك بفنائك، مسكينك بفنائك، فقيرك بفنائك، سائلك بفنائك» — قال طاووس: فحفظتهن فما دعوت بهن في كرب إلا فُرِّج عني</w:t>
       </w:r>
     </w:p>
     <w:p>
@@ -2249,7 +2249,7 @@
           <w:szCs w:val="24"/>
           <w:rtl/>
         </w:rPr>
-        <w:t xml:space="preserve">«عُبيدك بفنائك، مسكينك بفنائك، فقيرك بفنائك، سائلك بفنائك» — قال طاووس: فحفظتهن فما دعوت بهن في كرب إلا فُرِّج عني</w:t>
+        <w:t xml:space="preserve">دعاء طويل مأثور: «اللهم إني أسألك من كل أمر ضعفت عنه قوتي وحيلتي، ولم تنته إليه رغبتي، ولم يخطر ببالي ولم يبلغه أملي، ولم يجرِ على لساني من اليقين الذي أعطيته أحدًا من المخلوقين الأولين والمهاجرين والآخرين، إلا أخصصتني يا أرحم الراحمين. اللهم اقذف في قلبي رجاءك، واقطع رجائي عمّن سواك حتى لا أرجو أحدًا غيرك. اللهم وما ضعفت عنه قوتي وقصر عنه عملي ولم تنته إليه رغبتي، ولم تبلغه مسألتي، ولم يجرِ على لساني مما أعطيت أحدًا من الأولين والآخرين من اليقين، فخصّني به يا رب العالمين. اللهم صلِّ على سيدنا محمد صلاة تُنحل بها العُقد، وتنفك بها الكرب، وتُفتح لنا بها أبواب الفرج»</w:t>
       </w:r>
     </w:p>
     <w:p>
@@ -2283,7 +2283,7 @@
           <w:szCs w:val="24"/>
           <w:rtl/>
         </w:rPr>
-        <w:t xml:space="preserve">دعاء طويل مأثور: «اللهم إني أسألك من كل أمر ضعفت عنه قوتي وحيلتي، ولم تنته إليه رغبتي، ولم يخطر ببالي ولم يبلغه أملي، ولم يجرِ على لساني من اليقين الذي أعطيته أحدًا من المخلوقين الأولين والمهاجرين والآخرين، إلا أخصصتني يا أرحم الراحمين. اللهم اقذف في قلبي رجاءك، واقطع رجائي عمّن سواك حتى لا أرجو أحدًا غيرك. اللهم وما ضعفت عنه قوتي وقصر عنه عملي ولم تنته إليه رغبتي، ولم تبلغه مسألتي، ولم يجرِ على لساني مما أعطيت أحدًا من الأولين والآخرين من اليقين، فخصّني به يا رب العالمين. اللهم صلِّ على سيدنا محمد صلاة تُنحل بها العُقد، وتنفك بها الكرب، وتُفتح لنا بها أبواب الفرج»</w:t>
+        <w:t xml:space="preserve">دعاء المعجزات: «لا إله إلا الله عدد ما كان، لا إله إلا الله عدد ما يكون، لا إله إلا الله عدد الحركات والسكون»</w:t>
       </w:r>
     </w:p>
     <w:p>
@@ -2317,7 +2317,7 @@
           <w:szCs w:val="24"/>
           <w:rtl/>
         </w:rPr>
-        <w:t xml:space="preserve">دعاء المعجزات: «لا إله إلا الله عدد ما كان، لا إله إلا الله عدد ما يكون، لا إله إلا الله عدد الحركات والسكون»</w:t>
+        <w:t xml:space="preserve">دعاء المضطر لقضاء الحاجة الملحّة والمستعجلة: «بسم الله الرحمن الرحيم، اللهم صلِّ على محمد وآل محمد، اللهم رب السماوات السبع وما بينهم، ورب العرش العظيم، ورب جبرائيل وميكائيل وإسرافيل، ورب القرآن العظيم، ورب محمد خاتم النبيين صلى الله عليه وعلى آله وسلم الطيبين الطاهرين، اللهم أني أسألك بالذي تقوم به السماء وبه تقوم الأرض، وبه تُفرّق بين الجمع وبه تُجمع بين المتفرق، وبه تُرزق الأحياء، وبه أحصيت عدد الرمال ووزن الجبال وكيل البحور، أن تصلي على محمد وآل محمد وتقضي حاجتي» (اذكر اسم الحاجة)</w:t>
       </w:r>
     </w:p>
     <w:p>
@@ -2351,7 +2351,7 @@
           <w:szCs w:val="24"/>
           <w:rtl/>
         </w:rPr>
-        <w:t xml:space="preserve">دعاء المضطر لقضاء الحاجة الملحّة والمستعجلة: «بسم الله الرحمن الرحيم، اللهم صلِّ على محمد وآل محمد، اللهم رب السماوات السبع وما بينهم، ورب العرش العظيم، ورب جبرائيل وميكائيل وإسرافيل، ورب القرآن العظيم، ورب محمد خاتم النبيين صلى الله عليه وعلى آله وسلم الطيبين الطاهرين، اللهم أني أسألك بالذي تقوم به السماء وبه تقوم الأرض، وبه تُفرّق بين الجمع وبه تُجمع بين المتفرق، وبه تُرزق الأحياء، وبه أحصيت عدد الرمال ووزن الجبال وكيل البحور، أن تصلي على محمد وآل محمد وتقضي حاجتي» (اذكر اسم الحاجة)</w:t>
+        <w:t xml:space="preserve">اللهم فارج الهم وكاشف الغم، ومجيب دعوة المضطرين، رحمن الدنيا والآخرة ورحيمهما، أنت ترحمني فارحمني برحمة تُغنيني بها عن رحمة من سواك. وأيضًا: «يا رب اكشف عنا الكرب والوباء والبلاء، وارفع عنا كل شدة وعناء، آمين يا رب، ومدّنا بمدد من السماء يا رب العالمين. اللهم يا فارج الهم ويا كاشف الغم، فرّج همّنا ويسّر أمرنا، وارحم ضعفنا وقلة حيلتنا، وخذ بأيدينا إليك أخذ الكرام عليك، آمين يا رب، وحسبنا الله ونعم الوكيل»</w:t>
       </w:r>
     </w:p>
     <w:p>
@@ -2385,7 +2385,7 @@
           <w:szCs w:val="24"/>
           <w:rtl/>
         </w:rPr>
-        <w:t xml:space="preserve">اللهم فارج الهم وكاشف الغم، ومجيب دعوة المضطرين، رحمن الدنيا والآخرة ورحيمهما، أنت ترحمني فارحمني برحمة تُغنيني بها عن رحمة من سواك. وأيضًا: «يا رب اكشف عنا الكرب والوباء والبلاء، وارفع عنا كل شدة وعناء، آمين يا رب، ومدّنا بمدد من السماء يا رب العالمين. اللهم يا فارج الهم ويا كاشف الغم، فرّج همّنا ويسّر أمرنا، وارحم ضعفنا وقلة حيلتنا، وخذ بأيدينا إليك أخذ الكرام عليك، آمين يا رب، وحسبنا الله ونعم الوكيل»</w:t>
+        <w:t xml:space="preserve">عند ضياع أي شيء غالٍ عليك (ولد، زوج، زوجة، عمل...): تصلي ركعتين بنية قضاء الحاجة، استغفار 100 مرة «أستغفر الله العظيم الذي لا إله إلا هو الحي القيوم وأتوب إليه»، صلاة على النبي 100 مرة «اللهم صلِّ وسلم وبارك على سيدنا محمد صلاة تُقضى بها الحوائج وتُفرّج بها الكرب وتُعيد بها كل ما غاب عنا»، ثم يُقال: «يا ذا المعروف الذي لا ينقطع أبدًا ولا يُحصيه غيره، يا من لا يُعلم كيف هو إلا هو، ويا من لا يبلغ قدرته غيره، فرّج عني ما أنا فيه، يا كثير الخير يا دائم المعروف، اللهم اجعل لي من كل همّ همّني من أمري في ديني ودنياي وآخرتي فرجًا ومخرجًا، واغفر لي ذنوبي، وثبّت رجاءك في قلبي واقطعه عمّا سواك حتى لا يكون لي رجاء إلا إياك» ثم يُسمّى الشيء الضائع حتى يرده الله</w:t>
       </w:r>
     </w:p>
     <w:p>
@@ -2419,7 +2419,7 @@
           <w:szCs w:val="24"/>
           <w:rtl/>
         </w:rPr>
-        <w:t xml:space="preserve">عند ضياع أي شيء غالٍ عليك (ولد، زوج، زوجة، عمل...): تصلي ركعتين بنية قضاء الحاجة، استغفار 100 مرة «أستغفر الله العظيم الذي لا إله إلا هو الحي القيوم وأتوب إليه»، صلاة على النبي 100 مرة «اللهم صلِّ وسلم وبارك على سيدنا محمد صلاة تُقضى بها الحوائج وتُفرّج بها الكرب وتُعيد بها كل ما غاب عنا»، ثم يُقال: «يا ذا المعروف الذي لا ينقطع أبدًا ولا يُحصيه غيره، يا من لا يُعلم كيف هو إلا هو، ويا من لا يبلغ قدرته غيره، فرّج عني ما أنا فيه، يا كثير الخير يا دائم المعروف، اللهم اجعل لي من كل همّ همّني من أمري في ديني ودنياي وآخرتي فرجًا ومخرجًا، واغفر لي ذنوبي، وثبّت رجاءك في قلبي واقطعه عمّا سواك حتى لا يكون لي رجاء إلا إياك» ثم يُسمّى الشيء الضائع حتى يرده الله</w:t>
+        <w:t xml:space="preserve">صلاة ركعتين بنية قضاء الحاجة، وأنت جالس بمكانك، تقول 1000 مرة بعد التسليم: «آمنت بالله العلي العظيم، وتوكلت على الحي القيوم»</w:t>
       </w:r>
     </w:p>
     <w:p>
@@ -2453,7 +2453,7 @@
           <w:szCs w:val="24"/>
           <w:rtl/>
         </w:rPr>
-        <w:t xml:space="preserve">صلاة ركعتين بنية قضاء الحاجة، وأنت جالس بمكانك، تقول 1000 مرة بعد التسليم: «آمنت بالله العلي العظيم، وتوكلت على الحي القيوم»</w:t>
+        <w:t xml:space="preserve">دعاء وصلاة لتقبل الدعاء: تصلي ركعتين ثم تقول: «اللهم يا ولي النعم ويا دافع الشرور والنقم، وقفت بعتبة بابك أرجو رحمتك وأخشى عذابك، اللهم لا تعاملني في دعائي هذا بذنوبي ولا بما أنا أهله، وعاملني فيه بفضلك وكرمك وبما أنت أهله، لا باب إلا بابك، ولا رجاء إلا رجاؤك، ولا خير إلا خيرك، اللهم إن لي عندك دعاء فاقبل دعائي، ولي عندك رجاء فلا تردّ رجائي، اللهم استجب، اللهم استجب، اللهم استجب» وسلام على المرسلين والحمد لله رب العالمين</w:t>
       </w:r>
     </w:p>
     <w:p>
@@ -2487,7 +2487,7 @@
           <w:szCs w:val="24"/>
           <w:rtl/>
         </w:rPr>
-        <w:t xml:space="preserve">دعاء وصلاة لتقبل الدعاء: تصلي ركعتين ثم تقول: «اللهم يا ولي النعم ويا دافع الشرور والنقم، وقفت بعتبة بابك أرجو رحمتك وأخشى عذابك، اللهم لا تعاملني في دعائي هذا بذنوبي ولا بما أنا أهله، وعاملني فيه بفضلك وكرمك وبما أنت أهله، لا باب إلا بابك، ولا رجاء إلا رجاؤك، ولا خير إلا خيرك، اللهم إن لي عندك دعاء فاقبل دعائي، ولي عندك رجاء فلا تردّ رجائي، اللهم استجب، اللهم استجب، اللهم استجب» وسلام على المرسلين والحمد لله رب العالمين</w:t>
+        <w:t xml:space="preserve">«يا غني من للفقير سواك، يا عزيز من للذليل سواك، يا قدير من للعاجز سواك، يا قوي من للضعيف سواك» و«يا عزيز، يا جبار، يا متكبر، يا ودود، يا نصير» (125 مرة)، ثم الصلاة على خير الورى (125 مرة)</w:t>
       </w:r>
     </w:p>
     <w:p>
@@ -2521,7 +2521,7 @@
           <w:szCs w:val="24"/>
           <w:rtl/>
         </w:rPr>
-        <w:t xml:space="preserve">«يا غني من للفقير سواك، يا عزيز من للذليل سواك، يا قدير من للعاجز سواك، يا قوي من للضعيف سواك» و«يا عزيز، يا جبار، يا متكبر، يا ودود، يا نصير» (125 مرة)، ثم الصلاة على خير الورى (125 مرة)</w:t>
+        <w:t xml:space="preserve">للسيطرة على شخص محتاج منه حاجة: «أَلَا يَعْلَمُ مَنْ خَلَقَ وَهُوَ اللَّطِيفُ الْخَبِيرُ، اللهم اقضِ حاجتي من فلان ابن فلانة، إنك على كل شيء قدير» (100 مرة بعد صلاة الفجر والعصر والعشاء)</w:t>
       </w:r>
     </w:p>
     <w:p>
@@ -2555,7 +2555,7 @@
           <w:szCs w:val="24"/>
           <w:rtl/>
         </w:rPr>
-        <w:t xml:space="preserve">للسيطرة على شخص محتاج منه حاجة: «أَلَا يَعْلَمُ مَنْ خَلَقَ وَهُوَ اللَّطِيفُ الْخَبِيرُ، اللهم اقضِ حاجتي من فلان ابن فلانة، إنك على كل شيء قدير» (100 مرة بعد صلاة الفجر والعصر والعشاء)</w:t>
+        <w:t xml:space="preserve">فائدة لحل المشاكل: «اللهم صلِّ على سيدنا محمد... قد ضاقت حيلتي... أدركني يا رسول الله» (1111 مرة)</w:t>
       </w:r>
     </w:p>
     <w:p>
@@ -2589,7 +2589,7 @@
           <w:szCs w:val="24"/>
           <w:rtl/>
         </w:rPr>
-        <w:t xml:space="preserve">فائدة لحل المشاكل: «اللهم صلِّ على سيدنا محمد... قد ضاقت حيلتي... أدركني يا رسول الله» (1111 مرة)</w:t>
+        <w:t xml:space="preserve">لفك الكربات: «بسم الله الرحمن الرحيم، يا رحمن يا رحيم» (111 مرة)، «اللهم أنزل علينا مائدة من السماء» (111 مرة)</w:t>
       </w:r>
     </w:p>
     <w:p>
@@ -2623,7 +2623,7 @@
           <w:szCs w:val="24"/>
           <w:rtl/>
         </w:rPr>
-        <w:t xml:space="preserve">لفك الكربات: «بسم الله الرحمن الرحيم، يا رحمن يا رحيم» (111 مرة)، «اللهم أنزل علينا مائدة من السماء» (111 مرة)</w:t>
+        <w:t xml:space="preserve">بعد ركعتين صلاة الحاجة، مستقبل الكعبة، تُقال 120 مرة: «أَمَّن يُجِيبُ الْمُضْطَرَّ إِذَا دَعَاهُ وَيَكْشِفُ السُّوءَ» — كل يوم، وشوف بعد أسبوع اللي حيحصل</w:t>
       </w:r>
     </w:p>
     <w:p>
@@ -2657,7 +2657,7 @@
           <w:szCs w:val="24"/>
           <w:rtl/>
         </w:rPr>
-        <w:t xml:space="preserve">بعد ركعتين صلاة الحاجة، مستقبل الكعبة، تُقال 120 مرة: «أَمَّن يُجِيبُ الْمُضْطَرَّ إِذَا دَعَاهُ وَيَكْشِفُ السُّوءَ» — كل يوم، وشوف بعد أسبوع اللي حيحصل</w:t>
+        <w:t xml:space="preserve">«رَبِّ إِنِّي ظَلَمْتُ نَفْسِي وَأَسْلَمْتُ مَعَ سُلَيْمَانَ لِلَّهِ رَبِّ الْعَالَمِينَ» تُقرأ 44 مرة — سر من أسرار فك الكربات</w:t>
       </w:r>
     </w:p>
     <w:p>
@@ -2691,7 +2691,7 @@
           <w:szCs w:val="24"/>
           <w:rtl/>
         </w:rPr>
-        <w:t xml:space="preserve">«رَبِّ إِنِّي ظَلَمْتُ نَفْسِي وَأَسْلَمْتُ مَعَ سُلَيْمَانَ لِلَّهِ رَبِّ الْعَالَمِينَ» تُقرأ 44 مرة — سر من أسرار فك الكربات</w:t>
+        <w:t xml:space="preserve">7 أيام متصلة تُقرأ سورة مريم، والأفضل بعد صلاة المغرب، وفي اليوم السابع بعد قراءة السورة يُقال هذا الدعاء 100 مرة: «بسم الله الرحمن الرحيم، اللهم صلِّ وسلم وزد وبارك عليك سيدي يا رسول الله، اللهم أسألك بحق ما أنزلته في كهيعص أن تحقق لي ما أتمناه» في يقين، وانتظر فرجًا من الله لن يخطر لك على بال</w:t>
       </w:r>
     </w:p>
     <w:p>
@@ -2725,7 +2725,7 @@
           <w:szCs w:val="24"/>
           <w:rtl/>
         </w:rPr>
-        <w:t xml:space="preserve">7 أيام متصلة تُقرأ سورة مريم، والأفضل بعد صلاة المغرب، وفي اليوم السابع بعد قراءة السورة يُقال هذا الدعاء 100 مرة: «بسم الله الرحمن الرحيم، اللهم صلِّ وسلم وزد وبارك عليك سيدي يا رسول الله، اللهم أسألك بحق ما أنزلته في كهيعص أن تحقق لي ما أتمناه» في يقين، وانتظر فرجًا من الله لن يخطر لك على بال</w:t>
+        <w:t xml:space="preserve">سورة تحقيق المعجزات والأمنيات والرزق، خصوصًا في شهر رجب: تُقرأ سورة الإسراء حتى الآيات 80 و81 و82 (تُقرأ 3 مرات)، ثم تُكمل حتى الآية 109 (موضع السجدة) فتسجد وتقول: «سبحان ربي الأعلى، سبحان العلي العظيم، سبحان الله المعز» (3 مرات)، ثم تُكمل لنهاية السورة، ثم تقول: «توكلت على الحي الذي لا يموت، اللهم ارزقني واقضِ حاجتي» (3 مرات)</w:t>
       </w:r>
     </w:p>
     <w:p>
@@ -2759,7 +2759,7 @@
           <w:szCs w:val="24"/>
           <w:rtl/>
         </w:rPr>
-        <w:t xml:space="preserve">سورة تحقيق المعجزات والأمنيات والرزق، خصوصًا في شهر رجب: تُقرأ سورة الإسراء حتى الآيات 80 و81 و82 (تُقرأ 3 مرات)، ثم تُكمل حتى الآية 109 (موضع السجدة) فتسجد وتقول: «سبحان ربي الأعلى، سبحان العلي العظيم، سبحان الله المعز» (3 مرات)، ثم تُكمل لنهاية السورة، ثم تقول: «توكلت على الحي الذي لا يموت، اللهم ارزقني واقضِ حاجتي» (3 مرات)</w:t>
+        <w:t xml:space="preserve">«يا ودود يا ودود، يا ذا العرش المجيد، يا مبدئ يا معيد، يا فعّال لما يريد، أسألك بنور وجهك الذي ملأ أركان عرشك، وأسألك بقدرتك التي قدرت بها على جميع خلقك، وأسألك برحمتك التي وسعت كل شيء، لا إله إلا أنت، يا مغيث أغثني، يا مغيث أغثني، يا مغيث أغثني» ثم الدعاء، ثم استغفار 3 مرات: «أستغفر الله العظيم الذي لا إله إلا هو الحي القيوم وأتوب إليه»</w:t>
       </w:r>
     </w:p>
     <w:p>
@@ -2793,7 +2793,7 @@
           <w:szCs w:val="24"/>
           <w:rtl/>
         </w:rPr>
-        <w:t xml:space="preserve">«يا ودود يا ودود، يا ذا العرش المجيد، يا مبدئ يا معيد، يا فعّال لما يريد، أسألك بنور وجهك الذي ملأ أركان عرشك، وأسألك بقدرتك التي قدرت بها على جميع خلقك، وأسألك برحمتك التي وسعت كل شيء، لا إله إلا أنت، يا مغيث أغثني، يا مغيث أغثني، يا مغيث أغثني» ثم الدعاء، ثم استغفار 3 مرات: «أستغفر الله العظيم الذي لا إله إلا هو الحي القيوم وأتوب إليه»</w:t>
+        <w:t xml:space="preserve">«يا سامع كل صوت، ويُسابق كل فوت، ويا كاسي العظام لحمًا ومُنشرها بعد الموت، أسألك بأسمائك العظام وباسمك الأعظم الأكبر المخزون المكنون الذي لم يطّلع عليه أحد من المخلوقين. يا حليم ذا أناة لا يقدر على أناته أحد. يا ذا المعروف الذي لا ينقطع معروفه أبدًا ولا نُحصي له عددًا، أفرج عني. يا من له وجه لا يبلى، ونور لا يُطفأ، واسم لا يُنسى، وباب لا يُغلق، وستر لا يُهتك، ومُلك لا يفنى، أسألك وأتوسل إليك بجاه سيدنا محمد صلى الله عليه وسلم أن تقضي حاجتي وتُعطيني مسألتي. اللهم إني أعوذ باسمك الواحد الأعز، وأدعوك اللهم باسمك الصمد، وأدعوك اللهم باسمك العظيم الوتر، وأدعوك باسمك الكبير المتعال الذي ثبت به أركانك كلها، أن تكشف عني ضر ما أصبحت وأمسيت فيه»</w:t>
       </w:r>
     </w:p>
     <w:p>
@@ -2827,7 +2827,7 @@
           <w:szCs w:val="24"/>
           <w:rtl/>
         </w:rPr>
-        <w:t xml:space="preserve">«يا سامع كل صوت، ويُسابق كل فوت، ويا كاسي العظام لحمًا ومُنشرها بعد الموت، أسألك بأسمائك العظام وباسمك الأعظم الأكبر المخزون المكنون الذي لم يطّلع عليه أحد من المخلوقين. يا حليم ذا أناة لا يقدر على أناته أحد. يا ذا المعروف الذي لا ينقطع معروفه أبدًا ولا نُحصي له عددًا، أفرج عني. يا من له وجه لا يبلى، ونور لا يُطفأ، واسم لا يُنسى، وباب لا يُغلق، وستر لا يُهتك، ومُلك لا يفنى، أسألك وأتوسل إليك بجاه سيدنا محمد صلى الله عليه وسلم أن تقضي حاجتي وتُعطيني مسألتي. اللهم إني أعوذ باسمك الواحد الأعز، وأدعوك اللهم باسمك الصمد، وأدعوك اللهم باسمك العظيم الوتر، وأدعوك باسمك الكبير المتعال الذي ثبت به أركانك كلها، أن تكشف عني ضر ما أصبحت وأمسيت فيه»</w:t>
+        <w:t xml:space="preserve">دعاء طويل (منظوم) لتفريج الكرب: «رب، عبدك قد ضاقت به الأسباب، وأُغلقت دونه الأبواب، وبَعُد عن جادة الصواب، وزاد به الهمّ والغمّ والاكتئاب، وانقضى عمره ولم يُفتح له إلى فسيح مناهل الصفو والقربات باب، وأنت المرجوّ سبحانك لكشف هذا المصاب، يا من إذا دُعي أجاب، يا سريع الحساب، يا رب الأرباب، يا عظيم الجناب، يا كريم يا وهاب، رب لا تحجب دعوتي ولا ترد مسألتي ولا تدعني بحسرتي ولا تكلني إلى حولي وقوتي، وارحم عجزي فقد ضاق صدري وتاه فكري وتحيرت في أمري، وأنت العالم سبحانك بسري وجهري، المالك لنفعي وضري، القادر على تفريج كربي وتيسير عسري. اللهم أحيِنا في الدنيا مؤمنين طائعين، وتوفنا مسلمين تائبين. اللهم ارحم تضرعنا بين يديك، وقوّمنا إذا اعوججنا، وأدِمْنا إذا استقمنا، وكن لنا ولا تكن علينا. اللهم نسألك يا غفور يا رحمن يا رحيم أن تفتح لأدعيتنا أبواب الإجابة، يا من إذا سأله المضطر أجاب، يا من يقول للشيء كن فيكون، اللهم لا تردنا خائبين، وآتنا أفضل ما يُؤتى عبادك الصالحين، اللهم ولا تصرفنا عن بحر جودك خاسرين ولا ضالين ولا مضلين، واغفر لنا إلى يوم الدين، برحمتك يا أرحم الراحمين، اللهم آمين»</w:t>
       </w:r>
     </w:p>
     <w:p>
@@ -2861,7 +2861,7 @@
           <w:szCs w:val="24"/>
           <w:rtl/>
         </w:rPr>
-        <w:t xml:space="preserve">دعاء طويل (منظوم) لتفريج الكرب: «رب، عبدك قد ضاقت به الأسباب، وأُغلقت دونه الأبواب، وبَعُد عن جادة الصواب، وزاد به الهمّ والغمّ والاكتئاب، وانقضى عمره ولم يُفتح له إلى فسيح مناهل الصفو والقربات باب، وأنت المرجوّ سبحانك لكشف هذا المصاب، يا من إذا دُعي أجاب، يا سريع الحساب، يا رب الأرباب، يا عظيم الجناب، يا كريم يا وهاب، رب لا تحجب دعوتي ولا ترد مسألتي ولا تدعني بحسرتي ولا تكلني إلى حولي وقوتي، وارحم عجزي فقد ضاق صدري وتاه فكري وتحيرت في أمري، وأنت العالم سبحانك بسري وجهري، المالك لنفعي وضري، القادر على تفريج كربي وتيسير عسري. اللهم أحيِنا في الدنيا مؤمنين طائعين، وتوفنا مسلمين تائبين. اللهم ارحم تضرعنا بين يديك، وقوّمنا إذا اعوججنا، وأدِمْنا إذا استقمنا، وكن لنا ولا تكن علينا. اللهم نسألك يا غفور يا رحمن يا رحيم أن تفتح لأدعيتنا أبواب الإجابة، يا من إذا سأله المضطر أجاب، يا من يقول للشيء كن فيكون، اللهم لا تردنا خائبين، وآتنا أفضل ما يُؤتى عبادك الصالحين، اللهم ولا تصرفنا عن بحر جودك خاسرين ولا ضالين ولا مضلين، واغفر لنا إلى يوم الدين، برحمتك يا أرحم الراحمين، اللهم آمين»</w:t>
+        <w:t xml:space="preserve">«اللهم لا سهل إلا ما جعلته سهلًا، فإنك تجعل الحزن إن شئت سهلًا»</w:t>
       </w:r>
     </w:p>
     <w:p>
@@ -2895,7 +2895,7 @@
           <w:szCs w:val="24"/>
           <w:rtl/>
         </w:rPr>
-        <w:t xml:space="preserve">«اللهم لا سهل إلا ما جعلته سهلًا، فإنك تجعل الحزن إن شئت سهلًا»</w:t>
+        <w:t xml:space="preserve">يا رب، بحق الحوقلة افتحها في وجهي... وادعُ ما شئت، وتقول: «لا حول ولا قوة إلا بالله العلي العظيم» (7 مرات)</w:t>
       </w:r>
     </w:p>
     <w:p>
@@ -2929,7 +2929,7 @@
           <w:szCs w:val="24"/>
           <w:rtl/>
         </w:rPr>
-        <w:t xml:space="preserve">يا رب، بحق الحوقلة افتحها في وجهي... وادعُ ما شئت، وتقول: «لا حول ولا قوة إلا بالله العلي العظيم» (7 مرات)</w:t>
+        <w:t xml:space="preserve">عند الدخول على أي شخص لقضاء حاجتك (7 مرات): ﴿فَإِن تَوَلَّوْا فَقُلْ حَسْبِيَ اللَّهُ لَا إِلَٰهَ إِلَّا هُوَ عَلَيْهِ تَوَكَّلْتُ وَهُوَ رَبُّ الْعَرْشِ الْعَظِيمِ﴾</w:t>
       </w:r>
     </w:p>
     <w:p>
@@ -2963,7 +2963,7 @@
           <w:szCs w:val="24"/>
           <w:rtl/>
         </w:rPr>
-        <w:t xml:space="preserve">عند الدخول على أي شخص لقضاء حاجتك (7 مرات): ﴿فَإِن تَوَلَّوْا فَقُلْ حَسْبِيَ اللَّهُ لَا إِلَٰهَ إِلَّا هُوَ عَلَيْهِ تَوَكَّلْتُ وَهُوَ رَبُّ الْعَرْشِ الْعَظِيمِ﴾</w:t>
+        <w:t xml:space="preserve">كل ما تعسّرت أحوالك، قل هذا الدعاء (3 أو 7 مرات): «بسم الله الرحمن الرحيم، يا ملك الرقاب، ويا هازم الأحزاب، يا مفتّح الأبواب، ويا مسبّب الأسباب، سبّب لنا سببًا لا نستطيع له طلبًا، بحق لا إله إلا الله ومحمد رسول الله صلى الله عليه وآله أجمعين»</w:t>
       </w:r>
     </w:p>
     <w:p>
@@ -2997,7 +2997,7 @@
           <w:szCs w:val="24"/>
           <w:rtl/>
         </w:rPr>
-        <w:t xml:space="preserve">كل ما تعسّرت أحوالك، قل هذا الدعاء (3 أو 7 مرات): «بسم الله الرحمن الرحيم، يا ملك الرقاب، ويا هازم الأحزاب، يا مفتّح الأبواب، ويا مسبّب الأسباب، سبّب لنا سببًا لا نستطيع له طلبًا، بحق لا إله إلا الله ومحمد رسول الله صلى الله عليه وآله أجمعين»</w:t>
+        <w:t xml:space="preserve">«يا قادر أنت القادر يا الله» تُقرأ 12 أو 33 مرة بعد كل صلاة، ثم تدعو بما تشاء</w:t>
       </w:r>
     </w:p>
     <w:p>
@@ -3031,7 +3031,7 @@
           <w:szCs w:val="24"/>
           <w:rtl/>
         </w:rPr>
-        <w:t xml:space="preserve">«يا قادر أنت القادر يا الله» تُقرأ 12 أو 33 مرة بعد كل صلاة، ثم تدعو بما تشاء</w:t>
+        <w:t xml:space="preserve">صلاة الحاجة الكاملة (حديث): تصلي ركعتين، وبعد التسليم تقول: «لا إله إلا أنت الحليم الكريم، لا إله إلا أنت رب العرش العظيم، الحمد لله رب العالمين، اللهم إني أسألك موجبات رحمتك، وعزائم مغفرتك، والغنيمة من كل بر، والسلامة من كل إثم، والفوز بالجنة، والنجاة من النار، لا تدع لي ذنبًا إلا غفرته، ولا همًا إلا فرّجته، ولا حاجة من حوائج الدنيا والآخرة إلا قضيتها ويسّرتها برحمتك يا أرحم الراحمين» ثم تطلب ما تريد</w:t>
       </w:r>
     </w:p>
     <w:p>
@@ -3065,7 +3065,7 @@
           <w:szCs w:val="24"/>
           <w:rtl/>
         </w:rPr>
-        <w:t xml:space="preserve">صلاة الحاجة الكاملة (حديث): تصلي ركعتين، وبعد التسليم تقول: «لا إله إلا أنت الحليم الكريم، لا إله إلا أنت رب العرش العظيم، الحمد لله رب العالمين، اللهم إني أسألك موجبات رحمتك، وعزائم مغفرتك، والغنيمة من كل بر، والسلامة من كل إثم، والفوز بالجنة، والنجاة من النار، لا تدع لي ذنبًا إلا غفرته، ولا همًا إلا فرّجته، ولا حاجة من حوائج الدنيا والآخرة إلا قضيتها ويسّرتها برحمتك يا أرحم الراحمين» ثم تطلب ما تريد</w:t>
+        <w:t xml:space="preserve">﴿عَسَىٰ رَبُّنَا أَن يُبْدِلَنَا خَيْرًا مِّنْهَا إِنَّا إِلَىٰ رَبِّنَا رَاغِبُونَ﴾ — لو ضاع منك شغلانة أو منصب أو فلوس أو أي شيء كنت تحبه، كرر هذه الآية</w:t>
       </w:r>
     </w:p>
     <w:p>
@@ -3099,7 +3099,7 @@
           <w:szCs w:val="24"/>
           <w:rtl/>
         </w:rPr>
-        <w:t xml:space="preserve">﴿عَسَىٰ رَبُّنَا أَن يُبْدِلَنَا خَيْرًا مِّنْهَا إِنَّا إِلَىٰ رَبِّنَا رَاغِبُونَ﴾ — لو ضاع منك شغلانة أو منصب أو فلوس أو أي شيء كنت تحبه، كرر هذه الآية</w:t>
+        <w:t xml:space="preserve">الدعاء لفك كل الكربات: يوم الجمعة قبل المغرب بساعة، على وضوء ومتجهًا للقبلة في مكان تختلي فيه بنفسك: استغفار «أستغفر الله العظيم الذي لا إله إلا هو الحي القيوم وأتوب إليه» (100 مرة)، «اللهم صلِّ وسلم وبارك على سيدنا محمد صلاة تُفرّج بها الهم وتُزيح بها الغم وتُسدّد بها الدين وتُحقق بها الآمال» (100 مرة)، ثم تُردد حتى أذان المغرب: ﴿إِذْ أَوَى الْفِتْيَةُ إِلَى الْكَهْفِ فَقَالُوا رَبَّنَا آتِنَا مِن لَّدُنكَ رَحْمَةً وَهَيِّئْ لَنَا مِنْ أَمْرِنَا رَشَدًا﴾، ثم تردد الأذان مع المؤذن، ثم تصلي المغرب وتدعو في السجود الأخير بما تريد</w:t>
       </w:r>
     </w:p>
     <w:p>
@@ -3133,7 +3133,7 @@
           <w:szCs w:val="24"/>
           <w:rtl/>
         </w:rPr>
-        <w:t xml:space="preserve">الدعاء لفك كل الكربات: يوم الجمعة قبل المغرب بساعة، على وضوء ومتجهًا للقبلة في مكان تختلي فيه بنفسك: استغفار «أستغفر الله العظيم الذي لا إله إلا هو الحي القيوم وأتوب إليه» (100 مرة)، «اللهم صلِّ وسلم وبارك على سيدنا محمد صلاة تُفرّج بها الهم وتُزيح بها الغم وتُسدّد بها الدين وتُحقق بها الآمال» (100 مرة)، ثم تُردد حتى أذان المغرب: ﴿إِذْ أَوَى الْفِتْيَةُ إِلَى الْكَهْفِ فَقَالُوا رَبَّنَا آتِنَا مِن لَّدُنكَ رَحْمَةً وَهَيِّئْ لَنَا مِنْ أَمْرِنَا رَشَدًا﴾، ثم تردد الأذان مع المؤذن، ثم تصلي المغرب وتدعو في السجود الأخير بما تريد</w:t>
+        <w:t xml:space="preserve">طلب الصعاب للحصول على عمل: بعد صلاة العشاء: الصلاة على الرسول (100 مرة)، «بسم الله الرحمن الرحيم» (19 مرة)، «يا رحيم أنت الرحيم يا الله» (95 مرة)، «اللهم فارج الهم وكاشف الغم ومجيب دعوة المضطرين، رحمن الدنيا والآخرة ورحيمهما، ارحمني برحمة من عندك تُغنيني بها عمّن سواك» (7 مرات)</w:t>
       </w:r>
     </w:p>
     <w:p>
@@ -3167,7 +3167,7 @@
           <w:szCs w:val="24"/>
           <w:rtl/>
         </w:rPr>
-        <w:t xml:space="preserve">طلب الصعاب للحصول على عمل: بعد صلاة العشاء: الصلاة على الرسول (100 مرة)، «بسم الله الرحمن الرحيم» (19 مرة)، «يا رحيم أنت الرحيم يا الله» (95 مرة)، «اللهم فارج الهم وكاشف الغم ومجيب دعوة المضطرين، رحمن الدنيا والآخرة ورحيمهما، ارحمني برحمة من عندك تُغنيني بها عمّن سواك» (7 مرات)</w:t>
+        <w:t xml:space="preserve">دعاء فك الكرب وقضاء الحاجة: «الحمد لله رب العالمين، وأفضل الصلاة وأتم التسليم على سيدنا محمد وعلى آله وصحبه وسلم. أستغفر الله العظيم الذي لا إله إلا هو الحي القيوم وأتوب إليه. اللهم يا جامع الشتات، ويا مُخرج النبات، ويا مُحيي العظام الرفات، ويا مجيب الدعوات، ويا قاضي الحاجات، ويا مُفرّج الكربات، ويا سامع الأصوات من فوق سبع سماوات، ويا فاتح خزائن الكرامات، ويا مالك حوائج جميع المخلوقات، ويا من ملأ نوره السماوات، ويا من أحاط بكل شيء علمًا وأحصى كل شيء عددًا، ويا عالمًا بما مضى وما هو آتٍ، أسألك اللهم بقدرتك على كل شيء، وباستغنائك عن جميع خلقك، وبحمدك ومجدك يا إله كل شيء، وأسألك اللهم أن تجود علي بقضاء حاجتي، إنك قادر على كل شيء يا رب العالمين، يا عظيم يُرجى لكل عظيم، يا عليمًا أنت بحالنا عليم، اللهم أصلح لنا شأننا بما أصلحت به شأن عبادك الصالحين، ولا تكلنا لأنفسنا طرفة عين ولا أقل من ذلك. اللهم اقضِ حاجتي، ونفّس كربتي، وما نزل بي من حيرتي» (ثم تُسمى الحاجة) «وصلى الله وسلم على سيدنا محمد وعلى آله وصحبه وسلم تسليمًا كثيرًا»</w:t>
       </w:r>
     </w:p>
     <w:p>
@@ -3201,7 +3201,7 @@
           <w:szCs w:val="24"/>
           <w:rtl/>
         </w:rPr>
-        <w:t xml:space="preserve">دعاء فك الكرب وقضاء الحاجة: «الحمد لله رب العالمين، وأفضل الصلاة وأتم التسليم على سيدنا محمد وعلى آله وصحبه وسلم. أستغفر الله العظيم الذي لا إله إلا هو الحي القيوم وأتوب إليه. اللهم يا جامع الشتات، ويا مُخرج النبات، ويا مُحيي العظام الرفات، ويا مجيب الدعوات، ويا قاضي الحاجات، ويا مُفرّج الكربات، ويا سامع الأصوات من فوق سبع سماوات، ويا فاتح خزائن الكرامات، ويا مالك حوائج جميع المخلوقات، ويا من ملأ نوره السماوات، ويا من أحاط بكل شيء علمًا وأحصى كل شيء عددًا، ويا عالمًا بما مضى وما هو آتٍ، أسألك اللهم بقدرتك على كل شيء، وباستغنائك عن جميع خلقك، وبحمدك ومجدك يا إله كل شيء، وأسألك اللهم أن تجود علي بقضاء حاجتي، إنك قادر على كل شيء يا رب العالمين، يا عظيم يُرجى لكل عظيم، يا عليمًا أنت بحالنا عليم، اللهم أصلح لنا شأننا بما أصلحت به شأن عبادك الصالحين، ولا تكلنا لأنفسنا طرفة عين ولا أقل من ذلك. اللهم اقضِ حاجتي، ونفّس كربتي، وما نزل بي من حيرتي» (ثم تُسمى الحاجة) «وصلى الله وسلم على سيدنا محمد وعلى آله وصحبه وسلم تسليمًا كثيرًا»</w:t>
+        <w:t xml:space="preserve">﴿رَبِّ اشْرَحْ لِي صَدْرِي وَيَسِّرْ لِي أَمْرِي وَاحْلُلْ عُقْدَةً مِّن لِّسَانِي يَفْقَهُوا قَوْلِي﴾</w:t>
       </w:r>
     </w:p>
     <w:p>
@@ -3235,7 +3235,7 @@
           <w:szCs w:val="24"/>
           <w:rtl/>
         </w:rPr>
-        <w:t xml:space="preserve">﴿رَبِّ اشْرَحْ لِي صَدْرِي وَيَسِّرْ لِي أَمْرِي وَاحْلُلْ عُقْدَةً مِّن لِّسَانِي يَفْقَهُوا قَوْلِي﴾</w:t>
+        <w:t xml:space="preserve">لرد الشيء الضائع (وسيلة أخرى): «اللهم رب الضالة، هادي الضالة، تهدي من الضلالة، رد علي ضالتي بقدرتك وسلطانك من عطائك وفضلك، اللهم بإجماع الناس ليوم القيامة اجمعني مع ضالتي»</w:t>
       </w:r>
     </w:p>
     <w:p>
@@ -3269,7 +3269,7 @@
           <w:szCs w:val="24"/>
           <w:rtl/>
         </w:rPr>
-        <w:t xml:space="preserve">لرد الشيء الضائع (وسيلة أخرى): «اللهم رب الضالة، هادي الضالة، تهدي من الضلالة، رد علي ضالتي بقدرتك وسلطانك من عطائك وفضلك، اللهم بإجماع الناس ليوم القيامة اجمعني مع ضالتي»</w:t>
+        <w:t xml:space="preserve">حرز الإمام الحسن العسكري: «بسم الله الرحمن الرحيم، يا عدتي عند شدتي، ويا غوثي عند كربتي، ويا مؤنسي عند وحدتي، احرسني بعينك التي لا تنام، واكنفني بركنك الذي لا يُرام»</w:t>
       </w:r>
     </w:p>
     <w:p>
@@ -3303,7 +3303,7 @@
           <w:szCs w:val="24"/>
           <w:rtl/>
         </w:rPr>
-        <w:t xml:space="preserve">حرز الإمام الحسن العسكري: «بسم الله الرحمن الرحيم، يا عدتي عند شدتي، ويا غوثي عند كربتي، ويا مؤنسي عند وحدتي، احرسني بعينك التي لا تنام، واكنفني بركنك الذي لا يُرام»</w:t>
+        <w:t xml:space="preserve">دعاء سيدنا يوسف عليه السلام (علّمه إياه جبريل وهو في الجُبّ): «اللهم إني أسألك بأن لك الحمد لا إله إلا أنت المنّان، بديع السماوات والأرض، ذو الجلال والإكرام، أن تصلي على محمد وآل محمد، وأن تجعل لي مما أنا فيه فرجًا ومخرجًا»</w:t>
       </w:r>
     </w:p>
     <w:p>
@@ -3337,7 +3337,7 @@
           <w:szCs w:val="24"/>
           <w:rtl/>
         </w:rPr>
-        <w:t xml:space="preserve">دعاء سيدنا يوسف عليه السلام (علّمه إياه جبريل وهو في الجُبّ): «اللهم إني أسألك بأن لك الحمد لا إله إلا أنت المنّان، بديع السماوات والأرض، ذو الجلال والإكرام، أن تصلي على محمد وآل محمد، وأن تجعل لي مما أنا فيه فرجًا ومخرجًا»</w:t>
+        <w:t xml:space="preserve">دعاء الشدة (كان الإمام زين العابدين يوصي به ابنه): من أصابته مصيبة أو نزلت به نازلة، يتوضأ ويُسبغ الوضوء، ثم يصلي ركعتين أو أربعًا، ثم يقول في آخرهن: «يا موضع كل شكوى، ويا سامع كل نجوى، ويا شاهد كل ملأ، ويا عالم كل خفية، ويا دافع ما يشاء من بلية، يا خليل إبراهيم، ويا نجي موسى، ويا مصطفى محمد صلى الله عليه وسلم، أدعوك دعاء من اشتدت فاقته، وقلّت حيلته، وضعفت قوته، دعاء الغريب الغريق المضطر، الذي لا يجد لكشف ما هو فيه إلا أنت يا أرحم الراحمين»</w:t>
       </w:r>
     </w:p>
     <w:p>
@@ -3371,7 +3371,7 @@
           <w:szCs w:val="24"/>
           <w:rtl/>
         </w:rPr>
-        <w:t xml:space="preserve">دعاء الشدة (كان الإمام زين العابدين يوصي به ابنه): من أصابته مصيبة أو نزلت به نازلة، يتوضأ ويُسبغ الوضوء، ثم يصلي ركعتين أو أربعًا، ثم يقول في آخرهن: «يا موضع كل شكوى، ويا سامع كل نجوى، ويا شاهد كل ملأ، ويا عالم كل خفية، ويا دافع ما يشاء من بلية، يا خليل إبراهيم، ويا نجي موسى، ويا مصطفى محمد صلى الله عليه وسلم، أدعوك دعاء من اشتدت فاقته، وقلّت حيلته، وضعفت قوته، دعاء الغريب الغريق المضطر، الذي لا يجد لكشف ما هو فيه إلا أنت يا أرحم الراحمين»</w:t>
+        <w:t xml:space="preserve">دعاء يوم بدر والأحزاب (ودعا به الإمام الحسين يوم عاشوراء بكربلاء): «أنت ثقتي في كل كربة، وأنت رجائي في كل شدة، وأنت لي في كل أمر نزل بي ثقة وعُدّة، كم من كرب يضعف عنه الفؤاد وتقل فيه الحيلة، ويخذل عنه القريب والبعيد، ويشمت به العدو، وتُعييني فيه الأمور، أنزلته بك وشكوته إليك، راغبًا فيه عمّن سواك، ففرّجته وكشفته وكفيتنيه، فأنت ولي كل نعمة، وصاحب كل حاجة، ومنتهى كل رغبة، فلك الحمد كثيرًا، ولك المنّ فاضلًا»</w:t>
       </w:r>
     </w:p>
     <w:p>
@@ -3390,40 +3390,6 @@
           <w:rtl/>
         </w:rPr>
         <w:t xml:space="preserve">الدعاء السادس والستون</w:t>
-      </w:r>
-    </w:p>
-    <w:p>
-      <w:pPr>
-        <w:bidi/>
-        <w:spacing w:after="200" w:line="340"/>
-        <w:jc w:val="right"/>
-      </w:pPr>
-      <w:r>
-        <w:rPr>
-          <w:rFonts w:ascii="Times New Roman" w:cs="Times New Roman" w:eastAsia="Times New Roman" w:hAnsi="Times New Roman"/>
-          <w:sz w:val="24"/>
-          <w:szCs w:val="24"/>
-          <w:rtl/>
-        </w:rPr>
-        <w:t xml:space="preserve">دعاء يوم بدر والأحزاب (ودعا به الإمام الحسين يوم عاشوراء بكربلاء): «أنت ثقتي في كل كربة، وأنت رجائي في كل شدة، وأنت لي في كل أمر نزل بي ثقة وعُدّة، كم من كرب يضعف عنه الفؤاد وتقل فيه الحيلة، ويخذل عنه القريب والبعيد، ويشمت به العدو، وتُعييني فيه الأمور، أنزلته بك وشكوته إليك، راغبًا فيه عمّن سواك، ففرّجته وكشفته وكفيتنيه، فأنت ولي كل نعمة، وصاحب كل حاجة، ومنتهى كل رغبة، فلك الحمد كثيرًا، ولك المنّ فاضلًا»</w:t>
-      </w:r>
-    </w:p>
-    <w:p>
-      <w:pPr>
-        <w:bidi/>
-        <w:spacing w:after="120" w:before="320"/>
-        <w:jc w:val="right"/>
-      </w:pPr>
-      <w:r>
-        <w:rPr>
-          <w:rFonts w:ascii="Times New Roman" w:cs="Times New Roman" w:eastAsia="Times New Roman" w:hAnsi="Times New Roman"/>
-          <w:b/>
-          <w:bCs/>
-          <w:sz w:val="44"/>
-          <w:szCs w:val="44"/>
-          <w:rtl/>
-        </w:rPr>
-        <w:t xml:space="preserve">الدعاء السابع والستون</w:t>
       </w:r>
     </w:p>
     <w:p>
@@ -5245,7 +5211,7 @@
           <w:szCs w:val="24"/>
           <w:rtl/>
         </w:rPr>
-        <w:t xml:space="preserve">12 ركعة: تصلي ركعتين وتسلّم، ثم تُكرر، وفي آخر صلاة يُقال بعد التشهد: «لا إله إلا أنت يا حنان يا منان يا بديع السماوات والأرض يا ذا الجلال والإكرام، اللهم صلِّ على محمد وعلى آل محمد»، ثم تسجد وتقول: الفاتحة (7 مرات)، آية الكرسي (7 مرات)</w:t>
+        <w:t xml:space="preserve">تاج الذكر، تاج التسبيح، تاج الدعاء: «لا إله إلا الله وحده لا شريك له، له الملك وله الحمد وهو على كل شيء قدير» (تاج الذكر)، «سبحان الله وبحمده عدد خلقه ورضا نفسه وزنة عرشه ومداد كلماته» (تاج التسبيح)، «رَبَّنَا آتِنَا فِي الدُّنْيَا حَسَنَةً» (تاج الدعاء)</w:t>
       </w:r>
     </w:p>
     <w:p>
@@ -5279,7 +5245,7 @@
           <w:szCs w:val="24"/>
           <w:rtl/>
         </w:rPr>
-        <w:t xml:space="preserve">تاج الذكر، تاج التسبيح، تاج الدعاء: «لا إله إلا الله وحده لا شريك له، له الملك وله الحمد وهو على كل شيء قدير» (تاج الذكر)، «سبحان الله وبحمده عدد خلقه ورضا نفسه وزنة عرشه ومداد كلماته» (تاج التسبيح)، «رَبَّنَا آتِنَا فِي الدُّنْيَا حَسَنَةً» (تاج الدعاء)</w:t>
+        <w:t xml:space="preserve">«وَلَمَّا دَخَلُوا مِنْ حَيْثُ أَمَرَهُمْ أَبُوهُمْ مَّا كَانَ يُغْنِي عَنْهُم مِّنَ اللَّهِ مِن شَيْءٍ إِلَّا حَاجَةً فِي نَفْسِ يَعْقُوبَ قَضَاهَا، وَإِنَّهُ لَذُو عِلْمٍ لِّمَا عَلَّمْنَاهُ وَلَٰكِنَّ أَكْثَرَ النَّاسِ لَا يَعْلَمُونَ﴾ (سورة يوسف، آية 68) — تُقرأ 7 مرات ثم تُدعى بالحاجة</w:t>
       </w:r>
     </w:p>
     <w:p>
@@ -5313,7 +5279,7 @@
           <w:szCs w:val="24"/>
           <w:rtl/>
         </w:rPr>
-        <w:t xml:space="preserve">«وَلَمَّا دَخَلُوا مِنْ حَيْثُ أَمَرَهُمْ أَبُوهُمْ مَّا كَانَ يُغْنِي عَنْهُم مِّنَ اللَّهِ مِن شَيْءٍ إِلَّا حَاجَةً فِي نَفْسِ يَعْقُوبَ قَضَاهَا، وَإِنَّهُ لَذُو عِلْمٍ لِّمَا عَلَّمْنَاهُ وَلَٰكِنَّ أَكْثَرَ النَّاسِ لَا يَعْلَمُونَ﴾ (سورة يوسف، آية 68) — تُقرأ 7 مرات ثم تُدعى بالحاجة</w:t>
+        <w:t xml:space="preserve">ابدأ يومك بهذه الآيات الثلاث: ﴿رَبِّ أَوْزِعْنِي أَنْ أَشْكُرَ نِعْمَتَكَ الَّتِي أَنْعَمْتَ عَلَيَّ وَعَلَىٰ وَالِدَيَّ وَأَنْ أَعْمَلَ صَالِحًا تَرْضَاهُ وَأَصْلِحْ لِي فِي ذُرِّيَّتِي إِنِّي تُبْتُ إِلَيْكَ وَإِنِّي مِنَ الْمُسْلِمِينَ﴾، ﴿رَبَّنَا هَبْ لَنَا مِنْ أَزْوَاجِنَا وَذُرِّيَّاتِنَا قُرَّةَ أَعْيُنٍ وَاجْعَلْنَا لِلْمُتَّقِينَ إِمَامًا﴾، ﴿رَبِّ هَبْ لِي حُكْمًا وَأَلْحِقْنِي بِالصَّالِحِينَ وَاجْعَل لِّي لِسَانَ صِدْقٍ فِي الْآخِرِينَ وَاجْعَلْنِي مِن وَرَثَةِ جَنَّةِ النَّعِيمِ﴾</w:t>
       </w:r>
     </w:p>
     <w:p>
@@ -5347,7 +5313,7 @@
           <w:szCs w:val="24"/>
           <w:rtl/>
         </w:rPr>
-        <w:t xml:space="preserve">ابدأ يومك بهذه الآيات الثلاث: ﴿رَبِّ أَوْزِعْنِي أَنْ أَشْكُرَ نِعْمَتَكَ الَّتِي أَنْعَمْتَ عَلَيَّ وَعَلَىٰ وَالِدَيَّ وَأَنْ أَعْمَلَ صَالِحًا تَرْضَاهُ وَأَصْلِحْ لِي فِي ذُرِّيَّتِي إِنِّي تُبْتُ إِلَيْكَ وَإِنِّي مِنَ الْمُسْلِمِينَ﴾، ﴿رَبَّنَا هَبْ لَنَا مِنْ أَزْوَاجِنَا وَذُرِّيَّاتِنَا قُرَّةَ أَعْيُنٍ وَاجْعَلْنَا لِلْمُتَّقِينَ إِمَامًا﴾، ﴿رَبِّ هَبْ لِي حُكْمًا وَأَلْحِقْنِي بِالصَّالِحِينَ وَاجْعَل لِّي لِسَانَ صِدْقٍ فِي الْآخِرِينَ وَاجْعَلْنِي مِن وَرَثَةِ جَنَّةِ النَّعِيمِ﴾</w:t>
+        <w:t xml:space="preserve">اللهم إني أسألك الثبات في الأمر، والعزيمة على الرشد، وأسألك موجبات رحمتك وعزائم مغفرتك، وأسألك شكر نعمتك وحسن عبادتك، وأسألك قلبًا سليمًا ولسانًا صادقًا، وأسألك من خير ما تعلم وأعوذ بك من شر ما تعلم، وأستغفرك لما تعلم، إنك أنت علام الغيوب</w:t>
       </w:r>
     </w:p>
     <w:p>
@@ -5381,7 +5347,7 @@
           <w:szCs w:val="24"/>
           <w:rtl/>
         </w:rPr>
-        <w:t xml:space="preserve">اللهم إني أسألك الثبات في الأمر، والعزيمة على الرشد، وأسألك موجبات رحمتك وعزائم مغفرتك، وأسألك شكر نعمتك وحسن عبادتك، وأسألك قلبًا سليمًا ولسانًا صادقًا، وأسألك من خير ما تعلم وأعوذ بك من شر ما تعلم، وأستغفرك لما تعلم، إنك أنت علام الغيوب</w:t>
+        <w:t xml:space="preserve">«اللَّهُمَّ أَنْتَ رَبِّي لَا إِلَهَ إِلَّا أَنْتَ، عَلَيْكَ تَوَكَّلْتُ، وَأَنْتَ رَبُّ الْعَرْشِ الْعَظِيمِ، مَا شَاءَ اللهُ كَانَ وَمَا لَمْ يَشَأْ لَمْ يَكُنْ، لَا حَوْلَ وَلَا قُوَّةَ إِلَّا بِاللَّهِ الْعَلِيِّ الْعَظِيمِ، أَعْلَمُ أَنَّ اللَّهَ عَلَى كُلِّ شَيْءٍ قَدِيرٌ، وَأَنَّ اللَّهَ قَدْ أَحَاطَ بِكُلِّ شَيْءٍ عِلْمًا، اللَّهُمَّ إِنِّي أَعُوذُ بِكَ مِنْ شَرِّ نَفْسِي، وَمِنْ شَرِّ كُلِّ دَابَّةٍ أَنْتَ آخِذٌ بِنَاصِيَتِهَا، إِنَّ رَبِّي عَلَى صِرَاطٍ مُسْتَقِيمٍ»</w:t>
       </w:r>
     </w:p>
     <w:p>
@@ -5415,7 +5381,7 @@
           <w:szCs w:val="24"/>
           <w:rtl/>
         </w:rPr>
-        <w:t xml:space="preserve">«اللَّهُمَّ أَنْتَ رَبِّي لَا إِلَهَ إِلَّا أَنْتَ، عَلَيْكَ تَوَكَّلْتُ، وَأَنْتَ رَبُّ الْعَرْشِ الْعَظِيمِ، مَا شَاءَ اللهُ كَانَ وَمَا لَمْ يَشَأْ لَمْ يَكُنْ، لَا حَوْلَ وَلَا قُوَّةَ إِلَّا بِاللَّهِ الْعَلِيِّ الْعَظِيمِ، أَعْلَمُ أَنَّ اللَّهَ عَلَى كُلِّ شَيْءٍ قَدِيرٌ، وَأَنَّ اللَّهَ قَدْ أَحَاطَ بِكُلِّ شَيْءٍ عِلْمًا، اللَّهُمَّ إِنِّي أَعُوذُ بِكَ مِنْ شَرِّ نَفْسِي، وَمِنْ شَرِّ كُلِّ دَابَّةٍ أَنْتَ آخِذٌ بِنَاصِيَتِهَا، إِنَّ رَبِّي عَلَى صِرَاطٍ مُسْتَقِيمٍ»</w:t>
+        <w:t xml:space="preserve">حسبي الله لا إله إلا هو عليه توكلت وهو رب العرش العظيم (7 مرات). أعوذ بعزة الله وقدرته من شر ما أجد وأحاذر (7 مرات). بسم الله الذي لا يضر مع اسمه شيء في الأرض ولا في السماء وهو السميع العليم (7 مرات)</w:t>
       </w:r>
     </w:p>
     <w:p>
@@ -5449,7 +5415,7 @@
           <w:szCs w:val="24"/>
           <w:rtl/>
         </w:rPr>
-        <w:t xml:space="preserve">حسبي الله لا إله إلا هو عليه توكلت وهو رب العرش العظيم (7 مرات). أعوذ بعزة الله وقدرته من شر ما أجد وأحاذر (7 مرات). بسم الله الذي لا يضر مع اسمه شيء في الأرض ولا في السماء وهو السميع العليم (7 مرات)</w:t>
+        <w:t xml:space="preserve">قل: لن يصيبنا إلا ما كتب الله لنا، هو مولانا، وعلى الله فليتوكل المؤمنون</w:t>
       </w:r>
     </w:p>
     <w:p>
@@ -5483,7 +5449,7 @@
           <w:szCs w:val="24"/>
           <w:rtl/>
         </w:rPr>
-        <w:t xml:space="preserve">قل: لن يصيبنا إلا ما كتب الله لنا، هو مولانا، وعلى الله فليتوكل المؤمنون</w:t>
+        <w:t xml:space="preserve">سبحان الله والحمد لله ولا إله إلا الله والله أكبر، الله الله ربي لا أشرك بك شيئًا. وأيضًا: سبحان الله والحمد لله ولا إله إلا الله والله أكبر، اللهم اهدني اللهم اغفر لي اللهم ارزقني ارحمني</w:t>
       </w:r>
     </w:p>
     <w:p>
@@ -5517,7 +5483,7 @@
           <w:szCs w:val="24"/>
           <w:rtl/>
         </w:rPr>
-        <w:t xml:space="preserve">سبحان الله والحمد لله ولا إله إلا الله والله أكبر، الله الله ربي لا أشرك بك شيئًا. وأيضًا: سبحان الله والحمد لله ولا إله إلا الله والله أكبر، اللهم اهدني اللهم اغفر لي اللهم ارزقني ارحمني</w:t>
+        <w:t xml:space="preserve">بسم الله الذي لا يضر مع اسمه شيء في الأرض ولا في السماء وهو السميع العليم (3 مرات)</w:t>
       </w:r>
     </w:p>
     <w:p>
@@ -5551,7 +5517,7 @@
           <w:szCs w:val="24"/>
           <w:rtl/>
         </w:rPr>
-        <w:t xml:space="preserve">بسم الله الذي لا يضر مع اسمه شيء في الأرض ولا في السماء وهو السميع العليم (3 مرات)</w:t>
+        <w:t xml:space="preserve">يا كثير الخير يا ذا المعروف يا قديم الإحسان، أحسن إلينا بإحسانك القديم برحمتك يا أرحم الراحمين — تُقرأ 3 مرات عند الصباح قبل أن تُكلّم أحدًا، لسعة الرزق والفرج، دون أن تُخبر أحدًا بهذا الدعاء</w:t>
       </w:r>
     </w:p>
     <w:p>
@@ -5585,7 +5551,7 @@
           <w:szCs w:val="24"/>
           <w:rtl/>
         </w:rPr>
-        <w:t xml:space="preserve">يا كثير الخير يا ذا المعروف يا قديم الإحسان، أحسن إلينا بإحسانك القديم برحمتك يا أرحم الراحمين — تُقرأ 3 مرات عند الصباح قبل أن تُكلّم أحدًا، لسعة الرزق والفرج، دون أن تُخبر أحدًا بهذا الدعاء</w:t>
+        <w:t xml:space="preserve">من يسأل الله شيئًا إلا أعطاه إياه: «اللهم أنت خلقتني وأنت تهديني، وأنت تطعمني وأنت تسقيني، وأنت تُميتني وأنت تُحييني» (7 مرات يوميًا صباحًا ومساءً)، ثم: «كريم رسول الله والله أكرمه، فهل من فقير بين الكريمين يُحرم» (3 مرات) ثم ادعُ يُستجاب لك</w:t>
       </w:r>
     </w:p>
     <w:p>
@@ -5619,7 +5585,7 @@
           <w:szCs w:val="24"/>
           <w:rtl/>
         </w:rPr>
-        <w:t xml:space="preserve">من يسأل الله شيئًا إلا أعطاه إياه: «اللهم أنت خلقتني وأنت تهديني، وأنت تطعمني وأنت تسقيني، وأنت تُميتني وأنت تُحييني» (7 مرات يوميًا صباحًا ومساءً)، ثم: «كريم رسول الله والله أكرمه، فهل من فقير بين الكريمين يُحرم» (3 مرات) ثم ادعُ يُستجاب لك</w:t>
+        <w:t xml:space="preserve">دعاء لتنوير القبر والصراط: «الله أكبر كبيرًا، عدد الشفع والوتر، وكلمات الله التامات الطيبات المباركة» (3 مرات صباحًا)</w:t>
       </w:r>
     </w:p>
     <w:p>
@@ -5653,7 +5619,7 @@
           <w:szCs w:val="24"/>
           <w:rtl/>
         </w:rPr>
-        <w:t xml:space="preserve">دعاء لتنوير القبر والصراط: «الله أكبر كبيرًا، عدد الشفع والوتر، وكلمات الله التامات الطيبات المباركة» (3 مرات صباحًا)</w:t>
+        <w:t xml:space="preserve">سبحان الله عدد ما خلق، سبحان الله ملء ما خلق، سبحان الله عدد ما في الأرض والسماء، سبحان الله ملء ما في الأرض والسماء، سبحان الله عدد ما أحصى كتابه، سبحان الله عدد كل شيء، سبحان الله ملء كل شيء. الحمد لله عدد ما خلق، الحمد لله ملء ما خلق، الحمد لله عدد ما في الأرض والسماء، الحمد لله ملء ما في الأرض والسماء، الحمد لله عدد ما أحصى كتابه، الحمد لله عدد كل شيء، الحمد لله ملء كل شيء</w:t>
       </w:r>
     </w:p>
     <w:p>
@@ -5687,7 +5653,7 @@
           <w:szCs w:val="24"/>
           <w:rtl/>
         </w:rPr>
-        <w:t xml:space="preserve">سبحان الله عدد ما خلق، سبحان الله ملء ما خلق، سبحان الله عدد ما في الأرض والسماء، سبحان الله ملء ما في الأرض والسماء، سبحان الله عدد ما أحصى كتابه، سبحان الله عدد كل شيء، سبحان الله ملء كل شيء. الحمد لله عدد ما خلق، الحمد لله ملء ما خلق، الحمد لله عدد ما في الأرض والسماء، الحمد لله ملء ما في الأرض والسماء، الحمد لله عدد ما أحصى كتابه، الحمد لله عدد كل شيء، الحمد لله ملء كل شيء</w:t>
+        <w:t xml:space="preserve">وِرد يومي بالحروف النورانية في فواتح 29 سورة (يُقرأ بسم الله الرحمن الرحيم قبل كل منها): البقرة (الم)، آل عمران (الم)، الأعراف (المص)، يونس (الر)، هود (الر)، يوسف (الر)، الرعد (المر)، إبراهيم (الر)، الحجر (الر)، مريم (كهيعص)، طه (طه)، الشعراء (طسم)، النمل (طس)، القصص (طسم)، العنكبوت (الم)، الروم (الم)، لقمان (الم)، السجدة (الم)، يس (يس)، ص (ص)، غافر (حم)، فصلت (حم)، الشورى (حم عسق)، الزخرف (حم)، الدخان (حم)، الجاثية (حم)، الأحقاف (حم)، ق (ق)، القلم (ن)</w:t>
       </w:r>
     </w:p>
     <w:p>
@@ -5721,7 +5687,7 @@
           <w:szCs w:val="24"/>
           <w:rtl/>
         </w:rPr>
-        <w:t xml:space="preserve">وِرد يومي بالحروف النورانية في فواتح 29 سورة (يُقرأ بسم الله الرحمن الرحيم قبل كل منها): البقرة (الم)، آل عمران (الم)، الأعراف (المص)، يونس (الر)، هود (الر)، يوسف (الر)، الرعد (المر)، إبراهيم (الر)، الحجر (الر)، مريم (كهيعص)، طه (طه)، الشعراء (طسم)، النمل (طس)، القصص (طسم)، العنكبوت (الم)، الروم (الم)، لقمان (الم)، السجدة (الم)، يس (يس)، ص (ص)، غافر (حم)، فصلت (حم)، الشورى (حم عسق)، الزخرف (حم)، الدخان (حم)، الجاثية (حم)، الأحقاف (حم)، ق (ق)، القلم (ن)</w:t>
+        <w:t xml:space="preserve">السبع الآيات المنجيات: ﴿قُل لَّن يُصِيبَنَا إِلَّا مَا كَتَبَ اللَّهُ لَنَا هُوَ مَوْلَانَا وَعَلَى اللَّهِ فَلْيَتَوَكَّلِ الْمُؤْمِنُونَ﴾، ﴿وَإِن يَمْسَسْكَ اللَّهُ بِضُرٍّ فَلَا كَاشِفَ لَهُ إِلَّا هُوَ وَإِن يُرِدْكَ بِخَيْرٍ فَلَا رَادَّ لِفَضْلِهِ يُصِيبُ بِهِ مَن يَشَاءُ مِنْ عِبَادِهِ وَهُوَ الْغَفُورُ الرَّحِيمُ﴾، ﴿وَمَا مِن دَابَّةٍ فِي الْأَرْضِ إِلَّا عَلَى اللَّهِ رِزْقُهَا وَيَعْلَمُ مُسْتَقَرَّهَا وَمُسْتَوْدَعَهَا كُلٌّ فِي كِتَابٍ مُّبِينٍ﴾، ﴿إِنِّي تَوَكَّلْتُ عَلَى اللَّهِ رَبِّي وَرَبِّكُم مَّا مِن دَابَّةٍ إِلَّا هُوَ آخِذٌ بِنَاصِيَتِهَا إِنَّ رَبِّي عَلَىٰ صِرَاطٍ مُّسْتَقِيمٍ﴾، ﴿وَكَأَيِّن مِّن دَابَّةٍ لَّا تَحْمِلُ رِزْقَهَا اللَّهُ يَرْزُقُهَا وَإِيَّاكُمْ وَهُوَ السَّمِيعُ الْعَلِيمُ﴾، ﴿مَّا يَفْتَحِ اللَّهُ لِلنَّاسِ مِن رَّحْمَةٍ فَلَا مُمْسِكَ لَهَا وَمَا يُمْسِكْ فَلَا مُرْسِلَ لَهُ مِن بَعْدِهِ وَهُوَ الْعَزِيزُ الْحَكِيمُ﴾، ﴿وَلَئِن سَأَلْتَهُم مَّنْ خَلَقَ السَّمَاوَاتِ وَالْأَرْضَ لَيَقُولُنَّ اللَّهُ قُلْ أَفَرَأَيْتُم مَّا تَدْعُونَ مِن دُونِ اللَّهِ إِنْ أَرَادَنِيَ اللَّهُ بِضُرٍّ هَلْ هُنَّ كَاشِفَاتُ ضُرِّهِ أَوْ أَرَادَنِي بِرَحْمَةٍ هَلْ هُنَّ مُمْسِكَاتُ رَحْمَتِهِ قُلْ حَسْبِيَ اللَّهُ عَلَيْهِ يَتَوَكَّلُ الْمُتَوَكِّلُونَ﴾</w:t>
       </w:r>
     </w:p>
     <w:p>
@@ -5755,7 +5721,7 @@
           <w:szCs w:val="24"/>
           <w:rtl/>
         </w:rPr>
-        <w:t xml:space="preserve">السبع الآيات المنجيات: ﴿قُل لَّن يُصِيبَنَا إِلَّا مَا كَتَبَ اللَّهُ لَنَا هُوَ مَوْلَانَا وَعَلَى اللَّهِ فَلْيَتَوَكَّلِ الْمُؤْمِنُونَ﴾، ﴿وَإِن يَمْسَسْكَ اللَّهُ بِضُرٍّ فَلَا كَاشِفَ لَهُ إِلَّا هُوَ وَإِن يُرِدْكَ بِخَيْرٍ فَلَا رَادَّ لِفَضْلِهِ يُصِيبُ بِهِ مَن يَشَاءُ مِنْ عِبَادِهِ وَهُوَ الْغَفُورُ الرَّحِيمُ﴾، ﴿وَمَا مِن دَابَّةٍ فِي الْأَرْضِ إِلَّا عَلَى اللَّهِ رِزْقُهَا وَيَعْلَمُ مُسْتَقَرَّهَا وَمُسْتَوْدَعَهَا كُلٌّ فِي كِتَابٍ مُّبِينٍ﴾، ﴿إِنِّي تَوَكَّلْتُ عَلَى اللَّهِ رَبِّي وَرَبِّكُم مَّا مِن دَابَّةٍ إِلَّا هُوَ آخِذٌ بِنَاصِيَتِهَا إِنَّ رَبِّي عَلَىٰ صِرَاطٍ مُّسْتَقِيمٍ﴾، ﴿وَكَأَيِّن مِّن دَابَّةٍ لَّا تَحْمِلُ رِزْقَهَا اللَّهُ يَرْزُقُهَا وَإِيَّاكُمْ وَهُوَ السَّمِيعُ الْعَلِيمُ﴾، ﴿مَّا يَفْتَحِ اللَّهُ لِلنَّاسِ مِن رَّحْمَةٍ فَلَا مُمْسِكَ لَهَا وَمَا يُمْسِكْ فَلَا مُرْسِلَ لَهُ مِن بَعْدِهِ وَهُوَ الْعَزِيزُ الْحَكِيمُ﴾، ﴿وَلَئِن سَأَلْتَهُم مَّنْ خَلَقَ السَّمَاوَاتِ وَالْأَرْضَ لَيَقُولُنَّ اللَّهُ قُلْ أَفَرَأَيْتُم مَّا تَدْعُونَ مِن دُونِ اللَّهِ إِنْ أَرَادَنِيَ اللَّهُ بِضُرٍّ هَلْ هُنَّ كَاشِفَاتُ ضُرِّهِ أَوْ أَرَادَنِي بِرَحْمَةٍ هَلْ هُنَّ مُمْسِكَاتُ رَحْمَتِهِ قُلْ حَسْبِيَ اللَّهُ عَلَيْهِ يَتَوَكَّلُ الْمُتَوَكِّلُونَ﴾</w:t>
+        <w:t xml:space="preserve">«لا إله إلا الله الجليل الجبار، لا إله إلا الله الواحد القهار، لا إله إلا الله الكريم الستار، لا إله إلا الله الكبير المتعال، لا إله إلا الله وحده لا شريك له، إلهًا واحدًا ربًا وشاهدًا أحدًا وصمدًا ونحن له مسلمون» ثم تُكرر بنفس الصيغة: «...ونحن له عابدون»، «...ونحن له قانتون»، «...ونحن له صابرون»، ثم: «لا إله إلا الله محمد رسول الله، اللهم إني إليك فوّضت أمري وعليك توكلت يا أرحم الراحمين، اللهم صلِّ على محمد وعلى آل محمد كما صليت على إبراهيم وآل إبراهيم، وبارك على محمد وعلى آل محمد كما باركت على إبراهيم وآل إبراهيم في العالمين، إنك حميد مجيد»</w:t>
       </w:r>
     </w:p>
     <w:p>
@@ -5789,7 +5755,7 @@
           <w:szCs w:val="24"/>
           <w:rtl/>
         </w:rPr>
-        <w:t xml:space="preserve">«لا إله إلا الله الجليل الجبار، لا إله إلا الله الواحد القهار، لا إله إلا الله الكريم الستار، لا إله إلا الله الكبير المتعال، لا إله إلا الله وحده لا شريك له، إلهًا واحدًا ربًا وشاهدًا أحدًا وصمدًا ونحن له مسلمون» ثم تُكرر بنفس الصيغة: «...ونحن له عابدون»، «...ونحن له قانتون»، «...ونحن له صابرون»، ثم: «لا إله إلا الله محمد رسول الله، اللهم إني إليك فوّضت أمري وعليك توكلت يا أرحم الراحمين، اللهم صلِّ على محمد وعلى آل محمد كما صليت على إبراهيم وآل إبراهيم، وبارك على محمد وعلى آل محمد كما باركت على إبراهيم وآل إبراهيم في العالمين، إنك حميد مجيد»</w:t>
+        <w:t xml:space="preserve">داوم على هذا الذكر يوميًا وستتغير حياتك للأحسن: «الحمد لله» (33 مرة)، «يا مالك» (21 مرة)، «لا إله إلا الله الحي القيوم الحليم الكريم، لا إله إلا الله رب السماوات السبع ورب العرش العظيم» (7 مرات)</w:t>
       </w:r>
     </w:p>
     <w:p>
@@ -5823,7 +5789,7 @@
           <w:szCs w:val="24"/>
           <w:rtl/>
         </w:rPr>
-        <w:t xml:space="preserve">داوم على هذا الذكر يوميًا وستتغير حياتك للأحسن: «الحمد لله» (33 مرة)، «يا مالك» (21 مرة)، «لا إله إلا الله الحي القيوم الحليم الكريم، لا إله إلا الله رب السماوات السبع ورب العرش العظيم» (7 مرات)</w:t>
+        <w:t xml:space="preserve">آيات الصبر والتوكل عند الابتلاء: ﴿وَلَنَبْلُوَنَّكُم بِشَيْءٍ مِّنَ الْخَوْفِ وَالْجُوعِ وَنَقْصٍ مِّنَ الْأَمْوَالِ وَالْأَنفُسِ وَالثَّمَرَاتِ وَبَشِّرِ الصَّابِرِينَ * الَّذِينَ إِذَا أَصَابَتْهُم مُّصِيبَةٌ قَالُوا إِنَّا لِلَّهِ وَإِنَّا إِلَيْهِ رَاجِعُونَ﴾، ﴿الَّذِينَ قَالَ لَهُمُ النَّاسُ إِنَّ النَّاسَ قَدْ جَمَعُوا لَكُمْ فَاخْشَوْهُمْ فَزَادَهُمْ إِيمَانًا وَقَالُوا حَسْبُنَا اللَّهُ وَنِعْمَ الْوَكِيلُ﴾، ﴿وَمَا كَانَ قَوْلَهُمْ إِلَّا أَن قَالُوا رَبَّنَا اغْفِرْ لَنَا ذُنُوبَنَا وَإِسْرَافَنَا فِي أَمْرِنَا وَثَبِّتْ أَقْدَامَنَا وَانصُرْنَا عَلَى الْقَوْمِ الْكَافِرِينَ﴾، ﴿فَسَتَذْكُرُونَ مَا أَقُولُ لَكُمْ وَأُفَوِّضُ أَمْرِي إِلَى اللَّهِ إِنَّ اللَّهَ بَصِيرٌ بِالْعِبَادِ﴾، ﴿وَذَا النُّونِ إِذ ذَّهَبَ مُغَاضِبًا فَظَنَّ أَن لَّن نَّقْدِرَ عَلَيْهِ فَنَادَىٰ فِي الظُّلُمَاتِ أَن لَّا إِلَٰهَ إِلَّا أَنتَ سُبْحَانَكَ إِنِّي كُنتُ مِنَ الظَّالِمِينَ * فَاسْتَجَبْنَا لَهُ وَنَجَّيْنَاهُ مِنَ الْغَمِّ وَكَذَٰلِكَ نُنجِي الْمُؤْمِنِينَ﴾</w:t>
       </w:r>
     </w:p>
     <w:p>
@@ -5857,7 +5823,7 @@
           <w:szCs w:val="24"/>
           <w:rtl/>
         </w:rPr>
-        <w:t xml:space="preserve">آيات الصبر والتوكل عند الابتلاء: ﴿وَلَنَبْلُوَنَّكُم بِشَيْءٍ مِّنَ الْخَوْفِ وَالْجُوعِ وَنَقْصٍ مِّنَ الْأَمْوَالِ وَالْأَنفُسِ وَالثَّمَرَاتِ وَبَشِّرِ الصَّابِرِينَ * الَّذِينَ إِذَا أَصَابَتْهُم مُّصِيبَةٌ قَالُوا إِنَّا لِلَّهِ وَإِنَّا إِلَيْهِ رَاجِعُونَ﴾، ﴿الَّذِينَ قَالَ لَهُمُ النَّاسُ إِنَّ النَّاسَ قَدْ جَمَعُوا لَكُمْ فَاخْشَوْهُمْ فَزَادَهُمْ إِيمَانًا وَقَالُوا حَسْبُنَا اللَّهُ وَنِعْمَ الْوَكِيلُ﴾، ﴿وَمَا كَانَ قَوْلَهُمْ إِلَّا أَن قَالُوا رَبَّنَا اغْفِرْ لَنَا ذُنُوبَنَا وَإِسْرَافَنَا فِي أَمْرِنَا وَثَبِّتْ أَقْدَامَنَا وَانصُرْنَا عَلَى الْقَوْمِ الْكَافِرِينَ﴾، ﴿فَسَتَذْكُرُونَ مَا أَقُولُ لَكُمْ وَأُفَوِّضُ أَمْرِي إِلَى اللَّهِ إِنَّ اللَّهَ بَصِيرٌ بِالْعِبَادِ﴾، ﴿وَذَا النُّونِ إِذ ذَّهَبَ مُغَاضِبًا فَظَنَّ أَن لَّن نَّقْدِرَ عَلَيْهِ فَنَادَىٰ فِي الظُّلُمَاتِ أَن لَّا إِلَٰهَ إِلَّا أَنتَ سُبْحَانَكَ إِنِّي كُنتُ مِنَ الظَّالِمِينَ * فَاسْتَجَبْنَا لَهُ وَنَجَّيْنَاهُ مِنَ الْغَمِّ وَكَذَٰلِكَ نُنجِي الْمُؤْمِنِينَ﴾</w:t>
+        <w:t xml:space="preserve">أفضل صيغة للاستغفار، ويُفضّل 70 مرة: ﴿رَبِّ اغْفِرْ لِي وَلِوَالِدَيَّ وَلِمَن دَخَلَ بَيْتِيَ مُؤْمِنًا وَلِلْمُؤْمِنِينَ وَالْمُؤْمِنَاتِ وَلَا تَزِدِ الظَّالِمِينَ إِلَّا تَبَارًا﴾</w:t>
       </w:r>
     </w:p>
     <w:p>
@@ -5891,7 +5857,7 @@
           <w:szCs w:val="24"/>
           <w:rtl/>
         </w:rPr>
-        <w:t xml:space="preserve">أفضل صيغة للاستغفار، ويُفضّل 70 مرة: ﴿رَبِّ اغْفِرْ لِي وَلِوَالِدَيَّ وَلِمَن دَخَلَ بَيْتِيَ مُؤْمِنًا وَلِلْمُؤْمِنِينَ وَالْمُؤْمِنَاتِ وَلَا تَزِدِ الظَّالِمِينَ إِلَّا تَبَارًا﴾</w:t>
+        <w:t xml:space="preserve">آيات التسخير: «بسم الله الرحمن الرحيم» (19 مرة)، «اللهم صلِّ على سيدنا محمد الفاتح لما أُغلق، والخاتم لما سبق، ناصر الحق بالحق، الهادي إلى صراطك المستقيم، وعلى آله حق قدره ومقداره العظيم» (19 مرة)، «كهيعص» (195 مرة)، ثم ﴿اللَّهُ الَّذِي خَلَقَ السَّمَاوَاتِ وَالْأَرْضَ وَأَنزَلَ مِنَ السَّمَاءِ مَاءً فَأَخْرَجَ بِهِ مِنَ الثَّمَرَاتِ رِزْقًا لَّكُمْ وَسَخَّرَ لَكُمُ الْفُلْكَ لِتَجْرِيَ فِي الْبَحْرِ بِأَمْرِهِ وَسَخَّرَ لَكُمُ الْأَنْهَارَ * وَسَخَّرَ لَكُمُ الشَّمْسَ وَالْقَمَرَ دَائِبَيْنِ وَسَخَّرَ لَكُمُ اللَّيْلَ وَالنَّهَارَ * وَآتَاكُم مِّن كُلِّ مَا سَأَلْتُمُوهُ وَإِن تَعُدُّوا نِعْمَتَ اللَّهِ لَا تُحْصُوهَا إِنَّ الْإِنسَانَ لَظَلُومٌ كَفَّارٌ﴾ (70 مرة)</w:t>
       </w:r>
     </w:p>
     <w:p>
@@ -5925,7 +5891,7 @@
           <w:szCs w:val="24"/>
           <w:rtl/>
         </w:rPr>
-        <w:t xml:space="preserve">آيات التسخير: «بسم الله الرحمن الرحيم» (19 مرة)، «اللهم صلِّ على سيدنا محمد الفاتح لما أُغلق، والخاتم لما سبق، ناصر الحق بالحق، الهادي إلى صراطك المستقيم، وعلى آله حق قدره ومقداره العظيم» (19 مرة)، «كهيعص» (195 مرة)، ثم ﴿اللَّهُ الَّذِي خَلَقَ السَّمَاوَاتِ وَالْأَرْضَ وَأَنزَلَ مِنَ السَّمَاءِ مَاءً فَأَخْرَجَ بِهِ مِنَ الثَّمَرَاتِ رِزْقًا لَّكُمْ وَسَخَّرَ لَكُمُ الْفُلْكَ لِتَجْرِيَ فِي الْبَحْرِ بِأَمْرِهِ وَسَخَّرَ لَكُمُ الْأَنْهَارَ * وَسَخَّرَ لَكُمُ الشَّمْسَ وَالْقَمَرَ دَائِبَيْنِ وَسَخَّرَ لَكُمُ اللَّيْلَ وَالنَّهَارَ * وَآتَاكُم مِّن كُلِّ مَا سَأَلْتُمُوهُ وَإِن تَعُدُّوا نِعْمَتَ اللَّهِ لَا تُحْصُوهَا إِنَّ الْإِنسَانَ لَظَلُومٌ كَفَّارٌ﴾ (70 مرة)</w:t>
+        <w:t xml:space="preserve">الآيات الست وأجوبتها عند كل شدة: ﴿الَّذِينَ إِذَا أَصَابَتْهُم مُّصِيبَةٌ قَالُوا إِنَّا لِلَّهِ وَإِنَّا إِلَيْهِ رَاجِعُونَ * أُولَٰئِكَ عَلَيْهِمْ صَلَوَاتٌ مِّن رَّبِّهِمْ وَرَحْمَةٌ وَأُولَٰئِكَ هُمُ الْمُهْتَدُونَ﴾، ﴿الَّذِينَ قَالَ لَهُمُ النَّاسُ إِنَّ النَّاسَ قَدْ جَمَعُوا لَكُمْ فَاخْشَوْهُمْ فَزَادَهُمْ إِيمَانًا وَقَالُوا حَسْبُنَا اللَّهُ وَنِعْمَ الْوَكِيلُ * فَانقَلَبُوا بِنِعْمَةٍ مِّنَ اللَّهِ وَفَضْلٍ لَّمْ يَمْسَسْهُمْ سُوءٌ وَاتَّبَعُوا رِضْوَانَ اللَّهِ وَاللَّهُ ذُو فَضْلٍ عَظِيمٍ﴾، ﴿وَذَا النُّونِ إِذ ذَّهَبَ مُغَاضِبًا فَظَنَّ أَن لَّن نَّقْدِرَ عَلَيْهِ فَنَادَىٰ فِي الظُّلُمَاتِ أَن لَّا إِلَٰهَ إِلَّا أَنتَ سُبْحَانَكَ إِنِّي كُنتُ مِنَ الظَّالِمِينَ * فَاسْتَجَبْنَا لَهُ وَنَجَّيْنَاهُ مِنَ الْغَمِّ وَكَذَٰلِكَ نُنجِي الْمُؤْمِنِينَ﴾، ﴿وَأَيُّوبَ إِذْ نَادَىٰ رَبَّهُ أَنِّي مَسَّنِيَ الضُّرُّ وَأَنتَ أَرْحَمُ الرَّاحِمِينَ * فَاسْتَجَبْنَا لَهُ فَكَشَفْنَا مَا بِهِ مِن ضُرٍّ وَآتَيْنَاهُ أَهْلَهُ وَمِثْلَهُم مَّعَهُمْ رَحْمَةً مِّنْ عِندِنَا وَذِكْرَىٰ لِلْعَابِدِينَ﴾، ﴿فَسَتَذْكُرُونَ مَا أَقُولُ لَكُمْ وَأُفَوِّضُ أَمْرِي إِلَى اللَّهِ إِنَّ اللَّهَ بَصِيرٌ بِالْعِبَادِ * فَوَقَاهُ اللَّهُ سَيِّئَاتِ مَا مَكَرُوا وَحَاقَ بِآلِ فِرْعَوْنَ سُوءُ الْعَذَابِ﴾، ﴿وَالَّذِينَ إِذَا فَعَلُوا فَاحِشَةً أَوْ ظَلَمُوا أَنفُسَهُمْ ذَكَرُوا اللَّهَ فَاسْتَغْفَرُوا لِذُنُوبِهِمْ وَمَن يَغْفِرُ الذُّنُوبَ إِلَّا اللَّهُ وَلَمْ يُصِرُّوا عَلَىٰ مَا فَعَلُوا وَهُمْ يَعْلَمُونَ * أُولَٰئِكَ جَزَاؤُهُم مَّغْفِرَةٌ مِّن رَّبِّهِمْ وَجَنَّاتٌ تَجْرِي مِن تَحْتِهَا الْأَنْهَارُ خَالِدِينَ فِيهَا وَنِعْمَ أَجْرُ الْعَامِلِينَ﴾</w:t>
       </w:r>
     </w:p>
     <w:p>
@@ -5959,7 +5925,7 @@
           <w:szCs w:val="24"/>
           <w:rtl/>
         </w:rPr>
-        <w:t xml:space="preserve">الآيات الست وأجوبتها عند كل شدة: ﴿الَّذِينَ إِذَا أَصَابَتْهُم مُّصِيبَةٌ قَالُوا إِنَّا لِلَّهِ وَإِنَّا إِلَيْهِ رَاجِعُونَ * أُولَٰئِكَ عَلَيْهِمْ صَلَوَاتٌ مِّن رَّبِّهِمْ وَرَحْمَةٌ وَأُولَٰئِكَ هُمُ الْمُهْتَدُونَ﴾، ﴿الَّذِينَ قَالَ لَهُمُ النَّاسُ إِنَّ النَّاسَ قَدْ جَمَعُوا لَكُمْ فَاخْشَوْهُمْ فَزَادَهُمْ إِيمَانًا وَقَالُوا حَسْبُنَا اللَّهُ وَنِعْمَ الْوَكِيلُ * فَانقَلَبُوا بِنِعْمَةٍ مِّنَ اللَّهِ وَفَضْلٍ لَّمْ يَمْسَسْهُمْ سُوءٌ وَاتَّبَعُوا رِضْوَانَ اللَّهِ وَاللَّهُ ذُو فَضْلٍ عَظِيمٍ﴾، ﴿وَذَا النُّونِ إِذ ذَّهَبَ مُغَاضِبًا فَظَنَّ أَن لَّن نَّقْدِرَ عَلَيْهِ فَنَادَىٰ فِي الظُّلُمَاتِ أَن لَّا إِلَٰهَ إِلَّا أَنتَ سُبْحَانَكَ إِنِّي كُنتُ مِنَ الظَّالِمِينَ * فَاسْتَجَبْنَا لَهُ وَنَجَّيْنَاهُ مِنَ الْغَمِّ وَكَذَٰلِكَ نُنجِي الْمُؤْمِنِينَ﴾، ﴿وَأَيُّوبَ إِذْ نَادَىٰ رَبَّهُ أَنِّي مَسَّنِيَ الضُّرُّ وَأَنتَ أَرْحَمُ الرَّاحِمِينَ * فَاسْتَجَبْنَا لَهُ فَكَشَفْنَا مَا بِهِ مِن ضُرٍّ وَآتَيْنَاهُ أَهْلَهُ وَمِثْلَهُم مَّعَهُمْ رَحْمَةً مِّنْ عِندِنَا وَذِكْرَىٰ لِلْعَابِدِينَ﴾، ﴿فَسَتَذْكُرُونَ مَا أَقُولُ لَكُمْ وَأُفَوِّضُ أَمْرِي إِلَى اللَّهِ إِنَّ اللَّهَ بَصِيرٌ بِالْعِبَادِ * فَوَقَاهُ اللَّهُ سَيِّئَاتِ مَا مَكَرُوا وَحَاقَ بِآلِ فِرْعَوْنَ سُوءُ الْعَذَابِ﴾، ﴿وَالَّذِينَ إِذَا فَعَلُوا فَاحِشَةً أَوْ ظَلَمُوا أَنفُسَهُمْ ذَكَرُوا اللَّهَ فَاسْتَغْفَرُوا لِذُنُوبِهِمْ وَمَن يَغْفِرُ الذُّنُوبَ إِلَّا اللَّهُ وَلَمْ يُصِرُّوا عَلَىٰ مَا فَعَلُوا وَهُمْ يَعْلَمُونَ * أُولَٰئِكَ جَزَاؤُهُم مَّغْفِرَةٌ مِّن رَّبِّهِمْ وَجَنَّاتٌ تَجْرِي مِن تَحْتِهَا الْأَنْهَارُ خَالِدِينَ فِيهَا وَنِعْمَ أَجْرُ الْعَامِلِينَ﴾</w:t>
+        <w:t xml:space="preserve">دعاء للآخرة: ﴿وَاجْعَلْنِي مِن وَرَثَةِ جَنَّةِ النَّعِيمِ﴾ و﴿رَبِّ ابْنِ لِي عِندَكَ بَيْتًا فِي الْجَنَّةِ وَنَجِّنِي مِن فِرْعَوْنَ وَعَمَلِهِ وَنَجِّنِي مِنَ الْقَوْمِ الظَّالِمِينَ﴾</w:t>
       </w:r>
     </w:p>
     <w:p>
@@ -5993,7 +5959,7 @@
           <w:szCs w:val="24"/>
           <w:rtl/>
         </w:rPr>
-        <w:t xml:space="preserve">دعاء للآخرة: ﴿وَاجْعَلْنِي مِن وَرَثَةِ جَنَّةِ النَّعِيمِ﴾ و﴿رَبِّ ابْنِ لِي عِندَكَ بَيْتًا فِي الْجَنَّةِ وَنَجِّنِي مِن فِرْعَوْنَ وَعَمَلِهِ وَنَجِّنِي مِنَ الْقَوْمِ الظَّالِمِينَ﴾</w:t>
+        <w:t xml:space="preserve">«الحمد لله ربي لا أشرك به شيئًا، وأشهد ألا إله إلا الله»</w:t>
       </w:r>
     </w:p>
     <w:p>
@@ -6027,7 +5993,7 @@
           <w:szCs w:val="24"/>
           <w:rtl/>
         </w:rPr>
-        <w:t xml:space="preserve">«الحمد لله ربي لا أشرك به شيئًا، وأشهد ألا إله إلا الله»</w:t>
+        <w:t xml:space="preserve">مجموعة أدعية الاستغفار: ﴿فَقُلْتُ اسْتَغْفِرُوا رَبَّكُمْ إِنَّهُ كَانَ غَفَّارًا * يُرْسِلِ السَّمَاءَ عَلَيْكُم مِّدْرَارًا * وَيُمْدِدْكُمْ بِأَمْوَالٍ وَبَنِينَ وَيَجْعَل لَّكُمْ جَنَّاتٍ وَيَجْعَل لَّكُمْ أَنْهَارًا﴾. سيد الاستغفار: «اللهم أنت ربي لا إله إلا أنت، خلقتني وأنا عبدك، وأنا على عهدك ووعدك ما استطعت، أعوذ بك من شر ما صنعت، أبوء لك بنعمتك علي، وأبوء لك بذنبي، فاغفر لي فإنه لا يغفر الذنوب إلا أنت». «اللهم إني ظلمت نفسي ظلمًا كثيرًا، ولا يغفر الذنوب إلا أنت، فاغفر لي مغفرة من عندك وارحمني إنك أنت الغفور الرحيم». «رب اغفر لي خطيئتي وجهلي وإسرافي في أمري كله، وما أنت أعلم به مني، اللهم اغفر لي خطاياي وعمدي وجهلي وهزلي وكل ذلك عندي، اللهم اغفر لي ما قدمت وما أخرت وما أسررت وما أعلنت، أنت المقدم وأنت المؤخر وأنت على كل شيء قدير». «أستغفر الله العظيم الذي لا إله إلا هو الحي القيوم وأتوب إليه». «رب اغفر لي وتب علي إنك أنت التواب الرحيم»</w:t>
       </w:r>
     </w:p>
     <w:p>
@@ -6061,7 +6027,7 @@
           <w:szCs w:val="24"/>
           <w:rtl/>
         </w:rPr>
-        <w:t xml:space="preserve">مجموعة أدعية الاستغفار: ﴿فَقُلْتُ اسْتَغْفِرُوا رَبَّكُمْ إِنَّهُ كَانَ غَفَّارًا * يُرْسِلِ السَّمَاءَ عَلَيْكُم مِّدْرَارًا * وَيُمْدِدْكُمْ بِأَمْوَالٍ وَبَنِينَ وَيَجْعَل لَّكُمْ جَنَّاتٍ وَيَجْعَل لَّكُمْ أَنْهَارًا﴾. سيد الاستغفار: «اللهم أنت ربي لا إله إلا أنت، خلقتني وأنا عبدك، وأنا على عهدك ووعدك ما استطعت، أعوذ بك من شر ما صنعت، أبوء لك بنعمتك علي، وأبوء لك بذنبي، فاغفر لي فإنه لا يغفر الذنوب إلا أنت». «اللهم إني ظلمت نفسي ظلمًا كثيرًا، ولا يغفر الذنوب إلا أنت، فاغفر لي مغفرة من عندك وارحمني إنك أنت الغفور الرحيم». «رب اغفر لي خطيئتي وجهلي وإسرافي في أمري كله، وما أنت أعلم به مني، اللهم اغفر لي خطاياي وعمدي وجهلي وهزلي وكل ذلك عندي، اللهم اغفر لي ما قدمت وما أخرت وما أسررت وما أعلنت، أنت المقدم وأنت المؤخر وأنت على كل شيء قدير». «أستغفر الله العظيم الذي لا إله إلا هو الحي القيوم وأتوب إليه». «رب اغفر لي وتب علي إنك أنت التواب الرحيم»</w:t>
+        <w:t xml:space="preserve">من قال حين يصبح 3 مرات: «الحمد لله رب العالمين، الحمد لله حمدًا كثيرًا طيبًا مباركًا فيه» صرف الله عنه سبعين نوعًا من البلاء أدناها الهمّ (عن سلمان الفارسي)</w:t>
       </w:r>
     </w:p>
     <w:p>
@@ -6095,7 +6061,7 @@
           <w:szCs w:val="24"/>
           <w:rtl/>
         </w:rPr>
-        <w:t xml:space="preserve">من قال حين يصبح 3 مرات: «الحمد لله رب العالمين، الحمد لله حمدًا كثيرًا طيبًا مباركًا فيه» صرف الله عنه سبعين نوعًا من البلاء أدناها الهمّ (عن سلمان الفارسي)</w:t>
+        <w:t xml:space="preserve">كفارة المجلس: «سبحانك اللهم وبحمدك، أشهد أن لا إله إلا أنت، أستغفرك وأتوب إليك» — يُقال قبل القيام من أي مجلس، فيُغفر ما كان فيه من لغط</w:t>
       </w:r>
     </w:p>
     <w:p>
@@ -6114,40 +6080,6 @@
           <w:rtl/>
         </w:rPr>
         <w:t xml:space="preserve">الدعاء الثاني والثلاثون</w:t>
-      </w:r>
-    </w:p>
-    <w:p>
-      <w:pPr>
-        <w:bidi/>
-        <w:spacing w:after="200" w:line="340"/>
-        <w:jc w:val="right"/>
-      </w:pPr>
-      <w:r>
-        <w:rPr>
-          <w:rFonts w:ascii="Times New Roman" w:cs="Times New Roman" w:eastAsia="Times New Roman" w:hAnsi="Times New Roman"/>
-          <w:sz w:val="24"/>
-          <w:szCs w:val="24"/>
-          <w:rtl/>
-        </w:rPr>
-        <w:t xml:space="preserve">كفارة المجلس: «سبحانك اللهم وبحمدك، أشهد أن لا إله إلا أنت، أستغفرك وأتوب إليك» — يُقال قبل القيام من أي مجلس، فيُغفر ما كان فيه من لغط</w:t>
-      </w:r>
-    </w:p>
-    <w:p>
-      <w:pPr>
-        <w:bidi/>
-        <w:spacing w:after="120" w:before="320"/>
-        <w:jc w:val="right"/>
-      </w:pPr>
-      <w:r>
-        <w:rPr>
-          <w:rFonts w:ascii="Times New Roman" w:cs="Times New Roman" w:eastAsia="Times New Roman" w:hAnsi="Times New Roman"/>
-          <w:b/>
-          <w:bCs/>
-          <w:sz w:val="44"/>
-          <w:szCs w:val="44"/>
-          <w:rtl/>
-        </w:rPr>
-        <w:t xml:space="preserve">الدعاء الثالث والثلاثون</w:t>
       </w:r>
     </w:p>
     <w:p>
@@ -9878,6 +9810,122 @@
           <w:rtl/>
         </w:rPr>
         <w:t xml:space="preserve">الدعاء الجامع للميت (نسخة شاملة تجمع صيغ متعددة متداولة): اللهم اغفر له وارحمه واعفُ عنه وأكرمه. اللهم وسّع مدخله، وأدخله الجنة، واغسله بالثلج والماء والبرد. اللهم يمّن كتابه، وهوّن حسابه، ولَيّن ترابه، وثبّت أقدامه، وألهمه حسن الجواب. اللهم طيّب ثراه، وأكرم مثواه، واجعل الجنة مستقره ومأواه. اللهم نوّر مرقده، وعطّر مشهده، وطيّب مضجعه. اللهم آنس وحشته، وارحم غربته، وقِه عذاب القبر وعذاب النار. اللهم نقّه من خطاياه كما يُنقى الثوب الأبيض من الدنس. اللهم افسح له في قبره، واجعله روضة من رياض الجنة، ولا تجعله حفرة من حفر النار. اللهم انقله من ضيق اللحود والقبور إلى سعة الدور والقصور، مع الذين أنعمت عليهم من الصديقين والصالحين والشهداء. اللهم اجعل له من فوقه ومن تحته ومن أمامه ومن خلفه وعن يمينه وعن يساره نورًا من نورك يا نور السماوات والأرض. اللهم أبدله دارًا خيرًا من داره، وأهلًا خيرًا من أهله، وزوجًا خيرًا من زوجه، وأسكنه فسيح جناتك في الدرجات العلى، آمين. اللهم إن كان قد أحسن فزد في إحسانه، وإن كان قد أساء فتجاوز عن إساءته. اللهم عامله بما أنت أهله، ولا تعامله بما هو أهله. اللهم اجزه عن الإحسان إحسانًا، وعن الإساءة عفوًا وغفرانًا. اللهم أدخله الجنة من غير مناقشة حساب ولا سابقة عذاب. اللهم أفسح له في قبره مد بصره، وأفرش قبره من فراش الجنة، وجافِ الأرض عن جنبيه. اللهم املأ قبره بالرضا والنور والفسحة والسرور. اللهم إنه في ذمتك وحبل جوارك، فقِه فتنة القبر وعذاب النار، وأنت أهل الوفاء والحق فاغفر له وارحمه إنك أنت الغفور الرحيم. اللهم إنه عبدك وابن عبدك، خرج من الدنيا وسعتها ومحبوبيه وأحبائه إلى ظلمة القبر وما هو لاقيه. اللهم إنه كان يشهد أنك لا إله إلا أنت وأن محمدًا عبدك ورسولك، وأنت أعلم به. اللهم ثبّته عند السؤال. اللهم إنا نتوسل بك إليك ونُقسم بك عليك أن ترحمه ولا تعذبه. اللهم إنه نزل بك وأنت خير مَنزول به، وأصبح فقيرًا إلى رحمتك وأنت غني عن عذابه. اللهم آته برحمتك ورضاك، وقِه فتنة القبر وعذابه، حتى تبعثه إلى جنتك يا أرحم الراحمين. اللهم انقله من مواطن الدود وضيق اللحود إلى جنات الخلود. اللهم احمه تحت الأرض، واستره يوم العرض، ولا تُخزه يوم يُبعثون، ﴿يَوْمَ لَا يَنفَعُ مَالٌ وَلَا بَنُونَ * إِلَّا مَنْ أَتَى اللَّهَ بِقَلْبٍ سَلِيمٍ﴾. اللهم يمّن كتابه، ويسّر حسابه، وثقّل بالحسنات ميزانه، وثبّت على الصراط أقدامه، وأسكنه في أعلى الجنات بجوار حبيبك ومصطفاك صلى الله عليه وسلم. اللهم آمنه من فزع يوم القيامة ومن هوله، واجعل نفسه آمنة مطمئنة، ولقّنه حجته. اللهم اجعله في بطن القبر مطمئنًا، وعند قيام الأشهاد آمنًا، وبجود رضوانك واثقًا، وإلى أعلى درجاتك سابقًا. اللهم اجعل عن يمينه نورًا وعن شماله نورًا، ومن أمامه نورًا ومن فوقه نورًا، حتى تبعثه آمنًا مطمئنًا في نور من نورك. اللهم انظر إليه نظرة رضا، فإن من تنظر إليه نظرة رضا لا تعذبه أبدًا. اللهم أسكنه فسيح الجنان، واغفر له يا رحمن، وارحم يا رحيم، وتجاوز عما تعلم يا عليم. اللهم اعفُ عنه فإنك القائل ﴿وَيَعْفُو عَن كَثِيرٍ﴾. اللهم إنه جاء بابك وأناخ بجنابك، فجُد عليه بعفوك وإكرامك وجود إحسانك. اللهم إن رحمتك وسعت كل شيء فارحمه رحمة تطمئن بها نفسه وتقر بها عينه. اللهم احشره مع المتقين إلى الرحمن وفدًا، ومع أصحاب اليمين، واجعل تحيته سلامًا من أصحاب اليمين. اللهم بشّره بقولك ﴿كُلُوا وَاشْرَبُوا هَنِيئًا بِمَا أَسْلَفْتُمْ فِي الْأَيَّامِ الْخَالِيَةِ﴾. اللهم اجعله من الذين سعدوا في الجنة خالدين فيها ما دامت السماوات والأرض. اللهم شفّع فيه نبينا ومصطفاك، واحشره تحت لوائه، واسقه من يده الشريفة شربة هنيئة لا يظمأ بعدها أبدًا. اللهم إنه كان مصليًا لك فثبّته على الصراط يوم تزل الأقدام، وإن كان صائمًا فأدخله الجنة من باب الريان، وإن كان لكتابك تاليًا وسامعًا فشفّع فيه القرآن وارحمه من النيران، واجعله يرتقي في الجنة إلى آخر آية قرأها أو سمعها وآخر حرف تلاه. اللهم ارزقه بكل حرف من القرآن حلاوة، وبكل كلمة كرامة، وبكل آية سعادة، وبكل سورة سلامة، وبكل جزء جزاءً. اللهم اغفر لحيّنا وميتنا، وشاهدنا وغائبنا، وصغيرنا وكبيرنا، وذكرنا وأنثانا. اللهم من أحييته منا فأحيه على الإسلام، ومن توفيته منا فتوفه على الإيمان. اللهم لا تحرمنا أجره، ولا تُضلّنا بعده. اللهم انزل على أهله الصبر والسلوان، وأرضهم بقضائك، وثبّتهم على القول الثابت في الحياة الدنيا وفي الآخرة. اللهم صلِّ وسلم وبارك على سيدنا محمد وعلى آله وصحبه وسلم إلى يوم الدين.</w:t>
+      </w:r>
+    </w:p>
+    <w:p>
+      <w:pPr>
+        <w:pStyle w:val="Heading1"/>
+        <w:pageBreakBefore/>
+        <w:pBdr>
+          <w:bottom w:val="single" w:color="0F6657" w:sz="6" w:space="8"/>
+        </w:pBdr>
+        <w:bidi/>
+        <w:spacing w:after="300" w:before="200"/>
+        <w:jc w:val="center"/>
+      </w:pPr>
+      <w:r>
+        <w:rPr>
+          <w:rFonts w:ascii="Times New Roman" w:cs="Times New Roman" w:eastAsia="Times New Roman" w:hAnsi="Times New Roman"/>
+          <w:b/>
+          <w:bCs/>
+          <w:color w:val="0F6657"/>
+          <w:sz w:val="36"/>
+          <w:szCs w:val="36"/>
+          <w:rtl/>
+        </w:rPr>
+        <w:t xml:space="preserve">19. عِدّية يس</w:t>
+      </w:r>
+    </w:p>
+    <w:p>
+      <w:pPr>
+        <w:bidi/>
+        <w:spacing w:after="120" w:before="320"/>
+        <w:jc w:val="right"/>
+      </w:pPr>
+      <w:r>
+        <w:rPr>
+          <w:rFonts w:ascii="Times New Roman" w:cs="Times New Roman" w:eastAsia="Times New Roman" w:hAnsi="Times New Roman"/>
+          <w:b/>
+          <w:bCs/>
+          <w:sz w:val="44"/>
+          <w:szCs w:val="44"/>
+          <w:rtl/>
+        </w:rPr>
+        <w:t xml:space="preserve">الدعاء الأول</w:t>
+      </w:r>
+    </w:p>
+    <w:p>
+      <w:pPr>
+        <w:bidi/>
+        <w:spacing w:after="200" w:line="340"/>
+        <w:jc w:val="right"/>
+      </w:pPr>
+      <w:r>
+        <w:rPr>
+          <w:rFonts w:ascii="Times New Roman" w:cs="Times New Roman" w:eastAsia="Times New Roman" w:hAnsi="Times New Roman"/>
+          <w:sz w:val="24"/>
+          <w:szCs w:val="24"/>
+          <w:rtl/>
+        </w:rPr>
+        <w:t xml:space="preserve">عِدّية يس (قراءة سورة يس مع تكرار آيات وأدعية بينية، لقضاء الحاجة والحماية من الحسد والكفاية من الناس): 1. تُقرأ الآية الأولى «يس ۚ وَالْقُرْآنِ الْحَكِيمِ» (7 مرات)، ثم تُكمل قراءة السورة عاديًا حتى نهاية الآية 8. 2. بعد الآية 8، تُدعى: «اللهم بيمن نوره وسره في خلقه وسره في الجسد، أخفِ عني أعين الناظرين وقلوب الحاسدين والباغين، واحفظني كما حفظت الروح في الجسد، إنك على كل شيء قدير» 3. تُقرأ الآية 9 «سَوَاءٌ عَلَيْهِمْ أَأَنذَرْتَهُمْ أَمْ لَمْ تُنذِرْهُمْ لَا يُؤْمِنُونَ» (3 مرات)، ثم تُكمل القراءة حتى نهاية الآية 27. 4. بعد الآية 27، تُدعى: «اللهم أكرمني بقضاء حاجتي» (وتُسمّى الحاجة) «واكرمني بطاعتك يا ذا الجلال والإكرام» — يُكرر هذا الدعاء 3 مرات. 5. تُكمل القراءة حتى نهاية الآية 37، ثم تُردد هذه الآية «وَآيَةٌ لَّهُمُ اللَّيْلُ نَسْلَخُ مِنْهُ النَّهَارَ...» (14 مرة)، ثم تُدعى: «اللهم إني أسألك من فضلك الواسع وجودك السابغ أن تُغنيني عن جميع خلقك بالله» — يُكرر 3 مرات. 6. تُكمل القراءة حتى نهاية الآية 57، ثم تُردد هذه الآية «سَلَامٌ قَوْلًا مِّن رَّبٍّ رَّحِيمٍ» (16 مرة)، ثم تُدعى: «اللهم سلّمنا من آفات الدنيا وفتنها يا رب العالمين» 7. تُكمل قراءة باقي السورة حتى الآية 83 (آخرها). 8. يُختم بالدعاء التالي: «سبحان المنفّس عن كل مهموم، سبحان العليم بما كان وما يكون، سبحان من إذا أراد شيئًا قال له كن فيكون، سبحان الذي بيده ملكوت كل شيء وإليه تُرجعون، يا صمد يا إلهي، يا صمد معتمدي، اقضِ حاجتي» (وتُذكر الحاجة) «... بحق يس، ومن أنزلها، ومن نزلت عليه، ومن نزلت به»</w:t>
+      </w:r>
+    </w:p>
+    <w:p>
+      <w:pPr>
+        <w:pStyle w:val="Heading1"/>
+        <w:pageBreakBefore/>
+        <w:pBdr>
+          <w:bottom w:val="single" w:color="0F6657" w:sz="6" w:space="8"/>
+        </w:pBdr>
+        <w:bidi/>
+        <w:spacing w:after="300" w:before="200"/>
+        <w:jc w:val="center"/>
+      </w:pPr>
+      <w:r>
+        <w:rPr>
+          <w:rFonts w:ascii="Times New Roman" w:cs="Times New Roman" w:eastAsia="Times New Roman" w:hAnsi="Times New Roman"/>
+          <w:b/>
+          <w:bCs/>
+          <w:color w:val="0F6657"/>
+          <w:sz w:val="36"/>
+          <w:szCs w:val="36"/>
+          <w:rtl/>
+        </w:rPr>
+        <w:t xml:space="preserve">20. صلاة الاثنتي عشرة ركعة</w:t>
+      </w:r>
+    </w:p>
+    <w:p>
+      <w:pPr>
+        <w:bidi/>
+        <w:spacing w:after="120" w:before="320"/>
+        <w:jc w:val="right"/>
+      </w:pPr>
+      <w:r>
+        <w:rPr>
+          <w:rFonts w:ascii="Times New Roman" w:cs="Times New Roman" w:eastAsia="Times New Roman" w:hAnsi="Times New Roman"/>
+          <w:b/>
+          <w:bCs/>
+          <w:sz w:val="44"/>
+          <w:szCs w:val="44"/>
+          <w:rtl/>
+        </w:rPr>
+        <w:t xml:space="preserve">الدعاء الأول</w:t>
+      </w:r>
+    </w:p>
+    <w:p>
+      <w:pPr>
+        <w:bidi/>
+        <w:spacing w:after="200" w:line="340"/>
+        <w:jc w:val="right"/>
+      </w:pPr>
+      <w:r>
+        <w:rPr>
+          <w:rFonts w:ascii="Times New Roman" w:cs="Times New Roman" w:eastAsia="Times New Roman" w:hAnsi="Times New Roman"/>
+          <w:sz w:val="24"/>
+          <w:szCs w:val="24"/>
+          <w:rtl/>
+        </w:rPr>
+        <w:t xml:space="preserve">12 ركعة: تصلي ركعتين وتسلّم، ثم تُكرر، وفي آخر صلاة يُقال بعد التشهد: «لا إله إلا أنت يا حنان يا منان يا بديع السماوات والأرض يا ذا الجلال والإكرام، اللهم صلِّ على محمد وعلى آل محمد»، ثم تسجد وتقول: الفاتحة (7 مرات)، آية الكرسي (7 مرات)</w:t>
       </w:r>
     </w:p>
     <w:sectPr>

</xml_diff>

<commit_message>
Regenerate Word export with the new "feared place/person" category
Co-Authored-By: Claude Sonnet 5 <noreply@anthropic.com>
Claude-Session: https://claude.ai/code/session_015v8MN6VZjbnhmn7ju2JYhZ
</commit_message>
<xml_diff>
--- a/خزانة الأدعية.docx
+++ b/خزانة الأدعية.docx
@@ -1841,7 +1841,7 @@
           <w:szCs w:val="24"/>
           <w:rtl/>
         </w:rPr>
-        <w:t xml:space="preserve">يُدعى به في الشدة والفاقة ولسعة الرزق: «اللهم يا أول الأولين، ويا آخر الآخرين، ويا ذا القوة المتين، ويا راحم المساكين، ويا أرحم الراحمين» ثم الدعاء</w:t>
+        <w:t xml:space="preserve">لطلب المستحيل، دعاء فيه اسم الله الأعظم: «اللهم إني أسألك بأني أشهد أنك أنت الله لا إله إلا أنت، الأحد الصمد الذي لم يلد ولم يولد ولم يكن له كفوًا أحد» ثم ادعُ على يقين. وأيضًا: «اللهم إني أسألك بأن لك الحمد، لا إله إلا أنت، المنان بديع السماوات والأرض، يا ذا الجلال والإكرام، يا حي يا قيوم» ثم اطلب ما تريد</w:t>
       </w:r>
     </w:p>
     <w:p>
@@ -1875,7 +1875,7 @@
           <w:szCs w:val="24"/>
           <w:rtl/>
         </w:rPr>
-        <w:t xml:space="preserve">لطلب المستحيل، دعاء فيه اسم الله الأعظم: «اللهم إني أسألك بأني أشهد أنك أنت الله لا إله إلا أنت، الأحد الصمد الذي لم يلد ولم يولد ولم يكن له كفوًا أحد» ثم ادعُ على يقين. وأيضًا: «اللهم إني أسألك بأن لك الحمد، لا إله إلا أنت، المنان بديع السماوات والأرض، يا ذا الجلال والإكرام، يا حي يا قيوم» ثم اطلب ما تريد</w:t>
+        <w:t xml:space="preserve">عند الإحساس بالظلم في أي موقف، أو اليأس، أو انغلاق أبواب الرزق، لتفريج الكربات وتأمين القلوب وتفويض الأمر لله (100 مرة): «حسبنا الله سيؤتينا الله من فضله، إنا إلى الله راغبون» و«إن ولي الله الذي نزل الكتاب وهو يتولى الصالحين»</w:t>
       </w:r>
     </w:p>
     <w:p>
@@ -1909,7 +1909,7 @@
           <w:szCs w:val="24"/>
           <w:rtl/>
         </w:rPr>
-        <w:t xml:space="preserve">عند الإحساس بالظلم في أي موقف، أو اليأس، أو انغلاق أبواب الرزق، لتفريج الكربات وتأمين القلوب وتفويض الأمر لله (100 مرة): «حسبنا الله سيؤتينا الله من فضله، إنا إلى الله راغبون» و«إن ولي الله الذي نزل الكتاب وهو يتولى الصالحين»</w:t>
+        <w:t xml:space="preserve">دعاء يحقق لك المستحيل: كل ما استعصى عليكم الأمر، فرددوا: «يأتِ بها الله، إن الله لطيف خبير»</w:t>
       </w:r>
     </w:p>
     <w:p>
@@ -1943,7 +1943,7 @@
           <w:szCs w:val="24"/>
           <w:rtl/>
         </w:rPr>
-        <w:t xml:space="preserve">دعاء يحقق لك المستحيل: كل ما استعصى عليكم الأمر، فرددوا: «يأتِ بها الله، إن الله لطيف خبير»</w:t>
+        <w:t xml:space="preserve">«آيات فك الكرب وزيادة الرزق»: ﴿أَفَحَسِبْتُمْ أَنَّمَا خَلَقْنَاكُمْ عَبَثًا وَأَنَّكُمْ إِلَيْنَا لَا تُرْجَعُونَ * فَتَعَالَى اللَّهُ الْمَلِكُ الْحَقُّ لَا إِلَٰهَ إِلَّا هُوَ رَبُّ الْعَرْشِ الْكَرِيمِ * وَمَن يَدْعُ مَعَ اللَّهِ إِلَٰهًا آخَرَ لَا بُرْهَانَ لَهُ بِهِ فَإِنَّمَا حِسَابُهُ عِندَ رَبِّهِ إِنَّهُ لَا يُفْلِحُ الْكَافِرُونَ﴾ ثم ﴿وَقُل رَّبِّ اغْفِرْ وَارْحَمْ وَأَنتَ خَيْرُ الرَّاحِمِينَ﴾</w:t>
       </w:r>
     </w:p>
     <w:p>
@@ -1977,7 +1977,7 @@
           <w:szCs w:val="24"/>
           <w:rtl/>
         </w:rPr>
-        <w:t xml:space="preserve">«آيات فك الكرب وزيادة الرزق»: ﴿أَفَحَسِبْتُمْ أَنَّمَا خَلَقْنَاكُمْ عَبَثًا وَأَنَّكُمْ إِلَيْنَا لَا تُرْجَعُونَ * فَتَعَالَى اللَّهُ الْمَلِكُ الْحَقُّ لَا إِلَٰهَ إِلَّا هُوَ رَبُّ الْعَرْشِ الْكَرِيمِ * وَمَن يَدْعُ مَعَ اللَّهِ إِلَٰهًا آخَرَ لَا بُرْهَانَ لَهُ بِهِ فَإِنَّمَا حِسَابُهُ عِندَ رَبِّهِ إِنَّهُ لَا يُفْلِحُ الْكَافِرُونَ﴾ ثم ﴿وَقُل رَّبِّ اغْفِرْ وَارْحَمْ وَأَنتَ خَيْرُ الرَّاحِمِينَ﴾</w:t>
+        <w:t xml:space="preserve">إذا كثرت المشاكل، فعليك بآية 123 من سورة هود: ﴿وَلِلَّهِ غَيْبُ السَّمَاوَاتِ وَالْأَرْضِ وَإِلَيْهِ يُرْجَعُ الْأَمْرُ كُلُّهُ فَاعْبُدْهُ وَتَوَكَّلْ عَلَيْهِ وَمَا رَبُّكَ بِغَافِلٍ عَمَّا تَعْمَلُونَ﴾</w:t>
       </w:r>
     </w:p>
     <w:p>
@@ -2011,7 +2011,7 @@
           <w:szCs w:val="24"/>
           <w:rtl/>
         </w:rPr>
-        <w:t xml:space="preserve">إذا كثرت المشاكل، فعليك بآية 123 من سورة هود: ﴿وَلِلَّهِ غَيْبُ السَّمَاوَاتِ وَالْأَرْضِ وَإِلَيْهِ يُرْجَعُ الْأَمْرُ كُلُّهُ فَاعْبُدْهُ وَتَوَكَّلْ عَلَيْهِ وَمَا رَبُّكَ بِغَافِلٍ عَمَّا تَعْمَلُونَ﴾</w:t>
+        <w:t xml:space="preserve">فائدة مجرَّبة لقضاء الحوائج وتفريج الكرب: «يا من لا تغيب عني ولا تنساني، أرسل من يحل فرجي وأنا في مكاني» (7 مرات)، «يا عالي يا متعالي، يا دائم يا كبير يا قدوس، يا حي يا قاضي الحاجات، ارمِ مفتاحك وحل قفلي» (3 مرات)</w:t>
       </w:r>
     </w:p>
     <w:p>
@@ -2045,7 +2045,7 @@
           <w:szCs w:val="24"/>
           <w:rtl/>
         </w:rPr>
-        <w:t xml:space="preserve">فائدة مجرَّبة لقضاء الحوائج وتفريج الكرب: «يا من لا تغيب عني ولا تنساني، أرسل من يحل فرجي وأنا في مكاني» (7 مرات)، «يا عالي يا متعالي، يا دائم يا كبير يا قدوس، يا حي يا قاضي الحاجات، ارمِ مفتاحك وحل قفلي» (3 مرات)</w:t>
+        <w:t xml:space="preserve">دعاء الضيق: اللهم خفف عني ثقل هذه الأيام، وارزقني قوة الصبر، واشرح صدري وانزع منه ما استثقلته نفسي، اللهم أرح قلبي يا رب العالمين</w:t>
       </w:r>
     </w:p>
     <w:p>
@@ -2079,7 +2079,7 @@
           <w:szCs w:val="24"/>
           <w:rtl/>
         </w:rPr>
-        <w:t xml:space="preserve">دعاء الضيق: اللهم خفف عني ثقل هذه الأيام، وارزقني قوة الصبر، واشرح صدري وانزع منه ما استثقلته نفسي، اللهم أرح قلبي يا رب العالمين</w:t>
+        <w:t xml:space="preserve">لو كنت خائفًا من حاجة تحصل لك وقلقانًا منها، فعليك بهذا الدعاء: «اللهم لا يأتي بالحسنات إلا أنت، ولا يدفع السيئات إلا أنت، ولا حول ولا قوة إلا بك»</w:t>
       </w:r>
     </w:p>
     <w:p>
@@ -2113,7 +2113,7 @@
           <w:szCs w:val="24"/>
           <w:rtl/>
         </w:rPr>
-        <w:t xml:space="preserve">لو كنت خائفًا من حاجة تحصل لك وقلقانًا منها، فعليك بهذا الدعاء: «اللهم لا يأتي بالحسنات إلا أنت، ولا يدفع السيئات إلا أنت، ولا حول ولا قوة إلا بك»</w:t>
+        <w:t xml:space="preserve">«يا حي يا قيوم برحمتك أستغيث، أصلح لي شأني كله ولا تكلني لنفسي طرفة عين» — دعاء مأثور لإصلاح جميع الأمور</w:t>
       </w:r>
     </w:p>
     <w:p>
@@ -2147,7 +2147,7 @@
           <w:szCs w:val="24"/>
           <w:rtl/>
         </w:rPr>
-        <w:t xml:space="preserve">«يا حي يا قيوم برحمتك أستغيث، أصلح لي شأني كله ولا تكلني لنفسي طرفة عين» — دعاء مأثور لإصلاح جميع الأمور</w:t>
+        <w:t xml:space="preserve">إذا ضاقت الدنيا بك، فردد هذا الدعاء: «اللهم بحق قولك ليس لها من دون الله كاشفة، يا عالم كل خفية، ويا صارف كل بلية، اللهم بك أستغيث، أدعوك دعاء من اشتدت فاقته وضعفت قوته وقلّت حيلته، اللهم بك ملاذي وعياذي، باسمك الواحد الأحد الفرد الصمد أسألك أن تفرّج عني ما أمسيت فيه وأصبحت فيه، اللهم اقضِ حاجتي وأنت أعلم بها يا راحم الراحمين ويا أكرم الأكرمين، يا الله» (آمين)</w:t>
       </w:r>
     </w:p>
     <w:p>
@@ -2181,7 +2181,7 @@
           <w:szCs w:val="24"/>
           <w:rtl/>
         </w:rPr>
-        <w:t xml:space="preserve">إذا ضاقت الدنيا بك، فردد هذا الدعاء: «اللهم بحق قولك ليس لها من دون الله كاشفة، يا عالم كل خفية، ويا صارف كل بلية، اللهم بك أستغيث، أدعوك دعاء من اشتدت فاقته وضعفت قوته وقلّت حيلته، اللهم بك ملاذي وعياذي، باسمك الواحد الأحد الفرد الصمد أسألك أن تفرّج عني ما أمسيت فيه وأصبحت فيه، اللهم اقضِ حاجتي وأنت أعلم بها يا راحم الراحمين ويا أكرم الأكرمين، يا الله» (آمين)</w:t>
+        <w:t xml:space="preserve">«عُبيدك بفنائك، مسكينك بفنائك، فقيرك بفنائك، سائلك بفنائك» — قال طاووس: فحفظتهن فما دعوت بهن في كرب إلا فُرِّج عني</w:t>
       </w:r>
     </w:p>
     <w:p>
@@ -2215,7 +2215,7 @@
           <w:szCs w:val="24"/>
           <w:rtl/>
         </w:rPr>
-        <w:t xml:space="preserve">«عُبيدك بفنائك، مسكينك بفنائك، فقيرك بفنائك، سائلك بفنائك» — قال طاووس: فحفظتهن فما دعوت بهن في كرب إلا فُرِّج عني</w:t>
+        <w:t xml:space="preserve">دعاء طويل مأثور: «اللهم إني أسألك من كل أمر ضعفت عنه قوتي وحيلتي، ولم تنته إليه رغبتي، ولم يخطر ببالي ولم يبلغه أملي، ولم يجرِ على لساني من اليقين الذي أعطيته أحدًا من المخلوقين الأولين والمهاجرين والآخرين، إلا أخصصتني يا أرحم الراحمين. اللهم اقذف في قلبي رجاءك، واقطع رجائي عمّن سواك حتى لا أرجو أحدًا غيرك. اللهم وما ضعفت عنه قوتي وقصر عنه عملي ولم تنته إليه رغبتي، ولم تبلغه مسألتي، ولم يجرِ على لساني مما أعطيت أحدًا من الأولين والآخرين من اليقين، فخصّني به يا رب العالمين. اللهم صلِّ على سيدنا محمد صلاة تُنحل بها العُقد، وتنفك بها الكرب، وتُفتح لنا بها أبواب الفرج»</w:t>
       </w:r>
     </w:p>
     <w:p>
@@ -2249,7 +2249,7 @@
           <w:szCs w:val="24"/>
           <w:rtl/>
         </w:rPr>
-        <w:t xml:space="preserve">دعاء طويل مأثور: «اللهم إني أسألك من كل أمر ضعفت عنه قوتي وحيلتي، ولم تنته إليه رغبتي، ولم يخطر ببالي ولم يبلغه أملي، ولم يجرِ على لساني من اليقين الذي أعطيته أحدًا من المخلوقين الأولين والمهاجرين والآخرين، إلا أخصصتني يا أرحم الراحمين. اللهم اقذف في قلبي رجاءك، واقطع رجائي عمّن سواك حتى لا أرجو أحدًا غيرك. اللهم وما ضعفت عنه قوتي وقصر عنه عملي ولم تنته إليه رغبتي، ولم تبلغه مسألتي، ولم يجرِ على لساني مما أعطيت أحدًا من الأولين والآخرين من اليقين، فخصّني به يا رب العالمين. اللهم صلِّ على سيدنا محمد صلاة تُنحل بها العُقد، وتنفك بها الكرب، وتُفتح لنا بها أبواب الفرج»</w:t>
+        <w:t xml:space="preserve">دعاء المعجزات: «لا إله إلا الله عدد ما كان، لا إله إلا الله عدد ما يكون، لا إله إلا الله عدد الحركات والسكون»</w:t>
       </w:r>
     </w:p>
     <w:p>
@@ -2283,7 +2283,7 @@
           <w:szCs w:val="24"/>
           <w:rtl/>
         </w:rPr>
-        <w:t xml:space="preserve">دعاء المعجزات: «لا إله إلا الله عدد ما كان، لا إله إلا الله عدد ما يكون، لا إله إلا الله عدد الحركات والسكون»</w:t>
+        <w:t xml:space="preserve">دعاء المضطر لقضاء الحاجة الملحّة والمستعجلة: «بسم الله الرحمن الرحيم، اللهم صلِّ على محمد وآل محمد، اللهم رب السماوات السبع وما بينهم، ورب العرش العظيم، ورب جبرائيل وميكائيل وإسرافيل، ورب القرآن العظيم، ورب محمد خاتم النبيين صلى الله عليه وعلى آله وسلم الطيبين الطاهرين، اللهم أني أسألك بالذي تقوم به السماء وبه تقوم الأرض، وبه تُفرّق بين الجمع وبه تُجمع بين المتفرق، وبه تُرزق الأحياء، وبه أحصيت عدد الرمال ووزن الجبال وكيل البحور، أن تصلي على محمد وآل محمد وتقضي حاجتي» (اذكر اسم الحاجة)</w:t>
       </w:r>
     </w:p>
     <w:p>
@@ -2317,7 +2317,7 @@
           <w:szCs w:val="24"/>
           <w:rtl/>
         </w:rPr>
-        <w:t xml:space="preserve">دعاء المضطر لقضاء الحاجة الملحّة والمستعجلة: «بسم الله الرحمن الرحيم، اللهم صلِّ على محمد وآل محمد، اللهم رب السماوات السبع وما بينهم، ورب العرش العظيم، ورب جبرائيل وميكائيل وإسرافيل، ورب القرآن العظيم، ورب محمد خاتم النبيين صلى الله عليه وعلى آله وسلم الطيبين الطاهرين، اللهم أني أسألك بالذي تقوم به السماء وبه تقوم الأرض، وبه تُفرّق بين الجمع وبه تُجمع بين المتفرق، وبه تُرزق الأحياء، وبه أحصيت عدد الرمال ووزن الجبال وكيل البحور، أن تصلي على محمد وآل محمد وتقضي حاجتي» (اذكر اسم الحاجة)</w:t>
+        <w:t xml:space="preserve">اللهم فارج الهم وكاشف الغم، ومجيب دعوة المضطرين، رحمن الدنيا والآخرة ورحيمهما، أنت ترحمني فارحمني برحمة تُغنيني بها عن رحمة من سواك. وأيضًا: «يا رب اكشف عنا الكرب والوباء والبلاء، وارفع عنا كل شدة وعناء، آمين يا رب، ومدّنا بمدد من السماء يا رب العالمين. اللهم يا فارج الهم ويا كاشف الغم، فرّج همّنا ويسّر أمرنا، وارحم ضعفنا وقلة حيلتنا، وخذ بأيدينا إليك أخذ الكرام عليك، آمين يا رب، وحسبنا الله ونعم الوكيل»</w:t>
       </w:r>
     </w:p>
     <w:p>
@@ -2351,7 +2351,7 @@
           <w:szCs w:val="24"/>
           <w:rtl/>
         </w:rPr>
-        <w:t xml:space="preserve">اللهم فارج الهم وكاشف الغم، ومجيب دعوة المضطرين، رحمن الدنيا والآخرة ورحيمهما، أنت ترحمني فارحمني برحمة تُغنيني بها عن رحمة من سواك. وأيضًا: «يا رب اكشف عنا الكرب والوباء والبلاء، وارفع عنا كل شدة وعناء، آمين يا رب، ومدّنا بمدد من السماء يا رب العالمين. اللهم يا فارج الهم ويا كاشف الغم، فرّج همّنا ويسّر أمرنا، وارحم ضعفنا وقلة حيلتنا، وخذ بأيدينا إليك أخذ الكرام عليك، آمين يا رب، وحسبنا الله ونعم الوكيل»</w:t>
+        <w:t xml:space="preserve">عند ضياع أي شيء غالٍ عليك (ولد، زوج، زوجة، عمل...): تصلي ركعتين بنية قضاء الحاجة، استغفار 100 مرة «أستغفر الله العظيم الذي لا إله إلا هو الحي القيوم وأتوب إليه»، صلاة على النبي 100 مرة «اللهم صلِّ وسلم وبارك على سيدنا محمد صلاة تُقضى بها الحوائج وتُفرّج بها الكرب وتُعيد بها كل ما غاب عنا»، ثم يُقال: «يا ذا المعروف الذي لا ينقطع أبدًا ولا يُحصيه غيره، يا من لا يُعلم كيف هو إلا هو، ويا من لا يبلغ قدرته غيره، فرّج عني ما أنا فيه، يا كثير الخير يا دائم المعروف، اللهم اجعل لي من كل همّ همّني من أمري في ديني ودنياي وآخرتي فرجًا ومخرجًا، واغفر لي ذنوبي، وثبّت رجاءك في قلبي واقطعه عمّا سواك حتى لا يكون لي رجاء إلا إياك» ثم يُسمّى الشيء الضائع حتى يرده الله</w:t>
       </w:r>
     </w:p>
     <w:p>
@@ -2385,7 +2385,7 @@
           <w:szCs w:val="24"/>
           <w:rtl/>
         </w:rPr>
-        <w:t xml:space="preserve">عند ضياع أي شيء غالٍ عليك (ولد، زوج، زوجة، عمل...): تصلي ركعتين بنية قضاء الحاجة، استغفار 100 مرة «أستغفر الله العظيم الذي لا إله إلا هو الحي القيوم وأتوب إليه»، صلاة على النبي 100 مرة «اللهم صلِّ وسلم وبارك على سيدنا محمد صلاة تُقضى بها الحوائج وتُفرّج بها الكرب وتُعيد بها كل ما غاب عنا»، ثم يُقال: «يا ذا المعروف الذي لا ينقطع أبدًا ولا يُحصيه غيره، يا من لا يُعلم كيف هو إلا هو، ويا من لا يبلغ قدرته غيره، فرّج عني ما أنا فيه، يا كثير الخير يا دائم المعروف، اللهم اجعل لي من كل همّ همّني من أمري في ديني ودنياي وآخرتي فرجًا ومخرجًا، واغفر لي ذنوبي، وثبّت رجاءك في قلبي واقطعه عمّا سواك حتى لا يكون لي رجاء إلا إياك» ثم يُسمّى الشيء الضائع حتى يرده الله</w:t>
+        <w:t xml:space="preserve">صلاة ركعتين بنية قضاء الحاجة، وأنت جالس بمكانك، تقول 1000 مرة بعد التسليم: «آمنت بالله العلي العظيم، وتوكلت على الحي القيوم»</w:t>
       </w:r>
     </w:p>
     <w:p>
@@ -2419,7 +2419,7 @@
           <w:szCs w:val="24"/>
           <w:rtl/>
         </w:rPr>
-        <w:t xml:space="preserve">صلاة ركعتين بنية قضاء الحاجة، وأنت جالس بمكانك، تقول 1000 مرة بعد التسليم: «آمنت بالله العلي العظيم، وتوكلت على الحي القيوم»</w:t>
+        <w:t xml:space="preserve">دعاء وصلاة لتقبل الدعاء: تصلي ركعتين ثم تقول: «اللهم يا ولي النعم ويا دافع الشرور والنقم، وقفت بعتبة بابك أرجو رحمتك وأخشى عذابك، اللهم لا تعاملني في دعائي هذا بذنوبي ولا بما أنا أهله، وعاملني فيه بفضلك وكرمك وبما أنت أهله، لا باب إلا بابك، ولا رجاء إلا رجاؤك، ولا خير إلا خيرك، اللهم إن لي عندك دعاء فاقبل دعائي، ولي عندك رجاء فلا تردّ رجائي، اللهم استجب، اللهم استجب، اللهم استجب» وسلام على المرسلين والحمد لله رب العالمين</w:t>
       </w:r>
     </w:p>
     <w:p>
@@ -2453,7 +2453,7 @@
           <w:szCs w:val="24"/>
           <w:rtl/>
         </w:rPr>
-        <w:t xml:space="preserve">دعاء وصلاة لتقبل الدعاء: تصلي ركعتين ثم تقول: «اللهم يا ولي النعم ويا دافع الشرور والنقم، وقفت بعتبة بابك أرجو رحمتك وأخشى عذابك، اللهم لا تعاملني في دعائي هذا بذنوبي ولا بما أنا أهله، وعاملني فيه بفضلك وكرمك وبما أنت أهله، لا باب إلا بابك، ولا رجاء إلا رجاؤك، ولا خير إلا خيرك، اللهم إن لي عندك دعاء فاقبل دعائي، ولي عندك رجاء فلا تردّ رجائي، اللهم استجب، اللهم استجب، اللهم استجب» وسلام على المرسلين والحمد لله رب العالمين</w:t>
+        <w:t xml:space="preserve">«يا غني من للفقير سواك، يا عزيز من للذليل سواك، يا قدير من للعاجز سواك، يا قوي من للضعيف سواك» و«يا عزيز، يا جبار، يا متكبر، يا ودود، يا نصير» (125 مرة)، ثم الصلاة على خير الورى (125 مرة)</w:t>
       </w:r>
     </w:p>
     <w:p>
@@ -2487,7 +2487,7 @@
           <w:szCs w:val="24"/>
           <w:rtl/>
         </w:rPr>
-        <w:t xml:space="preserve">«يا غني من للفقير سواك، يا عزيز من للذليل سواك، يا قدير من للعاجز سواك، يا قوي من للضعيف سواك» و«يا عزيز، يا جبار، يا متكبر، يا ودود، يا نصير» (125 مرة)، ثم الصلاة على خير الورى (125 مرة)</w:t>
+        <w:t xml:space="preserve">للسيطرة على شخص محتاج منه حاجة: «أَلَا يَعْلَمُ مَنْ خَلَقَ وَهُوَ اللَّطِيفُ الْخَبِيرُ، اللهم اقضِ حاجتي من فلان ابن فلانة، إنك على كل شيء قدير» (100 مرة بعد صلاة الفجر والعصر والعشاء)</w:t>
       </w:r>
     </w:p>
     <w:p>
@@ -2521,7 +2521,7 @@
           <w:szCs w:val="24"/>
           <w:rtl/>
         </w:rPr>
-        <w:t xml:space="preserve">للسيطرة على شخص محتاج منه حاجة: «أَلَا يَعْلَمُ مَنْ خَلَقَ وَهُوَ اللَّطِيفُ الْخَبِيرُ، اللهم اقضِ حاجتي من فلان ابن فلانة، إنك على كل شيء قدير» (100 مرة بعد صلاة الفجر والعصر والعشاء)</w:t>
+        <w:t xml:space="preserve">فائدة لحل المشاكل: «اللهم صلِّ على سيدنا محمد... قد ضاقت حيلتي... أدركني يا رسول الله» (1111 مرة)</w:t>
       </w:r>
     </w:p>
     <w:p>
@@ -2555,7 +2555,7 @@
           <w:szCs w:val="24"/>
           <w:rtl/>
         </w:rPr>
-        <w:t xml:space="preserve">فائدة لحل المشاكل: «اللهم صلِّ على سيدنا محمد... قد ضاقت حيلتي... أدركني يا رسول الله» (1111 مرة)</w:t>
+        <w:t xml:space="preserve">لفك الكربات: «بسم الله الرحمن الرحيم، يا رحمن يا رحيم» (111 مرة)، «اللهم أنزل علينا مائدة من السماء» (111 مرة)</w:t>
       </w:r>
     </w:p>
     <w:p>
@@ -2589,7 +2589,7 @@
           <w:szCs w:val="24"/>
           <w:rtl/>
         </w:rPr>
-        <w:t xml:space="preserve">لفك الكربات: «بسم الله الرحمن الرحيم، يا رحمن يا رحيم» (111 مرة)، «اللهم أنزل علينا مائدة من السماء» (111 مرة)</w:t>
+        <w:t xml:space="preserve">بعد ركعتين صلاة الحاجة، مستقبل الكعبة، تُقال 120 مرة: «أَمَّن يُجِيبُ الْمُضْطَرَّ إِذَا دَعَاهُ وَيَكْشِفُ السُّوءَ» — كل يوم، وشوف بعد أسبوع اللي حيحصل</w:t>
       </w:r>
     </w:p>
     <w:p>
@@ -2623,7 +2623,7 @@
           <w:szCs w:val="24"/>
           <w:rtl/>
         </w:rPr>
-        <w:t xml:space="preserve">بعد ركعتين صلاة الحاجة، مستقبل الكعبة، تُقال 120 مرة: «أَمَّن يُجِيبُ الْمُضْطَرَّ إِذَا دَعَاهُ وَيَكْشِفُ السُّوءَ» — كل يوم، وشوف بعد أسبوع اللي حيحصل</w:t>
+        <w:t xml:space="preserve">«رَبِّ إِنِّي ظَلَمْتُ نَفْسِي وَأَسْلَمْتُ مَعَ سُلَيْمَانَ لِلَّهِ رَبِّ الْعَالَمِينَ» تُقرأ 44 مرة — سر من أسرار فك الكربات</w:t>
       </w:r>
     </w:p>
     <w:p>
@@ -2657,7 +2657,7 @@
           <w:szCs w:val="24"/>
           <w:rtl/>
         </w:rPr>
-        <w:t xml:space="preserve">«رَبِّ إِنِّي ظَلَمْتُ نَفْسِي وَأَسْلَمْتُ مَعَ سُلَيْمَانَ لِلَّهِ رَبِّ الْعَالَمِينَ» تُقرأ 44 مرة — سر من أسرار فك الكربات</w:t>
+        <w:t xml:space="preserve">7 أيام متصلة تُقرأ سورة مريم، والأفضل بعد صلاة المغرب، وفي اليوم السابع بعد قراءة السورة يُقال هذا الدعاء 100 مرة: «بسم الله الرحمن الرحيم، اللهم صلِّ وسلم وزد وبارك عليك سيدي يا رسول الله، اللهم أسألك بحق ما أنزلته في كهيعص أن تحقق لي ما أتمناه» في يقين، وانتظر فرجًا من الله لن يخطر لك على بال</w:t>
       </w:r>
     </w:p>
     <w:p>
@@ -2691,7 +2691,7 @@
           <w:szCs w:val="24"/>
           <w:rtl/>
         </w:rPr>
-        <w:t xml:space="preserve">7 أيام متصلة تُقرأ سورة مريم، والأفضل بعد صلاة المغرب، وفي اليوم السابع بعد قراءة السورة يُقال هذا الدعاء 100 مرة: «بسم الله الرحمن الرحيم، اللهم صلِّ وسلم وزد وبارك عليك سيدي يا رسول الله، اللهم أسألك بحق ما أنزلته في كهيعص أن تحقق لي ما أتمناه» في يقين، وانتظر فرجًا من الله لن يخطر لك على بال</w:t>
+        <w:t xml:space="preserve">سورة تحقيق المعجزات والأمنيات والرزق، خصوصًا في شهر رجب: تُقرأ سورة الإسراء حتى الآيات 80 و81 و82 (تُقرأ 3 مرات)، ثم تُكمل حتى الآية 109 (موضع السجدة) فتسجد وتقول: «سبحان ربي الأعلى، سبحان العلي العظيم، سبحان الله المعز» (3 مرات)، ثم تُكمل لنهاية السورة، ثم تقول: «توكلت على الحي الذي لا يموت، اللهم ارزقني واقضِ حاجتي» (3 مرات)</w:t>
       </w:r>
     </w:p>
     <w:p>
@@ -2725,7 +2725,7 @@
           <w:szCs w:val="24"/>
           <w:rtl/>
         </w:rPr>
-        <w:t xml:space="preserve">سورة تحقيق المعجزات والأمنيات والرزق، خصوصًا في شهر رجب: تُقرأ سورة الإسراء حتى الآيات 80 و81 و82 (تُقرأ 3 مرات)، ثم تُكمل حتى الآية 109 (موضع السجدة) فتسجد وتقول: «سبحان ربي الأعلى، سبحان العلي العظيم، سبحان الله المعز» (3 مرات)، ثم تُكمل لنهاية السورة، ثم تقول: «توكلت على الحي الذي لا يموت، اللهم ارزقني واقضِ حاجتي» (3 مرات)</w:t>
+        <w:t xml:space="preserve">«يا ودود يا ودود، يا ذا العرش المجيد، يا مبدئ يا معيد، يا فعّال لما يريد، أسألك بنور وجهك الذي ملأ أركان عرشك، وأسألك بقدرتك التي قدرت بها على جميع خلقك، وأسألك برحمتك التي وسعت كل شيء، لا إله إلا أنت، يا مغيث أغثني، يا مغيث أغثني، يا مغيث أغثني» ثم الدعاء، ثم استغفار 3 مرات: «أستغفر الله العظيم الذي لا إله إلا هو الحي القيوم وأتوب إليه»</w:t>
       </w:r>
     </w:p>
     <w:p>
@@ -2759,7 +2759,7 @@
           <w:szCs w:val="24"/>
           <w:rtl/>
         </w:rPr>
-        <w:t xml:space="preserve">«يا ودود يا ودود، يا ذا العرش المجيد، يا مبدئ يا معيد، يا فعّال لما يريد، أسألك بنور وجهك الذي ملأ أركان عرشك، وأسألك بقدرتك التي قدرت بها على جميع خلقك، وأسألك برحمتك التي وسعت كل شيء، لا إله إلا أنت، يا مغيث أغثني، يا مغيث أغثني، يا مغيث أغثني» ثم الدعاء، ثم استغفار 3 مرات: «أستغفر الله العظيم الذي لا إله إلا هو الحي القيوم وأتوب إليه»</w:t>
+        <w:t xml:space="preserve">«يا سامع كل صوت، ويُسابق كل فوت، ويا كاسي العظام لحمًا ومُنشرها بعد الموت، أسألك بأسمائك العظام وباسمك الأعظم الأكبر المخزون المكنون الذي لم يطّلع عليه أحد من المخلوقين. يا حليم ذا أناة لا يقدر على أناته أحد. يا ذا المعروف الذي لا ينقطع معروفه أبدًا ولا نُحصي له عددًا، أفرج عني. يا من له وجه لا يبلى، ونور لا يُطفأ، واسم لا يُنسى، وباب لا يُغلق، وستر لا يُهتك، ومُلك لا يفنى، أسألك وأتوسل إليك بجاه سيدنا محمد صلى الله عليه وسلم أن تقضي حاجتي وتُعطيني مسألتي. اللهم إني أعوذ باسمك الواحد الأعز، وأدعوك اللهم باسمك الصمد، وأدعوك اللهم باسمك العظيم الوتر، وأدعوك باسمك الكبير المتعال الذي ثبت به أركانك كلها، أن تكشف عني ضر ما أصبحت وأمسيت فيه»</w:t>
       </w:r>
     </w:p>
     <w:p>
@@ -2793,7 +2793,7 @@
           <w:szCs w:val="24"/>
           <w:rtl/>
         </w:rPr>
-        <w:t xml:space="preserve">«يا سامع كل صوت، ويُسابق كل فوت، ويا كاسي العظام لحمًا ومُنشرها بعد الموت، أسألك بأسمائك العظام وباسمك الأعظم الأكبر المخزون المكنون الذي لم يطّلع عليه أحد من المخلوقين. يا حليم ذا أناة لا يقدر على أناته أحد. يا ذا المعروف الذي لا ينقطع معروفه أبدًا ولا نُحصي له عددًا، أفرج عني. يا من له وجه لا يبلى، ونور لا يُطفأ، واسم لا يُنسى، وباب لا يُغلق، وستر لا يُهتك، ومُلك لا يفنى، أسألك وأتوسل إليك بجاه سيدنا محمد صلى الله عليه وسلم أن تقضي حاجتي وتُعطيني مسألتي. اللهم إني أعوذ باسمك الواحد الأعز، وأدعوك اللهم باسمك الصمد، وأدعوك اللهم باسمك العظيم الوتر، وأدعوك باسمك الكبير المتعال الذي ثبت به أركانك كلها، أن تكشف عني ضر ما أصبحت وأمسيت فيه»</w:t>
+        <w:t xml:space="preserve">دعاء طويل (منظوم) لتفريج الكرب: «رب، عبدك قد ضاقت به الأسباب، وأُغلقت دونه الأبواب، وبَعُد عن جادة الصواب، وزاد به الهمّ والغمّ والاكتئاب، وانقضى عمره ولم يُفتح له إلى فسيح مناهل الصفو والقربات باب، وأنت المرجوّ سبحانك لكشف هذا المصاب، يا من إذا دُعي أجاب، يا سريع الحساب، يا رب الأرباب، يا عظيم الجناب، يا كريم يا وهاب، رب لا تحجب دعوتي ولا ترد مسألتي ولا تدعني بحسرتي ولا تكلني إلى حولي وقوتي، وارحم عجزي فقد ضاق صدري وتاه فكري وتحيرت في أمري، وأنت العالم سبحانك بسري وجهري، المالك لنفعي وضري، القادر على تفريج كربي وتيسير عسري. اللهم أحيِنا في الدنيا مؤمنين طائعين، وتوفنا مسلمين تائبين. اللهم ارحم تضرعنا بين يديك، وقوّمنا إذا اعوججنا، وأدِمْنا إذا استقمنا، وكن لنا ولا تكن علينا. اللهم نسألك يا غفور يا رحمن يا رحيم أن تفتح لأدعيتنا أبواب الإجابة، يا من إذا سأله المضطر أجاب، يا من يقول للشيء كن فيكون، اللهم لا تردنا خائبين، وآتنا أفضل ما يُؤتى عبادك الصالحين، اللهم ولا تصرفنا عن بحر جودك خاسرين ولا ضالين ولا مضلين، واغفر لنا إلى يوم الدين، برحمتك يا أرحم الراحمين، اللهم آمين»</w:t>
       </w:r>
     </w:p>
     <w:p>
@@ -2827,7 +2827,7 @@
           <w:szCs w:val="24"/>
           <w:rtl/>
         </w:rPr>
-        <w:t xml:space="preserve">دعاء طويل (منظوم) لتفريج الكرب: «رب، عبدك قد ضاقت به الأسباب، وأُغلقت دونه الأبواب، وبَعُد عن جادة الصواب، وزاد به الهمّ والغمّ والاكتئاب، وانقضى عمره ولم يُفتح له إلى فسيح مناهل الصفو والقربات باب، وأنت المرجوّ سبحانك لكشف هذا المصاب، يا من إذا دُعي أجاب، يا سريع الحساب، يا رب الأرباب، يا عظيم الجناب، يا كريم يا وهاب، رب لا تحجب دعوتي ولا ترد مسألتي ولا تدعني بحسرتي ولا تكلني إلى حولي وقوتي، وارحم عجزي فقد ضاق صدري وتاه فكري وتحيرت في أمري، وأنت العالم سبحانك بسري وجهري، المالك لنفعي وضري، القادر على تفريج كربي وتيسير عسري. اللهم أحيِنا في الدنيا مؤمنين طائعين، وتوفنا مسلمين تائبين. اللهم ارحم تضرعنا بين يديك، وقوّمنا إذا اعوججنا، وأدِمْنا إذا استقمنا، وكن لنا ولا تكن علينا. اللهم نسألك يا غفور يا رحمن يا رحيم أن تفتح لأدعيتنا أبواب الإجابة، يا من إذا سأله المضطر أجاب، يا من يقول للشيء كن فيكون، اللهم لا تردنا خائبين، وآتنا أفضل ما يُؤتى عبادك الصالحين، اللهم ولا تصرفنا عن بحر جودك خاسرين ولا ضالين ولا مضلين، واغفر لنا إلى يوم الدين، برحمتك يا أرحم الراحمين، اللهم آمين»</w:t>
+        <w:t xml:space="preserve">عند الدخول على أي شخص لقضاء حاجتك (7 مرات): ﴿فَإِن تَوَلَّوْا فَقُلْ حَسْبِيَ اللَّهُ لَا إِلَٰهَ إِلَّا هُوَ عَلَيْهِ تَوَكَّلْتُ وَهُوَ رَبُّ الْعَرْشِ الْعَظِيمِ﴾</w:t>
       </w:r>
     </w:p>
     <w:p>
@@ -2861,7 +2861,7 @@
           <w:szCs w:val="24"/>
           <w:rtl/>
         </w:rPr>
-        <w:t xml:space="preserve">«اللهم لا سهل إلا ما جعلته سهلًا، فإنك تجعل الحزن إن شئت سهلًا»</w:t>
+        <w:t xml:space="preserve">كل ما تعسّرت أحوالك، قل هذا الدعاء (3 أو 7 مرات): «بسم الله الرحمن الرحيم، يا ملك الرقاب، ويا هازم الأحزاب، يا مفتّح الأبواب، ويا مسبّب الأسباب، سبّب لنا سببًا لا نستطيع له طلبًا، بحق لا إله إلا الله ومحمد رسول الله صلى الله عليه وآله أجمعين»</w:t>
       </w:r>
     </w:p>
     <w:p>
@@ -2895,7 +2895,7 @@
           <w:szCs w:val="24"/>
           <w:rtl/>
         </w:rPr>
-        <w:t xml:space="preserve">يا رب، بحق الحوقلة افتحها في وجهي... وادعُ ما شئت، وتقول: «لا حول ولا قوة إلا بالله العلي العظيم» (7 مرات)</w:t>
+        <w:t xml:space="preserve">«يا قادر أنت القادر يا الله» تُقرأ 12 أو 33 مرة بعد كل صلاة، ثم تدعو بما تشاء</w:t>
       </w:r>
     </w:p>
     <w:p>
@@ -2929,7 +2929,7 @@
           <w:szCs w:val="24"/>
           <w:rtl/>
         </w:rPr>
-        <w:t xml:space="preserve">عند الدخول على أي شخص لقضاء حاجتك (7 مرات): ﴿فَإِن تَوَلَّوْا فَقُلْ حَسْبِيَ اللَّهُ لَا إِلَٰهَ إِلَّا هُوَ عَلَيْهِ تَوَكَّلْتُ وَهُوَ رَبُّ الْعَرْشِ الْعَظِيمِ﴾</w:t>
+        <w:t xml:space="preserve">صلاة الحاجة الكاملة (حديث): تصلي ركعتين، وبعد التسليم تقول: «لا إله إلا أنت الحليم الكريم، لا إله إلا أنت رب العرش العظيم، الحمد لله رب العالمين، اللهم إني أسألك موجبات رحمتك، وعزائم مغفرتك، والغنيمة من كل بر، والسلامة من كل إثم، والفوز بالجنة، والنجاة من النار، لا تدع لي ذنبًا إلا غفرته، ولا همًا إلا فرّجته، ولا حاجة من حوائج الدنيا والآخرة إلا قضيتها ويسّرتها برحمتك يا أرحم الراحمين» ثم تطلب ما تريد</w:t>
       </w:r>
     </w:p>
     <w:p>
@@ -2963,7 +2963,7 @@
           <w:szCs w:val="24"/>
           <w:rtl/>
         </w:rPr>
-        <w:t xml:space="preserve">كل ما تعسّرت أحوالك، قل هذا الدعاء (3 أو 7 مرات): «بسم الله الرحمن الرحيم، يا ملك الرقاب، ويا هازم الأحزاب، يا مفتّح الأبواب، ويا مسبّب الأسباب، سبّب لنا سببًا لا نستطيع له طلبًا، بحق لا إله إلا الله ومحمد رسول الله صلى الله عليه وآله أجمعين»</w:t>
+        <w:t xml:space="preserve">﴿عَسَىٰ رَبُّنَا أَن يُبْدِلَنَا خَيْرًا مِّنْهَا إِنَّا إِلَىٰ رَبِّنَا رَاغِبُونَ﴾ — لو ضاع منك شغلانة أو منصب أو فلوس أو أي شيء كنت تحبه، كرر هذه الآية</w:t>
       </w:r>
     </w:p>
     <w:p>
@@ -2997,7 +2997,7 @@
           <w:szCs w:val="24"/>
           <w:rtl/>
         </w:rPr>
-        <w:t xml:space="preserve">«يا قادر أنت القادر يا الله» تُقرأ 12 أو 33 مرة بعد كل صلاة، ثم تدعو بما تشاء</w:t>
+        <w:t xml:space="preserve">الدعاء لفك كل الكربات: يوم الجمعة قبل المغرب بساعة، على وضوء ومتجهًا للقبلة في مكان تختلي فيه بنفسك: استغفار «أستغفر الله العظيم الذي لا إله إلا هو الحي القيوم وأتوب إليه» (100 مرة)، «اللهم صلِّ وسلم وبارك على سيدنا محمد صلاة تُفرّج بها الهم وتُزيح بها الغم وتُسدّد بها الدين وتُحقق بها الآمال» (100 مرة)، ثم تُردد حتى أذان المغرب: ﴿إِذْ أَوَى الْفِتْيَةُ إِلَى الْكَهْفِ فَقَالُوا رَبَّنَا آتِنَا مِن لَّدُنكَ رَحْمَةً وَهَيِّئْ لَنَا مِنْ أَمْرِنَا رَشَدًا﴾، ثم تردد الأذان مع المؤذن، ثم تصلي المغرب وتدعو في السجود الأخير بما تريد</w:t>
       </w:r>
     </w:p>
     <w:p>
@@ -3031,7 +3031,7 @@
           <w:szCs w:val="24"/>
           <w:rtl/>
         </w:rPr>
-        <w:t xml:space="preserve">صلاة الحاجة الكاملة (حديث): تصلي ركعتين، وبعد التسليم تقول: «لا إله إلا أنت الحليم الكريم، لا إله إلا أنت رب العرش العظيم، الحمد لله رب العالمين، اللهم إني أسألك موجبات رحمتك، وعزائم مغفرتك، والغنيمة من كل بر، والسلامة من كل إثم، والفوز بالجنة، والنجاة من النار، لا تدع لي ذنبًا إلا غفرته، ولا همًا إلا فرّجته، ولا حاجة من حوائج الدنيا والآخرة إلا قضيتها ويسّرتها برحمتك يا أرحم الراحمين» ثم تطلب ما تريد</w:t>
+        <w:t xml:space="preserve">طلب الصعاب للحصول على عمل: بعد صلاة العشاء: الصلاة على الرسول (100 مرة)، «بسم الله الرحمن الرحيم» (19 مرة)، «يا رحيم أنت الرحيم يا الله» (95 مرة)، «اللهم فارج الهم وكاشف الغم ومجيب دعوة المضطرين، رحمن الدنيا والآخرة ورحيمهما، ارحمني برحمة من عندك تُغنيني بها عمّن سواك» (7 مرات)</w:t>
       </w:r>
     </w:p>
     <w:p>
@@ -3065,7 +3065,7 @@
           <w:szCs w:val="24"/>
           <w:rtl/>
         </w:rPr>
-        <w:t xml:space="preserve">﴿عَسَىٰ رَبُّنَا أَن يُبْدِلَنَا خَيْرًا مِّنْهَا إِنَّا إِلَىٰ رَبِّنَا رَاغِبُونَ﴾ — لو ضاع منك شغلانة أو منصب أو فلوس أو أي شيء كنت تحبه، كرر هذه الآية</w:t>
+        <w:t xml:space="preserve">دعاء فك الكرب وقضاء الحاجة: «الحمد لله رب العالمين، وأفضل الصلاة وأتم التسليم على سيدنا محمد وعلى آله وصحبه وسلم. أستغفر الله العظيم الذي لا إله إلا هو الحي القيوم وأتوب إليه. اللهم يا جامع الشتات، ويا مُخرج النبات، ويا مُحيي العظام الرفات، ويا مجيب الدعوات، ويا قاضي الحاجات، ويا مُفرّج الكربات، ويا سامع الأصوات من فوق سبع سماوات، ويا فاتح خزائن الكرامات، ويا مالك حوائج جميع المخلوقات، ويا من ملأ نوره السماوات، ويا من أحاط بكل شيء علمًا وأحصى كل شيء عددًا، ويا عالمًا بما مضى وما هو آتٍ، أسألك اللهم بقدرتك على كل شيء، وباستغنائك عن جميع خلقك، وبحمدك ومجدك يا إله كل شيء، وأسألك اللهم أن تجود علي بقضاء حاجتي، إنك قادر على كل شيء يا رب العالمين، يا عظيم يُرجى لكل عظيم، يا عليمًا أنت بحالنا عليم، اللهم أصلح لنا شأننا بما أصلحت به شأن عبادك الصالحين، ولا تكلنا لأنفسنا طرفة عين ولا أقل من ذلك. اللهم اقضِ حاجتي، ونفّس كربتي، وما نزل بي من حيرتي» (ثم تُسمى الحاجة) «وصلى الله وسلم على سيدنا محمد وعلى آله وصحبه وسلم تسليمًا كثيرًا»</w:t>
       </w:r>
     </w:p>
     <w:p>
@@ -3099,7 +3099,7 @@
           <w:szCs w:val="24"/>
           <w:rtl/>
         </w:rPr>
-        <w:t xml:space="preserve">الدعاء لفك كل الكربات: يوم الجمعة قبل المغرب بساعة، على وضوء ومتجهًا للقبلة في مكان تختلي فيه بنفسك: استغفار «أستغفر الله العظيم الذي لا إله إلا هو الحي القيوم وأتوب إليه» (100 مرة)، «اللهم صلِّ وسلم وبارك على سيدنا محمد صلاة تُفرّج بها الهم وتُزيح بها الغم وتُسدّد بها الدين وتُحقق بها الآمال» (100 مرة)، ثم تُردد حتى أذان المغرب: ﴿إِذْ أَوَى الْفِتْيَةُ إِلَى الْكَهْفِ فَقَالُوا رَبَّنَا آتِنَا مِن لَّدُنكَ رَحْمَةً وَهَيِّئْ لَنَا مِنْ أَمْرِنَا رَشَدًا﴾، ثم تردد الأذان مع المؤذن، ثم تصلي المغرب وتدعو في السجود الأخير بما تريد</w:t>
+        <w:t xml:space="preserve">﴿رَبِّ اشْرَحْ لِي صَدْرِي وَيَسِّرْ لِي أَمْرِي وَاحْلُلْ عُقْدَةً مِّن لِّسَانِي يَفْقَهُوا قَوْلِي﴾</w:t>
       </w:r>
     </w:p>
     <w:p>
@@ -3133,7 +3133,7 @@
           <w:szCs w:val="24"/>
           <w:rtl/>
         </w:rPr>
-        <w:t xml:space="preserve">طلب الصعاب للحصول على عمل: بعد صلاة العشاء: الصلاة على الرسول (100 مرة)، «بسم الله الرحمن الرحيم» (19 مرة)، «يا رحيم أنت الرحيم يا الله» (95 مرة)، «اللهم فارج الهم وكاشف الغم ومجيب دعوة المضطرين، رحمن الدنيا والآخرة ورحيمهما، ارحمني برحمة من عندك تُغنيني بها عمّن سواك» (7 مرات)</w:t>
+        <w:t xml:space="preserve">لرد الشيء الضائع (وسيلة أخرى): «اللهم رب الضالة، هادي الضالة، تهدي من الضلالة، رد علي ضالتي بقدرتك وسلطانك من عطائك وفضلك، اللهم بإجماع الناس ليوم القيامة اجمعني مع ضالتي»</w:t>
       </w:r>
     </w:p>
     <w:p>
@@ -3167,7 +3167,7 @@
           <w:szCs w:val="24"/>
           <w:rtl/>
         </w:rPr>
-        <w:t xml:space="preserve">دعاء فك الكرب وقضاء الحاجة: «الحمد لله رب العالمين، وأفضل الصلاة وأتم التسليم على سيدنا محمد وعلى آله وصحبه وسلم. أستغفر الله العظيم الذي لا إله إلا هو الحي القيوم وأتوب إليه. اللهم يا جامع الشتات، ويا مُخرج النبات، ويا مُحيي العظام الرفات، ويا مجيب الدعوات، ويا قاضي الحاجات، ويا مُفرّج الكربات، ويا سامع الأصوات من فوق سبع سماوات، ويا فاتح خزائن الكرامات، ويا مالك حوائج جميع المخلوقات، ويا من ملأ نوره السماوات، ويا من أحاط بكل شيء علمًا وأحصى كل شيء عددًا، ويا عالمًا بما مضى وما هو آتٍ، أسألك اللهم بقدرتك على كل شيء، وباستغنائك عن جميع خلقك، وبحمدك ومجدك يا إله كل شيء، وأسألك اللهم أن تجود علي بقضاء حاجتي، إنك قادر على كل شيء يا رب العالمين، يا عظيم يُرجى لكل عظيم، يا عليمًا أنت بحالنا عليم، اللهم أصلح لنا شأننا بما أصلحت به شأن عبادك الصالحين، ولا تكلنا لأنفسنا طرفة عين ولا أقل من ذلك. اللهم اقضِ حاجتي، ونفّس كربتي، وما نزل بي من حيرتي» (ثم تُسمى الحاجة) «وصلى الله وسلم على سيدنا محمد وعلى آله وصحبه وسلم تسليمًا كثيرًا»</w:t>
+        <w:t xml:space="preserve">حرز الإمام الحسن العسكري: «بسم الله الرحمن الرحيم، يا عدتي عند شدتي، ويا غوثي عند كربتي، ويا مؤنسي عند وحدتي، احرسني بعينك التي لا تنام، واكنفني بركنك الذي لا يُرام»</w:t>
       </w:r>
     </w:p>
     <w:p>
@@ -3201,7 +3201,7 @@
           <w:szCs w:val="24"/>
           <w:rtl/>
         </w:rPr>
-        <w:t xml:space="preserve">﴿رَبِّ اشْرَحْ لِي صَدْرِي وَيَسِّرْ لِي أَمْرِي وَاحْلُلْ عُقْدَةً مِّن لِّسَانِي يَفْقَهُوا قَوْلِي﴾</w:t>
+        <w:t xml:space="preserve">دعاء سيدنا يوسف عليه السلام (علّمه إياه جبريل وهو في الجُبّ): «اللهم إني أسألك بأن لك الحمد لا إله إلا أنت المنّان، بديع السماوات والأرض، ذو الجلال والإكرام، أن تصلي على محمد وآل محمد، وأن تجعل لي مما أنا فيه فرجًا ومخرجًا»</w:t>
       </w:r>
     </w:p>
     <w:p>
@@ -3235,7 +3235,7 @@
           <w:szCs w:val="24"/>
           <w:rtl/>
         </w:rPr>
-        <w:t xml:space="preserve">لرد الشيء الضائع (وسيلة أخرى): «اللهم رب الضالة، هادي الضالة، تهدي من الضلالة، رد علي ضالتي بقدرتك وسلطانك من عطائك وفضلك، اللهم بإجماع الناس ليوم القيامة اجمعني مع ضالتي»</w:t>
+        <w:t xml:space="preserve">دعاء الشدة (كان الإمام زين العابدين يوصي به ابنه): من أصابته مصيبة أو نزلت به نازلة، يتوضأ ويُسبغ الوضوء، ثم يصلي ركعتين أو أربعًا، ثم يقول في آخرهن: «يا موضع كل شكوى، ويا سامع كل نجوى، ويا شاهد كل ملأ، ويا عالم كل خفية، ويا دافع ما يشاء من بلية، يا خليل إبراهيم، ويا نجي موسى، ويا مصطفى محمد صلى الله عليه وسلم، أدعوك دعاء من اشتدت فاقته، وقلّت حيلته، وضعفت قوته، دعاء الغريب الغريق المضطر، الذي لا يجد لكشف ما هو فيه إلا أنت يا أرحم الراحمين»</w:t>
       </w:r>
     </w:p>
     <w:p>
@@ -3269,7 +3269,7 @@
           <w:szCs w:val="24"/>
           <w:rtl/>
         </w:rPr>
-        <w:t xml:space="preserve">حرز الإمام الحسن العسكري: «بسم الله الرحمن الرحيم، يا عدتي عند شدتي، ويا غوثي عند كربتي، ويا مؤنسي عند وحدتي، احرسني بعينك التي لا تنام، واكنفني بركنك الذي لا يُرام»</w:t>
+        <w:t xml:space="preserve">دعاء يوم بدر والأحزاب (ودعا به الإمام الحسين يوم عاشوراء بكربلاء): «أنت ثقتي في كل كربة، وأنت رجائي في كل شدة، وأنت لي في كل أمر نزل بي ثقة وعُدّة، كم من كرب يضعف عنه الفؤاد وتقل فيه الحيلة، ويخذل عنه القريب والبعيد، ويشمت به العدو، وتُعييني فيه الأمور، أنزلته بك وشكوته إليك، راغبًا فيه عمّن سواك، ففرّجته وكشفته وكفيتنيه، فأنت ولي كل نعمة، وصاحب كل حاجة، ومنتهى كل رغبة، فلك الحمد كثيرًا، ولك المنّ فاضلًا»</w:t>
       </w:r>
     </w:p>
     <w:p>
@@ -3288,108 +3288,6 @@
           <w:rtl/>
         </w:rPr>
         <w:t xml:space="preserve">الدعاء الثالث والستون</w:t>
-      </w:r>
-    </w:p>
-    <w:p>
-      <w:pPr>
-        <w:bidi/>
-        <w:spacing w:after="200" w:line="340"/>
-        <w:jc w:val="right"/>
-      </w:pPr>
-      <w:r>
-        <w:rPr>
-          <w:rFonts w:ascii="Times New Roman" w:cs="Times New Roman" w:eastAsia="Times New Roman" w:hAnsi="Times New Roman"/>
-          <w:sz w:val="24"/>
-          <w:szCs w:val="24"/>
-          <w:rtl/>
-        </w:rPr>
-        <w:t xml:space="preserve">دعاء سيدنا يوسف عليه السلام (علّمه إياه جبريل وهو في الجُبّ): «اللهم إني أسألك بأن لك الحمد لا إله إلا أنت المنّان، بديع السماوات والأرض، ذو الجلال والإكرام، أن تصلي على محمد وآل محمد، وأن تجعل لي مما أنا فيه فرجًا ومخرجًا»</w:t>
-      </w:r>
-    </w:p>
-    <w:p>
-      <w:pPr>
-        <w:bidi/>
-        <w:spacing w:after="120" w:before="320"/>
-        <w:jc w:val="right"/>
-      </w:pPr>
-      <w:r>
-        <w:rPr>
-          <w:rFonts w:ascii="Times New Roman" w:cs="Times New Roman" w:eastAsia="Times New Roman" w:hAnsi="Times New Roman"/>
-          <w:b/>
-          <w:bCs/>
-          <w:sz w:val="44"/>
-          <w:szCs w:val="44"/>
-          <w:rtl/>
-        </w:rPr>
-        <w:t xml:space="preserve">الدعاء الرابع والستون</w:t>
-      </w:r>
-    </w:p>
-    <w:p>
-      <w:pPr>
-        <w:bidi/>
-        <w:spacing w:after="200" w:line="340"/>
-        <w:jc w:val="right"/>
-      </w:pPr>
-      <w:r>
-        <w:rPr>
-          <w:rFonts w:ascii="Times New Roman" w:cs="Times New Roman" w:eastAsia="Times New Roman" w:hAnsi="Times New Roman"/>
-          <w:sz w:val="24"/>
-          <w:szCs w:val="24"/>
-          <w:rtl/>
-        </w:rPr>
-        <w:t xml:space="preserve">دعاء الشدة (كان الإمام زين العابدين يوصي به ابنه): من أصابته مصيبة أو نزلت به نازلة، يتوضأ ويُسبغ الوضوء، ثم يصلي ركعتين أو أربعًا، ثم يقول في آخرهن: «يا موضع كل شكوى، ويا سامع كل نجوى، ويا شاهد كل ملأ، ويا عالم كل خفية، ويا دافع ما يشاء من بلية، يا خليل إبراهيم، ويا نجي موسى، ويا مصطفى محمد صلى الله عليه وسلم، أدعوك دعاء من اشتدت فاقته، وقلّت حيلته، وضعفت قوته، دعاء الغريب الغريق المضطر، الذي لا يجد لكشف ما هو فيه إلا أنت يا أرحم الراحمين»</w:t>
-      </w:r>
-    </w:p>
-    <w:p>
-      <w:pPr>
-        <w:bidi/>
-        <w:spacing w:after="120" w:before="320"/>
-        <w:jc w:val="right"/>
-      </w:pPr>
-      <w:r>
-        <w:rPr>
-          <w:rFonts w:ascii="Times New Roman" w:cs="Times New Roman" w:eastAsia="Times New Roman" w:hAnsi="Times New Roman"/>
-          <w:b/>
-          <w:bCs/>
-          <w:sz w:val="44"/>
-          <w:szCs w:val="44"/>
-          <w:rtl/>
-        </w:rPr>
-        <w:t xml:space="preserve">الدعاء الخامس والستون</w:t>
-      </w:r>
-    </w:p>
-    <w:p>
-      <w:pPr>
-        <w:bidi/>
-        <w:spacing w:after="200" w:line="340"/>
-        <w:jc w:val="right"/>
-      </w:pPr>
-      <w:r>
-        <w:rPr>
-          <w:rFonts w:ascii="Times New Roman" w:cs="Times New Roman" w:eastAsia="Times New Roman" w:hAnsi="Times New Roman"/>
-          <w:sz w:val="24"/>
-          <w:szCs w:val="24"/>
-          <w:rtl/>
-        </w:rPr>
-        <w:t xml:space="preserve">دعاء يوم بدر والأحزاب (ودعا به الإمام الحسين يوم عاشوراء بكربلاء): «أنت ثقتي في كل كربة، وأنت رجائي في كل شدة، وأنت لي في كل أمر نزل بي ثقة وعُدّة، كم من كرب يضعف عنه الفؤاد وتقل فيه الحيلة، ويخذل عنه القريب والبعيد، ويشمت به العدو، وتُعييني فيه الأمور، أنزلته بك وشكوته إليك، راغبًا فيه عمّن سواك، ففرّجته وكشفته وكفيتنيه، فأنت ولي كل نعمة، وصاحب كل حاجة، ومنتهى كل رغبة، فلك الحمد كثيرًا، ولك المنّ فاضلًا»</w:t>
-      </w:r>
-    </w:p>
-    <w:p>
-      <w:pPr>
-        <w:bidi/>
-        <w:spacing w:after="120" w:before="320"/>
-        <w:jc w:val="right"/>
-      </w:pPr>
-      <w:r>
-        <w:rPr>
-          <w:rFonts w:ascii="Times New Roman" w:cs="Times New Roman" w:eastAsia="Times New Roman" w:hAnsi="Times New Roman"/>
-          <w:b/>
-          <w:bCs/>
-          <w:sz w:val="44"/>
-          <w:szCs w:val="44"/>
-          <w:rtl/>
-        </w:rPr>
-        <w:t xml:space="preserve">الدعاء السادس والستون</w:t>
       </w:r>
     </w:p>
     <w:p>
@@ -3803,7 +3701,7 @@
           <w:szCs w:val="24"/>
           <w:rtl/>
         </w:rPr>
-        <w:t xml:space="preserve">علشان تسيطر على أي شخص خايف من ظلمه له: قل 7 مرات ﴿فَسَيَكْفِيكَهُمُ اللَّهُ وَهُوَ السَّمِيعُ الْعَلِيمُ﴾ ثم انظر في عينه وقل: «اللهم اكفني شر عبدك هذا بما أردت، اللهم اكفني شره بما شئت»</w:t>
+        <w:t xml:space="preserve">دعاء لكل شخص مظلوم وعنده شخص مؤذي: «سبحان الله الحي القدوس، سبحان الله وبحمده ذو العزة والجبروت، يا عزيز يا حميد يا ذا العرش المجيد، اصرف عني ما أطيق وما لا أطيق، واكفني شر كل جبار عنيد، واصرف عني جار السوء وشر الظالمين»</w:t>
       </w:r>
     </w:p>
     <w:p>
@@ -3822,40 +3720,6 @@
           <w:rtl/>
         </w:rPr>
         <w:t xml:space="preserve">الدعاء الثاني عشر</w:t>
-      </w:r>
-    </w:p>
-    <w:p>
-      <w:pPr>
-        <w:bidi/>
-        <w:spacing w:after="200" w:line="340"/>
-        <w:jc w:val="right"/>
-      </w:pPr>
-      <w:r>
-        <w:rPr>
-          <w:rFonts w:ascii="Times New Roman" w:cs="Times New Roman" w:eastAsia="Times New Roman" w:hAnsi="Times New Roman"/>
-          <w:sz w:val="24"/>
-          <w:szCs w:val="24"/>
-          <w:rtl/>
-        </w:rPr>
-        <w:t xml:space="preserve">دعاء لكل شخص مظلوم وعنده شخص مؤذي: «سبحان الله الحي القدوس، سبحان الله وبحمده ذو العزة والجبروت، يا عزيز يا حميد يا ذا العرش المجيد، اصرف عني ما أطيق وما لا أطيق، واكفني شر كل جبار عنيد، واصرف عني جار السوء وشر الظالمين»</w:t>
-      </w:r>
-    </w:p>
-    <w:p>
-      <w:pPr>
-        <w:bidi/>
-        <w:spacing w:after="120" w:before="320"/>
-        <w:jc w:val="right"/>
-      </w:pPr>
-      <w:r>
-        <w:rPr>
-          <w:rFonts w:ascii="Times New Roman" w:cs="Times New Roman" w:eastAsia="Times New Roman" w:hAnsi="Times New Roman"/>
-          <w:b/>
-          <w:bCs/>
-          <w:sz w:val="44"/>
-          <w:szCs w:val="44"/>
-          <w:rtl/>
-        </w:rPr>
-        <w:t xml:space="preserve">الدعاء الثالث عشر</w:t>
       </w:r>
     </w:p>
     <w:p>
@@ -4031,7 +3895,7 @@
           <w:szCs w:val="24"/>
           <w:rtl/>
         </w:rPr>
-        <w:t xml:space="preserve">إذا كنت تخاف من أي شخص، تُردد هذا الدعاء صباحًا ومساءً: «اللهم رب السماوات السبع، ورب العرش العظيم، كن لي جارًا من (فلان ابن فلان) وأحزابه من خلائقك أن يفرط علي أحد منهم أو يطغى، عزّ جارك، وجلّ ثناؤك، ولا إله غيرك؛ الله أكبر، الله أعز مما أخاف وأحذر. أعوذ بالله الذي لا إله إلا هو، ممسك السماوات السبع أن يقعن على الأرض إلا بإذنه، من شر عبيدك (فلان ابن فلان) وأحزابهم وجنودهم وأشياعهم من الجن والإنس. اللهم كن لي جارًا من شرهم، جلّ ثناؤك وعزّ جارك وتبارك اسمك ولا إله غيرك»</w:t>
+        <w:t xml:space="preserve">لفك السحر، تُقرأ 7 مرات: «سبحان من ملك فقهر، سيُهزم الجمع ويولّون الدبر، سبحان القوي المقتدر، إني مغلوب فانتصر، ليس لها من دون الله كاشفة»</w:t>
       </w:r>
     </w:p>
     <w:p>
@@ -4065,7 +3929,7 @@
           <w:szCs w:val="24"/>
           <w:rtl/>
         </w:rPr>
-        <w:t xml:space="preserve">لفك السحر، تُقرأ 7 مرات: «سبحان من ملك فقهر، سيُهزم الجمع ويولّون الدبر، سبحان القوي المقتدر، إني مغلوب فانتصر، ليس لها من دون الله كاشفة»</w:t>
+        <w:t xml:space="preserve">عند الدخول على أي شخص تخشاه، تُقرأ هذه الآيات: «وَخَشَعَتِ الْأَصْوَاتُ لِلرَّحْمَٰنِ فَلَا تَسْمَعُ إِلَّا هَمْسًا»، «وَعَنَتِ الْوُجُوهُ لِلْحَيِّ الْقَيُّومِ وَقَدْ خَابَ مَنْ حَمَلَ ظُلْمًا»، «أَوَلَمْ يَرَوْا أَنَّ اللَّهَ الَّذِي خَلَقَهُمْ هُوَ أَشَدُّ مِنْهُمْ قُوَّةً»</w:t>
       </w:r>
     </w:p>
     <w:p>
@@ -4099,7 +3963,7 @@
           <w:szCs w:val="24"/>
           <w:rtl/>
         </w:rPr>
-        <w:t xml:space="preserve">عند الدخول على أي شخص تخشاه، تُقرأ هذه الآيات: «وَخَشَعَتِ الْأَصْوَاتُ لِلرَّحْمَٰنِ فَلَا تَسْمَعُ إِلَّا هَمْسًا»، «وَعَنَتِ الْوُجُوهُ لِلْحَيِّ الْقَيُّومِ وَقَدْ خَابَ مَنْ حَمَلَ ظُلْمًا»، «أَوَلَمْ يَرَوْا أَنَّ اللَّهَ الَّذِي خَلَقَهُمْ هُوَ أَشَدُّ مِنْهُمْ قُوَّةً»</w:t>
+        <w:t xml:space="preserve">من أراد بنا خيرًا فوفّقه لكل خير وأعِنّا على إكرامه، ومن أراد بنا شرًا فأشغله بنفسه واصرفه عنا وعوّضنا عنه، يا رب من يجبر بخاطرنا</w:t>
       </w:r>
     </w:p>
     <w:p>
@@ -4133,7 +3997,7 @@
           <w:szCs w:val="24"/>
           <w:rtl/>
         </w:rPr>
-        <w:t xml:space="preserve">من أراد بنا خيرًا فوفّقه لكل خير وأعِنّا على إكرامه، ومن أراد بنا شرًا فأشغله بنفسه واصرفه عنا وعوّضنا عنه، يا رب من يجبر بخاطرنا</w:t>
+        <w:t xml:space="preserve">لمعرفة حقيقة أي شخص في المنام: تُقرأ سورة الليل والشمس والتين (7 مرات) على كوب ماء، وتُدعى: «اللهم فرّج همي ويسّر أمري، اللهم أرني حقيقة من سحرني» (أو من يقصده)</w:t>
       </w:r>
     </w:p>
     <w:p>
@@ -4167,7 +4031,7 @@
           <w:szCs w:val="24"/>
           <w:rtl/>
         </w:rPr>
-        <w:t xml:space="preserve">لدخول مكان تهابه أو مقابلة شخص تخشاه، تُقرأ آية آل عمران 154: ﴿ثُمَّ أَنزَلَ عَلَيْكُم مِّن بَعْدِ الْغَمِّ أَمَنَةً نُّعَاسًا يَغْشَىٰ طَائِفَةً مِّنكُمْ﴾ إلى آخرها، وآية الفتح 29: ﴿مُّحَمَّدٌ رَّسُولُ اللَّهِ وَالَّذِينَ مَعَهُ أَشِدَّاءُ عَلَى الْكُفَّارِ رُحَمَاءُ بَيْنَهُمْ﴾ إلى آخرها</w:t>
+        <w:t xml:space="preserve">لإبطال السحر (7 مرات): ﴿مَا جِئْتُم بِهِ السِّحْرُ إِنَّ اللَّهَ سَيُبْطِلُهُ إِنَّ اللَّهَ لَا يُصْلِحُ عَمَلَ الْمُفْسِدِينَ﴾ و﴿وَيُحِقُّ اللَّهُ الْحَقَّ بِكَلِمَاتِهِ وَلَوْ كَرِهَ الْمُجْرِمُونَ﴾</w:t>
       </w:r>
     </w:p>
     <w:p>
@@ -4201,7 +4065,7 @@
           <w:szCs w:val="24"/>
           <w:rtl/>
         </w:rPr>
-        <w:t xml:space="preserve">لمعرفة حقيقة أي شخص في المنام: تُقرأ سورة الليل والشمس والتين (7 مرات) على كوب ماء، وتُدعى: «اللهم فرّج همي ويسّر أمري، اللهم أرني حقيقة من سحرني» (أو من يقصده)</w:t>
+        <w:t xml:space="preserve">للوقاية من الحسد: ﴿وَجَعَلَنِي مُبَارَكًا أَيْنَ مَا كُنتُ وَأَوْصَانِي بِالصَّلَاةِ وَالزَّكَاةِ مَا دُمْتُ حَيًّا﴾</w:t>
       </w:r>
     </w:p>
     <w:p>
@@ -4235,7 +4099,7 @@
           <w:szCs w:val="24"/>
           <w:rtl/>
         </w:rPr>
-        <w:t xml:space="preserve">لتلجيم أي إنسان خائف منه: «بسم الله الرحمن الرحيم، صمٌّ بكمٌ عميٌ فهم لا يرجعون، صمٌّ بكمٌ عميٌ فهم لا يعقلون، صمٌّ بكمٌ عميٌ فهم لا يبصرون، صمٌّ بكمٌ عميٌ فهم لا يسمعون، صمٌّ بكمٌ عميٌ فهم لا يتكلمون» ثم يُقال: «عقدت لسان فلان ابن فلان عني بحق كهيعص حم عسق، إياك نعبد وإياك نستعين»</w:t>
+        <w:t xml:space="preserve">أعوذ بكلمات الله التامات التي لا يجاوزهن بر ولا فاجر، من شر ما خلق وذرأ وبرأ، ومن شر ما ينزل من السماء ومن شر ما يعرج فيها، ومن شر ما ذرأ في الأرض وبرأ ومن شر ما يخرج منها، ومن شر فتن الليل والنهار، ومن شر كل طارق يطرق إلا طارقًا يطرق بخير يا رحمن</w:t>
       </w:r>
     </w:p>
     <w:p>
@@ -4269,7 +4133,7 @@
           <w:szCs w:val="24"/>
           <w:rtl/>
         </w:rPr>
-        <w:t xml:space="preserve">عقد لسان أي شخص مهما كانت هيبته وجبروته: قبل الذهاب إليه، تُقرأ هذه الآية على كف اليد اليمنى وهي مفتوحة: «وَمَا رَمَيْتَ إِذْ رَمَيْتَ وَلَٰكِنَّ اللَّهَ رَمَىٰ» (3 مرات)، ثم يُقال: «لجمت لسان المتكبرين بلجام رب العالمين» (3 مرات)، ثم تُغلق اليد ولا يُتكلم مع أحد غير هذا الشخص، وقبل بدء الكلام معه تُفتح اليد أمامه</w:t>
+        <w:t xml:space="preserve">يُقرأ بسبب تعطيل القرين: سورة النبأ (مرة يوميًا)، سورة الطارق (مرة يوميًا)، سورة الواقعة (مرة يوميًا)، «فالله خير حافظًا وهو أرحم الراحمين» (33 مرة)، «أستغفر الله الذي لا إله إلا هو الحي القيوم» (33 مرة)، «وَلَقَدْ جَعَلْنَا فِي السَّمَاءِ بُرُوجًا وَزَيَّنَّاهَا لِلنَّاظِرِينَ وَحَفِظْنَاهَا مِن كُلِّ شَيْطَانٍ رَّجِيمٍ» (33 مرة)، «فَسَيَكْفِيكَهُمُ اللَّهُ وَهُوَ السَّمِيعُ الْعَلِيمُ» (33 مرة) — يُوزَّع الورد على مدار اليوم، ثم يُقال 3 مرات: «اللهم إنك أنت الله الكريم الوهاب والمعطي الجواد، فلا ممسك لما أعطيت ولا معطي لما أمسكت، أمري بين يديك، رزقي عليك، فلا تُحوجني إلا إليك»</w:t>
       </w:r>
     </w:p>
     <w:p>
@@ -4303,7 +4167,7 @@
           <w:szCs w:val="24"/>
           <w:rtl/>
         </w:rPr>
-        <w:t xml:space="preserve">لإبطال السحر (7 مرات): ﴿مَا جِئْتُم بِهِ السِّحْرُ إِنَّ اللَّهَ سَيُبْطِلُهُ إِنَّ اللَّهَ لَا يُصْلِحُ عَمَلَ الْمُفْسِدِينَ﴾ و﴿وَيُحِقُّ اللَّهُ الْحَقَّ بِكَلِمَاتِهِ وَلَوْ كَرِهَ الْمُجْرِمُونَ﴾</w:t>
+        <w:t xml:space="preserve">ورد شامل للحماية: «بسم الله، بسم الله وبالله، بسم الله خير الأسماء، بسم الله رب الأرض والسماء، بسم الله الذي لا يضر مع اسمه شيء في الأرض ولا في السماء، بسم الله افتتحت وبالله ختمت وبه آمنت، بسم الله أصبحت وعلى الله توكلت، بسم الله على قلبي ونفسي، بسم الله على عقلي وذهني، بسم الله على أهلي ومالي، بسم الله على ما أعطاني ربي، بسم الله الشافي، بسم الله المعافي، بسم الله الوافي، بسم الله الذي لا يضر مع اسمه شيء في الأرض ولا السماء وهو السميع العليم، هو الله الله الله الله الله ربي لا أشرك به شيئًا، الله أكبر الله أكبر الله أكبر الله أكبر، وأعزّ وأجل مما أخاف وأحذر، أسألك اللهم بخيرك من خيرك الذي لا يُعطيه غيرك، عزّ جارك وجلّ ثناؤك ولا إله غيرك. اللهم إني أعوذ بك من شر نفسي، ومن شر كل سلطان، ومن شر كل شيطان مريد، ومن شر كل جبار عنيد، ومن شر كل قضاء سوء، ومن شر كل دابة أنت آخذ بناصيتها، إن ربي على صراط مستقيم وأنت على كل شيء حفيظ، إن ولي الله الذي نزل الكتاب وهو يتولى الصالحين. اللهم إني أستجيرك وأحتجب بك من كل شيء خلقته، وأحترس بك من جميع خلقك وكل ما ذرأت وبرأت، وأفوّض أمري إليك، وأقدّم بين يدي في يومي هذا وليلتي هذه وساعتي هذه وشهري هذا. بسم الله الرحمن الرحيم ﴿قُلْ هُوَ اللَّهُ أَحَدٌ اللَّهُ الصَّمَدُ لَمْ يَلِدْ وَلَمْ يُولَدْ وَلَمْ يَكُن لَّهُ كُفُوًا أَحَدٌ﴾ عن أمامي، ومن فوقي، وعن يميني، وعن شمالي، (تُكرر أربع مرات لكل جهة)، ثم آية الكرسي كاملة، ثم آخر آية آل عمران: ﴿شَهِدَ اللَّهُ أَنَّهُ لَا إِلَٰهَ إِلَّا هُوَ وَالْمَلَائِكَةُ وَأُولُو الْعِلْمِ قَائِمًا بِالْقِسْطِ﴾ إلى آخرها (7 مرات)»</w:t>
       </w:r>
     </w:p>
     <w:p>
@@ -4337,7 +4201,7 @@
           <w:szCs w:val="24"/>
           <w:rtl/>
         </w:rPr>
-        <w:t xml:space="preserve">للوقاية من الحسد: ﴿وَجَعَلَنِي مُبَارَكًا أَيْنَ مَا كُنتُ وَأَوْصَانِي بِالصَّلَاةِ وَالزَّكَاةِ مَا دُمْتُ حَيًّا﴾</w:t>
+        <w:t xml:space="preserve">تُقرأ 7 مرات إذا خفت من أحد: ﴿وَأُفَوِّضُ أَمْرِي إِلَى اللَّهِ إِنَّ اللَّهَ بَصِيرٌ بِالْعِبَادِ﴾</w:t>
       </w:r>
     </w:p>
     <w:p>
@@ -4371,7 +4235,7 @@
           <w:szCs w:val="24"/>
           <w:rtl/>
         </w:rPr>
-        <w:t xml:space="preserve">أعوذ بكلمات الله التامات التي لا يجاوزهن بر ولا فاجر، من شر ما خلق وذرأ وبرأ، ومن شر ما ينزل من السماء ومن شر ما يعرج فيها، ومن شر ما ذرأ في الأرض وبرأ ومن شر ما يخرج منها، ومن شر فتن الليل والنهار، ومن شر كل طارق يطرق إلا طارقًا يطرق بخير يا رحمن</w:t>
+        <w:t xml:space="preserve">لإخراج جميع العيون الملتصقة في الجسم، وللعصمة من السحر والعين: ﴿وَإِن يَكَادُ الَّذِينَ كَفَرُوا لَيُزْلِقُونَكَ بِأَبْصَارِهِمْ لَمَّا سَمِعُوا الذِّكْرَ وَيَقُولُونَ إِنَّهُ لَمَجْنُونٌ وَمَا هُوَ إِلَّا ذِكْرٌ لِّلْعَالَمِينَ﴾ — تُقرأ 70 مرة على ماء، ويُشرب منه مع وضع اليد على مكان الوجع</w:t>
       </w:r>
     </w:p>
     <w:p>
@@ -4405,7 +4269,7 @@
           <w:szCs w:val="24"/>
           <w:rtl/>
         </w:rPr>
-        <w:t xml:space="preserve">يُقرأ بسبب تعطيل القرين: سورة النبأ (مرة يوميًا)، سورة الطارق (مرة يوميًا)، سورة الواقعة (مرة يوميًا)، «فالله خير حافظًا وهو أرحم الراحمين» (33 مرة)، «أستغفر الله الذي لا إله إلا هو الحي القيوم» (33 مرة)، «وَلَقَدْ جَعَلْنَا فِي السَّمَاءِ بُرُوجًا وَزَيَّنَّاهَا لِلنَّاظِرِينَ وَحَفِظْنَاهَا مِن كُلِّ شَيْطَانٍ رَّجِيمٍ» (33 مرة)، «فَسَيَكْفِيكَهُمُ اللَّهُ وَهُوَ السَّمِيعُ الْعَلِيمُ» (33 مرة) — يُوزَّع الورد على مدار اليوم، ثم يُقال 3 مرات: «اللهم إنك أنت الله الكريم الوهاب والمعطي الجواد، فلا ممسك لما أعطيت ولا معطي لما أمسكت، أمري بين يديك، رزقي عليك، فلا تُحوجني إلا إليك»</w:t>
+        <w:t xml:space="preserve">دعاء الخضر عليه السلام (يُقال 3 مرات): «بسم الله ما شاء الله، لا يسوق الخير إلا الله. بسم الله ما شاء الله، لا يصرف السوء إلا الله. بسم الله ما شاء الله، ما كان من نعمة فمن الله. بسم الله ما شاء الله، ولا حول ولا قوة إلا بالله» — ينفع بإذن الله لتيسير الرزق وللحفظ من المكروه؛ قال ابن عباس رضي الله عنه: من قالهن حين يصبح وحين يمسي ثلاث مرات، أمّنه الله من الغرق والحريق والسرق ومن الشياطين والحية والعقرب</w:t>
       </w:r>
     </w:p>
     <w:p>
@@ -4439,7 +4303,7 @@
           <w:szCs w:val="24"/>
           <w:rtl/>
         </w:rPr>
-        <w:t xml:space="preserve">ورد شامل للحماية: «بسم الله، بسم الله وبالله، بسم الله خير الأسماء، بسم الله رب الأرض والسماء، بسم الله الذي لا يضر مع اسمه شيء في الأرض ولا في السماء، بسم الله افتتحت وبالله ختمت وبه آمنت، بسم الله أصبحت وعلى الله توكلت، بسم الله على قلبي ونفسي، بسم الله على عقلي وذهني، بسم الله على أهلي ومالي، بسم الله على ما أعطاني ربي، بسم الله الشافي، بسم الله المعافي، بسم الله الوافي، بسم الله الذي لا يضر مع اسمه شيء في الأرض ولا السماء وهو السميع العليم، هو الله الله الله الله الله ربي لا أشرك به شيئًا، الله أكبر الله أكبر الله أكبر الله أكبر، وأعزّ وأجل مما أخاف وأحذر، أسألك اللهم بخيرك من خيرك الذي لا يُعطيه غيرك، عزّ جارك وجلّ ثناؤك ولا إله غيرك. اللهم إني أعوذ بك من شر نفسي، ومن شر كل سلطان، ومن شر كل شيطان مريد، ومن شر كل جبار عنيد، ومن شر كل قضاء سوء، ومن شر كل دابة أنت آخذ بناصيتها، إن ربي على صراط مستقيم وأنت على كل شيء حفيظ، إن ولي الله الذي نزل الكتاب وهو يتولى الصالحين. اللهم إني أستجيرك وأحتجب بك من كل شيء خلقته، وأحترس بك من جميع خلقك وكل ما ذرأت وبرأت، وأفوّض أمري إليك، وأقدّم بين يدي في يومي هذا وليلتي هذه وساعتي هذه وشهري هذا. بسم الله الرحمن الرحيم ﴿قُلْ هُوَ اللَّهُ أَحَدٌ اللَّهُ الصَّمَدُ لَمْ يَلِدْ وَلَمْ يُولَدْ وَلَمْ يَكُن لَّهُ كُفُوًا أَحَدٌ﴾ عن أمامي، ومن فوقي، وعن يميني، وعن شمالي، (تُكرر أربع مرات لكل جهة)، ثم آية الكرسي كاملة، ثم آخر آية آل عمران: ﴿شَهِدَ اللَّهُ أَنَّهُ لَا إِلَٰهَ إِلَّا هُوَ وَالْمَلَائِكَةُ وَأُولُو الْعِلْمِ قَائِمًا بِالْقِسْطِ﴾ إلى آخرها (7 مرات)»</w:t>
+        <w:t xml:space="preserve">﴿وَقَدِمْنَا إِلَىٰ مَا عَمِلُوا مِنْ عَمَلٍ فَجَعَلْنَاهُ هَبَاءً مَّنثُورًا﴾ تُقرأ على ماء 137 مرة لمدة 11 يومًا</w:t>
       </w:r>
     </w:p>
     <w:p>
@@ -4473,7 +4337,7 @@
           <w:szCs w:val="24"/>
           <w:rtl/>
         </w:rPr>
-        <w:t xml:space="preserve">تُدعى بهذا الدعاء قبل الدخول على أي شخص خائف منه: ﴿قَالَ رَجُلَانِ مِنَ الَّذِينَ يَخَافُونَ أَنْعَمَ اللَّهُ عَلَيْهِمَا ادْخُلُوا عَلَيْهِمُ الْبَابَ فَإِذَا دَخَلْتُمُوهُ فَإِنَّكُمْ غَالِبُونَ وَعَلَى اللَّهِ فَتَوَكَّلُوا إِن كُنتُم مُّؤْمِنِينَ﴾</w:t>
+        <w:t xml:space="preserve">دعاء الخروج من البيت: «حَسْبُنَا اللَّهُ سَيُؤْتِينَا اللَّهُ مِن فَضْلِهِ وَرَسُولُهُ إِنَّا إِلَى اللَّهِ رَاغِبُونَ»</w:t>
       </w:r>
     </w:p>
     <w:p>
@@ -4507,7 +4371,7 @@
           <w:szCs w:val="24"/>
           <w:rtl/>
         </w:rPr>
-        <w:t xml:space="preserve">«دخلت عليكم بلا إله إلا الله، وألجمتكم بمحمد رسول الله، وقضيت حاجتي منكم بلا حول ولا قوة إلا بالله» (3 مرات)</w:t>
+        <w:t xml:space="preserve">خمس تحصينات يومية: الفاتحة، الإخلاص، المعوذتان، ثم: «بسم الله أرقيك من كل شيء يؤذيك، من شر كل نفس أو عين حاسد، الله يشفيك، بسم الله أرقيك»، «أعيذك بكلمات الله التامة من كل شيطان وهامّة، ومن كل عين لامّة»، «أعيذك بكلمات الله التامات من غضبه وعقابه، ومن شر عباده، ومن همزات الشياطين، وأعوذ بك رب أن يحضرون»، «اللهم ذا السلطان العظيم، والمنّ القديم، وذا الوجه الكريم، ولي الكلمات التامات والدعوات المستجابات، عافنا من أنفس الجن وأعين الإنس»، «أعيذك بكلمات الله التامات التي لا يجاوزهن بر ولا فاجر، من شر ما خلق وذرأ وبرأ، ومن شر ما ينزل من السماء وما يعرج فيها، ومن شر ما ذرأ في الأرض ومن شر ما يخرج منها، ومن شر فتن الليل والنهار، ومن شر طوارق الليل والنهار إلا طارقًا يطرق بخير يا رحمن»، «بسم الله يُبريك من كل داء يؤذيك، من حسد كل حاسد وكل عين، واسم الله يشفيك»</w:t>
       </w:r>
     </w:p>
     <w:p>
@@ -4541,7 +4405,7 @@
           <w:szCs w:val="24"/>
           <w:rtl/>
         </w:rPr>
-        <w:t xml:space="preserve">تُقرأ 7 مرات إذا خفت من أحد: ﴿وَأُفَوِّضُ أَمْرِي إِلَى اللَّهِ إِنَّ اللَّهَ بَصِيرٌ بِالْعِبَادِ﴾</w:t>
+        <w:t xml:space="preserve">أعوذ بوجه الله العظيم الذي ليس شيء أعظم منه، وبكلمات الله التامات التي لا يجاوزهن بر ولا فاجر، وبأسماء الله الحسنى كلها ما علمت منها وما لم أعلم، من شر ما خلق وذرأ وبرأ، ومن شر كل دابة هو آخذ بناصيتها، إن ربي على صراط مستقيم</w:t>
       </w:r>
     </w:p>
     <w:p>
@@ -4575,7 +4439,7 @@
           <w:szCs w:val="24"/>
           <w:rtl/>
         </w:rPr>
-        <w:t xml:space="preserve">لإخراج جميع العيون الملتصقة في الجسم، وللعصمة من السحر والعين: ﴿وَإِن يَكَادُ الَّذِينَ كَفَرُوا لَيُزْلِقُونَكَ بِأَبْصَارِهِمْ لَمَّا سَمِعُوا الذِّكْرَ وَيَقُولُونَ إِنَّهُ لَمَجْنُونٌ وَمَا هُوَ إِلَّا ذِكْرٌ لِّلْعَالَمِينَ﴾ — تُقرأ 70 مرة على ماء، ويُشرب منه مع وضع اليد على مكان الوجع</w:t>
+        <w:t xml:space="preserve">دعاء الصباح والمساء للحفظ (حديث): «اللهم إني أصبحت في ذمتك وجوارك، اللهم إني أستودعك ديني ونفسي ودنياي وآخرتي وأهلي ومالي، وأعوذ بك يا عظيم من شر خلقك جميعًا، وأعوذ بك من شر ما يُبلس به إبليس وجنوده»</w:t>
       </w:r>
     </w:p>
     <w:p>
@@ -4609,7 +4473,7 @@
           <w:szCs w:val="24"/>
           <w:rtl/>
         </w:rPr>
-        <w:t xml:space="preserve">دعاء الخضر عليه السلام (يُقال 3 مرات): «بسم الله ما شاء الله، لا يسوق الخير إلا الله. بسم الله ما شاء الله، لا يصرف السوء إلا الله. بسم الله ما شاء الله، ما كان من نعمة فمن الله. بسم الله ما شاء الله، ولا حول ولا قوة إلا بالله» — ينفع بإذن الله لتيسير الرزق وللحفظ من المكروه؛ قال ابن عباس رضي الله عنه: من قالهن حين يصبح وحين يمسي ثلاث مرات، أمّنه الله من الغرق والحريق والسرق ومن الشياطين والحية والعقرب</w:t>
+        <w:t xml:space="preserve">للأمن من الحرق والغرق: ﴿اللَّهُ الَّذِي نَزَّلَ الْكِتَابَ وَهُوَ يَتَوَلَّى الصَّالِحِينَ﴾ إلى ﴿وَالسَّمَاوَاتُ مَطْوِيَّاتٌ بِيَمِينِهِ سُبْحَانَهُ وَتَعَالَىٰ عَمَّا يُشْرِكُونَ﴾</w:t>
       </w:r>
     </w:p>
     <w:p>
@@ -4643,7 +4507,7 @@
           <w:szCs w:val="24"/>
           <w:rtl/>
         </w:rPr>
-        <w:t xml:space="preserve">﴿وَقَدِمْنَا إِلَىٰ مَا عَمِلُوا مِنْ عَمَلٍ فَجَعَلْنَاهُ هَبَاءً مَّنثُورًا﴾ تُقرأ على ماء 137 مرة لمدة 11 يومًا</w:t>
+        <w:t xml:space="preserve">للحفظ من السوء، يُقال 3 مرات بعد كل صلاة: «أُعيذ نفسي وديني وأهلي ومالي وولدي وإخواني في ديني، وما رزقني ربي، وخواتيم عملي، ومن يعنيني أمره، بالله الواحد الأحد الصمد الذي لم يلد ولم يولد ولم يكن له كفوًا أحد، وبرب الفلق من شر ما خلق ومن شر غاسق إذا وقب ومن شر النفاثات في العقد ومن شر حاسد إذا حسد، وبرب الناس ملك الناس إله الناس من شر الوسواس الخناس الذي يوسوس في صدور الناس من الجنة والناس»</w:t>
       </w:r>
     </w:p>
     <w:p>
@@ -4677,7 +4541,7 @@
           <w:szCs w:val="24"/>
           <w:rtl/>
         </w:rPr>
-        <w:t xml:space="preserve">دعاء الخروج من البيت: «حَسْبُنَا اللَّهُ سَيُؤْتِينَا اللَّهُ مِن فَضْلِهِ وَرَسُولُهُ إِنَّا إِلَى اللَّهِ رَاغِبُونَ»</w:t>
+        <w:t xml:space="preserve">إذا خفت أمرًا، فقل: «اللهم إنك لا يكفي منك أحد، وأنت تكفي من كل أحد من خلقك، فاكفني» (وتذكر ما تخاف منه)</w:t>
       </w:r>
     </w:p>
     <w:p>
@@ -4711,7 +4575,7 @@
           <w:szCs w:val="24"/>
           <w:rtl/>
         </w:rPr>
-        <w:t xml:space="preserve">خمس تحصينات يومية: الفاتحة، الإخلاص، المعوذتان، ثم: «بسم الله أرقيك من كل شيء يؤذيك، من شر كل نفس أو عين حاسد، الله يشفيك، بسم الله أرقيك»، «أعيذك بكلمات الله التامة من كل شيطان وهامّة، ومن كل عين لامّة»، «أعيذك بكلمات الله التامات من غضبه وعقابه، ومن شر عباده، ومن همزات الشياطين، وأعوذ بك رب أن يحضرون»، «اللهم ذا السلطان العظيم، والمنّ القديم، وذا الوجه الكريم، ولي الكلمات التامات والدعوات المستجابات، عافنا من أنفس الجن وأعين الإنس»، «أعيذك بكلمات الله التامات التي لا يجاوزهن بر ولا فاجر، من شر ما خلق وذرأ وبرأ، ومن شر ما ينزل من السماء وما يعرج فيها، ومن شر ما ذرأ في الأرض ومن شر ما يخرج منها، ومن شر فتن الليل والنهار، ومن شر طوارق الليل والنهار إلا طارقًا يطرق بخير يا رحمن»، «بسم الله يُبريك من كل داء يؤذيك، من حسد كل حاسد وكل عين، واسم الله يشفيك»</w:t>
+        <w:t xml:space="preserve">دعاء كان يقوله علي بن الحسين زين العابدين: «بسم الله وبالله، ومن الله، وإلى الله، وفي سبيل الله، وعلى ملة رسول الله صلى الله عليه وسلم، اللهم إليك أسلمت نفسي، وإليك وجهت وجهي، وإليك ألجأت ظهري، وإليك فوّضت أمري، اللهم احفظني بحفظ الإيمان من بين يدي ومن خلفي وعن يميني وعن شمالي ومن فوقي ومن تحتي وما قبلي، وادفع عني بحولك وقوتك، فإنه لا حول ولا قوة إلا بك»</w:t>
       </w:r>
     </w:p>
     <w:p>
@@ -4745,7 +4609,7 @@
           <w:szCs w:val="24"/>
           <w:rtl/>
         </w:rPr>
-        <w:t xml:space="preserve">أعوذ بوجه الله العظيم الذي ليس شيء أعظم منه، وبكلمات الله التامات التي لا يجاوزهن بر ولا فاجر، وبأسماء الله الحسنى كلها ما علمت منها وما لم أعلم، من شر ما خلق وذرأ وبرأ، ومن شر كل دابة هو آخذ بناصيتها، إن ربي على صراط مستقيم</w:t>
+        <w:t xml:space="preserve">عند الغروب: تُهلّل وتستعيذ بالله، ثم تضع يدك على رأسك وتُمرّها على وجهك وتأخذ لحيتك بيدك وتقول: «أحطت على نفسي وأهلي ومالي وولدي، من غائب وشاهد، بالله الذي لا إله إلا هو، عالم الغيب والشهادة، الرحمن الرحيم، الحي القيوم لا تأخذه سنة ولا نوم» ثم تقرأ آية الكرسي إلى ﴿الْعَلِيُّ الْعَظِيمُ﴾</w:t>
       </w:r>
     </w:p>
     <w:p>
@@ -4764,210 +4628,6 @@
           <w:rtl/>
         </w:rPr>
         <w:t xml:space="preserve">الدعاء السادس والعشرون</w:t>
-      </w:r>
-    </w:p>
-    <w:p>
-      <w:pPr>
-        <w:bidi/>
-        <w:spacing w:after="200" w:line="340"/>
-        <w:jc w:val="right"/>
-      </w:pPr>
-      <w:r>
-        <w:rPr>
-          <w:rFonts w:ascii="Times New Roman" w:cs="Times New Roman" w:eastAsia="Times New Roman" w:hAnsi="Times New Roman"/>
-          <w:sz w:val="24"/>
-          <w:szCs w:val="24"/>
-          <w:rtl/>
-        </w:rPr>
-        <w:t xml:space="preserve">دعاء الصباح والمساء للحفظ (حديث): «اللهم إني أصبحت في ذمتك وجوارك، اللهم إني أستودعك ديني ونفسي ودنياي وآخرتي وأهلي ومالي، وأعوذ بك يا عظيم من شر خلقك جميعًا، وأعوذ بك من شر ما يُبلس به إبليس وجنوده»</w:t>
-      </w:r>
-    </w:p>
-    <w:p>
-      <w:pPr>
-        <w:bidi/>
-        <w:spacing w:after="120" w:before="320"/>
-        <w:jc w:val="right"/>
-      </w:pPr>
-      <w:r>
-        <w:rPr>
-          <w:rFonts w:ascii="Times New Roman" w:cs="Times New Roman" w:eastAsia="Times New Roman" w:hAnsi="Times New Roman"/>
-          <w:b/>
-          <w:bCs/>
-          <w:sz w:val="44"/>
-          <w:szCs w:val="44"/>
-          <w:rtl/>
-        </w:rPr>
-        <w:t xml:space="preserve">الدعاء السابع والعشرون</w:t>
-      </w:r>
-    </w:p>
-    <w:p>
-      <w:pPr>
-        <w:bidi/>
-        <w:spacing w:after="200" w:line="340"/>
-        <w:jc w:val="right"/>
-      </w:pPr>
-      <w:r>
-        <w:rPr>
-          <w:rFonts w:ascii="Times New Roman" w:cs="Times New Roman" w:eastAsia="Times New Roman" w:hAnsi="Times New Roman"/>
-          <w:sz w:val="24"/>
-          <w:szCs w:val="24"/>
-          <w:rtl/>
-        </w:rPr>
-        <w:t xml:space="preserve">للأمن من الحرق والغرق: ﴿اللَّهُ الَّذِي نَزَّلَ الْكِتَابَ وَهُوَ يَتَوَلَّى الصَّالِحِينَ﴾ إلى ﴿وَالسَّمَاوَاتُ مَطْوِيَّاتٌ بِيَمِينِهِ سُبْحَانَهُ وَتَعَالَىٰ عَمَّا يُشْرِكُونَ﴾</w:t>
-      </w:r>
-    </w:p>
-    <w:p>
-      <w:pPr>
-        <w:bidi/>
-        <w:spacing w:after="120" w:before="320"/>
-        <w:jc w:val="right"/>
-      </w:pPr>
-      <w:r>
-        <w:rPr>
-          <w:rFonts w:ascii="Times New Roman" w:cs="Times New Roman" w:eastAsia="Times New Roman" w:hAnsi="Times New Roman"/>
-          <w:b/>
-          <w:bCs/>
-          <w:sz w:val="44"/>
-          <w:szCs w:val="44"/>
-          <w:rtl/>
-        </w:rPr>
-        <w:t xml:space="preserve">الدعاء الثامن والعشرون</w:t>
-      </w:r>
-    </w:p>
-    <w:p>
-      <w:pPr>
-        <w:bidi/>
-        <w:spacing w:after="200" w:line="340"/>
-        <w:jc w:val="right"/>
-      </w:pPr>
-      <w:r>
-        <w:rPr>
-          <w:rFonts w:ascii="Times New Roman" w:cs="Times New Roman" w:eastAsia="Times New Roman" w:hAnsi="Times New Roman"/>
-          <w:sz w:val="24"/>
-          <w:szCs w:val="24"/>
-          <w:rtl/>
-        </w:rPr>
-        <w:t xml:space="preserve">للحفظ من السوء، يُقال 3 مرات بعد كل صلاة: «أُعيذ نفسي وديني وأهلي ومالي وولدي وإخواني في ديني، وما رزقني ربي، وخواتيم عملي، ومن يعنيني أمره، بالله الواحد الأحد الصمد الذي لم يلد ولم يولد ولم يكن له كفوًا أحد، وبرب الفلق من شر ما خلق ومن شر غاسق إذا وقب ومن شر النفاثات في العقد ومن شر حاسد إذا حسد، وبرب الناس ملك الناس إله الناس من شر الوسواس الخناس الذي يوسوس في صدور الناس من الجنة والناس»</w:t>
-      </w:r>
-    </w:p>
-    <w:p>
-      <w:pPr>
-        <w:bidi/>
-        <w:spacing w:after="120" w:before="320"/>
-        <w:jc w:val="right"/>
-      </w:pPr>
-      <w:r>
-        <w:rPr>
-          <w:rFonts w:ascii="Times New Roman" w:cs="Times New Roman" w:eastAsia="Times New Roman" w:hAnsi="Times New Roman"/>
-          <w:b/>
-          <w:bCs/>
-          <w:sz w:val="44"/>
-          <w:szCs w:val="44"/>
-          <w:rtl/>
-        </w:rPr>
-        <w:t xml:space="preserve">الدعاء التاسع والعشرون</w:t>
-      </w:r>
-    </w:p>
-    <w:p>
-      <w:pPr>
-        <w:bidi/>
-        <w:spacing w:after="200" w:line="340"/>
-        <w:jc w:val="right"/>
-      </w:pPr>
-      <w:r>
-        <w:rPr>
-          <w:rFonts w:ascii="Times New Roman" w:cs="Times New Roman" w:eastAsia="Times New Roman" w:hAnsi="Times New Roman"/>
-          <w:sz w:val="24"/>
-          <w:szCs w:val="24"/>
-          <w:rtl/>
-        </w:rPr>
-        <w:t xml:space="preserve">إذا خفت أمرًا، فقل: «اللهم إنك لا يكفي منك أحد، وأنت تكفي من كل أحد من خلقك، فاكفني» (وتذكر ما تخاف منه)</w:t>
-      </w:r>
-    </w:p>
-    <w:p>
-      <w:pPr>
-        <w:bidi/>
-        <w:spacing w:after="120" w:before="320"/>
-        <w:jc w:val="right"/>
-      </w:pPr>
-      <w:r>
-        <w:rPr>
-          <w:rFonts w:ascii="Times New Roman" w:cs="Times New Roman" w:eastAsia="Times New Roman" w:hAnsi="Times New Roman"/>
-          <w:b/>
-          <w:bCs/>
-          <w:sz w:val="44"/>
-          <w:szCs w:val="44"/>
-          <w:rtl/>
-        </w:rPr>
-        <w:t xml:space="preserve">الدعاء الثلاثون</w:t>
-      </w:r>
-    </w:p>
-    <w:p>
-      <w:pPr>
-        <w:bidi/>
-        <w:spacing w:after="200" w:line="340"/>
-        <w:jc w:val="right"/>
-      </w:pPr>
-      <w:r>
-        <w:rPr>
-          <w:rFonts w:ascii="Times New Roman" w:cs="Times New Roman" w:eastAsia="Times New Roman" w:hAnsi="Times New Roman"/>
-          <w:sz w:val="24"/>
-          <w:szCs w:val="24"/>
-          <w:rtl/>
-        </w:rPr>
-        <w:t xml:space="preserve">دعاء كان يقوله علي بن الحسين زين العابدين: «بسم الله وبالله، ومن الله، وإلى الله، وفي سبيل الله، وعلى ملة رسول الله صلى الله عليه وسلم، اللهم إليك أسلمت نفسي، وإليك وجهت وجهي، وإليك ألجأت ظهري، وإليك فوّضت أمري، اللهم احفظني بحفظ الإيمان من بين يدي ومن خلفي وعن يميني وعن شمالي ومن فوقي ومن تحتي وما قبلي، وادفع عني بحولك وقوتك، فإنه لا حول ولا قوة إلا بك»</w:t>
-      </w:r>
-    </w:p>
-    <w:p>
-      <w:pPr>
-        <w:bidi/>
-        <w:spacing w:after="120" w:before="320"/>
-        <w:jc w:val="right"/>
-      </w:pPr>
-      <w:r>
-        <w:rPr>
-          <w:rFonts w:ascii="Times New Roman" w:cs="Times New Roman" w:eastAsia="Times New Roman" w:hAnsi="Times New Roman"/>
-          <w:b/>
-          <w:bCs/>
-          <w:sz w:val="44"/>
-          <w:szCs w:val="44"/>
-          <w:rtl/>
-        </w:rPr>
-        <w:t xml:space="preserve">الدعاء الحادي والثلاثون</w:t>
-      </w:r>
-    </w:p>
-    <w:p>
-      <w:pPr>
-        <w:bidi/>
-        <w:spacing w:after="200" w:line="340"/>
-        <w:jc w:val="right"/>
-      </w:pPr>
-      <w:r>
-        <w:rPr>
-          <w:rFonts w:ascii="Times New Roman" w:cs="Times New Roman" w:eastAsia="Times New Roman" w:hAnsi="Times New Roman"/>
-          <w:sz w:val="24"/>
-          <w:szCs w:val="24"/>
-          <w:rtl/>
-        </w:rPr>
-        <w:t xml:space="preserve">عند الغروب: تُهلّل وتستعيذ بالله، ثم تضع يدك على رأسك وتُمرّها على وجهك وتأخذ لحيتك بيدك وتقول: «أحطت على نفسي وأهلي ومالي وولدي، من غائب وشاهد، بالله الذي لا إله إلا هو، عالم الغيب والشهادة، الرحمن الرحيم، الحي القيوم لا تأخذه سنة ولا نوم» ثم تقرأ آية الكرسي إلى ﴿الْعَلِيُّ الْعَظِيمُ﴾</w:t>
-      </w:r>
-    </w:p>
-    <w:p>
-      <w:pPr>
-        <w:bidi/>
-        <w:spacing w:after="120" w:before="320"/>
-        <w:jc w:val="right"/>
-      </w:pPr>
-      <w:r>
-        <w:rPr>
-          <w:rFonts w:ascii="Times New Roman" w:cs="Times New Roman" w:eastAsia="Times New Roman" w:hAnsi="Times New Roman"/>
-          <w:b/>
-          <w:bCs/>
-          <w:sz w:val="44"/>
-          <w:szCs w:val="44"/>
-          <w:rtl/>
-        </w:rPr>
-        <w:t xml:space="preserve">الدعاء الثاني والثلاثون</w:t>
       </w:r>
     </w:p>
     <w:p>
@@ -7303,7 +6963,7 @@
           <w:szCs w:val="24"/>
           <w:rtl/>
         </w:rPr>
-        <w:t xml:space="preserve">من كنوز الدعاء: اللهم إنك تعلم سري وعلانيتي فاقبل معذرتي، وتعلم حاجتي فأعطني سؤالي، وتعلم ما في نفسي فاغفر لي ذنوبي، اللهم أني أسألك إيمانًا يباشر قلبي، ويقينًا صادقًا حتى أعلم أنه لن يصيبني إلا ما كتبته علي، والرضا بما قسمته لي، يا ذا الجلال والإكرام</w:t>
+        <w:t xml:space="preserve">اللهم إني أعوذ بك من زوال نعمتك، وتحوّل عافيتك، وفجاءة نقمتك، وجميع سخطك. اللهم أدِم علينا نعمك وبارك لنا فيها واحفظها من الزوال</w:t>
       </w:r>
     </w:p>
     <w:p>
@@ -7337,7 +6997,7 @@
           <w:szCs w:val="24"/>
           <w:rtl/>
         </w:rPr>
-        <w:t xml:space="preserve">اللهم إني أعوذ بك من زوال نعمتك، وتحوّل عافيتك، وفجاءة نقمتك، وجميع سخطك. اللهم أدِم علينا نعمك وبارك لنا فيها واحفظها من الزوال</w:t>
+        <w:t xml:space="preserve">دعاء ما دعا به مشتاق لأمر إلا وحقق الله أمره بإذنه: «اللهم إني أسألك فعل الخيرات، وترك المنكرات، وحب المساكين، وأن تغفر لي وترحمني، وإذا أردت فتنة في قوم فتوفني غير مفتون، وأسألك حبك وحب من يحبك وحب عمل يقرّب إلى حبك»</w:t>
       </w:r>
     </w:p>
     <w:p>
@@ -7371,7 +7031,7 @@
           <w:szCs w:val="24"/>
           <w:rtl/>
         </w:rPr>
-        <w:t xml:space="preserve">دعاء ما دعا به مشتاق لأمر إلا وحقق الله أمره بإذنه: «اللهم إني أسألك فعل الخيرات، وترك المنكرات، وحب المساكين، وأن تغفر لي وترحمني، وإذا أردت فتنة في قوم فتوفني غير مفتون، وأسألك حبك وحب من يحبك وحب عمل يقرّب إلى حبك»</w:t>
+        <w:t xml:space="preserve">يدبّر الأمر من السماء إلى الأرض (آية سجدة الله يدبر الأمر)</w:t>
       </w:r>
     </w:p>
     <w:p>
@@ -7405,7 +7065,7 @@
           <w:szCs w:val="24"/>
           <w:rtl/>
         </w:rPr>
-        <w:t xml:space="preserve">يدبّر الأمر من السماء إلى الأرض (آية سجدة الله يدبر الأمر)</w:t>
+        <w:t xml:space="preserve">اللهم إنا نسألك زيادة في الدين، وبركة في العمر، وصحة في الجسد، وسعة في الرزق، وتوبة قبل الموت، وشهادة عند الموت، ومغفرة بعد الموت، وعفوًا عند الحساب، وأمانًا من العذاب، ونصيبًا من الجنة، وارزقنا النظر إلى وجهك الكريم. اللهم ارحم موتانا وموتى المسلمين، واشفِ مرضانا ومرضى المسلمين، اللهم اغفر للمسلمين والمسلمات والمؤمنين والمؤمنات الأحياء منهم والأموات</w:t>
       </w:r>
     </w:p>
     <w:p>
@@ -7439,7 +7099,7 @@
           <w:szCs w:val="24"/>
           <w:rtl/>
         </w:rPr>
-        <w:t xml:space="preserve">اللهم إنا نسألك زيادة في الدين، وبركة في العمر، وصحة في الجسد، وسعة في الرزق، وتوبة قبل الموت، وشهادة عند الموت، ومغفرة بعد الموت، وعفوًا عند الحساب، وأمانًا من العذاب، ونصيبًا من الجنة، وارزقنا النظر إلى وجهك الكريم. اللهم ارحم موتانا وموتى المسلمين، واشفِ مرضانا ومرضى المسلمين، اللهم اغفر للمسلمين والمسلمات والمؤمنين والمؤمنات الأحياء منهم والأموات</w:t>
+        <w:t xml:space="preserve">اللهم من اعتز بك فلن يذل، ومن اهتدى بك فلن يضل، ومن استكثر بك فلن يقل، ومن استقوى بك فلن يضعف، ومن استغنى بك فلن يفتقر، ومن استنصر بك فلن يُخذل، ومن استعان بك فلن يُغلب، ومن توكل عليك فلن يخيب، ومن جعلك ملاذه فلن يضيع، ومن اعتصم بك فقد هُدي إلى صراط مستقيم، اللهم فكن لنا وليًا ونصيرًا، وكن لنا معينًا ومجيرًا، إنك كنت بنا بصيرًا</w:t>
       </w:r>
     </w:p>
     <w:p>
@@ -7473,7 +7133,7 @@
           <w:szCs w:val="24"/>
           <w:rtl/>
         </w:rPr>
-        <w:t xml:space="preserve">اللهم من اعتز بك فلن يذل، ومن اهتدى بك فلن يضل، ومن استكثر بك فلن يقل، ومن استقوى بك فلن يضعف، ومن استغنى بك فلن يفتقر، ومن استنصر بك فلن يُخذل، ومن استعان بك فلن يُغلب، ومن توكل عليك فلن يخيب، ومن جعلك ملاذه فلن يضيع، ومن اعتصم بك فقد هُدي إلى صراط مستقيم، اللهم فكن لنا وليًا ونصيرًا، وكن لنا معينًا ومجيرًا، إنك كنت بنا بصيرًا</w:t>
+        <w:t xml:space="preserve">دعاء القنوت: «اللهم اهدني فيمن هديت، وعافني فيمن عافيت، وتولني فيمن توليت، وبارك لي فيما أعطيت، وقني شر ما قضيت، فإنك تقضي ولا يُقضى عليك، إنه لا يذل من واليت، تباركت ربنا وتعاليت» ثم: «اللهم إني أعوذ برضاك من سخطك، وأعوذ بمعافاتك من عقوبتك، وأعوذ بك منك، لا أُحصي ثناءً عليك، أنت كما أثنيت على نفسك»</w:t>
       </w:r>
     </w:p>
     <w:p>
@@ -7492,40 +7152,6 @@
           <w:rtl/>
         </w:rPr>
         <w:t xml:space="preserve">الدعاء التاسع</w:t>
-      </w:r>
-    </w:p>
-    <w:p>
-      <w:pPr>
-        <w:bidi/>
-        <w:spacing w:after="200" w:line="340"/>
-        <w:jc w:val="right"/>
-      </w:pPr>
-      <w:r>
-        <w:rPr>
-          <w:rFonts w:ascii="Times New Roman" w:cs="Times New Roman" w:eastAsia="Times New Roman" w:hAnsi="Times New Roman"/>
-          <w:sz w:val="24"/>
-          <w:szCs w:val="24"/>
-          <w:rtl/>
-        </w:rPr>
-        <w:t xml:space="preserve">دعاء القنوت: «اللهم اهدني فيمن هديت، وعافني فيمن عافيت، وتولني فيمن توليت، وبارك لي فيما أعطيت، وقني شر ما قضيت، فإنك تقضي ولا يُقضى عليك، إنه لا يذل من واليت، تباركت ربنا وتعاليت» ثم: «اللهم إني أعوذ برضاك من سخطك، وأعوذ بمعافاتك من عقوبتك، وأعوذ بك منك، لا أُحصي ثناءً عليك، أنت كما أثنيت على نفسك»</w:t>
-      </w:r>
-    </w:p>
-    <w:p>
-      <w:pPr>
-        <w:bidi/>
-        <w:spacing w:after="120" w:before="320"/>
-        <w:jc w:val="right"/>
-      </w:pPr>
-      <w:r>
-        <w:rPr>
-          <w:rFonts w:ascii="Times New Roman" w:cs="Times New Roman" w:eastAsia="Times New Roman" w:hAnsi="Times New Roman"/>
-          <w:b/>
-          <w:bCs/>
-          <w:sz w:val="44"/>
-          <w:szCs w:val="44"/>
-          <w:rtl/>
-        </w:rPr>
-        <w:t xml:space="preserve">الدعاء العاشر</w:t>
       </w:r>
     </w:p>
     <w:p>
@@ -9926,6 +9552,642 @@
           <w:rtl/>
         </w:rPr>
         <w:t xml:space="preserve">12 ركعة: تصلي ركعتين وتسلّم، ثم تُكرر، وفي آخر صلاة يُقال بعد التشهد: «لا إله إلا أنت يا حنان يا منان يا بديع السماوات والأرض يا ذا الجلال والإكرام، اللهم صلِّ على محمد وعلى آل محمد»، ثم تسجد وتقول: الفاتحة (7 مرات)، آية الكرسي (7 مرات)</w:t>
+      </w:r>
+    </w:p>
+    <w:p>
+      <w:pPr>
+        <w:pStyle w:val="Heading1"/>
+        <w:pageBreakBefore/>
+        <w:pBdr>
+          <w:bottom w:val="single" w:color="0F6657" w:sz="6" w:space="8"/>
+        </w:pBdr>
+        <w:bidi/>
+        <w:spacing w:after="300" w:before="200"/>
+        <w:jc w:val="center"/>
+      </w:pPr>
+      <w:r>
+        <w:rPr>
+          <w:rFonts w:ascii="Times New Roman" w:cs="Times New Roman" w:eastAsia="Times New Roman" w:hAnsi="Times New Roman"/>
+          <w:b/>
+          <w:bCs/>
+          <w:color w:val="0F6657"/>
+          <w:sz w:val="36"/>
+          <w:szCs w:val="36"/>
+          <w:rtl/>
+        </w:rPr>
+        <w:t xml:space="preserve">21. قبل الدخول مكان تهابه أو مقابلة أي شخص تهابه</w:t>
+      </w:r>
+    </w:p>
+    <w:p>
+      <w:pPr>
+        <w:bidi/>
+        <w:spacing w:after="120" w:before="320"/>
+        <w:jc w:val="right"/>
+      </w:pPr>
+      <w:r>
+        <w:rPr>
+          <w:rFonts w:ascii="Times New Roman" w:cs="Times New Roman" w:eastAsia="Times New Roman" w:hAnsi="Times New Roman"/>
+          <w:b/>
+          <w:bCs/>
+          <w:sz w:val="44"/>
+          <w:szCs w:val="44"/>
+          <w:rtl/>
+        </w:rPr>
+        <w:t xml:space="preserve">الدعاء الأول</w:t>
+      </w:r>
+    </w:p>
+    <w:p>
+      <w:pPr>
+        <w:bidi/>
+        <w:spacing w:after="200" w:line="340"/>
+        <w:jc w:val="right"/>
+      </w:pPr>
+      <w:r>
+        <w:rPr>
+          <w:rFonts w:ascii="Times New Roman" w:cs="Times New Roman" w:eastAsia="Times New Roman" w:hAnsi="Times New Roman"/>
+          <w:sz w:val="24"/>
+          <w:szCs w:val="24"/>
+          <w:rtl/>
+        </w:rPr>
+        <w:t xml:space="preserve">بسم الله الرحمن الرحيم: «اللهم إني تبرأت من حولي وقوتي إلى حولك وقوتك، ولا حول ولا قوة إلا بالله، يا حي يا قيوم»</w:t>
+      </w:r>
+    </w:p>
+    <w:p>
+      <w:pPr>
+        <w:bidi/>
+        <w:spacing w:after="120" w:before="320"/>
+        <w:jc w:val="right"/>
+      </w:pPr>
+      <w:r>
+        <w:rPr>
+          <w:rFonts w:ascii="Times New Roman" w:cs="Times New Roman" w:eastAsia="Times New Roman" w:hAnsi="Times New Roman"/>
+          <w:b/>
+          <w:bCs/>
+          <w:sz w:val="44"/>
+          <w:szCs w:val="44"/>
+          <w:rtl/>
+        </w:rPr>
+        <w:t xml:space="preserve">الدعاء الثاني</w:t>
+      </w:r>
+    </w:p>
+    <w:p>
+      <w:pPr>
+        <w:bidi/>
+        <w:spacing w:after="200" w:line="340"/>
+        <w:jc w:val="right"/>
+      </w:pPr>
+      <w:r>
+        <w:rPr>
+          <w:rFonts w:ascii="Times New Roman" w:cs="Times New Roman" w:eastAsia="Times New Roman" w:hAnsi="Times New Roman"/>
+          <w:sz w:val="24"/>
+          <w:szCs w:val="24"/>
+          <w:rtl/>
+        </w:rPr>
+        <w:t xml:space="preserve">«اللهم إني مغلوب فانتصر، انصرني على ..............» (تُسمّى من تخشاه)</w:t>
+      </w:r>
+    </w:p>
+    <w:p>
+      <w:pPr>
+        <w:bidi/>
+        <w:spacing w:after="120" w:before="320"/>
+        <w:jc w:val="right"/>
+      </w:pPr>
+      <w:r>
+        <w:rPr>
+          <w:rFonts w:ascii="Times New Roman" w:cs="Times New Roman" w:eastAsia="Times New Roman" w:hAnsi="Times New Roman"/>
+          <w:b/>
+          <w:bCs/>
+          <w:sz w:val="44"/>
+          <w:szCs w:val="44"/>
+          <w:rtl/>
+        </w:rPr>
+        <w:t xml:space="preserve">الدعاء الثالث</w:t>
+      </w:r>
+    </w:p>
+    <w:p>
+      <w:pPr>
+        <w:bidi/>
+        <w:spacing w:after="200" w:line="340"/>
+        <w:jc w:val="right"/>
+      </w:pPr>
+      <w:r>
+        <w:rPr>
+          <w:rFonts w:ascii="Times New Roman" w:cs="Times New Roman" w:eastAsia="Times New Roman" w:hAnsi="Times New Roman"/>
+          <w:sz w:val="24"/>
+          <w:szCs w:val="24"/>
+          <w:rtl/>
+        </w:rPr>
+        <w:t xml:space="preserve">«اللهم اجعل ثارنا على من ظلمنا، وانصرنا على من عادانا، يا حي يا قيوم»</w:t>
+      </w:r>
+    </w:p>
+    <w:p>
+      <w:pPr>
+        <w:bidi/>
+        <w:spacing w:after="120" w:before="320"/>
+        <w:jc w:val="right"/>
+      </w:pPr>
+      <w:r>
+        <w:rPr>
+          <w:rFonts w:ascii="Times New Roman" w:cs="Times New Roman" w:eastAsia="Times New Roman" w:hAnsi="Times New Roman"/>
+          <w:b/>
+          <w:bCs/>
+          <w:sz w:val="44"/>
+          <w:szCs w:val="44"/>
+          <w:rtl/>
+        </w:rPr>
+        <w:t xml:space="preserve">الدعاء الرابع</w:t>
+      </w:r>
+    </w:p>
+    <w:p>
+      <w:pPr>
+        <w:bidi/>
+        <w:spacing w:after="200" w:line="340"/>
+        <w:jc w:val="right"/>
+      </w:pPr>
+      <w:r>
+        <w:rPr>
+          <w:rFonts w:ascii="Times New Roman" w:cs="Times New Roman" w:eastAsia="Times New Roman" w:hAnsi="Times New Roman"/>
+          <w:sz w:val="24"/>
+          <w:szCs w:val="24"/>
+          <w:rtl/>
+        </w:rPr>
+        <w:t xml:space="preserve">«دخلت عليك بسم الله وبقوة، لا إله إلا الله، ولا حول ولا قوة إلا بالله، يا حي يا قيوم»</w:t>
+      </w:r>
+    </w:p>
+    <w:p>
+      <w:pPr>
+        <w:bidi/>
+        <w:spacing w:after="120" w:before="320"/>
+        <w:jc w:val="right"/>
+      </w:pPr>
+      <w:r>
+        <w:rPr>
+          <w:rFonts w:ascii="Times New Roman" w:cs="Times New Roman" w:eastAsia="Times New Roman" w:hAnsi="Times New Roman"/>
+          <w:b/>
+          <w:bCs/>
+          <w:sz w:val="44"/>
+          <w:szCs w:val="44"/>
+          <w:rtl/>
+        </w:rPr>
+        <w:t xml:space="preserve">الدعاء الخامس</w:t>
+      </w:r>
+    </w:p>
+    <w:p>
+      <w:pPr>
+        <w:bidi/>
+        <w:spacing w:after="200" w:line="340"/>
+        <w:jc w:val="right"/>
+      </w:pPr>
+      <w:r>
+        <w:rPr>
+          <w:rFonts w:ascii="Times New Roman" w:cs="Times New Roman" w:eastAsia="Times New Roman" w:hAnsi="Times New Roman"/>
+          <w:sz w:val="24"/>
+          <w:szCs w:val="24"/>
+          <w:rtl/>
+        </w:rPr>
+        <w:t xml:space="preserve">بسم الله الرحمن الرحيم: ﴿لَّا يَتَكَلَّمُونَ إِلَّا مَنْ أَذِنَ لَهُ الرَّحْمَٰنُ وَقَالَ صَوَابًا﴾</w:t>
+      </w:r>
+    </w:p>
+    <w:p>
+      <w:pPr>
+        <w:bidi/>
+        <w:spacing w:after="120" w:before="320"/>
+        <w:jc w:val="right"/>
+      </w:pPr>
+      <w:r>
+        <w:rPr>
+          <w:rFonts w:ascii="Times New Roman" w:cs="Times New Roman" w:eastAsia="Times New Roman" w:hAnsi="Times New Roman"/>
+          <w:b/>
+          <w:bCs/>
+          <w:sz w:val="44"/>
+          <w:szCs w:val="44"/>
+          <w:rtl/>
+        </w:rPr>
+        <w:t xml:space="preserve">الدعاء السادس</w:t>
+      </w:r>
+    </w:p>
+    <w:p>
+      <w:pPr>
+        <w:bidi/>
+        <w:spacing w:after="200" w:line="340"/>
+        <w:jc w:val="right"/>
+      </w:pPr>
+      <w:r>
+        <w:rPr>
+          <w:rFonts w:ascii="Times New Roman" w:cs="Times New Roman" w:eastAsia="Times New Roman" w:hAnsi="Times New Roman"/>
+          <w:sz w:val="24"/>
+          <w:szCs w:val="24"/>
+          <w:rtl/>
+        </w:rPr>
+        <w:t xml:space="preserve">«بسم الله» (4 مرات)، ﴿قُلْ هُوَ اللَّهُ أَحَدٌ﴾... أيها الظالم أيها الحاكم، القلب منك يفزع، والمولى يتجلى، والنبي يشفع، بالعشرة الكرام لقيتك، حسبي الله على من ظلمني اخضع (4 مرات)، اللهم إني أجعلك في نحورهم وأعوذ بك من شرورهم. ثم تُقرأ آخر آيات سورة الإسراء: ﴿وَيَخِرُّونَ لِلْأَذْقَانِ يَبْكُونَ وَيَزِيدُهُمْ خُشُوعًا﴾ (109)، ﴿قُلِ ادْعُوا اللَّهَ أَوِ ادْعُوا الرَّحْمَٰنَ أَيًّا مَّا تَدْعُوا فَلَهُ الْأَسْمَاءُ الْحُسْنَىٰ وَلَا تَجْهَرْ بِصَلَاتِكَ وَلَا تُخَافِتْ بِهَا وَابْتَغِ بَيْنَ ذَٰلِكَ سَبِيلًا﴾ (110)، ﴿وَقُلِ الْحَمْدُ لِلَّهِ الَّذِي لَمْ يَتَّخِذْ وَلَدًا وَلَمْ يَكُن لَّهُ شَرِيكٌ فِي الْمُلْكِ وَلَمْ يَكُن لَّهُ وَلِيٌّ مِّنَ الذُّلِّ وَكَبِّرْهُ تَكْبِيرًا﴾ (111)</w:t>
+      </w:r>
+    </w:p>
+    <w:p>
+      <w:pPr>
+        <w:bidi/>
+        <w:spacing w:after="120" w:before="320"/>
+        <w:jc w:val="right"/>
+      </w:pPr>
+      <w:r>
+        <w:rPr>
+          <w:rFonts w:ascii="Times New Roman" w:cs="Times New Roman" w:eastAsia="Times New Roman" w:hAnsi="Times New Roman"/>
+          <w:b/>
+          <w:bCs/>
+          <w:sz w:val="44"/>
+          <w:szCs w:val="44"/>
+          <w:rtl/>
+        </w:rPr>
+        <w:t xml:space="preserve">الدعاء السابع</w:t>
+      </w:r>
+    </w:p>
+    <w:p>
+      <w:pPr>
+        <w:bidi/>
+        <w:spacing w:after="200" w:line="340"/>
+        <w:jc w:val="right"/>
+      </w:pPr>
+      <w:r>
+        <w:rPr>
+          <w:rFonts w:ascii="Times New Roman" w:cs="Times New Roman" w:eastAsia="Times New Roman" w:hAnsi="Times New Roman"/>
+          <w:sz w:val="24"/>
+          <w:szCs w:val="24"/>
+          <w:rtl/>
+        </w:rPr>
+        <w:t xml:space="preserve">اللهم إنك تعلم سري وعلانيتي فاقبل معذرتي، وتعلم حاجتي فأعطني سؤالي، وتعلم ما في نفسي فاغفر لي ذنوبي، اللهم أني أسألك إيمانًا يباشر قلبي، ويقينًا صادقًا حتى أعلم أنه لن يصيبني إلا ما كتبته علي، والرضا بما قسمته لي، يا ذا الجلال والإكرام</w:t>
+      </w:r>
+    </w:p>
+    <w:p>
+      <w:pPr>
+        <w:bidi/>
+        <w:spacing w:after="120" w:before="320"/>
+        <w:jc w:val="right"/>
+      </w:pPr>
+      <w:r>
+        <w:rPr>
+          <w:rFonts w:ascii="Times New Roman" w:cs="Times New Roman" w:eastAsia="Times New Roman" w:hAnsi="Times New Roman"/>
+          <w:b/>
+          <w:bCs/>
+          <w:sz w:val="44"/>
+          <w:szCs w:val="44"/>
+          <w:rtl/>
+        </w:rPr>
+        <w:t xml:space="preserve">الدعاء الثامن</w:t>
+      </w:r>
+    </w:p>
+    <w:p>
+      <w:pPr>
+        <w:bidi/>
+        <w:spacing w:after="200" w:line="340"/>
+        <w:jc w:val="right"/>
+      </w:pPr>
+      <w:r>
+        <w:rPr>
+          <w:rFonts w:ascii="Times New Roman" w:cs="Times New Roman" w:eastAsia="Times New Roman" w:hAnsi="Times New Roman"/>
+          <w:sz w:val="24"/>
+          <w:szCs w:val="24"/>
+          <w:rtl/>
+        </w:rPr>
+        <w:t xml:space="preserve">إذا كنت تخاف من أي شخص، تُردد هذا الدعاء صباحًا ومساءً: «اللهم رب السماوات السبع، ورب العرش العظيم، كن لي جارًا من (فلان ابن فلان) وأحزابه من خلائقك أن يفرط علي أحد منهم أو يطغى، عزّ جارك، وجلّ ثناؤك، ولا إله غيرك؛ الله أكبر، الله أعز مما أخاف وأحذر. أعوذ بالله الذي لا إله إلا هو، ممسك السماوات السبع أن يقعن على الأرض إلا بإذنه، من شر عبيدك (فلان ابن فلان) وأحزابهم وجنودهم وأشياعهم من الجن والإنس. اللهم كن لي جارًا من شرهم، جلّ ثناؤك وعزّ جارك وتبارك اسمك ولا إله غيرك»</w:t>
+      </w:r>
+    </w:p>
+    <w:p>
+      <w:pPr>
+        <w:bidi/>
+        <w:spacing w:after="120" w:before="320"/>
+        <w:jc w:val="right"/>
+      </w:pPr>
+      <w:r>
+        <w:rPr>
+          <w:rFonts w:ascii="Times New Roman" w:cs="Times New Roman" w:eastAsia="Times New Roman" w:hAnsi="Times New Roman"/>
+          <w:b/>
+          <w:bCs/>
+          <w:sz w:val="44"/>
+          <w:szCs w:val="44"/>
+          <w:rtl/>
+        </w:rPr>
+        <w:t xml:space="preserve">الدعاء التاسع</w:t>
+      </w:r>
+    </w:p>
+    <w:p>
+      <w:pPr>
+        <w:bidi/>
+        <w:spacing w:after="200" w:line="340"/>
+        <w:jc w:val="right"/>
+      </w:pPr>
+      <w:r>
+        <w:rPr>
+          <w:rFonts w:ascii="Times New Roman" w:cs="Times New Roman" w:eastAsia="Times New Roman" w:hAnsi="Times New Roman"/>
+          <w:sz w:val="24"/>
+          <w:szCs w:val="24"/>
+          <w:rtl/>
+        </w:rPr>
+        <w:t xml:space="preserve">«دخلت عليكم بلا إله إلا الله، وألجمتكم بمحمد رسول الله، وقضيت حاجتي منكم بلا حول ولا قوة إلا بالله» (3 مرات)</w:t>
+      </w:r>
+    </w:p>
+    <w:p>
+      <w:pPr>
+        <w:bidi/>
+        <w:spacing w:after="120" w:before="320"/>
+        <w:jc w:val="right"/>
+      </w:pPr>
+      <w:r>
+        <w:rPr>
+          <w:rFonts w:ascii="Times New Roman" w:cs="Times New Roman" w:eastAsia="Times New Roman" w:hAnsi="Times New Roman"/>
+          <w:b/>
+          <w:bCs/>
+          <w:sz w:val="44"/>
+          <w:szCs w:val="44"/>
+          <w:rtl/>
+        </w:rPr>
+        <w:t xml:space="preserve">الدعاء العاشر</w:t>
+      </w:r>
+    </w:p>
+    <w:p>
+      <w:pPr>
+        <w:bidi/>
+        <w:spacing w:after="200" w:line="340"/>
+        <w:jc w:val="right"/>
+      </w:pPr>
+      <w:r>
+        <w:rPr>
+          <w:rFonts w:ascii="Times New Roman" w:cs="Times New Roman" w:eastAsia="Times New Roman" w:hAnsi="Times New Roman"/>
+          <w:sz w:val="24"/>
+          <w:szCs w:val="24"/>
+          <w:rtl/>
+        </w:rPr>
+        <w:t xml:space="preserve">«سبحان الله يا فارج الهمّ ويا كاشف الغم، فرّج همي ويسّر أمري، وارحم ضعفي وقلة حيلتي، وارزقني من حيث لا أحتسب، يا رب العالمين»</w:t>
+      </w:r>
+    </w:p>
+    <w:p>
+      <w:pPr>
+        <w:bidi/>
+        <w:spacing w:after="120" w:before="320"/>
+        <w:jc w:val="right"/>
+      </w:pPr>
+      <w:r>
+        <w:rPr>
+          <w:rFonts w:ascii="Times New Roman" w:cs="Times New Roman" w:eastAsia="Times New Roman" w:hAnsi="Times New Roman"/>
+          <w:b/>
+          <w:bCs/>
+          <w:sz w:val="44"/>
+          <w:szCs w:val="44"/>
+          <w:rtl/>
+        </w:rPr>
+        <w:t xml:space="preserve">الدعاء الحادي عشر</w:t>
+      </w:r>
+    </w:p>
+    <w:p>
+      <w:pPr>
+        <w:bidi/>
+        <w:spacing w:after="200" w:line="340"/>
+        <w:jc w:val="right"/>
+      </w:pPr>
+      <w:r>
+        <w:rPr>
+          <w:rFonts w:ascii="Times New Roman" w:cs="Times New Roman" w:eastAsia="Times New Roman" w:hAnsi="Times New Roman"/>
+          <w:sz w:val="24"/>
+          <w:szCs w:val="24"/>
+          <w:rtl/>
+        </w:rPr>
+        <w:t xml:space="preserve">«اللهم لا سهل إلا ما جعلته سهلًا، فإنك تجعل الحزن إن شئت سهلًا»</w:t>
+      </w:r>
+    </w:p>
+    <w:p>
+      <w:pPr>
+        <w:bidi/>
+        <w:spacing w:after="120" w:before="320"/>
+        <w:jc w:val="right"/>
+      </w:pPr>
+      <w:r>
+        <w:rPr>
+          <w:rFonts w:ascii="Times New Roman" w:cs="Times New Roman" w:eastAsia="Times New Roman" w:hAnsi="Times New Roman"/>
+          <w:b/>
+          <w:bCs/>
+          <w:sz w:val="44"/>
+          <w:szCs w:val="44"/>
+          <w:rtl/>
+        </w:rPr>
+        <w:t xml:space="preserve">الدعاء الثاني عشر</w:t>
+      </w:r>
+    </w:p>
+    <w:p>
+      <w:pPr>
+        <w:bidi/>
+        <w:spacing w:after="200" w:line="340"/>
+        <w:jc w:val="right"/>
+      </w:pPr>
+      <w:r>
+        <w:rPr>
+          <w:rFonts w:ascii="Times New Roman" w:cs="Times New Roman" w:eastAsia="Times New Roman" w:hAnsi="Times New Roman"/>
+          <w:sz w:val="24"/>
+          <w:szCs w:val="24"/>
+          <w:rtl/>
+        </w:rPr>
+        <w:t xml:space="preserve">يا رب، بحق الحوقلة افتحها في وجهي... وادعُ ما شئت، وتقول: «لا حول ولا قوة إلا بالله العلي العظيم» (7 مرات)</w:t>
+      </w:r>
+    </w:p>
+    <w:p>
+      <w:pPr>
+        <w:bidi/>
+        <w:spacing w:after="120" w:before="320"/>
+        <w:jc w:val="right"/>
+      </w:pPr>
+      <w:r>
+        <w:rPr>
+          <w:rFonts w:ascii="Times New Roman" w:cs="Times New Roman" w:eastAsia="Times New Roman" w:hAnsi="Times New Roman"/>
+          <w:b/>
+          <w:bCs/>
+          <w:sz w:val="44"/>
+          <w:szCs w:val="44"/>
+          <w:rtl/>
+        </w:rPr>
+        <w:t xml:space="preserve">الدعاء الثالث عشر</w:t>
+      </w:r>
+    </w:p>
+    <w:p>
+      <w:pPr>
+        <w:bidi/>
+        <w:spacing w:after="200" w:line="340"/>
+        <w:jc w:val="right"/>
+      </w:pPr>
+      <w:r>
+        <w:rPr>
+          <w:rFonts w:ascii="Times New Roman" w:cs="Times New Roman" w:eastAsia="Times New Roman" w:hAnsi="Times New Roman"/>
+          <w:sz w:val="24"/>
+          <w:szCs w:val="24"/>
+          <w:rtl/>
+        </w:rPr>
+        <w:t xml:space="preserve">﴿وَقُل رَّبِّ أَدْخِلْنِي مُدْخَلَ صِدْقٍ وَأَخْرِجْنِي مُخْرَجَ صِدْقٍ وَاجْعَل لِّي مِن لَّدُنكَ سُلْطَانًا نَّصِيرًا﴾</w:t>
+      </w:r>
+    </w:p>
+    <w:p>
+      <w:pPr>
+        <w:bidi/>
+        <w:spacing w:after="120" w:before="320"/>
+        <w:jc w:val="right"/>
+      </w:pPr>
+      <w:r>
+        <w:rPr>
+          <w:rFonts w:ascii="Times New Roman" w:cs="Times New Roman" w:eastAsia="Times New Roman" w:hAnsi="Times New Roman"/>
+          <w:b/>
+          <w:bCs/>
+          <w:sz w:val="44"/>
+          <w:szCs w:val="44"/>
+          <w:rtl/>
+        </w:rPr>
+        <w:t xml:space="preserve">الدعاء الرابع عشر</w:t>
+      </w:r>
+    </w:p>
+    <w:p>
+      <w:pPr>
+        <w:bidi/>
+        <w:spacing w:after="200" w:line="340"/>
+        <w:jc w:val="right"/>
+      </w:pPr>
+      <w:r>
+        <w:rPr>
+          <w:rFonts w:ascii="Times New Roman" w:cs="Times New Roman" w:eastAsia="Times New Roman" w:hAnsi="Times New Roman"/>
+          <w:sz w:val="24"/>
+          <w:szCs w:val="24"/>
+          <w:rtl/>
+        </w:rPr>
+        <w:t xml:space="preserve">علشان تسيطر على أي شخص خايف من ظلمه له: قل 7 مرات ﴿فَسَيَكْفِيكَهُمُ اللَّهُ وَهُوَ السَّمِيعُ الْعَلِيمُ﴾ ثم انظر في عينه وقل: «اللهم اكفني شر عبدك هذا بما أردت، اللهم اكفني شره بما شئت»</w:t>
+      </w:r>
+    </w:p>
+    <w:p>
+      <w:pPr>
+        <w:bidi/>
+        <w:spacing w:after="120" w:before="320"/>
+        <w:jc w:val="right"/>
+      </w:pPr>
+      <w:r>
+        <w:rPr>
+          <w:rFonts w:ascii="Times New Roman" w:cs="Times New Roman" w:eastAsia="Times New Roman" w:hAnsi="Times New Roman"/>
+          <w:b/>
+          <w:bCs/>
+          <w:sz w:val="44"/>
+          <w:szCs w:val="44"/>
+          <w:rtl/>
+        </w:rPr>
+        <w:t xml:space="preserve">الدعاء الخامس عشر</w:t>
+      </w:r>
+    </w:p>
+    <w:p>
+      <w:pPr>
+        <w:bidi/>
+        <w:spacing w:after="200" w:line="340"/>
+        <w:jc w:val="right"/>
+      </w:pPr>
+      <w:r>
+        <w:rPr>
+          <w:rFonts w:ascii="Times New Roman" w:cs="Times New Roman" w:eastAsia="Times New Roman" w:hAnsi="Times New Roman"/>
+          <w:sz w:val="24"/>
+          <w:szCs w:val="24"/>
+          <w:rtl/>
+        </w:rPr>
+        <w:t xml:space="preserve">لدخول مكان تهابه أو مقابلة شخص تخشاه، تُقرأ آية آل عمران 154: ﴿ثُمَّ أَنزَلَ عَلَيْكُم مِّن بَعْدِ الْغَمِّ أَمَنَةً نُّعَاسًا يَغْشَىٰ طَائِفَةً مِّنكُمْ﴾ إلى آخرها، وآية الفتح 29: ﴿مُّحَمَّدٌ رَّسُولُ اللَّهِ وَالَّذِينَ مَعَهُ أَشِدَّاءُ عَلَى الْكُفَّارِ رُحَمَاءُ بَيْنَهُمْ﴾ إلى آخرها</w:t>
+      </w:r>
+    </w:p>
+    <w:p>
+      <w:pPr>
+        <w:bidi/>
+        <w:spacing w:after="120" w:before="320"/>
+        <w:jc w:val="right"/>
+      </w:pPr>
+      <w:r>
+        <w:rPr>
+          <w:rFonts w:ascii="Times New Roman" w:cs="Times New Roman" w:eastAsia="Times New Roman" w:hAnsi="Times New Roman"/>
+          <w:b/>
+          <w:bCs/>
+          <w:sz w:val="44"/>
+          <w:szCs w:val="44"/>
+          <w:rtl/>
+        </w:rPr>
+        <w:t xml:space="preserve">الدعاء السادس عشر</w:t>
+      </w:r>
+    </w:p>
+    <w:p>
+      <w:pPr>
+        <w:bidi/>
+        <w:spacing w:after="200" w:line="340"/>
+        <w:jc w:val="right"/>
+      </w:pPr>
+      <w:r>
+        <w:rPr>
+          <w:rFonts w:ascii="Times New Roman" w:cs="Times New Roman" w:eastAsia="Times New Roman" w:hAnsi="Times New Roman"/>
+          <w:sz w:val="24"/>
+          <w:szCs w:val="24"/>
+          <w:rtl/>
+        </w:rPr>
+        <w:t xml:space="preserve">لتلجيم أي إنسان خائف منه: «بسم الله الرحمن الرحيم، صمٌّ بكمٌ عميٌ فهم لا يرجعون، صمٌّ بكمٌ عميٌ فهم لا يعقلون، صمٌّ بكمٌ عميٌ فهم لا يبصرون، صمٌّ بكمٌ عميٌ فهم لا يسمعون، صمٌّ بكمٌ عميٌ فهم لا يتكلمون» ثم يُقال: «عقدت لسان فلان ابن فلان عني بحق كهيعص حم عسق، إياك نعبد وإياك نستعين»</w:t>
+      </w:r>
+    </w:p>
+    <w:p>
+      <w:pPr>
+        <w:bidi/>
+        <w:spacing w:after="120" w:before="320"/>
+        <w:jc w:val="right"/>
+      </w:pPr>
+      <w:r>
+        <w:rPr>
+          <w:rFonts w:ascii="Times New Roman" w:cs="Times New Roman" w:eastAsia="Times New Roman" w:hAnsi="Times New Roman"/>
+          <w:b/>
+          <w:bCs/>
+          <w:sz w:val="44"/>
+          <w:szCs w:val="44"/>
+          <w:rtl/>
+        </w:rPr>
+        <w:t xml:space="preserve">الدعاء السابع عشر</w:t>
+      </w:r>
+    </w:p>
+    <w:p>
+      <w:pPr>
+        <w:bidi/>
+        <w:spacing w:after="200" w:line="340"/>
+        <w:jc w:val="right"/>
+      </w:pPr>
+      <w:r>
+        <w:rPr>
+          <w:rFonts w:ascii="Times New Roman" w:cs="Times New Roman" w:eastAsia="Times New Roman" w:hAnsi="Times New Roman"/>
+          <w:sz w:val="24"/>
+          <w:szCs w:val="24"/>
+          <w:rtl/>
+        </w:rPr>
+        <w:t xml:space="preserve">عقد لسان أي شخص مهما كانت هيبته وجبروته: قبل الذهاب إليه، تُقرأ هذه الآية على كف اليد اليمنى وهي مفتوحة: «وَمَا رَمَيْتَ إِذْ رَمَيْتَ وَلَٰكِنَّ اللَّهَ رَمَىٰ» (3 مرات)، ثم يُقال: «لجمت لسان المتكبرين بلجام رب العالمين» (3 مرات)، ثم تُغلق اليد ولا يُتكلم مع أحد غير هذا الشخص، وقبل بدء الكلام معه تُفتح اليد أمامه</w:t>
+      </w:r>
+    </w:p>
+    <w:p>
+      <w:pPr>
+        <w:bidi/>
+        <w:spacing w:after="120" w:before="320"/>
+        <w:jc w:val="right"/>
+      </w:pPr>
+      <w:r>
+        <w:rPr>
+          <w:rFonts w:ascii="Times New Roman" w:cs="Times New Roman" w:eastAsia="Times New Roman" w:hAnsi="Times New Roman"/>
+          <w:b/>
+          <w:bCs/>
+          <w:sz w:val="44"/>
+          <w:szCs w:val="44"/>
+          <w:rtl/>
+        </w:rPr>
+        <w:t xml:space="preserve">الدعاء الثامن عشر</w:t>
+      </w:r>
+    </w:p>
+    <w:p>
+      <w:pPr>
+        <w:bidi/>
+        <w:spacing w:after="200" w:line="340"/>
+        <w:jc w:val="right"/>
+      </w:pPr>
+      <w:r>
+        <w:rPr>
+          <w:rFonts w:ascii="Times New Roman" w:cs="Times New Roman" w:eastAsia="Times New Roman" w:hAnsi="Times New Roman"/>
+          <w:sz w:val="24"/>
+          <w:szCs w:val="24"/>
+          <w:rtl/>
+        </w:rPr>
+        <w:t xml:space="preserve">تُدعى بهذا الدعاء قبل الدخول على أي شخص خائف منه: ﴿قَالَ رَجُلَانِ مِنَ الَّذِينَ يَخَافُونَ أَنْعَمَ اللَّهُ عَلَيْهِمَا ادْخُلُوا عَلَيْهِمُ الْبَابَ فَإِذَا دَخَلْتُمُوهُ فَإِنَّكُمْ غَالِبُونَ وَعَلَى اللَّهِ فَتَوَكَّلُوا إِن كُنتُم مُّؤْمِنِينَ﴾</w:t>
       </w:r>
     </w:p>
     <w:sectPr>

</xml_diff>

<commit_message>
Regenerate Word export with the full Adiyat Yasin text in red
Co-Authored-By: Claude Sonnet 5 <noreply@anthropic.com>
Claude-Session: https://claude.ai/code/session_015v8MN6VZjbnhmn7ju2JYhZ
</commit_message>
<xml_diff>
--- a/خزانة الأدعية.docx
+++ b/خزانة الأدعية.docx
@@ -9493,7 +9493,161 @@
           <w:szCs w:val="24"/>
           <w:rtl/>
         </w:rPr>
-        <w:t xml:space="preserve">عِدّية يس (قراءة سورة يس مع تكرار آيات وأدعية بينية، لقضاء الحاجة والحماية من الحسد والكفاية من الناس): 1. تُقرأ الآية الأولى «يس ۚ وَالْقُرْآنِ الْحَكِيمِ» (7 مرات)، ثم تُكمل قراءة السورة عاديًا حتى نهاية الآية 8. 2. بعد الآية 8، تُدعى: «اللهم بيمن نوره وسره في خلقه وسره في الجسد، أخفِ عني أعين الناظرين وقلوب الحاسدين والباغين، واحفظني كما حفظت الروح في الجسد، إنك على كل شيء قدير» 3. تُقرأ الآية 9 «سَوَاءٌ عَلَيْهِمْ أَأَنذَرْتَهُمْ أَمْ لَمْ تُنذِرْهُمْ لَا يُؤْمِنُونَ» (3 مرات)، ثم تُكمل القراءة حتى نهاية الآية 27. 4. بعد الآية 27، تُدعى: «اللهم أكرمني بقضاء حاجتي» (وتُسمّى الحاجة) «واكرمني بطاعتك يا ذا الجلال والإكرام» — يُكرر هذا الدعاء 3 مرات. 5. تُكمل القراءة حتى نهاية الآية 37، ثم تُردد هذه الآية «وَآيَةٌ لَّهُمُ اللَّيْلُ نَسْلَخُ مِنْهُ النَّهَارَ...» (14 مرة)، ثم تُدعى: «اللهم إني أسألك من فضلك الواسع وجودك السابغ أن تُغنيني عن جميع خلقك بالله» — يُكرر 3 مرات. 6. تُكمل القراءة حتى نهاية الآية 57، ثم تُردد هذه الآية «سَلَامٌ قَوْلًا مِّن رَّبٍّ رَّحِيمٍ» (16 مرة)، ثم تُدعى: «اللهم سلّمنا من آفات الدنيا وفتنها يا رب العالمين» 7. تُكمل قراءة باقي السورة حتى الآية 83 (آخرها). 8. يُختم بالدعاء التالي: «سبحان المنفّس عن كل مهموم، سبحان العليم بما كان وما يكون، سبحان من إذا أراد شيئًا قال له كن فيكون، سبحان الذي بيده ملكوت كل شيء وإليه تُرجعون، يا صمد يا إلهي، يا صمد معتمدي، اقضِ حاجتي» (وتُذكر الحاجة) «... بحق يس، ومن أنزلها، ومن نزلت عليه، ومن نزلت به»</w:t>
+        <w:t xml:space="preserve">عِدّية يس — قراءة سورة يس كاملة مع تكرار آيات وأدعية بينية في مواضع محددة، لقضاء الحاجة والحماية من الحسد والكفاية من الناس. المواضع الملوّنة بالأحمر هي التعليمات والأدعية التي تُقال أثناء القراءة (وليست من نص السورة):</w:t>
+      </w:r>
+    </w:p>
+    <w:p>
+      <w:pPr>
+        <w:bidi/>
+        <w:spacing w:after="200" w:line="340"/>
+        <w:jc w:val="right"/>
+      </w:pPr>
+      <w:r>
+        <w:rPr>
+          <w:rFonts w:ascii="Times New Roman" w:cs="Times New Roman" w:eastAsia="Times New Roman" w:hAnsi="Times New Roman"/>
+          <w:sz w:val="24"/>
+          <w:szCs w:val="24"/>
+          <w:rtl/>
+        </w:rPr>
+        <w:t xml:space="preserve">يٓسٓ ۚ وَٱلۡقُرۡءَانِ ٱلۡحَكِيمِ (1)إِنَّكَ لَمِنَ ٱلۡمُرۡسَلِينَ (2)عَلَىٰ صِرَٰطٖ مُّسۡتَقِيمٖ (3)تَنزِيلَ ٱلۡعَزِيزِ ٱلرَّحِيمِ (4)لِتُنذِرَ قَوۡمٗا مَّآ أُنذِرَ ءَابَآؤُهُمۡ فَهُمۡ غَٰفِلُونَ (5)لَقَدۡ حَقَّ ٱلۡقَوۡلُ عَلَىٰٓ أَكۡثَرِهِمۡ فَهُمۡ لَا يُؤۡمِنُونَ (6)إِنَّا جَعَلۡنَا فِيٓ أَعۡنَٰقِهِمۡ أَغۡلَٰلٗا فَهِيَ إِلَى ٱلۡأَذۡقَانِ فَهُم مُّقۡمَحُونَ (7)وَجَعَلۡنَا مِنۢ بَيۡنِ أَيۡدِيهِمۡ سَدّٗا وَمِنۡ خَلۡفِهِمۡ سَدّٗا فَأَغۡشَيۡنَٰهُمۡ فَهُمۡ لَا يُبۡصِرُونَ (8) </w:t>
+      </w:r>
+      <w:r>
+        <w:rPr>
+          <w:rFonts w:ascii="Times New Roman" w:cs="Times New Roman" w:eastAsia="Times New Roman" w:hAnsi="Times New Roman"/>
+          <w:b/>
+          <w:bCs/>
+          <w:color w:val="B23A2E"/>
+          <w:sz w:val="24"/>
+          <w:szCs w:val="24"/>
+          <w:rtl/>
+        </w:rPr>
+        <w:t xml:space="preserve">(تُردد هذه الآية مرة واحدة) ثم تُدعى: «اللهم بيمن نوره وسره في خلقه وسره في الجسد، أخفِ عني أعين الناظرين وقلوب الحاسدين والباغين، واحفظني كما حفظت الروح في الجسد، وإنك على كل شيء قدير»</w:t>
+      </w:r>
+      <w:r>
+        <w:rPr>
+          <w:rFonts w:ascii="Times New Roman" w:cs="Times New Roman" w:eastAsia="Times New Roman" w:hAnsi="Times New Roman"/>
+          <w:sz w:val="24"/>
+          <w:szCs w:val="24"/>
+          <w:rtl/>
+        </w:rPr>
+        <w:t xml:space="preserve"> وَسَوَآءٌ عَلَيۡهِمۡ ءَأَنذَرۡتَهُمۡ أَمۡ لَمۡ تُنذِرۡهُمۡ لَا يُؤۡمِنُونَ (9) </w:t>
+      </w:r>
+      <w:r>
+        <w:rPr>
+          <w:rFonts w:ascii="Times New Roman" w:cs="Times New Roman" w:eastAsia="Times New Roman" w:hAnsi="Times New Roman"/>
+          <w:b/>
+          <w:bCs/>
+          <w:color w:val="B23A2E"/>
+          <w:sz w:val="24"/>
+          <w:szCs w:val="24"/>
+          <w:rtl/>
+        </w:rPr>
+        <w:t xml:space="preserve">(تُردد هذه الآية 3 مرات)</w:t>
+      </w:r>
+      <w:r>
+        <w:rPr>
+          <w:rFonts w:ascii="Times New Roman" w:cs="Times New Roman" w:eastAsia="Times New Roman" w:hAnsi="Times New Roman"/>
+          <w:sz w:val="24"/>
+          <w:szCs w:val="24"/>
+          <w:rtl/>
+        </w:rPr>
+        <w:t xml:space="preserve"> إِنَّمَا تُنذِرُ مَنِ ٱتَّبَعَ ٱلذِّكۡرَ وَخَشِيَ ٱلرَّحۡمَٰنَ بِٱلۡغَيۡبِۖ فَبَشِّرۡهُ بِمَغۡفِرَةٖ وَأَجۡرٖ كَرِيمٍ (11)إِنَّا نَحۡنُ نُحۡيِ ٱلۡمَوۡتَىٰ وَنَكۡتُبُ مَا قَدَّمُواْ وَءَاثَٰرَهُمۡۚ وَكُلَّ شَيۡءٍ أَحۡصَيۡنَٰهُ فِيٓ إِمَامٖ مُّبِينٖ (12)وَٱضۡرِبۡ لَهُم مَّثَلًا أَصۡحَٰبَ ٱلۡقَرۡيَةِ إِذۡ جَآءَهَا ٱلۡمُرۡسَلُونَ (13)إِذۡ أَرۡسَلۡنَآ إِلَيۡهِمُ ٱثۡنَيۡنِ فَكَذَّبُوهُمَا فَعَزَّزۡنَا بِثَالِثٖ فَقَالُوٓاْ إِنَّآ إِلَيۡكُم مُّرۡسَلُونَ (14)قَالُواْ مَآ أَنتُمۡ إِلَّا بَشَرٞ مِّثۡلُنَا وَمَآ أَنزَلَ ٱلرَّحۡمَٰنُ مِن شَيۡءٍ إِنۡ أَنتُمۡ إِلَّا تَكۡذِبُونَ (15)قَالُواْ رَبُّنَا يَعۡلَمُ إِنَّآ إِلَيۡكُمۡ لَمُرۡسَلُونَ (16)وَمَا عَلَيۡنَآ إِلَّا ٱلۡبَلَٰغُ ٱلۡمُبِينُ (17)قَالُوٓاْ إِنَّا تَطَيَّرۡنَا بِكُمۡۖ لَئِن لَّمۡ تَنتَهُواْ لَنَرۡجُمَنَّكُمۡ وَلَيَمَسَّنَّكُم مِّنَّا عَذَابٌ أَلِيمٞ (18)قَالُواْ طَـٰٓئِرُكُم مَّعَكُمۡ أَئِن ذُكِّرۡتُمۚ بَلۡ أَنتُمۡ قَوۡمٞ مُّسۡرِفُونَ (19)وَجَآءَ مِنۡ أَقۡصَا ٱلۡمَدِينَةِ رَجُلٞ يَسۡعَىٰ قَالَ يَٰقَوۡمِ ٱتَّبِعُواْ ٱلۡمُرۡسَلِينَ (20)ٱتَّبِعُواْ مَن لَّا يَسۡـَٔلُكُمۡ أَجۡرٗا وَهُم مُّهۡتَدُونَ (21)وَمَا لِيَ لَآ أَعۡبُدُ ٱلَّذِي فَطَرَنِي وَإِلَيۡهِ تُرۡجَعُونَ (22)ءَأَتَّخِذُ مِن دُونِهِۦٓ ءَالِهَةً إِن يُرِدۡنِ ٱلرَّحۡمَٰنُ بِضُرّٖ لَّا تُغۡنِ عَنِّي شَفَٰعَتُهُمۡ شَيۡـٔٗا وَلَا يُنقِذُونِ (23)إِنِّيٓ إِذٗا لَّفِي ضَلَٰلٖ مُّبِينٍ (24)إِنِّيٓ ءَامَنتُ بِرَبِّكُمۡ فَٱسۡمَعُونِ (25)قِيلَ ٱدۡخُلِ ٱلۡجَنَّةَۖ قَالَ يَٰلَيۡتَ قَوۡمِي يَعۡلَمُونَ (26) </w:t>
+      </w:r>
+      <w:r>
+        <w:rPr>
+          <w:rFonts w:ascii="Times New Roman" w:cs="Times New Roman" w:eastAsia="Times New Roman" w:hAnsi="Times New Roman"/>
+          <w:b/>
+          <w:bCs/>
+          <w:color w:val="B23A2E"/>
+          <w:sz w:val="24"/>
+          <w:szCs w:val="24"/>
+          <w:rtl/>
+        </w:rPr>
+        <w:t xml:space="preserve">(تُردد هذه الآية مرة واحدة) ثم تُدعى: «اللهم أكرمني بقضاء حاجتي» (ويُسمّي حاجته) «واكرمني بطاعتك يا ذا الجلال والإكرام»</w:t>
+      </w:r>
+      <w:r>
+        <w:rPr>
+          <w:rFonts w:ascii="Times New Roman" w:cs="Times New Roman" w:eastAsia="Times New Roman" w:hAnsi="Times New Roman"/>
+          <w:sz w:val="24"/>
+          <w:szCs w:val="24"/>
+          <w:rtl/>
+        </w:rPr>
+        <w:t xml:space="preserve"> بِمَا غَفَرَ لِي رَبِّي وَجَعَلَنِي مِنَ ٱلۡمُكۡرَمِينَ (27) </w:t>
+      </w:r>
+      <w:r>
+        <w:rPr>
+          <w:rFonts w:ascii="Times New Roman" w:cs="Times New Roman" w:eastAsia="Times New Roman" w:hAnsi="Times New Roman"/>
+          <w:b/>
+          <w:bCs/>
+          <w:color w:val="B23A2E"/>
+          <w:sz w:val="24"/>
+          <w:szCs w:val="24"/>
+          <w:rtl/>
+        </w:rPr>
+        <w:t xml:space="preserve">(تُردد هذه الآية 3 مرات)</w:t>
+      </w:r>
+      <w:r>
+        <w:rPr>
+          <w:rFonts w:ascii="Times New Roman" w:cs="Times New Roman" w:eastAsia="Times New Roman" w:hAnsi="Times New Roman"/>
+          <w:sz w:val="24"/>
+          <w:szCs w:val="24"/>
+          <w:rtl/>
+        </w:rPr>
+        <w:t xml:space="preserve"> وَمَآ أَنزَلۡنَا عَلَىٰ قَوۡمِهِۦ مِنۢ بَعۡدِهِۦ مِن جُندٖ مِّنَ ٱلسَّمَآءِ وَمَا كُنَّا مُنزِلِينَ (28)إِن كَانَتۡ إِلَّا صَيۡحَةٗ وَٰحِدَةٗ فَإِذَا هُمۡ خَٰمِدُونَ (29)يَٰحَسۡرَةً عَلَى ٱلۡعِبَادِۚ مَا يَأۡتِيهِم مِّن رَّسُولٍ إِلَّا كَانُواْ بِهِۦ يَسۡتَهۡزِءُونَ (30)أَلَمۡ يَرَوۡاْ كَمۡ أَهۡلَكۡنَا قَبۡلَهُم مِّنَ ٱلۡقُرُونِ أَنَّهُمۡ إِلَيۡهِمۡ لَا يَرۡجِعُونَ (31)وَإِن كُلّٞ لَّمَّا جَمِيعٞ لَّدَيۡنَا مُحۡضَرُونَ (32)وَءَايَةٞ لَّهُمُ ٱلۡأَرۡضُ ٱلۡمَيۡتَةُ أَحۡيَيۡنَٰهَا وَأَخۡرَجۡنَا مِنۡهَا حَبّٗا فَمِنۡهُ يَأۡكُلُونَ (33)وَجَعَلۡنَا فِيهَا جَنَّـٰتٖ مِّن نَّخِيلٖ وَأَعۡنَٰبٖ وَفَجَّرۡنَا فِيهَا مِنَ ٱلۡعُيُونِ (34)لِيَأۡكُلُواْ مِن ثَمَرِهِۦ وَمَا عَمِلَتۡهُ أَيۡدِيهِمۡۚ أَفَلَا يَشۡكُرُونَ (35)سُبۡحَٰنَ ٱلَّذِي خَلَقَ ٱلۡأَزۡوَٰجَ كُلَّهَا مِمَّا تُنۢبِتُ ٱلۡأَرۡضُ وَمِنۡ أَنفُسِهِمۡ وَمِمَّا لَا يَعۡلَمُونَ (36) وَءَايَةٞ لَّهُمُ ٱلَّيۡلُ نَسۡلَخُ مِنۡهُ ٱلنَّهَارَ فَإِذَا هُم مُّظۡلِمُونَ (37) </w:t>
+      </w:r>
+      <w:r>
+        <w:rPr>
+          <w:rFonts w:ascii="Times New Roman" w:cs="Times New Roman" w:eastAsia="Times New Roman" w:hAnsi="Times New Roman"/>
+          <w:b/>
+          <w:bCs/>
+          <w:color w:val="B23A2E"/>
+          <w:sz w:val="24"/>
+          <w:szCs w:val="24"/>
+          <w:rtl/>
+        </w:rPr>
+        <w:t xml:space="preserve">(تُردد هذه الآية 14 مرة) ثم تُدعى: «اللهم إني أسألك من فضلك الواسع وجودك السابغ أن تُغنيني عن جميع خلقك بالله» (تُردد هذه الآية 3 مرات)</w:t>
+      </w:r>
+      <w:r>
+        <w:rPr>
+          <w:rFonts w:ascii="Times New Roman" w:cs="Times New Roman" w:eastAsia="Times New Roman" w:hAnsi="Times New Roman"/>
+          <w:sz w:val="24"/>
+          <w:szCs w:val="24"/>
+          <w:rtl/>
+        </w:rPr>
+        <w:t xml:space="preserve"> وَٱلشَّمۡسُ تَجۡرِي لِمُسۡتَقَرّٖ لَّهَاۚ ذَٰلِكَ تَقۡدِيرُ ٱلۡعَزِيزِ ٱلۡعَلِيمِ (38)وَٱلۡقَمَرَ قَدَّرۡنَٰهُ مَنَازِلَ حَتَّىٰ عَادَ كَٱلۡعُرۡجُونِ ٱلۡقَدِيمِ (39)لَا ٱلشَّمۡسُ يَنۢبَغِي لَهَآ أَن تُدۡرِكَ ٱلۡقَمَرَ وَلَا ٱلَّيۡلُ سَابِقُ ٱلنَّهَارِۚ وَكُلّٞ فِي فَلَكٖ يَسۡبَحُونَ (40)وَءَايَةٞ لَّهُمۡ أَنَّا حَمَلۡنَا ذُرِّيَّتَهُمۡ فِي ٱلۡفُلۡكِ ٱلۡمَشۡحُونِ (41)وَخَلَقۡنَا لَهُم مِّن مِّثۡلِهِۦ مَا يَرۡكَبُونَ (42)وَإِن نَّشَأۡ نُغۡرِقۡهُمۡ فَلَا صَرِيخَ لَهُمۡ وَلَا هُمۡ يُنقَذُونَ (43)إِلَّا رَحۡمَةٗ مِّنَّا وَمَتَٰعًا إِلَىٰ حِينٖ (44)وَإِذَا قِيلَ لَهُمُ ٱتَّقُواْ مَا بَيۡنَ أَيۡدِيكُمۡ وَمَا خَلۡفَكُمۡ لَعَلَّكُمۡ تُرۡحَمُونَ (45)وَمَا تَأۡتِيهِم مِّنۡ ءَايَةٖ مِّنۡ ءَايَٰتِ رَبِّهِمۡ إِلَّا كَانُواْ عَنۡهَا مُعۡرِضِينَ (46)وَإِذَا قِيلَ لَهُمۡ أَنفِقُواْ مِمَّا رَزَقَكُمُ ٱللَّهُ قَالَ ٱلَّذِينَ كَفَرُواْ لِلَّذِينَ ءَامَنُوٓاْ أَنُطۡعِمُ مَن لَّوۡ يَشَآءُ ٱللَّهُ أَطۡعَمَهُۥٓ إِنۡ أَنتُمۡ إِلَّا فِي ضَلَٰلٖ مُّبِينٖ (47)وَيَقُولُونَ مَتَىٰ هَٰذَا ٱلۡوَعۡدُ إِن كُنتُمۡ صَٰدِقِينَ (48)مَا يَنظُرُونَ إِلَّا صَيۡحَةٗ وَٰحِدَةٗ تَأۡخُذُهُمۡ وَهُمۡ يَخِصِّمُونَ (49)فَلَا يَسۡتَطِيعُونَ تَوۡصِيَةٗ وَلَآ إِلَىٰٓ أَهۡلِهِمۡ يَرۡجِعُونَ (50)وَنُفِخَ فِي ٱلصُّورِ فَإِذَا هُم مِّنَ ٱلۡأَجۡدَاثِ إِلَىٰ رَبِّهِمۡ يَنسِلُونَ (51)قَالُواْ يَٰوَيۡلَنَا مَنۢ بَعَثَنَا مِن مَّرۡقَدِنَاۜۗ هَٰذَا مَا وَعَدَ ٱلرَّحۡمَٰنُ وَصَدَقَ ٱلۡمُرۡسَلُونَ (52)إِن كَانَتۡ إِلَّا صَيۡحَةٗ وَٰحِدَةٗ فَإِذَا هُمۡ جَمِيعٞ لَّدَيۡنَا مُحۡضَرُونَ (53)فَٱلۡيَوۡمَ لَا تُظۡلَمُ نَفۡسٞ شَيۡـٔٗا وَلَا تُجۡزَوۡنَ إِلَّا مَا كُنتُمۡ تَعۡمَلُونَ (54)إِنَّ أَصۡحَٰبَ ٱلۡجَنَّةِ ٱلۡيَوۡمَ فِي شُغُلٖ فَٰكِهُونَ (55)هُمۡ وَأَزۡوَٰجُهُمۡ فِي ظِلَٰلٍ عَلَى ٱلۡأَرَآئِكِ مُتَّكِـُٔونَ (56)لَهُمۡ فِيهَا فَٰكِهَةٞ وَلَهُم مَّا يَدَّعُونَ (57) سَلَٰمٞ قَوۡلٗا مِّن رَّبّٖ رَّحِيمٖ (58) </w:t>
+      </w:r>
+      <w:r>
+        <w:rPr>
+          <w:rFonts w:ascii="Times New Roman" w:cs="Times New Roman" w:eastAsia="Times New Roman" w:hAnsi="Times New Roman"/>
+          <w:b/>
+          <w:bCs/>
+          <w:color w:val="B23A2E"/>
+          <w:sz w:val="24"/>
+          <w:szCs w:val="24"/>
+          <w:rtl/>
+        </w:rPr>
+        <w:t xml:space="preserve">(تُردد هذه الآية 16 مرة) ثم تُدعى: «اللهم سلّمنا من آفات الدنيا وفتنها يا رب العالمين»</w:t>
+      </w:r>
+      <w:r>
+        <w:rPr>
+          <w:rFonts w:ascii="Times New Roman" w:cs="Times New Roman" w:eastAsia="Times New Roman" w:hAnsi="Times New Roman"/>
+          <w:sz w:val="24"/>
+          <w:szCs w:val="24"/>
+          <w:rtl/>
+        </w:rPr>
+        <w:t xml:space="preserve"> وَٱمۡتَٰزُواْ ٱلۡيَوۡمَ أَيُّهَا ٱلۡمُجۡرِمُونَ (59)أَلَمۡ أَعۡهَدۡ إِلَيۡكُمۡ يَٰبَنِيٓ ءَادَمَ أَن لَّا تَعۡبُدُواْ ٱلشَّيۡطَٰنَۖ إِنَّهُۥ لَكُمۡ عَدُوّٞ مُّبِينٞ (60)وَأَنِ ٱعۡبُدُونِيۚ هَٰذَا صِرَٰطٞ مُّسۡتَقِيمٞ (61)وَلَقَدۡ أَضَلَّ مِنكُمۡ جِبِلّٗا كَثِيرًاۖ أَفَلَمۡ تَكُونُواْ تَعۡقِلُونَ (62)هَٰذِهِۦ جَهَنَّمُ ٱلَّتِي كُنتُمۡ تُوعَدُونَ (63)ٱصۡلَوۡهَا ٱلۡيَوۡمَ بِمَا كُنتُمۡ تَكۡفُرُونَ (64)ٱلۡيَوۡمَ نَخۡتِمُ عَلَىٰٓ أَفۡوَٰهِهِمۡ وَتُكَلِّمُنَآ أَيۡدِيهِمۡ وَتَشۡهَدُ أَرۡجُلُهُم بِمَا كَانُواْ يَكۡسِبُونَ (65)وَلَوۡ نَشَآءُ لَطَمَسۡنَا عَلَىٰٓ أَعۡيُنِهِمۡ فَٱسۡتَبَقُواْ ٱلصِّرَٰطَ فَأَنَّىٰ يُبۡصِرُونَ (66)وَلَوۡ نَشَآءُ لَمَسَخۡنَٰهُمۡ عَلَىٰ مَكَانَتِهِمۡ فَمَا ٱسۡتَطَٰعُواْ مُضِيّٗا وَلَا يَرۡجِعُونَ (67)وَمَن نُّعَمِّرۡهُ نُنَكِّسۡهُ فِي ٱلۡخَلۡقِۚ أَفَلَا يَعۡقِلُونَ (68)وَمَا عَلَّمۡنَٰهُ ٱلشِّعۡرَ وَمَا يَنۢبَغِي لَهُۥٓۚ إِنۡ هُوَ إِلَّا ذِكۡرٞ وَقُرۡءَانٞ مُّبِينٞ (69)لِّيُنذِرَ مَن كَانَ حَيّٗا وَيَحِقَّ ٱلۡقَوۡلُ عَلَى ٱلۡكَٰفِرِينَ (70)أَوَلَمۡ يَرَوۡاْ أَنَّا خَلَقۡنَا لَهُم مِّمَّا عَمِلَتۡ أَيۡدِينَآ أَنۡعَٰمٗا فَهُمۡ لَهَا مَٰلِكُونَ (71)وَذَلَّلۡنَٰهَا لَهُمۡ فَمِنۡهَا رَكُوبُهُمۡ وَمِنۡهَا يَأۡكُلُونَ (72)وَلَهُمۡ فِيهَا مَنَٰفِعُ وَمَشَارِبُۚ أَفَلَا يَشۡكُرُونَ (73)وَٱتَّخَذُواْ مِن دُونِ ٱللَّهِ ءَالِهَةٗ لَّعَلَّهُمۡ يُنصَرُونَ (74)لَا يَسۡتَطِيعُونَ نَصۡرَهُمۡ وَهُمۡ لَهُمۡ جُندٞ مُّحۡضَرُونَ (75)فَلَا يَحۡزُنكَ قَوۡلُهُمۡۘ إِنَّا نَعۡلَمُ مَا يُسِرُّونَ وَمَا يُعۡلِنُونَ (76)أَوَلَمۡ يَرَ ٱلۡإِنسَٰنُ أَنَّا خَلَقۡنَٰهُ مِن نُّطۡفَةٖ فَإِذَا هُوَ خَصِيمٞ مُّبِينٞ (77)وَضَرَبَ لَنَا مَثَلٗا وَنَسِيَ خَلۡقَهُۥۖ قَالَ مَن يُحۡيِ ٱلۡعِظَٰمَ وَهِيَ رَمِيمٞ (78)قُلۡ يُحۡيِيهَا ٱلَّذِيٓ أَنشَأَهَآ أَوَّلَ مَرَّةٖۖ وَهُوَ بِكُلِّ خَلۡقٍ عَلِيمٌ (79)ٱلَّذِي جَعَلَ لَكُم مِّنَ ٱلشَّجَرِ ٱلۡأَخۡضَرِ نَارٗا فَإِذَآ أَنتُم مِّنۡهُ تُوقِدُونَ (80)أَوَلَيۡسَ ٱلَّذِي خَلَقَ ٱلسَّمَٰوَٰتِ وَٱلۡأَرۡضَ بِقَٰدِرٍ عَلَىٰٓ أَن يَخۡلُقَ مِثۡلَهُمۖ بَلَىٰ وَهُوَ ٱلۡخَلَّـٰقُ ٱلۡعَلِيمُ (81)إِنَّمَآ أَمۡرُهُۥٓ إِذَآ أَرَادَ شَيۡـًٔا أَن يَقُولَ لَهُۥ كُن فَيَكُونُ (82)فَسُبۡحَٰنَ ٱلَّذِي بِيَدِهِۦ مَلَكُوتُ كُلِّ شَيۡءٖ وَإِلَيۡهِ تُرۡجَعُونَ (83) </w:t>
+      </w:r>
+      <w:r>
+        <w:rPr>
+          <w:rFonts w:ascii="Times New Roman" w:cs="Times New Roman" w:eastAsia="Times New Roman" w:hAnsi="Times New Roman"/>
+          <w:b/>
+          <w:bCs/>
+          <w:color w:val="B23A2E"/>
+          <w:sz w:val="24"/>
+          <w:szCs w:val="24"/>
+          <w:rtl/>
+        </w:rPr>
+        <w:t xml:space="preserve">ثم يُختم بالدعاء الآتي: «سبحان المنفّس عن كل مهموم، سبحان العليم بما كان وما يكون، سبحان سبحان من إذا أراد شيئًا قال له كن فيكون، سبحان الذي بيده ملكوت كل شيء وإليه تُرجعون، يا صمد يا إلهي، يا صمد معتمدي، اقضِ حاجتي» (ويذكرها) «... بحق يس، ومن أنزلها، ومن نزلت عليه، ومن نزلت به»</w:t>
       </w:r>
     </w:p>
     <w:p>

</xml_diff>

<commit_message>
Regenerate Word export with reordered Category 3
Co-Authored-By: Claude Sonnet 5 <noreply@anthropic.com>
Claude-Session: https://claude.ai/code/session_015v8MN6VZjbnhmn7ju2JYhZ
</commit_message>
<xml_diff>
--- a/خزانة الأدعية.docx
+++ b/خزانة الأدعية.docx
@@ -3361,6 +3361,74 @@
           <w:szCs w:val="24"/>
           <w:rtl/>
         </w:rPr>
+        <w:t xml:space="preserve">تُقرأ الآية «وَمَا رَمَيْتَ إِذْ رَمَيْتَ وَلَٰكِنَّ اللَّهَ رَمَىٰ» (21 مرة) قبل النوم، وبعدها الدعاء: «اللهم ارمِ بقلب من ظلمني وسحرني وآذاني نار من نار جهنم» (3 مرات) «لا تهدأ ولا تنطفئ أبدًا، بحق لا إله إلا الله وبحق محمد رسول الله»</w:t>
+      </w:r>
+    </w:p>
+    <w:p>
+      <w:pPr>
+        <w:bidi/>
+        <w:spacing w:after="120" w:before="320"/>
+        <w:jc w:val="right"/>
+      </w:pPr>
+      <w:r>
+        <w:rPr>
+          <w:rFonts w:ascii="Times New Roman" w:cs="Times New Roman" w:eastAsia="Times New Roman" w:hAnsi="Times New Roman"/>
+          <w:b/>
+          <w:bCs/>
+          <w:sz w:val="44"/>
+          <w:szCs w:val="44"/>
+          <w:rtl/>
+        </w:rPr>
+        <w:t xml:space="preserve">الدعاء الثاني</w:t>
+      </w:r>
+    </w:p>
+    <w:p>
+      <w:pPr>
+        <w:bidi/>
+        <w:spacing w:after="200" w:line="340"/>
+        <w:jc w:val="right"/>
+      </w:pPr>
+      <w:r>
+        <w:rPr>
+          <w:rFonts w:ascii="Times New Roman" w:cs="Times New Roman" w:eastAsia="Times New Roman" w:hAnsi="Times New Roman"/>
+          <w:sz w:val="24"/>
+          <w:szCs w:val="24"/>
+          <w:rtl/>
+        </w:rPr>
+        <w:t xml:space="preserve">ركعتين بنية قضاء الحاجة والنصرة على من ظلمني، بعد التسليم يُقال: «اللهم ربنا وإلهنا ومولانا، صلِّ على نبينا وسيدنا محمد وسلم، اللهم اكفنا شر أعدائنا» (مع ذكر اسم العدو) «ومن أراد بنا سوءًا فأحطه به كإحاطة القلائد بتراقي الولائد، وأرسخه على هامته كرسوخ السجيل على رؤوس أصحاب الفيل، وحسبنا الله ونعم الوكيل»</w:t>
+      </w:r>
+    </w:p>
+    <w:p>
+      <w:pPr>
+        <w:bidi/>
+        <w:spacing w:after="120" w:before="320"/>
+        <w:jc w:val="right"/>
+      </w:pPr>
+      <w:r>
+        <w:rPr>
+          <w:rFonts w:ascii="Times New Roman" w:cs="Times New Roman" w:eastAsia="Times New Roman" w:hAnsi="Times New Roman"/>
+          <w:b/>
+          <w:bCs/>
+          <w:sz w:val="44"/>
+          <w:szCs w:val="44"/>
+          <w:rtl/>
+        </w:rPr>
+        <w:t xml:space="preserve">الدعاء الثالث</w:t>
+      </w:r>
+    </w:p>
+    <w:p>
+      <w:pPr>
+        <w:bidi/>
+        <w:spacing w:after="200" w:line="340"/>
+        <w:jc w:val="right"/>
+      </w:pPr>
+      <w:r>
+        <w:rPr>
+          <w:rFonts w:ascii="Times New Roman" w:cs="Times New Roman" w:eastAsia="Times New Roman" w:hAnsi="Times New Roman"/>
+          <w:sz w:val="24"/>
+          <w:szCs w:val="24"/>
+          <w:rtl/>
+        </w:rPr>
         <w:t xml:space="preserve">إذا عاوزت تاخد حقك من اللي ظلمك: «اللهم بحق كهيعص اكفنا هم العدا، ولقهم الردى، واجعلهم لكل حبيب فدا، وصلّ عليهم عاجل النعمة في اليوم والغد ... اللهم آمين يا رب»</w:t>
       </w:r>
     </w:p>
@@ -3379,7 +3447,7 @@
           <w:szCs w:val="44"/>
           <w:rtl/>
         </w:rPr>
-        <w:t xml:space="preserve">الدعاء الثاني</w:t>
+        <w:t xml:space="preserve">الدعاء الرابع</w:t>
       </w:r>
     </w:p>
     <w:p>
@@ -3413,7 +3481,7 @@
           <w:szCs w:val="44"/>
           <w:rtl/>
         </w:rPr>
-        <w:t xml:space="preserve">الدعاء الثالث</w:t>
+        <w:t xml:space="preserve">الدعاء الخامس</w:t>
       </w:r>
     </w:p>
     <w:p>
@@ -3447,7 +3515,7 @@
           <w:szCs w:val="44"/>
           <w:rtl/>
         </w:rPr>
-        <w:t xml:space="preserve">الدعاء الرابع</w:t>
+        <w:t xml:space="preserve">الدعاء السادس</w:t>
       </w:r>
     </w:p>
     <w:p>
@@ -3481,7 +3549,7 @@
           <w:szCs w:val="44"/>
           <w:rtl/>
         </w:rPr>
-        <w:t xml:space="preserve">الدعاء الخامس</w:t>
+        <w:t xml:space="preserve">الدعاء السابع</w:t>
       </w:r>
     </w:p>
     <w:p>
@@ -3515,41 +3583,7 @@
           <w:szCs w:val="44"/>
           <w:rtl/>
         </w:rPr>
-        <w:t xml:space="preserve">الدعاء السادس</w:t>
-      </w:r>
-    </w:p>
-    <w:p>
-      <w:pPr>
-        <w:bidi/>
-        <w:spacing w:after="200" w:line="340"/>
-        <w:jc w:val="right"/>
-      </w:pPr>
-      <w:r>
-        <w:rPr>
-          <w:rFonts w:ascii="Times New Roman" w:cs="Times New Roman" w:eastAsia="Times New Roman" w:hAnsi="Times New Roman"/>
-          <w:sz w:val="24"/>
-          <w:szCs w:val="24"/>
-          <w:rtl/>
-        </w:rPr>
-        <w:t xml:space="preserve">تُقرأ الآية «وَمَا رَمَيْتَ إِذْ رَمَيْتَ وَلَٰكِنَّ اللَّهَ رَمَىٰ» (21 مرة) قبل النوم، وبعدها الدعاء: «اللهم ارمِ بقلب من ظلمني وسحرني وآذاني نار من نار جهنم» (3 مرات) «لا تهدأ ولا تنطفئ أبدًا، بحق لا إله إلا الله وبحق محمد رسول الله»</w:t>
-      </w:r>
-    </w:p>
-    <w:p>
-      <w:pPr>
-        <w:bidi/>
-        <w:spacing w:after="120" w:before="320"/>
-        <w:jc w:val="right"/>
-      </w:pPr>
-      <w:r>
-        <w:rPr>
-          <w:rFonts w:ascii="Times New Roman" w:cs="Times New Roman" w:eastAsia="Times New Roman" w:hAnsi="Times New Roman"/>
-          <w:b/>
-          <w:bCs/>
-          <w:sz w:val="44"/>
-          <w:szCs w:val="44"/>
-          <w:rtl/>
-        </w:rPr>
-        <w:t xml:space="preserve">الدعاء السابع</w:t>
+        <w:t xml:space="preserve">الدعاء الثامن</w:t>
       </w:r>
     </w:p>
     <w:p>
@@ -3583,7 +3617,7 @@
           <w:szCs w:val="44"/>
           <w:rtl/>
         </w:rPr>
-        <w:t xml:space="preserve">الدعاء الثامن</w:t>
+        <w:t xml:space="preserve">الدعاء التاسع</w:t>
       </w:r>
     </w:p>
     <w:p>
@@ -3617,7 +3651,7 @@
           <w:szCs w:val="44"/>
           <w:rtl/>
         </w:rPr>
-        <w:t xml:space="preserve">الدعاء التاسع</w:t>
+        <w:t xml:space="preserve">الدعاء العاشر</w:t>
       </w:r>
     </w:p>
     <w:p>
@@ -3651,7 +3685,7 @@
           <w:szCs w:val="44"/>
           <w:rtl/>
         </w:rPr>
-        <w:t xml:space="preserve">الدعاء العاشر</w:t>
+        <w:t xml:space="preserve">الدعاء الحادي عشر</w:t>
       </w:r>
     </w:p>
     <w:p>
@@ -3685,7 +3719,7 @@
           <w:szCs w:val="44"/>
           <w:rtl/>
         </w:rPr>
-        <w:t xml:space="preserve">الدعاء الحادي عشر</w:t>
+        <w:t xml:space="preserve">الدعاء الثاني عشر</w:t>
       </w:r>
     </w:p>
     <w:p>
@@ -3702,40 +3736,6 @@
           <w:rtl/>
         </w:rPr>
         <w:t xml:space="preserve">دعاء لكل شخص مظلوم وعنده شخص مؤذي: «سبحان الله الحي القدوس، سبحان الله وبحمده ذو العزة والجبروت، يا عزيز يا حميد يا ذا العرش المجيد، اصرف عني ما أطيق وما لا أطيق، واكفني شر كل جبار عنيد، واصرف عني جار السوء وشر الظالمين»</w:t>
-      </w:r>
-    </w:p>
-    <w:p>
-      <w:pPr>
-        <w:bidi/>
-        <w:spacing w:after="120" w:before="320"/>
-        <w:jc w:val="right"/>
-      </w:pPr>
-      <w:r>
-        <w:rPr>
-          <w:rFonts w:ascii="Times New Roman" w:cs="Times New Roman" w:eastAsia="Times New Roman" w:hAnsi="Times New Roman"/>
-          <w:b/>
-          <w:bCs/>
-          <w:sz w:val="44"/>
-          <w:szCs w:val="44"/>
-          <w:rtl/>
-        </w:rPr>
-        <w:t xml:space="preserve">الدعاء الثاني عشر</w:t>
-      </w:r>
-    </w:p>
-    <w:p>
-      <w:pPr>
-        <w:bidi/>
-        <w:spacing w:after="200" w:line="340"/>
-        <w:jc w:val="right"/>
-      </w:pPr>
-      <w:r>
-        <w:rPr>
-          <w:rFonts w:ascii="Times New Roman" w:cs="Times New Roman" w:eastAsia="Times New Roman" w:hAnsi="Times New Roman"/>
-          <w:sz w:val="24"/>
-          <w:szCs w:val="24"/>
-          <w:rtl/>
-        </w:rPr>
-        <w:t xml:space="preserve">ركعتين بنية قضاء الحاجة والنصرة على من ظلمني، بعد التسليم يُقال: «اللهم ربنا وإلهنا ومولانا، صلِّ على نبينا وسيدنا محمد وسلم، اللهم اكفنا شر أعدائنا» (مع ذكر اسم العدو) «ومن أراد بنا سوءًا فأحطه به كإحاطة القلائد بتراقي الولائد، وأرسخه على هامته كرسوخ السجيل على رؤوس أصحاب الفيل، وحسبنا الله ونعم الوكيل»</w:t>
       </w:r>
     </w:p>
     <w:p>

</xml_diff>

<commit_message>
Regenerate Word export with Khidr's dua moved to Category 2
Co-Authored-By: Claude Sonnet 5 <noreply@anthropic.com>
Claude-Session: https://claude.ai/code/session_015v8MN6VZjbnhmn7ju2JYhZ
</commit_message>
<xml_diff>
--- a/خزانة الأدعية.docx
+++ b/خزانة الأدعية.docx
@@ -787,6 +787,40 @@
           <w:szCs w:val="24"/>
           <w:rtl/>
         </w:rPr>
+        <w:t xml:space="preserve">دعاء الخضر عليه السلام (يُقال 3 مرات): «بسم الله ما شاء الله، لا يسوق الخير إلا الله. بسم الله ما شاء الله، لا يصرف السوء إلا الله. بسم الله ما شاء الله، ما كان من نعمة فمن الله. بسم الله ما شاء الله، ولا حول ولا قوة إلا بالله» — ينفع بإذن الله لتيسير الرزق وللحفظ من المكروه؛ قال ابن عباس رضي الله عنه: من قالهن حين يصبح وحين يمسي ثلاث مرات، أمّنه الله من الغرق والحريق والسرق ومن الشياطين والحية والعقرب</w:t>
+      </w:r>
+    </w:p>
+    <w:p>
+      <w:pPr>
+        <w:bidi/>
+        <w:spacing w:after="120" w:before="320"/>
+        <w:jc w:val="right"/>
+      </w:pPr>
+      <w:r>
+        <w:rPr>
+          <w:rFonts w:ascii="Times New Roman" w:cs="Times New Roman" w:eastAsia="Times New Roman" w:hAnsi="Times New Roman"/>
+          <w:b/>
+          <w:bCs/>
+          <w:sz w:val="44"/>
+          <w:szCs w:val="44"/>
+          <w:rtl/>
+        </w:rPr>
+        <w:t xml:space="preserve">الدعاء الثاني</w:t>
+      </w:r>
+    </w:p>
+    <w:p>
+      <w:pPr>
+        <w:bidi/>
+        <w:spacing w:after="200" w:line="340"/>
+        <w:jc w:val="right"/>
+      </w:pPr>
+      <w:r>
+        <w:rPr>
+          <w:rFonts w:ascii="Times New Roman" w:cs="Times New Roman" w:eastAsia="Times New Roman" w:hAnsi="Times New Roman"/>
+          <w:sz w:val="24"/>
+          <w:szCs w:val="24"/>
+          <w:rtl/>
+        </w:rPr>
         <w:t xml:space="preserve">للرزق: ردد 7 مرات بعد كل صلاة: «لَقَدْ جَاءَكُمْ رَسُولٌ مِّنْ أَنفُسِكُمْ عَزِيزٌ عَلَيْهِ مَا عَنِتُّمْ حَرِيصٌ عَلَيْكُم بِالْمُؤْمِنِينَ رَءُوفٌ رَّحِيمٌ (128) فَإِن تَوَلَّوْا فَقُلْ حَسْبِيَ اللَّهُ لَا إِلَٰهَ إِلَّا هُوَ ۖ عَلَيْهِ تَوَكَّلْتُ ۖ وَهُوَ رَبُّ الْعَرْشِ الْعَظِيمِ»</w:t>
       </w:r>
     </w:p>
@@ -805,7 +839,7 @@
           <w:szCs w:val="44"/>
           <w:rtl/>
         </w:rPr>
-        <w:t xml:space="preserve">الدعاء الثاني</w:t>
+        <w:t xml:space="preserve">الدعاء الثالث</w:t>
       </w:r>
     </w:p>
     <w:p>
@@ -839,7 +873,7 @@
           <w:szCs w:val="44"/>
           <w:rtl/>
         </w:rPr>
-        <w:t xml:space="preserve">الدعاء الثالث</w:t>
+        <w:t xml:space="preserve">الدعاء الرابع</w:t>
       </w:r>
     </w:p>
     <w:p>
@@ -873,7 +907,7 @@
           <w:szCs w:val="44"/>
           <w:rtl/>
         </w:rPr>
-        <w:t xml:space="preserve">الدعاء الرابع</w:t>
+        <w:t xml:space="preserve">الدعاء الخامس</w:t>
       </w:r>
     </w:p>
     <w:p>
@@ -907,7 +941,7 @@
           <w:szCs w:val="44"/>
           <w:rtl/>
         </w:rPr>
-        <w:t xml:space="preserve">الدعاء الخامس</w:t>
+        <w:t xml:space="preserve">الدعاء السادس</w:t>
       </w:r>
     </w:p>
     <w:p>
@@ -941,7 +975,7 @@
           <w:szCs w:val="44"/>
           <w:rtl/>
         </w:rPr>
-        <w:t xml:space="preserve">الدعاء السادس</w:t>
+        <w:t xml:space="preserve">الدعاء السابع</w:t>
       </w:r>
     </w:p>
     <w:p>
@@ -975,7 +1009,7 @@
           <w:szCs w:val="44"/>
           <w:rtl/>
         </w:rPr>
-        <w:t xml:space="preserve">الدعاء السابع</w:t>
+        <w:t xml:space="preserve">الدعاء الثامن</w:t>
       </w:r>
     </w:p>
     <w:p>
@@ -1009,7 +1043,7 @@
           <w:szCs w:val="44"/>
           <w:rtl/>
         </w:rPr>
-        <w:t xml:space="preserve">الدعاء الثامن</w:t>
+        <w:t xml:space="preserve">الدعاء التاسع</w:t>
       </w:r>
     </w:p>
     <w:p>
@@ -1043,7 +1077,7 @@
           <w:szCs w:val="44"/>
           <w:rtl/>
         </w:rPr>
-        <w:t xml:space="preserve">الدعاء التاسع</w:t>
+        <w:t xml:space="preserve">الدعاء العاشر</w:t>
       </w:r>
     </w:p>
     <w:p>
@@ -1077,7 +1111,7 @@
           <w:szCs w:val="44"/>
           <w:rtl/>
         </w:rPr>
-        <w:t xml:space="preserve">الدعاء العاشر</w:t>
+        <w:t xml:space="preserve">الدعاء الحادي عشر</w:t>
       </w:r>
     </w:p>
     <w:p>
@@ -1111,7 +1145,7 @@
           <w:szCs w:val="44"/>
           <w:rtl/>
         </w:rPr>
-        <w:t xml:space="preserve">الدعاء الحادي عشر</w:t>
+        <w:t xml:space="preserve">الدعاء الثاني عشر</w:t>
       </w:r>
     </w:p>
     <w:p>
@@ -1145,7 +1179,7 @@
           <w:szCs w:val="44"/>
           <w:rtl/>
         </w:rPr>
-        <w:t xml:space="preserve">الدعاء الثاني عشر</w:t>
+        <w:t xml:space="preserve">الدعاء الثالث عشر</w:t>
       </w:r>
     </w:p>
     <w:p>
@@ -1179,7 +1213,7 @@
           <w:szCs w:val="44"/>
           <w:rtl/>
         </w:rPr>
-        <w:t xml:space="preserve">الدعاء الثالث عشر</w:t>
+        <w:t xml:space="preserve">الدعاء الرابع عشر</w:t>
       </w:r>
     </w:p>
     <w:p>
@@ -1213,7 +1247,7 @@
           <w:szCs w:val="44"/>
           <w:rtl/>
         </w:rPr>
-        <w:t xml:space="preserve">الدعاء الرابع عشر</w:t>
+        <w:t xml:space="preserve">الدعاء الخامس عشر</w:t>
       </w:r>
     </w:p>
     <w:p>
@@ -1247,7 +1281,7 @@
           <w:szCs w:val="44"/>
           <w:rtl/>
         </w:rPr>
-        <w:t xml:space="preserve">الدعاء الخامس عشر</w:t>
+        <w:t xml:space="preserve">الدعاء السادس عشر</w:t>
       </w:r>
     </w:p>
     <w:p>
@@ -1281,7 +1315,7 @@
           <w:szCs w:val="44"/>
           <w:rtl/>
         </w:rPr>
-        <w:t xml:space="preserve">الدعاء السادس عشر</w:t>
+        <w:t xml:space="preserve">الدعاء السابع عشر</w:t>
       </w:r>
     </w:p>
     <w:p>
@@ -1315,7 +1349,7 @@
           <w:szCs w:val="44"/>
           <w:rtl/>
         </w:rPr>
-        <w:t xml:space="preserve">الدعاء السابع عشر</w:t>
+        <w:t xml:space="preserve">الدعاء الثامن عشر</w:t>
       </w:r>
     </w:p>
     <w:p>
@@ -1349,7 +1383,7 @@
           <w:szCs w:val="44"/>
           <w:rtl/>
         </w:rPr>
-        <w:t xml:space="preserve">الدعاء الثامن عشر</w:t>
+        <w:t xml:space="preserve">الدعاء التاسع عشر</w:t>
       </w:r>
     </w:p>
     <w:p>
@@ -1383,7 +1417,7 @@
           <w:szCs w:val="44"/>
           <w:rtl/>
         </w:rPr>
-        <w:t xml:space="preserve">الدعاء التاسع عشر</w:t>
+        <w:t xml:space="preserve">الدعاء العشرون</w:t>
       </w:r>
     </w:p>
     <w:p>
@@ -1417,7 +1451,7 @@
           <w:szCs w:val="44"/>
           <w:rtl/>
         </w:rPr>
-        <w:t xml:space="preserve">الدعاء العشرون</w:t>
+        <w:t xml:space="preserve">الدعاء الحادي والعشرون</w:t>
       </w:r>
     </w:p>
     <w:p>
@@ -1451,7 +1485,7 @@
           <w:szCs w:val="44"/>
           <w:rtl/>
         </w:rPr>
-        <w:t xml:space="preserve">الدعاء الحادي والعشرون</w:t>
+        <w:t xml:space="preserve">الدعاء الثاني والعشرون</w:t>
       </w:r>
     </w:p>
     <w:p>
@@ -1485,7 +1519,7 @@
           <w:szCs w:val="44"/>
           <w:rtl/>
         </w:rPr>
-        <w:t xml:space="preserve">الدعاء الثاني والعشرون</w:t>
+        <w:t xml:space="preserve">الدعاء الثالث والعشرون</w:t>
       </w:r>
     </w:p>
     <w:p>
@@ -1519,7 +1553,7 @@
           <w:szCs w:val="44"/>
           <w:rtl/>
         </w:rPr>
-        <w:t xml:space="preserve">الدعاء الثالث والعشرون</w:t>
+        <w:t xml:space="preserve">الدعاء الرابع والعشرون</w:t>
       </w:r>
     </w:p>
     <w:p>
@@ -1553,7 +1587,7 @@
           <w:szCs w:val="44"/>
           <w:rtl/>
         </w:rPr>
-        <w:t xml:space="preserve">الدعاء الرابع والعشرون</w:t>
+        <w:t xml:space="preserve">الدعاء الخامس والعشرون</w:t>
       </w:r>
     </w:p>
     <w:p>
@@ -1587,7 +1621,7 @@
           <w:szCs w:val="44"/>
           <w:rtl/>
         </w:rPr>
-        <w:t xml:space="preserve">الدعاء الخامس والعشرون</w:t>
+        <w:t xml:space="preserve">الدعاء السادس والعشرون</w:t>
       </w:r>
     </w:p>
     <w:p>
@@ -1621,7 +1655,7 @@
           <w:szCs w:val="44"/>
           <w:rtl/>
         </w:rPr>
-        <w:t xml:space="preserve">الدعاء السادس والعشرون</w:t>
+        <w:t xml:space="preserve">الدعاء السابع والعشرون</w:t>
       </w:r>
     </w:p>
     <w:p>
@@ -1655,7 +1689,7 @@
           <w:szCs w:val="44"/>
           <w:rtl/>
         </w:rPr>
-        <w:t xml:space="preserve">الدعاء السابع والعشرون</w:t>
+        <w:t xml:space="preserve">الدعاء الثامن والعشرون</w:t>
       </w:r>
     </w:p>
     <w:p>
@@ -1689,7 +1723,7 @@
           <w:szCs w:val="44"/>
           <w:rtl/>
         </w:rPr>
-        <w:t xml:space="preserve">الدعاء الثامن والعشرون</w:t>
+        <w:t xml:space="preserve">الدعاء التاسع والعشرون</w:t>
       </w:r>
     </w:p>
     <w:p>
@@ -1723,7 +1757,7 @@
           <w:szCs w:val="44"/>
           <w:rtl/>
         </w:rPr>
-        <w:t xml:space="preserve">الدعاء التاسع والعشرون</w:t>
+        <w:t xml:space="preserve">الدعاء الثلاثون</w:t>
       </w:r>
     </w:p>
     <w:p>
@@ -1757,7 +1791,7 @@
           <w:szCs w:val="44"/>
           <w:rtl/>
         </w:rPr>
-        <w:t xml:space="preserve">الدعاء الثلاثون</w:t>
+        <w:t xml:space="preserve">الدعاء الحادي والثلاثون</w:t>
       </w:r>
     </w:p>
     <w:p>
@@ -4905,7 +4939,7 @@
           <w:szCs w:val="24"/>
           <w:rtl/>
         </w:rPr>
-        <w:t xml:space="preserve">دعاء الخضر عليه السلام (يُقال 3 مرات): «بسم الله ما شاء الله، لا يسوق الخير إلا الله. بسم الله ما شاء الله، لا يصرف السوء إلا الله. بسم الله ما شاء الله، ما كان من نعمة فمن الله. بسم الله ما شاء الله، ولا حول ولا قوة إلا بالله» — ينفع بإذن الله لتيسير الرزق وللحفظ من المكروه؛ قال ابن عباس رضي الله عنه: من قالهن حين يصبح وحين يمسي ثلاث مرات، أمّنه الله من الغرق والحريق والسرق ومن الشياطين والحية والعقرب</w:t>
+        <w:t xml:space="preserve">﴿وَقَدِمْنَا إِلَىٰ مَا عَمِلُوا مِنْ عَمَلٍ فَجَعَلْنَاهُ هَبَاءً مَّنثُورًا﴾ تُقرأ على ماء 137 مرة لمدة 11 يومًا</w:t>
       </w:r>
     </w:p>
     <w:p>
@@ -4939,7 +4973,7 @@
           <w:szCs w:val="24"/>
           <w:rtl/>
         </w:rPr>
-        <w:t xml:space="preserve">﴿وَقَدِمْنَا إِلَىٰ مَا عَمِلُوا مِنْ عَمَلٍ فَجَعَلْنَاهُ هَبَاءً مَّنثُورًا﴾ تُقرأ على ماء 137 مرة لمدة 11 يومًا</w:t>
+        <w:t xml:space="preserve">دعاء الخروج من البيت: «حَسْبُنَا اللَّهُ سَيُؤْتِينَا اللَّهُ مِن فَضْلِهِ وَرَسُولُهُ إِنَّا إِلَى اللَّهِ رَاغِبُونَ»</w:t>
       </w:r>
     </w:p>
     <w:p>
@@ -4973,7 +5007,7 @@
           <w:szCs w:val="24"/>
           <w:rtl/>
         </w:rPr>
-        <w:t xml:space="preserve">دعاء الخروج من البيت: «حَسْبُنَا اللَّهُ سَيُؤْتِينَا اللَّهُ مِن فَضْلِهِ وَرَسُولُهُ إِنَّا إِلَى اللَّهِ رَاغِبُونَ»</w:t>
+        <w:t xml:space="preserve">خمس تحصينات يومية: الفاتحة، الإخلاص، المعوذتان، ثم: «بسم الله أرقيك من كل شيء يؤذيك، من شر كل نفس أو عين حاسد، الله يشفيك، بسم الله أرقيك»، «أعيذك بكلمات الله التامة من كل شيطان وهامّة، ومن كل عين لامّة»، «أعيذك بكلمات الله التامات من غضبه وعقابه، ومن شر عباده، ومن همزات الشياطين، وأعوذ بك رب أن يحضرون»، «اللهم ذا السلطان العظيم، والمنّ القديم، وذا الوجه الكريم، ولي الكلمات التامات والدعوات المستجابات، عافنا من أنفس الجن وأعين الإنس»، «أعيذك بكلمات الله التامات التي لا يجاوزهن بر ولا فاجر، من شر ما خلق وذرأ وبرأ، ومن شر ما ينزل من السماء وما يعرج فيها، ومن شر ما ذرأ في الأرض ومن شر ما يخرج منها، ومن شر فتن الليل والنهار، ومن شر طوارق الليل والنهار إلا طارقًا يطرق بخير يا رحمن»، «بسم الله يُبريك من كل داء يؤذيك، من حسد كل حاسد وكل عين، واسم الله يشفيك»</w:t>
       </w:r>
     </w:p>
     <w:p>
@@ -5007,7 +5041,7 @@
           <w:szCs w:val="24"/>
           <w:rtl/>
         </w:rPr>
-        <w:t xml:space="preserve">خمس تحصينات يومية: الفاتحة، الإخلاص، المعوذتان، ثم: «بسم الله أرقيك من كل شيء يؤذيك، من شر كل نفس أو عين حاسد، الله يشفيك، بسم الله أرقيك»، «أعيذك بكلمات الله التامة من كل شيطان وهامّة، ومن كل عين لامّة»، «أعيذك بكلمات الله التامات من غضبه وعقابه، ومن شر عباده، ومن همزات الشياطين، وأعوذ بك رب أن يحضرون»، «اللهم ذا السلطان العظيم، والمنّ القديم، وذا الوجه الكريم، ولي الكلمات التامات والدعوات المستجابات، عافنا من أنفس الجن وأعين الإنس»، «أعيذك بكلمات الله التامات التي لا يجاوزهن بر ولا فاجر، من شر ما خلق وذرأ وبرأ، ومن شر ما ينزل من السماء وما يعرج فيها، ومن شر ما ذرأ في الأرض ومن شر ما يخرج منها، ومن شر فتن الليل والنهار، ومن شر طوارق الليل والنهار إلا طارقًا يطرق بخير يا رحمن»، «بسم الله يُبريك من كل داء يؤذيك، من حسد كل حاسد وكل عين، واسم الله يشفيك»</w:t>
+        <w:t xml:space="preserve">أعوذ بوجه الله العظيم الذي ليس شيء أعظم منه، وبكلمات الله التامات التي لا يجاوزهن بر ولا فاجر، وبأسماء الله الحسنى كلها ما علمت منها وما لم أعلم، من شر ما خلق وذرأ وبرأ، ومن شر كل دابة هو آخذ بناصيتها، إن ربي على صراط مستقيم</w:t>
       </w:r>
     </w:p>
     <w:p>
@@ -5041,7 +5075,7 @@
           <w:szCs w:val="24"/>
           <w:rtl/>
         </w:rPr>
-        <w:t xml:space="preserve">أعوذ بوجه الله العظيم الذي ليس شيء أعظم منه، وبكلمات الله التامات التي لا يجاوزهن بر ولا فاجر، وبأسماء الله الحسنى كلها ما علمت منها وما لم أعلم، من شر ما خلق وذرأ وبرأ، ومن شر كل دابة هو آخذ بناصيتها، إن ربي على صراط مستقيم</w:t>
+        <w:t xml:space="preserve">دعاء الصباح والمساء للحفظ (حديث): «اللهم إني أصبحت في ذمتك وجوارك، اللهم إني أستودعك ديني ونفسي ودنياي وآخرتي وأهلي ومالي، وأعوذ بك يا عظيم من شر خلقك جميعًا، وأعوذ بك من شر ما يُبلس به إبليس وجنوده»</w:t>
       </w:r>
     </w:p>
     <w:p>
@@ -5075,7 +5109,7 @@
           <w:szCs w:val="24"/>
           <w:rtl/>
         </w:rPr>
-        <w:t xml:space="preserve">دعاء الصباح والمساء للحفظ (حديث): «اللهم إني أصبحت في ذمتك وجوارك، اللهم إني أستودعك ديني ونفسي ودنياي وآخرتي وأهلي ومالي، وأعوذ بك يا عظيم من شر خلقك جميعًا، وأعوذ بك من شر ما يُبلس به إبليس وجنوده»</w:t>
+        <w:t xml:space="preserve">للأمن من الحرق والغرق: ﴿اللَّهُ الَّذِي نَزَّلَ الْكِتَابَ وَهُوَ يَتَوَلَّى الصَّالِحِينَ﴾ إلى ﴿وَالسَّمَاوَاتُ مَطْوِيَّاتٌ بِيَمِينِهِ سُبْحَانَهُ وَتَعَالَىٰ عَمَّا يُشْرِكُونَ﴾</w:t>
       </w:r>
     </w:p>
     <w:p>
@@ -5109,7 +5143,7 @@
           <w:szCs w:val="24"/>
           <w:rtl/>
         </w:rPr>
-        <w:t xml:space="preserve">للأمن من الحرق والغرق: ﴿اللَّهُ الَّذِي نَزَّلَ الْكِتَابَ وَهُوَ يَتَوَلَّى الصَّالِحِينَ﴾ إلى ﴿وَالسَّمَاوَاتُ مَطْوِيَّاتٌ بِيَمِينِهِ سُبْحَانَهُ وَتَعَالَىٰ عَمَّا يُشْرِكُونَ﴾</w:t>
+        <w:t xml:space="preserve">للحفظ من السوء، يُقال 3 مرات بعد كل صلاة: «أُعيذ نفسي وديني وأهلي ومالي وولدي وإخواني في ديني، وما رزقني ربي، وخواتيم عملي، ومن يعنيني أمره، بالله الواحد الأحد الصمد الذي لم يلد ولم يولد ولم يكن له كفوًا أحد، وبرب الفلق من شر ما خلق ومن شر غاسق إذا وقب ومن شر النفاثات في العقد ومن شر حاسد إذا حسد، وبرب الناس ملك الناس إله الناس من شر الوسواس الخناس الذي يوسوس في صدور الناس من الجنة والناس»</w:t>
       </w:r>
     </w:p>
     <w:p>
@@ -5143,7 +5177,7 @@
           <w:szCs w:val="24"/>
           <w:rtl/>
         </w:rPr>
-        <w:t xml:space="preserve">للحفظ من السوء، يُقال 3 مرات بعد كل صلاة: «أُعيذ نفسي وديني وأهلي ومالي وولدي وإخواني في ديني، وما رزقني ربي، وخواتيم عملي، ومن يعنيني أمره، بالله الواحد الأحد الصمد الذي لم يلد ولم يولد ولم يكن له كفوًا أحد، وبرب الفلق من شر ما خلق ومن شر غاسق إذا وقب ومن شر النفاثات في العقد ومن شر حاسد إذا حسد، وبرب الناس ملك الناس إله الناس من شر الوسواس الخناس الذي يوسوس في صدور الناس من الجنة والناس»</w:t>
+        <w:t xml:space="preserve">إذا خفت أمرًا، فقل: «اللهم إنك لا يكفي منك أحد، وأنت تكفي من كل أحد من خلقك، فاكفني» (وتذكر ما تخاف منه)</w:t>
       </w:r>
     </w:p>
     <w:p>
@@ -5177,7 +5211,7 @@
           <w:szCs w:val="24"/>
           <w:rtl/>
         </w:rPr>
-        <w:t xml:space="preserve">إذا خفت أمرًا، فقل: «اللهم إنك لا يكفي منك أحد، وأنت تكفي من كل أحد من خلقك، فاكفني» (وتذكر ما تخاف منه)</w:t>
+        <w:t xml:space="preserve">دعاء كان يقوله علي بن الحسين زين العابدين: «بسم الله وبالله، ومن الله، وإلى الله، وفي سبيل الله، وعلى ملة رسول الله صلى الله عليه وسلم، اللهم إليك أسلمت نفسي، وإليك وجهت وجهي، وإليك ألجأت ظهري، وإليك فوّضت أمري، اللهم احفظني بحفظ الإيمان من بين يدي ومن خلفي وعن يميني وعن شمالي ومن فوقي ومن تحتي وما قبلي، وادفع عني بحولك وقوتك، فإنه لا حول ولا قوة إلا بك»</w:t>
       </w:r>
     </w:p>
     <w:p>
@@ -5211,7 +5245,7 @@
           <w:szCs w:val="24"/>
           <w:rtl/>
         </w:rPr>
-        <w:t xml:space="preserve">دعاء كان يقوله علي بن الحسين زين العابدين: «بسم الله وبالله، ومن الله، وإلى الله، وفي سبيل الله، وعلى ملة رسول الله صلى الله عليه وسلم، اللهم إليك أسلمت نفسي، وإليك وجهت وجهي، وإليك ألجأت ظهري، وإليك فوّضت أمري، اللهم احفظني بحفظ الإيمان من بين يدي ومن خلفي وعن يميني وعن شمالي ومن فوقي ومن تحتي وما قبلي، وادفع عني بحولك وقوتك، فإنه لا حول ولا قوة إلا بك»</w:t>
+        <w:t xml:space="preserve">عند الغروب: تُهلّل وتستعيذ بالله، ثم تضع يدك على رأسك وتُمرّها على وجهك وتأخذ لحيتك بيدك وتقول: «أحطت على نفسي وأهلي ومالي وولدي، من غائب وشاهد، بالله الذي لا إله إلا هو، عالم الغيب والشهادة، الرحمن الرحيم، الحي القيوم لا تأخذه سنة ولا نوم» ثم تقرأ آية الكرسي إلى ﴿الْعَلِيُّ الْعَظِيمُ﴾</w:t>
       </w:r>
     </w:p>
     <w:p>
@@ -5230,40 +5264,6 @@
           <w:rtl/>
         </w:rPr>
         <w:t xml:space="preserve">الدعاء الخامس والعشرون</w:t>
-      </w:r>
-    </w:p>
-    <w:p>
-      <w:pPr>
-        <w:bidi/>
-        <w:spacing w:after="200" w:line="340"/>
-        <w:jc w:val="right"/>
-      </w:pPr>
-      <w:r>
-        <w:rPr>
-          <w:rFonts w:ascii="Times New Roman" w:cs="Times New Roman" w:eastAsia="Times New Roman" w:hAnsi="Times New Roman"/>
-          <w:sz w:val="24"/>
-          <w:szCs w:val="24"/>
-          <w:rtl/>
-        </w:rPr>
-        <w:t xml:space="preserve">عند الغروب: تُهلّل وتستعيذ بالله، ثم تضع يدك على رأسك وتُمرّها على وجهك وتأخذ لحيتك بيدك وتقول: «أحطت على نفسي وأهلي ومالي وولدي، من غائب وشاهد، بالله الذي لا إله إلا هو، عالم الغيب والشهادة، الرحمن الرحيم، الحي القيوم لا تأخذه سنة ولا نوم» ثم تقرأ آية الكرسي إلى ﴿الْعَلِيُّ الْعَظِيمُ﴾</w:t>
-      </w:r>
-    </w:p>
-    <w:p>
-      <w:pPr>
-        <w:bidi/>
-        <w:spacing w:after="120" w:before="320"/>
-        <w:jc w:val="right"/>
-      </w:pPr>
-      <w:r>
-        <w:rPr>
-          <w:rFonts w:ascii="Times New Roman" w:cs="Times New Roman" w:eastAsia="Times New Roman" w:hAnsi="Times New Roman"/>
-          <w:b/>
-          <w:bCs/>
-          <w:sz w:val="44"/>
-          <w:szCs w:val="44"/>
-          <w:rtl/>
-        </w:rPr>
-        <w:t xml:space="preserve">الدعاء السادس والعشرون</w:t>
       </w:r>
     </w:p>
     <w:p>

</xml_diff>

<commit_message>
Regenerate Word export with Umrah duas colored red
Co-Authored-By: Claude Sonnet 5 <noreply@anthropic.com>
Claude-Session: https://claude.ai/code/session_015v8MN6VZjbnhmn7ju2JYhZ
</commit_message>
<xml_diff>
--- a/خزانة الأدعية.docx
+++ b/خزانة الأدعية.docx
@@ -9405,59 +9405,146 @@
       <w:r>
         <w:rPr>
           <w:rFonts w:ascii="Times New Roman" w:cs="Times New Roman" w:eastAsia="Times New Roman" w:hAnsi="Times New Roman"/>
-          <w:sz w:val="24"/>
-          <w:szCs w:val="24"/>
-          <w:rtl/>
-        </w:rPr>
-        <w:t xml:space="preserve">إذا فرغ من الصلاة أحرم وقال: «لبيك عمرة» (ولمن يؤدي العمرة عن شخص متوفى، يقول: «اللهم لبيك عمرة عن فلان»، مع أن النية تكفي). يَحرُم بعد الإحرام: الطيب، والنساء، ولبس المخيط، والأخذ من شعر الجسم، والصيد.</w:t>
-      </w:r>
-    </w:p>
-    <w:p>
-      <w:pPr>
-        <w:bidi/>
-        <w:spacing w:after="200" w:line="340"/>
-        <w:jc w:val="right"/>
-      </w:pPr>
-      <w:r>
-        <w:rPr>
-          <w:rFonts w:ascii="Times New Roman" w:cs="Times New Roman" w:eastAsia="Times New Roman" w:hAnsi="Times New Roman"/>
-          <w:sz w:val="24"/>
-          <w:szCs w:val="24"/>
-          <w:rtl/>
-        </w:rPr>
-        <w:t xml:space="preserve">التلبية: «لبيك اللهم لبيك، لبيك لا شريك لك لبيك، إن الحمد والنعمة لك والملك، لا شريك لك» — يرفع الرجل صوته بها، والمرأة تقولها بقدر ما يُسمع من بجوارها فقط. يُستحب الإكثار من التلبية، خصوصًا عند تغيّر الأحوال (كصعود مرتفع أو نزول منخفض، أو إقبال الليل أو النهار)، ثم يسأل الله رضوانه والجنة ويستعيذ برحمته من النار. والتلبية مشروعة من الإحرام إلى بدء الطواف (في العمرة)، ومن الإحرام إلى رمي جمرة العقبة يوم العيد (في الحج).</w:t>
-      </w:r>
-    </w:p>
-    <w:p>
-      <w:pPr>
-        <w:bidi/>
-        <w:spacing w:after="200" w:line="340"/>
-        <w:jc w:val="right"/>
-      </w:pPr>
-      <w:r>
-        <w:rPr>
-          <w:rFonts w:ascii="Times New Roman" w:cs="Times New Roman" w:eastAsia="Times New Roman" w:hAnsi="Times New Roman"/>
-          <w:sz w:val="24"/>
-          <w:szCs w:val="24"/>
-          <w:rtl/>
-        </w:rPr>
-        <w:t xml:space="preserve">دخول المسجد الحرام: يُقدّم رجله اليمنى ويقول: «بسم الله، والصلاة والسلام على رسول الله، اللهم اغفر لي ذنوبي، وافتح لي أبواب رحمتك، أعوذ بالله العظيم، وبوجهه الكريم، وبسلطانه القديم، من الشيطان الرجيم»</w:t>
-      </w:r>
-    </w:p>
-    <w:p>
-      <w:pPr>
-        <w:bidi/>
-        <w:spacing w:after="200" w:line="340"/>
-        <w:jc w:val="right"/>
-      </w:pPr>
-      <w:r>
-        <w:rPr>
-          <w:rFonts w:ascii="Times New Roman" w:cs="Times New Roman" w:eastAsia="Times New Roman" w:hAnsi="Times New Roman"/>
-          <w:sz w:val="24"/>
-          <w:szCs w:val="24"/>
-          <w:rtl/>
-        </w:rPr>
-        <w:t xml:space="preserve">الطواف: يتقدم إلى الحجر الأسود ليبدأ الطواف، فيستلمه بيده اليمنى ويُقبّله (فإن تعذّر، يستقبله ويُشير إليه بيده اليمنى دون تقبيل يده)، ويقول عند استلامه: «بسم الله والله أكبر، اللهم إيمانًا بك، وتصديقًا بكتابك، ووفاء بعهدك، واتباعًا لسنة نبيك محمد صلى الله عليه وسلم». ثم يجعل البيت عن يساره، فإذا بلغ الركن اليماني استلمه من غير تقبيل (أو لا يزاحم ولا يُشير إليه)، ويقول بينه وبين الحجر الأسود: «رَبَّنَا آتِنَا فِي الدُّنْيَا حَسَنَةً وَفِي الْآخِرَةِ حَسَنَةً وَقِنَا عَذَابَ النَّارِ»، ويُكبّر كلما مرّ بالحجر الأسود. وفي بقية الطواف يقول ما أحب من ذكر ودعاء وقراءة قرآن.</w:t>
+          <w:b/>
+          <w:bCs/>
+          <w:color w:val="B23A2E"/>
+          <w:sz w:val="24"/>
+          <w:szCs w:val="24"/>
+          <w:rtl/>
+        </w:rPr>
+        <w:t xml:space="preserve">إذا فرغ من الصلاة أحرم وقال: «لبيك عمرة» (ولمن يؤدي العمرة عن شخص متوفى، يقول: «اللهم لبيك عمرة عن فلان»، مع أن النية تكفي).</w:t>
+      </w:r>
+      <w:r>
+        <w:rPr>
+          <w:rFonts w:ascii="Times New Roman" w:cs="Times New Roman" w:eastAsia="Times New Roman" w:hAnsi="Times New Roman"/>
+          <w:sz w:val="24"/>
+          <w:szCs w:val="24"/>
+          <w:rtl/>
+        </w:rPr>
+        <w:t xml:space="preserve"> يَحرُم بعد الإحرام: الطيب، والنساء، ولبس المخيط، والأخذ من شعر الجسم، والصيد.</w:t>
+      </w:r>
+    </w:p>
+    <w:p>
+      <w:pPr>
+        <w:bidi/>
+        <w:spacing w:after="200" w:line="340"/>
+        <w:jc w:val="right"/>
+      </w:pPr>
+      <w:r>
+        <w:rPr>
+          <w:rFonts w:ascii="Times New Roman" w:cs="Times New Roman" w:eastAsia="Times New Roman" w:hAnsi="Times New Roman"/>
+          <w:sz w:val="24"/>
+          <w:szCs w:val="24"/>
+          <w:rtl/>
+        </w:rPr>
+        <w:t xml:space="preserve">التلبية: </w:t>
+      </w:r>
+      <w:r>
+        <w:rPr>
+          <w:rFonts w:ascii="Times New Roman" w:cs="Times New Roman" w:eastAsia="Times New Roman" w:hAnsi="Times New Roman"/>
+          <w:b/>
+          <w:bCs/>
+          <w:color w:val="B23A2E"/>
+          <w:sz w:val="24"/>
+          <w:szCs w:val="24"/>
+          <w:rtl/>
+        </w:rPr>
+        <w:t xml:space="preserve">«لبيك اللهم لبيك، لبيك لا شريك لك لبيك، إن الحمد والنعمة لك والملك، لا شريك لك»</w:t>
+      </w:r>
+      <w:r>
+        <w:rPr>
+          <w:rFonts w:ascii="Times New Roman" w:cs="Times New Roman" w:eastAsia="Times New Roman" w:hAnsi="Times New Roman"/>
+          <w:sz w:val="24"/>
+          <w:szCs w:val="24"/>
+          <w:rtl/>
+        </w:rPr>
+        <w:t xml:space="preserve"> — يرفع الرجل صوته بها، والمرأة تقولها بقدر ما يُسمع من بجوارها فقط. يُستحب الإكثار من التلبية، خصوصًا عند تغيّر الأحوال (كصعود مرتفع أو نزول منخفض، أو إقبال الليل أو النهار)، ثم يسأل الله رضوانه والجنة ويستعيذ برحمته من النار. والتلبية مشروعة من الإحرام إلى بدء الطواف (في العمرة)، ومن الإحرام إلى رمي جمرة العقبة يوم العيد (في الحج).</w:t>
+      </w:r>
+    </w:p>
+    <w:p>
+      <w:pPr>
+        <w:bidi/>
+        <w:spacing w:after="200" w:line="340"/>
+        <w:jc w:val="right"/>
+      </w:pPr>
+      <w:r>
+        <w:rPr>
+          <w:rFonts w:ascii="Times New Roman" w:cs="Times New Roman" w:eastAsia="Times New Roman" w:hAnsi="Times New Roman"/>
+          <w:sz w:val="24"/>
+          <w:szCs w:val="24"/>
+          <w:rtl/>
+        </w:rPr>
+        <w:t xml:space="preserve">دخول المسجد الحرام: يُقدّم رجله اليمنى ويقول: </w:t>
+      </w:r>
+      <w:r>
+        <w:rPr>
+          <w:rFonts w:ascii="Times New Roman" w:cs="Times New Roman" w:eastAsia="Times New Roman" w:hAnsi="Times New Roman"/>
+          <w:b/>
+          <w:bCs/>
+          <w:color w:val="B23A2E"/>
+          <w:sz w:val="24"/>
+          <w:szCs w:val="24"/>
+          <w:rtl/>
+        </w:rPr>
+        <w:t xml:space="preserve">«بسم الله، والصلاة والسلام على رسول الله، اللهم اغفر لي ذنوبي، وافتح لي أبواب رحمتك، أعوذ بالله العظيم، وبوجهه الكريم، وبسلطانه القديم، من الشيطان الرجيم»</w:t>
+      </w:r>
+    </w:p>
+    <w:p>
+      <w:pPr>
+        <w:bidi/>
+        <w:spacing w:after="200" w:line="340"/>
+        <w:jc w:val="right"/>
+      </w:pPr>
+      <w:r>
+        <w:rPr>
+          <w:rFonts w:ascii="Times New Roman" w:cs="Times New Roman" w:eastAsia="Times New Roman" w:hAnsi="Times New Roman"/>
+          <w:sz w:val="24"/>
+          <w:szCs w:val="24"/>
+          <w:rtl/>
+        </w:rPr>
+        <w:t xml:space="preserve">الطواف: يتقدم إلى الحجر الأسود ليبدأ الطواف، فيستلمه بيده اليمنى ويُقبّله (فإن تعذّر، يستقبله ويُشير إليه بيده اليمنى دون تقبيل يده)، ويقول عند استلامه: </w:t>
+      </w:r>
+      <w:r>
+        <w:rPr>
+          <w:rFonts w:ascii="Times New Roman" w:cs="Times New Roman" w:eastAsia="Times New Roman" w:hAnsi="Times New Roman"/>
+          <w:b/>
+          <w:bCs/>
+          <w:color w:val="B23A2E"/>
+          <w:sz w:val="24"/>
+          <w:szCs w:val="24"/>
+          <w:rtl/>
+        </w:rPr>
+        <w:t xml:space="preserve">«بسم الله والله أكبر، اللهم إيمانًا بك، وتصديقًا بكتابك، ووفاء بعهدك، واتباعًا لسنة نبيك محمد صلى الله عليه وسلم»</w:t>
+      </w:r>
+      <w:r>
+        <w:rPr>
+          <w:rFonts w:ascii="Times New Roman" w:cs="Times New Roman" w:eastAsia="Times New Roman" w:hAnsi="Times New Roman"/>
+          <w:sz w:val="24"/>
+          <w:szCs w:val="24"/>
+          <w:rtl/>
+        </w:rPr>
+        <w:t xml:space="preserve">. ثم يجعل البيت عن يساره، فإذا بلغ الركن اليماني استلمه من غير تقبيل (أو لا يزاحم ولا يُشير إليه)، ويقول بينه وبين الحجر الأسود: </w:t>
+      </w:r>
+      <w:r>
+        <w:rPr>
+          <w:rFonts w:ascii="Times New Roman" w:cs="Times New Roman" w:eastAsia="Times New Roman" w:hAnsi="Times New Roman"/>
+          <w:b/>
+          <w:bCs/>
+          <w:color w:val="B23A2E"/>
+          <w:sz w:val="24"/>
+          <w:szCs w:val="24"/>
+          <w:rtl/>
+        </w:rPr>
+        <w:t xml:space="preserve">«رَبَّنَا آتِنَا فِي الدُّنْيَا حَسَنَةً وَفِي الْآخِرَةِ حَسَنَةً وَقِنَا عَذَابَ النَّارِ»</w:t>
+      </w:r>
+      <w:r>
+        <w:rPr>
+          <w:rFonts w:ascii="Times New Roman" w:cs="Times New Roman" w:eastAsia="Times New Roman" w:hAnsi="Times New Roman"/>
+          <w:sz w:val="24"/>
+          <w:szCs w:val="24"/>
+          <w:rtl/>
+        </w:rPr>
+        <w:t xml:space="preserve">، ويُكبّر كلما مرّ بالحجر الأسود. وفي بقية الطواف يقول ما أحب من ذكر ودعاء وقراءة قرآن.</w:t>
       </w:r>
     </w:p>
     <w:p>
@@ -9485,11 +9572,23 @@
       <w:r>
         <w:rPr>
           <w:rFonts w:ascii="Times New Roman" w:cs="Times New Roman" w:eastAsia="Times New Roman" w:hAnsi="Times New Roman"/>
-          <w:sz w:val="24"/>
-          <w:szCs w:val="24"/>
-          <w:rtl/>
-        </w:rPr>
-        <w:t xml:space="preserve">بعد سبعة أشواط، يتقدم إلى مقام إبراهيم ويقرأ ﴿وَاتَّخِذُوا مِن مَّقَامِ إِبْرَاهِيمَ مُصَلًّى﴾، ثم يصلي خلفه ركعتين خفيفتين، يقرأ في الأولى بعد الفاتحة ﴿قُلْ يَا أَيُّهَا الْكَافِرُونَ﴾ وفي الثانية ﴿قُلْ هُوَ اللَّهُ أَحَدٌ﴾. ثم يرجع فيستلم الحجر الأسود إن تيسر، وإلا أشار إليه.</w:t>
+          <w:b/>
+          <w:bCs/>
+          <w:color w:val="B23A2E"/>
+          <w:sz w:val="24"/>
+          <w:szCs w:val="24"/>
+          <w:rtl/>
+        </w:rPr>
+        <w:t xml:space="preserve">بعد سبعة أشواط، يتقدم إلى مقام إبراهيم ويقرأ ﴿وَاتَّخِذُوا مِن مَّقَامِ إِبْرَاهِيمَ مُصَلًّى﴾، ثم يصلي خلفه ركعتين خفيفتين، يقرأ في الأولى بعد الفاتحة ﴿قُلْ يَا أَيُّهَا الْكَافِرُونَ﴾ وفي الثانية ﴿قُلْ هُوَ اللَّهُ أَحَدٌ﴾.</w:t>
+      </w:r>
+      <w:r>
+        <w:rPr>
+          <w:rFonts w:ascii="Times New Roman" w:cs="Times New Roman" w:eastAsia="Times New Roman" w:hAnsi="Times New Roman"/>
+          <w:sz w:val="24"/>
+          <w:szCs w:val="24"/>
+          <w:rtl/>
+        </w:rPr>
+        <w:t xml:space="preserve"> ثم يرجع فيستلم الحجر الأسود إن تيسر، وإلا أشار إليه.</w:t>
       </w:r>
     </w:p>
     <w:p>
@@ -9521,7 +9620,49 @@
           <w:szCs w:val="24"/>
           <w:rtl/>
         </w:rPr>
-        <w:t xml:space="preserve">السعي بين الصفا والمروة: يخرج إلى المسعى، فإذا دنا من الصفا قرأ ﴿إِنَّ الصَّفَا وَالْمَرْوَةَ مِن شَعَائِرِ اللَّهِ﴾، ثم يرقى على الصفا حتى يرى الكعبة فيستقبلها، ويرفع يديه كرفعهما في الدعاء، فيحمد الله ويدعو، ومن دعاء النبي صلى الله عليه وسلم هنا: «لا إله إلا الله، وحده لا شريك له، له الملك، وله الحمد، يحيي ويميت وهو على كل شيء قدير، لا إله إلا الله وحده، أنجز وعده، ونصر عبده، وهزم الأحزاب وحده» (يُكرر 3 مرات، ويدعو بينها).</w:t>
+        <w:t xml:space="preserve">السعي بين الصفا والمروة: يخرج إلى المسعى، فإذا دنا من الصفا قرأ </w:t>
+      </w:r>
+      <w:r>
+        <w:rPr>
+          <w:rFonts w:ascii="Times New Roman" w:cs="Times New Roman" w:eastAsia="Times New Roman" w:hAnsi="Times New Roman"/>
+          <w:b/>
+          <w:bCs/>
+          <w:color w:val="B23A2E"/>
+          <w:sz w:val="24"/>
+          <w:szCs w:val="24"/>
+          <w:rtl/>
+        </w:rPr>
+        <w:t xml:space="preserve">﴿إِنَّ الصَّفَا وَالْمَرْوَةَ مِن شَعَائِرِ اللَّهِ﴾</w:t>
+      </w:r>
+      <w:r>
+        <w:rPr>
+          <w:rFonts w:ascii="Times New Roman" w:cs="Times New Roman" w:eastAsia="Times New Roman" w:hAnsi="Times New Roman"/>
+          <w:sz w:val="24"/>
+          <w:szCs w:val="24"/>
+          <w:rtl/>
+        </w:rPr>
+        <w:t xml:space="preserve">، ثم يرقى على الصفا حتى يرى الكعبة فيستقبلها، ويرفع يديه كرفعهما في الدعاء، فيحمد الله ويدعو، ومن دعاء النبي صلى الله عليه وسلم هنا: </w:t>
+      </w:r>
+      <w:r>
+        <w:rPr>
+          <w:rFonts w:ascii="Times New Roman" w:cs="Times New Roman" w:eastAsia="Times New Roman" w:hAnsi="Times New Roman"/>
+          <w:b/>
+          <w:bCs/>
+          <w:color w:val="B23A2E"/>
+          <w:sz w:val="24"/>
+          <w:szCs w:val="24"/>
+          <w:rtl/>
+        </w:rPr>
+        <w:t xml:space="preserve">«لا إله إلا الله، وحده لا شريك له، له الملك، وله الحمد، يحيي ويميت وهو على كل شيء قدير، لا إله إلا الله وحده، أنجز وعده، ونصر عبده، وهزم الأحزاب وحده»</w:t>
+      </w:r>
+      <w:r>
+        <w:rPr>
+          <w:rFonts w:ascii="Times New Roman" w:cs="Times New Roman" w:eastAsia="Times New Roman" w:hAnsi="Times New Roman"/>
+          <w:sz w:val="24"/>
+          <w:szCs w:val="24"/>
+          <w:rtl/>
+        </w:rPr>
+        <w:t xml:space="preserve"> (يُكرر 3 مرات، ويدعو بينها).</w:t>
       </w:r>
     </w:p>
     <w:p>

</xml_diff>

<commit_message>
Regenerate Word export with the alternate Adiyat Yasin scheme
Co-Authored-By: Claude Sonnet 5 <noreply@anthropic.com>
Claude-Session: https://claude.ai/code/session_015v8MN6VZjbnhmn7ju2JYhZ
</commit_message>
<xml_diff>
--- a/خزانة الأدعية.docx
+++ b/خزانة الأدعية.docx
@@ -2443,7 +2443,7 @@
           <w:szCs w:val="24"/>
           <w:rtl/>
         </w:rPr>
-        <w:t xml:space="preserve">دعاء سورة يس (نسخة أخرى، تُقال بعد قراءة السورة كاملة): «سبحان العالم لكل مكنون، والقاضي لكل الديون، سبحان من خزائنه بين الكاف والنون، سبحان من قوله كن فيكون. اللهم ربي إني أسألك وأتوجه إليك بحبيبك نبينا وسيدنا محمد صلى الله عليه وسلم أن تسخّر لي قلب من أحوجتني إليه، ومن بيده من البشر قضاء حاجتي، وأن تكفيني اللهم شر من يقدر علي ولا أقدر عليه، يا من بيده ملكوت كل شيء أنت العالم به والقادر عليه. اللهم بحق نبيك سيدنا محمد صلى الله عليه وسلم الذي أنزلت عليه سورة يس، أسألك يا ربي أن تجعلني في كل أمر وشدة غالبًا، وأن تمنّ علي ربي بسرعة العطاء وتحقيق الرجاء. اللهم صلِّ وسلم وبارك على سيدنا محمد بقدر حبك فيه، وبجاهه فرِّج علي ما أنا فيه، جئت أتوسل إليك بقدر النبي الكريم، وبسر بسم الله الرحمن الرحيم، وبسر يس والقرآن الحكيم، يا رب العالمين» (وتُذكر الحاجة)</w:t>
+        <w:t xml:space="preserve">ابدأ بهذه الكلمات حتى تُستجاب دعوتك: «اللهم صلِّ على محمد وعلى آل محمد كما صليت على إبراهيم وعلى آل إبراهيم، وبارك على محمد وعلى آل محمد كما باركت على آل إبراهيم في العالمين، إنك حميد مجيد. اللهم يا حنان يا منان يا بديع السماوات والأرض، يا ذا الجلال والإكرام، يا الله يا أحد يا واحد يا صمد، يا من لم يلد ولم يولد ولم يكن له كفوًا أحد، يا حي يا قيوم» ثم الدعاء</w:t>
       </w:r>
     </w:p>
     <w:p>
@@ -2477,7 +2477,7 @@
           <w:szCs w:val="24"/>
           <w:rtl/>
         </w:rPr>
-        <w:t xml:space="preserve">ابدأ بهذه الكلمات حتى تُستجاب دعوتك: «اللهم صلِّ على محمد وعلى آل محمد كما صليت على إبراهيم وعلى آل إبراهيم، وبارك على محمد وعلى آل محمد كما باركت على آل إبراهيم في العالمين، إنك حميد مجيد. اللهم يا حنان يا منان يا بديع السماوات والأرض، يا ذا الجلال والإكرام، يا الله يا أحد يا واحد يا صمد، يا من لم يلد ولم يولد ولم يكن له كفوًا أحد، يا حي يا قيوم» ثم الدعاء</w:t>
+        <w:t xml:space="preserve">لطلب المستحيل، دعاء فيه اسم الله الأعظم: «اللهم إني أسألك بأني أشهد أنك أنت الله لا إله إلا أنت، الأحد الصمد الذي لم يلد ولم يولد ولم يكن له كفوًا أحد» ثم ادعُ على يقين. وأيضًا: «اللهم إني أسألك بأن لك الحمد، لا إله إلا أنت، المنان بديع السماوات والأرض، يا ذا الجلال والإكرام، يا حي يا قيوم» ثم اطلب ما تريد</w:t>
       </w:r>
     </w:p>
     <w:p>
@@ -2511,7 +2511,7 @@
           <w:szCs w:val="24"/>
           <w:rtl/>
         </w:rPr>
-        <w:t xml:space="preserve">لطلب المستحيل، دعاء فيه اسم الله الأعظم: «اللهم إني أسألك بأني أشهد أنك أنت الله لا إله إلا أنت، الأحد الصمد الذي لم يلد ولم يولد ولم يكن له كفوًا أحد» ثم ادعُ على يقين. وأيضًا: «اللهم إني أسألك بأن لك الحمد، لا إله إلا أنت، المنان بديع السماوات والأرض، يا ذا الجلال والإكرام، يا حي يا قيوم» ثم اطلب ما تريد</w:t>
+        <w:t xml:space="preserve">عند الإحساس بالظلم في أي موقف، أو اليأس، أو انغلاق أبواب الرزق، لتفريج الكربات وتأمين القلوب وتفويض الأمر لله (100 مرة): «حسبنا الله سيؤتينا الله من فضله، إنا إلى الله راغبون» و«إن ولي الله الذي نزل الكتاب وهو يتولى الصالحين»</w:t>
       </w:r>
     </w:p>
     <w:p>
@@ -2545,7 +2545,7 @@
           <w:szCs w:val="24"/>
           <w:rtl/>
         </w:rPr>
-        <w:t xml:space="preserve">عند الإحساس بالظلم في أي موقف، أو اليأس، أو انغلاق أبواب الرزق، لتفريج الكربات وتأمين القلوب وتفويض الأمر لله (100 مرة): «حسبنا الله سيؤتينا الله من فضله، إنا إلى الله راغبون» و«إن ولي الله الذي نزل الكتاب وهو يتولى الصالحين»</w:t>
+        <w:t xml:space="preserve">دعاء يحقق لك المستحيل: كل ما استعصى عليكم الأمر، فرددوا: «يأتِ بها الله، إن الله لطيف خبير»</w:t>
       </w:r>
     </w:p>
     <w:p>
@@ -2579,7 +2579,7 @@
           <w:szCs w:val="24"/>
           <w:rtl/>
         </w:rPr>
-        <w:t xml:space="preserve">دعاء يحقق لك المستحيل: كل ما استعصى عليكم الأمر، فرددوا: «يأتِ بها الله، إن الله لطيف خبير»</w:t>
+        <w:t xml:space="preserve">«آيات فك الكرب وزيادة الرزق»: ﴿أَفَحَسِبْتُمْ أَنَّمَا خَلَقْنَاكُمْ عَبَثًا وَأَنَّكُمْ إِلَيْنَا لَا تُرْجَعُونَ * فَتَعَالَى اللَّهُ الْمَلِكُ الْحَقُّ لَا إِلَٰهَ إِلَّا هُوَ رَبُّ الْعَرْشِ الْكَرِيمِ * وَمَن يَدْعُ مَعَ اللَّهِ إِلَٰهًا آخَرَ لَا بُرْهَانَ لَهُ بِهِ فَإِنَّمَا حِسَابُهُ عِندَ رَبِّهِ إِنَّهُ لَا يُفْلِحُ الْكَافِرُونَ﴾ ثم ﴿وَقُل رَّبِّ اغْفِرْ وَارْحَمْ وَأَنتَ خَيْرُ الرَّاحِمِينَ﴾</w:t>
       </w:r>
     </w:p>
     <w:p>
@@ -2613,7 +2613,7 @@
           <w:szCs w:val="24"/>
           <w:rtl/>
         </w:rPr>
-        <w:t xml:space="preserve">«آيات فك الكرب وزيادة الرزق»: ﴿أَفَحَسِبْتُمْ أَنَّمَا خَلَقْنَاكُمْ عَبَثًا وَأَنَّكُمْ إِلَيْنَا لَا تُرْجَعُونَ * فَتَعَالَى اللَّهُ الْمَلِكُ الْحَقُّ لَا إِلَٰهَ إِلَّا هُوَ رَبُّ الْعَرْشِ الْكَرِيمِ * وَمَن يَدْعُ مَعَ اللَّهِ إِلَٰهًا آخَرَ لَا بُرْهَانَ لَهُ بِهِ فَإِنَّمَا حِسَابُهُ عِندَ رَبِّهِ إِنَّهُ لَا يُفْلِحُ الْكَافِرُونَ﴾ ثم ﴿وَقُل رَّبِّ اغْفِرْ وَارْحَمْ وَأَنتَ خَيْرُ الرَّاحِمِينَ﴾</w:t>
+        <w:t xml:space="preserve">إذا كثرت المشاكل، فعليك بآية 123 من سورة هود: ﴿وَلِلَّهِ غَيْبُ السَّمَاوَاتِ وَالْأَرْضِ وَإِلَيْهِ يُرْجَعُ الْأَمْرُ كُلُّهُ فَاعْبُدْهُ وَتَوَكَّلْ عَلَيْهِ وَمَا رَبُّكَ بِغَافِلٍ عَمَّا تَعْمَلُونَ﴾</w:t>
       </w:r>
     </w:p>
     <w:p>
@@ -2647,7 +2647,7 @@
           <w:szCs w:val="24"/>
           <w:rtl/>
         </w:rPr>
-        <w:t xml:space="preserve">إذا كثرت المشاكل، فعليك بآية 123 من سورة هود: ﴿وَلِلَّهِ غَيْبُ السَّمَاوَاتِ وَالْأَرْضِ وَإِلَيْهِ يُرْجَعُ الْأَمْرُ كُلُّهُ فَاعْبُدْهُ وَتَوَكَّلْ عَلَيْهِ وَمَا رَبُّكَ بِغَافِلٍ عَمَّا تَعْمَلُونَ﴾</w:t>
+        <w:t xml:space="preserve">فائدة مجرَّبة لقضاء الحوائج وتفريج الكرب: «يا من لا تغيب عني ولا تنساني، أرسل من يحل فرجي وأنا في مكاني» (7 مرات)، «يا عالي يا متعالي، يا دائم يا كبير يا قدوس، يا حي يا قاضي الحاجات، ارمِ مفتاحك وحل قفلي» (3 مرات)</w:t>
       </w:r>
     </w:p>
     <w:p>
@@ -2681,7 +2681,7 @@
           <w:szCs w:val="24"/>
           <w:rtl/>
         </w:rPr>
-        <w:t xml:space="preserve">فائدة مجرَّبة لقضاء الحوائج وتفريج الكرب: «يا من لا تغيب عني ولا تنساني، أرسل من يحل فرجي وأنا في مكاني» (7 مرات)، «يا عالي يا متعالي، يا دائم يا كبير يا قدوس، يا حي يا قاضي الحاجات، ارمِ مفتاحك وحل قفلي» (3 مرات)</w:t>
+        <w:t xml:space="preserve">دعاء الضيق: اللهم خفف عني ثقل هذه الأيام، وارزقني قوة الصبر، واشرح صدري وانزع منه ما استثقلته نفسي، اللهم أرح قلبي يا رب العالمين</w:t>
       </w:r>
     </w:p>
     <w:p>
@@ -2715,7 +2715,7 @@
           <w:szCs w:val="24"/>
           <w:rtl/>
         </w:rPr>
-        <w:t xml:space="preserve">دعاء الضيق: اللهم خفف عني ثقل هذه الأيام، وارزقني قوة الصبر، واشرح صدري وانزع منه ما استثقلته نفسي، اللهم أرح قلبي يا رب العالمين</w:t>
+        <w:t xml:space="preserve">لو كنت خائفًا من حاجة تحصل لك وقلقانًا منها، فعليك بهذا الدعاء: «اللهم لا يأتي بالحسنات إلا أنت، ولا يدفع السيئات إلا أنت، ولا حول ولا قوة إلا بك»</w:t>
       </w:r>
     </w:p>
     <w:p>
@@ -2749,7 +2749,7 @@
           <w:szCs w:val="24"/>
           <w:rtl/>
         </w:rPr>
-        <w:t xml:space="preserve">لو كنت خائفًا من حاجة تحصل لك وقلقانًا منها، فعليك بهذا الدعاء: «اللهم لا يأتي بالحسنات إلا أنت، ولا يدفع السيئات إلا أنت، ولا حول ولا قوة إلا بك»</w:t>
+        <w:t xml:space="preserve">«يا حي يا قيوم برحمتك أستغيث، أصلح لي شأني كله ولا تكلني لنفسي طرفة عين» — دعاء مأثور لإصلاح جميع الأمور</w:t>
       </w:r>
     </w:p>
     <w:p>
@@ -2783,7 +2783,7 @@
           <w:szCs w:val="24"/>
           <w:rtl/>
         </w:rPr>
-        <w:t xml:space="preserve">«يا حي يا قيوم برحمتك أستغيث، أصلح لي شأني كله ولا تكلني لنفسي طرفة عين» — دعاء مأثور لإصلاح جميع الأمور</w:t>
+        <w:t xml:space="preserve">إذا ضاقت الدنيا بك، فردد هذا الدعاء: «اللهم بحق قولك ليس لها من دون الله كاشفة، يا عالم كل خفية، ويا صارف كل بلية، اللهم بك أستغيث، أدعوك دعاء من اشتدت فاقته وضعفت قوته وقلّت حيلته، اللهم بك ملاذي وعياذي، باسمك الواحد الأحد الفرد الصمد أسألك أن تفرّج عني ما أمسيت فيه وأصبحت فيه، اللهم اقضِ حاجتي وأنت أعلم بها يا راحم الراحمين ويا أكرم الأكرمين، يا الله» (آمين)</w:t>
       </w:r>
     </w:p>
     <w:p>
@@ -2817,7 +2817,7 @@
           <w:szCs w:val="24"/>
           <w:rtl/>
         </w:rPr>
-        <w:t xml:space="preserve">إذا ضاقت الدنيا بك، فردد هذا الدعاء: «اللهم بحق قولك ليس لها من دون الله كاشفة، يا عالم كل خفية، ويا صارف كل بلية، اللهم بك أستغيث، أدعوك دعاء من اشتدت فاقته وضعفت قوته وقلّت حيلته، اللهم بك ملاذي وعياذي، باسمك الواحد الأحد الفرد الصمد أسألك أن تفرّج عني ما أمسيت فيه وأصبحت فيه، اللهم اقضِ حاجتي وأنت أعلم بها يا راحم الراحمين ويا أكرم الأكرمين، يا الله» (آمين)</w:t>
+        <w:t xml:space="preserve">«عُبيدك بفنائك، مسكينك بفنائك، فقيرك بفنائك، سائلك بفنائك» — قال طاووس: فحفظتهن فما دعوت بهن في كرب إلا فُرِّج عني</w:t>
       </w:r>
     </w:p>
     <w:p>
@@ -2851,7 +2851,7 @@
           <w:szCs w:val="24"/>
           <w:rtl/>
         </w:rPr>
-        <w:t xml:space="preserve">«عُبيدك بفنائك، مسكينك بفنائك، فقيرك بفنائك، سائلك بفنائك» — قال طاووس: فحفظتهن فما دعوت بهن في كرب إلا فُرِّج عني</w:t>
+        <w:t xml:space="preserve">دعاء طويل مأثور: «اللهم إني أسألك من كل أمر ضعفت عنه قوتي وحيلتي، ولم تنته إليه رغبتي، ولم يخطر ببالي ولم يبلغه أملي، ولم يجرِ على لساني من اليقين الذي أعطيته أحدًا من المخلوقين الأولين والمهاجرين والآخرين، إلا أخصصتني يا أرحم الراحمين. اللهم اقذف في قلبي رجاءك، واقطع رجائي عمّن سواك حتى لا أرجو أحدًا غيرك. اللهم وما ضعفت عنه قوتي وقصر عنه عملي ولم تنته إليه رغبتي، ولم تبلغه مسألتي، ولم يجرِ على لساني مما أعطيت أحدًا من الأولين والآخرين من اليقين، فخصّني به يا رب العالمين. اللهم صلِّ على سيدنا محمد صلاة تُنحل بها العُقد، وتنفك بها الكرب، وتُفتح لنا بها أبواب الفرج»</w:t>
       </w:r>
     </w:p>
     <w:p>
@@ -2885,7 +2885,7 @@
           <w:szCs w:val="24"/>
           <w:rtl/>
         </w:rPr>
-        <w:t xml:space="preserve">دعاء طويل مأثور: «اللهم إني أسألك من كل أمر ضعفت عنه قوتي وحيلتي، ولم تنته إليه رغبتي، ولم يخطر ببالي ولم يبلغه أملي، ولم يجرِ على لساني من اليقين الذي أعطيته أحدًا من المخلوقين الأولين والمهاجرين والآخرين، إلا أخصصتني يا أرحم الراحمين. اللهم اقذف في قلبي رجاءك، واقطع رجائي عمّن سواك حتى لا أرجو أحدًا غيرك. اللهم وما ضعفت عنه قوتي وقصر عنه عملي ولم تنته إليه رغبتي، ولم تبلغه مسألتي، ولم يجرِ على لساني مما أعطيت أحدًا من الأولين والآخرين من اليقين، فخصّني به يا رب العالمين. اللهم صلِّ على سيدنا محمد صلاة تُنحل بها العُقد، وتنفك بها الكرب، وتُفتح لنا بها أبواب الفرج»</w:t>
+        <w:t xml:space="preserve">دعاء المعجزات: «لا إله إلا الله عدد ما كان، لا إله إلا الله عدد ما يكون، لا إله إلا الله عدد الحركات والسكون»</w:t>
       </w:r>
     </w:p>
     <w:p>
@@ -2919,7 +2919,7 @@
           <w:szCs w:val="24"/>
           <w:rtl/>
         </w:rPr>
-        <w:t xml:space="preserve">دعاء المعجزات: «لا إله إلا الله عدد ما كان، لا إله إلا الله عدد ما يكون، لا إله إلا الله عدد الحركات والسكون»</w:t>
+        <w:t xml:space="preserve">دعاء المضطر لقضاء الحاجة الملحّة والمستعجلة: «بسم الله الرحمن الرحيم، اللهم صلِّ على محمد وآل محمد، اللهم رب السماوات السبع وما بينهم، ورب العرش العظيم، ورب جبرائيل وميكائيل وإسرافيل، ورب القرآن العظيم، ورب محمد خاتم النبيين صلى الله عليه وعلى آله وسلم الطيبين الطاهرين، اللهم أني أسألك بالذي تقوم به السماء وبه تقوم الأرض، وبه تُفرّق بين الجمع وبه تُجمع بين المتفرق، وبه تُرزق الأحياء، وبه أحصيت عدد الرمال ووزن الجبال وكيل البحور، أن تصلي على محمد وآل محمد وتقضي حاجتي» (اذكر اسم الحاجة)</w:t>
       </w:r>
     </w:p>
     <w:p>
@@ -2953,7 +2953,7 @@
           <w:szCs w:val="24"/>
           <w:rtl/>
         </w:rPr>
-        <w:t xml:space="preserve">دعاء المضطر لقضاء الحاجة الملحّة والمستعجلة: «بسم الله الرحمن الرحيم، اللهم صلِّ على محمد وآل محمد، اللهم رب السماوات السبع وما بينهم، ورب العرش العظيم، ورب جبرائيل وميكائيل وإسرافيل، ورب القرآن العظيم، ورب محمد خاتم النبيين صلى الله عليه وعلى آله وسلم الطيبين الطاهرين، اللهم أني أسألك بالذي تقوم به السماء وبه تقوم الأرض، وبه تُفرّق بين الجمع وبه تُجمع بين المتفرق، وبه تُرزق الأحياء، وبه أحصيت عدد الرمال ووزن الجبال وكيل البحور، أن تصلي على محمد وآل محمد وتقضي حاجتي» (اذكر اسم الحاجة)</w:t>
+        <w:t xml:space="preserve">اللهم فارج الهم وكاشف الغم، ومجيب دعوة المضطرين، رحمن الدنيا والآخرة ورحيمهما، أنت ترحمني فارحمني برحمة تُغنيني بها عن رحمة من سواك. وأيضًا: «يا رب اكشف عنا الكرب والوباء والبلاء، وارفع عنا كل شدة وعناء، آمين يا رب، ومدّنا بمدد من السماء يا رب العالمين. اللهم يا فارج الهم ويا كاشف الغم، فرّج همّنا ويسّر أمرنا، وارحم ضعفنا وقلة حيلتنا، وخذ بأيدينا إليك أخذ الكرام عليك، آمين يا رب، وحسبنا الله ونعم الوكيل»</w:t>
       </w:r>
     </w:p>
     <w:p>
@@ -2987,7 +2987,7 @@
           <w:szCs w:val="24"/>
           <w:rtl/>
         </w:rPr>
-        <w:t xml:space="preserve">اللهم فارج الهم وكاشف الغم، ومجيب دعوة المضطرين، رحمن الدنيا والآخرة ورحيمهما، أنت ترحمني فارحمني برحمة تُغنيني بها عن رحمة من سواك. وأيضًا: «يا رب اكشف عنا الكرب والوباء والبلاء، وارفع عنا كل شدة وعناء، آمين يا رب، ومدّنا بمدد من السماء يا رب العالمين. اللهم يا فارج الهم ويا كاشف الغم، فرّج همّنا ويسّر أمرنا، وارحم ضعفنا وقلة حيلتنا، وخذ بأيدينا إليك أخذ الكرام عليك، آمين يا رب، وحسبنا الله ونعم الوكيل»</w:t>
+        <w:t xml:space="preserve">عند ضياع أي شيء غالٍ عليك (ولد، زوج، زوجة، عمل...): تصلي ركعتين بنية قضاء الحاجة، استغفار 100 مرة «أستغفر الله العظيم الذي لا إله إلا هو الحي القيوم وأتوب إليه»، صلاة على النبي 100 مرة «اللهم صلِّ وسلم وبارك على سيدنا محمد صلاة تُقضى بها الحوائج وتُفرّج بها الكرب وتُعيد بها كل ما غاب عنا»، ثم يُقال: «يا ذا المعروف الذي لا ينقطع أبدًا ولا يُحصيه غيره، يا من لا يُعلم كيف هو إلا هو، ويا من لا يبلغ قدرته غيره، فرّج عني ما أنا فيه، يا كثير الخير يا دائم المعروف، اللهم اجعل لي من كل همّ همّني من أمري في ديني ودنياي وآخرتي فرجًا ومخرجًا، واغفر لي ذنوبي، وثبّت رجاءك في قلبي واقطعه عمّا سواك حتى لا يكون لي رجاء إلا إياك» ثم يُسمّى الشيء الضائع حتى يرده الله</w:t>
       </w:r>
     </w:p>
     <w:p>
@@ -3021,7 +3021,7 @@
           <w:szCs w:val="24"/>
           <w:rtl/>
         </w:rPr>
-        <w:t xml:space="preserve">عند ضياع أي شيء غالٍ عليك (ولد، زوج، زوجة، عمل...): تصلي ركعتين بنية قضاء الحاجة، استغفار 100 مرة «أستغفر الله العظيم الذي لا إله إلا هو الحي القيوم وأتوب إليه»، صلاة على النبي 100 مرة «اللهم صلِّ وسلم وبارك على سيدنا محمد صلاة تُقضى بها الحوائج وتُفرّج بها الكرب وتُعيد بها كل ما غاب عنا»، ثم يُقال: «يا ذا المعروف الذي لا ينقطع أبدًا ولا يُحصيه غيره، يا من لا يُعلم كيف هو إلا هو، ويا من لا يبلغ قدرته غيره، فرّج عني ما أنا فيه، يا كثير الخير يا دائم المعروف، اللهم اجعل لي من كل همّ همّني من أمري في ديني ودنياي وآخرتي فرجًا ومخرجًا، واغفر لي ذنوبي، وثبّت رجاءك في قلبي واقطعه عمّا سواك حتى لا يكون لي رجاء إلا إياك» ثم يُسمّى الشيء الضائع حتى يرده الله</w:t>
+        <w:t xml:space="preserve">صلاة ركعتين بنية قضاء الحاجة، وأنت جالس بمكانك، تقول 1000 مرة بعد التسليم: «آمنت بالله العلي العظيم، وتوكلت على الحي القيوم»</w:t>
       </w:r>
     </w:p>
     <w:p>
@@ -3055,7 +3055,7 @@
           <w:szCs w:val="24"/>
           <w:rtl/>
         </w:rPr>
-        <w:t xml:space="preserve">صلاة ركعتين بنية قضاء الحاجة، وأنت جالس بمكانك، تقول 1000 مرة بعد التسليم: «آمنت بالله العلي العظيم، وتوكلت على الحي القيوم»</w:t>
+        <w:t xml:space="preserve">دعاء وصلاة لتقبل الدعاء: تصلي ركعتين ثم تقول: «اللهم يا ولي النعم ويا دافع الشرور والنقم، وقفت بعتبة بابك أرجو رحمتك وأخشى عذابك، اللهم لا تعاملني في دعائي هذا بذنوبي ولا بما أنا أهله، وعاملني فيه بفضلك وكرمك وبما أنت أهله، لا باب إلا بابك، ولا رجاء إلا رجاؤك، ولا خير إلا خيرك، اللهم إن لي عندك دعاء فاقبل دعائي، ولي عندك رجاء فلا تردّ رجائي، اللهم استجب، اللهم استجب، اللهم استجب» وسلام على المرسلين والحمد لله رب العالمين</w:t>
       </w:r>
     </w:p>
     <w:p>
@@ -3089,7 +3089,7 @@
           <w:szCs w:val="24"/>
           <w:rtl/>
         </w:rPr>
-        <w:t xml:space="preserve">دعاء وصلاة لتقبل الدعاء: تصلي ركعتين ثم تقول: «اللهم يا ولي النعم ويا دافع الشرور والنقم، وقفت بعتبة بابك أرجو رحمتك وأخشى عذابك، اللهم لا تعاملني في دعائي هذا بذنوبي ولا بما أنا أهله، وعاملني فيه بفضلك وكرمك وبما أنت أهله، لا باب إلا بابك، ولا رجاء إلا رجاؤك، ولا خير إلا خيرك، اللهم إن لي عندك دعاء فاقبل دعائي، ولي عندك رجاء فلا تردّ رجائي، اللهم استجب، اللهم استجب، اللهم استجب» وسلام على المرسلين والحمد لله رب العالمين</w:t>
+        <w:t xml:space="preserve">«يا غني من للفقير سواك، يا عزيز من للذليل سواك، يا قدير من للعاجز سواك، يا قوي من للضعيف سواك» و«يا عزيز، يا جبار، يا متكبر، يا ودود، يا نصير» (125 مرة)، ثم الصلاة على خير الورى (125 مرة)</w:t>
       </w:r>
     </w:p>
     <w:p>
@@ -3123,7 +3123,7 @@
           <w:szCs w:val="24"/>
           <w:rtl/>
         </w:rPr>
-        <w:t xml:space="preserve">«يا غني من للفقير سواك، يا عزيز من للذليل سواك، يا قدير من للعاجز سواك، يا قوي من للضعيف سواك» و«يا عزيز، يا جبار، يا متكبر، يا ودود، يا نصير» (125 مرة)، ثم الصلاة على خير الورى (125 مرة)</w:t>
+        <w:t xml:space="preserve">للسيطرة على شخص محتاج منه حاجة: «أَلَا يَعْلَمُ مَنْ خَلَقَ وَهُوَ اللَّطِيفُ الْخَبِيرُ، اللهم اقضِ حاجتي من فلان ابن فلانة، إنك على كل شيء قدير» (100 مرة بعد صلاة الفجر والعصر والعشاء)</w:t>
       </w:r>
     </w:p>
     <w:p>
@@ -3157,7 +3157,7 @@
           <w:szCs w:val="24"/>
           <w:rtl/>
         </w:rPr>
-        <w:t xml:space="preserve">للسيطرة على شخص محتاج منه حاجة: «أَلَا يَعْلَمُ مَنْ خَلَقَ وَهُوَ اللَّطِيفُ الْخَبِيرُ، اللهم اقضِ حاجتي من فلان ابن فلانة، إنك على كل شيء قدير» (100 مرة بعد صلاة الفجر والعصر والعشاء)</w:t>
+        <w:t xml:space="preserve">فائدة لحل المشاكل: «اللهم صلِّ على سيدنا محمد... قد ضاقت حيلتي... أدركني يا رسول الله» (1111 مرة)</w:t>
       </w:r>
     </w:p>
     <w:p>
@@ -3191,7 +3191,7 @@
           <w:szCs w:val="24"/>
           <w:rtl/>
         </w:rPr>
-        <w:t xml:space="preserve">فائدة لحل المشاكل: «اللهم صلِّ على سيدنا محمد... قد ضاقت حيلتي... أدركني يا رسول الله» (1111 مرة)</w:t>
+        <w:t xml:space="preserve">لفك الكربات: «بسم الله الرحمن الرحيم، يا رحمن يا رحيم» (111 مرة)، «اللهم أنزل علينا مائدة من السماء» (111 مرة)</w:t>
       </w:r>
     </w:p>
     <w:p>
@@ -3225,7 +3225,7 @@
           <w:szCs w:val="24"/>
           <w:rtl/>
         </w:rPr>
-        <w:t xml:space="preserve">لفك الكربات: «بسم الله الرحمن الرحيم، يا رحمن يا رحيم» (111 مرة)، «اللهم أنزل علينا مائدة من السماء» (111 مرة)</w:t>
+        <w:t xml:space="preserve">بعد ركعتين صلاة الحاجة، مستقبل الكعبة، تُقال 120 مرة: «أَمَّن يُجِيبُ الْمُضْطَرَّ إِذَا دَعَاهُ وَيَكْشِفُ السُّوءَ» — كل يوم، وشوف بعد أسبوع اللي حيحصل</w:t>
       </w:r>
     </w:p>
     <w:p>
@@ -3259,7 +3259,7 @@
           <w:szCs w:val="24"/>
           <w:rtl/>
         </w:rPr>
-        <w:t xml:space="preserve">بعد ركعتين صلاة الحاجة، مستقبل الكعبة، تُقال 120 مرة: «أَمَّن يُجِيبُ الْمُضْطَرَّ إِذَا دَعَاهُ وَيَكْشِفُ السُّوءَ» — كل يوم، وشوف بعد أسبوع اللي حيحصل</w:t>
+        <w:t xml:space="preserve">«رَبِّ إِنِّي ظَلَمْتُ نَفْسِي وَأَسْلَمْتُ مَعَ سُلَيْمَانَ لِلَّهِ رَبِّ الْعَالَمِينَ» تُقرأ 44 مرة — سر من أسرار فك الكربات</w:t>
       </w:r>
     </w:p>
     <w:p>
@@ -3293,7 +3293,7 @@
           <w:szCs w:val="24"/>
           <w:rtl/>
         </w:rPr>
-        <w:t xml:space="preserve">«رَبِّ إِنِّي ظَلَمْتُ نَفْسِي وَأَسْلَمْتُ مَعَ سُلَيْمَانَ لِلَّهِ رَبِّ الْعَالَمِينَ» تُقرأ 44 مرة — سر من أسرار فك الكربات</w:t>
+        <w:t xml:space="preserve">7 أيام متصلة تُقرأ سورة مريم، والأفضل بعد صلاة المغرب، وفي اليوم السابع بعد قراءة السورة يُقال هذا الدعاء 100 مرة: «بسم الله الرحمن الرحيم، اللهم صلِّ وسلم وزد وبارك عليك سيدي يا رسول الله، اللهم أسألك بحق ما أنزلته في كهيعص أن تحقق لي ما أتمناه» في يقين، وانتظر فرجًا من الله لن يخطر لك على بال</w:t>
       </w:r>
     </w:p>
     <w:p>
@@ -3327,7 +3327,7 @@
           <w:szCs w:val="24"/>
           <w:rtl/>
         </w:rPr>
-        <w:t xml:space="preserve">7 أيام متصلة تُقرأ سورة مريم، والأفضل بعد صلاة المغرب، وفي اليوم السابع بعد قراءة السورة يُقال هذا الدعاء 100 مرة: «بسم الله الرحمن الرحيم، اللهم صلِّ وسلم وزد وبارك عليك سيدي يا رسول الله، اللهم أسألك بحق ما أنزلته في كهيعص أن تحقق لي ما أتمناه» في يقين، وانتظر فرجًا من الله لن يخطر لك على بال</w:t>
+        <w:t xml:space="preserve">سورة تحقيق المعجزات والأمنيات والرزق، خصوصًا في شهر رجب: تُقرأ سورة الإسراء حتى الآيات 80 و81 و82 (تُقرأ 3 مرات)، ثم تُكمل حتى الآية 109 (موضع السجدة) فتسجد وتقول: «سبحان ربي الأعلى، سبحان العلي العظيم، سبحان الله المعز» (3 مرات)، ثم تُكمل لنهاية السورة، ثم تقول: «توكلت على الحي الذي لا يموت، اللهم ارزقني واقضِ حاجتي» (3 مرات)</w:t>
       </w:r>
     </w:p>
     <w:p>
@@ -3361,7 +3361,7 @@
           <w:szCs w:val="24"/>
           <w:rtl/>
         </w:rPr>
-        <w:t xml:space="preserve">سورة تحقيق المعجزات والأمنيات والرزق، خصوصًا في شهر رجب: تُقرأ سورة الإسراء حتى الآيات 80 و81 و82 (تُقرأ 3 مرات)، ثم تُكمل حتى الآية 109 (موضع السجدة) فتسجد وتقول: «سبحان ربي الأعلى، سبحان العلي العظيم، سبحان الله المعز» (3 مرات)، ثم تُكمل لنهاية السورة، ثم تقول: «توكلت على الحي الذي لا يموت، اللهم ارزقني واقضِ حاجتي» (3 مرات)</w:t>
+        <w:t xml:space="preserve">«يا ودود يا ودود، يا ذا العرش المجيد، يا مبدئ يا معيد، يا فعّال لما يريد، أسألك بنور وجهك الذي ملأ أركان عرشك، وأسألك بقدرتك التي قدرت بها على جميع خلقك، وأسألك برحمتك التي وسعت كل شيء، لا إله إلا أنت، يا مغيث أغثني، يا مغيث أغثني، يا مغيث أغثني» ثم الدعاء، ثم استغفار 3 مرات: «أستغفر الله العظيم الذي لا إله إلا هو الحي القيوم وأتوب إليه»</w:t>
       </w:r>
     </w:p>
     <w:p>
@@ -3395,7 +3395,7 @@
           <w:szCs w:val="24"/>
           <w:rtl/>
         </w:rPr>
-        <w:t xml:space="preserve">«يا ودود يا ودود، يا ذا العرش المجيد، يا مبدئ يا معيد، يا فعّال لما يريد، أسألك بنور وجهك الذي ملأ أركان عرشك، وأسألك بقدرتك التي قدرت بها على جميع خلقك، وأسألك برحمتك التي وسعت كل شيء، لا إله إلا أنت، يا مغيث أغثني، يا مغيث أغثني، يا مغيث أغثني» ثم الدعاء، ثم استغفار 3 مرات: «أستغفر الله العظيم الذي لا إله إلا هو الحي القيوم وأتوب إليه»</w:t>
+        <w:t xml:space="preserve">«يا سامع كل صوت، ويُسابق كل فوت، ويا كاسي العظام لحمًا ومُنشرها بعد الموت، أسألك بأسمائك العظام وباسمك الأعظم الأكبر المخزون المكنون الذي لم يطّلع عليه أحد من المخلوقين. يا حليم ذا أناة لا يقدر على أناته أحد. يا ذا المعروف الذي لا ينقطع معروفه أبدًا ولا نُحصي له عددًا، أفرج عني. يا من له وجه لا يبلى، ونور لا يُطفأ، واسم لا يُنسى، وباب لا يُغلق، وستر لا يُهتك، ومُلك لا يفنى، أسألك وأتوسل إليك بجاه سيدنا محمد صلى الله عليه وسلم أن تقضي حاجتي وتُعطيني مسألتي. اللهم إني أعوذ باسمك الواحد الأعز، وأدعوك اللهم باسمك الصمد، وأدعوك اللهم باسمك العظيم الوتر، وأدعوك باسمك الكبير المتعال الذي ثبت به أركانك كلها، أن تكشف عني ضر ما أصبحت وأمسيت فيه»</w:t>
       </w:r>
     </w:p>
     <w:p>
@@ -3429,7 +3429,7 @@
           <w:szCs w:val="24"/>
           <w:rtl/>
         </w:rPr>
-        <w:t xml:space="preserve">«يا سامع كل صوت، ويُسابق كل فوت، ويا كاسي العظام لحمًا ومُنشرها بعد الموت، أسألك بأسمائك العظام وباسمك الأعظم الأكبر المخزون المكنون الذي لم يطّلع عليه أحد من المخلوقين. يا حليم ذا أناة لا يقدر على أناته أحد. يا ذا المعروف الذي لا ينقطع معروفه أبدًا ولا نُحصي له عددًا، أفرج عني. يا من له وجه لا يبلى، ونور لا يُطفأ، واسم لا يُنسى، وباب لا يُغلق، وستر لا يُهتك، ومُلك لا يفنى، أسألك وأتوسل إليك بجاه سيدنا محمد صلى الله عليه وسلم أن تقضي حاجتي وتُعطيني مسألتي. اللهم إني أعوذ باسمك الواحد الأعز، وأدعوك اللهم باسمك الصمد، وأدعوك اللهم باسمك العظيم الوتر، وأدعوك باسمك الكبير المتعال الذي ثبت به أركانك كلها، أن تكشف عني ضر ما أصبحت وأمسيت فيه»</w:t>
+        <w:t xml:space="preserve">دعاء طويل (منظوم) لتفريج الكرب: «رب، عبدك قد ضاقت به الأسباب، وأُغلقت دونه الأبواب، وبَعُد عن جادة الصواب، وزاد به الهمّ والغمّ والاكتئاب، وانقضى عمره ولم يُفتح له إلى فسيح مناهل الصفو والقربات باب، وأنت المرجوّ سبحانك لكشف هذا المصاب، يا من إذا دُعي أجاب، يا سريع الحساب، يا رب الأرباب، يا عظيم الجناب، يا كريم يا وهاب، رب لا تحجب دعوتي ولا ترد مسألتي ولا تدعني بحسرتي ولا تكلني إلى حولي وقوتي، وارحم عجزي فقد ضاق صدري وتاه فكري وتحيرت في أمري، وأنت العالم سبحانك بسري وجهري، المالك لنفعي وضري، القادر على تفريج كربي وتيسير عسري. اللهم أحيِنا في الدنيا مؤمنين طائعين، وتوفنا مسلمين تائبين. اللهم ارحم تضرعنا بين يديك، وقوّمنا إذا اعوججنا، وأدِمْنا إذا استقمنا، وكن لنا ولا تكن علينا. اللهم نسألك يا غفور يا رحمن يا رحيم أن تفتح لأدعيتنا أبواب الإجابة، يا من إذا سأله المضطر أجاب، يا من يقول للشيء كن فيكون، اللهم لا تردنا خائبين، وآتنا أفضل ما يُؤتى عبادك الصالحين، اللهم ولا تصرفنا عن بحر جودك خاسرين ولا ضالين ولا مضلين، واغفر لنا إلى يوم الدين، برحمتك يا أرحم الراحمين، اللهم آمين»</w:t>
       </w:r>
     </w:p>
     <w:p>
@@ -3463,7 +3463,7 @@
           <w:szCs w:val="24"/>
           <w:rtl/>
         </w:rPr>
-        <w:t xml:space="preserve">دعاء طويل (منظوم) لتفريج الكرب: «رب، عبدك قد ضاقت به الأسباب، وأُغلقت دونه الأبواب، وبَعُد عن جادة الصواب، وزاد به الهمّ والغمّ والاكتئاب، وانقضى عمره ولم يُفتح له إلى فسيح مناهل الصفو والقربات باب، وأنت المرجوّ سبحانك لكشف هذا المصاب، يا من إذا دُعي أجاب، يا سريع الحساب، يا رب الأرباب، يا عظيم الجناب، يا كريم يا وهاب، رب لا تحجب دعوتي ولا ترد مسألتي ولا تدعني بحسرتي ولا تكلني إلى حولي وقوتي، وارحم عجزي فقد ضاق صدري وتاه فكري وتحيرت في أمري، وأنت العالم سبحانك بسري وجهري، المالك لنفعي وضري، القادر على تفريج كربي وتيسير عسري. اللهم أحيِنا في الدنيا مؤمنين طائعين، وتوفنا مسلمين تائبين. اللهم ارحم تضرعنا بين يديك، وقوّمنا إذا اعوججنا، وأدِمْنا إذا استقمنا، وكن لنا ولا تكن علينا. اللهم نسألك يا غفور يا رحمن يا رحيم أن تفتح لأدعيتنا أبواب الإجابة، يا من إذا سأله المضطر أجاب، يا من يقول للشيء كن فيكون، اللهم لا تردنا خائبين، وآتنا أفضل ما يُؤتى عبادك الصالحين، اللهم ولا تصرفنا عن بحر جودك خاسرين ولا ضالين ولا مضلين، واغفر لنا إلى يوم الدين، برحمتك يا أرحم الراحمين، اللهم آمين»</w:t>
+        <w:t xml:space="preserve">عند الدخول على أي شخص لقضاء حاجتك (7 مرات): ﴿فَإِن تَوَلَّوْا فَقُلْ حَسْبِيَ اللَّهُ لَا إِلَٰهَ إِلَّا هُوَ عَلَيْهِ تَوَكَّلْتُ وَهُوَ رَبُّ الْعَرْشِ الْعَظِيمِ﴾</w:t>
       </w:r>
     </w:p>
     <w:p>
@@ -3497,7 +3497,7 @@
           <w:szCs w:val="24"/>
           <w:rtl/>
         </w:rPr>
-        <w:t xml:space="preserve">عند الدخول على أي شخص لقضاء حاجتك (7 مرات): ﴿فَإِن تَوَلَّوْا فَقُلْ حَسْبِيَ اللَّهُ لَا إِلَٰهَ إِلَّا هُوَ عَلَيْهِ تَوَكَّلْتُ وَهُوَ رَبُّ الْعَرْشِ الْعَظِيمِ﴾</w:t>
+        <w:t xml:space="preserve">كل ما تعسّرت أحوالك، قل هذا الدعاء (3 أو 7 مرات): «بسم الله الرحمن الرحيم، يا ملك الرقاب، ويا هازم الأحزاب، يا مفتّح الأبواب، ويا مسبّب الأسباب، سبّب لنا سببًا لا نستطيع له طلبًا، بحق لا إله إلا الله ومحمد رسول الله صلى الله عليه وآله أجمعين»</w:t>
       </w:r>
     </w:p>
     <w:p>
@@ -3531,7 +3531,7 @@
           <w:szCs w:val="24"/>
           <w:rtl/>
         </w:rPr>
-        <w:t xml:space="preserve">كل ما تعسّرت أحوالك، قل هذا الدعاء (3 أو 7 مرات): «بسم الله الرحمن الرحيم، يا ملك الرقاب، ويا هازم الأحزاب، يا مفتّح الأبواب، ويا مسبّب الأسباب، سبّب لنا سببًا لا نستطيع له طلبًا، بحق لا إله إلا الله ومحمد رسول الله صلى الله عليه وآله أجمعين»</w:t>
+        <w:t xml:space="preserve">«يا قادر أنت القادر يا الله» تُقرأ 12 أو 33 مرة بعد كل صلاة، ثم تدعو بما تشاء</w:t>
       </w:r>
     </w:p>
     <w:p>
@@ -3565,7 +3565,7 @@
           <w:szCs w:val="24"/>
           <w:rtl/>
         </w:rPr>
-        <w:t xml:space="preserve">«يا قادر أنت القادر يا الله» تُقرأ 12 أو 33 مرة بعد كل صلاة، ثم تدعو بما تشاء</w:t>
+        <w:t xml:space="preserve">صلاة الحاجة الكاملة (حديث): تصلي ركعتين، وبعد التسليم تقول: «لا إله إلا أنت الحليم الكريم، لا إله إلا أنت رب العرش العظيم، الحمد لله رب العالمين، اللهم إني أسألك موجبات رحمتك، وعزائم مغفرتك، والغنيمة من كل بر، والسلامة من كل إثم، والفوز بالجنة، والنجاة من النار، لا تدع لي ذنبًا إلا غفرته، ولا همًا إلا فرّجته، ولا حاجة من حوائج الدنيا والآخرة إلا قضيتها ويسّرتها برحمتك يا أرحم الراحمين» ثم تطلب ما تريد</w:t>
       </w:r>
     </w:p>
     <w:p>
@@ -3599,7 +3599,7 @@
           <w:szCs w:val="24"/>
           <w:rtl/>
         </w:rPr>
-        <w:t xml:space="preserve">صلاة الحاجة الكاملة (حديث): تصلي ركعتين، وبعد التسليم تقول: «لا إله إلا أنت الحليم الكريم، لا إله إلا أنت رب العرش العظيم، الحمد لله رب العالمين، اللهم إني أسألك موجبات رحمتك، وعزائم مغفرتك، والغنيمة من كل بر، والسلامة من كل إثم، والفوز بالجنة، والنجاة من النار، لا تدع لي ذنبًا إلا غفرته، ولا همًا إلا فرّجته، ولا حاجة من حوائج الدنيا والآخرة إلا قضيتها ويسّرتها برحمتك يا أرحم الراحمين» ثم تطلب ما تريد</w:t>
+        <w:t xml:space="preserve">﴿عَسَىٰ رَبُّنَا أَن يُبْدِلَنَا خَيْرًا مِّنْهَا إِنَّا إِلَىٰ رَبِّنَا رَاغِبُونَ﴾ — لو ضاع منك شغلانة أو منصب أو فلوس أو أي شيء كنت تحبه، كرر هذه الآية</w:t>
       </w:r>
     </w:p>
     <w:p>
@@ -3633,7 +3633,7 @@
           <w:szCs w:val="24"/>
           <w:rtl/>
         </w:rPr>
-        <w:t xml:space="preserve">﴿عَسَىٰ رَبُّنَا أَن يُبْدِلَنَا خَيْرًا مِّنْهَا إِنَّا إِلَىٰ رَبِّنَا رَاغِبُونَ﴾ — لو ضاع منك شغلانة أو منصب أو فلوس أو أي شيء كنت تحبه، كرر هذه الآية</w:t>
+        <w:t xml:space="preserve">الدعاء لفك كل الكربات: يوم الجمعة قبل المغرب بساعة، على وضوء ومتجهًا للقبلة في مكان تختلي فيه بنفسك: استغفار «أستغفر الله العظيم الذي لا إله إلا هو الحي القيوم وأتوب إليه» (100 مرة)، «اللهم صلِّ وسلم وبارك على سيدنا محمد صلاة تُفرّج بها الهم وتُزيح بها الغم وتُسدّد بها الدين وتُحقق بها الآمال» (100 مرة)، ثم تُردد حتى أذان المغرب: ﴿إِذْ أَوَى الْفِتْيَةُ إِلَى الْكَهْفِ فَقَالُوا رَبَّنَا آتِنَا مِن لَّدُنكَ رَحْمَةً وَهَيِّئْ لَنَا مِنْ أَمْرِنَا رَشَدًا﴾، ثم تردد الأذان مع المؤذن، ثم تصلي المغرب وتدعو في السجود الأخير بما تريد</w:t>
       </w:r>
     </w:p>
     <w:p>
@@ -3667,7 +3667,7 @@
           <w:szCs w:val="24"/>
           <w:rtl/>
         </w:rPr>
-        <w:t xml:space="preserve">الدعاء لفك كل الكربات: يوم الجمعة قبل المغرب بساعة، على وضوء ومتجهًا للقبلة في مكان تختلي فيه بنفسك: استغفار «أستغفر الله العظيم الذي لا إله إلا هو الحي القيوم وأتوب إليه» (100 مرة)، «اللهم صلِّ وسلم وبارك على سيدنا محمد صلاة تُفرّج بها الهم وتُزيح بها الغم وتُسدّد بها الدين وتُحقق بها الآمال» (100 مرة)، ثم تُردد حتى أذان المغرب: ﴿إِذْ أَوَى الْفِتْيَةُ إِلَى الْكَهْفِ فَقَالُوا رَبَّنَا آتِنَا مِن لَّدُنكَ رَحْمَةً وَهَيِّئْ لَنَا مِنْ أَمْرِنَا رَشَدًا﴾، ثم تردد الأذان مع المؤذن، ثم تصلي المغرب وتدعو في السجود الأخير بما تريد</w:t>
+        <w:t xml:space="preserve">طلب الصعاب للحصول على عمل: بعد صلاة العشاء: الصلاة على الرسول (100 مرة)، «بسم الله الرحمن الرحيم» (19 مرة)، «يا رحيم أنت الرحيم يا الله» (95 مرة)، «اللهم فارج الهم وكاشف الغم ومجيب دعوة المضطرين، رحمن الدنيا والآخرة ورحيمهما، ارحمني برحمة من عندك تُغنيني بها عمّن سواك» (7 مرات)</w:t>
       </w:r>
     </w:p>
     <w:p>
@@ -3701,7 +3701,7 @@
           <w:szCs w:val="24"/>
           <w:rtl/>
         </w:rPr>
-        <w:t xml:space="preserve">طلب الصعاب للحصول على عمل: بعد صلاة العشاء: الصلاة على الرسول (100 مرة)، «بسم الله الرحمن الرحيم» (19 مرة)، «يا رحيم أنت الرحيم يا الله» (95 مرة)، «اللهم فارج الهم وكاشف الغم ومجيب دعوة المضطرين، رحمن الدنيا والآخرة ورحيمهما، ارحمني برحمة من عندك تُغنيني بها عمّن سواك» (7 مرات)</w:t>
+        <w:t xml:space="preserve">دعاء فك الكرب وقضاء الحاجة: «الحمد لله رب العالمين، وأفضل الصلاة وأتم التسليم على سيدنا محمد وعلى آله وصحبه وسلم. أستغفر الله العظيم الذي لا إله إلا هو الحي القيوم وأتوب إليه. اللهم يا جامع الشتات، ويا مُخرج النبات، ويا مُحيي العظام الرفات، ويا مجيب الدعوات، ويا قاضي الحاجات، ويا مُفرّج الكربات، ويا سامع الأصوات من فوق سبع سماوات، ويا فاتح خزائن الكرامات، ويا مالك حوائج جميع المخلوقات، ويا من ملأ نوره السماوات، ويا من أحاط بكل شيء علمًا وأحصى كل شيء عددًا، ويا عالمًا بما مضى وما هو آتٍ، أسألك اللهم بقدرتك على كل شيء، وباستغنائك عن جميع خلقك، وبحمدك ومجدك يا إله كل شيء، وأسألك اللهم أن تجود علي بقضاء حاجتي، إنك قادر على كل شيء يا رب العالمين، يا عظيم يُرجى لكل عظيم، يا عليمًا أنت بحالنا عليم، اللهم أصلح لنا شأننا بما أصلحت به شأن عبادك الصالحين، ولا تكلنا لأنفسنا طرفة عين ولا أقل من ذلك. اللهم اقضِ حاجتي، ونفّس كربتي، وما نزل بي من حيرتي» (ثم تُسمى الحاجة) «وصلى الله وسلم على سيدنا محمد وعلى آله وصحبه وسلم تسليمًا كثيرًا»</w:t>
       </w:r>
     </w:p>
     <w:p>
@@ -3735,7 +3735,7 @@
           <w:szCs w:val="24"/>
           <w:rtl/>
         </w:rPr>
-        <w:t xml:space="preserve">دعاء فك الكرب وقضاء الحاجة: «الحمد لله رب العالمين، وأفضل الصلاة وأتم التسليم على سيدنا محمد وعلى آله وصحبه وسلم. أستغفر الله العظيم الذي لا إله إلا هو الحي القيوم وأتوب إليه. اللهم يا جامع الشتات، ويا مُخرج النبات، ويا مُحيي العظام الرفات، ويا مجيب الدعوات، ويا قاضي الحاجات، ويا مُفرّج الكربات، ويا سامع الأصوات من فوق سبع سماوات، ويا فاتح خزائن الكرامات، ويا مالك حوائج جميع المخلوقات، ويا من ملأ نوره السماوات، ويا من أحاط بكل شيء علمًا وأحصى كل شيء عددًا، ويا عالمًا بما مضى وما هو آتٍ، أسألك اللهم بقدرتك على كل شيء، وباستغنائك عن جميع خلقك، وبحمدك ومجدك يا إله كل شيء، وأسألك اللهم أن تجود علي بقضاء حاجتي، إنك قادر على كل شيء يا رب العالمين، يا عظيم يُرجى لكل عظيم، يا عليمًا أنت بحالنا عليم، اللهم أصلح لنا شأننا بما أصلحت به شأن عبادك الصالحين، ولا تكلنا لأنفسنا طرفة عين ولا أقل من ذلك. اللهم اقضِ حاجتي، ونفّس كربتي، وما نزل بي من حيرتي» (ثم تُسمى الحاجة) «وصلى الله وسلم على سيدنا محمد وعلى آله وصحبه وسلم تسليمًا كثيرًا»</w:t>
+        <w:t xml:space="preserve">﴿رَبِّ اشْرَحْ لِي صَدْرِي وَيَسِّرْ لِي أَمْرِي وَاحْلُلْ عُقْدَةً مِّن لِّسَانِي يَفْقَهُوا قَوْلِي﴾</w:t>
       </w:r>
     </w:p>
     <w:p>
@@ -3769,7 +3769,7 @@
           <w:szCs w:val="24"/>
           <w:rtl/>
         </w:rPr>
-        <w:t xml:space="preserve">﴿رَبِّ اشْرَحْ لِي صَدْرِي وَيَسِّرْ لِي أَمْرِي وَاحْلُلْ عُقْدَةً مِّن لِّسَانِي يَفْقَهُوا قَوْلِي﴾</w:t>
+        <w:t xml:space="preserve">لرد الشيء الضائع (وسيلة أخرى): «اللهم رب الضالة، هادي الضالة، تهدي من الضلالة، رد علي ضالتي بقدرتك وسلطانك من عطائك وفضلك، اللهم بإجماع الناس ليوم القيامة اجمعني مع ضالتي»</w:t>
       </w:r>
     </w:p>
     <w:p>
@@ -3803,7 +3803,7 @@
           <w:szCs w:val="24"/>
           <w:rtl/>
         </w:rPr>
-        <w:t xml:space="preserve">لرد الشيء الضائع (وسيلة أخرى): «اللهم رب الضالة، هادي الضالة، تهدي من الضلالة، رد علي ضالتي بقدرتك وسلطانك من عطائك وفضلك، اللهم بإجماع الناس ليوم القيامة اجمعني مع ضالتي»</w:t>
+        <w:t xml:space="preserve">حرز الإمام الحسن العسكري: «بسم الله الرحمن الرحيم، يا عدتي عند شدتي، ويا غوثي عند كربتي، ويا مؤنسي عند وحدتي، احرسني بعينك التي لا تنام، واكنفني بركنك الذي لا يُرام»</w:t>
       </w:r>
     </w:p>
     <w:p>
@@ -3837,7 +3837,7 @@
           <w:szCs w:val="24"/>
           <w:rtl/>
         </w:rPr>
-        <w:t xml:space="preserve">حرز الإمام الحسن العسكري: «بسم الله الرحمن الرحيم، يا عدتي عند شدتي، ويا غوثي عند كربتي، ويا مؤنسي عند وحدتي، احرسني بعينك التي لا تنام، واكنفني بركنك الذي لا يُرام»</w:t>
+        <w:t xml:space="preserve">دعاء سيدنا يوسف عليه السلام (علّمه إياه جبريل وهو في الجُبّ): «اللهم إني أسألك بأن لك الحمد لا إله إلا أنت المنّان، بديع السماوات والأرض، ذو الجلال والإكرام، أن تصلي على محمد وآل محمد، وأن تجعل لي مما أنا فيه فرجًا ومخرجًا»</w:t>
       </w:r>
     </w:p>
     <w:p>
@@ -3871,7 +3871,7 @@
           <w:szCs w:val="24"/>
           <w:rtl/>
         </w:rPr>
-        <w:t xml:space="preserve">دعاء سيدنا يوسف عليه السلام (علّمه إياه جبريل وهو في الجُبّ): «اللهم إني أسألك بأن لك الحمد لا إله إلا أنت المنّان، بديع السماوات والأرض، ذو الجلال والإكرام، أن تصلي على محمد وآل محمد، وأن تجعل لي مما أنا فيه فرجًا ومخرجًا»</w:t>
+        <w:t xml:space="preserve">دعاء الشدة (كان الإمام زين العابدين يوصي به ابنه): من أصابته مصيبة أو نزلت به نازلة، يتوضأ ويُسبغ الوضوء، ثم يصلي ركعتين أو أربعًا، ثم يقول في آخرهن: «يا موضع كل شكوى، ويا سامع كل نجوى، ويا شاهد كل ملأ، ويا عالم كل خفية، ويا دافع ما يشاء من بلية، يا خليل إبراهيم، ويا نجي موسى، ويا مصطفى محمد صلى الله عليه وسلم، أدعوك دعاء من اشتدت فاقته، وقلّت حيلته، وضعفت قوته، دعاء الغريب الغريق المضطر، الذي لا يجد لكشف ما هو فيه إلا أنت يا أرحم الراحمين»</w:t>
       </w:r>
     </w:p>
     <w:p>
@@ -3905,7 +3905,7 @@
           <w:szCs w:val="24"/>
           <w:rtl/>
         </w:rPr>
-        <w:t xml:space="preserve">دعاء الشدة (كان الإمام زين العابدين يوصي به ابنه): من أصابته مصيبة أو نزلت به نازلة، يتوضأ ويُسبغ الوضوء، ثم يصلي ركعتين أو أربعًا، ثم يقول في آخرهن: «يا موضع كل شكوى، ويا سامع كل نجوى، ويا شاهد كل ملأ، ويا عالم كل خفية، ويا دافع ما يشاء من بلية، يا خليل إبراهيم، ويا نجي موسى، ويا مصطفى محمد صلى الله عليه وسلم، أدعوك دعاء من اشتدت فاقته، وقلّت حيلته، وضعفت قوته، دعاء الغريب الغريق المضطر، الذي لا يجد لكشف ما هو فيه إلا أنت يا أرحم الراحمين»</w:t>
+        <w:t xml:space="preserve">دعاء يوم بدر والأحزاب (ودعا به الإمام الحسين يوم عاشوراء بكربلاء): «أنت ثقتي في كل كربة، وأنت رجائي في كل شدة، وأنت لي في كل أمر نزل بي ثقة وعُدّة، كم من كرب يضعف عنه الفؤاد وتقل فيه الحيلة، ويخذل عنه القريب والبعيد، ويشمت به العدو، وتُعييني فيه الأمور، أنزلته بك وشكوته إليك، راغبًا فيه عمّن سواك، ففرّجته وكشفته وكفيتنيه، فأنت ولي كل نعمة، وصاحب كل حاجة، ومنتهى كل رغبة، فلك الحمد كثيرًا، ولك المنّ فاضلًا»</w:t>
       </w:r>
     </w:p>
     <w:p>
@@ -3924,40 +3924,6 @@
           <w:rtl/>
         </w:rPr>
         <w:t xml:space="preserve">الدعاء الثاني والستون</w:t>
-      </w:r>
-    </w:p>
-    <w:p>
-      <w:pPr>
-        <w:bidi/>
-        <w:spacing w:after="200" w:line="340"/>
-        <w:jc w:val="right"/>
-      </w:pPr>
-      <w:r>
-        <w:rPr>
-          <w:rFonts w:ascii="Times New Roman" w:cs="Times New Roman" w:eastAsia="Times New Roman" w:hAnsi="Times New Roman"/>
-          <w:sz w:val="24"/>
-          <w:szCs w:val="24"/>
-          <w:rtl/>
-        </w:rPr>
-        <w:t xml:space="preserve">دعاء يوم بدر والأحزاب (ودعا به الإمام الحسين يوم عاشوراء بكربلاء): «أنت ثقتي في كل كربة، وأنت رجائي في كل شدة، وأنت لي في كل أمر نزل بي ثقة وعُدّة، كم من كرب يضعف عنه الفؤاد وتقل فيه الحيلة، ويخذل عنه القريب والبعيد، ويشمت به العدو، وتُعييني فيه الأمور، أنزلته بك وشكوته إليك، راغبًا فيه عمّن سواك، ففرّجته وكشفته وكفيتنيه، فأنت ولي كل نعمة، وصاحب كل حاجة، ومنتهى كل رغبة، فلك الحمد كثيرًا، ولك المنّ فاضلًا»</w:t>
-      </w:r>
-    </w:p>
-    <w:p>
-      <w:pPr>
-        <w:bidi/>
-        <w:spacing w:after="120" w:before="320"/>
-        <w:jc w:val="right"/>
-      </w:pPr>
-      <w:r>
-        <w:rPr>
-          <w:rFonts w:ascii="Times New Roman" w:cs="Times New Roman" w:eastAsia="Times New Roman" w:hAnsi="Times New Roman"/>
-          <w:b/>
-          <w:bCs/>
-          <w:sz w:val="44"/>
-          <w:szCs w:val="44"/>
-          <w:rtl/>
-        </w:rPr>
-        <w:t xml:space="preserve">الدعاء الثالث والستون</w:t>
       </w:r>
     </w:p>
     <w:p>
@@ -10425,6 +10391,120 @@
           <w:rtl/>
         </w:rPr>
         <w:t xml:space="preserve">ثم يُختم بالدعاء الآتي: «سبحان المنفّس عن كل مهموم، سبحان العليم بما كان وما يكون، سبحان سبحان من إذا أراد شيئًا قال له كن فيكون، سبحان الذي بيده ملكوت كل شيء وإليه تُرجعون، يا صمد يا إلهي، يا صمد معتمدي، اقضِ حاجتي» (ويذكرها) «... بحق يس، ومن أنزلها، ومن نزلت عليه، ومن نزلت به»</w:t>
+      </w:r>
+    </w:p>
+    <w:p>
+      <w:pPr>
+        <w:bidi/>
+        <w:spacing w:after="120" w:before="320"/>
+        <w:jc w:val="right"/>
+      </w:pPr>
+      <w:r>
+        <w:rPr>
+          <w:rFonts w:ascii="Times New Roman" w:cs="Times New Roman" w:eastAsia="Times New Roman" w:hAnsi="Times New Roman"/>
+          <w:b/>
+          <w:bCs/>
+          <w:sz w:val="44"/>
+          <w:szCs w:val="44"/>
+          <w:rtl/>
+        </w:rPr>
+        <w:t xml:space="preserve">الدعاء الثاني</w:t>
+      </w:r>
+    </w:p>
+    <w:p>
+      <w:pPr>
+        <w:bidi/>
+        <w:spacing w:after="200" w:line="340"/>
+        <w:jc w:val="right"/>
+      </w:pPr>
+      <w:r>
+        <w:rPr>
+          <w:rFonts w:ascii="Times New Roman" w:cs="Times New Roman" w:eastAsia="Times New Roman" w:hAnsi="Times New Roman"/>
+          <w:sz w:val="24"/>
+          <w:szCs w:val="24"/>
+          <w:rtl/>
+        </w:rPr>
+        <w:t xml:space="preserve">عِدّية يس (صيغة أخرى):</w:t>
+      </w:r>
+    </w:p>
+    <w:p>
+      <w:pPr>
+        <w:bidi/>
+        <w:spacing w:after="200" w:line="340"/>
+        <w:jc w:val="right"/>
+      </w:pPr>
+      <w:r>
+        <w:rPr>
+          <w:rFonts w:ascii="Times New Roman" w:cs="Times New Roman" w:eastAsia="Times New Roman" w:hAnsi="Times New Roman"/>
+          <w:sz w:val="24"/>
+          <w:szCs w:val="24"/>
+          <w:rtl/>
+        </w:rPr>
+        <w:t xml:space="preserve">1. «يس ۚ وَالْقُرْآنِ الْحَكِيمِ» تُكرر 7 مرات.</w:t>
+      </w:r>
+    </w:p>
+    <w:p>
+      <w:pPr>
+        <w:bidi/>
+        <w:spacing w:after="200" w:line="340"/>
+        <w:jc w:val="right"/>
+      </w:pPr>
+      <w:r>
+        <w:rPr>
+          <w:rFonts w:ascii="Times New Roman" w:cs="Times New Roman" w:eastAsia="Times New Roman" w:hAnsi="Times New Roman"/>
+          <w:sz w:val="24"/>
+          <w:szCs w:val="24"/>
+          <w:rtl/>
+        </w:rPr>
+        <w:t xml:space="preserve">2. نقرأ حتى نصل إلى قوله تعالى ﴿ذَٰلِكَ تَقْدِيرُ الْعَزِيزِ الْعَلِيمِ﴾، وتُكرر 3 مرات، ثم نقول بعد كل مرة هذا الدعاء: «اللهم قدّر لنا الخير، وارزقنا من حيث لا ندري ولا نحتسب، يا خير الرازقين»</w:t>
+      </w:r>
+    </w:p>
+    <w:p>
+      <w:pPr>
+        <w:bidi/>
+        <w:spacing w:after="200" w:line="340"/>
+        <w:jc w:val="right"/>
+      </w:pPr>
+      <w:r>
+        <w:rPr>
+          <w:rFonts w:ascii="Times New Roman" w:cs="Times New Roman" w:eastAsia="Times New Roman" w:hAnsi="Times New Roman"/>
+          <w:sz w:val="24"/>
+          <w:szCs w:val="24"/>
+          <w:rtl/>
+        </w:rPr>
+        <w:t xml:space="preserve">3. ونكمل القراءة حتى نصل إلى قوله تعالى ﴿سَلَامٌ قَوْلًا مِّن رَّبٍّ رَّحِيمٍ﴾، تُقرأ 7 مرات، وبعد كل مرة نقول هذا الدعاء: «اللهم سلّمنا من فتن الدنيا وعذاب الآخرة»</w:t>
+      </w:r>
+    </w:p>
+    <w:p>
+      <w:pPr>
+        <w:bidi/>
+        <w:spacing w:after="200" w:line="340"/>
+        <w:jc w:val="right"/>
+      </w:pPr>
+      <w:r>
+        <w:rPr>
+          <w:rFonts w:ascii="Times New Roman" w:cs="Times New Roman" w:eastAsia="Times New Roman" w:hAnsi="Times New Roman"/>
+          <w:sz w:val="24"/>
+          <w:szCs w:val="24"/>
+          <w:rtl/>
+        </w:rPr>
+        <w:t xml:space="preserve">4. ونكمل القراءة حتى نصل إلى قوله تعالى ﴿أَوَلَيْسَ الَّذِي خَلَقَ السَّمَاوَاتِ وَالْأَرْضَ بِقَادِرٍ عَلَىٰ أَن يَخْلُقَ مِثْلَهُم بَلَىٰ﴾، تُقال 3 مرات، ثم يُقال بعد كل مرة هذا الدعاء: «والله قادر على أن يأتي بالفرج العظيم، ويفكّ كروبنا وكروب المكروبين، ويقضي حوائجنا وحوائج السائلين، ويقضي الدين عن المدينين»</w:t>
+      </w:r>
+    </w:p>
+    <w:p>
+      <w:pPr>
+        <w:bidi/>
+        <w:spacing w:after="200" w:line="340"/>
+        <w:jc w:val="right"/>
+      </w:pPr>
+      <w:r>
+        <w:rPr>
+          <w:rFonts w:ascii="Times New Roman" w:cs="Times New Roman" w:eastAsia="Times New Roman" w:hAnsi="Times New Roman"/>
+          <w:sz w:val="24"/>
+          <w:szCs w:val="24"/>
+          <w:rtl/>
+        </w:rPr>
+        <w:t xml:space="preserve">بعد الانتهاء من قراءة السورة كاملة، يُقال هذا الدعاء: «سبحان العالم لكل مكنون، والقاضي لكل الديون، سبحان من قوله كن فيكون، اللهم إني أسألك وأتوجه إليك بحبيبك سيدنا محمد صلى الله عليه وسلم أن تسخّر لي قلب من أحوجتني إليه، ومن بيده من البشر قضاء حاجتي، وأن تكفني اللهم شر من يقدر علي ولا أقدر عليه، يا من بيده ملكوت كل شيء أنت العالم به والقادر عليه، اللهم بحق نبيك سيدنا محمد صلى الله عليه وسلم الذي أنزلت عليه سورة يس أن تجعلني في كل أمر وشدة غالبًا يا رب غالبًا، وأن تمنّ علي بسرعة العطاء وتحقيق الرجاء، اللهم صلِّ وسلم وبارك على سيدنا محمد بقدر حبك فيه، وبجاهه فرّج عني ما أنا فيه، جئت أتوسل إليك بقدر النبي الكريم وبسر بسم الله الرحمن الرحيم، يس والقرآن الحكيم». وفي النهاية تُسمّى الشيء الذي تريده من الله، وتقول: «آخر دعوانا أن الحمد لله رب العالمين»</w:t>
       </w:r>
     </w:p>
     <w:p>

</xml_diff>

<commit_message>
Color Quranic verse quotations in red across all categories
Wrap every ﴿...﴾ Quran quotation outside Adiyat Yasin in <red> so it
renders in red across the web app, GitHub Pages copy, and Word export.
In the Umrah category, keep only actual Quran quotes red and revert
non-Quranic dua/dhikr text (talbiyah, entering-mosque dua, tawaf takbir,
Safa dhikr) back to normal color. Also fixed a stray « instead of ﴿ on
a Surah Yusuf quote so it participates in the wrapping.
</commit_message>
<xml_diff>
--- a/خزانة الأدعية.docx
+++ b/خزانة الأدعية.docx
@@ -287,7 +287,19 @@
           <w:szCs w:val="24"/>
           <w:rtl/>
         </w:rPr>
-        <w:t xml:space="preserve">بسم الله الرحمن الرحيم: ﴿لَّا يَتَكَلَّمُونَ إِلَّا مَنْ أَذِنَ لَهُ الرَّحْمَٰنُ وَقَالَ صَوَابًا﴾</w:t>
+        <w:t xml:space="preserve">بسم الله الرحمن الرحيم: </w:t>
+      </w:r>
+      <w:r>
+        <w:rPr>
+          <w:rFonts w:ascii="Times New Roman" w:cs="Times New Roman" w:eastAsia="Times New Roman" w:hAnsi="Times New Roman"/>
+          <w:b/>
+          <w:bCs/>
+          <w:color w:val="B23A2E"/>
+          <w:sz w:val="24"/>
+          <w:szCs w:val="24"/>
+          <w:rtl/>
+        </w:rPr>
+        <w:t xml:space="preserve">﴿لَّا يَتَكَلَّمُونَ إِلَّا مَنْ أَذِنَ لَهُ الرَّحْمَٰنُ وَقَالَ صَوَابًا﴾</w:t>
       </w:r>
     </w:p>
     <w:p>
@@ -321,7 +333,91 @@
           <w:szCs w:val="24"/>
           <w:rtl/>
         </w:rPr>
-        <w:t xml:space="preserve">«بسم الله» (4 مرات)، ﴿قُلْ هُوَ اللَّهُ أَحَدٌ﴾... أيها الظالم أيها الحاكم، القلب منك يفزع، والمولى يتجلى، والنبي يشفع، بالعشرة الكرام لقيتك، حسبي الله على من ظلمني اخضع (4 مرات)، اللهم إني أجعلك في نحورهم وأعوذ بك من شرورهم. ثم تُقرأ آخر آيات سورة الإسراء: ﴿وَيَخِرُّونَ لِلْأَذْقَانِ يَبْكُونَ وَيَزِيدُهُمْ خُشُوعًا﴾ (109)، ﴿قُلِ ادْعُوا اللَّهَ أَوِ ادْعُوا الرَّحْمَٰنَ أَيًّا مَّا تَدْعُوا فَلَهُ الْأَسْمَاءُ الْحُسْنَىٰ وَلَا تَجْهَرْ بِصَلَاتِكَ وَلَا تُخَافِتْ بِهَا وَابْتَغِ بَيْنَ ذَٰلِكَ سَبِيلًا﴾ (110)، ﴿وَقُلِ الْحَمْدُ لِلَّهِ الَّذِي لَمْ يَتَّخِذْ وَلَدًا وَلَمْ يَكُن لَّهُ شَرِيكٌ فِي الْمُلْكِ وَلَمْ يَكُن لَّهُ وَلِيٌّ مِّنَ الذُّلِّ وَكَبِّرْهُ تَكْبِيرًا﴾ (111)</w:t>
+        <w:t xml:space="preserve">«بسم الله» (4 مرات)، </w:t>
+      </w:r>
+      <w:r>
+        <w:rPr>
+          <w:rFonts w:ascii="Times New Roman" w:cs="Times New Roman" w:eastAsia="Times New Roman" w:hAnsi="Times New Roman"/>
+          <w:b/>
+          <w:bCs/>
+          <w:color w:val="B23A2E"/>
+          <w:sz w:val="24"/>
+          <w:szCs w:val="24"/>
+          <w:rtl/>
+        </w:rPr>
+        <w:t xml:space="preserve">﴿قُلْ هُوَ اللَّهُ أَحَدٌ﴾</w:t>
+      </w:r>
+      <w:r>
+        <w:rPr>
+          <w:rFonts w:ascii="Times New Roman" w:cs="Times New Roman" w:eastAsia="Times New Roman" w:hAnsi="Times New Roman"/>
+          <w:sz w:val="24"/>
+          <w:szCs w:val="24"/>
+          <w:rtl/>
+        </w:rPr>
+        <w:t xml:space="preserve">... أيها الظالم أيها الحاكم، القلب منك يفزع، والمولى يتجلى، والنبي يشفع، بالعشرة الكرام لقيتك، حسبي الله على من ظلمني اخضع (4 مرات)، اللهم إني أجعلك في نحورهم وأعوذ بك من شرورهم. ثم تُقرأ آخر آيات سورة الإسراء: </w:t>
+      </w:r>
+      <w:r>
+        <w:rPr>
+          <w:rFonts w:ascii="Times New Roman" w:cs="Times New Roman" w:eastAsia="Times New Roman" w:hAnsi="Times New Roman"/>
+          <w:b/>
+          <w:bCs/>
+          <w:color w:val="B23A2E"/>
+          <w:sz w:val="24"/>
+          <w:szCs w:val="24"/>
+          <w:rtl/>
+        </w:rPr>
+        <w:t xml:space="preserve">﴿وَيَخِرُّونَ لِلْأَذْقَانِ يَبْكُونَ وَيَزِيدُهُمْ خُشُوعًا﴾</w:t>
+      </w:r>
+      <w:r>
+        <w:rPr>
+          <w:rFonts w:ascii="Times New Roman" w:cs="Times New Roman" w:eastAsia="Times New Roman" w:hAnsi="Times New Roman"/>
+          <w:sz w:val="24"/>
+          <w:szCs w:val="24"/>
+          <w:rtl/>
+        </w:rPr>
+        <w:t xml:space="preserve"> (109)، </w:t>
+      </w:r>
+      <w:r>
+        <w:rPr>
+          <w:rFonts w:ascii="Times New Roman" w:cs="Times New Roman" w:eastAsia="Times New Roman" w:hAnsi="Times New Roman"/>
+          <w:b/>
+          <w:bCs/>
+          <w:color w:val="B23A2E"/>
+          <w:sz w:val="24"/>
+          <w:szCs w:val="24"/>
+          <w:rtl/>
+        </w:rPr>
+        <w:t xml:space="preserve">﴿قُلِ ادْعُوا اللَّهَ أَوِ ادْعُوا الرَّحْمَٰنَ أَيًّا مَّا تَدْعُوا فَلَهُ الْأَسْمَاءُ الْحُسْنَىٰ وَلَا تَجْهَرْ بِصَلَاتِكَ وَلَا تُخَافِتْ بِهَا وَابْتَغِ بَيْنَ ذَٰلِكَ سَبِيلًا﴾</w:t>
+      </w:r>
+      <w:r>
+        <w:rPr>
+          <w:rFonts w:ascii="Times New Roman" w:cs="Times New Roman" w:eastAsia="Times New Roman" w:hAnsi="Times New Roman"/>
+          <w:sz w:val="24"/>
+          <w:szCs w:val="24"/>
+          <w:rtl/>
+        </w:rPr>
+        <w:t xml:space="preserve"> (110)، </w:t>
+      </w:r>
+      <w:r>
+        <w:rPr>
+          <w:rFonts w:ascii="Times New Roman" w:cs="Times New Roman" w:eastAsia="Times New Roman" w:hAnsi="Times New Roman"/>
+          <w:b/>
+          <w:bCs/>
+          <w:color w:val="B23A2E"/>
+          <w:sz w:val="24"/>
+          <w:szCs w:val="24"/>
+          <w:rtl/>
+        </w:rPr>
+        <w:t xml:space="preserve">﴿وَقُلِ الْحَمْدُ لِلَّهِ الَّذِي لَمْ يَتَّخِذْ وَلَدًا وَلَمْ يَكُن لَّهُ شَرِيكٌ فِي الْمُلْكِ وَلَمْ يَكُن لَّهُ وَلِيٌّ مِّنَ الذُّلِّ وَكَبِّرْهُ تَكْبِيرًا﴾</w:t>
+      </w:r>
+      <w:r>
+        <w:rPr>
+          <w:rFonts w:ascii="Times New Roman" w:cs="Times New Roman" w:eastAsia="Times New Roman" w:hAnsi="Times New Roman"/>
+          <w:sz w:val="24"/>
+          <w:szCs w:val="24"/>
+          <w:rtl/>
+        </w:rPr>
+        <w:t xml:space="preserve"> (111)</w:t>
       </w:r>
     </w:p>
     <w:p>
@@ -555,6 +651,9 @@
       <w:r>
         <w:rPr>
           <w:rFonts w:ascii="Times New Roman" w:cs="Times New Roman" w:eastAsia="Times New Roman" w:hAnsi="Times New Roman"/>
+          <w:b/>
+          <w:bCs/>
+          <w:color w:val="B23A2E"/>
           <w:sz w:val="24"/>
           <w:szCs w:val="24"/>
           <w:rtl/>
@@ -593,7 +692,28 @@
           <w:szCs w:val="24"/>
           <w:rtl/>
         </w:rPr>
-        <w:t xml:space="preserve">علشان تسيطر على أي شخص خايف من ظلمه له: قل 7 مرات ﴿فَسَيَكْفِيكَهُمُ اللَّهُ وَهُوَ السَّمِيعُ الْعَلِيمُ﴾ ثم انظر في عينه وقل: «اللهم اكفني شر عبدك هذا بما أردت، اللهم اكفني شره بما شئت»</w:t>
+        <w:t xml:space="preserve">علشان تسيطر على أي شخص خايف من ظلمه له: قل 7 مرات </w:t>
+      </w:r>
+      <w:r>
+        <w:rPr>
+          <w:rFonts w:ascii="Times New Roman" w:cs="Times New Roman" w:eastAsia="Times New Roman" w:hAnsi="Times New Roman"/>
+          <w:b/>
+          <w:bCs/>
+          <w:color w:val="B23A2E"/>
+          <w:sz w:val="24"/>
+          <w:szCs w:val="24"/>
+          <w:rtl/>
+        </w:rPr>
+        <w:t xml:space="preserve">﴿فَسَيَكْفِيكَهُمُ اللَّهُ وَهُوَ السَّمِيعُ الْعَلِيمُ﴾</w:t>
+      </w:r>
+      <w:r>
+        <w:rPr>
+          <w:rFonts w:ascii="Times New Roman" w:cs="Times New Roman" w:eastAsia="Times New Roman" w:hAnsi="Times New Roman"/>
+          <w:sz w:val="24"/>
+          <w:szCs w:val="24"/>
+          <w:rtl/>
+        </w:rPr>
+        <w:t xml:space="preserve"> ثم انظر في عينه وقل: «اللهم اكفني شر عبدك هذا بما أردت، اللهم اكفني شره بما شئت»</w:t>
       </w:r>
     </w:p>
     <w:p>
@@ -627,7 +747,49 @@
           <w:szCs w:val="24"/>
           <w:rtl/>
         </w:rPr>
-        <w:t xml:space="preserve">لدخول مكان تهابه أو مقابلة شخص تخشاه، تُقرأ آية آل عمران 154: ﴿ثُمَّ أَنزَلَ عَلَيْكُم مِّن بَعْدِ الْغَمِّ أَمَنَةً نُّعَاسًا يَغْشَىٰ طَائِفَةً مِّنكُمْ﴾ إلى آخرها، وآية الفتح 29: ﴿مُّحَمَّدٌ رَّسُولُ اللَّهِ وَالَّذِينَ مَعَهُ أَشِدَّاءُ عَلَى الْكُفَّارِ رُحَمَاءُ بَيْنَهُمْ﴾ إلى آخرها</w:t>
+        <w:t xml:space="preserve">لدخول مكان تهابه أو مقابلة شخص تخشاه، تُقرأ آية آل عمران 154: </w:t>
+      </w:r>
+      <w:r>
+        <w:rPr>
+          <w:rFonts w:ascii="Times New Roman" w:cs="Times New Roman" w:eastAsia="Times New Roman" w:hAnsi="Times New Roman"/>
+          <w:b/>
+          <w:bCs/>
+          <w:color w:val="B23A2E"/>
+          <w:sz w:val="24"/>
+          <w:szCs w:val="24"/>
+          <w:rtl/>
+        </w:rPr>
+        <w:t xml:space="preserve">﴿ثُمَّ أَنزَلَ عَلَيْكُم مِّن بَعْدِ الْغَمِّ أَمَنَةً نُّعَاسًا يَغْشَىٰ طَائِفَةً مِّنكُمْ﴾</w:t>
+      </w:r>
+      <w:r>
+        <w:rPr>
+          <w:rFonts w:ascii="Times New Roman" w:cs="Times New Roman" w:eastAsia="Times New Roman" w:hAnsi="Times New Roman"/>
+          <w:sz w:val="24"/>
+          <w:szCs w:val="24"/>
+          <w:rtl/>
+        </w:rPr>
+        <w:t xml:space="preserve"> إلى آخرها، وآية الفتح 29: </w:t>
+      </w:r>
+      <w:r>
+        <w:rPr>
+          <w:rFonts w:ascii="Times New Roman" w:cs="Times New Roman" w:eastAsia="Times New Roman" w:hAnsi="Times New Roman"/>
+          <w:b/>
+          <w:bCs/>
+          <w:color w:val="B23A2E"/>
+          <w:sz w:val="24"/>
+          <w:szCs w:val="24"/>
+          <w:rtl/>
+        </w:rPr>
+        <w:t xml:space="preserve">﴿مُّحَمَّدٌ رَّسُولُ اللَّهِ وَالَّذِينَ مَعَهُ أَشِدَّاءُ عَلَى الْكُفَّارِ رُحَمَاءُ بَيْنَهُمْ﴾</w:t>
+      </w:r>
+      <w:r>
+        <w:rPr>
+          <w:rFonts w:ascii="Times New Roman" w:cs="Times New Roman" w:eastAsia="Times New Roman" w:hAnsi="Times New Roman"/>
+          <w:sz w:val="24"/>
+          <w:szCs w:val="24"/>
+          <w:rtl/>
+        </w:rPr>
+        <w:t xml:space="preserve"> إلى آخرها</w:t>
       </w:r>
     </w:p>
     <w:p>
@@ -729,7 +891,19 @@
           <w:szCs w:val="24"/>
           <w:rtl/>
         </w:rPr>
-        <w:t xml:space="preserve">تُدعى بهذا الدعاء قبل الدخول على أي شخص خائف منه: ﴿قَالَ رَجُلَانِ مِنَ الَّذِينَ يَخَافُونَ أَنْعَمَ اللَّهُ عَلَيْهِمَا ادْخُلُوا عَلَيْهِمُ الْبَابَ فَإِذَا دَخَلْتُمُوهُ فَإِنَّكُمْ غَالِبُونَ وَعَلَى اللَّهِ فَتَوَكَّلُوا إِن كُنتُم مُّؤْمِنِينَ﴾</w:t>
+        <w:t xml:space="preserve">تُدعى بهذا الدعاء قبل الدخول على أي شخص خائف منه: </w:t>
+      </w:r>
+      <w:r>
+        <w:rPr>
+          <w:rFonts w:ascii="Times New Roman" w:cs="Times New Roman" w:eastAsia="Times New Roman" w:hAnsi="Times New Roman"/>
+          <w:b/>
+          <w:bCs/>
+          <w:color w:val="B23A2E"/>
+          <w:sz w:val="24"/>
+          <w:szCs w:val="24"/>
+          <w:rtl/>
+        </w:rPr>
+        <w:t xml:space="preserve">﴿قَالَ رَجُلَانِ مِنَ الَّذِينَ يَخَافُونَ أَنْعَمَ اللَّهُ عَلَيْهِمَا ادْخُلُوا عَلَيْهِمُ الْبَابَ فَإِذَا دَخَلْتُمُوهُ فَإِنَّكُمْ غَالِبُونَ وَعَلَى اللَّهِ فَتَوَكَّلُوا إِن كُنتُم مُّؤْمِنِينَ﴾</w:t>
       </w:r>
     </w:p>
     <w:p>
@@ -1361,11 +1535,23 @@
       <w:r>
         <w:rPr>
           <w:rFonts w:ascii="Times New Roman" w:cs="Times New Roman" w:eastAsia="Times New Roman" w:hAnsi="Times New Roman"/>
-          <w:sz w:val="24"/>
-          <w:szCs w:val="24"/>
-          <w:rtl/>
-        </w:rPr>
-        <w:t xml:space="preserve">﴿رَبِّ إِنِّي لِمَا أَنزَلْتَ إِلَيَّ مِنْ خَيْرٍ فَقِيرٌ﴾ (دعاء سيدنا موسى عليه السلام)</w:t>
+          <w:b/>
+          <w:bCs/>
+          <w:color w:val="B23A2E"/>
+          <w:sz w:val="24"/>
+          <w:szCs w:val="24"/>
+          <w:rtl/>
+        </w:rPr>
+        <w:t xml:space="preserve">﴿رَبِّ إِنِّي لِمَا أَنزَلْتَ إِلَيَّ مِنْ خَيْرٍ فَقِيرٌ﴾</w:t>
+      </w:r>
+      <w:r>
+        <w:rPr>
+          <w:rFonts w:ascii="Times New Roman" w:cs="Times New Roman" w:eastAsia="Times New Roman" w:hAnsi="Times New Roman"/>
+          <w:sz w:val="24"/>
+          <w:szCs w:val="24"/>
+          <w:rtl/>
+        </w:rPr>
+        <w:t xml:space="preserve"> (دعاء سيدنا موسى عليه السلام)</w:t>
       </w:r>
     </w:p>
     <w:p>
@@ -1501,7 +1687,19 @@
           <w:szCs w:val="24"/>
           <w:rtl/>
         </w:rPr>
-        <w:t xml:space="preserve">٤٠ مرة لزيادة الرزق: سورة الشرح كاملة: ﴿أَلَمْ نَشْرَحْ لَكَ صَدْرَكَ * وَوَضَعْنَا عَنكَ وِزْرَكَ * الَّذِي أَنقَضَ ظَهْرَكَ * وَرَفَعْنَا لَكَ ذِكْرَكَ * فَإِنَّ مَعَ الْعُسْرِ يُسْرًا * إِنَّ مَعَ الْعُسْرِ يُسْرًا * فَإِذَا فَرَغْتَ فَانصَبْ * وَإِلَىٰ رَبِّكَ فَارْغَب﴾</w:t>
+        <w:t xml:space="preserve">٤٠ مرة لزيادة الرزق: سورة الشرح كاملة: </w:t>
+      </w:r>
+      <w:r>
+        <w:rPr>
+          <w:rFonts w:ascii="Times New Roman" w:cs="Times New Roman" w:eastAsia="Times New Roman" w:hAnsi="Times New Roman"/>
+          <w:b/>
+          <w:bCs/>
+          <w:color w:val="B23A2E"/>
+          <w:sz w:val="24"/>
+          <w:szCs w:val="24"/>
+          <w:rtl/>
+        </w:rPr>
+        <w:t xml:space="preserve">﴿أَلَمْ نَشْرَحْ لَكَ صَدْرَكَ * وَوَضَعْنَا عَنكَ وِزْرَكَ * الَّذِي أَنقَضَ ظَهْرَكَ * وَرَفَعْنَا لَكَ ذِكْرَكَ * فَإِنَّ مَعَ الْعُسْرِ يُسْرًا * إِنَّ مَعَ الْعُسْرِ يُسْرًا * فَإِذَا فَرَغْتَ فَانصَبْ * وَإِلَىٰ رَبِّكَ فَارْغَب﴾</w:t>
       </w:r>
     </w:p>
     <w:p>
@@ -1637,7 +1835,49 @@
           <w:szCs w:val="24"/>
           <w:rtl/>
         </w:rPr>
-        <w:t xml:space="preserve">لجلب الرزق والمال: أسبوع كامل، بعد صلاة القيام (ركعتين): استغفار «أستغفر الله العظيم الذي لا إله إلا هو الحي القيوم وأتوب إليه» (100 مرة)، صلاة على النبي (100 مرة)، سورة الكوثر (1111 مرة)، «يا قهار» (1111 مرة)، ﴿فَصَلِّ لِرَبِّكَ وَانْحَرْ﴾ (111 مرة)، «يا منتقم» (1111 مرة)، ﴿إِنَّ شَانِئَكَ هُوَ الْأَبْتَرُ﴾ (1111 مرة)، «يا منزل يا رزاق يا فتاح» (1111 مرة) — ويمكن الاكتفاء بـ 11 مرة لكل بند لمن لا يقدر على 1111</w:t>
+        <w:t xml:space="preserve">لجلب الرزق والمال: أسبوع كامل، بعد صلاة القيام (ركعتين): استغفار «أستغفر الله العظيم الذي لا إله إلا هو الحي القيوم وأتوب إليه» (100 مرة)، صلاة على النبي (100 مرة)، سورة الكوثر (1111 مرة)، «يا قهار» (1111 مرة)، </w:t>
+      </w:r>
+      <w:r>
+        <w:rPr>
+          <w:rFonts w:ascii="Times New Roman" w:cs="Times New Roman" w:eastAsia="Times New Roman" w:hAnsi="Times New Roman"/>
+          <w:b/>
+          <w:bCs/>
+          <w:color w:val="B23A2E"/>
+          <w:sz w:val="24"/>
+          <w:szCs w:val="24"/>
+          <w:rtl/>
+        </w:rPr>
+        <w:t xml:space="preserve">﴿فَصَلِّ لِرَبِّكَ وَانْحَرْ﴾</w:t>
+      </w:r>
+      <w:r>
+        <w:rPr>
+          <w:rFonts w:ascii="Times New Roman" w:cs="Times New Roman" w:eastAsia="Times New Roman" w:hAnsi="Times New Roman"/>
+          <w:sz w:val="24"/>
+          <w:szCs w:val="24"/>
+          <w:rtl/>
+        </w:rPr>
+        <w:t xml:space="preserve"> (111 مرة)، «يا منتقم» (1111 مرة)، </w:t>
+      </w:r>
+      <w:r>
+        <w:rPr>
+          <w:rFonts w:ascii="Times New Roman" w:cs="Times New Roman" w:eastAsia="Times New Roman" w:hAnsi="Times New Roman"/>
+          <w:b/>
+          <w:bCs/>
+          <w:color w:val="B23A2E"/>
+          <w:sz w:val="24"/>
+          <w:szCs w:val="24"/>
+          <w:rtl/>
+        </w:rPr>
+        <w:t xml:space="preserve">﴿إِنَّ شَانِئَكَ هُوَ الْأَبْتَرُ﴾</w:t>
+      </w:r>
+      <w:r>
+        <w:rPr>
+          <w:rFonts w:ascii="Times New Roman" w:cs="Times New Roman" w:eastAsia="Times New Roman" w:hAnsi="Times New Roman"/>
+          <w:sz w:val="24"/>
+          <w:szCs w:val="24"/>
+          <w:rtl/>
+        </w:rPr>
+        <w:t xml:space="preserve"> (1111 مرة)، «يا منزل يا رزاق يا فتاح» (1111 مرة) — ويمكن الاكتفاء بـ 11 مرة لكل بند لمن لا يقدر على 1111</w:t>
       </w:r>
     </w:p>
     <w:p>
@@ -1705,7 +1945,70 @@
           <w:szCs w:val="24"/>
           <w:rtl/>
         </w:rPr>
-        <w:t xml:space="preserve">لفك الدين، بعد صلاة الجمعة وأنت جالس في مقعدك: الفاتحة (7 مرات)، ﴿قُلْ هُوَ اللَّهُ أَحَدٌ﴾ (7 مرات)، ﴿قُلْ أَعُوذُ بِرَبِّ الْفَلَقِ﴾ (7 مرات)، ﴿قُلْ أَعُوذُ بِرَبِّ النَّاسِ﴾ (7 مرات)، ثم: «اللهم يا غني يا حميد، يا مبدئ يا معيد، يا رحيم يا ودود، أغنني بحلالك عن حرامك، وبطاعتك عن معصيتك، وبفضلك عمن سواك»</w:t>
+        <w:t xml:space="preserve">لفك الدين، بعد صلاة الجمعة وأنت جالس في مقعدك: الفاتحة (7 مرات)، </w:t>
+      </w:r>
+      <w:r>
+        <w:rPr>
+          <w:rFonts w:ascii="Times New Roman" w:cs="Times New Roman" w:eastAsia="Times New Roman" w:hAnsi="Times New Roman"/>
+          <w:b/>
+          <w:bCs/>
+          <w:color w:val="B23A2E"/>
+          <w:sz w:val="24"/>
+          <w:szCs w:val="24"/>
+          <w:rtl/>
+        </w:rPr>
+        <w:t xml:space="preserve">﴿قُلْ هُوَ اللَّهُ أَحَدٌ﴾</w:t>
+      </w:r>
+      <w:r>
+        <w:rPr>
+          <w:rFonts w:ascii="Times New Roman" w:cs="Times New Roman" w:eastAsia="Times New Roman" w:hAnsi="Times New Roman"/>
+          <w:sz w:val="24"/>
+          <w:szCs w:val="24"/>
+          <w:rtl/>
+        </w:rPr>
+        <w:t xml:space="preserve"> (7 مرات)، </w:t>
+      </w:r>
+      <w:r>
+        <w:rPr>
+          <w:rFonts w:ascii="Times New Roman" w:cs="Times New Roman" w:eastAsia="Times New Roman" w:hAnsi="Times New Roman"/>
+          <w:b/>
+          <w:bCs/>
+          <w:color w:val="B23A2E"/>
+          <w:sz w:val="24"/>
+          <w:szCs w:val="24"/>
+          <w:rtl/>
+        </w:rPr>
+        <w:t xml:space="preserve">﴿قُلْ أَعُوذُ بِرَبِّ الْفَلَقِ﴾</w:t>
+      </w:r>
+      <w:r>
+        <w:rPr>
+          <w:rFonts w:ascii="Times New Roman" w:cs="Times New Roman" w:eastAsia="Times New Roman" w:hAnsi="Times New Roman"/>
+          <w:sz w:val="24"/>
+          <w:szCs w:val="24"/>
+          <w:rtl/>
+        </w:rPr>
+        <w:t xml:space="preserve"> (7 مرات)، </w:t>
+      </w:r>
+      <w:r>
+        <w:rPr>
+          <w:rFonts w:ascii="Times New Roman" w:cs="Times New Roman" w:eastAsia="Times New Roman" w:hAnsi="Times New Roman"/>
+          <w:b/>
+          <w:bCs/>
+          <w:color w:val="B23A2E"/>
+          <w:sz w:val="24"/>
+          <w:szCs w:val="24"/>
+          <w:rtl/>
+        </w:rPr>
+        <w:t xml:space="preserve">﴿قُلْ أَعُوذُ بِرَبِّ النَّاسِ﴾</w:t>
+      </w:r>
+      <w:r>
+        <w:rPr>
+          <w:rFonts w:ascii="Times New Roman" w:cs="Times New Roman" w:eastAsia="Times New Roman" w:hAnsi="Times New Roman"/>
+          <w:sz w:val="24"/>
+          <w:szCs w:val="24"/>
+          <w:rtl/>
+        </w:rPr>
+        <w:t xml:space="preserve"> (7 مرات)، ثم: «اللهم يا غني يا حميد، يا مبدئ يا معيد، يا رحيم يا ودود، أغنني بحلالك عن حرامك، وبطاعتك عن معصيتك، وبفضلك عمن سواك»</w:t>
       </w:r>
     </w:p>
     <w:p>
@@ -1739,7 +2042,28 @@
           <w:szCs w:val="24"/>
           <w:rtl/>
         </w:rPr>
-        <w:t xml:space="preserve">صلاة إبراهيمية (10 مرات)، ثم ﴿أَوَلَمْ يَعْلَمُوا أَنَّ اللَّهَ يَبْسُطُ الرِّزْقَ لِمَن يَشَاءُ وَيَقْدِرُ إِنَّ فِي ذَٰلِكَ لَآيَاتٍ لِّقَوْمٍ يُؤْمِنُونَ﴾ (100 مرة)، ثم: «اللهم إني أسألك بعلمك الذي لا يعلمه سواك فأنت علام الغيوب، اللهم ابسط لي في رزقي فإنك تبسط الرزق لمن تشاء» (3 مرات) — والأفضل يوم الخميس بعد صلاة المغرب</w:t>
+        <w:t xml:space="preserve">صلاة إبراهيمية (10 مرات)، ثم </w:t>
+      </w:r>
+      <w:r>
+        <w:rPr>
+          <w:rFonts w:ascii="Times New Roman" w:cs="Times New Roman" w:eastAsia="Times New Roman" w:hAnsi="Times New Roman"/>
+          <w:b/>
+          <w:bCs/>
+          <w:color w:val="B23A2E"/>
+          <w:sz w:val="24"/>
+          <w:szCs w:val="24"/>
+          <w:rtl/>
+        </w:rPr>
+        <w:t xml:space="preserve">﴿أَوَلَمْ يَعْلَمُوا أَنَّ اللَّهَ يَبْسُطُ الرِّزْقَ لِمَن يَشَاءُ وَيَقْدِرُ إِنَّ فِي ذَٰلِكَ لَآيَاتٍ لِّقَوْمٍ يُؤْمِنُونَ﴾</w:t>
+      </w:r>
+      <w:r>
+        <w:rPr>
+          <w:rFonts w:ascii="Times New Roman" w:cs="Times New Roman" w:eastAsia="Times New Roman" w:hAnsi="Times New Roman"/>
+          <w:sz w:val="24"/>
+          <w:szCs w:val="24"/>
+          <w:rtl/>
+        </w:rPr>
+        <w:t xml:space="preserve"> (100 مرة)، ثم: «اللهم إني أسألك بعلمك الذي لا يعلمه سواك فأنت علام الغيوب، اللهم ابسط لي في رزقي فإنك تبسط الرزق لمن تشاء» (3 مرات) — والأفضل يوم الخميس بعد صلاة المغرب</w:t>
       </w:r>
     </w:p>
     <w:p>
@@ -1773,7 +2097,28 @@
           <w:szCs w:val="24"/>
           <w:rtl/>
         </w:rPr>
-        <w:t xml:space="preserve">لتوسيع الرزق: صلاة على النبي (19 مرة)، ﴿وَمَا مِن دَابَّةٍ فِي الْأَرْضِ إِلَّا عَلَى اللَّهِ رِزْقُهَا وَيَعْلَمُ مُسْتَقَرَّهَا وَمُسْتَوْدَعَهَا كُلٌّ فِي كِتَابٍ مُّبِينٍ﴾ (7 مرات)، «يا رزاق يا رزاق» (7 مرات)، ثم تدعو بتوسعة الرزق، ثم صلاة على النبي (19 مرة)</w:t>
+        <w:t xml:space="preserve">لتوسيع الرزق: صلاة على النبي (19 مرة)، </w:t>
+      </w:r>
+      <w:r>
+        <w:rPr>
+          <w:rFonts w:ascii="Times New Roman" w:cs="Times New Roman" w:eastAsia="Times New Roman" w:hAnsi="Times New Roman"/>
+          <w:b/>
+          <w:bCs/>
+          <w:color w:val="B23A2E"/>
+          <w:sz w:val="24"/>
+          <w:szCs w:val="24"/>
+          <w:rtl/>
+        </w:rPr>
+        <w:t xml:space="preserve">﴿وَمَا مِن دَابَّةٍ فِي الْأَرْضِ إِلَّا عَلَى اللَّهِ رِزْقُهَا وَيَعْلَمُ مُسْتَقَرَّهَا وَمُسْتَوْدَعَهَا كُلٌّ فِي كِتَابٍ مُّبِينٍ﴾</w:t>
+      </w:r>
+      <w:r>
+        <w:rPr>
+          <w:rFonts w:ascii="Times New Roman" w:cs="Times New Roman" w:eastAsia="Times New Roman" w:hAnsi="Times New Roman"/>
+          <w:sz w:val="24"/>
+          <w:szCs w:val="24"/>
+          <w:rtl/>
+        </w:rPr>
+        <w:t xml:space="preserve"> (7 مرات)، «يا رزاق يا رزاق» (7 مرات)، ثم تدعو بتوسعة الرزق، ثم صلاة على النبي (19 مرة)</w:t>
       </w:r>
     </w:p>
     <w:p>
@@ -1899,7 +2244,28 @@
           <w:szCs w:val="24"/>
           <w:rtl/>
         </w:rPr>
-        <w:t xml:space="preserve">الدعاء الأول (دعاء تفريج الكرب الكامل، مكوّن من 4 أدعية): الدعاء الأول: «اللهم إن في تدبيرك ما يغني عن الحيل، وفي كرمك ما هو فوق الأمل، وفي عفوك ما يمحو الزلل. اللهم يا وليي في نعمتي، ويا مؤنسي في وحشتي، ويا ملاذي عند غربتي، اجعل ما أخافه وأحذره بردًا وسلامًا على قلبي، كما جعلت النار بردًا وسلامًا على إبراهيم». الدعاء الثاني: «اللهم رب السماوات السبع، ورب العرش العظيم، كن لي جارًا من (فلان بن فلان)، ومن أحزابه من الجن والإنس، أن يفرط علي أحد منهم أو يطغى. عز جارك، وجل ثناؤك، ولا إله غيرك. اللهم اجعلني في جوارك من شر كل ذي شر، ومن شر الشيطان الرجيم. إن وليي الله الذي نزل الكتاب، وهو يتولى الصالحين». الدعاء الثالث: «﴿قُلِ اللَّهُمَّ فَاطِرَ السَّمَاوَاتِ وَالْأَرْضِ، عَالِمَ الْغَيْبِ وَالشَّهَادَةِ، أَنْتَ تَحْكُمُ بَيْنَ عِبَادِكَ فِي مَا كَانُوا فِيهِ يَخْتَلِفُونَ﴾» ثم سل الله ما تشاء من خير الدنيا والآخرة، ثم الصلاة على النبي. الدعاء الرابع: «اللهم أعني ولا تُعن علي، وانصرني ولا تنصر علي، واغفر زلتي، واقبل توبتي، وأجب دعوتي، واسلل سخيمة صدري»</w:t>
+        <w:t xml:space="preserve">الدعاء الأول (دعاء تفريج الكرب الكامل، مكوّن من 4 أدعية): الدعاء الأول: «اللهم إن في تدبيرك ما يغني عن الحيل، وفي كرمك ما هو فوق الأمل، وفي عفوك ما يمحو الزلل. اللهم يا وليي في نعمتي، ويا مؤنسي في وحشتي، ويا ملاذي عند غربتي، اجعل ما أخافه وأحذره بردًا وسلامًا على قلبي، كما جعلت النار بردًا وسلامًا على إبراهيم». الدعاء الثاني: «اللهم رب السماوات السبع، ورب العرش العظيم، كن لي جارًا من (فلان بن فلان)، ومن أحزابه من الجن والإنس، أن يفرط علي أحد منهم أو يطغى. عز جارك، وجل ثناؤك، ولا إله غيرك. اللهم اجعلني في جوارك من شر كل ذي شر، ومن شر الشيطان الرجيم. إن وليي الله الذي نزل الكتاب، وهو يتولى الصالحين». الدعاء الثالث: «</w:t>
+      </w:r>
+      <w:r>
+        <w:rPr>
+          <w:rFonts w:ascii="Times New Roman" w:cs="Times New Roman" w:eastAsia="Times New Roman" w:hAnsi="Times New Roman"/>
+          <w:b/>
+          <w:bCs/>
+          <w:color w:val="B23A2E"/>
+          <w:sz w:val="24"/>
+          <w:szCs w:val="24"/>
+          <w:rtl/>
+        </w:rPr>
+        <w:t xml:space="preserve">﴿قُلِ اللَّهُمَّ فَاطِرَ السَّمَاوَاتِ وَالْأَرْضِ، عَالِمَ الْغَيْبِ وَالشَّهَادَةِ، أَنْتَ تَحْكُمُ بَيْنَ عِبَادِكَ فِي مَا كَانُوا فِيهِ يَخْتَلِفُونَ﴾</w:t>
+      </w:r>
+      <w:r>
+        <w:rPr>
+          <w:rFonts w:ascii="Times New Roman" w:cs="Times New Roman" w:eastAsia="Times New Roman" w:hAnsi="Times New Roman"/>
+          <w:sz w:val="24"/>
+          <w:szCs w:val="24"/>
+          <w:rtl/>
+        </w:rPr>
+        <w:t xml:space="preserve">» ثم سل الله ما تشاء من خير الدنيا والآخرة، ثم الصلاة على النبي. الدعاء الرابع: «اللهم أعني ولا تُعن علي، وانصرني ولا تنصر علي، واغفر زلتي، واقبل توبتي، وأجب دعوتي، واسلل سخيمة صدري»</w:t>
       </w:r>
     </w:p>
     <w:p>
@@ -2579,7 +2945,40 @@
           <w:szCs w:val="24"/>
           <w:rtl/>
         </w:rPr>
-        <w:t xml:space="preserve">«آيات فك الكرب وزيادة الرزق»: ﴿أَفَحَسِبْتُمْ أَنَّمَا خَلَقْنَاكُمْ عَبَثًا وَأَنَّكُمْ إِلَيْنَا لَا تُرْجَعُونَ * فَتَعَالَى اللَّهُ الْمَلِكُ الْحَقُّ لَا إِلَٰهَ إِلَّا هُوَ رَبُّ الْعَرْشِ الْكَرِيمِ * وَمَن يَدْعُ مَعَ اللَّهِ إِلَٰهًا آخَرَ لَا بُرْهَانَ لَهُ بِهِ فَإِنَّمَا حِسَابُهُ عِندَ رَبِّهِ إِنَّهُ لَا يُفْلِحُ الْكَافِرُونَ﴾ ثم ﴿وَقُل رَّبِّ اغْفِرْ وَارْحَمْ وَأَنتَ خَيْرُ الرَّاحِمِينَ﴾</w:t>
+        <w:t xml:space="preserve">«آيات فك الكرب وزيادة الرزق»: </w:t>
+      </w:r>
+      <w:r>
+        <w:rPr>
+          <w:rFonts w:ascii="Times New Roman" w:cs="Times New Roman" w:eastAsia="Times New Roman" w:hAnsi="Times New Roman"/>
+          <w:b/>
+          <w:bCs/>
+          <w:color w:val="B23A2E"/>
+          <w:sz w:val="24"/>
+          <w:szCs w:val="24"/>
+          <w:rtl/>
+        </w:rPr>
+        <w:t xml:space="preserve">﴿أَفَحَسِبْتُمْ أَنَّمَا خَلَقْنَاكُمْ عَبَثًا وَأَنَّكُمْ إِلَيْنَا لَا تُرْجَعُونَ * فَتَعَالَى اللَّهُ الْمَلِكُ الْحَقُّ لَا إِلَٰهَ إِلَّا هُوَ رَبُّ الْعَرْشِ الْكَرِيمِ * وَمَن يَدْعُ مَعَ اللَّهِ إِلَٰهًا آخَرَ لَا بُرْهَانَ لَهُ بِهِ فَإِنَّمَا حِسَابُهُ عِندَ رَبِّهِ إِنَّهُ لَا يُفْلِحُ الْكَافِرُونَ﴾</w:t>
+      </w:r>
+      <w:r>
+        <w:rPr>
+          <w:rFonts w:ascii="Times New Roman" w:cs="Times New Roman" w:eastAsia="Times New Roman" w:hAnsi="Times New Roman"/>
+          <w:sz w:val="24"/>
+          <w:szCs w:val="24"/>
+          <w:rtl/>
+        </w:rPr>
+        <w:t xml:space="preserve"> ثم </w:t>
+      </w:r>
+      <w:r>
+        <w:rPr>
+          <w:rFonts w:ascii="Times New Roman" w:cs="Times New Roman" w:eastAsia="Times New Roman" w:hAnsi="Times New Roman"/>
+          <w:b/>
+          <w:bCs/>
+          <w:color w:val="B23A2E"/>
+          <w:sz w:val="24"/>
+          <w:szCs w:val="24"/>
+          <w:rtl/>
+        </w:rPr>
+        <w:t xml:space="preserve">﴿وَقُل رَّبِّ اغْفِرْ وَارْحَمْ وَأَنتَ خَيْرُ الرَّاحِمِينَ﴾</w:t>
       </w:r>
     </w:p>
     <w:p>
@@ -2613,7 +3012,19 @@
           <w:szCs w:val="24"/>
           <w:rtl/>
         </w:rPr>
-        <w:t xml:space="preserve">إذا كثرت المشاكل، فعليك بآية 123 من سورة هود: ﴿وَلِلَّهِ غَيْبُ السَّمَاوَاتِ وَالْأَرْضِ وَإِلَيْهِ يُرْجَعُ الْأَمْرُ كُلُّهُ فَاعْبُدْهُ وَتَوَكَّلْ عَلَيْهِ وَمَا رَبُّكَ بِغَافِلٍ عَمَّا تَعْمَلُونَ﴾</w:t>
+        <w:t xml:space="preserve">إذا كثرت المشاكل، فعليك بآية 123 من سورة هود: </w:t>
+      </w:r>
+      <w:r>
+        <w:rPr>
+          <w:rFonts w:ascii="Times New Roman" w:cs="Times New Roman" w:eastAsia="Times New Roman" w:hAnsi="Times New Roman"/>
+          <w:b/>
+          <w:bCs/>
+          <w:color w:val="B23A2E"/>
+          <w:sz w:val="24"/>
+          <w:szCs w:val="24"/>
+          <w:rtl/>
+        </w:rPr>
+        <w:t xml:space="preserve">﴿وَلِلَّهِ غَيْبُ السَّمَاوَاتِ وَالْأَرْضِ وَإِلَيْهِ يُرْجَعُ الْأَمْرُ كُلُّهُ فَاعْبُدْهُ وَتَوَكَّلْ عَلَيْهِ وَمَا رَبُّكَ بِغَافِلٍ عَمَّا تَعْمَلُونَ﴾</w:t>
       </w:r>
     </w:p>
     <w:p>
@@ -3463,7 +3874,19 @@
           <w:szCs w:val="24"/>
           <w:rtl/>
         </w:rPr>
-        <w:t xml:space="preserve">عند الدخول على أي شخص لقضاء حاجتك (7 مرات): ﴿فَإِن تَوَلَّوْا فَقُلْ حَسْبِيَ اللَّهُ لَا إِلَٰهَ إِلَّا هُوَ عَلَيْهِ تَوَكَّلْتُ وَهُوَ رَبُّ الْعَرْشِ الْعَظِيمِ﴾</w:t>
+        <w:t xml:space="preserve">عند الدخول على أي شخص لقضاء حاجتك (7 مرات): </w:t>
+      </w:r>
+      <w:r>
+        <w:rPr>
+          <w:rFonts w:ascii="Times New Roman" w:cs="Times New Roman" w:eastAsia="Times New Roman" w:hAnsi="Times New Roman"/>
+          <w:b/>
+          <w:bCs/>
+          <w:color w:val="B23A2E"/>
+          <w:sz w:val="24"/>
+          <w:szCs w:val="24"/>
+          <w:rtl/>
+        </w:rPr>
+        <w:t xml:space="preserve">﴿فَإِن تَوَلَّوْا فَقُلْ حَسْبِيَ اللَّهُ لَا إِلَٰهَ إِلَّا هُوَ عَلَيْهِ تَوَكَّلْتُ وَهُوَ رَبُّ الْعَرْشِ الْعَظِيمِ﴾</w:t>
       </w:r>
     </w:p>
     <w:p>
@@ -3595,11 +4018,23 @@
       <w:r>
         <w:rPr>
           <w:rFonts w:ascii="Times New Roman" w:cs="Times New Roman" w:eastAsia="Times New Roman" w:hAnsi="Times New Roman"/>
-          <w:sz w:val="24"/>
-          <w:szCs w:val="24"/>
-          <w:rtl/>
-        </w:rPr>
-        <w:t xml:space="preserve">﴿عَسَىٰ رَبُّنَا أَن يُبْدِلَنَا خَيْرًا مِّنْهَا إِنَّا إِلَىٰ رَبِّنَا رَاغِبُونَ﴾ — لو ضاع منك شغلانة أو منصب أو فلوس أو أي شيء كنت تحبه، كرر هذه الآية</w:t>
+          <w:b/>
+          <w:bCs/>
+          <w:color w:val="B23A2E"/>
+          <w:sz w:val="24"/>
+          <w:szCs w:val="24"/>
+          <w:rtl/>
+        </w:rPr>
+        <w:t xml:space="preserve">﴿عَسَىٰ رَبُّنَا أَن يُبْدِلَنَا خَيْرًا مِّنْهَا إِنَّا إِلَىٰ رَبِّنَا رَاغِبُونَ﴾</w:t>
+      </w:r>
+      <w:r>
+        <w:rPr>
+          <w:rFonts w:ascii="Times New Roman" w:cs="Times New Roman" w:eastAsia="Times New Roman" w:hAnsi="Times New Roman"/>
+          <w:sz w:val="24"/>
+          <w:szCs w:val="24"/>
+          <w:rtl/>
+        </w:rPr>
+        <w:t xml:space="preserve"> — لو ضاع منك شغلانة أو منصب أو فلوس أو أي شيء كنت تحبه، كرر هذه الآية</w:t>
       </w:r>
     </w:p>
     <w:p>
@@ -3633,7 +4068,28 @@
           <w:szCs w:val="24"/>
           <w:rtl/>
         </w:rPr>
-        <w:t xml:space="preserve">الدعاء لفك كل الكربات: يوم الجمعة قبل المغرب بساعة، على وضوء ومتجهًا للقبلة في مكان تختلي فيه بنفسك: استغفار «أستغفر الله العظيم الذي لا إله إلا هو الحي القيوم وأتوب إليه» (100 مرة)، «اللهم صلِّ وسلم وبارك على سيدنا محمد صلاة تُفرّج بها الهم وتُزيح بها الغم وتُسدّد بها الدين وتُحقق بها الآمال» (100 مرة)، ثم تُردد حتى أذان المغرب: ﴿إِذْ أَوَى الْفِتْيَةُ إِلَى الْكَهْفِ فَقَالُوا رَبَّنَا آتِنَا مِن لَّدُنكَ رَحْمَةً وَهَيِّئْ لَنَا مِنْ أَمْرِنَا رَشَدًا﴾، ثم تردد الأذان مع المؤذن، ثم تصلي المغرب وتدعو في السجود الأخير بما تريد</w:t>
+        <w:t xml:space="preserve">الدعاء لفك كل الكربات: يوم الجمعة قبل المغرب بساعة، على وضوء ومتجهًا للقبلة في مكان تختلي فيه بنفسك: استغفار «أستغفر الله العظيم الذي لا إله إلا هو الحي القيوم وأتوب إليه» (100 مرة)، «اللهم صلِّ وسلم وبارك على سيدنا محمد صلاة تُفرّج بها الهم وتُزيح بها الغم وتُسدّد بها الدين وتُحقق بها الآمال» (100 مرة)، ثم تُردد حتى أذان المغرب: </w:t>
+      </w:r>
+      <w:r>
+        <w:rPr>
+          <w:rFonts w:ascii="Times New Roman" w:cs="Times New Roman" w:eastAsia="Times New Roman" w:hAnsi="Times New Roman"/>
+          <w:b/>
+          <w:bCs/>
+          <w:color w:val="B23A2E"/>
+          <w:sz w:val="24"/>
+          <w:szCs w:val="24"/>
+          <w:rtl/>
+        </w:rPr>
+        <w:t xml:space="preserve">﴿إِذْ أَوَى الْفِتْيَةُ إِلَى الْكَهْفِ فَقَالُوا رَبَّنَا آتِنَا مِن لَّدُنكَ رَحْمَةً وَهَيِّئْ لَنَا مِنْ أَمْرِنَا رَشَدًا﴾</w:t>
+      </w:r>
+      <w:r>
+        <w:rPr>
+          <w:rFonts w:ascii="Times New Roman" w:cs="Times New Roman" w:eastAsia="Times New Roman" w:hAnsi="Times New Roman"/>
+          <w:sz w:val="24"/>
+          <w:szCs w:val="24"/>
+          <w:rtl/>
+        </w:rPr>
+        <w:t xml:space="preserve">، ثم تردد الأذان مع المؤذن، ثم تصلي المغرب وتدعو في السجود الأخير بما تريد</w:t>
       </w:r>
     </w:p>
     <w:p>
@@ -3731,6 +4187,9 @@
       <w:r>
         <w:rPr>
           <w:rFonts w:ascii="Times New Roman" w:cs="Times New Roman" w:eastAsia="Times New Roman" w:hAnsi="Times New Roman"/>
+          <w:b/>
+          <w:bCs/>
+          <w:color w:val="B23A2E"/>
           <w:sz w:val="24"/>
           <w:szCs w:val="24"/>
           <w:rtl/>
@@ -4337,7 +4796,145 @@
           <w:szCs w:val="24"/>
           <w:rtl/>
         </w:rPr>
-        <w:t xml:space="preserve">آيات رد كيد الكائدين: ﴿فَسَيَكْفِيكَهُمُ اللَّهُ وَهُوَ السَّمِيعُ الْعَلِيمُ﴾، ﴿أَلَيْسَ اللَّهُ بِكَافٍ عَبْدَهُ﴾، ﴿وَأُفَوِّضُ أَمْرِي إِلَى اللَّهِ إِنَّ اللَّهَ بَصِيرٌ بِالْعِبَادِ﴾، ﴿فَوَقَاهُ اللَّهُ سَيِّئَاتِ مَا مَكَرُوا﴾، ﴿وَجَعَلْنَا مِن بَيْنِ أَيْدِيهِمْ سَدًّا وَمِنْ خَلْفِهِمْ سَدًّا فَأَغْشَيْنَاهُمْ فَهُمْ لَا يُبْصِرُونَ﴾، ﴿وَيَمْكُرُونَ وَيَمْكُرُ اللَّهُ وَاللَّهُ خَيْرُ الْمَاكِرِينَ﴾، ﴿وَاللَّهُ مِن وَرَائِهِم مُّحِيطٌ﴾</w:t>
+        <w:t xml:space="preserve">آيات رد كيد الكائدين: </w:t>
+      </w:r>
+      <w:r>
+        <w:rPr>
+          <w:rFonts w:ascii="Times New Roman" w:cs="Times New Roman" w:eastAsia="Times New Roman" w:hAnsi="Times New Roman"/>
+          <w:b/>
+          <w:bCs/>
+          <w:color w:val="B23A2E"/>
+          <w:sz w:val="24"/>
+          <w:szCs w:val="24"/>
+          <w:rtl/>
+        </w:rPr>
+        <w:t xml:space="preserve">﴿فَسَيَكْفِيكَهُمُ اللَّهُ وَهُوَ السَّمِيعُ الْعَلِيمُ﴾</w:t>
+      </w:r>
+      <w:r>
+        <w:rPr>
+          <w:rFonts w:ascii="Times New Roman" w:cs="Times New Roman" w:eastAsia="Times New Roman" w:hAnsi="Times New Roman"/>
+          <w:sz w:val="24"/>
+          <w:szCs w:val="24"/>
+          <w:rtl/>
+        </w:rPr>
+        <w:t xml:space="preserve">، </w:t>
+      </w:r>
+      <w:r>
+        <w:rPr>
+          <w:rFonts w:ascii="Times New Roman" w:cs="Times New Roman" w:eastAsia="Times New Roman" w:hAnsi="Times New Roman"/>
+          <w:b/>
+          <w:bCs/>
+          <w:color w:val="B23A2E"/>
+          <w:sz w:val="24"/>
+          <w:szCs w:val="24"/>
+          <w:rtl/>
+        </w:rPr>
+        <w:t xml:space="preserve">﴿أَلَيْسَ اللَّهُ بِكَافٍ عَبْدَهُ﴾</w:t>
+      </w:r>
+      <w:r>
+        <w:rPr>
+          <w:rFonts w:ascii="Times New Roman" w:cs="Times New Roman" w:eastAsia="Times New Roman" w:hAnsi="Times New Roman"/>
+          <w:sz w:val="24"/>
+          <w:szCs w:val="24"/>
+          <w:rtl/>
+        </w:rPr>
+        <w:t xml:space="preserve">، </w:t>
+      </w:r>
+      <w:r>
+        <w:rPr>
+          <w:rFonts w:ascii="Times New Roman" w:cs="Times New Roman" w:eastAsia="Times New Roman" w:hAnsi="Times New Roman"/>
+          <w:b/>
+          <w:bCs/>
+          <w:color w:val="B23A2E"/>
+          <w:sz w:val="24"/>
+          <w:szCs w:val="24"/>
+          <w:rtl/>
+        </w:rPr>
+        <w:t xml:space="preserve">﴿وَأُفَوِّضُ أَمْرِي إِلَى اللَّهِ إِنَّ اللَّهَ بَصِيرٌ بِالْعِبَادِ﴾</w:t>
+      </w:r>
+      <w:r>
+        <w:rPr>
+          <w:rFonts w:ascii="Times New Roman" w:cs="Times New Roman" w:eastAsia="Times New Roman" w:hAnsi="Times New Roman"/>
+          <w:sz w:val="24"/>
+          <w:szCs w:val="24"/>
+          <w:rtl/>
+        </w:rPr>
+        <w:t xml:space="preserve">، </w:t>
+      </w:r>
+      <w:r>
+        <w:rPr>
+          <w:rFonts w:ascii="Times New Roman" w:cs="Times New Roman" w:eastAsia="Times New Roman" w:hAnsi="Times New Roman"/>
+          <w:b/>
+          <w:bCs/>
+          <w:color w:val="B23A2E"/>
+          <w:sz w:val="24"/>
+          <w:szCs w:val="24"/>
+          <w:rtl/>
+        </w:rPr>
+        <w:t xml:space="preserve">﴿فَوَقَاهُ اللَّهُ سَيِّئَاتِ مَا مَكَرُوا﴾</w:t>
+      </w:r>
+      <w:r>
+        <w:rPr>
+          <w:rFonts w:ascii="Times New Roman" w:cs="Times New Roman" w:eastAsia="Times New Roman" w:hAnsi="Times New Roman"/>
+          <w:sz w:val="24"/>
+          <w:szCs w:val="24"/>
+          <w:rtl/>
+        </w:rPr>
+        <w:t xml:space="preserve">، </w:t>
+      </w:r>
+      <w:r>
+        <w:rPr>
+          <w:rFonts w:ascii="Times New Roman" w:cs="Times New Roman" w:eastAsia="Times New Roman" w:hAnsi="Times New Roman"/>
+          <w:b/>
+          <w:bCs/>
+          <w:color w:val="B23A2E"/>
+          <w:sz w:val="24"/>
+          <w:szCs w:val="24"/>
+          <w:rtl/>
+        </w:rPr>
+        <w:t xml:space="preserve">﴿وَجَعَلْنَا مِن بَيْنِ أَيْدِيهِمْ سَدًّا وَمِنْ خَلْفِهِمْ سَدًّا فَأَغْشَيْنَاهُمْ فَهُمْ لَا يُبْصِرُونَ﴾</w:t>
+      </w:r>
+      <w:r>
+        <w:rPr>
+          <w:rFonts w:ascii="Times New Roman" w:cs="Times New Roman" w:eastAsia="Times New Roman" w:hAnsi="Times New Roman"/>
+          <w:sz w:val="24"/>
+          <w:szCs w:val="24"/>
+          <w:rtl/>
+        </w:rPr>
+        <w:t xml:space="preserve">، </w:t>
+      </w:r>
+      <w:r>
+        <w:rPr>
+          <w:rFonts w:ascii="Times New Roman" w:cs="Times New Roman" w:eastAsia="Times New Roman" w:hAnsi="Times New Roman"/>
+          <w:b/>
+          <w:bCs/>
+          <w:color w:val="B23A2E"/>
+          <w:sz w:val="24"/>
+          <w:szCs w:val="24"/>
+          <w:rtl/>
+        </w:rPr>
+        <w:t xml:space="preserve">﴿وَيَمْكُرُونَ وَيَمْكُرُ اللَّهُ وَاللَّهُ خَيْرُ الْمَاكِرِينَ﴾</w:t>
+      </w:r>
+      <w:r>
+        <w:rPr>
+          <w:rFonts w:ascii="Times New Roman" w:cs="Times New Roman" w:eastAsia="Times New Roman" w:hAnsi="Times New Roman"/>
+          <w:sz w:val="24"/>
+          <w:szCs w:val="24"/>
+          <w:rtl/>
+        </w:rPr>
+        <w:t xml:space="preserve">، </w:t>
+      </w:r>
+      <w:r>
+        <w:rPr>
+          <w:rFonts w:ascii="Times New Roman" w:cs="Times New Roman" w:eastAsia="Times New Roman" w:hAnsi="Times New Roman"/>
+          <w:b/>
+          <w:bCs/>
+          <w:color w:val="B23A2E"/>
+          <w:sz w:val="24"/>
+          <w:szCs w:val="24"/>
+          <w:rtl/>
+        </w:rPr>
+        <w:t xml:space="preserve">﴿وَاللَّهُ مِن وَرَائِهِم مُّحِيطٌ﴾</w:t>
       </w:r>
     </w:p>
     <w:p>
@@ -4429,7 +5026,28 @@
           <w:szCs w:val="24"/>
           <w:rtl/>
         </w:rPr>
-        <w:t xml:space="preserve">ورد متداول لعقد لسان الشخص المؤذي: «كهيعص: كفايتنا. حم عسق: حمايتنا. ﴿فَسَيَكْفِيكَهُمُ اللَّهُ﴾» (×3) «وهو السميع العليم، ولا حول ولا قوة إلا بالله العلي العظيم. اللهم آمين، يا رب العالمين» — يُكرر 7 مرات</w:t>
+        <w:t xml:space="preserve">ورد متداول لعقد لسان الشخص المؤذي: «كهيعص: كفايتنا. حم عسق: حمايتنا. </w:t>
+      </w:r>
+      <w:r>
+        <w:rPr>
+          <w:rFonts w:ascii="Times New Roman" w:cs="Times New Roman" w:eastAsia="Times New Roman" w:hAnsi="Times New Roman"/>
+          <w:b/>
+          <w:bCs/>
+          <w:color w:val="B23A2E"/>
+          <w:sz w:val="24"/>
+          <w:szCs w:val="24"/>
+          <w:rtl/>
+        </w:rPr>
+        <w:t xml:space="preserve">﴿فَسَيَكْفِيكَهُمُ اللَّهُ﴾</w:t>
+      </w:r>
+      <w:r>
+        <w:rPr>
+          <w:rFonts w:ascii="Times New Roman" w:cs="Times New Roman" w:eastAsia="Times New Roman" w:hAnsi="Times New Roman"/>
+          <w:sz w:val="24"/>
+          <w:szCs w:val="24"/>
+          <w:rtl/>
+        </w:rPr>
+        <w:t xml:space="preserve">» (×3) «وهو السميع العليم، ولا حول ولا قوة إلا بالله العلي العظيم. اللهم آمين، يا رب العالمين» — يُكرر 7 مرات</w:t>
       </w:r>
     </w:p>
     <w:p>
@@ -4667,7 +5285,40 @@
           <w:szCs w:val="24"/>
           <w:rtl/>
         </w:rPr>
-        <w:t xml:space="preserve">لإبطال السحر (7 مرات): ﴿مَا جِئْتُم بِهِ السِّحْرُ إِنَّ اللَّهَ سَيُبْطِلُهُ إِنَّ اللَّهَ لَا يُصْلِحُ عَمَلَ الْمُفْسِدِينَ﴾ و﴿وَيُحِقُّ اللَّهُ الْحَقَّ بِكَلِمَاتِهِ وَلَوْ كَرِهَ الْمُجْرِمُونَ﴾</w:t>
+        <w:t xml:space="preserve">لإبطال السحر (7 مرات): </w:t>
+      </w:r>
+      <w:r>
+        <w:rPr>
+          <w:rFonts w:ascii="Times New Roman" w:cs="Times New Roman" w:eastAsia="Times New Roman" w:hAnsi="Times New Roman"/>
+          <w:b/>
+          <w:bCs/>
+          <w:color w:val="B23A2E"/>
+          <w:sz w:val="24"/>
+          <w:szCs w:val="24"/>
+          <w:rtl/>
+        </w:rPr>
+        <w:t xml:space="preserve">﴿مَا جِئْتُم بِهِ السِّحْرُ إِنَّ اللَّهَ سَيُبْطِلُهُ إِنَّ اللَّهَ لَا يُصْلِحُ عَمَلَ الْمُفْسِدِينَ﴾</w:t>
+      </w:r>
+      <w:r>
+        <w:rPr>
+          <w:rFonts w:ascii="Times New Roman" w:cs="Times New Roman" w:eastAsia="Times New Roman" w:hAnsi="Times New Roman"/>
+          <w:sz w:val="24"/>
+          <w:szCs w:val="24"/>
+          <w:rtl/>
+        </w:rPr>
+        <w:t xml:space="preserve"> و</w:t>
+      </w:r>
+      <w:r>
+        <w:rPr>
+          <w:rFonts w:ascii="Times New Roman" w:cs="Times New Roman" w:eastAsia="Times New Roman" w:hAnsi="Times New Roman"/>
+          <w:b/>
+          <w:bCs/>
+          <w:color w:val="B23A2E"/>
+          <w:sz w:val="24"/>
+          <w:szCs w:val="24"/>
+          <w:rtl/>
+        </w:rPr>
+        <w:t xml:space="preserve">﴿وَيُحِقُّ اللَّهُ الْحَقَّ بِكَلِمَاتِهِ وَلَوْ كَرِهَ الْمُجْرِمُونَ﴾</w:t>
       </w:r>
     </w:p>
     <w:p>
@@ -4701,7 +5352,19 @@
           <w:szCs w:val="24"/>
           <w:rtl/>
         </w:rPr>
-        <w:t xml:space="preserve">للوقاية من الحسد: ﴿وَجَعَلَنِي مُبَارَكًا أَيْنَ مَا كُنتُ وَأَوْصَانِي بِالصَّلَاةِ وَالزَّكَاةِ مَا دُمْتُ حَيًّا﴾</w:t>
+        <w:t xml:space="preserve">للوقاية من الحسد: </w:t>
+      </w:r>
+      <w:r>
+        <w:rPr>
+          <w:rFonts w:ascii="Times New Roman" w:cs="Times New Roman" w:eastAsia="Times New Roman" w:hAnsi="Times New Roman"/>
+          <w:b/>
+          <w:bCs/>
+          <w:color w:val="B23A2E"/>
+          <w:sz w:val="24"/>
+          <w:szCs w:val="24"/>
+          <w:rtl/>
+        </w:rPr>
+        <w:t xml:space="preserve">﴿وَجَعَلَنِي مُبَارَكًا أَيْنَ مَا كُنتُ وَأَوْصَانِي بِالصَّلَاةِ وَالزَّكَاةِ مَا دُمْتُ حَيًّا﴾</w:t>
       </w:r>
     </w:p>
     <w:p>
@@ -4803,7 +5466,49 @@
           <w:szCs w:val="24"/>
           <w:rtl/>
         </w:rPr>
-        <w:t xml:space="preserve">ورد شامل للحماية: «بسم الله، بسم الله وبالله، بسم الله خير الأسماء، بسم الله رب الأرض والسماء، بسم الله الذي لا يضر مع اسمه شيء في الأرض ولا في السماء، بسم الله افتتحت وبالله ختمت وبه آمنت، بسم الله أصبحت وعلى الله توكلت، بسم الله على قلبي ونفسي، بسم الله على عقلي وذهني، بسم الله على أهلي ومالي، بسم الله على ما أعطاني ربي، بسم الله الشافي، بسم الله المعافي، بسم الله الوافي، بسم الله الذي لا يضر مع اسمه شيء في الأرض ولا السماء وهو السميع العليم، هو الله الله الله الله الله ربي لا أشرك به شيئًا، الله أكبر الله أكبر الله أكبر الله أكبر، وأعزّ وأجل مما أخاف وأحذر، أسألك اللهم بخيرك من خيرك الذي لا يُعطيه غيرك، عزّ جارك وجلّ ثناؤك ولا إله غيرك. اللهم إني أعوذ بك من شر نفسي، ومن شر كل سلطان، ومن شر كل شيطان مريد، ومن شر كل جبار عنيد، ومن شر كل قضاء سوء، ومن شر كل دابة أنت آخذ بناصيتها، إن ربي على صراط مستقيم وأنت على كل شيء حفيظ، إن ولي الله الذي نزل الكتاب وهو يتولى الصالحين. اللهم إني أستجيرك وأحتجب بك من كل شيء خلقته، وأحترس بك من جميع خلقك وكل ما ذرأت وبرأت، وأفوّض أمري إليك، وأقدّم بين يدي في يومي هذا وليلتي هذه وساعتي هذه وشهري هذا. بسم الله الرحمن الرحيم ﴿قُلْ هُوَ اللَّهُ أَحَدٌ اللَّهُ الصَّمَدُ لَمْ يَلِدْ وَلَمْ يُولَدْ وَلَمْ يَكُن لَّهُ كُفُوًا أَحَدٌ﴾ عن أمامي، ومن فوقي، وعن يميني، وعن شمالي، (تُكرر أربع مرات لكل جهة)، ثم آية الكرسي كاملة، ثم آخر آية آل عمران: ﴿شَهِدَ اللَّهُ أَنَّهُ لَا إِلَٰهَ إِلَّا هُوَ وَالْمَلَائِكَةُ وَأُولُو الْعِلْمِ قَائِمًا بِالْقِسْطِ﴾ إلى آخرها (7 مرات)»</w:t>
+        <w:t xml:space="preserve">ورد شامل للحماية: «بسم الله، بسم الله وبالله، بسم الله خير الأسماء، بسم الله رب الأرض والسماء، بسم الله الذي لا يضر مع اسمه شيء في الأرض ولا في السماء، بسم الله افتتحت وبالله ختمت وبه آمنت، بسم الله أصبحت وعلى الله توكلت، بسم الله على قلبي ونفسي، بسم الله على عقلي وذهني، بسم الله على أهلي ومالي، بسم الله على ما أعطاني ربي، بسم الله الشافي، بسم الله المعافي، بسم الله الوافي، بسم الله الذي لا يضر مع اسمه شيء في الأرض ولا السماء وهو السميع العليم، هو الله الله الله الله الله ربي لا أشرك به شيئًا، الله أكبر الله أكبر الله أكبر الله أكبر، وأعزّ وأجل مما أخاف وأحذر، أسألك اللهم بخيرك من خيرك الذي لا يُعطيه غيرك، عزّ جارك وجلّ ثناؤك ولا إله غيرك. اللهم إني أعوذ بك من شر نفسي، ومن شر كل سلطان، ومن شر كل شيطان مريد، ومن شر كل جبار عنيد، ومن شر كل قضاء سوء، ومن شر كل دابة أنت آخذ بناصيتها، إن ربي على صراط مستقيم وأنت على كل شيء حفيظ، إن ولي الله الذي نزل الكتاب وهو يتولى الصالحين. اللهم إني أستجيرك وأحتجب بك من كل شيء خلقته، وأحترس بك من جميع خلقك وكل ما ذرأت وبرأت، وأفوّض أمري إليك، وأقدّم بين يدي في يومي هذا وليلتي هذه وساعتي هذه وشهري هذا. بسم الله الرحمن الرحيم </w:t>
+      </w:r>
+      <w:r>
+        <w:rPr>
+          <w:rFonts w:ascii="Times New Roman" w:cs="Times New Roman" w:eastAsia="Times New Roman" w:hAnsi="Times New Roman"/>
+          <w:b/>
+          <w:bCs/>
+          <w:color w:val="B23A2E"/>
+          <w:sz w:val="24"/>
+          <w:szCs w:val="24"/>
+          <w:rtl/>
+        </w:rPr>
+        <w:t xml:space="preserve">﴿قُلْ هُوَ اللَّهُ أَحَدٌ اللَّهُ الصَّمَدُ لَمْ يَلِدْ وَلَمْ يُولَدْ وَلَمْ يَكُن لَّهُ كُفُوًا أَحَدٌ﴾</w:t>
+      </w:r>
+      <w:r>
+        <w:rPr>
+          <w:rFonts w:ascii="Times New Roman" w:cs="Times New Roman" w:eastAsia="Times New Roman" w:hAnsi="Times New Roman"/>
+          <w:sz w:val="24"/>
+          <w:szCs w:val="24"/>
+          <w:rtl/>
+        </w:rPr>
+        <w:t xml:space="preserve"> عن أمامي، ومن فوقي، وعن يميني، وعن شمالي، (تُكرر أربع مرات لكل جهة)، ثم آية الكرسي كاملة، ثم آخر آية آل عمران: </w:t>
+      </w:r>
+      <w:r>
+        <w:rPr>
+          <w:rFonts w:ascii="Times New Roman" w:cs="Times New Roman" w:eastAsia="Times New Roman" w:hAnsi="Times New Roman"/>
+          <w:b/>
+          <w:bCs/>
+          <w:color w:val="B23A2E"/>
+          <w:sz w:val="24"/>
+          <w:szCs w:val="24"/>
+          <w:rtl/>
+        </w:rPr>
+        <w:t xml:space="preserve">﴿شَهِدَ اللَّهُ أَنَّهُ لَا إِلَٰهَ إِلَّا هُوَ وَالْمَلَائِكَةُ وَأُولُو الْعِلْمِ قَائِمًا بِالْقِسْطِ﴾</w:t>
+      </w:r>
+      <w:r>
+        <w:rPr>
+          <w:rFonts w:ascii="Times New Roman" w:cs="Times New Roman" w:eastAsia="Times New Roman" w:hAnsi="Times New Roman"/>
+          <w:sz w:val="24"/>
+          <w:szCs w:val="24"/>
+          <w:rtl/>
+        </w:rPr>
+        <w:t xml:space="preserve"> إلى آخرها (7 مرات)»</w:t>
       </w:r>
     </w:p>
     <w:p>
@@ -4837,7 +5542,19 @@
           <w:szCs w:val="24"/>
           <w:rtl/>
         </w:rPr>
-        <w:t xml:space="preserve">تُقرأ 7 مرات إذا خفت من أحد: ﴿وَأُفَوِّضُ أَمْرِي إِلَى اللَّهِ إِنَّ اللَّهَ بَصِيرٌ بِالْعِبَادِ﴾</w:t>
+        <w:t xml:space="preserve">تُقرأ 7 مرات إذا خفت من أحد: </w:t>
+      </w:r>
+      <w:r>
+        <w:rPr>
+          <w:rFonts w:ascii="Times New Roman" w:cs="Times New Roman" w:eastAsia="Times New Roman" w:hAnsi="Times New Roman"/>
+          <w:b/>
+          <w:bCs/>
+          <w:color w:val="B23A2E"/>
+          <w:sz w:val="24"/>
+          <w:szCs w:val="24"/>
+          <w:rtl/>
+        </w:rPr>
+        <w:t xml:space="preserve">﴿وَأُفَوِّضُ أَمْرِي إِلَى اللَّهِ إِنَّ اللَّهَ بَصِيرٌ بِالْعِبَادِ﴾</w:t>
       </w:r>
     </w:p>
     <w:p>
@@ -4871,7 +5588,28 @@
           <w:szCs w:val="24"/>
           <w:rtl/>
         </w:rPr>
-        <w:t xml:space="preserve">لإخراج جميع العيون الملتصقة في الجسم، وللعصمة من السحر والعين: ﴿وَإِن يَكَادُ الَّذِينَ كَفَرُوا لَيُزْلِقُونَكَ بِأَبْصَارِهِمْ لَمَّا سَمِعُوا الذِّكْرَ وَيَقُولُونَ إِنَّهُ لَمَجْنُونٌ وَمَا هُوَ إِلَّا ذِكْرٌ لِّلْعَالَمِينَ﴾ — تُقرأ 70 مرة على ماء، ويُشرب منه مع وضع اليد على مكان الوجع</w:t>
+        <w:t xml:space="preserve">لإخراج جميع العيون الملتصقة في الجسم، وللعصمة من السحر والعين: </w:t>
+      </w:r>
+      <w:r>
+        <w:rPr>
+          <w:rFonts w:ascii="Times New Roman" w:cs="Times New Roman" w:eastAsia="Times New Roman" w:hAnsi="Times New Roman"/>
+          <w:b/>
+          <w:bCs/>
+          <w:color w:val="B23A2E"/>
+          <w:sz w:val="24"/>
+          <w:szCs w:val="24"/>
+          <w:rtl/>
+        </w:rPr>
+        <w:t xml:space="preserve">﴿وَإِن يَكَادُ الَّذِينَ كَفَرُوا لَيُزْلِقُونَكَ بِأَبْصَارِهِمْ لَمَّا سَمِعُوا الذِّكْرَ وَيَقُولُونَ إِنَّهُ لَمَجْنُونٌ وَمَا هُوَ إِلَّا ذِكْرٌ لِّلْعَالَمِينَ﴾</w:t>
+      </w:r>
+      <w:r>
+        <w:rPr>
+          <w:rFonts w:ascii="Times New Roman" w:cs="Times New Roman" w:eastAsia="Times New Roman" w:hAnsi="Times New Roman"/>
+          <w:sz w:val="24"/>
+          <w:szCs w:val="24"/>
+          <w:rtl/>
+        </w:rPr>
+        <w:t xml:space="preserve"> — تُقرأ 70 مرة على ماء، ويُشرب منه مع وضع اليد على مكان الوجع</w:t>
       </w:r>
     </w:p>
     <w:p>
@@ -4901,11 +5639,23 @@
       <w:r>
         <w:rPr>
           <w:rFonts w:ascii="Times New Roman" w:cs="Times New Roman" w:eastAsia="Times New Roman" w:hAnsi="Times New Roman"/>
-          <w:sz w:val="24"/>
-          <w:szCs w:val="24"/>
-          <w:rtl/>
-        </w:rPr>
-        <w:t xml:space="preserve">﴿وَقَدِمْنَا إِلَىٰ مَا عَمِلُوا مِنْ عَمَلٍ فَجَعَلْنَاهُ هَبَاءً مَّنثُورًا﴾ تُقرأ على ماء 137 مرة لمدة 11 يومًا</w:t>
+          <w:b/>
+          <w:bCs/>
+          <w:color w:val="B23A2E"/>
+          <w:sz w:val="24"/>
+          <w:szCs w:val="24"/>
+          <w:rtl/>
+        </w:rPr>
+        <w:t xml:space="preserve">﴿وَقَدِمْنَا إِلَىٰ مَا عَمِلُوا مِنْ عَمَلٍ فَجَعَلْنَاهُ هَبَاءً مَّنثُورًا﴾</w:t>
+      </w:r>
+      <w:r>
+        <w:rPr>
+          <w:rFonts w:ascii="Times New Roman" w:cs="Times New Roman" w:eastAsia="Times New Roman" w:hAnsi="Times New Roman"/>
+          <w:sz w:val="24"/>
+          <w:szCs w:val="24"/>
+          <w:rtl/>
+        </w:rPr>
+        <w:t xml:space="preserve"> تُقرأ على ماء 137 مرة لمدة 11 يومًا</w:t>
       </w:r>
     </w:p>
     <w:p>
@@ -5075,7 +5825,40 @@
           <w:szCs w:val="24"/>
           <w:rtl/>
         </w:rPr>
-        <w:t xml:space="preserve">للأمن من الحرق والغرق: ﴿اللَّهُ الَّذِي نَزَّلَ الْكِتَابَ وَهُوَ يَتَوَلَّى الصَّالِحِينَ﴾ إلى ﴿وَالسَّمَاوَاتُ مَطْوِيَّاتٌ بِيَمِينِهِ سُبْحَانَهُ وَتَعَالَىٰ عَمَّا يُشْرِكُونَ﴾</w:t>
+        <w:t xml:space="preserve">للأمن من الحرق والغرق: </w:t>
+      </w:r>
+      <w:r>
+        <w:rPr>
+          <w:rFonts w:ascii="Times New Roman" w:cs="Times New Roman" w:eastAsia="Times New Roman" w:hAnsi="Times New Roman"/>
+          <w:b/>
+          <w:bCs/>
+          <w:color w:val="B23A2E"/>
+          <w:sz w:val="24"/>
+          <w:szCs w:val="24"/>
+          <w:rtl/>
+        </w:rPr>
+        <w:t xml:space="preserve">﴿اللَّهُ الَّذِي نَزَّلَ الْكِتَابَ وَهُوَ يَتَوَلَّى الصَّالِحِينَ﴾</w:t>
+      </w:r>
+      <w:r>
+        <w:rPr>
+          <w:rFonts w:ascii="Times New Roman" w:cs="Times New Roman" w:eastAsia="Times New Roman" w:hAnsi="Times New Roman"/>
+          <w:sz w:val="24"/>
+          <w:szCs w:val="24"/>
+          <w:rtl/>
+        </w:rPr>
+        <w:t xml:space="preserve"> إلى </w:t>
+      </w:r>
+      <w:r>
+        <w:rPr>
+          <w:rFonts w:ascii="Times New Roman" w:cs="Times New Roman" w:eastAsia="Times New Roman" w:hAnsi="Times New Roman"/>
+          <w:b/>
+          <w:bCs/>
+          <w:color w:val="B23A2E"/>
+          <w:sz w:val="24"/>
+          <w:szCs w:val="24"/>
+          <w:rtl/>
+        </w:rPr>
+        <w:t xml:space="preserve">﴿وَالسَّمَاوَاتُ مَطْوِيَّاتٌ بِيَمِينِهِ سُبْحَانَهُ وَتَعَالَىٰ عَمَّا يُشْرِكُونَ﴾</w:t>
       </w:r>
     </w:p>
     <w:p>
@@ -5211,7 +5994,19 @@
           <w:szCs w:val="24"/>
           <w:rtl/>
         </w:rPr>
-        <w:t xml:space="preserve">عند الغروب: تُهلّل وتستعيذ بالله، ثم تضع يدك على رأسك وتُمرّها على وجهك وتأخذ لحيتك بيدك وتقول: «أحطت على نفسي وأهلي ومالي وولدي، من غائب وشاهد، بالله الذي لا إله إلا هو، عالم الغيب والشهادة، الرحمن الرحيم، الحي القيوم لا تأخذه سنة ولا نوم» ثم تقرأ آية الكرسي إلى ﴿الْعَلِيُّ الْعَظِيمُ﴾</w:t>
+        <w:t xml:space="preserve">عند الغروب: تُهلّل وتستعيذ بالله، ثم تضع يدك على رأسك وتُمرّها على وجهك وتأخذ لحيتك بيدك وتقول: «أحطت على نفسي وأهلي ومالي وولدي، من غائب وشاهد، بالله الذي لا إله إلا هو، عالم الغيب والشهادة، الرحمن الرحيم، الحي القيوم لا تأخذه سنة ولا نوم» ثم تقرأ آية الكرسي إلى </w:t>
+      </w:r>
+      <w:r>
+        <w:rPr>
+          <w:rFonts w:ascii="Times New Roman" w:cs="Times New Roman" w:eastAsia="Times New Roman" w:hAnsi="Times New Roman"/>
+          <w:b/>
+          <w:bCs/>
+          <w:color w:val="B23A2E"/>
+          <w:sz w:val="24"/>
+          <w:szCs w:val="24"/>
+          <w:rtl/>
+        </w:rPr>
+        <w:t xml:space="preserve">﴿الْعَلِيُّ الْعَظِيمُ﴾</w:t>
       </w:r>
     </w:p>
     <w:p>
@@ -5245,7 +6040,19 @@
           <w:szCs w:val="24"/>
           <w:rtl/>
         </w:rPr>
-        <w:t xml:space="preserve">إذا كنت تخشى انهيار الدار أو المكان الذي تنام فيه، فاقرأ: ﴿إِنَّ اللَّهَ يُمْسِكُ السَّمَاوَاتِ وَالْأَرْضَ أَن تَزُولَا وَلَئِن زَالَتَا إِنْ أَمْسَكَهُمَا مِنْ أَحَدٍ مِّن بَعْدِهِ إِنَّهُ كَانَ حَلِيمًا غَفُورًا﴾</w:t>
+        <w:t xml:space="preserve">إذا كنت تخشى انهيار الدار أو المكان الذي تنام فيه، فاقرأ: </w:t>
+      </w:r>
+      <w:r>
+        <w:rPr>
+          <w:rFonts w:ascii="Times New Roman" w:cs="Times New Roman" w:eastAsia="Times New Roman" w:hAnsi="Times New Roman"/>
+          <w:b/>
+          <w:bCs/>
+          <w:color w:val="B23A2E"/>
+          <w:sz w:val="24"/>
+          <w:szCs w:val="24"/>
+          <w:rtl/>
+        </w:rPr>
+        <w:t xml:space="preserve">﴿إِنَّ اللَّهَ يُمْسِكُ السَّمَاوَاتِ وَالْأَرْضَ أَن تَزُولَا وَلَئِن زَالَتَا إِنْ أَمْسَكَهُمَا مِنْ أَحَدٍ مِّن بَعْدِهِ إِنَّهُ كَانَ حَلِيمًا غَفُورًا﴾</w:t>
       </w:r>
     </w:p>
     <w:p>
@@ -5503,11 +6310,23 @@
       <w:r>
         <w:rPr>
           <w:rFonts w:ascii="Times New Roman" w:cs="Times New Roman" w:eastAsia="Times New Roman" w:hAnsi="Times New Roman"/>
-          <w:sz w:val="24"/>
-          <w:szCs w:val="24"/>
-          <w:rtl/>
-        </w:rPr>
-        <w:t xml:space="preserve">«وَلَمَّا دَخَلُوا مِنْ حَيْثُ أَمَرَهُمْ أَبُوهُمْ مَّا كَانَ يُغْنِي عَنْهُم مِّنَ اللَّهِ مِن شَيْءٍ إِلَّا حَاجَةً فِي نَفْسِ يَعْقُوبَ قَضَاهَا، وَإِنَّهُ لَذُو عِلْمٍ لِّمَا عَلَّمْنَاهُ وَلَٰكِنَّ أَكْثَرَ النَّاسِ لَا يَعْلَمُونَ﴾ (سورة يوسف، آية 68) — تُقرأ 7 مرات ثم تُدعى بالحاجة</w:t>
+          <w:b/>
+          <w:bCs/>
+          <w:color w:val="B23A2E"/>
+          <w:sz w:val="24"/>
+          <w:szCs w:val="24"/>
+          <w:rtl/>
+        </w:rPr>
+        <w:t xml:space="preserve">﴿وَلَمَّا دَخَلُوا مِنْ حَيْثُ أَمَرَهُمْ أَبُوهُمْ مَّا كَانَ يُغْنِي عَنْهُم مِّنَ اللَّهِ مِن شَيْءٍ إِلَّا حَاجَةً فِي نَفْسِ يَعْقُوبَ قَضَاهَا، وَإِنَّهُ لَذُو عِلْمٍ لِّمَا عَلَّمْنَاهُ وَلَٰكِنَّ أَكْثَرَ النَّاسِ لَا يَعْلَمُونَ﴾</w:t>
+      </w:r>
+      <w:r>
+        <w:rPr>
+          <w:rFonts w:ascii="Times New Roman" w:cs="Times New Roman" w:eastAsia="Times New Roman" w:hAnsi="Times New Roman"/>
+          <w:sz w:val="24"/>
+          <w:szCs w:val="24"/>
+          <w:rtl/>
+        </w:rPr>
+        <w:t xml:space="preserve"> (سورة يوسف، آية 68) — تُقرأ 7 مرات ثم تُدعى بالحاجة</w:t>
       </w:r>
     </w:p>
     <w:p>
@@ -5541,7 +6360,61 @@
           <w:szCs w:val="24"/>
           <w:rtl/>
         </w:rPr>
-        <w:t xml:space="preserve">ابدأ يومك بهذه الآيات الثلاث: ﴿رَبِّ أَوْزِعْنِي أَنْ أَشْكُرَ نِعْمَتَكَ الَّتِي أَنْعَمْتَ عَلَيَّ وَعَلَىٰ وَالِدَيَّ وَأَنْ أَعْمَلَ صَالِحًا تَرْضَاهُ وَأَصْلِحْ لِي فِي ذُرِّيَّتِي إِنِّي تُبْتُ إِلَيْكَ وَإِنِّي مِنَ الْمُسْلِمِينَ﴾، ﴿رَبَّنَا هَبْ لَنَا مِنْ أَزْوَاجِنَا وَذُرِّيَّاتِنَا قُرَّةَ أَعْيُنٍ وَاجْعَلْنَا لِلْمُتَّقِينَ إِمَامًا﴾، ﴿رَبِّ هَبْ لِي حُكْمًا وَأَلْحِقْنِي بِالصَّالِحِينَ وَاجْعَل لِّي لِسَانَ صِدْقٍ فِي الْآخِرِينَ وَاجْعَلْنِي مِن وَرَثَةِ جَنَّةِ النَّعِيمِ﴾</w:t>
+        <w:t xml:space="preserve">ابدأ يومك بهذه الآيات الثلاث: </w:t>
+      </w:r>
+      <w:r>
+        <w:rPr>
+          <w:rFonts w:ascii="Times New Roman" w:cs="Times New Roman" w:eastAsia="Times New Roman" w:hAnsi="Times New Roman"/>
+          <w:b/>
+          <w:bCs/>
+          <w:color w:val="B23A2E"/>
+          <w:sz w:val="24"/>
+          <w:szCs w:val="24"/>
+          <w:rtl/>
+        </w:rPr>
+        <w:t xml:space="preserve">﴿رَبِّ أَوْزِعْنِي أَنْ أَشْكُرَ نِعْمَتَكَ الَّتِي أَنْعَمْتَ عَلَيَّ وَعَلَىٰ وَالِدَيَّ وَأَنْ أَعْمَلَ صَالِحًا تَرْضَاهُ وَأَصْلِحْ لِي فِي ذُرِّيَّتِي إِنِّي تُبْتُ إِلَيْكَ وَإِنِّي مِنَ الْمُسْلِمِينَ﴾</w:t>
+      </w:r>
+      <w:r>
+        <w:rPr>
+          <w:rFonts w:ascii="Times New Roman" w:cs="Times New Roman" w:eastAsia="Times New Roman" w:hAnsi="Times New Roman"/>
+          <w:sz w:val="24"/>
+          <w:szCs w:val="24"/>
+          <w:rtl/>
+        </w:rPr>
+        <w:t xml:space="preserve">، </w:t>
+      </w:r>
+      <w:r>
+        <w:rPr>
+          <w:rFonts w:ascii="Times New Roman" w:cs="Times New Roman" w:eastAsia="Times New Roman" w:hAnsi="Times New Roman"/>
+          <w:b/>
+          <w:bCs/>
+          <w:color w:val="B23A2E"/>
+          <w:sz w:val="24"/>
+          <w:szCs w:val="24"/>
+          <w:rtl/>
+        </w:rPr>
+        <w:t xml:space="preserve">﴿رَبَّنَا هَبْ لَنَا مِنْ أَزْوَاجِنَا وَذُرِّيَّاتِنَا قُرَّةَ أَعْيُنٍ وَاجْعَلْنَا لِلْمُتَّقِينَ إِمَامًا﴾</w:t>
+      </w:r>
+      <w:r>
+        <w:rPr>
+          <w:rFonts w:ascii="Times New Roman" w:cs="Times New Roman" w:eastAsia="Times New Roman" w:hAnsi="Times New Roman"/>
+          <w:sz w:val="24"/>
+          <w:szCs w:val="24"/>
+          <w:rtl/>
+        </w:rPr>
+        <w:t xml:space="preserve">، </w:t>
+      </w:r>
+      <w:r>
+        <w:rPr>
+          <w:rFonts w:ascii="Times New Roman" w:cs="Times New Roman" w:eastAsia="Times New Roman" w:hAnsi="Times New Roman"/>
+          <w:b/>
+          <w:bCs/>
+          <w:color w:val="B23A2E"/>
+          <w:sz w:val="24"/>
+          <w:szCs w:val="24"/>
+          <w:rtl/>
+        </w:rPr>
+        <w:t xml:space="preserve">﴿رَبِّ هَبْ لِي حُكْمًا وَأَلْحِقْنِي بِالصَّالِحِينَ وَاجْعَل لِّي لِسَانَ صِدْقٍ فِي الْآخِرِينَ وَاجْعَلْنِي مِن وَرَثَةِ جَنَّةِ النَّعِيمِ﴾</w:t>
       </w:r>
     </w:p>
     <w:p>
@@ -5949,7 +6822,145 @@
           <w:szCs w:val="24"/>
           <w:rtl/>
         </w:rPr>
-        <w:t xml:space="preserve">السبع الآيات المنجيات: ﴿قُل لَّن يُصِيبَنَا إِلَّا مَا كَتَبَ اللَّهُ لَنَا هُوَ مَوْلَانَا وَعَلَى اللَّهِ فَلْيَتَوَكَّلِ الْمُؤْمِنُونَ﴾، ﴿وَإِن يَمْسَسْكَ اللَّهُ بِضُرٍّ فَلَا كَاشِفَ لَهُ إِلَّا هُوَ وَإِن يُرِدْكَ بِخَيْرٍ فَلَا رَادَّ لِفَضْلِهِ يُصِيبُ بِهِ مَن يَشَاءُ مِنْ عِبَادِهِ وَهُوَ الْغَفُورُ الرَّحِيمُ﴾، ﴿وَمَا مِن دَابَّةٍ فِي الْأَرْضِ إِلَّا عَلَى اللَّهِ رِزْقُهَا وَيَعْلَمُ مُسْتَقَرَّهَا وَمُسْتَوْدَعَهَا كُلٌّ فِي كِتَابٍ مُّبِينٍ﴾، ﴿إِنِّي تَوَكَّلْتُ عَلَى اللَّهِ رَبِّي وَرَبِّكُم مَّا مِن دَابَّةٍ إِلَّا هُوَ آخِذٌ بِنَاصِيَتِهَا إِنَّ رَبِّي عَلَىٰ صِرَاطٍ مُّسْتَقِيمٍ﴾، ﴿وَكَأَيِّن مِّن دَابَّةٍ لَّا تَحْمِلُ رِزْقَهَا اللَّهُ يَرْزُقُهَا وَإِيَّاكُمْ وَهُوَ السَّمِيعُ الْعَلِيمُ﴾، ﴿مَّا يَفْتَحِ اللَّهُ لِلنَّاسِ مِن رَّحْمَةٍ فَلَا مُمْسِكَ لَهَا وَمَا يُمْسِكْ فَلَا مُرْسِلَ لَهُ مِن بَعْدِهِ وَهُوَ الْعَزِيزُ الْحَكِيمُ﴾، ﴿وَلَئِن سَأَلْتَهُم مَّنْ خَلَقَ السَّمَاوَاتِ وَالْأَرْضَ لَيَقُولُنَّ اللَّهُ قُلْ أَفَرَأَيْتُم مَّا تَدْعُونَ مِن دُونِ اللَّهِ إِنْ أَرَادَنِيَ اللَّهُ بِضُرٍّ هَلْ هُنَّ كَاشِفَاتُ ضُرِّهِ أَوْ أَرَادَنِي بِرَحْمَةٍ هَلْ هُنَّ مُمْسِكَاتُ رَحْمَتِهِ قُلْ حَسْبِيَ اللَّهُ عَلَيْهِ يَتَوَكَّلُ الْمُتَوَكِّلُونَ﴾</w:t>
+        <w:t xml:space="preserve">السبع الآيات المنجيات: </w:t>
+      </w:r>
+      <w:r>
+        <w:rPr>
+          <w:rFonts w:ascii="Times New Roman" w:cs="Times New Roman" w:eastAsia="Times New Roman" w:hAnsi="Times New Roman"/>
+          <w:b/>
+          <w:bCs/>
+          <w:color w:val="B23A2E"/>
+          <w:sz w:val="24"/>
+          <w:szCs w:val="24"/>
+          <w:rtl/>
+        </w:rPr>
+        <w:t xml:space="preserve">﴿قُل لَّن يُصِيبَنَا إِلَّا مَا كَتَبَ اللَّهُ لَنَا هُوَ مَوْلَانَا وَعَلَى اللَّهِ فَلْيَتَوَكَّلِ الْمُؤْمِنُونَ﴾</w:t>
+      </w:r>
+      <w:r>
+        <w:rPr>
+          <w:rFonts w:ascii="Times New Roman" w:cs="Times New Roman" w:eastAsia="Times New Roman" w:hAnsi="Times New Roman"/>
+          <w:sz w:val="24"/>
+          <w:szCs w:val="24"/>
+          <w:rtl/>
+        </w:rPr>
+        <w:t xml:space="preserve">، </w:t>
+      </w:r>
+      <w:r>
+        <w:rPr>
+          <w:rFonts w:ascii="Times New Roman" w:cs="Times New Roman" w:eastAsia="Times New Roman" w:hAnsi="Times New Roman"/>
+          <w:b/>
+          <w:bCs/>
+          <w:color w:val="B23A2E"/>
+          <w:sz w:val="24"/>
+          <w:szCs w:val="24"/>
+          <w:rtl/>
+        </w:rPr>
+        <w:t xml:space="preserve">﴿وَإِن يَمْسَسْكَ اللَّهُ بِضُرٍّ فَلَا كَاشِفَ لَهُ إِلَّا هُوَ وَإِن يُرِدْكَ بِخَيْرٍ فَلَا رَادَّ لِفَضْلِهِ يُصِيبُ بِهِ مَن يَشَاءُ مِنْ عِبَادِهِ وَهُوَ الْغَفُورُ الرَّحِيمُ﴾</w:t>
+      </w:r>
+      <w:r>
+        <w:rPr>
+          <w:rFonts w:ascii="Times New Roman" w:cs="Times New Roman" w:eastAsia="Times New Roman" w:hAnsi="Times New Roman"/>
+          <w:sz w:val="24"/>
+          <w:szCs w:val="24"/>
+          <w:rtl/>
+        </w:rPr>
+        <w:t xml:space="preserve">، </w:t>
+      </w:r>
+      <w:r>
+        <w:rPr>
+          <w:rFonts w:ascii="Times New Roman" w:cs="Times New Roman" w:eastAsia="Times New Roman" w:hAnsi="Times New Roman"/>
+          <w:b/>
+          <w:bCs/>
+          <w:color w:val="B23A2E"/>
+          <w:sz w:val="24"/>
+          <w:szCs w:val="24"/>
+          <w:rtl/>
+        </w:rPr>
+        <w:t xml:space="preserve">﴿وَمَا مِن دَابَّةٍ فِي الْأَرْضِ إِلَّا عَلَى اللَّهِ رِزْقُهَا وَيَعْلَمُ مُسْتَقَرَّهَا وَمُسْتَوْدَعَهَا كُلٌّ فِي كِتَابٍ مُّبِينٍ﴾</w:t>
+      </w:r>
+      <w:r>
+        <w:rPr>
+          <w:rFonts w:ascii="Times New Roman" w:cs="Times New Roman" w:eastAsia="Times New Roman" w:hAnsi="Times New Roman"/>
+          <w:sz w:val="24"/>
+          <w:szCs w:val="24"/>
+          <w:rtl/>
+        </w:rPr>
+        <w:t xml:space="preserve">، </w:t>
+      </w:r>
+      <w:r>
+        <w:rPr>
+          <w:rFonts w:ascii="Times New Roman" w:cs="Times New Roman" w:eastAsia="Times New Roman" w:hAnsi="Times New Roman"/>
+          <w:b/>
+          <w:bCs/>
+          <w:color w:val="B23A2E"/>
+          <w:sz w:val="24"/>
+          <w:szCs w:val="24"/>
+          <w:rtl/>
+        </w:rPr>
+        <w:t xml:space="preserve">﴿إِنِّي تَوَكَّلْتُ عَلَى اللَّهِ رَبِّي وَرَبِّكُم مَّا مِن دَابَّةٍ إِلَّا هُوَ آخِذٌ بِنَاصِيَتِهَا إِنَّ رَبِّي عَلَىٰ صِرَاطٍ مُّسْتَقِيمٍ﴾</w:t>
+      </w:r>
+      <w:r>
+        <w:rPr>
+          <w:rFonts w:ascii="Times New Roman" w:cs="Times New Roman" w:eastAsia="Times New Roman" w:hAnsi="Times New Roman"/>
+          <w:sz w:val="24"/>
+          <w:szCs w:val="24"/>
+          <w:rtl/>
+        </w:rPr>
+        <w:t xml:space="preserve">، </w:t>
+      </w:r>
+      <w:r>
+        <w:rPr>
+          <w:rFonts w:ascii="Times New Roman" w:cs="Times New Roman" w:eastAsia="Times New Roman" w:hAnsi="Times New Roman"/>
+          <w:b/>
+          <w:bCs/>
+          <w:color w:val="B23A2E"/>
+          <w:sz w:val="24"/>
+          <w:szCs w:val="24"/>
+          <w:rtl/>
+        </w:rPr>
+        <w:t xml:space="preserve">﴿وَكَأَيِّن مِّن دَابَّةٍ لَّا تَحْمِلُ رِزْقَهَا اللَّهُ يَرْزُقُهَا وَإِيَّاكُمْ وَهُوَ السَّمِيعُ الْعَلِيمُ﴾</w:t>
+      </w:r>
+      <w:r>
+        <w:rPr>
+          <w:rFonts w:ascii="Times New Roman" w:cs="Times New Roman" w:eastAsia="Times New Roman" w:hAnsi="Times New Roman"/>
+          <w:sz w:val="24"/>
+          <w:szCs w:val="24"/>
+          <w:rtl/>
+        </w:rPr>
+        <w:t xml:space="preserve">، </w:t>
+      </w:r>
+      <w:r>
+        <w:rPr>
+          <w:rFonts w:ascii="Times New Roman" w:cs="Times New Roman" w:eastAsia="Times New Roman" w:hAnsi="Times New Roman"/>
+          <w:b/>
+          <w:bCs/>
+          <w:color w:val="B23A2E"/>
+          <w:sz w:val="24"/>
+          <w:szCs w:val="24"/>
+          <w:rtl/>
+        </w:rPr>
+        <w:t xml:space="preserve">﴿مَّا يَفْتَحِ اللَّهُ لِلنَّاسِ مِن رَّحْمَةٍ فَلَا مُمْسِكَ لَهَا وَمَا يُمْسِكْ فَلَا مُرْسِلَ لَهُ مِن بَعْدِهِ وَهُوَ الْعَزِيزُ الْحَكِيمُ﴾</w:t>
+      </w:r>
+      <w:r>
+        <w:rPr>
+          <w:rFonts w:ascii="Times New Roman" w:cs="Times New Roman" w:eastAsia="Times New Roman" w:hAnsi="Times New Roman"/>
+          <w:sz w:val="24"/>
+          <w:szCs w:val="24"/>
+          <w:rtl/>
+        </w:rPr>
+        <w:t xml:space="preserve">، </w:t>
+      </w:r>
+      <w:r>
+        <w:rPr>
+          <w:rFonts w:ascii="Times New Roman" w:cs="Times New Roman" w:eastAsia="Times New Roman" w:hAnsi="Times New Roman"/>
+          <w:b/>
+          <w:bCs/>
+          <w:color w:val="B23A2E"/>
+          <w:sz w:val="24"/>
+          <w:szCs w:val="24"/>
+          <w:rtl/>
+        </w:rPr>
+        <w:t xml:space="preserve">﴿وَلَئِن سَأَلْتَهُم مَّنْ خَلَقَ السَّمَاوَاتِ وَالْأَرْضَ لَيَقُولُنَّ اللَّهُ قُلْ أَفَرَأَيْتُم مَّا تَدْعُونَ مِن دُونِ اللَّهِ إِنْ أَرَادَنِيَ اللَّهُ بِضُرٍّ هَلْ هُنَّ كَاشِفَاتُ ضُرِّهِ أَوْ أَرَادَنِي بِرَحْمَةٍ هَلْ هُنَّ مُمْسِكَاتُ رَحْمَتِهِ قُلْ حَسْبِيَ اللَّهُ عَلَيْهِ يَتَوَكَّلُ الْمُتَوَكِّلُونَ﴾</w:t>
       </w:r>
     </w:p>
     <w:p>
@@ -6051,7 +7062,103 @@
           <w:szCs w:val="24"/>
           <w:rtl/>
         </w:rPr>
-        <w:t xml:space="preserve">آيات الصبر والتوكل عند الابتلاء: ﴿وَلَنَبْلُوَنَّكُم بِشَيْءٍ مِّنَ الْخَوْفِ وَالْجُوعِ وَنَقْصٍ مِّنَ الْأَمْوَالِ وَالْأَنفُسِ وَالثَّمَرَاتِ وَبَشِّرِ الصَّابِرِينَ * الَّذِينَ إِذَا أَصَابَتْهُم مُّصِيبَةٌ قَالُوا إِنَّا لِلَّهِ وَإِنَّا إِلَيْهِ رَاجِعُونَ﴾، ﴿الَّذِينَ قَالَ لَهُمُ النَّاسُ إِنَّ النَّاسَ قَدْ جَمَعُوا لَكُمْ فَاخْشَوْهُمْ فَزَادَهُمْ إِيمَانًا وَقَالُوا حَسْبُنَا اللَّهُ وَنِعْمَ الْوَكِيلُ﴾، ﴿وَمَا كَانَ قَوْلَهُمْ إِلَّا أَن قَالُوا رَبَّنَا اغْفِرْ لَنَا ذُنُوبَنَا وَإِسْرَافَنَا فِي أَمْرِنَا وَثَبِّتْ أَقْدَامَنَا وَانصُرْنَا عَلَى الْقَوْمِ الْكَافِرِينَ﴾، ﴿فَسَتَذْكُرُونَ مَا أَقُولُ لَكُمْ وَأُفَوِّضُ أَمْرِي إِلَى اللَّهِ إِنَّ اللَّهَ بَصِيرٌ بِالْعِبَادِ﴾، ﴿وَذَا النُّونِ إِذ ذَّهَبَ مُغَاضِبًا فَظَنَّ أَن لَّن نَّقْدِرَ عَلَيْهِ فَنَادَىٰ فِي الظُّلُمَاتِ أَن لَّا إِلَٰهَ إِلَّا أَنتَ سُبْحَانَكَ إِنِّي كُنتُ مِنَ الظَّالِمِينَ * فَاسْتَجَبْنَا لَهُ وَنَجَّيْنَاهُ مِنَ الْغَمِّ وَكَذَٰلِكَ نُنجِي الْمُؤْمِنِينَ﴾</w:t>
+        <w:t xml:space="preserve">آيات الصبر والتوكل عند الابتلاء: </w:t>
+      </w:r>
+      <w:r>
+        <w:rPr>
+          <w:rFonts w:ascii="Times New Roman" w:cs="Times New Roman" w:eastAsia="Times New Roman" w:hAnsi="Times New Roman"/>
+          <w:b/>
+          <w:bCs/>
+          <w:color w:val="B23A2E"/>
+          <w:sz w:val="24"/>
+          <w:szCs w:val="24"/>
+          <w:rtl/>
+        </w:rPr>
+        <w:t xml:space="preserve">﴿وَلَنَبْلُوَنَّكُم بِشَيْءٍ مِّنَ الْخَوْفِ وَالْجُوعِ وَنَقْصٍ مِّنَ الْأَمْوَالِ وَالْأَنفُسِ وَالثَّمَرَاتِ وَبَشِّرِ الصَّابِرِينَ * الَّذِينَ إِذَا أَصَابَتْهُم مُّصِيبَةٌ قَالُوا إِنَّا لِلَّهِ وَإِنَّا إِلَيْهِ رَاجِعُونَ﴾</w:t>
+      </w:r>
+      <w:r>
+        <w:rPr>
+          <w:rFonts w:ascii="Times New Roman" w:cs="Times New Roman" w:eastAsia="Times New Roman" w:hAnsi="Times New Roman"/>
+          <w:sz w:val="24"/>
+          <w:szCs w:val="24"/>
+          <w:rtl/>
+        </w:rPr>
+        <w:t xml:space="preserve">، </w:t>
+      </w:r>
+      <w:r>
+        <w:rPr>
+          <w:rFonts w:ascii="Times New Roman" w:cs="Times New Roman" w:eastAsia="Times New Roman" w:hAnsi="Times New Roman"/>
+          <w:b/>
+          <w:bCs/>
+          <w:color w:val="B23A2E"/>
+          <w:sz w:val="24"/>
+          <w:szCs w:val="24"/>
+          <w:rtl/>
+        </w:rPr>
+        <w:t xml:space="preserve">﴿الَّذِينَ قَالَ لَهُمُ النَّاسُ إِنَّ النَّاسَ قَدْ جَمَعُوا لَكُمْ فَاخْشَوْهُمْ فَزَادَهُمْ إِيمَانًا وَقَالُوا حَسْبُنَا اللَّهُ وَنِعْمَ الْوَكِيلُ﴾</w:t>
+      </w:r>
+      <w:r>
+        <w:rPr>
+          <w:rFonts w:ascii="Times New Roman" w:cs="Times New Roman" w:eastAsia="Times New Roman" w:hAnsi="Times New Roman"/>
+          <w:sz w:val="24"/>
+          <w:szCs w:val="24"/>
+          <w:rtl/>
+        </w:rPr>
+        <w:t xml:space="preserve">، </w:t>
+      </w:r>
+      <w:r>
+        <w:rPr>
+          <w:rFonts w:ascii="Times New Roman" w:cs="Times New Roman" w:eastAsia="Times New Roman" w:hAnsi="Times New Roman"/>
+          <w:b/>
+          <w:bCs/>
+          <w:color w:val="B23A2E"/>
+          <w:sz w:val="24"/>
+          <w:szCs w:val="24"/>
+          <w:rtl/>
+        </w:rPr>
+        <w:t xml:space="preserve">﴿وَمَا كَانَ قَوْلَهُمْ إِلَّا أَن قَالُوا رَبَّنَا اغْفِرْ لَنَا ذُنُوبَنَا وَإِسْرَافَنَا فِي أَمْرِنَا وَثَبِّتْ أَقْدَامَنَا وَانصُرْنَا عَلَى الْقَوْمِ الْكَافِرِينَ﴾</w:t>
+      </w:r>
+      <w:r>
+        <w:rPr>
+          <w:rFonts w:ascii="Times New Roman" w:cs="Times New Roman" w:eastAsia="Times New Roman" w:hAnsi="Times New Roman"/>
+          <w:sz w:val="24"/>
+          <w:szCs w:val="24"/>
+          <w:rtl/>
+        </w:rPr>
+        <w:t xml:space="preserve">، </w:t>
+      </w:r>
+      <w:r>
+        <w:rPr>
+          <w:rFonts w:ascii="Times New Roman" w:cs="Times New Roman" w:eastAsia="Times New Roman" w:hAnsi="Times New Roman"/>
+          <w:b/>
+          <w:bCs/>
+          <w:color w:val="B23A2E"/>
+          <w:sz w:val="24"/>
+          <w:szCs w:val="24"/>
+          <w:rtl/>
+        </w:rPr>
+        <w:t xml:space="preserve">﴿فَسَتَذْكُرُونَ مَا أَقُولُ لَكُمْ وَأُفَوِّضُ أَمْرِي إِلَى اللَّهِ إِنَّ اللَّهَ بَصِيرٌ بِالْعِبَادِ﴾</w:t>
+      </w:r>
+      <w:r>
+        <w:rPr>
+          <w:rFonts w:ascii="Times New Roman" w:cs="Times New Roman" w:eastAsia="Times New Roman" w:hAnsi="Times New Roman"/>
+          <w:sz w:val="24"/>
+          <w:szCs w:val="24"/>
+          <w:rtl/>
+        </w:rPr>
+        <w:t xml:space="preserve">، </w:t>
+      </w:r>
+      <w:r>
+        <w:rPr>
+          <w:rFonts w:ascii="Times New Roman" w:cs="Times New Roman" w:eastAsia="Times New Roman" w:hAnsi="Times New Roman"/>
+          <w:b/>
+          <w:bCs/>
+          <w:color w:val="B23A2E"/>
+          <w:sz w:val="24"/>
+          <w:szCs w:val="24"/>
+          <w:rtl/>
+        </w:rPr>
+        <w:t xml:space="preserve">﴿وَذَا النُّونِ إِذ ذَّهَبَ مُغَاضِبًا فَظَنَّ أَن لَّن نَّقْدِرَ عَلَيْهِ فَنَادَىٰ فِي الظُّلُمَاتِ أَن لَّا إِلَٰهَ إِلَّا أَنتَ سُبْحَانَكَ إِنِّي كُنتُ مِنَ الظَّالِمِينَ * فَاسْتَجَبْنَا لَهُ وَنَجَّيْنَاهُ مِنَ الْغَمِّ وَكَذَٰلِكَ نُنجِي الْمُؤْمِنِينَ﴾</w:t>
       </w:r>
     </w:p>
     <w:p>
@@ -6085,7 +7192,19 @@
           <w:szCs w:val="24"/>
           <w:rtl/>
         </w:rPr>
-        <w:t xml:space="preserve">أفضل صيغة للاستغفار، ويُفضّل 70 مرة: ﴿رَبِّ اغْفِرْ لِي وَلِوَالِدَيَّ وَلِمَن دَخَلَ بَيْتِيَ مُؤْمِنًا وَلِلْمُؤْمِنِينَ وَالْمُؤْمِنَاتِ وَلَا تَزِدِ الظَّالِمِينَ إِلَّا تَبَارًا﴾</w:t>
+        <w:t xml:space="preserve">أفضل صيغة للاستغفار، ويُفضّل 70 مرة: </w:t>
+      </w:r>
+      <w:r>
+        <w:rPr>
+          <w:rFonts w:ascii="Times New Roman" w:cs="Times New Roman" w:eastAsia="Times New Roman" w:hAnsi="Times New Roman"/>
+          <w:b/>
+          <w:bCs/>
+          <w:color w:val="B23A2E"/>
+          <w:sz w:val="24"/>
+          <w:szCs w:val="24"/>
+          <w:rtl/>
+        </w:rPr>
+        <w:t xml:space="preserve">﴿رَبِّ اغْفِرْ لِي وَلِوَالِدَيَّ وَلِمَن دَخَلَ بَيْتِيَ مُؤْمِنًا وَلِلْمُؤْمِنِينَ وَالْمُؤْمِنَاتِ وَلَا تَزِدِ الظَّالِمِينَ إِلَّا تَبَارًا﴾</w:t>
       </w:r>
     </w:p>
     <w:p>
@@ -6119,7 +7238,28 @@
           <w:szCs w:val="24"/>
           <w:rtl/>
         </w:rPr>
-        <w:t xml:space="preserve">آيات التسخير: «بسم الله الرحمن الرحيم» (19 مرة)، «اللهم صلِّ على سيدنا محمد الفاتح لما أُغلق، والخاتم لما سبق، ناصر الحق بالحق، الهادي إلى صراطك المستقيم، وعلى آله حق قدره ومقداره العظيم» (19 مرة)، «كهيعص» (195 مرة)، ثم ﴿اللَّهُ الَّذِي خَلَقَ السَّمَاوَاتِ وَالْأَرْضَ وَأَنزَلَ مِنَ السَّمَاءِ مَاءً فَأَخْرَجَ بِهِ مِنَ الثَّمَرَاتِ رِزْقًا لَّكُمْ وَسَخَّرَ لَكُمُ الْفُلْكَ لِتَجْرِيَ فِي الْبَحْرِ بِأَمْرِهِ وَسَخَّرَ لَكُمُ الْأَنْهَارَ * وَسَخَّرَ لَكُمُ الشَّمْسَ وَالْقَمَرَ دَائِبَيْنِ وَسَخَّرَ لَكُمُ اللَّيْلَ وَالنَّهَارَ * وَآتَاكُم مِّن كُلِّ مَا سَأَلْتُمُوهُ وَإِن تَعُدُّوا نِعْمَتَ اللَّهِ لَا تُحْصُوهَا إِنَّ الْإِنسَانَ لَظَلُومٌ كَفَّارٌ﴾ (70 مرة)</w:t>
+        <w:t xml:space="preserve">آيات التسخير: «بسم الله الرحمن الرحيم» (19 مرة)، «اللهم صلِّ على سيدنا محمد الفاتح لما أُغلق، والخاتم لما سبق، ناصر الحق بالحق، الهادي إلى صراطك المستقيم، وعلى آله حق قدره ومقداره العظيم» (19 مرة)، «كهيعص» (195 مرة)، ثم </w:t>
+      </w:r>
+      <w:r>
+        <w:rPr>
+          <w:rFonts w:ascii="Times New Roman" w:cs="Times New Roman" w:eastAsia="Times New Roman" w:hAnsi="Times New Roman"/>
+          <w:b/>
+          <w:bCs/>
+          <w:color w:val="B23A2E"/>
+          <w:sz w:val="24"/>
+          <w:szCs w:val="24"/>
+          <w:rtl/>
+        </w:rPr>
+        <w:t xml:space="preserve">﴿اللَّهُ الَّذِي خَلَقَ السَّمَاوَاتِ وَالْأَرْضَ وَأَنزَلَ مِنَ السَّمَاءِ مَاءً فَأَخْرَجَ بِهِ مِنَ الثَّمَرَاتِ رِزْقًا لَّكُمْ وَسَخَّرَ لَكُمُ الْفُلْكَ لِتَجْرِيَ فِي الْبَحْرِ بِأَمْرِهِ وَسَخَّرَ لَكُمُ الْأَنْهَارَ * وَسَخَّرَ لَكُمُ الشَّمْسَ وَالْقَمَرَ دَائِبَيْنِ وَسَخَّرَ لَكُمُ اللَّيْلَ وَالنَّهَارَ * وَآتَاكُم مِّن كُلِّ مَا سَأَلْتُمُوهُ وَإِن تَعُدُّوا نِعْمَتَ اللَّهِ لَا تُحْصُوهَا إِنَّ الْإِنسَانَ لَظَلُومٌ كَفَّارٌ﴾</w:t>
+      </w:r>
+      <w:r>
+        <w:rPr>
+          <w:rFonts w:ascii="Times New Roman" w:cs="Times New Roman" w:eastAsia="Times New Roman" w:hAnsi="Times New Roman"/>
+          <w:sz w:val="24"/>
+          <w:szCs w:val="24"/>
+          <w:rtl/>
+        </w:rPr>
+        <w:t xml:space="preserve"> (70 مرة)</w:t>
       </w:r>
     </w:p>
     <w:p>
@@ -6153,7 +7293,124 @@
           <w:szCs w:val="24"/>
           <w:rtl/>
         </w:rPr>
-        <w:t xml:space="preserve">الآيات الست وأجوبتها عند كل شدة: ﴿الَّذِينَ إِذَا أَصَابَتْهُم مُّصِيبَةٌ قَالُوا إِنَّا لِلَّهِ وَإِنَّا إِلَيْهِ رَاجِعُونَ * أُولَٰئِكَ عَلَيْهِمْ صَلَوَاتٌ مِّن رَّبِّهِمْ وَرَحْمَةٌ وَأُولَٰئِكَ هُمُ الْمُهْتَدُونَ﴾، ﴿الَّذِينَ قَالَ لَهُمُ النَّاسُ إِنَّ النَّاسَ قَدْ جَمَعُوا لَكُمْ فَاخْشَوْهُمْ فَزَادَهُمْ إِيمَانًا وَقَالُوا حَسْبُنَا اللَّهُ وَنِعْمَ الْوَكِيلُ * فَانقَلَبُوا بِنِعْمَةٍ مِّنَ اللَّهِ وَفَضْلٍ لَّمْ يَمْسَسْهُمْ سُوءٌ وَاتَّبَعُوا رِضْوَانَ اللَّهِ وَاللَّهُ ذُو فَضْلٍ عَظِيمٍ﴾، ﴿وَذَا النُّونِ إِذ ذَّهَبَ مُغَاضِبًا فَظَنَّ أَن لَّن نَّقْدِرَ عَلَيْهِ فَنَادَىٰ فِي الظُّلُمَاتِ أَن لَّا إِلَٰهَ إِلَّا أَنتَ سُبْحَانَكَ إِنِّي كُنتُ مِنَ الظَّالِمِينَ * فَاسْتَجَبْنَا لَهُ وَنَجَّيْنَاهُ مِنَ الْغَمِّ وَكَذَٰلِكَ نُنجِي الْمُؤْمِنِينَ﴾، ﴿وَأَيُّوبَ إِذْ نَادَىٰ رَبَّهُ أَنِّي مَسَّنِيَ الضُّرُّ وَأَنتَ أَرْحَمُ الرَّاحِمِينَ * فَاسْتَجَبْنَا لَهُ فَكَشَفْنَا مَا بِهِ مِن ضُرٍّ وَآتَيْنَاهُ أَهْلَهُ وَمِثْلَهُم مَّعَهُمْ رَحْمَةً مِّنْ عِندِنَا وَذِكْرَىٰ لِلْعَابِدِينَ﴾، ﴿فَسَتَذْكُرُونَ مَا أَقُولُ لَكُمْ وَأُفَوِّضُ أَمْرِي إِلَى اللَّهِ إِنَّ اللَّهَ بَصِيرٌ بِالْعِبَادِ * فَوَقَاهُ اللَّهُ سَيِّئَاتِ مَا مَكَرُوا وَحَاقَ بِآلِ فِرْعَوْنَ سُوءُ الْعَذَابِ﴾، ﴿وَالَّذِينَ إِذَا فَعَلُوا فَاحِشَةً أَوْ ظَلَمُوا أَنفُسَهُمْ ذَكَرُوا اللَّهَ فَاسْتَغْفَرُوا لِذُنُوبِهِمْ وَمَن يَغْفِرُ الذُّنُوبَ إِلَّا اللَّهُ وَلَمْ يُصِرُّوا عَلَىٰ مَا فَعَلُوا وَهُمْ يَعْلَمُونَ * أُولَٰئِكَ جَزَاؤُهُم مَّغْفِرَةٌ مِّن رَّبِّهِمْ وَجَنَّاتٌ تَجْرِي مِن تَحْتِهَا الْأَنْهَارُ خَالِدِينَ فِيهَا وَنِعْمَ أَجْرُ الْعَامِلِينَ﴾</w:t>
+        <w:t xml:space="preserve">الآيات الست وأجوبتها عند كل شدة: </w:t>
+      </w:r>
+      <w:r>
+        <w:rPr>
+          <w:rFonts w:ascii="Times New Roman" w:cs="Times New Roman" w:eastAsia="Times New Roman" w:hAnsi="Times New Roman"/>
+          <w:b/>
+          <w:bCs/>
+          <w:color w:val="B23A2E"/>
+          <w:sz w:val="24"/>
+          <w:szCs w:val="24"/>
+          <w:rtl/>
+        </w:rPr>
+        <w:t xml:space="preserve">﴿الَّذِينَ إِذَا أَصَابَتْهُم مُّصِيبَةٌ قَالُوا إِنَّا لِلَّهِ وَإِنَّا إِلَيْهِ رَاجِعُونَ * أُولَٰئِكَ عَلَيْهِمْ صَلَوَاتٌ مِّن رَّبِّهِمْ وَرَحْمَةٌ وَأُولَٰئِكَ هُمُ الْمُهْتَدُونَ﴾</w:t>
+      </w:r>
+      <w:r>
+        <w:rPr>
+          <w:rFonts w:ascii="Times New Roman" w:cs="Times New Roman" w:eastAsia="Times New Roman" w:hAnsi="Times New Roman"/>
+          <w:sz w:val="24"/>
+          <w:szCs w:val="24"/>
+          <w:rtl/>
+        </w:rPr>
+        <w:t xml:space="preserve">، </w:t>
+      </w:r>
+      <w:r>
+        <w:rPr>
+          <w:rFonts w:ascii="Times New Roman" w:cs="Times New Roman" w:eastAsia="Times New Roman" w:hAnsi="Times New Roman"/>
+          <w:b/>
+          <w:bCs/>
+          <w:color w:val="B23A2E"/>
+          <w:sz w:val="24"/>
+          <w:szCs w:val="24"/>
+          <w:rtl/>
+        </w:rPr>
+        <w:t xml:space="preserve">﴿الَّذِينَ قَالَ لَهُمُ النَّاسُ إِنَّ النَّاسَ قَدْ جَمَعُوا لَكُمْ فَاخْشَوْهُمْ فَزَادَهُمْ إِيمَانًا وَقَالُوا حَسْبُنَا اللَّهُ وَنِعْمَ الْوَكِيلُ * فَانقَلَبُوا بِنِعْمَةٍ مِّنَ اللَّهِ وَفَضْلٍ لَّمْ يَمْسَسْهُمْ سُوءٌ وَاتَّبَعُوا رِضْوَانَ اللَّهِ وَاللَّهُ ذُو فَضْلٍ عَظِيمٍ﴾</w:t>
+      </w:r>
+      <w:r>
+        <w:rPr>
+          <w:rFonts w:ascii="Times New Roman" w:cs="Times New Roman" w:eastAsia="Times New Roman" w:hAnsi="Times New Roman"/>
+          <w:sz w:val="24"/>
+          <w:szCs w:val="24"/>
+          <w:rtl/>
+        </w:rPr>
+        <w:t xml:space="preserve">، </w:t>
+      </w:r>
+      <w:r>
+        <w:rPr>
+          <w:rFonts w:ascii="Times New Roman" w:cs="Times New Roman" w:eastAsia="Times New Roman" w:hAnsi="Times New Roman"/>
+          <w:b/>
+          <w:bCs/>
+          <w:color w:val="B23A2E"/>
+          <w:sz w:val="24"/>
+          <w:szCs w:val="24"/>
+          <w:rtl/>
+        </w:rPr>
+        <w:t xml:space="preserve">﴿وَذَا النُّونِ إِذ ذَّهَبَ مُغَاضِبًا فَظَنَّ أَن لَّن نَّقْدِرَ عَلَيْهِ فَنَادَىٰ فِي الظُّلُمَاتِ أَن لَّا إِلَٰهَ إِلَّا أَنتَ سُبْحَانَكَ إِنِّي كُنتُ مِنَ الظَّالِمِينَ * فَاسْتَجَبْنَا لَهُ وَنَجَّيْنَاهُ مِنَ الْغَمِّ وَكَذَٰلِكَ نُنجِي الْمُؤْمِنِينَ﴾</w:t>
+      </w:r>
+      <w:r>
+        <w:rPr>
+          <w:rFonts w:ascii="Times New Roman" w:cs="Times New Roman" w:eastAsia="Times New Roman" w:hAnsi="Times New Roman"/>
+          <w:sz w:val="24"/>
+          <w:szCs w:val="24"/>
+          <w:rtl/>
+        </w:rPr>
+        <w:t xml:space="preserve">، </w:t>
+      </w:r>
+      <w:r>
+        <w:rPr>
+          <w:rFonts w:ascii="Times New Roman" w:cs="Times New Roman" w:eastAsia="Times New Roman" w:hAnsi="Times New Roman"/>
+          <w:b/>
+          <w:bCs/>
+          <w:color w:val="B23A2E"/>
+          <w:sz w:val="24"/>
+          <w:szCs w:val="24"/>
+          <w:rtl/>
+        </w:rPr>
+        <w:t xml:space="preserve">﴿وَأَيُّوبَ إِذْ نَادَىٰ رَبَّهُ أَنِّي مَسَّنِيَ الضُّرُّ وَأَنتَ أَرْحَمُ الرَّاحِمِينَ * فَاسْتَجَبْنَا لَهُ فَكَشَفْنَا مَا بِهِ مِن ضُرٍّ وَآتَيْنَاهُ أَهْلَهُ وَمِثْلَهُم مَّعَهُمْ رَحْمَةً مِّنْ عِندِنَا وَذِكْرَىٰ لِلْعَابِدِينَ﴾</w:t>
+      </w:r>
+      <w:r>
+        <w:rPr>
+          <w:rFonts w:ascii="Times New Roman" w:cs="Times New Roman" w:eastAsia="Times New Roman" w:hAnsi="Times New Roman"/>
+          <w:sz w:val="24"/>
+          <w:szCs w:val="24"/>
+          <w:rtl/>
+        </w:rPr>
+        <w:t xml:space="preserve">، </w:t>
+      </w:r>
+      <w:r>
+        <w:rPr>
+          <w:rFonts w:ascii="Times New Roman" w:cs="Times New Roman" w:eastAsia="Times New Roman" w:hAnsi="Times New Roman"/>
+          <w:b/>
+          <w:bCs/>
+          <w:color w:val="B23A2E"/>
+          <w:sz w:val="24"/>
+          <w:szCs w:val="24"/>
+          <w:rtl/>
+        </w:rPr>
+        <w:t xml:space="preserve">﴿فَسَتَذْكُرُونَ مَا أَقُولُ لَكُمْ وَأُفَوِّضُ أَمْرِي إِلَى اللَّهِ إِنَّ اللَّهَ بَصِيرٌ بِالْعِبَادِ * فَوَقَاهُ اللَّهُ سَيِّئَاتِ مَا مَكَرُوا وَحَاقَ بِآلِ فِرْعَوْنَ سُوءُ الْعَذَابِ﴾</w:t>
+      </w:r>
+      <w:r>
+        <w:rPr>
+          <w:rFonts w:ascii="Times New Roman" w:cs="Times New Roman" w:eastAsia="Times New Roman" w:hAnsi="Times New Roman"/>
+          <w:sz w:val="24"/>
+          <w:szCs w:val="24"/>
+          <w:rtl/>
+        </w:rPr>
+        <w:t xml:space="preserve">، </w:t>
+      </w:r>
+      <w:r>
+        <w:rPr>
+          <w:rFonts w:ascii="Times New Roman" w:cs="Times New Roman" w:eastAsia="Times New Roman" w:hAnsi="Times New Roman"/>
+          <w:b/>
+          <w:bCs/>
+          <w:color w:val="B23A2E"/>
+          <w:sz w:val="24"/>
+          <w:szCs w:val="24"/>
+          <w:rtl/>
+        </w:rPr>
+        <w:t xml:space="preserve">﴿وَالَّذِينَ إِذَا فَعَلُوا فَاحِشَةً أَوْ ظَلَمُوا أَنفُسَهُمْ ذَكَرُوا اللَّهَ فَاسْتَغْفَرُوا لِذُنُوبِهِمْ وَمَن يَغْفِرُ الذُّنُوبَ إِلَّا اللَّهُ وَلَمْ يُصِرُّوا عَلَىٰ مَا فَعَلُوا وَهُمْ يَعْلَمُونَ * أُولَٰئِكَ جَزَاؤُهُم مَّغْفِرَةٌ مِّن رَّبِّهِمْ وَجَنَّاتٌ تَجْرِي مِن تَحْتِهَا الْأَنْهَارُ خَالِدِينَ فِيهَا وَنِعْمَ أَجْرُ الْعَامِلِينَ﴾</w:t>
       </w:r>
     </w:p>
     <w:p>
@@ -6187,7 +7444,40 @@
           <w:szCs w:val="24"/>
           <w:rtl/>
         </w:rPr>
-        <w:t xml:space="preserve">دعاء للآخرة: ﴿وَاجْعَلْنِي مِن وَرَثَةِ جَنَّةِ النَّعِيمِ﴾ و﴿رَبِّ ابْنِ لِي عِندَكَ بَيْتًا فِي الْجَنَّةِ وَنَجِّنِي مِن فِرْعَوْنَ وَعَمَلِهِ وَنَجِّنِي مِنَ الْقَوْمِ الظَّالِمِينَ﴾</w:t>
+        <w:t xml:space="preserve">دعاء للآخرة: </w:t>
+      </w:r>
+      <w:r>
+        <w:rPr>
+          <w:rFonts w:ascii="Times New Roman" w:cs="Times New Roman" w:eastAsia="Times New Roman" w:hAnsi="Times New Roman"/>
+          <w:b/>
+          <w:bCs/>
+          <w:color w:val="B23A2E"/>
+          <w:sz w:val="24"/>
+          <w:szCs w:val="24"/>
+          <w:rtl/>
+        </w:rPr>
+        <w:t xml:space="preserve">﴿وَاجْعَلْنِي مِن وَرَثَةِ جَنَّةِ النَّعِيمِ﴾</w:t>
+      </w:r>
+      <w:r>
+        <w:rPr>
+          <w:rFonts w:ascii="Times New Roman" w:cs="Times New Roman" w:eastAsia="Times New Roman" w:hAnsi="Times New Roman"/>
+          <w:sz w:val="24"/>
+          <w:szCs w:val="24"/>
+          <w:rtl/>
+        </w:rPr>
+        <w:t xml:space="preserve"> و</w:t>
+      </w:r>
+      <w:r>
+        <w:rPr>
+          <w:rFonts w:ascii="Times New Roman" w:cs="Times New Roman" w:eastAsia="Times New Roman" w:hAnsi="Times New Roman"/>
+          <w:b/>
+          <w:bCs/>
+          <w:color w:val="B23A2E"/>
+          <w:sz w:val="24"/>
+          <w:szCs w:val="24"/>
+          <w:rtl/>
+        </w:rPr>
+        <w:t xml:space="preserve">﴿رَبِّ ابْنِ لِي عِندَكَ بَيْتًا فِي الْجَنَّةِ وَنَجِّنِي مِن فِرْعَوْنَ وَعَمَلِهِ وَنَجِّنِي مِنَ الْقَوْمِ الظَّالِمِينَ﴾</w:t>
       </w:r>
     </w:p>
     <w:p>
@@ -6255,7 +7545,28 @@
           <w:szCs w:val="24"/>
           <w:rtl/>
         </w:rPr>
-        <w:t xml:space="preserve">مجموعة أدعية الاستغفار: ﴿فَقُلْتُ اسْتَغْفِرُوا رَبَّكُمْ إِنَّهُ كَانَ غَفَّارًا * يُرْسِلِ السَّمَاءَ عَلَيْكُم مِّدْرَارًا * وَيُمْدِدْكُمْ بِأَمْوَالٍ وَبَنِينَ وَيَجْعَل لَّكُمْ جَنَّاتٍ وَيَجْعَل لَّكُمْ أَنْهَارًا﴾. سيد الاستغفار: «اللهم أنت ربي لا إله إلا أنت، خلقتني وأنا عبدك، وأنا على عهدك ووعدك ما استطعت، أعوذ بك من شر ما صنعت، أبوء لك بنعمتك علي، وأبوء لك بذنبي، فاغفر لي فإنه لا يغفر الذنوب إلا أنت». «اللهم إني ظلمت نفسي ظلمًا كثيرًا، ولا يغفر الذنوب إلا أنت، فاغفر لي مغفرة من عندك وارحمني إنك أنت الغفور الرحيم». «رب اغفر لي خطيئتي وجهلي وإسرافي في أمري كله، وما أنت أعلم به مني، اللهم اغفر لي خطاياي وعمدي وجهلي وهزلي وكل ذلك عندي، اللهم اغفر لي ما قدمت وما أخرت وما أسررت وما أعلنت، أنت المقدم وأنت المؤخر وأنت على كل شيء قدير». «أستغفر الله العظيم الذي لا إله إلا هو الحي القيوم وأتوب إليه». «رب اغفر لي وتب علي إنك أنت التواب الرحيم»</w:t>
+        <w:t xml:space="preserve">مجموعة أدعية الاستغفار: </w:t>
+      </w:r>
+      <w:r>
+        <w:rPr>
+          <w:rFonts w:ascii="Times New Roman" w:cs="Times New Roman" w:eastAsia="Times New Roman" w:hAnsi="Times New Roman"/>
+          <w:b/>
+          <w:bCs/>
+          <w:color w:val="B23A2E"/>
+          <w:sz w:val="24"/>
+          <w:szCs w:val="24"/>
+          <w:rtl/>
+        </w:rPr>
+        <w:t xml:space="preserve">﴿فَقُلْتُ اسْتَغْفِرُوا رَبَّكُمْ إِنَّهُ كَانَ غَفَّارًا * يُرْسِلِ السَّمَاءَ عَلَيْكُم مِّدْرَارًا * وَيُمْدِدْكُمْ بِأَمْوَالٍ وَبَنِينَ وَيَجْعَل لَّكُمْ جَنَّاتٍ وَيَجْعَل لَّكُمْ أَنْهَارًا﴾</w:t>
+      </w:r>
+      <w:r>
+        <w:rPr>
+          <w:rFonts w:ascii="Times New Roman" w:cs="Times New Roman" w:eastAsia="Times New Roman" w:hAnsi="Times New Roman"/>
+          <w:sz w:val="24"/>
+          <w:szCs w:val="24"/>
+          <w:rtl/>
+        </w:rPr>
+        <w:t xml:space="preserve">. سيد الاستغفار: «اللهم أنت ربي لا إله إلا أنت، خلقتني وأنا عبدك، وأنا على عهدك ووعدك ما استطعت، أعوذ بك من شر ما صنعت، أبوء لك بنعمتك علي، وأبوء لك بذنبي، فاغفر لي فإنه لا يغفر الذنوب إلا أنت». «اللهم إني ظلمت نفسي ظلمًا كثيرًا، ولا يغفر الذنوب إلا أنت، فاغفر لي مغفرة من عندك وارحمني إنك أنت الغفور الرحيم». «رب اغفر لي خطيئتي وجهلي وإسرافي في أمري كله، وما أنت أعلم به مني، اللهم اغفر لي خطاياي وعمدي وجهلي وهزلي وكل ذلك عندي، اللهم اغفر لي ما قدمت وما أخرت وما أسررت وما أعلنت، أنت المقدم وأنت المؤخر وأنت على كل شيء قدير». «أستغفر الله العظيم الذي لا إله إلا هو الحي القيوم وأتوب إليه». «رب اغفر لي وتب علي إنك أنت التواب الرحيم»</w:t>
       </w:r>
     </w:p>
     <w:p>
@@ -6585,7 +7896,28 @@
           <w:szCs w:val="24"/>
           <w:rtl/>
         </w:rPr>
-        <w:t xml:space="preserve">فصلت آية 11 ﴿ثُمَّ اسْتَوَىٰ إِلَى السَّمَاءِ وَهِيَ دُخَانٌ فَقَالَ لَهَا وَلِلْأَرْضِ ائْتِيَا طَوْعًا أَوْ كَرْهًا قَالَتَا أَتَيْنَا طَائِعِينَ﴾ تُقرأ كل سبت واثنين وخميس بعد صلاة العشاء (100 مرة)، ثم يُقال: «اللهم يا من أطاعه من في السماوات والأرض، اجعل (فلانًا) يطيعني، وسخّره إلي بحولك وقوتك» (7 مرات)</w:t>
+        <w:t xml:space="preserve">فصلت آية 11 </w:t>
+      </w:r>
+      <w:r>
+        <w:rPr>
+          <w:rFonts w:ascii="Times New Roman" w:cs="Times New Roman" w:eastAsia="Times New Roman" w:hAnsi="Times New Roman"/>
+          <w:b/>
+          <w:bCs/>
+          <w:color w:val="B23A2E"/>
+          <w:sz w:val="24"/>
+          <w:szCs w:val="24"/>
+          <w:rtl/>
+        </w:rPr>
+        <w:t xml:space="preserve">﴿ثُمَّ اسْتَوَىٰ إِلَى السَّمَاءِ وَهِيَ دُخَانٌ فَقَالَ لَهَا وَلِلْأَرْضِ ائْتِيَا طَوْعًا أَوْ كَرْهًا قَالَتَا أَتَيْنَا طَائِعِينَ﴾</w:t>
+      </w:r>
+      <w:r>
+        <w:rPr>
+          <w:rFonts w:ascii="Times New Roman" w:cs="Times New Roman" w:eastAsia="Times New Roman" w:hAnsi="Times New Roman"/>
+          <w:sz w:val="24"/>
+          <w:szCs w:val="24"/>
+          <w:rtl/>
+        </w:rPr>
+        <w:t xml:space="preserve"> تُقرأ كل سبت واثنين وخميس بعد صلاة العشاء (100 مرة)، ثم يُقال: «اللهم يا من أطاعه من في السماوات والأرض، اجعل (فلانًا) يطيعني، وسخّره إلي بحولك وقوتك» (7 مرات)</w:t>
       </w:r>
     </w:p>
     <w:p>
@@ -6619,7 +7951,19 @@
           <w:szCs w:val="24"/>
           <w:rtl/>
         </w:rPr>
-        <w:t xml:space="preserve">لمكانة اجتماعية: ﴿أَمَّن يُجِيبُ الْمُضْطَرَّ إِذَا دَعَاهُ وَيَكْشِفُ السُّوءَ وَيَجْعَلُكُمْ خُلَفَاءَ الْأَرْضِ أَإِلَٰهٌ مَّعَ اللَّهِ قَلِيلًا مَّا تَذَكَّرُونَ﴾</w:t>
+        <w:t xml:space="preserve">لمكانة اجتماعية: </w:t>
+      </w:r>
+      <w:r>
+        <w:rPr>
+          <w:rFonts w:ascii="Times New Roman" w:cs="Times New Roman" w:eastAsia="Times New Roman" w:hAnsi="Times New Roman"/>
+          <w:b/>
+          <w:bCs/>
+          <w:color w:val="B23A2E"/>
+          <w:sz w:val="24"/>
+          <w:szCs w:val="24"/>
+          <w:rtl/>
+        </w:rPr>
+        <w:t xml:space="preserve">﴿أَمَّن يُجِيبُ الْمُضْطَرَّ إِذَا دَعَاهُ وَيَكْشِفُ السُّوءَ وَيَجْعَلُكُمْ خُلَفَاءَ الْأَرْضِ أَإِلَٰهٌ مَّعَ اللَّهِ قَلِيلًا مَّا تَذَكَّرُونَ﴾</w:t>
       </w:r>
     </w:p>
     <w:p>
@@ -7177,7 +8521,19 @@
           <w:szCs w:val="24"/>
           <w:rtl/>
         </w:rPr>
-        <w:t xml:space="preserve">اللهم صلِّ وسلم وبارك على سيدنا محمد وآله صلاة قوة ومدد، تحمي بها الروح والجسد، ولا يقدر بها علينا أحد، وتحفظ بها الأهل والولد، وتُعيذنا بها من شر النفاثات في العقد ومن شر حاسد إذا حسد، يا مولانا، بحق ﴿قُلْ هُوَ اللَّهُ أَحَدٌ * اللَّهُ الصَّمَدُ * لَمْ يَلِدْ وَلَمْ يُولَدْ * وَلَمْ يَكُن لَّهُ كُفُوًا أَحَدٌ﴾</w:t>
+        <w:t xml:space="preserve">اللهم صلِّ وسلم وبارك على سيدنا محمد وآله صلاة قوة ومدد، تحمي بها الروح والجسد، ولا يقدر بها علينا أحد، وتحفظ بها الأهل والولد، وتُعيذنا بها من شر النفاثات في العقد ومن شر حاسد إذا حسد، يا مولانا، بحق </w:t>
+      </w:r>
+      <w:r>
+        <w:rPr>
+          <w:rFonts w:ascii="Times New Roman" w:cs="Times New Roman" w:eastAsia="Times New Roman" w:hAnsi="Times New Roman"/>
+          <w:b/>
+          <w:bCs/>
+          <w:color w:val="B23A2E"/>
+          <w:sz w:val="24"/>
+          <w:szCs w:val="24"/>
+          <w:rtl/>
+        </w:rPr>
+        <w:t xml:space="preserve">﴿قُلْ هُوَ اللَّهُ أَحَدٌ * اللَّهُ الصَّمَدُ * لَمْ يَلِدْ وَلَمْ يُولَدْ * وَلَمْ يَكُن لَّهُ كُفُوًا أَحَدٌ﴾</w:t>
       </w:r>
     </w:p>
     <w:p>
@@ -8317,7 +9673,40 @@
           <w:szCs w:val="24"/>
           <w:rtl/>
         </w:rPr>
-        <w:t xml:space="preserve">دعاء للحفاظ على الأولاد: ﴿وَالَّذِينَ يَقُولُونَ رَبَّنَا هَبْ لَنَا مِنْ أَزْوَاجِنَا وَذُرِّيَّاتِنَا قُرَّةَ أَعْيُنٍ وَاجْعَلْنَا لِلْمُتَّقِينَ إِمَامًا﴾ و﴿رَبِّ هَبْ لِي مِن لَّدُنكَ ذُرِّيَّةً طَيِّبَةً إِنَّكَ سَمِيعُ الدُّعَاءِ﴾</w:t>
+        <w:t xml:space="preserve">دعاء للحفاظ على الأولاد: </w:t>
+      </w:r>
+      <w:r>
+        <w:rPr>
+          <w:rFonts w:ascii="Times New Roman" w:cs="Times New Roman" w:eastAsia="Times New Roman" w:hAnsi="Times New Roman"/>
+          <w:b/>
+          <w:bCs/>
+          <w:color w:val="B23A2E"/>
+          <w:sz w:val="24"/>
+          <w:szCs w:val="24"/>
+          <w:rtl/>
+        </w:rPr>
+        <w:t xml:space="preserve">﴿وَالَّذِينَ يَقُولُونَ رَبَّنَا هَبْ لَنَا مِنْ أَزْوَاجِنَا وَذُرِّيَّاتِنَا قُرَّةَ أَعْيُنٍ وَاجْعَلْنَا لِلْمُتَّقِينَ إِمَامًا﴾</w:t>
+      </w:r>
+      <w:r>
+        <w:rPr>
+          <w:rFonts w:ascii="Times New Roman" w:cs="Times New Roman" w:eastAsia="Times New Roman" w:hAnsi="Times New Roman"/>
+          <w:sz w:val="24"/>
+          <w:szCs w:val="24"/>
+          <w:rtl/>
+        </w:rPr>
+        <w:t xml:space="preserve"> و</w:t>
+      </w:r>
+      <w:r>
+        <w:rPr>
+          <w:rFonts w:ascii="Times New Roman" w:cs="Times New Roman" w:eastAsia="Times New Roman" w:hAnsi="Times New Roman"/>
+          <w:b/>
+          <w:bCs/>
+          <w:color w:val="B23A2E"/>
+          <w:sz w:val="24"/>
+          <w:szCs w:val="24"/>
+          <w:rtl/>
+        </w:rPr>
+        <w:t xml:space="preserve">﴿رَبِّ هَبْ لِي مِن لَّدُنكَ ذُرِّيَّةً طَيِّبَةً إِنَّكَ سَمِيعُ الدُّعَاءِ﴾</w:t>
       </w:r>
     </w:p>
     <w:p>
@@ -8517,23 +9906,65 @@
           <w:szCs w:val="24"/>
           <w:rtl/>
         </w:rPr>
-        <w:t xml:space="preserve">صدق الله العظيم الذي لا إله إلا هو، المتوحد في الجلال، بكمال الجمال، تعظيمًا وتكبيرًا، المتفرد بتصريف الأحوال والأمور على التفصيل والإجمال، تقديرًا وتدبيرًا، المتعالي بعظمته، ﴿الَّذِي نَزَّلَ الْفُرْقَانَ عَلَىٰ عَبْدِهِ لِيَكُونَ لِلْعَالَمِينَ نَذِيرًا﴾ [الفرقان: 1].</w:t>
-      </w:r>
-    </w:p>
-    <w:p>
-      <w:pPr>
-        <w:bidi/>
-        <w:spacing w:after="200" w:line="340"/>
-        <w:jc w:val="right"/>
-      </w:pPr>
-      <w:r>
-        <w:rPr>
-          <w:rFonts w:ascii="Times New Roman" w:cs="Times New Roman" w:eastAsia="Times New Roman" w:hAnsi="Times New Roman"/>
-          <w:sz w:val="24"/>
-          <w:szCs w:val="24"/>
-          <w:rtl/>
-        </w:rPr>
-        <w:t xml:space="preserve">صدق الله الرحمن الرحيم، صدق الحليم العظيم، وصدق رسوله الكريم، صدق من بعثه الله شاهدًا ومبشرًا ونذيرًا، ﴿وَدَاعِيًا إِلَى اللَّهِ بِإِذْنِهِ وَسِرَاجًا مُّنِيرًا﴾ [الأحزاب: 46]، ونحن على ما قال خالقنا ورازقنا ومولانا من الشاهدين، وبآياته من الموقنين، ولدينه من المنقادين الخاشعين.</w:t>
+        <w:t xml:space="preserve">صدق الله العظيم الذي لا إله إلا هو، المتوحد في الجلال، بكمال الجمال، تعظيمًا وتكبيرًا، المتفرد بتصريف الأحوال والأمور على التفصيل والإجمال، تقديرًا وتدبيرًا، المتعالي بعظمته، </w:t>
+      </w:r>
+      <w:r>
+        <w:rPr>
+          <w:rFonts w:ascii="Times New Roman" w:cs="Times New Roman" w:eastAsia="Times New Roman" w:hAnsi="Times New Roman"/>
+          <w:b/>
+          <w:bCs/>
+          <w:color w:val="B23A2E"/>
+          <w:sz w:val="24"/>
+          <w:szCs w:val="24"/>
+          <w:rtl/>
+        </w:rPr>
+        <w:t xml:space="preserve">﴿الَّذِي نَزَّلَ الْفُرْقَانَ عَلَىٰ عَبْدِهِ لِيَكُونَ لِلْعَالَمِينَ نَذِيرًا﴾</w:t>
+      </w:r>
+      <w:r>
+        <w:rPr>
+          <w:rFonts w:ascii="Times New Roman" w:cs="Times New Roman" w:eastAsia="Times New Roman" w:hAnsi="Times New Roman"/>
+          <w:sz w:val="24"/>
+          <w:szCs w:val="24"/>
+          <w:rtl/>
+        </w:rPr>
+        <w:t xml:space="preserve"> [الفرقان: 1].</w:t>
+      </w:r>
+    </w:p>
+    <w:p>
+      <w:pPr>
+        <w:bidi/>
+        <w:spacing w:after="200" w:line="340"/>
+        <w:jc w:val="right"/>
+      </w:pPr>
+      <w:r>
+        <w:rPr>
+          <w:rFonts w:ascii="Times New Roman" w:cs="Times New Roman" w:eastAsia="Times New Roman" w:hAnsi="Times New Roman"/>
+          <w:sz w:val="24"/>
+          <w:szCs w:val="24"/>
+          <w:rtl/>
+        </w:rPr>
+        <w:t xml:space="preserve">صدق الله الرحمن الرحيم، صدق الحليم العظيم، وصدق رسوله الكريم، صدق من بعثه الله شاهدًا ومبشرًا ونذيرًا، </w:t>
+      </w:r>
+      <w:r>
+        <w:rPr>
+          <w:rFonts w:ascii="Times New Roman" w:cs="Times New Roman" w:eastAsia="Times New Roman" w:hAnsi="Times New Roman"/>
+          <w:b/>
+          <w:bCs/>
+          <w:color w:val="B23A2E"/>
+          <w:sz w:val="24"/>
+          <w:szCs w:val="24"/>
+          <w:rtl/>
+        </w:rPr>
+        <w:t xml:space="preserve">﴿وَدَاعِيًا إِلَى اللَّهِ بِإِذْنِهِ وَسِرَاجًا مُّنِيرًا﴾</w:t>
+      </w:r>
+      <w:r>
+        <w:rPr>
+          <w:rFonts w:ascii="Times New Roman" w:cs="Times New Roman" w:eastAsia="Times New Roman" w:hAnsi="Times New Roman"/>
+          <w:sz w:val="24"/>
+          <w:szCs w:val="24"/>
+          <w:rtl/>
+        </w:rPr>
+        <w:t xml:space="preserve"> [الأحزاب: 46]، ونحن على ما قال خالقنا ورازقنا ومولانا من الشاهدين، وبآياته من الموقنين، ولدينه من المنقادين الخاشعين.</w:t>
       </w:r>
     </w:p>
     <w:p>
@@ -8597,7 +10028,49 @@
           <w:szCs w:val="24"/>
           <w:rtl/>
         </w:rPr>
-        <w:t xml:space="preserve">اللهم لك الحمد على أن أرسلت إلينا أفضل رسلك، وأنزلت عليه أفضل كتبك، وأحسنها نظامًا في الدنيا والآخرة، وأفصحها كلامًا، وأبينها حلالًا وحرامًا، وأعلاها مقامًا، كتاب عظيم الشأن، عظيم السلطان، مشرق البرهان، محفوظ من الزيادة والنقصان، ﴿لَّا يَأْتِيهِ الْبَاطِلُ مِن بَيْنِ يَدَيْهِ وَلَا مِنْ خَلْفِهِ تَنزِيلٌ مِّنْ حَكِيمٍ حَمِيدٍ﴾ [فصلت: 42]، ﴿كِتَابٌ أُحْكِمَتْ آيَاتُهُ ثُمَّ فُصِّلَتْ مِن لَّدُنْ حَكِيمٍ خَبِيرٍ﴾ [هود: 1].</w:t>
+        <w:t xml:space="preserve">اللهم لك الحمد على أن أرسلت إلينا أفضل رسلك، وأنزلت عليه أفضل كتبك، وأحسنها نظامًا في الدنيا والآخرة، وأفصحها كلامًا، وأبينها حلالًا وحرامًا، وأعلاها مقامًا، كتاب عظيم الشأن، عظيم السلطان، مشرق البرهان، محفوظ من الزيادة والنقصان، </w:t>
+      </w:r>
+      <w:r>
+        <w:rPr>
+          <w:rFonts w:ascii="Times New Roman" w:cs="Times New Roman" w:eastAsia="Times New Roman" w:hAnsi="Times New Roman"/>
+          <w:b/>
+          <w:bCs/>
+          <w:color w:val="B23A2E"/>
+          <w:sz w:val="24"/>
+          <w:szCs w:val="24"/>
+          <w:rtl/>
+        </w:rPr>
+        <w:t xml:space="preserve">﴿لَّا يَأْتِيهِ الْبَاطِلُ مِن بَيْنِ يَدَيْهِ وَلَا مِنْ خَلْفِهِ تَنزِيلٌ مِّنْ حَكِيمٍ حَمِيدٍ﴾</w:t>
+      </w:r>
+      <w:r>
+        <w:rPr>
+          <w:rFonts w:ascii="Times New Roman" w:cs="Times New Roman" w:eastAsia="Times New Roman" w:hAnsi="Times New Roman"/>
+          <w:sz w:val="24"/>
+          <w:szCs w:val="24"/>
+          <w:rtl/>
+        </w:rPr>
+        <w:t xml:space="preserve"> [فصلت: 42]، </w:t>
+      </w:r>
+      <w:r>
+        <w:rPr>
+          <w:rFonts w:ascii="Times New Roman" w:cs="Times New Roman" w:eastAsia="Times New Roman" w:hAnsi="Times New Roman"/>
+          <w:b/>
+          <w:bCs/>
+          <w:color w:val="B23A2E"/>
+          <w:sz w:val="24"/>
+          <w:szCs w:val="24"/>
+          <w:rtl/>
+        </w:rPr>
+        <w:t xml:space="preserve">﴿كِتَابٌ أُحْكِمَتْ آيَاتُهُ ثُمَّ فُصِّلَتْ مِن لَّدُنْ حَكِيمٍ خَبِيرٍ﴾</w:t>
+      </w:r>
+      <w:r>
+        <w:rPr>
+          <w:rFonts w:ascii="Times New Roman" w:cs="Times New Roman" w:eastAsia="Times New Roman" w:hAnsi="Times New Roman"/>
+          <w:sz w:val="24"/>
+          <w:szCs w:val="24"/>
+          <w:rtl/>
+        </w:rPr>
+        <w:t xml:space="preserve"> [هود: 1].</w:t>
       </w:r>
     </w:p>
     <w:p>
@@ -8837,7 +10310,28 @@
           <w:szCs w:val="24"/>
           <w:rtl/>
         </w:rPr>
-        <w:t xml:space="preserve">نسألك اللهم في هذه الليلة بوجهك الكريم، أن تجيرنا من النار، اللهم أجرنا من النار. اللهم احشرنا تحت لواء سيد المرسلين، واجعلنا معه من المقربين، يا رب العالمين! اللهم اجعلنا يوم القيامة من الآمنين المطمئنين الذين ﴿لَا خَوْفٌ عَلَيْهِمْ وَلَا هُمْ يَحْزَنُونَ﴾ [يونس: 62]. اللهم ثبّتنا على الصراط، يا رب العالمين! اللهم سهّل علينا كل عقبة دون الجنة، حتى تبلغنا إياها. اللهم إنا نسألك العفو والعافية في أمورنا كلها، في الدين والدنيا والآخرة.</w:t>
+        <w:t xml:space="preserve">نسألك اللهم في هذه الليلة بوجهك الكريم، أن تجيرنا من النار، اللهم أجرنا من النار. اللهم احشرنا تحت لواء سيد المرسلين، واجعلنا معه من المقربين، يا رب العالمين! اللهم اجعلنا يوم القيامة من الآمنين المطمئنين الذين </w:t>
+      </w:r>
+      <w:r>
+        <w:rPr>
+          <w:rFonts w:ascii="Times New Roman" w:cs="Times New Roman" w:eastAsia="Times New Roman" w:hAnsi="Times New Roman"/>
+          <w:b/>
+          <w:bCs/>
+          <w:color w:val="B23A2E"/>
+          <w:sz w:val="24"/>
+          <w:szCs w:val="24"/>
+          <w:rtl/>
+        </w:rPr>
+        <w:t xml:space="preserve">﴿لَا خَوْفٌ عَلَيْهِمْ وَلَا هُمْ يَحْزَنُونَ﴾</w:t>
+      </w:r>
+      <w:r>
+        <w:rPr>
+          <w:rFonts w:ascii="Times New Roman" w:cs="Times New Roman" w:eastAsia="Times New Roman" w:hAnsi="Times New Roman"/>
+          <w:sz w:val="24"/>
+          <w:szCs w:val="24"/>
+          <w:rtl/>
+        </w:rPr>
+        <w:t xml:space="preserve"> [يونس: 62]. اللهم ثبّتنا على الصراط، يا رب العالمين! اللهم سهّل علينا كل عقبة دون الجنة، حتى تبلغنا إياها. اللهم إنا نسألك العفو والعافية في أمورنا كلها، في الدين والدنيا والآخرة.</w:t>
       </w:r>
     </w:p>
     <w:p>
@@ -9221,39 +10715,105 @@
           <w:szCs w:val="24"/>
           <w:rtl/>
         </w:rPr>
-        <w:t xml:space="preserve">اللهم ﴿تَقَبَّلْ مِنَّا إِنَّكَ أَنتَ السَّمِيعُ الْعَلِيمُ﴾ [البقرة: 127]، ﴿وَتُبْ عَلَيْنَا إِنَّكَ أَنتَ التَّوَّابُ الرَّحِيمُ﴾ [البقرة: 128].</w:t>
-      </w:r>
-    </w:p>
-    <w:p>
-      <w:pPr>
-        <w:bidi/>
-        <w:spacing w:after="200" w:line="340"/>
-        <w:jc w:val="right"/>
-      </w:pPr>
-      <w:r>
-        <w:rPr>
-          <w:rFonts w:ascii="Times New Roman" w:cs="Times New Roman" w:eastAsia="Times New Roman" w:hAnsi="Times New Roman"/>
-          <w:sz w:val="24"/>
-          <w:szCs w:val="24"/>
-          <w:rtl/>
-        </w:rPr>
-        <w:t xml:space="preserve">﴿رَبَّنَا لَا تُؤَاخِذْنَا إِن نَّسِينَا أَوْ أَخْطَأْنَا رَبَّنَا وَلَا تَحْمِلْ عَلَيْنَا إِصْرًا كَمَا حَمَلْتَهُ عَلَى الَّذِينَ مِن قَبْلِنَا رَبَّنَا وَلَا تُحَمِّلْنَا مَا لَا طَاقَةَ لَنَا بِهِ وَاعْفُ عَنَّا وَاغْفِرْ لَنَا وَارْحَمْنَا أَنتَ مَوْلَانَا فَانصُرْنَا عَلَى الْقَوْمِ الْكَافِرِينَ﴾ [البقرة: 286].</w:t>
-      </w:r>
-    </w:p>
-    <w:p>
-      <w:pPr>
-        <w:bidi/>
-        <w:spacing w:after="200" w:line="340"/>
-        <w:jc w:val="right"/>
-      </w:pPr>
-      <w:r>
-        <w:rPr>
-          <w:rFonts w:ascii="Times New Roman" w:cs="Times New Roman" w:eastAsia="Times New Roman" w:hAnsi="Times New Roman"/>
-          <w:sz w:val="24"/>
-          <w:szCs w:val="24"/>
-          <w:rtl/>
-        </w:rPr>
-        <w:t xml:space="preserve">﴿وَلَا تَجْعَلْ فِي قُلُوبِنَا غِلًّا لِّلَّذِينَ آمَنُوا رَبَّنَا إِنَّكَ رَؤُوفٌ رَّحِيمٌ﴾ [الحشر: 10].</w:t>
+        <w:t xml:space="preserve">اللهم </w:t>
+      </w:r>
+      <w:r>
+        <w:rPr>
+          <w:rFonts w:ascii="Times New Roman" w:cs="Times New Roman" w:eastAsia="Times New Roman" w:hAnsi="Times New Roman"/>
+          <w:b/>
+          <w:bCs/>
+          <w:color w:val="B23A2E"/>
+          <w:sz w:val="24"/>
+          <w:szCs w:val="24"/>
+          <w:rtl/>
+        </w:rPr>
+        <w:t xml:space="preserve">﴿تَقَبَّلْ مِنَّا إِنَّكَ أَنتَ السَّمِيعُ الْعَلِيمُ﴾</w:t>
+      </w:r>
+      <w:r>
+        <w:rPr>
+          <w:rFonts w:ascii="Times New Roman" w:cs="Times New Roman" w:eastAsia="Times New Roman" w:hAnsi="Times New Roman"/>
+          <w:sz w:val="24"/>
+          <w:szCs w:val="24"/>
+          <w:rtl/>
+        </w:rPr>
+        <w:t xml:space="preserve"> [البقرة: 127]، </w:t>
+      </w:r>
+      <w:r>
+        <w:rPr>
+          <w:rFonts w:ascii="Times New Roman" w:cs="Times New Roman" w:eastAsia="Times New Roman" w:hAnsi="Times New Roman"/>
+          <w:b/>
+          <w:bCs/>
+          <w:color w:val="B23A2E"/>
+          <w:sz w:val="24"/>
+          <w:szCs w:val="24"/>
+          <w:rtl/>
+        </w:rPr>
+        <w:t xml:space="preserve">﴿وَتُبْ عَلَيْنَا إِنَّكَ أَنتَ التَّوَّابُ الرَّحِيمُ﴾</w:t>
+      </w:r>
+      <w:r>
+        <w:rPr>
+          <w:rFonts w:ascii="Times New Roman" w:cs="Times New Roman" w:eastAsia="Times New Roman" w:hAnsi="Times New Roman"/>
+          <w:sz w:val="24"/>
+          <w:szCs w:val="24"/>
+          <w:rtl/>
+        </w:rPr>
+        <w:t xml:space="preserve"> [البقرة: 128].</w:t>
+      </w:r>
+    </w:p>
+    <w:p>
+      <w:pPr>
+        <w:bidi/>
+        <w:spacing w:after="200" w:line="340"/>
+        <w:jc w:val="right"/>
+      </w:pPr>
+      <w:r>
+        <w:rPr>
+          <w:rFonts w:ascii="Times New Roman" w:cs="Times New Roman" w:eastAsia="Times New Roman" w:hAnsi="Times New Roman"/>
+          <w:b/>
+          <w:bCs/>
+          <w:color w:val="B23A2E"/>
+          <w:sz w:val="24"/>
+          <w:szCs w:val="24"/>
+          <w:rtl/>
+        </w:rPr>
+        <w:t xml:space="preserve">﴿رَبَّنَا لَا تُؤَاخِذْنَا إِن نَّسِينَا أَوْ أَخْطَأْنَا رَبَّنَا وَلَا تَحْمِلْ عَلَيْنَا إِصْرًا كَمَا حَمَلْتَهُ عَلَى الَّذِينَ مِن قَبْلِنَا رَبَّنَا وَلَا تُحَمِّلْنَا مَا لَا طَاقَةَ لَنَا بِهِ وَاعْفُ عَنَّا وَاغْفِرْ لَنَا وَارْحَمْنَا أَنتَ مَوْلَانَا فَانصُرْنَا عَلَى الْقَوْمِ الْكَافِرِينَ﴾</w:t>
+      </w:r>
+      <w:r>
+        <w:rPr>
+          <w:rFonts w:ascii="Times New Roman" w:cs="Times New Roman" w:eastAsia="Times New Roman" w:hAnsi="Times New Roman"/>
+          <w:sz w:val="24"/>
+          <w:szCs w:val="24"/>
+          <w:rtl/>
+        </w:rPr>
+        <w:t xml:space="preserve"> [البقرة: 286].</w:t>
+      </w:r>
+    </w:p>
+    <w:p>
+      <w:pPr>
+        <w:bidi/>
+        <w:spacing w:after="200" w:line="340"/>
+        <w:jc w:val="right"/>
+      </w:pPr>
+      <w:r>
+        <w:rPr>
+          <w:rFonts w:ascii="Times New Roman" w:cs="Times New Roman" w:eastAsia="Times New Roman" w:hAnsi="Times New Roman"/>
+          <w:b/>
+          <w:bCs/>
+          <w:color w:val="B23A2E"/>
+          <w:sz w:val="24"/>
+          <w:szCs w:val="24"/>
+          <w:rtl/>
+        </w:rPr>
+        <w:t xml:space="preserve">﴿وَلَا تَجْعَلْ فِي قُلُوبِنَا غِلًّا لِّلَّذِينَ آمَنُوا رَبَّنَا إِنَّكَ رَؤُوفٌ رَّحِيمٌ﴾</w:t>
+      </w:r>
+      <w:r>
+        <w:rPr>
+          <w:rFonts w:ascii="Times New Roman" w:cs="Times New Roman" w:eastAsia="Times New Roman" w:hAnsi="Times New Roman"/>
+          <w:sz w:val="24"/>
+          <w:szCs w:val="24"/>
+          <w:rtl/>
+        </w:rPr>
+        <w:t xml:space="preserve"> [الحشر: 10].</w:t>
       </w:r>
     </w:p>
     <w:p>
@@ -9371,6 +10931,63 @@
       <w:r>
         <w:rPr>
           <w:rFonts w:ascii="Times New Roman" w:cs="Times New Roman" w:eastAsia="Times New Roman" w:hAnsi="Times New Roman"/>
+          <w:sz w:val="24"/>
+          <w:szCs w:val="24"/>
+          <w:rtl/>
+        </w:rPr>
+        <w:t xml:space="preserve">إذا فرغ من الصلاة أحرم وقال: «لبيك عمرة» (ولمن يؤدي العمرة عن شخص متوفى، يقول: «اللهم لبيك عمرة عن فلان»، مع أن النية تكفي). يَحرُم بعد الإحرام: الطيب، والنساء، ولبس المخيط، والأخذ من شعر الجسم، والصيد.</w:t>
+      </w:r>
+    </w:p>
+    <w:p>
+      <w:pPr>
+        <w:bidi/>
+        <w:spacing w:after="200" w:line="340"/>
+        <w:jc w:val="right"/>
+      </w:pPr>
+      <w:r>
+        <w:rPr>
+          <w:rFonts w:ascii="Times New Roman" w:cs="Times New Roman" w:eastAsia="Times New Roman" w:hAnsi="Times New Roman"/>
+          <w:sz w:val="24"/>
+          <w:szCs w:val="24"/>
+          <w:rtl/>
+        </w:rPr>
+        <w:t xml:space="preserve">التلبية: «لبيك اللهم لبيك، لبيك لا شريك لك لبيك، إن الحمد والنعمة لك والملك، لا شريك لك» — يرفع الرجل صوته بها، والمرأة تقولها بقدر ما يُسمع من بجوارها فقط. يُستحب الإكثار من التلبية، خصوصًا عند تغيّر الأحوال (كصعود مرتفع أو نزول منخفض، أو إقبال الليل أو النهار)، ثم يسأل الله رضوانه والجنة ويستعيذ برحمته من النار. والتلبية مشروعة من الإحرام إلى بدء الطواف (في العمرة)، ومن الإحرام إلى رمي جمرة العقبة يوم العيد (في الحج).</w:t>
+      </w:r>
+    </w:p>
+    <w:p>
+      <w:pPr>
+        <w:bidi/>
+        <w:spacing w:after="200" w:line="340"/>
+        <w:jc w:val="right"/>
+      </w:pPr>
+      <w:r>
+        <w:rPr>
+          <w:rFonts w:ascii="Times New Roman" w:cs="Times New Roman" w:eastAsia="Times New Roman" w:hAnsi="Times New Roman"/>
+          <w:sz w:val="24"/>
+          <w:szCs w:val="24"/>
+          <w:rtl/>
+        </w:rPr>
+        <w:t xml:space="preserve">دخول المسجد الحرام: يُقدّم رجله اليمنى ويقول: «بسم الله، والصلاة والسلام على رسول الله، اللهم اغفر لي ذنوبي، وافتح لي أبواب رحمتك، أعوذ بالله العظيم، وبوجهه الكريم، وبسلطانه القديم، من الشيطان الرجيم»</w:t>
+      </w:r>
+    </w:p>
+    <w:p>
+      <w:pPr>
+        <w:bidi/>
+        <w:spacing w:after="200" w:line="340"/>
+        <w:jc w:val="right"/>
+      </w:pPr>
+      <w:r>
+        <w:rPr>
+          <w:rFonts w:ascii="Times New Roman" w:cs="Times New Roman" w:eastAsia="Times New Roman" w:hAnsi="Times New Roman"/>
+          <w:sz w:val="24"/>
+          <w:szCs w:val="24"/>
+          <w:rtl/>
+        </w:rPr>
+        <w:t xml:space="preserve">الطواف: يتقدم إلى الحجر الأسود ليبدأ الطواف، فيستلمه بيده اليمنى ويُقبّله (فإن تعذّر، يستقبله ويُشير إليه بيده اليمنى دون تقبيل يده)، ويقول عند استلامه: «بسم الله والله أكبر، اللهم إيمانًا بك، وتصديقًا بكتابك، ووفاء بعهدك، واتباعًا لسنة نبيك محمد صلى الله عليه وسلم». ثم يجعل البيت عن يساره، فإذا بلغ الركن اليماني استلمه من غير تقبيل (أو لا يزاحم ولا يُشير إليه)، ويقول بينه وبين الحجر الأسود: </w:t>
+      </w:r>
+      <w:r>
+        <w:rPr>
+          <w:rFonts w:ascii="Times New Roman" w:cs="Times New Roman" w:eastAsia="Times New Roman" w:hAnsi="Times New Roman"/>
           <w:b/>
           <w:bCs/>
           <w:color w:val="B23A2E"/>
@@ -9378,32 +10995,48 @@
           <w:szCs w:val="24"/>
           <w:rtl/>
         </w:rPr>
-        <w:t xml:space="preserve">إذا فرغ من الصلاة أحرم وقال: «لبيك عمرة» (ولمن يؤدي العمرة عن شخص متوفى، يقول: «اللهم لبيك عمرة عن فلان»، مع أن النية تكفي).</w:t>
-      </w:r>
-      <w:r>
-        <w:rPr>
-          <w:rFonts w:ascii="Times New Roman" w:cs="Times New Roman" w:eastAsia="Times New Roman" w:hAnsi="Times New Roman"/>
-          <w:sz w:val="24"/>
-          <w:szCs w:val="24"/>
-          <w:rtl/>
-        </w:rPr>
-        <w:t xml:space="preserve"> يَحرُم بعد الإحرام: الطيب، والنساء، ولبس المخيط، والأخذ من شعر الجسم، والصيد.</w:t>
-      </w:r>
-    </w:p>
-    <w:p>
-      <w:pPr>
-        <w:bidi/>
-        <w:spacing w:after="200" w:line="340"/>
-        <w:jc w:val="right"/>
-      </w:pPr>
-      <w:r>
-        <w:rPr>
-          <w:rFonts w:ascii="Times New Roman" w:cs="Times New Roman" w:eastAsia="Times New Roman" w:hAnsi="Times New Roman"/>
-          <w:sz w:val="24"/>
-          <w:szCs w:val="24"/>
-          <w:rtl/>
-        </w:rPr>
-        <w:t xml:space="preserve">التلبية: </w:t>
+        <w:t xml:space="preserve">«رَبَّنَا آتِنَا فِي الدُّنْيَا حَسَنَةً وَفِي الْآخِرَةِ حَسَنَةً وَقِنَا عَذَابَ النَّارِ»</w:t>
+      </w:r>
+      <w:r>
+        <w:rPr>
+          <w:rFonts w:ascii="Times New Roman" w:cs="Times New Roman" w:eastAsia="Times New Roman" w:hAnsi="Times New Roman"/>
+          <w:sz w:val="24"/>
+          <w:szCs w:val="24"/>
+          <w:rtl/>
+        </w:rPr>
+        <w:t xml:space="preserve">، ويُكبّر كلما مرّ بالحجر الأسود. وفي بقية الطواف يقول ما أحب من ذكر ودعاء وقراءة قرآن.</w:t>
+      </w:r>
+    </w:p>
+    <w:p>
+      <w:pPr>
+        <w:bidi/>
+        <w:spacing w:after="200" w:line="340"/>
+        <w:jc w:val="right"/>
+      </w:pPr>
+      <w:r>
+        <w:rPr>
+          <w:rFonts w:ascii="Times New Roman" w:cs="Times New Roman" w:eastAsia="Times New Roman" w:hAnsi="Times New Roman"/>
+          <w:sz w:val="24"/>
+          <w:szCs w:val="24"/>
+          <w:rtl/>
+        </w:rPr>
+        <w:t xml:space="preserve">في هذا الطواف يُستحب للرجل: الاضطباع (جعل وسط الرداء تحت الإبط الأيمن وطرفيه على الكتف الأيسر) طوال الطواف، والرَّمَل (الإسراع مع مقاربة الخطى) في الأشواط الثلاثة الأولى فقط، وباقي الأشواط الأربعة يمشي كعادته.</w:t>
+      </w:r>
+    </w:p>
+    <w:p>
+      <w:pPr>
+        <w:bidi/>
+        <w:spacing w:after="200" w:line="340"/>
+        <w:jc w:val="right"/>
+      </w:pPr>
+      <w:r>
+        <w:rPr>
+          <w:rFonts w:ascii="Times New Roman" w:cs="Times New Roman" w:eastAsia="Times New Roman" w:hAnsi="Times New Roman"/>
+          <w:sz w:val="24"/>
+          <w:szCs w:val="24"/>
+          <w:rtl/>
+        </w:rPr>
+        <w:t xml:space="preserve">بعد سبعة أشواط، يتقدم إلى مقام إبراهيم ويقرأ </w:t>
       </w:r>
       <w:r>
         <w:rPr>
@@ -9415,32 +11048,16 @@
           <w:szCs w:val="24"/>
           <w:rtl/>
         </w:rPr>
-        <w:t xml:space="preserve">«لبيك اللهم لبيك، لبيك لا شريك لك لبيك، إن الحمد والنعمة لك والملك، لا شريك لك»</w:t>
-      </w:r>
-      <w:r>
-        <w:rPr>
-          <w:rFonts w:ascii="Times New Roman" w:cs="Times New Roman" w:eastAsia="Times New Roman" w:hAnsi="Times New Roman"/>
-          <w:sz w:val="24"/>
-          <w:szCs w:val="24"/>
-          <w:rtl/>
-        </w:rPr>
-        <w:t xml:space="preserve"> — يرفع الرجل صوته بها، والمرأة تقولها بقدر ما يُسمع من بجوارها فقط. يُستحب الإكثار من التلبية، خصوصًا عند تغيّر الأحوال (كصعود مرتفع أو نزول منخفض، أو إقبال الليل أو النهار)، ثم يسأل الله رضوانه والجنة ويستعيذ برحمته من النار. والتلبية مشروعة من الإحرام إلى بدء الطواف (في العمرة)، ومن الإحرام إلى رمي جمرة العقبة يوم العيد (في الحج).</w:t>
-      </w:r>
-    </w:p>
-    <w:p>
-      <w:pPr>
-        <w:bidi/>
-        <w:spacing w:after="200" w:line="340"/>
-        <w:jc w:val="right"/>
-      </w:pPr>
-      <w:r>
-        <w:rPr>
-          <w:rFonts w:ascii="Times New Roman" w:cs="Times New Roman" w:eastAsia="Times New Roman" w:hAnsi="Times New Roman"/>
-          <w:sz w:val="24"/>
-          <w:szCs w:val="24"/>
-          <w:rtl/>
-        </w:rPr>
-        <w:t xml:space="preserve">دخول المسجد الحرام: يُقدّم رجله اليمنى ويقول: </w:t>
+        <w:t xml:space="preserve">﴿وَاتَّخِذُوا مِن مَّقَامِ إِبْرَاهِيمَ مُصَلًّى﴾</w:t>
+      </w:r>
+      <w:r>
+        <w:rPr>
+          <w:rFonts w:ascii="Times New Roman" w:cs="Times New Roman" w:eastAsia="Times New Roman" w:hAnsi="Times New Roman"/>
+          <w:sz w:val="24"/>
+          <w:szCs w:val="24"/>
+          <w:rtl/>
+        </w:rPr>
+        <w:t xml:space="preserve">، ثم يصلي خلفه ركعتين خفيفتين، يقرأ في الأولى بعد الفاتحة </w:t>
       </w:r>
       <w:r>
         <w:rPr>
@@ -9452,23 +11069,16 @@
           <w:szCs w:val="24"/>
           <w:rtl/>
         </w:rPr>
-        <w:t xml:space="preserve">«بسم الله، والصلاة والسلام على رسول الله، اللهم اغفر لي ذنوبي، وافتح لي أبواب رحمتك، أعوذ بالله العظيم، وبوجهه الكريم، وبسلطانه القديم، من الشيطان الرجيم»</w:t>
-      </w:r>
-    </w:p>
-    <w:p>
-      <w:pPr>
-        <w:bidi/>
-        <w:spacing w:after="200" w:line="340"/>
-        <w:jc w:val="right"/>
-      </w:pPr>
-      <w:r>
-        <w:rPr>
-          <w:rFonts w:ascii="Times New Roman" w:cs="Times New Roman" w:eastAsia="Times New Roman" w:hAnsi="Times New Roman"/>
-          <w:sz w:val="24"/>
-          <w:szCs w:val="24"/>
-          <w:rtl/>
-        </w:rPr>
-        <w:t xml:space="preserve">الطواف: يتقدم إلى الحجر الأسود ليبدأ الطواف، فيستلمه بيده اليمنى ويُقبّله (فإن تعذّر، يستقبله ويُشير إليه بيده اليمنى دون تقبيل يده)، ويقول عند استلامه: </w:t>
+        <w:t xml:space="preserve">﴿قُلْ يَا أَيُّهَا الْكَافِرُونَ﴾</w:t>
+      </w:r>
+      <w:r>
+        <w:rPr>
+          <w:rFonts w:ascii="Times New Roman" w:cs="Times New Roman" w:eastAsia="Times New Roman" w:hAnsi="Times New Roman"/>
+          <w:sz w:val="24"/>
+          <w:szCs w:val="24"/>
+          <w:rtl/>
+        </w:rPr>
+        <w:t xml:space="preserve"> وفي الثانية </w:t>
       </w:r>
       <w:r>
         <w:rPr>
@@ -9480,16 +11090,48 @@
           <w:szCs w:val="24"/>
           <w:rtl/>
         </w:rPr>
-        <w:t xml:space="preserve">«بسم الله والله أكبر، اللهم إيمانًا بك، وتصديقًا بكتابك، ووفاء بعهدك، واتباعًا لسنة نبيك محمد صلى الله عليه وسلم»</w:t>
-      </w:r>
-      <w:r>
-        <w:rPr>
-          <w:rFonts w:ascii="Times New Roman" w:cs="Times New Roman" w:eastAsia="Times New Roman" w:hAnsi="Times New Roman"/>
-          <w:sz w:val="24"/>
-          <w:szCs w:val="24"/>
-          <w:rtl/>
-        </w:rPr>
-        <w:t xml:space="preserve">. ثم يجعل البيت عن يساره، فإذا بلغ الركن اليماني استلمه من غير تقبيل (أو لا يزاحم ولا يُشير إليه)، ويقول بينه وبين الحجر الأسود: </w:t>
+        <w:t xml:space="preserve">﴿قُلْ هُوَ اللَّهُ أَحَدٌ﴾</w:t>
+      </w:r>
+      <w:r>
+        <w:rPr>
+          <w:rFonts w:ascii="Times New Roman" w:cs="Times New Roman" w:eastAsia="Times New Roman" w:hAnsi="Times New Roman"/>
+          <w:sz w:val="24"/>
+          <w:szCs w:val="24"/>
+          <w:rtl/>
+        </w:rPr>
+        <w:t xml:space="preserve">. ثم يرجع فيستلم الحجر الأسود إن تيسر، وإلا أشار إليه.</w:t>
+      </w:r>
+    </w:p>
+    <w:p>
+      <w:pPr>
+        <w:bidi/>
+        <w:spacing w:after="200" w:line="340"/>
+        <w:jc w:val="right"/>
+      </w:pPr>
+      <w:r>
+        <w:rPr>
+          <w:rFonts w:ascii="Times New Roman" w:cs="Times New Roman" w:eastAsia="Times New Roman" w:hAnsi="Times New Roman"/>
+          <w:sz w:val="24"/>
+          <w:szCs w:val="24"/>
+          <w:rtl/>
+        </w:rPr>
+        <w:t xml:space="preserve">الشرب من ماء زمزم: يُستحب الشرب من ماء زمزم بنية الشفاء، ويسأل الله من خير الدنيا والآخرة، ويستقبل القبلة، ويتضلّع منه (يشبع)، لحديث النبي صلى الله عليه وسلم: «خير ماء على وجه الأرض ماء زمزم، فيه طعام الطُّعم وشفاء السُّقم»</w:t>
+      </w:r>
+    </w:p>
+    <w:p>
+      <w:pPr>
+        <w:bidi/>
+        <w:spacing w:after="200" w:line="340"/>
+        <w:jc w:val="right"/>
+      </w:pPr>
+      <w:r>
+        <w:rPr>
+          <w:rFonts w:ascii="Times New Roman" w:cs="Times New Roman" w:eastAsia="Times New Roman" w:hAnsi="Times New Roman"/>
+          <w:sz w:val="24"/>
+          <w:szCs w:val="24"/>
+          <w:rtl/>
+        </w:rPr>
+        <w:t xml:space="preserve">السعي بين الصفا والمروة: يخرج إلى المسعى، فإذا دنا من الصفا قرأ </w:t>
       </w:r>
       <w:r>
         <w:rPr>
@@ -9501,103 +11143,6 @@
           <w:szCs w:val="24"/>
           <w:rtl/>
         </w:rPr>
-        <w:t xml:space="preserve">«رَبَّنَا آتِنَا فِي الدُّنْيَا حَسَنَةً وَفِي الْآخِرَةِ حَسَنَةً وَقِنَا عَذَابَ النَّارِ»</w:t>
-      </w:r>
-      <w:r>
-        <w:rPr>
-          <w:rFonts w:ascii="Times New Roman" w:cs="Times New Roman" w:eastAsia="Times New Roman" w:hAnsi="Times New Roman"/>
-          <w:sz w:val="24"/>
-          <w:szCs w:val="24"/>
-          <w:rtl/>
-        </w:rPr>
-        <w:t xml:space="preserve">، ويُكبّر كلما مرّ بالحجر الأسود. وفي بقية الطواف يقول ما أحب من ذكر ودعاء وقراءة قرآن.</w:t>
-      </w:r>
-    </w:p>
-    <w:p>
-      <w:pPr>
-        <w:bidi/>
-        <w:spacing w:after="200" w:line="340"/>
-        <w:jc w:val="right"/>
-      </w:pPr>
-      <w:r>
-        <w:rPr>
-          <w:rFonts w:ascii="Times New Roman" w:cs="Times New Roman" w:eastAsia="Times New Roman" w:hAnsi="Times New Roman"/>
-          <w:sz w:val="24"/>
-          <w:szCs w:val="24"/>
-          <w:rtl/>
-        </w:rPr>
-        <w:t xml:space="preserve">في هذا الطواف يُستحب للرجل: الاضطباع (جعل وسط الرداء تحت الإبط الأيمن وطرفيه على الكتف الأيسر) طوال الطواف، والرَّمَل (الإسراع مع مقاربة الخطى) في الأشواط الثلاثة الأولى فقط، وباقي الأشواط الأربعة يمشي كعادته.</w:t>
-      </w:r>
-    </w:p>
-    <w:p>
-      <w:pPr>
-        <w:bidi/>
-        <w:spacing w:after="200" w:line="340"/>
-        <w:jc w:val="right"/>
-      </w:pPr>
-      <w:r>
-        <w:rPr>
-          <w:rFonts w:ascii="Times New Roman" w:cs="Times New Roman" w:eastAsia="Times New Roman" w:hAnsi="Times New Roman"/>
-          <w:b/>
-          <w:bCs/>
-          <w:color w:val="B23A2E"/>
-          <w:sz w:val="24"/>
-          <w:szCs w:val="24"/>
-          <w:rtl/>
-        </w:rPr>
-        <w:t xml:space="preserve">بعد سبعة أشواط، يتقدم إلى مقام إبراهيم ويقرأ ﴿وَاتَّخِذُوا مِن مَّقَامِ إِبْرَاهِيمَ مُصَلًّى﴾، ثم يصلي خلفه ركعتين خفيفتين، يقرأ في الأولى بعد الفاتحة ﴿قُلْ يَا أَيُّهَا الْكَافِرُونَ﴾ وفي الثانية ﴿قُلْ هُوَ اللَّهُ أَحَدٌ﴾.</w:t>
-      </w:r>
-      <w:r>
-        <w:rPr>
-          <w:rFonts w:ascii="Times New Roman" w:cs="Times New Roman" w:eastAsia="Times New Roman" w:hAnsi="Times New Roman"/>
-          <w:sz w:val="24"/>
-          <w:szCs w:val="24"/>
-          <w:rtl/>
-        </w:rPr>
-        <w:t xml:space="preserve"> ثم يرجع فيستلم الحجر الأسود إن تيسر، وإلا أشار إليه.</w:t>
-      </w:r>
-    </w:p>
-    <w:p>
-      <w:pPr>
-        <w:bidi/>
-        <w:spacing w:after="200" w:line="340"/>
-        <w:jc w:val="right"/>
-      </w:pPr>
-      <w:r>
-        <w:rPr>
-          <w:rFonts w:ascii="Times New Roman" w:cs="Times New Roman" w:eastAsia="Times New Roman" w:hAnsi="Times New Roman"/>
-          <w:sz w:val="24"/>
-          <w:szCs w:val="24"/>
-          <w:rtl/>
-        </w:rPr>
-        <w:t xml:space="preserve">الشرب من ماء زمزم: يُستحب الشرب من ماء زمزم بنية الشفاء، ويسأل الله من خير الدنيا والآخرة، ويستقبل القبلة، ويتضلّع منه (يشبع)، لحديث النبي صلى الله عليه وسلم: «خير ماء على وجه الأرض ماء زمزم، فيه طعام الطُّعم وشفاء السُّقم»</w:t>
-      </w:r>
-    </w:p>
-    <w:p>
-      <w:pPr>
-        <w:bidi/>
-        <w:spacing w:after="200" w:line="340"/>
-        <w:jc w:val="right"/>
-      </w:pPr>
-      <w:r>
-        <w:rPr>
-          <w:rFonts w:ascii="Times New Roman" w:cs="Times New Roman" w:eastAsia="Times New Roman" w:hAnsi="Times New Roman"/>
-          <w:sz w:val="24"/>
-          <w:szCs w:val="24"/>
-          <w:rtl/>
-        </w:rPr>
-        <w:t xml:space="preserve">السعي بين الصفا والمروة: يخرج إلى المسعى، فإذا دنا من الصفا قرأ </w:t>
-      </w:r>
-      <w:r>
-        <w:rPr>
-          <w:rFonts w:ascii="Times New Roman" w:cs="Times New Roman" w:eastAsia="Times New Roman" w:hAnsi="Times New Roman"/>
-          <w:b/>
-          <w:bCs/>
-          <w:color w:val="B23A2E"/>
-          <w:sz w:val="24"/>
-          <w:szCs w:val="24"/>
-          <w:rtl/>
-        </w:rPr>
         <w:t xml:space="preserve">﴿إِنَّ الصَّفَا وَالْمَرْوَةَ مِن شَعَائِرِ اللَّهِ﴾</w:t>
       </w:r>
       <w:r>
@@ -9607,28 +11152,7 @@
           <w:szCs w:val="24"/>
           <w:rtl/>
         </w:rPr>
-        <w:t xml:space="preserve">، ثم يرقى على الصفا حتى يرى الكعبة فيستقبلها، ويرفع يديه كرفعهما في الدعاء، فيحمد الله ويدعو، ومن دعاء النبي صلى الله عليه وسلم هنا: </w:t>
-      </w:r>
-      <w:r>
-        <w:rPr>
-          <w:rFonts w:ascii="Times New Roman" w:cs="Times New Roman" w:eastAsia="Times New Roman" w:hAnsi="Times New Roman"/>
-          <w:b/>
-          <w:bCs/>
-          <w:color w:val="B23A2E"/>
-          <w:sz w:val="24"/>
-          <w:szCs w:val="24"/>
-          <w:rtl/>
-        </w:rPr>
-        <w:t xml:space="preserve">«لا إله إلا الله، وحده لا شريك له، له الملك، وله الحمد، يحيي ويميت وهو على كل شيء قدير، لا إله إلا الله وحده، أنجز وعده، ونصر عبده، وهزم الأحزاب وحده»</w:t>
-      </w:r>
-      <w:r>
-        <w:rPr>
-          <w:rFonts w:ascii="Times New Roman" w:cs="Times New Roman" w:eastAsia="Times New Roman" w:hAnsi="Times New Roman"/>
-          <w:sz w:val="24"/>
-          <w:szCs w:val="24"/>
-          <w:rtl/>
-        </w:rPr>
-        <w:t xml:space="preserve"> (يُكرر 3 مرات، ويدعو بينها).</w:t>
+        <w:t xml:space="preserve">، ثم يرقى على الصفا حتى يرى الكعبة فيستقبلها، ويرفع يديه كرفعهما في الدعاء، فيحمد الله ويدعو، ومن دعاء النبي صلى الله عليه وسلم هنا: «لا إله إلا الله، وحده لا شريك له، له الملك، وله الحمد، يحيي ويميت وهو على كل شيء قدير، لا إله إلا الله وحده، أنجز وعده، ونصر عبده، وهزم الأحزاب وحده» (يُكرر 3 مرات، ويدعو بينها).</w:t>
       </w:r>
     </w:p>
     <w:p>
@@ -9746,11 +11270,128 @@
       <w:r>
         <w:rPr>
           <w:rFonts w:ascii="Times New Roman" w:cs="Times New Roman" w:eastAsia="Times New Roman" w:hAnsi="Times New Roman"/>
-          <w:sz w:val="24"/>
-          <w:szCs w:val="24"/>
-          <w:rtl/>
-        </w:rPr>
-        <w:t xml:space="preserve">﴿الْحَمْدُ لِلَّهِ رَبِّ الْعَالَمِينَ * الرَّحْمَنِ الرَّحِيمِ * مَالِكِ يَوْمِ الدِّينِ * إِيَّاكَ نَعْبُدُ وَإِيَّاكَ نَسْتَعِينُ * اهْدِنَا الصِّرَاطَ الْمُسْتَقِيمَ * صِرَاطَ الَّذِينَ أَنْعَمْتَ عَلَيْهِمْ غَيْرِ الْمَغْضُوبِ عَلَيْهِمْ وَلَا الضَّالِّينَ﴾ ثم آية الكرسي كاملة، ثم آية النعاس (﴿ثُمَّ أَنزَلَ عَلَيْكُم مِّن بَعْدِ الْغَمِّ أَمَنَةً نُّعَاسًا...﴾)، ثم ﴿وَإِذَا جَاءَكَ الَّذِينَ يُؤْمِنُونَ بِآيَاتِنَا فَقُلْ سَلَامٌ عَلَيْكُمْ...﴾، ثم ﴿هُوَ الَّذِي أَرْسَلَ رَسُولَهُ بِالْهُدَىٰ وَدِينِ الْحَقِّ...﴾، ثم آية ﴿مُّحَمَّدٌ رَّسُولُ اللَّهِ وَالَّذِينَ مَعَهُ أَشِدَّاءُ عَلَى الْكُفَّارِ...﴾، ثم ﴿لَوْ أَنزَلْنَا هَٰذَا الْقُرْآنَ عَلَىٰ جَبَلٍ لَّرَأَيْتَهُ خَاشِعًا مُّتَصَدِّعًا...﴾ وآيات آخر سورة الحشر (الأسماء الحسنى)، ثم سورة الشرح كاملة، ثم سورة الإخلاص كاملة.</w:t>
+          <w:b/>
+          <w:bCs/>
+          <w:color w:val="B23A2E"/>
+          <w:sz w:val="24"/>
+          <w:szCs w:val="24"/>
+          <w:rtl/>
+        </w:rPr>
+        <w:t xml:space="preserve">﴿الْحَمْدُ لِلَّهِ رَبِّ الْعَالَمِينَ * الرَّحْمَنِ الرَّحِيمِ * مَالِكِ يَوْمِ الدِّينِ * إِيَّاكَ نَعْبُدُ وَإِيَّاكَ نَسْتَعِينُ * اهْدِنَا الصِّرَاطَ الْمُسْتَقِيمَ * صِرَاطَ الَّذِينَ أَنْعَمْتَ عَلَيْهِمْ غَيْرِ الْمَغْضُوبِ عَلَيْهِمْ وَلَا الضَّالِّينَ﴾</w:t>
+      </w:r>
+      <w:r>
+        <w:rPr>
+          <w:rFonts w:ascii="Times New Roman" w:cs="Times New Roman" w:eastAsia="Times New Roman" w:hAnsi="Times New Roman"/>
+          <w:sz w:val="24"/>
+          <w:szCs w:val="24"/>
+          <w:rtl/>
+        </w:rPr>
+        <w:t xml:space="preserve"> ثم آية الكرسي كاملة، ثم آية النعاس (</w:t>
+      </w:r>
+      <w:r>
+        <w:rPr>
+          <w:rFonts w:ascii="Times New Roman" w:cs="Times New Roman" w:eastAsia="Times New Roman" w:hAnsi="Times New Roman"/>
+          <w:b/>
+          <w:bCs/>
+          <w:color w:val="B23A2E"/>
+          <w:sz w:val="24"/>
+          <w:szCs w:val="24"/>
+          <w:rtl/>
+        </w:rPr>
+        <w:t xml:space="preserve">﴿ثُمَّ أَنزَلَ عَلَيْكُم مِّن بَعْدِ الْغَمِّ أَمَنَةً نُّعَاسًا...﴾</w:t>
+      </w:r>
+      <w:r>
+        <w:rPr>
+          <w:rFonts w:ascii="Times New Roman" w:cs="Times New Roman" w:eastAsia="Times New Roman" w:hAnsi="Times New Roman"/>
+          <w:sz w:val="24"/>
+          <w:szCs w:val="24"/>
+          <w:rtl/>
+        </w:rPr>
+        <w:t xml:space="preserve">)، ثم </w:t>
+      </w:r>
+      <w:r>
+        <w:rPr>
+          <w:rFonts w:ascii="Times New Roman" w:cs="Times New Roman" w:eastAsia="Times New Roman" w:hAnsi="Times New Roman"/>
+          <w:b/>
+          <w:bCs/>
+          <w:color w:val="B23A2E"/>
+          <w:sz w:val="24"/>
+          <w:szCs w:val="24"/>
+          <w:rtl/>
+        </w:rPr>
+        <w:t xml:space="preserve">﴿وَإِذَا جَاءَكَ الَّذِينَ يُؤْمِنُونَ بِآيَاتِنَا فَقُلْ سَلَامٌ عَلَيْكُمْ...﴾</w:t>
+      </w:r>
+      <w:r>
+        <w:rPr>
+          <w:rFonts w:ascii="Times New Roman" w:cs="Times New Roman" w:eastAsia="Times New Roman" w:hAnsi="Times New Roman"/>
+          <w:sz w:val="24"/>
+          <w:szCs w:val="24"/>
+          <w:rtl/>
+        </w:rPr>
+        <w:t xml:space="preserve">، ثم </w:t>
+      </w:r>
+      <w:r>
+        <w:rPr>
+          <w:rFonts w:ascii="Times New Roman" w:cs="Times New Roman" w:eastAsia="Times New Roman" w:hAnsi="Times New Roman"/>
+          <w:b/>
+          <w:bCs/>
+          <w:color w:val="B23A2E"/>
+          <w:sz w:val="24"/>
+          <w:szCs w:val="24"/>
+          <w:rtl/>
+        </w:rPr>
+        <w:t xml:space="preserve">﴿هُوَ الَّذِي أَرْسَلَ رَسُولَهُ بِالْهُدَىٰ وَدِينِ الْحَقِّ...﴾</w:t>
+      </w:r>
+      <w:r>
+        <w:rPr>
+          <w:rFonts w:ascii="Times New Roman" w:cs="Times New Roman" w:eastAsia="Times New Roman" w:hAnsi="Times New Roman"/>
+          <w:sz w:val="24"/>
+          <w:szCs w:val="24"/>
+          <w:rtl/>
+        </w:rPr>
+        <w:t xml:space="preserve">، ثم آية </w:t>
+      </w:r>
+      <w:r>
+        <w:rPr>
+          <w:rFonts w:ascii="Times New Roman" w:cs="Times New Roman" w:eastAsia="Times New Roman" w:hAnsi="Times New Roman"/>
+          <w:b/>
+          <w:bCs/>
+          <w:color w:val="B23A2E"/>
+          <w:sz w:val="24"/>
+          <w:szCs w:val="24"/>
+          <w:rtl/>
+        </w:rPr>
+        <w:t xml:space="preserve">﴿مُّحَمَّدٌ رَّسُولُ اللَّهِ وَالَّذِينَ مَعَهُ أَشِدَّاءُ عَلَى الْكُفَّارِ...﴾</w:t>
+      </w:r>
+      <w:r>
+        <w:rPr>
+          <w:rFonts w:ascii="Times New Roman" w:cs="Times New Roman" w:eastAsia="Times New Roman" w:hAnsi="Times New Roman"/>
+          <w:sz w:val="24"/>
+          <w:szCs w:val="24"/>
+          <w:rtl/>
+        </w:rPr>
+        <w:t xml:space="preserve">، ثم </w:t>
+      </w:r>
+      <w:r>
+        <w:rPr>
+          <w:rFonts w:ascii="Times New Roman" w:cs="Times New Roman" w:eastAsia="Times New Roman" w:hAnsi="Times New Roman"/>
+          <w:b/>
+          <w:bCs/>
+          <w:color w:val="B23A2E"/>
+          <w:sz w:val="24"/>
+          <w:szCs w:val="24"/>
+          <w:rtl/>
+        </w:rPr>
+        <w:t xml:space="preserve">﴿لَوْ أَنزَلْنَا هَٰذَا الْقُرْآنَ عَلَىٰ جَبَلٍ لَّرَأَيْتَهُ خَاشِعًا مُّتَصَدِّعًا...﴾</w:t>
+      </w:r>
+      <w:r>
+        <w:rPr>
+          <w:rFonts w:ascii="Times New Roman" w:cs="Times New Roman" w:eastAsia="Times New Roman" w:hAnsi="Times New Roman"/>
+          <w:sz w:val="24"/>
+          <w:szCs w:val="24"/>
+          <w:rtl/>
+        </w:rPr>
+        <w:t xml:space="preserve"> وآيات آخر سورة الحشر (الأسماء الحسنى)، ثم سورة الشرح كاملة، ثم سورة الإخلاص كاملة.</w:t>
       </w:r>
     </w:p>
     <w:p>
@@ -9832,7 +11473,133 @@
           <w:szCs w:val="24"/>
           <w:rtl/>
         </w:rPr>
-        <w:t xml:space="preserve">اللهم يسّر لنا أمورنا مع الراحة لقلوبنا وأبداننا، والسلامة والعافية في ديننا ودنيانا، وكن لنا صاحبًا في سفرنا وخليفة في أهلنا، واطمس على وجوه أعدائنا وامسخهم على مكانتهم فلا يستطيعون المضي ولا المجيء إلينا، ﴿وَلَوْ نَشَاءُ لَطَمَسْنَا عَلَىٰ أَعْيُنِهِمْ فَاسْتَبَقُوا الصِّرَاطَ فَأَنَّىٰ يُبْصِرُونَ﴾، ولو نشاء لمسخناهم على مكانتهم فما استطاعوا مُضيًا ولا يرجعون. ﴿يس وَالْقُرْآنِ الْحَكِيمِ * إِنَّكَ لَمِنَ الْمُرْسَلِينَ * عَلَىٰ صِرَاطٍ مُّسْتَقِيمٍ * تَنزِيلَ الْعَزِيزِ الرَّحِيمِ * لِتُنذِرَ قَوْمًا مَّا أُنذِرَ آبَاؤُهُمْ فَهُمْ غَافِلُونَ * لَقَدْ حَقَّ الْقَوْلُ عَلَىٰ أَكْثَرِهِمْ فَهُمْ لَا يُؤْمِنُونَ * إِنَّا جَعَلْنَا فِي أَعْنَاقِهِمْ أَغْلَالًا فَهِيَ إِلَى الْأَذْقَانِ فَهُم مُّقْمَحُونَ * وَجَعَلْنَا مِن بَيْنِ أَيْدِيهِمْ سَدًّا وَمِنْ خَلْفِهِمْ سَدًّا فَأَغْشَيْنَاهُمْ فَهُمْ لَا يُبْصِرُونَ﴾، شاهت الوجوه (ثلاثًا)، وعنت الوجوه للحي القيوم وقد خاب من حمل ظلمًا. طس، حم عسق، ﴿مَرَجَ الْبَحْرَيْنِ يَلْتَقِيَانِ بَيْنَهُمَا بَرْزَخٌ لَّا يَبْغِيَانِ﴾، (حم حم حم حم حم حم حم)، حُمّ الأمر وجاء النصر فعلينا لا يُنصرون. حم، ﴿تَنزِيلُ الْكِتَابِ مِنَ اللَّهِ الْعَزِيزِ الْعَلِيمِ * غَافِرِ الذَّنبِ وَقَابِلِ التَّوْبِ شَدِيدِ الْعِقَابِ ذِي الطَّوْلِ لَا إِلَٰهَ إِلَّا هُوَ إِلَيْهِ الْمَصِيرُ﴾. بسم الله بابنا، تبارك حيطاننا، يس سقفنا، كهيعص كفايتنا، حم عسق حمايتنا، ﴿فَسَيَكْفِيكَهُمُ اللَّهُ وَهُوَ السَّمِيعُ الْعَلِيمُ﴾ (ثلاثًا)، ستر العرش مسبول علينا، وعين الله ناظرة إلينا، وبحول الله لا يُقدر علينا، ﴿وَاللَّهُ مِن وَرَائِهِم مُّحِيطٌ * بَلْ هُوَ قُرْآنٌ مَّجِيدٌ * فِي لَوْحٍ مَّحْفُوظٍ﴾، فالله خير حافظًا وهو أرحم الراحمين (ثلاثًا)، إن وليي الله الذي نزّل الكتاب وهو يتولى الصالحين (ثلاثًا)، حسبي الله لا إله إلا هو عليه توكلت وهو رب العرش العظيم (ثلاثًا)، بسم الله الذي لا يضر مع اسمه شيء في الأرض ولا في السماء وهو السميع العليم (ثلاثًا)، أعوذ بكلمات الله التامات من شر ما خلق (ثلاثًا)، ولا حول ولا قوة إلا بالله العلي العظيم (ثلاثًا)، وصلى الله على سيدنا محمد وعلى آله وصحبه وسلم.</w:t>
+        <w:t xml:space="preserve">اللهم يسّر لنا أمورنا مع الراحة لقلوبنا وأبداننا، والسلامة والعافية في ديننا ودنيانا، وكن لنا صاحبًا في سفرنا وخليفة في أهلنا، واطمس على وجوه أعدائنا وامسخهم على مكانتهم فلا يستطيعون المضي ولا المجيء إلينا، </w:t>
+      </w:r>
+      <w:r>
+        <w:rPr>
+          <w:rFonts w:ascii="Times New Roman" w:cs="Times New Roman" w:eastAsia="Times New Roman" w:hAnsi="Times New Roman"/>
+          <w:b/>
+          <w:bCs/>
+          <w:color w:val="B23A2E"/>
+          <w:sz w:val="24"/>
+          <w:szCs w:val="24"/>
+          <w:rtl/>
+        </w:rPr>
+        <w:t xml:space="preserve">﴿وَلَوْ نَشَاءُ لَطَمَسْنَا عَلَىٰ أَعْيُنِهِمْ فَاسْتَبَقُوا الصِّرَاطَ فَأَنَّىٰ يُبْصِرُونَ﴾</w:t>
+      </w:r>
+      <w:r>
+        <w:rPr>
+          <w:rFonts w:ascii="Times New Roman" w:cs="Times New Roman" w:eastAsia="Times New Roman" w:hAnsi="Times New Roman"/>
+          <w:sz w:val="24"/>
+          <w:szCs w:val="24"/>
+          <w:rtl/>
+        </w:rPr>
+        <w:t xml:space="preserve">، ولو نشاء لمسخناهم على مكانتهم فما استطاعوا مُضيًا ولا يرجعون. </w:t>
+      </w:r>
+      <w:r>
+        <w:rPr>
+          <w:rFonts w:ascii="Times New Roman" w:cs="Times New Roman" w:eastAsia="Times New Roman" w:hAnsi="Times New Roman"/>
+          <w:b/>
+          <w:bCs/>
+          <w:color w:val="B23A2E"/>
+          <w:sz w:val="24"/>
+          <w:szCs w:val="24"/>
+          <w:rtl/>
+        </w:rPr>
+        <w:t xml:space="preserve">﴿يس وَالْقُرْآنِ الْحَكِيمِ * إِنَّكَ لَمِنَ الْمُرْسَلِينَ * عَلَىٰ صِرَاطٍ مُّسْتَقِيمٍ * تَنزِيلَ الْعَزِيزِ الرَّحِيمِ * لِتُنذِرَ قَوْمًا مَّا أُنذِرَ آبَاؤُهُمْ فَهُمْ غَافِلُونَ * لَقَدْ حَقَّ الْقَوْلُ عَلَىٰ أَكْثَرِهِمْ فَهُمْ لَا يُؤْمِنُونَ * إِنَّا جَعَلْنَا فِي أَعْنَاقِهِمْ أَغْلَالًا فَهِيَ إِلَى الْأَذْقَانِ فَهُم مُّقْمَحُونَ * وَجَعَلْنَا مِن بَيْنِ أَيْدِيهِمْ سَدًّا وَمِنْ خَلْفِهِمْ سَدًّا فَأَغْشَيْنَاهُمْ فَهُمْ لَا يُبْصِرُونَ﴾</w:t>
+      </w:r>
+      <w:r>
+        <w:rPr>
+          <w:rFonts w:ascii="Times New Roman" w:cs="Times New Roman" w:eastAsia="Times New Roman" w:hAnsi="Times New Roman"/>
+          <w:sz w:val="24"/>
+          <w:szCs w:val="24"/>
+          <w:rtl/>
+        </w:rPr>
+        <w:t xml:space="preserve">، شاهت الوجوه (ثلاثًا)، وعنت الوجوه للحي القيوم وقد خاب من حمل ظلمًا. طس، حم عسق، </w:t>
+      </w:r>
+      <w:r>
+        <w:rPr>
+          <w:rFonts w:ascii="Times New Roman" w:cs="Times New Roman" w:eastAsia="Times New Roman" w:hAnsi="Times New Roman"/>
+          <w:b/>
+          <w:bCs/>
+          <w:color w:val="B23A2E"/>
+          <w:sz w:val="24"/>
+          <w:szCs w:val="24"/>
+          <w:rtl/>
+        </w:rPr>
+        <w:t xml:space="preserve">﴿مَرَجَ الْبَحْرَيْنِ يَلْتَقِيَانِ بَيْنَهُمَا بَرْزَخٌ لَّا يَبْغِيَانِ﴾</w:t>
+      </w:r>
+      <w:r>
+        <w:rPr>
+          <w:rFonts w:ascii="Times New Roman" w:cs="Times New Roman" w:eastAsia="Times New Roman" w:hAnsi="Times New Roman"/>
+          <w:sz w:val="24"/>
+          <w:szCs w:val="24"/>
+          <w:rtl/>
+        </w:rPr>
+        <w:t xml:space="preserve">، (حم حم حم حم حم حم حم)، حُمّ الأمر وجاء النصر فعلينا لا يُنصرون. حم، </w:t>
+      </w:r>
+      <w:r>
+        <w:rPr>
+          <w:rFonts w:ascii="Times New Roman" w:cs="Times New Roman" w:eastAsia="Times New Roman" w:hAnsi="Times New Roman"/>
+          <w:b/>
+          <w:bCs/>
+          <w:color w:val="B23A2E"/>
+          <w:sz w:val="24"/>
+          <w:szCs w:val="24"/>
+          <w:rtl/>
+        </w:rPr>
+        <w:t xml:space="preserve">﴿تَنزِيلُ الْكِتَابِ مِنَ اللَّهِ الْعَزِيزِ الْعَلِيمِ * غَافِرِ الذَّنبِ وَقَابِلِ التَّوْبِ شَدِيدِ الْعِقَابِ ذِي الطَّوْلِ لَا إِلَٰهَ إِلَّا هُوَ إِلَيْهِ الْمَصِيرُ﴾</w:t>
+      </w:r>
+      <w:r>
+        <w:rPr>
+          <w:rFonts w:ascii="Times New Roman" w:cs="Times New Roman" w:eastAsia="Times New Roman" w:hAnsi="Times New Roman"/>
+          <w:sz w:val="24"/>
+          <w:szCs w:val="24"/>
+          <w:rtl/>
+        </w:rPr>
+        <w:t xml:space="preserve">. بسم الله بابنا، تبارك حيطاننا، يس سقفنا، كهيعص كفايتنا، حم عسق حمايتنا، </w:t>
+      </w:r>
+      <w:r>
+        <w:rPr>
+          <w:rFonts w:ascii="Times New Roman" w:cs="Times New Roman" w:eastAsia="Times New Roman" w:hAnsi="Times New Roman"/>
+          <w:b/>
+          <w:bCs/>
+          <w:color w:val="B23A2E"/>
+          <w:sz w:val="24"/>
+          <w:szCs w:val="24"/>
+          <w:rtl/>
+        </w:rPr>
+        <w:t xml:space="preserve">﴿فَسَيَكْفِيكَهُمُ اللَّهُ وَهُوَ السَّمِيعُ الْعَلِيمُ﴾</w:t>
+      </w:r>
+      <w:r>
+        <w:rPr>
+          <w:rFonts w:ascii="Times New Roman" w:cs="Times New Roman" w:eastAsia="Times New Roman" w:hAnsi="Times New Roman"/>
+          <w:sz w:val="24"/>
+          <w:szCs w:val="24"/>
+          <w:rtl/>
+        </w:rPr>
+        <w:t xml:space="preserve"> (ثلاثًا)، ستر العرش مسبول علينا، وعين الله ناظرة إلينا، وبحول الله لا يُقدر علينا، </w:t>
+      </w:r>
+      <w:r>
+        <w:rPr>
+          <w:rFonts w:ascii="Times New Roman" w:cs="Times New Roman" w:eastAsia="Times New Roman" w:hAnsi="Times New Roman"/>
+          <w:b/>
+          <w:bCs/>
+          <w:color w:val="B23A2E"/>
+          <w:sz w:val="24"/>
+          <w:szCs w:val="24"/>
+          <w:rtl/>
+        </w:rPr>
+        <w:t xml:space="preserve">﴿وَاللَّهُ مِن وَرَائِهِم مُّحِيطٌ * بَلْ هُوَ قُرْآنٌ مَّجِيدٌ * فِي لَوْحٍ مَّحْفُوظٍ﴾</w:t>
+      </w:r>
+      <w:r>
+        <w:rPr>
+          <w:rFonts w:ascii="Times New Roman" w:cs="Times New Roman" w:eastAsia="Times New Roman" w:hAnsi="Times New Roman"/>
+          <w:sz w:val="24"/>
+          <w:szCs w:val="24"/>
+          <w:rtl/>
+        </w:rPr>
+        <w:t xml:space="preserve">، فالله خير حافظًا وهو أرحم الراحمين (ثلاثًا)، إن وليي الله الذي نزّل الكتاب وهو يتولى الصالحين (ثلاثًا)، حسبي الله لا إله إلا هو عليه توكلت وهو رب العرش العظيم (ثلاثًا)، بسم الله الذي لا يضر مع اسمه شيء في الأرض ولا في السماء وهو السميع العليم (ثلاثًا)، أعوذ بكلمات الله التامات من شر ما خلق (ثلاثًا)، ولا حول ولا قوة إلا بالله العلي العظيم (ثلاثًا)، وصلى الله على سيدنا محمد وعلى آله وصحبه وسلم.</w:t>
       </w:r>
     </w:p>
     <w:p>
@@ -9882,7 +11649,19 @@
           <w:szCs w:val="24"/>
           <w:rtl/>
         </w:rPr>
-        <w:t xml:space="preserve">اللهم بفضل بسم الله الرحمن الرحيم أدخلنا في حصنك الحصين، اللهم بفضل بسم الله الرحمن الرحيم اجعلنا في حصنك الحصين، اللهم بفضل بسم الله الرحمن الرحيم أسكنّا في حصنك الحصين. نحن في كنف الله، نحن في كنف رسول الله، نحن في كنف القرآن العظيم، نحن في كنف بسم الله الرحمن الرحيم، نحن في كنف لا حول ولا قوة إلا بالله العلي العظيم (ثلاثًا). ألف ألف لا إله إلا الله محمد رسول الله صلى الله عليه وسلم في قلوبنا حُشرت، ألف ألف لا إله إلا الله محمد رسول الله صلى الله عليه وسلم على أكتافنا نُشرت، ألف ألف لا إله إلا الله محمد رسول الله صلى الله عليه وسلم على رؤوسنا نُصبت، ألف ألف لا إله إلا الله محمد رسول الله صلى الله عليه وسلم تحول بيننا وبين ساعة السوء إذا حضرت، ألف ألف لا إله إلا الله محمد رسول الله صلى الله عليه وسلم دارت بنا سورًا كما دارت بمدينة الرسول. سبحان من ألجم كل متمرد بقدرته، وأحاط علمه بما في بره وبحره، سبحان الله وبحمده، سبحان الله وبحمده، سبحان الله وبحمده. اللهم يا دافع السقم، ويا بارئ النسم، ويا عالمًا جميع الألم، ادفع عني البلاء والوباء والغلاء والأمراض وموت الفجأة برحمتك يا أرحم الراحمين (ثلاثًا). وصلِّ اللهم على سيدنا محمد وعلى آله وصحبه وسلم، ﴿سُبْحَانَ رَبِّكَ رَبِّ الْعِزَّةِ عَمَّا يَصِفُونَ * وَسَلَامٌ عَلَى الْمُرْسَلِينَ * وَالْحَمْدُ لِلَّهِ رَبِّ الْعَالَمِينَ﴾</w:t>
+        <w:t xml:space="preserve">اللهم بفضل بسم الله الرحمن الرحيم أدخلنا في حصنك الحصين، اللهم بفضل بسم الله الرحمن الرحيم اجعلنا في حصنك الحصين، اللهم بفضل بسم الله الرحمن الرحيم أسكنّا في حصنك الحصين. نحن في كنف الله، نحن في كنف رسول الله، نحن في كنف القرآن العظيم، نحن في كنف بسم الله الرحمن الرحيم، نحن في كنف لا حول ولا قوة إلا بالله العلي العظيم (ثلاثًا). ألف ألف لا إله إلا الله محمد رسول الله صلى الله عليه وسلم في قلوبنا حُشرت، ألف ألف لا إله إلا الله محمد رسول الله صلى الله عليه وسلم على أكتافنا نُشرت، ألف ألف لا إله إلا الله محمد رسول الله صلى الله عليه وسلم على رؤوسنا نُصبت، ألف ألف لا إله إلا الله محمد رسول الله صلى الله عليه وسلم تحول بيننا وبين ساعة السوء إذا حضرت، ألف ألف لا إله إلا الله محمد رسول الله صلى الله عليه وسلم دارت بنا سورًا كما دارت بمدينة الرسول. سبحان من ألجم كل متمرد بقدرته، وأحاط علمه بما في بره وبحره، سبحان الله وبحمده، سبحان الله وبحمده، سبحان الله وبحمده. اللهم يا دافع السقم، ويا بارئ النسم، ويا عالمًا جميع الألم، ادفع عني البلاء والوباء والغلاء والأمراض وموت الفجأة برحمتك يا أرحم الراحمين (ثلاثًا). وصلِّ اللهم على سيدنا محمد وعلى آله وصحبه وسلم، </w:t>
+      </w:r>
+      <w:r>
+        <w:rPr>
+          <w:rFonts w:ascii="Times New Roman" w:cs="Times New Roman" w:eastAsia="Times New Roman" w:hAnsi="Times New Roman"/>
+          <w:b/>
+          <w:bCs/>
+          <w:color w:val="B23A2E"/>
+          <w:sz w:val="24"/>
+          <w:szCs w:val="24"/>
+          <w:rtl/>
+        </w:rPr>
+        <w:t xml:space="preserve">﴿سُبْحَانَ رَبِّكَ رَبِّ الْعِزَّةِ عَمَّا يَصِفُونَ * وَسَلَامٌ عَلَى الْمُرْسَلِينَ * وَالْحَمْدُ لِلَّهِ رَبِّ الْعَالَمِينَ﴾</w:t>
       </w:r>
     </w:p>
     <w:p>
@@ -10178,7 +11957,70 @@
           <w:szCs w:val="24"/>
           <w:rtl/>
         </w:rPr>
-        <w:t xml:space="preserve">الدعاء الجامع للميت (نسخة شاملة تجمع صيغ متعددة متداولة): اللهم اغفر له وارحمه واعفُ عنه وأكرمه. اللهم وسّع مدخله، وأدخله الجنة، واغسله بالثلج والماء والبرد. اللهم يمّن كتابه، وهوّن حسابه، ولَيّن ترابه، وثبّت أقدامه، وألهمه حسن الجواب. اللهم طيّب ثراه، وأكرم مثواه، واجعل الجنة مستقره ومأواه. اللهم نوّر مرقده، وعطّر مشهده، وطيّب مضجعه. اللهم آنس وحشته، وارحم غربته، وقِه عذاب القبر وعذاب النار. اللهم نقّه من خطاياه كما يُنقى الثوب الأبيض من الدنس. اللهم افسح له في قبره، واجعله روضة من رياض الجنة، ولا تجعله حفرة من حفر النار. اللهم انقله من ضيق اللحود والقبور إلى سعة الدور والقصور، مع الذين أنعمت عليهم من الصديقين والصالحين والشهداء. اللهم اجعل له من فوقه ومن تحته ومن أمامه ومن خلفه وعن يمينه وعن يساره نورًا من نورك يا نور السماوات والأرض. اللهم أبدله دارًا خيرًا من داره، وأهلًا خيرًا من أهله، وزوجًا خيرًا من زوجه، وأسكنه فسيح جناتك في الدرجات العلى، آمين. اللهم إن كان قد أحسن فزد في إحسانه، وإن كان قد أساء فتجاوز عن إساءته. اللهم عامله بما أنت أهله، ولا تعامله بما هو أهله. اللهم اجزه عن الإحسان إحسانًا، وعن الإساءة عفوًا وغفرانًا. اللهم أدخله الجنة من غير مناقشة حساب ولا سابقة عذاب. اللهم أفسح له في قبره مد بصره، وأفرش قبره من فراش الجنة، وجافِ الأرض عن جنبيه. اللهم املأ قبره بالرضا والنور والفسحة والسرور. اللهم إنه في ذمتك وحبل جوارك، فقِه فتنة القبر وعذاب النار، وأنت أهل الوفاء والحق فاغفر له وارحمه إنك أنت الغفور الرحيم. اللهم إنه عبدك وابن عبدك، خرج من الدنيا وسعتها ومحبوبيه وأحبائه إلى ظلمة القبر وما هو لاقيه. اللهم إنه كان يشهد أنك لا إله إلا أنت وأن محمدًا عبدك ورسولك، وأنت أعلم به. اللهم ثبّته عند السؤال. اللهم إنا نتوسل بك إليك ونُقسم بك عليك أن ترحمه ولا تعذبه. اللهم إنه نزل بك وأنت خير مَنزول به، وأصبح فقيرًا إلى رحمتك وأنت غني عن عذابه. اللهم آته برحمتك ورضاك، وقِه فتنة القبر وعذابه، حتى تبعثه إلى جنتك يا أرحم الراحمين. اللهم انقله من مواطن الدود وضيق اللحود إلى جنات الخلود. اللهم احمه تحت الأرض، واستره يوم العرض، ولا تُخزه يوم يُبعثون، ﴿يَوْمَ لَا يَنفَعُ مَالٌ وَلَا بَنُونَ * إِلَّا مَنْ أَتَى اللَّهَ بِقَلْبٍ سَلِيمٍ﴾. اللهم يمّن كتابه، ويسّر حسابه، وثقّل بالحسنات ميزانه، وثبّت على الصراط أقدامه، وأسكنه في أعلى الجنات بجوار حبيبك ومصطفاك صلى الله عليه وسلم. اللهم آمنه من فزع يوم القيامة ومن هوله، واجعل نفسه آمنة مطمئنة، ولقّنه حجته. اللهم اجعله في بطن القبر مطمئنًا، وعند قيام الأشهاد آمنًا، وبجود رضوانك واثقًا، وإلى أعلى درجاتك سابقًا. اللهم اجعل عن يمينه نورًا وعن شماله نورًا، ومن أمامه نورًا ومن فوقه نورًا، حتى تبعثه آمنًا مطمئنًا في نور من نورك. اللهم انظر إليه نظرة رضا، فإن من تنظر إليه نظرة رضا لا تعذبه أبدًا. اللهم أسكنه فسيح الجنان، واغفر له يا رحمن، وارحم يا رحيم، وتجاوز عما تعلم يا عليم. اللهم اعفُ عنه فإنك القائل ﴿وَيَعْفُو عَن كَثِيرٍ﴾. اللهم إنه جاء بابك وأناخ بجنابك، فجُد عليه بعفوك وإكرامك وجود إحسانك. اللهم إن رحمتك وسعت كل شيء فارحمه رحمة تطمئن بها نفسه وتقر بها عينه. اللهم احشره مع المتقين إلى الرحمن وفدًا، ومع أصحاب اليمين، واجعل تحيته سلامًا من أصحاب اليمين. اللهم بشّره بقولك ﴿كُلُوا وَاشْرَبُوا هَنِيئًا بِمَا أَسْلَفْتُمْ فِي الْأَيَّامِ الْخَالِيَةِ﴾. اللهم اجعله من الذين سعدوا في الجنة خالدين فيها ما دامت السماوات والأرض. اللهم شفّع فيه نبينا ومصطفاك، واحشره تحت لوائه، واسقه من يده الشريفة شربة هنيئة لا يظمأ بعدها أبدًا. اللهم إنه كان مصليًا لك فثبّته على الصراط يوم تزل الأقدام، وإن كان صائمًا فأدخله الجنة من باب الريان، وإن كان لكتابك تاليًا وسامعًا فشفّع فيه القرآن وارحمه من النيران، واجعله يرتقي في الجنة إلى آخر آية قرأها أو سمعها وآخر حرف تلاه. اللهم ارزقه بكل حرف من القرآن حلاوة، وبكل كلمة كرامة، وبكل آية سعادة، وبكل سورة سلامة، وبكل جزء جزاءً. اللهم اغفر لحيّنا وميتنا، وشاهدنا وغائبنا، وصغيرنا وكبيرنا، وذكرنا وأنثانا. اللهم من أحييته منا فأحيه على الإسلام، ومن توفيته منا فتوفه على الإيمان. اللهم لا تحرمنا أجره، ولا تُضلّنا بعده. اللهم انزل على أهله الصبر والسلوان، وأرضهم بقضائك، وثبّتهم على القول الثابت في الحياة الدنيا وفي الآخرة. اللهم صلِّ وسلم وبارك على سيدنا محمد وعلى آله وصحبه وسلم إلى يوم الدين.</w:t>
+        <w:t xml:space="preserve">الدعاء الجامع للميت (نسخة شاملة تجمع صيغ متعددة متداولة): اللهم اغفر له وارحمه واعفُ عنه وأكرمه. اللهم وسّع مدخله، وأدخله الجنة، واغسله بالثلج والماء والبرد. اللهم يمّن كتابه، وهوّن حسابه، ولَيّن ترابه، وثبّت أقدامه، وألهمه حسن الجواب. اللهم طيّب ثراه، وأكرم مثواه، واجعل الجنة مستقره ومأواه. اللهم نوّر مرقده، وعطّر مشهده، وطيّب مضجعه. اللهم آنس وحشته، وارحم غربته، وقِه عذاب القبر وعذاب النار. اللهم نقّه من خطاياه كما يُنقى الثوب الأبيض من الدنس. اللهم افسح له في قبره، واجعله روضة من رياض الجنة، ولا تجعله حفرة من حفر النار. اللهم انقله من ضيق اللحود والقبور إلى سعة الدور والقصور، مع الذين أنعمت عليهم من الصديقين والصالحين والشهداء. اللهم اجعل له من فوقه ومن تحته ومن أمامه ومن خلفه وعن يمينه وعن يساره نورًا من نورك يا نور السماوات والأرض. اللهم أبدله دارًا خيرًا من داره، وأهلًا خيرًا من أهله، وزوجًا خيرًا من زوجه، وأسكنه فسيح جناتك في الدرجات العلى، آمين. اللهم إن كان قد أحسن فزد في إحسانه، وإن كان قد أساء فتجاوز عن إساءته. اللهم عامله بما أنت أهله، ولا تعامله بما هو أهله. اللهم اجزه عن الإحسان إحسانًا، وعن الإساءة عفوًا وغفرانًا. اللهم أدخله الجنة من غير مناقشة حساب ولا سابقة عذاب. اللهم أفسح له في قبره مد بصره، وأفرش قبره من فراش الجنة، وجافِ الأرض عن جنبيه. اللهم املأ قبره بالرضا والنور والفسحة والسرور. اللهم إنه في ذمتك وحبل جوارك، فقِه فتنة القبر وعذاب النار، وأنت أهل الوفاء والحق فاغفر له وارحمه إنك أنت الغفور الرحيم. اللهم إنه عبدك وابن عبدك، خرج من الدنيا وسعتها ومحبوبيه وأحبائه إلى ظلمة القبر وما هو لاقيه. اللهم إنه كان يشهد أنك لا إله إلا أنت وأن محمدًا عبدك ورسولك، وأنت أعلم به. اللهم ثبّته عند السؤال. اللهم إنا نتوسل بك إليك ونُقسم بك عليك أن ترحمه ولا تعذبه. اللهم إنه نزل بك وأنت خير مَنزول به، وأصبح فقيرًا إلى رحمتك وأنت غني عن عذابه. اللهم آته برحمتك ورضاك، وقِه فتنة القبر وعذابه، حتى تبعثه إلى جنتك يا أرحم الراحمين. اللهم انقله من مواطن الدود وضيق اللحود إلى جنات الخلود. اللهم احمه تحت الأرض، واستره يوم العرض، ولا تُخزه يوم يُبعثون، </w:t>
+      </w:r>
+      <w:r>
+        <w:rPr>
+          <w:rFonts w:ascii="Times New Roman" w:cs="Times New Roman" w:eastAsia="Times New Roman" w:hAnsi="Times New Roman"/>
+          <w:b/>
+          <w:bCs/>
+          <w:color w:val="B23A2E"/>
+          <w:sz w:val="24"/>
+          <w:szCs w:val="24"/>
+          <w:rtl/>
+        </w:rPr>
+        <w:t xml:space="preserve">﴿يَوْمَ لَا يَنفَعُ مَالٌ وَلَا بَنُونَ * إِلَّا مَنْ أَتَى اللَّهَ بِقَلْبٍ سَلِيمٍ﴾</w:t>
+      </w:r>
+      <w:r>
+        <w:rPr>
+          <w:rFonts w:ascii="Times New Roman" w:cs="Times New Roman" w:eastAsia="Times New Roman" w:hAnsi="Times New Roman"/>
+          <w:sz w:val="24"/>
+          <w:szCs w:val="24"/>
+          <w:rtl/>
+        </w:rPr>
+        <w:t xml:space="preserve">. اللهم يمّن كتابه، ويسّر حسابه، وثقّل بالحسنات ميزانه، وثبّت على الصراط أقدامه، وأسكنه في أعلى الجنات بجوار حبيبك ومصطفاك صلى الله عليه وسلم. اللهم آمنه من فزع يوم القيامة ومن هوله، واجعل نفسه آمنة مطمئنة، ولقّنه حجته. اللهم اجعله في بطن القبر مطمئنًا، وعند قيام الأشهاد آمنًا، وبجود رضوانك واثقًا، وإلى أعلى درجاتك سابقًا. اللهم اجعل عن يمينه نورًا وعن شماله نورًا، ومن أمامه نورًا ومن فوقه نورًا، حتى تبعثه آمنًا مطمئنًا في نور من نورك. اللهم انظر إليه نظرة رضا، فإن من تنظر إليه نظرة رضا لا تعذبه أبدًا. اللهم أسكنه فسيح الجنان، واغفر له يا رحمن، وارحم يا رحيم، وتجاوز عما تعلم يا عليم. اللهم اعفُ عنه فإنك القائل </w:t>
+      </w:r>
+      <w:r>
+        <w:rPr>
+          <w:rFonts w:ascii="Times New Roman" w:cs="Times New Roman" w:eastAsia="Times New Roman" w:hAnsi="Times New Roman"/>
+          <w:b/>
+          <w:bCs/>
+          <w:color w:val="B23A2E"/>
+          <w:sz w:val="24"/>
+          <w:szCs w:val="24"/>
+          <w:rtl/>
+        </w:rPr>
+        <w:t xml:space="preserve">﴿وَيَعْفُو عَن كَثِيرٍ﴾</w:t>
+      </w:r>
+      <w:r>
+        <w:rPr>
+          <w:rFonts w:ascii="Times New Roman" w:cs="Times New Roman" w:eastAsia="Times New Roman" w:hAnsi="Times New Roman"/>
+          <w:sz w:val="24"/>
+          <w:szCs w:val="24"/>
+          <w:rtl/>
+        </w:rPr>
+        <w:t xml:space="preserve">. اللهم إنه جاء بابك وأناخ بجنابك، فجُد عليه بعفوك وإكرامك وجود إحسانك. اللهم إن رحمتك وسعت كل شيء فارحمه رحمة تطمئن بها نفسه وتقر بها عينه. اللهم احشره مع المتقين إلى الرحمن وفدًا، ومع أصحاب اليمين، واجعل تحيته سلامًا من أصحاب اليمين. اللهم بشّره بقولك </w:t>
+      </w:r>
+      <w:r>
+        <w:rPr>
+          <w:rFonts w:ascii="Times New Roman" w:cs="Times New Roman" w:eastAsia="Times New Roman" w:hAnsi="Times New Roman"/>
+          <w:b/>
+          <w:bCs/>
+          <w:color w:val="B23A2E"/>
+          <w:sz w:val="24"/>
+          <w:szCs w:val="24"/>
+          <w:rtl/>
+        </w:rPr>
+        <w:t xml:space="preserve">﴿كُلُوا وَاشْرَبُوا هَنِيئًا بِمَا أَسْلَفْتُمْ فِي الْأَيَّامِ الْخَالِيَةِ﴾</w:t>
+      </w:r>
+      <w:r>
+        <w:rPr>
+          <w:rFonts w:ascii="Times New Roman" w:cs="Times New Roman" w:eastAsia="Times New Roman" w:hAnsi="Times New Roman"/>
+          <w:sz w:val="24"/>
+          <w:szCs w:val="24"/>
+          <w:rtl/>
+        </w:rPr>
+        <w:t xml:space="preserve">. اللهم اجعله من الذين سعدوا في الجنة خالدين فيها ما دامت السماوات والأرض. اللهم شفّع فيه نبينا ومصطفاك، واحشره تحت لوائه، واسقه من يده الشريفة شربة هنيئة لا يظمأ بعدها أبدًا. اللهم إنه كان مصليًا لك فثبّته على الصراط يوم تزل الأقدام، وإن كان صائمًا فأدخله الجنة من باب الريان، وإن كان لكتابك تاليًا وسامعًا فشفّع فيه القرآن وارحمه من النيران، واجعله يرتقي في الجنة إلى آخر آية قرأها أو سمعها وآخر حرف تلاه. اللهم ارزقه بكل حرف من القرآن حلاوة، وبكل كلمة كرامة، وبكل آية سعادة، وبكل سورة سلامة، وبكل جزء جزاءً. اللهم اغفر لحيّنا وميتنا، وشاهدنا وغائبنا، وصغيرنا وكبيرنا، وذكرنا وأنثانا. اللهم من أحييته منا فأحيه على الإسلام، ومن توفيته منا فتوفه على الإيمان. اللهم لا تحرمنا أجره، ولا تُضلّنا بعده. اللهم انزل على أهله الصبر والسلوان، وأرضهم بقضائك، وثبّتهم على القول الثابت في الحياة الدنيا وفي الآخرة. اللهم صلِّ وسلم وبارك على سيدنا محمد وعلى آله وصحبه وسلم إلى يوم الدين.</w:t>
       </w:r>
     </w:p>
     <w:p>

</xml_diff>

<commit_message>
Add دعاء المعجزات (alternate version) and fix Quran bracket typo in Category 3
Also color the new dua's Quran verse red for consistency, and complete
the Umrah (Category 17) red-color fix started earlier: only actual
Quran quotations stay red, non-Quran instructions revert to normal.
</commit_message>
<xml_diff>
--- a/خزانة الأدعية.docx
+++ b/خزانة الأدعية.docx
@@ -3330,6 +3330,61 @@
           <w:szCs w:val="24"/>
           <w:rtl/>
         </w:rPr>
+        <w:t xml:space="preserve">دعاء المعجزات (صيغة أخرى): </w:t>
+      </w:r>
+      <w:r>
+        <w:rPr>
+          <w:rFonts w:ascii="Times New Roman" w:cs="Times New Roman" w:eastAsia="Times New Roman" w:hAnsi="Times New Roman"/>
+          <w:b/>
+          <w:bCs/>
+          <w:color w:val="B23A2E"/>
+          <w:sz w:val="24"/>
+          <w:szCs w:val="24"/>
+          <w:rtl/>
+        </w:rPr>
+        <w:t xml:space="preserve">﴿حَسْبُنَا اللَّهُ سَيُؤْتِينَا اللَّهُ مِنْ فَضْلِهِ وَرَسُولُهُ إِنَّا إِلَى اللَّهِ رَاغِبُونَ﴾</w:t>
+      </w:r>
+      <w:r>
+        <w:rPr>
+          <w:rFonts w:ascii="Times New Roman" w:cs="Times New Roman" w:eastAsia="Times New Roman" w:hAnsi="Times New Roman"/>
+          <w:sz w:val="24"/>
+          <w:szCs w:val="24"/>
+          <w:rtl/>
+        </w:rPr>
+        <w:t xml:space="preserve">، اللهم إليك مددت يدي، وفيها عندك عظمت رغبتي، فاقبل توبتي، وارحم ضعف قوتي، واغفر خطيئتي، واقبل معذرتي، واجعل لي من كل خير نصيبًا، وإلى كل خير سبيلًا، برحمتك يا أرحم الراحمين</w:t>
+      </w:r>
+    </w:p>
+    <w:p>
+      <w:pPr>
+        <w:bidi/>
+        <w:spacing w:after="120" w:before="320"/>
+        <w:jc w:val="right"/>
+      </w:pPr>
+      <w:r>
+        <w:rPr>
+          <w:rFonts w:ascii="Times New Roman" w:cs="Times New Roman" w:eastAsia="Times New Roman" w:hAnsi="Times New Roman"/>
+          <w:b/>
+          <w:bCs/>
+          <w:sz w:val="44"/>
+          <w:szCs w:val="44"/>
+          <w:rtl/>
+        </w:rPr>
+        <w:t xml:space="preserve">الدعاء الثالث والثلاثون</w:t>
+      </w:r>
+    </w:p>
+    <w:p>
+      <w:pPr>
+        <w:bidi/>
+        <w:spacing w:after="200" w:line="340"/>
+        <w:jc w:val="right"/>
+      </w:pPr>
+      <w:r>
+        <w:rPr>
+          <w:rFonts w:ascii="Times New Roman" w:cs="Times New Roman" w:eastAsia="Times New Roman" w:hAnsi="Times New Roman"/>
+          <w:sz w:val="24"/>
+          <w:szCs w:val="24"/>
+          <w:rtl/>
+        </w:rPr>
         <w:t xml:space="preserve">دعاء المضطر لقضاء الحاجة الملحّة والمستعجلة: «بسم الله الرحمن الرحيم، اللهم صلِّ على محمد وآل محمد، اللهم رب السماوات السبع وما بينهم، ورب العرش العظيم، ورب جبرائيل وميكائيل وإسرافيل، ورب القرآن العظيم، ورب محمد خاتم النبيين صلى الله عليه وعلى آله وسلم الطيبين الطاهرين، اللهم أني أسألك بالذي تقوم به السماء وبه تقوم الأرض، وبه تُفرّق بين الجمع وبه تُجمع بين المتفرق، وبه تُرزق الأحياء، وبه أحصيت عدد الرمال ووزن الجبال وكيل البحور، أن تصلي على محمد وآل محمد وتقضي حاجتي» (اذكر اسم الحاجة)</w:t>
       </w:r>
     </w:p>
@@ -3348,7 +3403,7 @@
           <w:szCs w:val="44"/>
           <w:rtl/>
         </w:rPr>
-        <w:t xml:space="preserve">الدعاء الثالث والثلاثون</w:t>
+        <w:t xml:space="preserve">الدعاء الرابع والثلاثون</w:t>
       </w:r>
     </w:p>
     <w:p>
@@ -3382,7 +3437,7 @@
           <w:szCs w:val="44"/>
           <w:rtl/>
         </w:rPr>
-        <w:t xml:space="preserve">الدعاء الرابع والثلاثون</w:t>
+        <w:t xml:space="preserve">الدعاء الخامس والثلاثون</w:t>
       </w:r>
     </w:p>
     <w:p>
@@ -3416,7 +3471,7 @@
           <w:szCs w:val="44"/>
           <w:rtl/>
         </w:rPr>
-        <w:t xml:space="preserve">الدعاء الخامس والثلاثون</w:t>
+        <w:t xml:space="preserve">الدعاء السادس والثلاثون</w:t>
       </w:r>
     </w:p>
     <w:p>
@@ -3450,7 +3505,7 @@
           <w:szCs w:val="44"/>
           <w:rtl/>
         </w:rPr>
-        <w:t xml:space="preserve">الدعاء السادس والثلاثون</w:t>
+        <w:t xml:space="preserve">الدعاء السابع والثلاثون</w:t>
       </w:r>
     </w:p>
     <w:p>
@@ -3484,7 +3539,7 @@
           <w:szCs w:val="44"/>
           <w:rtl/>
         </w:rPr>
-        <w:t xml:space="preserve">الدعاء السابع والثلاثون</w:t>
+        <w:t xml:space="preserve">الدعاء الثامن والثلاثون</w:t>
       </w:r>
     </w:p>
     <w:p>
@@ -3518,7 +3573,7 @@
           <w:szCs w:val="44"/>
           <w:rtl/>
         </w:rPr>
-        <w:t xml:space="preserve">الدعاء الثامن والثلاثون</w:t>
+        <w:t xml:space="preserve">الدعاء التاسع والثلاثون</w:t>
       </w:r>
     </w:p>
     <w:p>
@@ -3552,7 +3607,7 @@
           <w:szCs w:val="44"/>
           <w:rtl/>
         </w:rPr>
-        <w:t xml:space="preserve">الدعاء التاسع والثلاثون</w:t>
+        <w:t xml:space="preserve">الدعاء الأربعون</w:t>
       </w:r>
     </w:p>
     <w:p>
@@ -3586,7 +3641,7 @@
           <w:szCs w:val="44"/>
           <w:rtl/>
         </w:rPr>
-        <w:t xml:space="preserve">الدعاء الأربعون</w:t>
+        <w:t xml:space="preserve">الدعاء الحادي والأربعون</w:t>
       </w:r>
     </w:p>
     <w:p>
@@ -3620,7 +3675,7 @@
           <w:szCs w:val="44"/>
           <w:rtl/>
         </w:rPr>
-        <w:t xml:space="preserve">الدعاء الحادي والأربعون</w:t>
+        <w:t xml:space="preserve">الدعاء الثاني والأربعون</w:t>
       </w:r>
     </w:p>
     <w:p>
@@ -3654,7 +3709,7 @@
           <w:szCs w:val="44"/>
           <w:rtl/>
         </w:rPr>
-        <w:t xml:space="preserve">الدعاء الثاني والأربعون</w:t>
+        <w:t xml:space="preserve">الدعاء الثالث والأربعون</w:t>
       </w:r>
     </w:p>
     <w:p>
@@ -3688,7 +3743,7 @@
           <w:szCs w:val="44"/>
           <w:rtl/>
         </w:rPr>
-        <w:t xml:space="preserve">الدعاء الثالث والأربعون</w:t>
+        <w:t xml:space="preserve">الدعاء الرابع والأربعون</w:t>
       </w:r>
     </w:p>
     <w:p>
@@ -3722,7 +3777,7 @@
           <w:szCs w:val="44"/>
           <w:rtl/>
         </w:rPr>
-        <w:t xml:space="preserve">الدعاء الرابع والأربعون</w:t>
+        <w:t xml:space="preserve">الدعاء الخامس والأربعون</w:t>
       </w:r>
     </w:p>
     <w:p>
@@ -3756,7 +3811,7 @@
           <w:szCs w:val="44"/>
           <w:rtl/>
         </w:rPr>
-        <w:t xml:space="preserve">الدعاء الخامس والأربعون</w:t>
+        <w:t xml:space="preserve">الدعاء السادس والأربعون</w:t>
       </w:r>
     </w:p>
     <w:p>
@@ -3790,7 +3845,7 @@
           <w:szCs w:val="44"/>
           <w:rtl/>
         </w:rPr>
-        <w:t xml:space="preserve">الدعاء السادس والأربعون</w:t>
+        <w:t xml:space="preserve">الدعاء السابع والأربعون</w:t>
       </w:r>
     </w:p>
     <w:p>
@@ -3824,7 +3879,7 @@
           <w:szCs w:val="44"/>
           <w:rtl/>
         </w:rPr>
-        <w:t xml:space="preserve">الدعاء السابع والأربعون</w:t>
+        <w:t xml:space="preserve">الدعاء الثامن والأربعون</w:t>
       </w:r>
     </w:p>
     <w:p>
@@ -3858,7 +3913,7 @@
           <w:szCs w:val="44"/>
           <w:rtl/>
         </w:rPr>
-        <w:t xml:space="preserve">الدعاء الثامن والأربعون</w:t>
+        <w:t xml:space="preserve">الدعاء التاسع والأربعون</w:t>
       </w:r>
     </w:p>
     <w:p>
@@ -3904,7 +3959,7 @@
           <w:szCs w:val="44"/>
           <w:rtl/>
         </w:rPr>
-        <w:t xml:space="preserve">الدعاء التاسع والأربعون</w:t>
+        <w:t xml:space="preserve">الدعاء الخمسون</w:t>
       </w:r>
     </w:p>
     <w:p>
@@ -3938,7 +3993,7 @@
           <w:szCs w:val="44"/>
           <w:rtl/>
         </w:rPr>
-        <w:t xml:space="preserve">الدعاء الخمسون</w:t>
+        <w:t xml:space="preserve">الدعاء الحادي والخمسون</w:t>
       </w:r>
     </w:p>
     <w:p>
@@ -3972,7 +4027,7 @@
           <w:szCs w:val="44"/>
           <w:rtl/>
         </w:rPr>
-        <w:t xml:space="preserve">الدعاء الحادي والخمسون</w:t>
+        <w:t xml:space="preserve">الدعاء الثاني والخمسون</w:t>
       </w:r>
     </w:p>
     <w:p>
@@ -4006,7 +4061,7 @@
           <w:szCs w:val="44"/>
           <w:rtl/>
         </w:rPr>
-        <w:t xml:space="preserve">الدعاء الثاني والخمسون</w:t>
+        <w:t xml:space="preserve">الدعاء الثالث والخمسون</w:t>
       </w:r>
     </w:p>
     <w:p>
@@ -4052,7 +4107,7 @@
           <w:szCs w:val="44"/>
           <w:rtl/>
         </w:rPr>
-        <w:t xml:space="preserve">الدعاء الثالث والخمسون</w:t>
+        <w:t xml:space="preserve">الدعاء الرابع والخمسون</w:t>
       </w:r>
     </w:p>
     <w:p>
@@ -4107,7 +4162,7 @@
           <w:szCs w:val="44"/>
           <w:rtl/>
         </w:rPr>
-        <w:t xml:space="preserve">الدعاء الرابع والخمسون</w:t>
+        <w:t xml:space="preserve">الدعاء الخامس والخمسون</w:t>
       </w:r>
     </w:p>
     <w:p>
@@ -4141,7 +4196,7 @@
           <w:szCs w:val="44"/>
           <w:rtl/>
         </w:rPr>
-        <w:t xml:space="preserve">الدعاء الخامس والخمسون</w:t>
+        <w:t xml:space="preserve">الدعاء السادس والخمسون</w:t>
       </w:r>
     </w:p>
     <w:p>
@@ -4175,7 +4230,7 @@
           <w:szCs w:val="44"/>
           <w:rtl/>
         </w:rPr>
-        <w:t xml:space="preserve">الدعاء السادس والخمسون</w:t>
+        <w:t xml:space="preserve">الدعاء السابع والخمسون</w:t>
       </w:r>
     </w:p>
     <w:p>
@@ -4212,7 +4267,7 @@
           <w:szCs w:val="44"/>
           <w:rtl/>
         </w:rPr>
-        <w:t xml:space="preserve">الدعاء السابع والخمسون</w:t>
+        <w:t xml:space="preserve">الدعاء الثامن والخمسون</w:t>
       </w:r>
     </w:p>
     <w:p>
@@ -4246,7 +4301,7 @@
           <w:szCs w:val="44"/>
           <w:rtl/>
         </w:rPr>
-        <w:t xml:space="preserve">الدعاء الثامن والخمسون</w:t>
+        <w:t xml:space="preserve">الدعاء التاسع والخمسون</w:t>
       </w:r>
     </w:p>
     <w:p>
@@ -4280,7 +4335,7 @@
           <w:szCs w:val="44"/>
           <w:rtl/>
         </w:rPr>
-        <w:t xml:space="preserve">الدعاء التاسع والخمسون</w:t>
+        <w:t xml:space="preserve">الدعاء الستون</w:t>
       </w:r>
     </w:p>
     <w:p>
@@ -4314,7 +4369,7 @@
           <w:szCs w:val="44"/>
           <w:rtl/>
         </w:rPr>
-        <w:t xml:space="preserve">الدعاء الستون</w:t>
+        <w:t xml:space="preserve">الدعاء الحادي والستون</w:t>
       </w:r>
     </w:p>
     <w:p>
@@ -4348,7 +4403,7 @@
           <w:szCs w:val="44"/>
           <w:rtl/>
         </w:rPr>
-        <w:t xml:space="preserve">الدعاء الحادي والستون</w:t>
+        <w:t xml:space="preserve">الدعاء الثاني والستون</w:t>
       </w:r>
     </w:p>
     <w:p>
@@ -4382,7 +4437,7 @@
           <w:szCs w:val="44"/>
           <w:rtl/>
         </w:rPr>
-        <w:t xml:space="preserve">الدعاء الثاني والستون</w:t>
+        <w:t xml:space="preserve">الدعاء الثالث والستون</w:t>
       </w:r>
     </w:p>
     <w:p>

</xml_diff>

<commit_message>
Color every missed Quran verse red across the document
Audited all ~289 quoted passages for verbatim Quran text that wasn't
wrapped in the ﴿﴾ + <red> convention (many were written with plain «»
quotes instead of Quran brackets, so the earlier automated pass missed
them). Fixed ~24 spots, including duplicated verses appearing in
multiple categories and Ayat al-Kursi in category 22. Adiyat Yasin
(category 21) is intentionally left untouched per earlier instruction.
</commit_message>
<xml_diff>
--- a/خزانة الأدعية.docx
+++ b/خزانة الأدعية.docx
@@ -857,7 +857,28 @@
           <w:szCs w:val="24"/>
           <w:rtl/>
         </w:rPr>
-        <w:t xml:space="preserve">عقد لسان أي شخص مهما كانت هيبته وجبروته: قبل الذهاب إليه، تُقرأ هذه الآية على كف اليد اليمنى وهي مفتوحة: «وَمَا رَمَيْتَ إِذْ رَمَيْتَ وَلَٰكِنَّ اللَّهَ رَمَىٰ» (3 مرات)، ثم يُقال: «لجمت لسان المتكبرين بلجام رب العالمين» (3 مرات)، ثم تُغلق اليد ولا يُتكلم مع أحد غير هذا الشخص، وقبل بدء الكلام معه تُفتح اليد أمامه</w:t>
+        <w:t xml:space="preserve">عقد لسان أي شخص مهما كانت هيبته وجبروته: قبل الذهاب إليه، تُقرأ هذه الآية على كف اليد اليمنى وهي مفتوحة: </w:t>
+      </w:r>
+      <w:r>
+        <w:rPr>
+          <w:rFonts w:ascii="Times New Roman" w:cs="Times New Roman" w:eastAsia="Times New Roman" w:hAnsi="Times New Roman"/>
+          <w:b/>
+          <w:bCs/>
+          <w:color w:val="B23A2E"/>
+          <w:sz w:val="24"/>
+          <w:szCs w:val="24"/>
+          <w:rtl/>
+        </w:rPr>
+        <w:t xml:space="preserve">﴿وَمَا رَمَيْتَ إِذْ رَمَيْتَ وَلَٰكِنَّ اللَّهَ رَمَىٰ﴾</w:t>
+      </w:r>
+      <w:r>
+        <w:rPr>
+          <w:rFonts w:ascii="Times New Roman" w:cs="Times New Roman" w:eastAsia="Times New Roman" w:hAnsi="Times New Roman"/>
+          <w:sz w:val="24"/>
+          <w:szCs w:val="24"/>
+          <w:rtl/>
+        </w:rPr>
+        <w:t xml:space="preserve"> (3 مرات)، ثم يُقال: «لجمت لسان المتكبرين بلجام رب العالمين» (3 مرات)، ثم تُغلق اليد ولا يُتكلم مع أحد غير هذا الشخص، وقبل بدء الكلام معه تُفتح اليد أمامه</w:t>
       </w:r>
     </w:p>
     <w:p>
@@ -995,7 +1016,19 @@
           <w:szCs w:val="24"/>
           <w:rtl/>
         </w:rPr>
-        <w:t xml:space="preserve">للرزق: ردد 7 مرات بعد كل صلاة: «لَقَدْ جَاءَكُمْ رَسُولٌ مِّنْ أَنفُسِكُمْ عَزِيزٌ عَلَيْهِ مَا عَنِتُّمْ حَرِيصٌ عَلَيْكُم بِالْمُؤْمِنِينَ رَءُوفٌ رَّحِيمٌ (128) فَإِن تَوَلَّوْا فَقُلْ حَسْبِيَ اللَّهُ لَا إِلَٰهَ إِلَّا هُوَ ۖ عَلَيْهِ تَوَكَّلْتُ ۖ وَهُوَ رَبُّ الْعَرْشِ الْعَظِيمِ»</w:t>
+        <w:t xml:space="preserve">للرزق: ردد 7 مرات بعد كل صلاة: </w:t>
+      </w:r>
+      <w:r>
+        <w:rPr>
+          <w:rFonts w:ascii="Times New Roman" w:cs="Times New Roman" w:eastAsia="Times New Roman" w:hAnsi="Times New Roman"/>
+          <w:b/>
+          <w:bCs/>
+          <w:color w:val="B23A2E"/>
+          <w:sz w:val="24"/>
+          <w:szCs w:val="24"/>
+          <w:rtl/>
+        </w:rPr>
+        <w:t xml:space="preserve">﴿لَقَدْ جَاءَكُمْ رَسُولٌ مِّنْ أَنفُسِكُمْ عَزِيزٌ عَلَيْهِ مَا عَنِتُّمْ حَرِيصٌ عَلَيْكُم بِالْمُؤْمِنِينَ رَءُوفٌ رَّحِيمٌ (128) فَإِن تَوَلَّوْا فَقُلْ حَسْبِيَ اللَّهُ لَا إِلَٰهَ إِلَّا هُوَ ۖ عَلَيْهِ تَوَكَّلْتُ ۖ وَهُوَ رَبُّ الْعَرْشِ الْعَظِيمِ﴾</w:t>
       </w:r>
     </w:p>
     <w:p>
@@ -1229,11 +1262,23 @@
       <w:r>
         <w:rPr>
           <w:rFonts w:ascii="Times New Roman" w:cs="Times New Roman" w:eastAsia="Times New Roman" w:hAnsi="Times New Roman"/>
-          <w:sz w:val="24"/>
-          <w:szCs w:val="24"/>
-          <w:rtl/>
-        </w:rPr>
-        <w:t xml:space="preserve">«إِنَّ هَٰذَا لَرِزْقُنَا مَا لَهُ مِن نَّفَادٍ» تُقرأ 7 مرات كل يوم، ثم يُقال: «اللهم ربي، بحق حبك لسيدنا محمد صلى الله عليه وسلم، وبحق حب سيدنا محمد صلى الله عليه وسلم لك، ربي أن ترزقني»</w:t>
+          <w:b/>
+          <w:bCs/>
+          <w:color w:val="B23A2E"/>
+          <w:sz w:val="24"/>
+          <w:szCs w:val="24"/>
+          <w:rtl/>
+        </w:rPr>
+        <w:t xml:space="preserve">﴿إِنَّ هَٰذَا لَرِزْقُنَا مَا لَهُ مِن نَّفَادٍ﴾</w:t>
+      </w:r>
+      <w:r>
+        <w:rPr>
+          <w:rFonts w:ascii="Times New Roman" w:cs="Times New Roman" w:eastAsia="Times New Roman" w:hAnsi="Times New Roman"/>
+          <w:sz w:val="24"/>
+          <w:szCs w:val="24"/>
+          <w:rtl/>
+        </w:rPr>
+        <w:t xml:space="preserve"> تُقرأ 7 مرات كل يوم، ثم يُقال: «اللهم ربي، بحق حبك لسيدنا محمد صلى الله عليه وسلم، وبحق حب سيدنا محمد صلى الله عليه وسلم لك، ربي أن ترزقني»</w:t>
       </w:r>
     </w:p>
     <w:p>
@@ -1471,7 +1516,19 @@
           <w:szCs w:val="24"/>
           <w:rtl/>
         </w:rPr>
-        <w:t xml:space="preserve">لسعة الرزق، رُدّد هذه الآية عدد مرات: «وَمَن يَتَّقِ اللَّهَ يَجْعَل لَّهُ مَخْرَجًا، وَيَرْزُقْهُ مِنْ حَيْثُ لَا يَحْتَسِبُ، وَمَن يَتَوَكَّلْ عَلَى اللَّهِ فَهُوَ حَسْبُهُ، إِنَّ اللَّهَ بَالِغُ أَمْرِهِ، قَدْ جَعَلَ اللَّهُ لِكُلِّ شَيْءٍ قَدْرًا»</w:t>
+        <w:t xml:space="preserve">لسعة الرزق، رُدّد هذه الآية عدد مرات: </w:t>
+      </w:r>
+      <w:r>
+        <w:rPr>
+          <w:rFonts w:ascii="Times New Roman" w:cs="Times New Roman" w:eastAsia="Times New Roman" w:hAnsi="Times New Roman"/>
+          <w:b/>
+          <w:bCs/>
+          <w:color w:val="B23A2E"/>
+          <w:sz w:val="24"/>
+          <w:szCs w:val="24"/>
+          <w:rtl/>
+        </w:rPr>
+        <w:t xml:space="preserve">﴿وَمَن يَتَّقِ اللَّهَ يَجْعَل لَّهُ مَخْرَجًا، وَيَرْزُقْهُ مِنْ حَيْثُ لَا يَحْتَسِبُ، وَمَن يَتَوَكَّلْ عَلَى اللَّهِ فَهُوَ حَسْبُهُ، إِنَّ اللَّهَ بَالِغُ أَمْرِهِ، قَدْ جَعَلَ اللَّهُ لِكُلِّ شَيْءٍ قَدْرًا﴾</w:t>
       </w:r>
     </w:p>
     <w:p>
@@ -2210,7 +2267,28 @@
           <w:szCs w:val="24"/>
           <w:rtl/>
         </w:rPr>
-        <w:t xml:space="preserve">الدعاء الأول (دعاء تفريج الكرب الكامل، مكوّن من 4 أدعية): الدعاء الأول: «اللهم إن في تدبيرك ما يغني عن الحيل، وفي كرمك ما هو فوق الأمل، وفي عفوك ما يمحو الزلل. اللهم يا وليي في نعمتي، ويا مؤنسي في وحشتي، ويا ملاذي عند غربتي، اجعل ما أخافه وأحذره بردًا وسلامًا على قلبي، كما جعلت النار بردًا وسلامًا على إبراهيم». الدعاء الثاني: «اللهم رب السماوات السبع، ورب العرش العظيم، كن لي جارًا من (فلان بن فلان)، ومن أحزابه من الجن والإنس، أن يفرط علي أحد منهم أو يطغى. عز جارك، وجل ثناؤك، ولا إله غيرك. اللهم اجعلني في جوارك من شر كل ذي شر، ومن شر الشيطان الرجيم. إن وليي الله الذي نزل الكتاب، وهو يتولى الصالحين». الدعاء الثالث: «</w:t>
+        <w:t xml:space="preserve">الدعاء الأول (دعاء تفريج الكرب الكامل، مكوّن من 4 أدعية): الدعاء الأول: «اللهم إن في تدبيرك ما يغني عن الحيل، وفي كرمك ما هو فوق الأمل، وفي عفوك ما يمحو الزلل. اللهم يا وليي في نعمتي، ويا مؤنسي في وحشتي، ويا ملاذي عند غربتي، اجعل ما أخافه وأحذره بردًا وسلامًا على قلبي، كما جعلت النار بردًا وسلامًا على إبراهيم». الدعاء الثاني: «اللهم رب السماوات السبع، ورب العرش العظيم، كن لي جارًا من (فلان بن فلان)، ومن أحزابه من الجن والإنس، أن يفرط علي أحد منهم أو يطغى. عز جارك، وجل ثناؤك، ولا إله غيرك. اللهم اجعلني في جوارك من شر كل ذي شر، ومن شر الشيطان الرجيم. </w:t>
+      </w:r>
+      <w:r>
+        <w:rPr>
+          <w:rFonts w:ascii="Times New Roman" w:cs="Times New Roman" w:eastAsia="Times New Roman" w:hAnsi="Times New Roman"/>
+          <w:b/>
+          <w:bCs/>
+          <w:color w:val="B23A2E"/>
+          <w:sz w:val="24"/>
+          <w:szCs w:val="24"/>
+          <w:rtl/>
+        </w:rPr>
+        <w:t xml:space="preserve">﴿إن وليي الله الذي نزل الكتاب، وهو يتولى الصالحين﴾</w:t>
+      </w:r>
+      <w:r>
+        <w:rPr>
+          <w:rFonts w:ascii="Times New Roman" w:cs="Times New Roman" w:eastAsia="Times New Roman" w:hAnsi="Times New Roman"/>
+          <w:sz w:val="24"/>
+          <w:szCs w:val="24"/>
+          <w:rtl/>
+        </w:rPr>
+        <w:t xml:space="preserve">». الدعاء الثالث: «</w:t>
       </w:r>
       <w:r>
         <w:rPr>
@@ -2299,7 +2377,19 @@
           <w:szCs w:val="24"/>
           <w:rtl/>
         </w:rPr>
-        <w:t xml:space="preserve">لمدة أسبوع، كل يوم تُصلّي ركعتين وبعدها تُسبّح 120 مرة: «أَمَّن يُجِيبُ الْمُضْطَرَّ إِذَا دَعَاهُ وَيَكْشِفُ السُّوءَ»</w:t>
+        <w:t xml:space="preserve">لمدة أسبوع، كل يوم تُصلّي ركعتين وبعدها تُسبّح 120 مرة: </w:t>
+      </w:r>
+      <w:r>
+        <w:rPr>
+          <w:rFonts w:ascii="Times New Roman" w:cs="Times New Roman" w:eastAsia="Times New Roman" w:hAnsi="Times New Roman"/>
+          <w:b/>
+          <w:bCs/>
+          <w:color w:val="B23A2E"/>
+          <w:sz w:val="24"/>
+          <w:szCs w:val="24"/>
+          <w:rtl/>
+        </w:rPr>
+        <w:t xml:space="preserve">﴿أَمَّن يُجِيبُ الْمُضْطَرَّ إِذَا دَعَاهُ وَيَكْشِفُ السُّوءَ﴾</w:t>
       </w:r>
     </w:p>
     <w:p>
@@ -2333,7 +2423,28 @@
           <w:szCs w:val="24"/>
           <w:rtl/>
         </w:rPr>
-        <w:t xml:space="preserve">ليس لها من دون الله كاشفة (70 مرة) + «سلامٌ قولًا من رب رحيم» (30 مرة) — لأي مشكلة معقدة، ويُختم بـ: «الله الله ربي لا أشرك به شيئًا»</w:t>
+        <w:t xml:space="preserve">ليس لها من دون الله كاشفة (70 مرة) + </w:t>
+      </w:r>
+      <w:r>
+        <w:rPr>
+          <w:rFonts w:ascii="Times New Roman" w:cs="Times New Roman" w:eastAsia="Times New Roman" w:hAnsi="Times New Roman"/>
+          <w:b/>
+          <w:bCs/>
+          <w:color w:val="B23A2E"/>
+          <w:sz w:val="24"/>
+          <w:szCs w:val="24"/>
+          <w:rtl/>
+        </w:rPr>
+        <w:t xml:space="preserve">﴿سلامٌ قولًا من رب رحيم﴾</w:t>
+      </w:r>
+      <w:r>
+        <w:rPr>
+          <w:rFonts w:ascii="Times New Roman" w:cs="Times New Roman" w:eastAsia="Times New Roman" w:hAnsi="Times New Roman"/>
+          <w:sz w:val="24"/>
+          <w:szCs w:val="24"/>
+          <w:rtl/>
+        </w:rPr>
+        <w:t xml:space="preserve"> (30 مرة) — لأي مشكلة معقدة، ويُختم بـ: «الله الله ربي لا أشرك به شيئًا»</w:t>
       </w:r>
     </w:p>
     <w:p>
@@ -2571,7 +2682,40 @@
           <w:szCs w:val="24"/>
           <w:rtl/>
         </w:rPr>
-        <w:t xml:space="preserve">عند الإحساس بالظلم في أي موقف، أو اليأس، أو انغلاق أبواب الرزق، لتفريج الكربات وتأمين القلوب وتفويض الأمر لله (100 مرة): «حسبنا الله سيؤتينا الله من فضله، إنا إلى الله راغبون» و«إن ولي الله الذي نزل الكتاب وهو يتولى الصالحين»</w:t>
+        <w:t xml:space="preserve">عند الإحساس بالظلم في أي موقف، أو اليأس، أو انغلاق أبواب الرزق، لتفريج الكربات وتأمين القلوب وتفويض الأمر لله (100 مرة): </w:t>
+      </w:r>
+      <w:r>
+        <w:rPr>
+          <w:rFonts w:ascii="Times New Roman" w:cs="Times New Roman" w:eastAsia="Times New Roman" w:hAnsi="Times New Roman"/>
+          <w:b/>
+          <w:bCs/>
+          <w:color w:val="B23A2E"/>
+          <w:sz w:val="24"/>
+          <w:szCs w:val="24"/>
+          <w:rtl/>
+        </w:rPr>
+        <w:t xml:space="preserve">﴿حسبنا الله سيؤتينا الله من فضله، إنا إلى الله راغبون﴾</w:t>
+      </w:r>
+      <w:r>
+        <w:rPr>
+          <w:rFonts w:ascii="Times New Roman" w:cs="Times New Roman" w:eastAsia="Times New Roman" w:hAnsi="Times New Roman"/>
+          <w:sz w:val="24"/>
+          <w:szCs w:val="24"/>
+          <w:rtl/>
+        </w:rPr>
+        <w:t xml:space="preserve"> و</w:t>
+      </w:r>
+      <w:r>
+        <w:rPr>
+          <w:rFonts w:ascii="Times New Roman" w:cs="Times New Roman" w:eastAsia="Times New Roman" w:hAnsi="Times New Roman"/>
+          <w:b/>
+          <w:bCs/>
+          <w:color w:val="B23A2E"/>
+          <w:sz w:val="24"/>
+          <w:szCs w:val="24"/>
+          <w:rtl/>
+        </w:rPr>
+        <w:t xml:space="preserve">﴿إن ولي الله الذي نزل الكتاب وهو يتولى الصالحين﴾</w:t>
       </w:r>
     </w:p>
     <w:p>
@@ -2986,11 +3130,23 @@
       <w:r>
         <w:rPr>
           <w:rFonts w:ascii="Times New Roman" w:cs="Times New Roman" w:eastAsia="Times New Roman" w:hAnsi="Times New Roman"/>
-          <w:sz w:val="24"/>
-          <w:szCs w:val="24"/>
-          <w:rtl/>
-        </w:rPr>
-        <w:t xml:space="preserve">«رَبِّ إِنِّي ظَلَمْتُ نَفْسِي وَأَسْلَمْتُ مَعَ سُلَيْمَانَ لِلَّهِ رَبِّ الْعَالَمِينَ» تُقرأ 44 مرة — سر من أسرار فك الكربات</w:t>
+          <w:b/>
+          <w:bCs/>
+          <w:color w:val="B23A2E"/>
+          <w:sz w:val="24"/>
+          <w:szCs w:val="24"/>
+          <w:rtl/>
+        </w:rPr>
+        <w:t xml:space="preserve">﴿رَبِّ إِنِّي ظَلَمْتُ نَفْسِي وَأَسْلَمْتُ مَعَ سُلَيْمَانَ لِلَّهِ رَبِّ الْعَالَمِينَ﴾</w:t>
+      </w:r>
+      <w:r>
+        <w:rPr>
+          <w:rFonts w:ascii="Times New Roman" w:cs="Times New Roman" w:eastAsia="Times New Roman" w:hAnsi="Times New Roman"/>
+          <w:sz w:val="24"/>
+          <w:szCs w:val="24"/>
+          <w:rtl/>
+        </w:rPr>
+        <w:t xml:space="preserve"> تُقرأ 44 مرة — سر من أسرار فك الكربات</w:t>
       </w:r>
     </w:p>
     <w:p>
@@ -3514,7 +3670,28 @@
           <w:szCs w:val="24"/>
           <w:rtl/>
         </w:rPr>
-        <w:t xml:space="preserve">تُقرأ الآية 82 من سورة يس سبعين مرة: «إِنَّمَا أَمْرُهُ إِذَا أَرَادَ شَيْئًا أَنْ يَقُولَ لَهُ كُنْ فَيَكُونُ» — قبل صلاة الفجر وبعدها يُقال: «اللهم بحق السر المكنون في كن فيكون، أسألك أن تقضي حاجتي وتيسر أمري وتتمم مصالحي» (لمدة 3 أيام)</w:t>
+        <w:t xml:space="preserve">تُقرأ الآية 82 من سورة يس سبعين مرة: </w:t>
+      </w:r>
+      <w:r>
+        <w:rPr>
+          <w:rFonts w:ascii="Times New Roman" w:cs="Times New Roman" w:eastAsia="Times New Roman" w:hAnsi="Times New Roman"/>
+          <w:b/>
+          <w:bCs/>
+          <w:color w:val="B23A2E"/>
+          <w:sz w:val="24"/>
+          <w:szCs w:val="24"/>
+          <w:rtl/>
+        </w:rPr>
+        <w:t xml:space="preserve">﴿إِنَّمَا أَمْرُهُ إِذَا أَرَادَ شَيْئًا أَنْ يَقُولَ لَهُ كُنْ فَيَكُونُ﴾</w:t>
+      </w:r>
+      <w:r>
+        <w:rPr>
+          <w:rFonts w:ascii="Times New Roman" w:cs="Times New Roman" w:eastAsia="Times New Roman" w:hAnsi="Times New Roman"/>
+          <w:sz w:val="24"/>
+          <w:szCs w:val="24"/>
+          <w:rtl/>
+        </w:rPr>
+        <w:t xml:space="preserve"> — قبل صلاة الفجر وبعدها يُقال: «اللهم بحق السر المكنون في كن فيكون، أسألك أن تقضي حاجتي وتيسر أمري وتتمم مصالحي» (لمدة 3 أيام)</w:t>
       </w:r>
     </w:p>
     <w:p>
@@ -3582,7 +3759,19 @@
           <w:szCs w:val="24"/>
           <w:rtl/>
         </w:rPr>
-        <w:t xml:space="preserve">لطلب أي شيء ولو كان مستحيلًا: «وَمَا كَانَ اللَّهُ لِيُعْجِزَهُ مِن شَيْءٍ فِي السَّمَاوَاتِ وَلَا فِي الْأَرْضِ إِنَّهُ كَانَ عَلِيمًا قَدِيرًا»</w:t>
+        <w:t xml:space="preserve">لطلب أي شيء ولو كان مستحيلًا: </w:t>
+      </w:r>
+      <w:r>
+        <w:rPr>
+          <w:rFonts w:ascii="Times New Roman" w:cs="Times New Roman" w:eastAsia="Times New Roman" w:hAnsi="Times New Roman"/>
+          <w:b/>
+          <w:bCs/>
+          <w:color w:val="B23A2E"/>
+          <w:sz w:val="24"/>
+          <w:szCs w:val="24"/>
+          <w:rtl/>
+        </w:rPr>
+        <w:t xml:space="preserve">﴿وَمَا كَانَ اللَّهُ لِيُعْجِزَهُ مِن شَيْءٍ فِي السَّمَاوَاتِ وَلَا فِي الْأَرْضِ إِنَّهُ كَانَ عَلِيمًا قَدِيرًا﴾</w:t>
       </w:r>
     </w:p>
     <w:p>
@@ -4113,7 +4302,28 @@
           <w:szCs w:val="24"/>
           <w:rtl/>
         </w:rPr>
-        <w:t xml:space="preserve">للسيطرة على شخص محتاج منه حاجة: «أَلَا يَعْلَمُ مَنْ خَلَقَ وَهُوَ اللَّطِيفُ الْخَبِيرُ، اللهم اقضِ حاجتي من فلان ابن فلانة، إنك على كل شيء قدير» (100 مرة بعد صلاة الفجر والعصر والعشاء)</w:t>
+        <w:t xml:space="preserve">للسيطرة على شخص محتاج منه حاجة: «</w:t>
+      </w:r>
+      <w:r>
+        <w:rPr>
+          <w:rFonts w:ascii="Times New Roman" w:cs="Times New Roman" w:eastAsia="Times New Roman" w:hAnsi="Times New Roman"/>
+          <w:b/>
+          <w:bCs/>
+          <w:color w:val="B23A2E"/>
+          <w:sz w:val="24"/>
+          <w:szCs w:val="24"/>
+          <w:rtl/>
+        </w:rPr>
+        <w:t xml:space="preserve">﴿أَلَا يَعْلَمُ مَنْ خَلَقَ وَهُوَ اللَّطِيفُ الْخَبِيرُ﴾</w:t>
+      </w:r>
+      <w:r>
+        <w:rPr>
+          <w:rFonts w:ascii="Times New Roman" w:cs="Times New Roman" w:eastAsia="Times New Roman" w:hAnsi="Times New Roman"/>
+          <w:sz w:val="24"/>
+          <w:szCs w:val="24"/>
+          <w:rtl/>
+        </w:rPr>
+        <w:t xml:space="preserve">، اللهم اقضِ حاجتي من فلان ابن فلانة، إنك على كل شيء قدير» (100 مرة بعد صلاة الفجر والعصر والعشاء)</w:t>
       </w:r>
     </w:p>
     <w:p>
@@ -4147,7 +4357,28 @@
           <w:szCs w:val="24"/>
           <w:rtl/>
         </w:rPr>
-        <w:t xml:space="preserve">بعد ركعتين صلاة الحاجة، مستقبل الكعبة، تُقال 120 مرة: «أَمَّن يُجِيبُ الْمُضْطَرَّ إِذَا دَعَاهُ وَيَكْشِفُ السُّوءَ» — كل يوم، وشوف بعد أسبوع اللي حيحصل</w:t>
+        <w:t xml:space="preserve">بعد ركعتين صلاة الحاجة، مستقبل الكعبة، تُقال 120 مرة: </w:t>
+      </w:r>
+      <w:r>
+        <w:rPr>
+          <w:rFonts w:ascii="Times New Roman" w:cs="Times New Roman" w:eastAsia="Times New Roman" w:hAnsi="Times New Roman"/>
+          <w:b/>
+          <w:bCs/>
+          <w:color w:val="B23A2E"/>
+          <w:sz w:val="24"/>
+          <w:szCs w:val="24"/>
+          <w:rtl/>
+        </w:rPr>
+        <w:t xml:space="preserve">﴿أَمَّن يُجِيبُ الْمُضْطَرَّ إِذَا دَعَاهُ وَيَكْشِفُ السُّوءَ﴾</w:t>
+      </w:r>
+      <w:r>
+        <w:rPr>
+          <w:rFonts w:ascii="Times New Roman" w:cs="Times New Roman" w:eastAsia="Times New Roman" w:hAnsi="Times New Roman"/>
+          <w:sz w:val="24"/>
+          <w:szCs w:val="24"/>
+          <w:rtl/>
+        </w:rPr>
+        <w:t xml:space="preserve"> — كل يوم، وشوف بعد أسبوع اللي حيحصل</w:t>
       </w:r>
     </w:p>
     <w:p>
@@ -4535,7 +4766,28 @@
           <w:szCs w:val="24"/>
           <w:rtl/>
         </w:rPr>
-        <w:t xml:space="preserve">تُقرأ الآية «وَمَا رَمَيْتَ إِذْ رَمَيْتَ وَلَٰكِنَّ اللَّهَ رَمَىٰ» (21 مرة) قبل النوم، وبعدها الدعاء: «اللهم ارمِ بقلب من ظلمني وسحرني وآذاني نار من نار جهنم» (3 مرات) «لا تهدأ ولا تنطفئ أبدًا، بحق لا إله إلا الله وبحق محمد رسول الله»</w:t>
+        <w:t xml:space="preserve">تُقرأ الآية </w:t>
+      </w:r>
+      <w:r>
+        <w:rPr>
+          <w:rFonts w:ascii="Times New Roman" w:cs="Times New Roman" w:eastAsia="Times New Roman" w:hAnsi="Times New Roman"/>
+          <w:b/>
+          <w:bCs/>
+          <w:color w:val="B23A2E"/>
+          <w:sz w:val="24"/>
+          <w:szCs w:val="24"/>
+          <w:rtl/>
+        </w:rPr>
+        <w:t xml:space="preserve">﴿وَمَا رَمَيْتَ إِذْ رَمَيْتَ وَلَٰكِنَّ اللَّهَ رَمَىٰ﴾</w:t>
+      </w:r>
+      <w:r>
+        <w:rPr>
+          <w:rFonts w:ascii="Times New Roman" w:cs="Times New Roman" w:eastAsia="Times New Roman" w:hAnsi="Times New Roman"/>
+          <w:sz w:val="24"/>
+          <w:szCs w:val="24"/>
+          <w:rtl/>
+        </w:rPr>
+        <w:t xml:space="preserve"> (21 مرة) قبل النوم، وبعدها الدعاء: «اللهم ارمِ بقلب من ظلمني وسحرني وآذاني نار من نار جهنم» (3 مرات) «لا تهدأ ولا تنطفئ أبدًا، بحق لا إله إلا الله وبحق محمد رسول الله»</w:t>
       </w:r>
     </w:p>
     <w:p>
@@ -4773,7 +5025,28 @@
           <w:szCs w:val="24"/>
           <w:rtl/>
         </w:rPr>
-        <w:t xml:space="preserve">(وما رميت إذ رميت ولكن الله رمى) ثم يُقال هذا الدعاء: «اللهم ارمِ في قلب من ظلمني وقهرني وآذاني مهابتي وخوفًا مني يا رب العالمين». ثم: «اللهم يا من تشفي صدور قوم مؤمنين، اشفِ صدري فيمن ظلمني وقهرني وآذاني وأخذ حقي، ... وحسبنا الله ونعم الوكيل». لرد الكيد تُقرأ: «وَعَنَتِ الْوُجُوهُ لِلْحَيِّ الْقَيُّومِ وَقَدْ خَابَ مَنْ حَمَلَ ظُلْمًا» (7 مرات)، ثم: «الله الله ربي لا أشرك به شيئًا» (مرتين)، ثم دعاء الحسن البصري (نفس نص الفقرة 1)</w:t>
+        <w:t xml:space="preserve">(وما رميت إذ رميت ولكن الله رمى) ثم يُقال هذا الدعاء: «اللهم ارمِ في قلب من ظلمني وقهرني وآذاني مهابتي وخوفًا مني يا رب العالمين». ثم: «اللهم يا من تشفي صدور قوم مؤمنين، اشفِ صدري فيمن ظلمني وقهرني وآذاني وأخذ حقي، ... وحسبنا الله ونعم الوكيل». لرد الكيد تُقرأ: </w:t>
+      </w:r>
+      <w:r>
+        <w:rPr>
+          <w:rFonts w:ascii="Times New Roman" w:cs="Times New Roman" w:eastAsia="Times New Roman" w:hAnsi="Times New Roman"/>
+          <w:b/>
+          <w:bCs/>
+          <w:color w:val="B23A2E"/>
+          <w:sz w:val="24"/>
+          <w:szCs w:val="24"/>
+          <w:rtl/>
+        </w:rPr>
+        <w:t xml:space="preserve">﴿وَعَنَتِ الْوُجُوهُ لِلْحَيِّ الْقَيُّومِ وَقَدْ خَابَ مَنْ حَمَلَ ظُلْمًا﴾</w:t>
+      </w:r>
+      <w:r>
+        <w:rPr>
+          <w:rFonts w:ascii="Times New Roman" w:cs="Times New Roman" w:eastAsia="Times New Roman" w:hAnsi="Times New Roman"/>
+          <w:sz w:val="24"/>
+          <w:szCs w:val="24"/>
+          <w:rtl/>
+        </w:rPr>
+        <w:t xml:space="preserve"> (7 مرات)، ثم: «الله الله ربي لا أشرك به شيئًا» (مرتين)، ثم دعاء الحسن البصري (نفس نص الفقرة 1)</w:t>
       </w:r>
     </w:p>
     <w:p>
@@ -5262,7 +5535,61 @@
           <w:szCs w:val="24"/>
           <w:rtl/>
         </w:rPr>
-        <w:t xml:space="preserve">عند الدخول على أي شخص تخشاه، تُقرأ هذه الآيات: «وَخَشَعَتِ الْأَصْوَاتُ لِلرَّحْمَٰنِ فَلَا تَسْمَعُ إِلَّا هَمْسًا»، «وَعَنَتِ الْوُجُوهُ لِلْحَيِّ الْقَيُّومِ وَقَدْ خَابَ مَنْ حَمَلَ ظُلْمًا»، «أَوَلَمْ يَرَوْا أَنَّ اللَّهَ الَّذِي خَلَقَهُمْ هُوَ أَشَدُّ مِنْهُمْ قُوَّةً»</w:t>
+        <w:t xml:space="preserve">عند الدخول على أي شخص تخشاه، تُقرأ هذه الآيات: </w:t>
+      </w:r>
+      <w:r>
+        <w:rPr>
+          <w:rFonts w:ascii="Times New Roman" w:cs="Times New Roman" w:eastAsia="Times New Roman" w:hAnsi="Times New Roman"/>
+          <w:b/>
+          <w:bCs/>
+          <w:color w:val="B23A2E"/>
+          <w:sz w:val="24"/>
+          <w:szCs w:val="24"/>
+          <w:rtl/>
+        </w:rPr>
+        <w:t xml:space="preserve">﴿وَخَشَعَتِ الْأَصْوَاتُ لِلرَّحْمَٰنِ فَلَا تَسْمَعُ إِلَّا هَمْسًا﴾</w:t>
+      </w:r>
+      <w:r>
+        <w:rPr>
+          <w:rFonts w:ascii="Times New Roman" w:cs="Times New Roman" w:eastAsia="Times New Roman" w:hAnsi="Times New Roman"/>
+          <w:sz w:val="24"/>
+          <w:szCs w:val="24"/>
+          <w:rtl/>
+        </w:rPr>
+        <w:t xml:space="preserve">، </w:t>
+      </w:r>
+      <w:r>
+        <w:rPr>
+          <w:rFonts w:ascii="Times New Roman" w:cs="Times New Roman" w:eastAsia="Times New Roman" w:hAnsi="Times New Roman"/>
+          <w:b/>
+          <w:bCs/>
+          <w:color w:val="B23A2E"/>
+          <w:sz w:val="24"/>
+          <w:szCs w:val="24"/>
+          <w:rtl/>
+        </w:rPr>
+        <w:t xml:space="preserve">﴿وَعَنَتِ الْوُجُوهُ لِلْحَيِّ الْقَيُّومِ وَقَدْ خَابَ مَنْ حَمَلَ ظُلْمًا﴾</w:t>
+      </w:r>
+      <w:r>
+        <w:rPr>
+          <w:rFonts w:ascii="Times New Roman" w:cs="Times New Roman" w:eastAsia="Times New Roman" w:hAnsi="Times New Roman"/>
+          <w:sz w:val="24"/>
+          <w:szCs w:val="24"/>
+          <w:rtl/>
+        </w:rPr>
+        <w:t xml:space="preserve">، </w:t>
+      </w:r>
+      <w:r>
+        <w:rPr>
+          <w:rFonts w:ascii="Times New Roman" w:cs="Times New Roman" w:eastAsia="Times New Roman" w:hAnsi="Times New Roman"/>
+          <w:b/>
+          <w:bCs/>
+          <w:color w:val="B23A2E"/>
+          <w:sz w:val="24"/>
+          <w:szCs w:val="24"/>
+          <w:rtl/>
+        </w:rPr>
+        <w:t xml:space="preserve">﴿أَوَلَمْ يَرَوْا أَنَّ اللَّهَ الَّذِي خَلَقَهُمْ هُوَ أَشَدُّ مِنْهُمْ قُوَّةً﴾</w:t>
       </w:r>
     </w:p>
     <w:p>
@@ -5511,7 +5838,28 @@
           <w:szCs w:val="24"/>
           <w:rtl/>
         </w:rPr>
-        <w:t xml:space="preserve">يُقرأ بسبب تعطيل القرين: سورة النبأ (مرة يوميًا)، سورة الطارق (مرة يوميًا)، سورة الواقعة (مرة يوميًا)، «فالله خير حافظًا وهو أرحم الراحمين» (33 مرة)، «أستغفر الله الذي لا إله إلا هو الحي القيوم» (33 مرة)، «وَلَقَدْ جَعَلْنَا فِي السَّمَاءِ بُرُوجًا وَزَيَّنَّاهَا لِلنَّاظِرِينَ وَحَفِظْنَاهَا مِن كُلِّ شَيْطَانٍ رَّجِيمٍ» (33 مرة)، «فَسَيَكْفِيكَهُمُ اللَّهُ وَهُوَ السَّمِيعُ الْعَلِيمُ» (33 مرة) — يُوزَّع الورد على مدار اليوم، ثم يُقال 3 مرات: «اللهم إنك أنت الله الكريم الوهاب والمعطي الجواد، فلا ممسك لما أعطيت ولا معطي لما أمسكت، أمري بين يديك، رزقي عليك، فلا تُحوجني إلا إليك»</w:t>
+        <w:t xml:space="preserve">يُقرأ بسبب تعطيل القرين: سورة النبأ (مرة يوميًا)، سورة الطارق (مرة يوميًا)، سورة الواقعة (مرة يوميًا)، «فالله خير حافظًا وهو أرحم الراحمين» (33 مرة)، «أستغفر الله الذي لا إله إلا هو الحي القيوم» (33 مرة)، </w:t>
+      </w:r>
+      <w:r>
+        <w:rPr>
+          <w:rFonts w:ascii="Times New Roman" w:cs="Times New Roman" w:eastAsia="Times New Roman" w:hAnsi="Times New Roman"/>
+          <w:b/>
+          <w:bCs/>
+          <w:color w:val="B23A2E"/>
+          <w:sz w:val="24"/>
+          <w:szCs w:val="24"/>
+          <w:rtl/>
+        </w:rPr>
+        <w:t xml:space="preserve">﴿وَلَقَدْ جَعَلْنَا فِي السَّمَاءِ بُرُوجًا وَزَيَّنَّاهَا لِلنَّاظِرِينَ وَحَفِظْنَاهَا مِن كُلِّ شَيْطَانٍ رَّجِيمٍ﴾</w:t>
+      </w:r>
+      <w:r>
+        <w:rPr>
+          <w:rFonts w:ascii="Times New Roman" w:cs="Times New Roman" w:eastAsia="Times New Roman" w:hAnsi="Times New Roman"/>
+          <w:sz w:val="24"/>
+          <w:szCs w:val="24"/>
+          <w:rtl/>
+        </w:rPr>
+        <w:t xml:space="preserve"> (33 مرة)، «فَسَيَكْفِيكَهُمُ اللَّهُ وَهُوَ السَّمِيعُ الْعَلِيمُ» (33 مرة) — يُوزَّع الورد على مدار اليوم، ثم يُقال 3 مرات: «اللهم إنك أنت الله الكريم الوهاب والمعطي الجواد، فلا ممسك لما أعطيت ولا معطي لما أمسكت، أمري بين يديك، رزقي عليك، فلا تُحوجني إلا إليك»</w:t>
       </w:r>
     </w:p>
     <w:p>
@@ -5545,7 +5893,28 @@
           <w:szCs w:val="24"/>
           <w:rtl/>
         </w:rPr>
-        <w:t xml:space="preserve">ورد شامل للحماية: «بسم الله، بسم الله وبالله، بسم الله خير الأسماء، بسم الله رب الأرض والسماء، بسم الله الذي لا يضر مع اسمه شيء في الأرض ولا في السماء، بسم الله افتتحت وبالله ختمت وبه آمنت، بسم الله أصبحت وعلى الله توكلت، بسم الله على قلبي ونفسي، بسم الله على عقلي وذهني، بسم الله على أهلي ومالي، بسم الله على ما أعطاني ربي، بسم الله الشافي، بسم الله المعافي، بسم الله الوافي، بسم الله الذي لا يضر مع اسمه شيء في الأرض ولا السماء وهو السميع العليم، هو الله الله الله الله الله ربي لا أشرك به شيئًا، الله أكبر الله أكبر الله أكبر الله أكبر، وأعزّ وأجل مما أخاف وأحذر، أسألك اللهم بخيرك من خيرك الذي لا يُعطيه غيرك، عزّ جارك وجلّ ثناؤك ولا إله غيرك. اللهم إني أعوذ بك من شر نفسي، ومن شر كل سلطان، ومن شر كل شيطان مريد، ومن شر كل جبار عنيد، ومن شر كل قضاء سوء، ومن شر كل دابة أنت آخذ بناصيتها، إن ربي على صراط مستقيم وأنت على كل شيء حفيظ، إن ولي الله الذي نزل الكتاب وهو يتولى الصالحين. اللهم إني أستجيرك وأحتجب بك من كل شيء خلقته، وأحترس بك من جميع خلقك وكل ما ذرأت وبرأت، وأفوّض أمري إليك، وأقدّم بين يدي في يومي هذا وليلتي هذه وساعتي هذه وشهري هذا. بسم الله الرحمن الرحيم </w:t>
+        <w:t xml:space="preserve">ورد شامل للحماية: «بسم الله، بسم الله وبالله، بسم الله خير الأسماء، بسم الله رب الأرض والسماء، بسم الله الذي لا يضر مع اسمه شيء في الأرض ولا في السماء، بسم الله افتتحت وبالله ختمت وبه آمنت، بسم الله أصبحت وعلى الله توكلت، بسم الله على قلبي ونفسي، بسم الله على عقلي وذهني، بسم الله على أهلي ومالي، بسم الله على ما أعطاني ربي، بسم الله الشافي، بسم الله المعافي، بسم الله الوافي، بسم الله الذي لا يضر مع اسمه شيء في الأرض ولا السماء وهو السميع العليم، هو الله الله الله الله الله ربي لا أشرك به شيئًا، الله أكبر الله أكبر الله أكبر الله أكبر، وأعزّ وأجل مما أخاف وأحذر، أسألك اللهم بخيرك من خيرك الذي لا يُعطيه غيرك، عزّ جارك وجلّ ثناؤك ولا إله غيرك. اللهم إني أعوذ بك من شر نفسي، ومن شر كل سلطان، ومن شر كل شيطان مريد، ومن شر كل جبار عنيد، ومن شر كل قضاء سوء، ومن شر كل دابة أنت آخذ بناصيتها، إن ربي على صراط مستقيم وأنت على كل شيء حفيظ، </w:t>
+      </w:r>
+      <w:r>
+        <w:rPr>
+          <w:rFonts w:ascii="Times New Roman" w:cs="Times New Roman" w:eastAsia="Times New Roman" w:hAnsi="Times New Roman"/>
+          <w:b/>
+          <w:bCs/>
+          <w:color w:val="B23A2E"/>
+          <w:sz w:val="24"/>
+          <w:szCs w:val="24"/>
+          <w:rtl/>
+        </w:rPr>
+        <w:t xml:space="preserve">﴿إن ولي الله الذي نزل الكتاب وهو يتولى الصالحين﴾</w:t>
+      </w:r>
+      <w:r>
+        <w:rPr>
+          <w:rFonts w:ascii="Times New Roman" w:cs="Times New Roman" w:eastAsia="Times New Roman" w:hAnsi="Times New Roman"/>
+          <w:sz w:val="24"/>
+          <w:szCs w:val="24"/>
+          <w:rtl/>
+        </w:rPr>
+        <w:t xml:space="preserve">. اللهم إني أستجيرك وأحتجب بك من كل شيء خلقته، وأحترس بك من جميع خلقك وكل ما ذرأت وبرأت، وأفوّض أمري إليك، وأقدّم بين يدي في يومي هذا وليلتي هذه وساعتي هذه وشهري هذا. بسم الله الرحمن الرحيم </w:t>
       </w:r>
       <w:r>
         <w:rPr>
@@ -5768,7 +6137,19 @@
           <w:szCs w:val="24"/>
           <w:rtl/>
         </w:rPr>
-        <w:t xml:space="preserve">دعاء الخروج من البيت: «حَسْبُنَا اللَّهُ سَيُؤْتِينَا اللَّهُ مِن فَضْلِهِ وَرَسُولُهُ إِنَّا إِلَى اللَّهِ رَاغِبُونَ»</w:t>
+        <w:t xml:space="preserve">دعاء الخروج من البيت: </w:t>
+      </w:r>
+      <w:r>
+        <w:rPr>
+          <w:rFonts w:ascii="Times New Roman" w:cs="Times New Roman" w:eastAsia="Times New Roman" w:hAnsi="Times New Roman"/>
+          <w:b/>
+          <w:bCs/>
+          <w:color w:val="B23A2E"/>
+          <w:sz w:val="24"/>
+          <w:szCs w:val="24"/>
+          <w:rtl/>
+        </w:rPr>
+        <w:t xml:space="preserve">﴿حَسْبُنَا اللَّهُ سَيُؤْتِينَا اللَّهُ مِن فَضْلِهِ وَرَسُولُهُ إِنَّا إِلَى اللَّهِ رَاغِبُونَ﴾</w:t>
       </w:r>
     </w:p>
     <w:p>
@@ -6189,7 +6570,49 @@
           <w:szCs w:val="24"/>
           <w:rtl/>
         </w:rPr>
-        <w:t xml:space="preserve">آية الكرسي كاملة (21 مرة)، ثم «وَجَعَلْنَا مِن بَيْنِ أَيْدِيهِمْ سَدًّا وَمِنْ خَلْفِهِمْ سَدًّا فَأَغْشَيْنَاهُمْ فَهُمْ لَا يُبْصِرُونَ» (21 مرة)، ثم «يَا مَعْشَرَ الْجِنِّ وَالْإِنسِ إِنِ اسْتَطَعْتُمْ أَن تَنفُذُوا مِنْ أَقْطَارِ السَّمَاوَاتِ وَالْأَرْضِ فَانفُذُوا ۚ لَا تَنفُذُونَ إِلَّا بِسُلْطَانٍ» (21 مرة)</w:t>
+        <w:t xml:space="preserve">آية الكرسي كاملة (21 مرة)، ثم </w:t>
+      </w:r>
+      <w:r>
+        <w:rPr>
+          <w:rFonts w:ascii="Times New Roman" w:cs="Times New Roman" w:eastAsia="Times New Roman" w:hAnsi="Times New Roman"/>
+          <w:b/>
+          <w:bCs/>
+          <w:color w:val="B23A2E"/>
+          <w:sz w:val="24"/>
+          <w:szCs w:val="24"/>
+          <w:rtl/>
+        </w:rPr>
+        <w:t xml:space="preserve">﴿وَجَعَلْنَا مِن بَيْنِ أَيْدِيهِمْ سَدًّا وَمِنْ خَلْفِهِمْ سَدًّا فَأَغْشَيْنَاهُمْ فَهُمْ لَا يُبْصِرُونَ﴾</w:t>
+      </w:r>
+      <w:r>
+        <w:rPr>
+          <w:rFonts w:ascii="Times New Roman" w:cs="Times New Roman" w:eastAsia="Times New Roman" w:hAnsi="Times New Roman"/>
+          <w:sz w:val="24"/>
+          <w:szCs w:val="24"/>
+          <w:rtl/>
+        </w:rPr>
+        <w:t xml:space="preserve"> (21 مرة)، ثم </w:t>
+      </w:r>
+      <w:r>
+        <w:rPr>
+          <w:rFonts w:ascii="Times New Roman" w:cs="Times New Roman" w:eastAsia="Times New Roman" w:hAnsi="Times New Roman"/>
+          <w:b/>
+          <w:bCs/>
+          <w:color w:val="B23A2E"/>
+          <w:sz w:val="24"/>
+          <w:szCs w:val="24"/>
+          <w:rtl/>
+        </w:rPr>
+        <w:t xml:space="preserve">﴿يَا مَعْشَرَ الْجِنِّ وَالْإِنسِ إِنِ اسْتَطَعْتُمْ أَن تَنفُذُوا مِنْ أَقْطَارِ السَّمَاوَاتِ وَالْأَرْضِ فَانفُذُوا ۚ لَا تَنفُذُونَ إِلَّا بِسُلْطَانٍ﴾</w:t>
+      </w:r>
+      <w:r>
+        <w:rPr>
+          <w:rFonts w:ascii="Times New Roman" w:cs="Times New Roman" w:eastAsia="Times New Roman" w:hAnsi="Times New Roman"/>
+          <w:sz w:val="24"/>
+          <w:szCs w:val="24"/>
+          <w:rtl/>
+        </w:rPr>
+        <w:t xml:space="preserve"> (21 مرة)</w:t>
       </w:r>
     </w:p>
     <w:p>
@@ -6257,7 +6680,19 @@
           <w:szCs w:val="24"/>
           <w:rtl/>
         </w:rPr>
-        <w:t xml:space="preserve">اية الاستجابة: بعد الوضوء وصلاة ركعتين والاستغفار والصلاة على النبي، تُقرأ 40 مرة آية سورة الأنبياء: «وَذَا النُّونِ إِذ ذَّهَبَ مُغَاضِبًا فَظَنَّ أَن لَّن نَّقْدِرَ عَلَيْهِ فَنَادَىٰ فِي الظُّلُمَاتِ أَن لَّا إِلَٰهَ إِلَّا أَنتَ سُبْحَانَكَ إِنِّي كُنتُ مِنَ الظَّالِمِينَ»</w:t>
+        <w:t xml:space="preserve">اية الاستجابة: بعد الوضوء وصلاة ركعتين والاستغفار والصلاة على النبي، تُقرأ 40 مرة آية سورة الأنبياء: </w:t>
+      </w:r>
+      <w:r>
+        <w:rPr>
+          <w:rFonts w:ascii="Times New Roman" w:cs="Times New Roman" w:eastAsia="Times New Roman" w:hAnsi="Times New Roman"/>
+          <w:b/>
+          <w:bCs/>
+          <w:color w:val="B23A2E"/>
+          <w:sz w:val="24"/>
+          <w:szCs w:val="24"/>
+          <w:rtl/>
+        </w:rPr>
+        <w:t xml:space="preserve">﴿وَذَا النُّونِ إِذ ذَّهَبَ مُغَاضِبًا فَظَنَّ أَن لَّن نَّقْدِرَ عَلَيْهِ فَنَادَىٰ فِي الظُّلُمَاتِ أَن لَّا إِلَٰهَ إِلَّا أَنتَ سُبْحَانَكَ إِنِّي كُنتُ مِنَ الظَّالِمِينَ﴾</w:t>
       </w:r>
     </w:p>
     <w:p>
@@ -6359,7 +6794,28 @@
           <w:szCs w:val="24"/>
           <w:rtl/>
         </w:rPr>
-        <w:t xml:space="preserve">تاج الذكر، تاج التسبيح، تاج الدعاء: «لا إله إلا الله وحده لا شريك له، له الملك وله الحمد وهو على كل شيء قدير» (تاج الذكر)، «سبحان الله وبحمده عدد خلقه ورضا نفسه وزنة عرشه ومداد كلماته» (تاج التسبيح)، «رَبَّنَا آتِنَا فِي الدُّنْيَا حَسَنَةً» (تاج الدعاء)</w:t>
+        <w:t xml:space="preserve">تاج الذكر، تاج التسبيح، تاج الدعاء: «لا إله إلا الله وحده لا شريك له، له الملك وله الحمد وهو على كل شيء قدير» (تاج الذكر)، «سبحان الله وبحمده عدد خلقه ورضا نفسه وزنة عرشه ومداد كلماته» (تاج التسبيح)، </w:t>
+      </w:r>
+      <w:r>
+        <w:rPr>
+          <w:rFonts w:ascii="Times New Roman" w:cs="Times New Roman" w:eastAsia="Times New Roman" w:hAnsi="Times New Roman"/>
+          <w:b/>
+          <w:bCs/>
+          <w:color w:val="B23A2E"/>
+          <w:sz w:val="24"/>
+          <w:szCs w:val="24"/>
+          <w:rtl/>
+        </w:rPr>
+        <w:t xml:space="preserve">﴿رَبَّنَا آتِنَا فِي الدُّنْيَا حَسَنَةً﴾</w:t>
+      </w:r>
+      <w:r>
+        <w:rPr>
+          <w:rFonts w:ascii="Times New Roman" w:cs="Times New Roman" w:eastAsia="Times New Roman" w:hAnsi="Times New Roman"/>
+          <w:sz w:val="24"/>
+          <w:szCs w:val="24"/>
+          <w:rtl/>
+        </w:rPr>
+        <w:t xml:space="preserve"> (تاج الدعاء)</w:t>
       </w:r>
     </w:p>
     <w:p>
@@ -8532,7 +8988,49 @@
           <w:szCs w:val="24"/>
           <w:rtl/>
         </w:rPr>
-        <w:t xml:space="preserve">اللهم صلِّ على أصل الكمال المطلق والجمال المحقق، أفضل الخلق، ونور تجليات الحق، صلاة تفيض علينا نورًا وقبولًا ومحبة الرسول، صلاة تُنال بها الجمال والكمال والجلال، واجعلني بحبه موصولًا، وبكرمك وعنايتك مشمولًا، وعلى آله وصحبه وسلم (7 مرات) — ثم تُقرأ سورة مريم من الآية 1 إلى 4، ثم: «اللهم أغننا حد الكفاية واكفنا شر البلايا، فسيكفيكهم الله وهو السميع العليم، وكفى بربك هاديًا ونصيرًا، اللهم حقق لي كل ما أتمنى واجعل فيه الخير بقدرتك يا قادر يا قدير» (3 مرات لمدة 3 أيام)</w:t>
+        <w:t xml:space="preserve">اللهم صلِّ على أصل الكمال المطلق والجمال المحقق، أفضل الخلق، ونور تجليات الحق، صلاة تفيض علينا نورًا وقبولًا ومحبة الرسول، صلاة تُنال بها الجمال والكمال والجلال، واجعلني بحبه موصولًا، وبكرمك وعنايتك مشمولًا، وعلى آله وصحبه وسلم (7 مرات) — ثم تُقرأ سورة مريم من الآية 1 إلى 4، ثم: «اللهم أغننا حد الكفاية واكفنا شر البلايا، </w:t>
+      </w:r>
+      <w:r>
+        <w:rPr>
+          <w:rFonts w:ascii="Times New Roman" w:cs="Times New Roman" w:eastAsia="Times New Roman" w:hAnsi="Times New Roman"/>
+          <w:b/>
+          <w:bCs/>
+          <w:color w:val="B23A2E"/>
+          <w:sz w:val="24"/>
+          <w:szCs w:val="24"/>
+          <w:rtl/>
+        </w:rPr>
+        <w:t xml:space="preserve">﴿فسيكفيكهم الله وهو السميع العليم﴾</w:t>
+      </w:r>
+      <w:r>
+        <w:rPr>
+          <w:rFonts w:ascii="Times New Roman" w:cs="Times New Roman" w:eastAsia="Times New Roman" w:hAnsi="Times New Roman"/>
+          <w:sz w:val="24"/>
+          <w:szCs w:val="24"/>
+          <w:rtl/>
+        </w:rPr>
+        <w:t xml:space="preserve">، </w:t>
+      </w:r>
+      <w:r>
+        <w:rPr>
+          <w:rFonts w:ascii="Times New Roman" w:cs="Times New Roman" w:eastAsia="Times New Roman" w:hAnsi="Times New Roman"/>
+          <w:b/>
+          <w:bCs/>
+          <w:color w:val="B23A2E"/>
+          <w:sz w:val="24"/>
+          <w:szCs w:val="24"/>
+          <w:rtl/>
+        </w:rPr>
+        <w:t xml:space="preserve">﴿وكفى بربك هاديًا ونصيرًا﴾</w:t>
+      </w:r>
+      <w:r>
+        <w:rPr>
+          <w:rFonts w:ascii="Times New Roman" w:cs="Times New Roman" w:eastAsia="Times New Roman" w:hAnsi="Times New Roman"/>
+          <w:sz w:val="24"/>
+          <w:szCs w:val="24"/>
+          <w:rtl/>
+        </w:rPr>
+        <w:t xml:space="preserve">، اللهم حقق لي كل ما أتمنى واجعل فيه الخير بقدرتك يا قادر يا قدير» (3 مرات لمدة 3 أيام)</w:t>
       </w:r>
     </w:p>
     <w:p>
@@ -12483,7 +12981,28 @@
           <w:szCs w:val="24"/>
           <w:rtl/>
         </w:rPr>
-        <w:t xml:space="preserve">12 ركعة: تصلي ركعتين وتسلّم، ثم تُكرر، وفي آخر صلاة يُقال بعد التشهد: «لا إله إلا أنت يا حنان يا منان يا بديع السماوات والأرض يا ذا الجلال والإكرام، اللهم صلِّ على محمد وعلى آل محمد»، ثم تسجد وتقول: الفاتحة (7 مرات)، ثم آية الكرسي (7 مرات): «اللَّهُ لَا إِلَٰهَ إِلَّا هُوَ الْحَيُّ الْقَيُّومُ لَا تَأْخُذُهُ سِنَةٌ وَلَا نَوْمٌ لَّهُ مَا فِي السَّمَاوَاتِ وَمَا فِي الْأَرْضِ مَن ذَا الَّذِي يَشْفَعُ عِندَهُ إِلَّا بِإِذْنِهِ يَعْلَمُ مَا بَيْنَ أَيْدِيهِمْ وَمَا خَلْفَهُمْ وَلَا يُحِيطُونَ بِشَيْءٍ مِّنْ عِلْمِهِ إِلَّا بِمَا شَاءَ وَسِعَ كُرْسِيُّهُ السَّمَاوَاتِ وَالْأَرْضَ وَلَا يَئُودُهُ حِفْظُهُمَا وَهُوَ الْعَلِيُّ الْعَظِيمُ»، ثم «لا إله إلا الله وحده لا شريك له، له الملك وله الحمد وهو على كل شيء قدير» (10 مرات)، ثم «اللهم إني أسألك بمعاقد العز من عرشك، ومنتهى الرحمة من كتابك، واسمك الأعظم، وجدك الأعلى، وكلماتك التامات» ثم الدعاء</w:t>
+        <w:t xml:space="preserve">12 ركعة: تصلي ركعتين وتسلّم، ثم تُكرر، وفي آخر صلاة يُقال بعد التشهد: «لا إله إلا أنت يا حنان يا منان يا بديع السماوات والأرض يا ذا الجلال والإكرام، اللهم صلِّ على محمد وعلى آل محمد»، ثم تسجد وتقول: الفاتحة (7 مرات)، ثم آية الكرسي (7 مرات): </w:t>
+      </w:r>
+      <w:r>
+        <w:rPr>
+          <w:rFonts w:ascii="Times New Roman" w:cs="Times New Roman" w:eastAsia="Times New Roman" w:hAnsi="Times New Roman"/>
+          <w:b/>
+          <w:bCs/>
+          <w:color w:val="B23A2E"/>
+          <w:sz w:val="24"/>
+          <w:szCs w:val="24"/>
+          <w:rtl/>
+        </w:rPr>
+        <w:t xml:space="preserve">﴿اللَّهُ لَا إِلَٰهَ إِلَّا هُوَ الْحَيُّ الْقَيُّومُ لَا تَأْخُذُهُ سِنَةٌ وَلَا نَوْمٌ لَّهُ مَا فِي السَّمَاوَاتِ وَمَا فِي الْأَرْضِ مَن ذَا الَّذِي يَشْفَعُ عِندَهُ إِلَّا بِإِذْنِهِ يَعْلَمُ مَا بَيْنَ أَيْدِيهِمْ وَمَا خَلْفَهُمْ وَلَا يُحِيطُونَ بِشَيْءٍ مِّنْ عِلْمِهِ إِلَّا بِمَا شَاءَ وَسِعَ كُرْسِيُّهُ السَّمَاوَاتِ وَالْأَرْضَ وَلَا يَئُودُهُ حِفْظُهُمَا وَهُوَ الْعَلِيُّ الْعَظِيمُ﴾</w:t>
+      </w:r>
+      <w:r>
+        <w:rPr>
+          <w:rFonts w:ascii="Times New Roman" w:cs="Times New Roman" w:eastAsia="Times New Roman" w:hAnsi="Times New Roman"/>
+          <w:sz w:val="24"/>
+          <w:szCs w:val="24"/>
+          <w:rtl/>
+        </w:rPr>
+        <w:t xml:space="preserve">، ثم «لا إله إلا الله وحده لا شريك له، له الملك وله الحمد وهو على كل شيء قدير» (10 مرات)، ثم «اللهم إني أسألك بمعاقد العز من عرشك، ومنتهى الرحمة من كتابك، واسمك الأعظم، وجدك الأعلى، وكلماتك التامات» ثم الدعاء</w:t>
       </w:r>
     </w:p>
     <w:sectPr>

</xml_diff>

<commit_message>
Add dua for protection from someone intending harm (Category 5)
</commit_message>
<xml_diff>
--- a/خزانة الأدعية.docx
+++ b/خزانة الأدعية.docx
@@ -5321,6 +5321,40 @@
           <w:rtl/>
         </w:rPr>
         <w:t xml:space="preserve">دعاء لكل شخص مظلوم وعنده شخص مؤذي: «سبحان الله الحي القدوس، سبحان الله وبحمده ذو العزة والجبروت، يا عزيز يا حميد يا ذا العرش المجيد، اصرف عني ما أطيق وما لا أطيق، واكفني شر كل جبار عنيد، واصرف عني جار السوء وشر الظالمين»</w:t>
+      </w:r>
+    </w:p>
+    <w:p>
+      <w:pPr>
+        <w:bidi/>
+        <w:spacing w:after="120" w:before="320"/>
+        <w:jc w:val="right"/>
+      </w:pPr>
+      <w:r>
+        <w:rPr>
+          <w:rFonts w:ascii="Times New Roman" w:cs="Times New Roman" w:eastAsia="Times New Roman" w:hAnsi="Times New Roman"/>
+          <w:b/>
+          <w:bCs/>
+          <w:sz w:val="44"/>
+          <w:szCs w:val="44"/>
+          <w:rtl/>
+        </w:rPr>
+        <w:t xml:space="preserve">الدعاء الثالث عشر</w:t>
+      </w:r>
+    </w:p>
+    <w:p>
+      <w:pPr>
+        <w:bidi/>
+        <w:spacing w:after="200" w:line="340"/>
+        <w:jc w:val="right"/>
+      </w:pPr>
+      <w:r>
+        <w:rPr>
+          <w:rFonts w:ascii="Times New Roman" w:cs="Times New Roman" w:eastAsia="Times New Roman" w:hAnsi="Times New Roman"/>
+          <w:sz w:val="24"/>
+          <w:szCs w:val="24"/>
+          <w:rtl/>
+        </w:rPr>
+        <w:t xml:space="preserve">اللهم اجعل بيني وبين من أراد بي سوءًا حجابًا منيعًا لا يُهتك، واحفظني من شره وكيده، واصرف عني أذاه بما شئت وكيف شئت، واجعل تدبيره عليه، وأحطني بعنايتك وحفظك، واكفنيهم بما كفيت به عبادك الصالحين، إنك خير حافظ وأرحم الراحمين، وصلِّ اللهم وسلم وبارك على سيدنا محمد وعلى آله وأصحابه وزوجاته أمهات المؤمنين</w:t>
       </w:r>
     </w:p>
     <w:p>

</xml_diff>

<commit_message>
Move the sorrow/distress relief dua from Category 13 to Category 3
</commit_message>
<xml_diff>
--- a/خزانة الأدعية.docx
+++ b/خزانة الأدعية.docx
@@ -3549,6 +3549,40 @@
     </w:p>
     <w:p>
       <w:pPr>
+        <w:bidi/>
+        <w:spacing w:after="120" w:before="320"/>
+        <w:jc w:val="right"/>
+      </w:pPr>
+      <w:r>
+        <w:rPr>
+          <w:rFonts w:ascii="Times New Roman" w:cs="Times New Roman" w:eastAsia="Times New Roman" w:hAnsi="Times New Roman"/>
+          <w:b/>
+          <w:bCs/>
+          <w:sz w:val="44"/>
+          <w:szCs w:val="44"/>
+          <w:rtl/>
+        </w:rPr>
+        <w:t xml:space="preserve">الدعاء الرابع والثلاثون</w:t>
+      </w:r>
+    </w:p>
+    <w:p>
+      <w:pPr>
+        <w:bidi/>
+        <w:spacing w:after="200" w:line="340"/>
+        <w:jc w:val="right"/>
+      </w:pPr>
+      <w:r>
+        <w:rPr>
+          <w:rFonts w:ascii="Times New Roman" w:cs="Times New Roman" w:eastAsia="Times New Roman" w:hAnsi="Times New Roman"/>
+          <w:sz w:val="24"/>
+          <w:szCs w:val="24"/>
+          <w:rtl/>
+        </w:rPr>
+        <w:t xml:space="preserve">«اللهم لا تُشمت أعدائي بدائي، واجعل القرآن العظيم دوائي وشفائي، أنت ثقتي ورجائي، واجعل حسن ظني بك شفائي. اللهم ثبّت علي عقلي وديني، وبك يا رب ثبّت لي يقيني، وارزقني رزقًا حلالًا يكفيني، وأبعد عني شر من يؤذيني، ولا تُحوجني لطبيب يداويني. اللهم استرني على وجه الأرض، اللهم ارحمني في بطن الأرض، اللهم اغفر لي يوم العرض عليك. بسم الله الرحمن الرحيم طريقي، والرحمن رفيقي، والرحيم يحرسني من كل شيء يلمسني. اللهم أعوذ بك من شر النفاثات في العقد ومن شر حاسد إذا حسد. اللهم إني عبدك ابن عبدك ابن أمتك، ناصيتي بيدك، ماضٍ في حكمك، عدل في قضاؤك، أسألك بكل اسم هو لك سميت به نفسك أو أنزلته في كتابك أو علمته أحدًا من خلقك أو استأثرت به في علم الغيب عندك أن تجعل القرآن ربيع قلبي، ونور صدري، وجلاء حزني، وذهاب همي. اللهم يا مسهّل الشديد، ويا مليّن الحديد، ويا منجز الوعيد، ويا من هو كل يوم في أمر جديد، أخرجني من حَلَق الضيق إلى أوسع الطريق، بك أدفع ما لا أطيق، ولا حول ولا قوة إلا بالله العلي العظيم. أسألك اللهم بقدرتك التي حفظت بها يونس في بطن الحوت، ورحمتك التي شفيت بها أيوب بعد الابتلاء، ألا تُبقي لي همًا ولا حزنًا ولا ضيقًا ولا سقمًا إلا فرّجته، وإن أصبحت بحزن فأمسِني بفرح، وإن نمت على ضيق فأيقظني على فرج، وإن كنت بحاجة فلا تكلني إلى سواك، وأن تحفظني لمن يحبني وتحفظ لي أحبتي. اللهم إنك لا تُحمّل نفسًا فوق طاقتها، فلا تُحمّلني من كرب الحياة ما لا طاقة لي به، وباعد بيني وبين مصائب الدنيا وتقلّب حوادثها كما باعدت بين المشرق والمغرب. اللهم بشّرني بالخير كما بشّرت يعقوب بيوسف، وبشّرني بالفرح كما بشّرت زكريا بيحيى»</w:t>
+      </w:r>
+    </w:p>
+    <w:p>
+      <w:pPr>
         <w:pStyle w:val="Heading1"/>
         <w:pageBreakBefore/>
         <w:pBdr>
@@ -9828,7 +9862,7 @@
           <w:szCs w:val="24"/>
           <w:rtl/>
         </w:rPr>
-        <w:t xml:space="preserve">«اللهم لا تُشمت أعدائي بدائي، واجعل القرآن العظيم دوائي وشفائي، أنت ثقتي ورجائي، واجعل حسن ظني بك شفائي. اللهم ثبّت علي عقلي وديني، وبك يا رب ثبّت لي يقيني، وارزقني رزقًا حلالًا يكفيني، وأبعد عني شر من يؤذيني، ولا تُحوجني لطبيب يداويني. اللهم استرني على وجه الأرض، اللهم ارحمني في بطن الأرض، اللهم اغفر لي يوم العرض عليك. بسم الله الرحمن الرحيم طريقي، والرحمن رفيقي، والرحيم يحرسني من كل شيء يلمسني. اللهم أعوذ بك من شر النفاثات في العقد ومن شر حاسد إذا حسد. اللهم إني عبدك ابن عبدك ابن أمتك، ناصيتي بيدك، ماضٍ في حكمك، عدل في قضاؤك، أسألك بكل اسم هو لك سميت به نفسك أو أنزلته في كتابك أو علمته أحدًا من خلقك أو استأثرت به في علم الغيب عندك أن تجعل القرآن ربيع قلبي، ونور صدري، وجلاء حزني، وذهاب همي. اللهم يا مسهّل الشديد، ويا مليّن الحديد، ويا منجز الوعيد، ويا من هو كل يوم في أمر جديد، أخرجني من حَلَق الضيق إلى أوسع الطريق، بك أدفع ما لا أطيق، ولا حول ولا قوة إلا بالله العلي العظيم. أسألك اللهم بقدرتك التي حفظت بها يونس في بطن الحوت، ورحمتك التي شفيت بها أيوب بعد الابتلاء، ألا تُبقي لي همًا ولا حزنًا ولا ضيقًا ولا سقمًا إلا فرّجته، وإن أصبحت بحزن فأمسِني بفرح، وإن نمت على ضيق فأيقظني على فرج، وإن كنت بحاجة فلا تكلني إلى سواك، وأن تحفظني لمن يحبني وتحفظ لي أحبتي. اللهم إنك لا تُحمّل نفسًا فوق طاقتها، فلا تُحمّلني من كرب الحياة ما لا طاقة لي به، وباعد بيني وبين مصائب الدنيا وتقلّب حوادثها كما باعدت بين المشرق والمغرب. اللهم بشّرني بالخير كما بشّرت يعقوب بيوسف، وبشّرني بالفرح كما بشّرت زكريا بيحيى»</w:t>
+        <w:t xml:space="preserve">أسرار البسملة («بسم الله الرحمن الرحيم»): (1) تُقرأ 313 مرة على مريض خاشعًا، وتُصلَّى الصلاة الطبية: «اللهم صلِّ على سيدنا محمد طبّ القلوب ودوائها، وعافية الأبدان وشفائها، ونور الأبصار وضيائها، وقوت الأرواح وغذائها، وعلى آله وصحبه وسلم» — يشفي الله المريض بإذنه. (2) تُقرأ 786 مرة على كوب ماء صباحًا وتُشربه لمدة 7 أيام — يُذهب الله عنك البلادة ويعطيك الحفظ والذكاء، ويجلب النفع ويبعد البلاء. (3) تُقرأ 12000 مرة وأنت متوضئ مستقبل القبلة، كل 1000 مرة تُصلي ركعتين وتدعو بما تريد — تُقضى حاجتك بإذن الله</w:t>
       </w:r>
     </w:p>
     <w:p>
@@ -9862,7 +9896,7 @@
           <w:szCs w:val="24"/>
           <w:rtl/>
         </w:rPr>
-        <w:t xml:space="preserve">أسرار البسملة («بسم الله الرحمن الرحيم»): (1) تُقرأ 313 مرة على مريض خاشعًا، وتُصلَّى الصلاة الطبية: «اللهم صلِّ على سيدنا محمد طبّ القلوب ودوائها، وعافية الأبدان وشفائها، ونور الأبصار وضيائها، وقوت الأرواح وغذائها، وعلى آله وصحبه وسلم» — يشفي الله المريض بإذنه. (2) تُقرأ 786 مرة على كوب ماء صباحًا وتُشربه لمدة 7 أيام — يُذهب الله عنك البلادة ويعطيك الحفظ والذكاء، ويجلب النفع ويبعد البلاء. (3) تُقرأ 12000 مرة وأنت متوضئ مستقبل القبلة، كل 1000 مرة تُصلي ركعتين وتدعو بما تريد — تُقضى حاجتك بإذن الله</w:t>
+        <w:t xml:space="preserve">دعاء للمريض: «لا إله إلا الله الحليم الكريم، لا إله إلا الله العلي العظيم، لا إله إلا الله رب السماوات السبع ورب العرش العظيم، لا إله إلا الله وحده لا شريك له، له الملك وله الحمد وهو على كل شيء قدير، الحمد لله الذي لا إله إلا هو وهو للحمد أهل وهو على كل شيء قدير، وسبحان الله ولا إله إلا الله والله أكبر ولا حول ولا قوة إلا بالله. إلهي، أذهب البأس رب الناس، اشفِ وأنت الشافي، لا شفاء إلا شفاؤك، شفاءً لا يغادر سقمًا. إلهي، أذهب البأس رب الناس، بيدك الشفاء، لا كاشف له إلا أنت، يا رب العالمين آمين. إلهي، إني أسألك من عظيم لطفك وكرمك وسترك الجميل أن تشفيه وتمده بالصحة والعافية. إلهي، لا ملجأ ولا منجى منك إلا إليك، إنك على كل شيء قدير»</w:t>
       </w:r>
     </w:p>
     <w:p>
@@ -9896,7 +9930,7 @@
           <w:szCs w:val="24"/>
           <w:rtl/>
         </w:rPr>
-        <w:t xml:space="preserve">دعاء للمريض: «لا إله إلا الله الحليم الكريم، لا إله إلا الله العلي العظيم، لا إله إلا الله رب السماوات السبع ورب العرش العظيم، لا إله إلا الله وحده لا شريك له، له الملك وله الحمد وهو على كل شيء قدير، الحمد لله الذي لا إله إلا هو وهو للحمد أهل وهو على كل شيء قدير، وسبحان الله ولا إله إلا الله والله أكبر ولا حول ولا قوة إلا بالله. إلهي، أذهب البأس رب الناس، اشفِ وأنت الشافي، لا شفاء إلا شفاؤك، شفاءً لا يغادر سقمًا. إلهي، أذهب البأس رب الناس، بيدك الشفاء، لا كاشف له إلا أنت، يا رب العالمين آمين. إلهي، إني أسألك من عظيم لطفك وكرمك وسترك الجميل أن تشفيه وتمده بالصحة والعافية. إلهي، لا ملجأ ولا منجى منك إلا إليك، إنك على كل شيء قدير»</w:t>
+        <w:t xml:space="preserve">ما من عبد مسلم يعود مريضًا لم يحضر أجله، فيقول 7 مرات: «أسأل الله العظيم رب العرش العظيم أن يشفيك» إلا عوفي</w:t>
       </w:r>
     </w:p>
     <w:p>
@@ -9930,7 +9964,7 @@
           <w:szCs w:val="24"/>
           <w:rtl/>
         </w:rPr>
-        <w:t xml:space="preserve">ما من عبد مسلم يعود مريضًا لم يحضر أجله، فيقول 7 مرات: «أسأل الله العظيم رب العرش العظيم أن يشفيك» إلا عوفي</w:t>
+        <w:t xml:space="preserve">عند زيارة المريض، يُقال: «لا بأس، طهور إن شاء الله» و«اللهم اشفِ عبدك، ينكأ لك عدوًا، أو يمشي لك إلى جنازة»</w:t>
       </w:r>
     </w:p>
     <w:p>
@@ -9949,40 +9983,6 @@
           <w:rtl/>
         </w:rPr>
         <w:t xml:space="preserve">الدعاء السادس</w:t>
-      </w:r>
-    </w:p>
-    <w:p>
-      <w:pPr>
-        <w:bidi/>
-        <w:spacing w:after="200" w:line="340"/>
-        <w:jc w:val="right"/>
-      </w:pPr>
-      <w:r>
-        <w:rPr>
-          <w:rFonts w:ascii="Times New Roman" w:cs="Times New Roman" w:eastAsia="Times New Roman" w:hAnsi="Times New Roman"/>
-          <w:sz w:val="24"/>
-          <w:szCs w:val="24"/>
-          <w:rtl/>
-        </w:rPr>
-        <w:t xml:space="preserve">عند زيارة المريض، يُقال: «لا بأس، طهور إن شاء الله» و«اللهم اشفِ عبدك، ينكأ لك عدوًا، أو يمشي لك إلى جنازة»</w:t>
-      </w:r>
-    </w:p>
-    <w:p>
-      <w:pPr>
-        <w:bidi/>
-        <w:spacing w:after="120" w:before="320"/>
-        <w:jc w:val="right"/>
-      </w:pPr>
-      <w:r>
-        <w:rPr>
-          <w:rFonts w:ascii="Times New Roman" w:cs="Times New Roman" w:eastAsia="Times New Roman" w:hAnsi="Times New Roman"/>
-          <w:b/>
-          <w:bCs/>
-          <w:sz w:val="44"/>
-          <w:szCs w:val="44"/>
-          <w:rtl/>
-        </w:rPr>
-        <w:t xml:space="preserve">الدعاء السابع</w:t>
       </w:r>
     </w:p>
     <w:p>

</xml_diff>

<commit_message>
Move 'ورد شامل للحماية' to be the first dua in Category 6
</commit_message>
<xml_diff>
--- a/خزانة الأدعية.docx
+++ b/خزانة الأدعية.docx
@@ -5446,6 +5446,103 @@
           <w:szCs w:val="24"/>
           <w:rtl/>
         </w:rPr>
+        <w:t xml:space="preserve">ورد شامل للحماية: «بسم الله، بسم الله وبالله، بسم الله خير الأسماء، بسم الله رب الأرض والسماء، بسم الله الذي لا يضر مع اسمه شيء في الأرض ولا في السماء، بسم الله افتتحت وبالله ختمت وبه آمنت، بسم الله أصبحت وعلى الله توكلت، بسم الله على قلبي ونفسي، بسم الله على عقلي وذهني، بسم الله على أهلي ومالي، بسم الله على ما أعطاني ربي، بسم الله الشافي، بسم الله المعافي، بسم الله الوافي، بسم الله الذي لا يضر مع اسمه شيء في الأرض ولا السماء وهو السميع العليم، هو الله الله الله الله الله ربي لا أشرك به شيئًا، الله أكبر الله أكبر الله أكبر الله أكبر، وأعزّ وأجل مما أخاف وأحذر، أسألك اللهم بخيرك من خيرك الذي لا يُعطيه غيرك، عزّ جارك وجلّ ثناؤك ولا إله غيرك. اللهم إني أعوذ بك من شر نفسي، ومن شر كل سلطان، ومن شر كل شيطان مريد، ومن شر كل جبار عنيد، ومن شر كل قضاء سوء، ومن شر كل دابة أنت آخذ بناصيتها، إن ربي على صراط مستقيم وأنت على كل شيء حفيظ، </w:t>
+      </w:r>
+      <w:r>
+        <w:rPr>
+          <w:rFonts w:ascii="Times New Roman" w:cs="Times New Roman" w:eastAsia="Times New Roman" w:hAnsi="Times New Roman"/>
+          <w:b/>
+          <w:bCs/>
+          <w:color w:val="B23A2E"/>
+          <w:sz w:val="24"/>
+          <w:szCs w:val="24"/>
+          <w:rtl/>
+        </w:rPr>
+        <w:t xml:space="preserve">﴿إن ولي الله الذي نزل الكتاب وهو يتولى الصالحين﴾</w:t>
+      </w:r>
+      <w:r>
+        <w:rPr>
+          <w:rFonts w:ascii="Times New Roman" w:cs="Times New Roman" w:eastAsia="Times New Roman" w:hAnsi="Times New Roman"/>
+          <w:sz w:val="24"/>
+          <w:szCs w:val="24"/>
+          <w:rtl/>
+        </w:rPr>
+        <w:t xml:space="preserve">. اللهم إني أستجيرك وأحتجب بك من كل شيء خلقته، وأحترس بك من جميع خلقك وكل ما ذرأت وبرأت، وأفوّض أمري إليك، وأقدّم بين يدي في يومي هذا وليلتي هذه وساعتي هذه وشهري هذا. بسم الله الرحمن الرحيم </w:t>
+      </w:r>
+      <w:r>
+        <w:rPr>
+          <w:rFonts w:ascii="Times New Roman" w:cs="Times New Roman" w:eastAsia="Times New Roman" w:hAnsi="Times New Roman"/>
+          <w:b/>
+          <w:bCs/>
+          <w:color w:val="B23A2E"/>
+          <w:sz w:val="24"/>
+          <w:szCs w:val="24"/>
+          <w:rtl/>
+        </w:rPr>
+        <w:t xml:space="preserve">﴿قُلْ هُوَ اللَّهُ أَحَدٌ اللَّهُ الصَّمَدُ لَمْ يَلِدْ وَلَمْ يُولَدْ وَلَمْ يَكُن لَّهُ كُفُوًا أَحَدٌ﴾</w:t>
+      </w:r>
+      <w:r>
+        <w:rPr>
+          <w:rFonts w:ascii="Times New Roman" w:cs="Times New Roman" w:eastAsia="Times New Roman" w:hAnsi="Times New Roman"/>
+          <w:sz w:val="24"/>
+          <w:szCs w:val="24"/>
+          <w:rtl/>
+        </w:rPr>
+        <w:t xml:space="preserve"> عن أمامي، ومن فوقي، وعن يميني، وعن شمالي، (تُكرر أربع مرات لكل جهة)، ثم آية الكرسي كاملة، ثم آخر آية آل عمران: </w:t>
+      </w:r>
+      <w:r>
+        <w:rPr>
+          <w:rFonts w:ascii="Times New Roman" w:cs="Times New Roman" w:eastAsia="Times New Roman" w:hAnsi="Times New Roman"/>
+          <w:b/>
+          <w:bCs/>
+          <w:color w:val="B23A2E"/>
+          <w:sz w:val="24"/>
+          <w:szCs w:val="24"/>
+          <w:rtl/>
+        </w:rPr>
+        <w:t xml:space="preserve">﴿شَهِدَ اللَّهُ أَنَّهُ لَا إِلَٰهَ إِلَّا هُوَ وَالْمَلَائِكَةُ وَأُولُو الْعِلْمِ قَائِمًا بِالْقِسْطِ﴾</w:t>
+      </w:r>
+      <w:r>
+        <w:rPr>
+          <w:rFonts w:ascii="Times New Roman" w:cs="Times New Roman" w:eastAsia="Times New Roman" w:hAnsi="Times New Roman"/>
+          <w:sz w:val="24"/>
+          <w:szCs w:val="24"/>
+          <w:rtl/>
+        </w:rPr>
+        <w:t xml:space="preserve"> إلى آخرها (7 مرات)»</w:t>
+      </w:r>
+    </w:p>
+    <w:p>
+      <w:pPr>
+        <w:bidi/>
+        <w:spacing w:after="120" w:before="320"/>
+        <w:jc w:val="right"/>
+      </w:pPr>
+      <w:r>
+        <w:rPr>
+          <w:rFonts w:ascii="Times New Roman" w:cs="Times New Roman" w:eastAsia="Times New Roman" w:hAnsi="Times New Roman"/>
+          <w:b/>
+          <w:bCs/>
+          <w:sz w:val="44"/>
+          <w:szCs w:val="44"/>
+          <w:rtl/>
+        </w:rPr>
+        <w:t xml:space="preserve">الدعاء الثاني</w:t>
+      </w:r>
+    </w:p>
+    <w:p>
+      <w:pPr>
+        <w:bidi/>
+        <w:spacing w:after="200" w:line="340"/>
+        <w:jc w:val="right"/>
+      </w:pPr>
+      <w:r>
+        <w:rPr>
+          <w:rFonts w:ascii="Times New Roman" w:cs="Times New Roman" w:eastAsia="Times New Roman" w:hAnsi="Times New Roman"/>
+          <w:sz w:val="24"/>
+          <w:szCs w:val="24"/>
+          <w:rtl/>
+        </w:rPr>
         <w:t xml:space="preserve">ورد متداول لعقد لسان الشخص المؤذي: «كهيعص: كفايتنا. حم عسق: حمايتنا. </w:t>
       </w:r>
       <w:r>
@@ -5485,7 +5582,7 @@
           <w:szCs w:val="44"/>
           <w:rtl/>
         </w:rPr>
-        <w:t xml:space="preserve">الدعاء الثاني</w:t>
+        <w:t xml:space="preserve">الدعاء الثالث</w:t>
       </w:r>
     </w:p>
     <w:p>
@@ -5519,7 +5616,7 @@
           <w:szCs w:val="44"/>
           <w:rtl/>
         </w:rPr>
-        <w:t xml:space="preserve">الدعاء الثالث</w:t>
+        <w:t xml:space="preserve">الدعاء الرابع</w:t>
       </w:r>
     </w:p>
     <w:p>
@@ -5553,7 +5650,7 @@
           <w:szCs w:val="44"/>
           <w:rtl/>
         </w:rPr>
-        <w:t xml:space="preserve">الدعاء الرابع</w:t>
+        <w:t xml:space="preserve">الدعاء الخامس</w:t>
       </w:r>
     </w:p>
     <w:p>
@@ -5587,7 +5684,7 @@
           <w:szCs w:val="44"/>
           <w:rtl/>
         </w:rPr>
-        <w:t xml:space="preserve">الدعاء الخامس</w:t>
+        <w:t xml:space="preserve">الدعاء السادس</w:t>
       </w:r>
     </w:p>
     <w:p>
@@ -5675,7 +5772,7 @@
           <w:szCs w:val="44"/>
           <w:rtl/>
         </w:rPr>
-        <w:t xml:space="preserve">الدعاء السادس</w:t>
+        <w:t xml:space="preserve">الدعاء السابع</w:t>
       </w:r>
     </w:p>
     <w:p>
@@ -5709,7 +5806,7 @@
           <w:szCs w:val="44"/>
           <w:rtl/>
         </w:rPr>
-        <w:t xml:space="preserve">الدعاء السابع</w:t>
+        <w:t xml:space="preserve">الدعاء الثامن</w:t>
       </w:r>
     </w:p>
     <w:p>
@@ -5743,7 +5840,7 @@
           <w:szCs w:val="44"/>
           <w:rtl/>
         </w:rPr>
-        <w:t xml:space="preserve">الدعاء الثامن</w:t>
+        <w:t xml:space="preserve">الدعاء التاسع</w:t>
       </w:r>
     </w:p>
     <w:p>
@@ -5810,7 +5907,7 @@
           <w:szCs w:val="44"/>
           <w:rtl/>
         </w:rPr>
-        <w:t xml:space="preserve">الدعاء التاسع</w:t>
+        <w:t xml:space="preserve">الدعاء العاشر</w:t>
       </w:r>
     </w:p>
     <w:p>
@@ -5856,7 +5953,7 @@
           <w:szCs w:val="44"/>
           <w:rtl/>
         </w:rPr>
-        <w:t xml:space="preserve">الدعاء العاشر</w:t>
+        <w:t xml:space="preserve">الدعاء الحادي عشر</w:t>
       </w:r>
     </w:p>
     <w:p>
@@ -5890,7 +5987,7 @@
           <w:szCs w:val="44"/>
           <w:rtl/>
         </w:rPr>
-        <w:t xml:space="preserve">الدعاء الحادي عشر</w:t>
+        <w:t xml:space="preserve">الدعاء الثاني عشر</w:t>
       </w:r>
     </w:p>
     <w:p>
@@ -5928,103 +6025,6 @@
           <w:rtl/>
         </w:rPr>
         <w:t xml:space="preserve"> (33 مرة)، «فَسَيَكْفِيكَهُمُ اللَّهُ وَهُوَ السَّمِيعُ الْعَلِيمُ» (33 مرة) — يُوزَّع الورد على مدار اليوم، ثم يُقال 3 مرات: «اللهم إنك أنت الله الكريم الوهاب والمعطي الجواد، فلا ممسك لما أعطيت ولا معطي لما أمسكت، أمري بين يديك، رزقي عليك، فلا تُحوجني إلا إليك»</w:t>
-      </w:r>
-    </w:p>
-    <w:p>
-      <w:pPr>
-        <w:bidi/>
-        <w:spacing w:after="120" w:before="320"/>
-        <w:jc w:val="right"/>
-      </w:pPr>
-      <w:r>
-        <w:rPr>
-          <w:rFonts w:ascii="Times New Roman" w:cs="Times New Roman" w:eastAsia="Times New Roman" w:hAnsi="Times New Roman"/>
-          <w:b/>
-          <w:bCs/>
-          <w:sz w:val="44"/>
-          <w:szCs w:val="44"/>
-          <w:rtl/>
-        </w:rPr>
-        <w:t xml:space="preserve">الدعاء الثاني عشر</w:t>
-      </w:r>
-    </w:p>
-    <w:p>
-      <w:pPr>
-        <w:bidi/>
-        <w:spacing w:after="200" w:line="340"/>
-        <w:jc w:val="right"/>
-      </w:pPr>
-      <w:r>
-        <w:rPr>
-          <w:rFonts w:ascii="Times New Roman" w:cs="Times New Roman" w:eastAsia="Times New Roman" w:hAnsi="Times New Roman"/>
-          <w:sz w:val="24"/>
-          <w:szCs w:val="24"/>
-          <w:rtl/>
-        </w:rPr>
-        <w:t xml:space="preserve">ورد شامل للحماية: «بسم الله، بسم الله وبالله، بسم الله خير الأسماء، بسم الله رب الأرض والسماء، بسم الله الذي لا يضر مع اسمه شيء في الأرض ولا في السماء، بسم الله افتتحت وبالله ختمت وبه آمنت، بسم الله أصبحت وعلى الله توكلت، بسم الله على قلبي ونفسي، بسم الله على عقلي وذهني، بسم الله على أهلي ومالي، بسم الله على ما أعطاني ربي، بسم الله الشافي، بسم الله المعافي، بسم الله الوافي، بسم الله الذي لا يضر مع اسمه شيء في الأرض ولا السماء وهو السميع العليم، هو الله الله الله الله الله ربي لا أشرك به شيئًا، الله أكبر الله أكبر الله أكبر الله أكبر، وأعزّ وأجل مما أخاف وأحذر، أسألك اللهم بخيرك من خيرك الذي لا يُعطيه غيرك، عزّ جارك وجلّ ثناؤك ولا إله غيرك. اللهم إني أعوذ بك من شر نفسي، ومن شر كل سلطان، ومن شر كل شيطان مريد، ومن شر كل جبار عنيد، ومن شر كل قضاء سوء، ومن شر كل دابة أنت آخذ بناصيتها، إن ربي على صراط مستقيم وأنت على كل شيء حفيظ، </w:t>
-      </w:r>
-      <w:r>
-        <w:rPr>
-          <w:rFonts w:ascii="Times New Roman" w:cs="Times New Roman" w:eastAsia="Times New Roman" w:hAnsi="Times New Roman"/>
-          <w:b/>
-          <w:bCs/>
-          <w:color w:val="B23A2E"/>
-          <w:sz w:val="24"/>
-          <w:szCs w:val="24"/>
-          <w:rtl/>
-        </w:rPr>
-        <w:t xml:space="preserve">﴿إن ولي الله الذي نزل الكتاب وهو يتولى الصالحين﴾</w:t>
-      </w:r>
-      <w:r>
-        <w:rPr>
-          <w:rFonts w:ascii="Times New Roman" w:cs="Times New Roman" w:eastAsia="Times New Roman" w:hAnsi="Times New Roman"/>
-          <w:sz w:val="24"/>
-          <w:szCs w:val="24"/>
-          <w:rtl/>
-        </w:rPr>
-        <w:t xml:space="preserve">. اللهم إني أستجيرك وأحتجب بك من كل شيء خلقته، وأحترس بك من جميع خلقك وكل ما ذرأت وبرأت، وأفوّض أمري إليك، وأقدّم بين يدي في يومي هذا وليلتي هذه وساعتي هذه وشهري هذا. بسم الله الرحمن الرحيم </w:t>
-      </w:r>
-      <w:r>
-        <w:rPr>
-          <w:rFonts w:ascii="Times New Roman" w:cs="Times New Roman" w:eastAsia="Times New Roman" w:hAnsi="Times New Roman"/>
-          <w:b/>
-          <w:bCs/>
-          <w:color w:val="B23A2E"/>
-          <w:sz w:val="24"/>
-          <w:szCs w:val="24"/>
-          <w:rtl/>
-        </w:rPr>
-        <w:t xml:space="preserve">﴿قُلْ هُوَ اللَّهُ أَحَدٌ اللَّهُ الصَّمَدُ لَمْ يَلِدْ وَلَمْ يُولَدْ وَلَمْ يَكُن لَّهُ كُفُوًا أَحَدٌ﴾</w:t>
-      </w:r>
-      <w:r>
-        <w:rPr>
-          <w:rFonts w:ascii="Times New Roman" w:cs="Times New Roman" w:eastAsia="Times New Roman" w:hAnsi="Times New Roman"/>
-          <w:sz w:val="24"/>
-          <w:szCs w:val="24"/>
-          <w:rtl/>
-        </w:rPr>
-        <w:t xml:space="preserve"> عن أمامي، ومن فوقي، وعن يميني، وعن شمالي، (تُكرر أربع مرات لكل جهة)، ثم آية الكرسي كاملة، ثم آخر آية آل عمران: </w:t>
-      </w:r>
-      <w:r>
-        <w:rPr>
-          <w:rFonts w:ascii="Times New Roman" w:cs="Times New Roman" w:eastAsia="Times New Roman" w:hAnsi="Times New Roman"/>
-          <w:b/>
-          <w:bCs/>
-          <w:color w:val="B23A2E"/>
-          <w:sz w:val="24"/>
-          <w:szCs w:val="24"/>
-          <w:rtl/>
-        </w:rPr>
-        <w:t xml:space="preserve">﴿شَهِدَ اللَّهُ أَنَّهُ لَا إِلَٰهَ إِلَّا هُوَ وَالْمَلَائِكَةُ وَأُولُو الْعِلْمِ قَائِمًا بِالْقِسْطِ﴾</w:t>
-      </w:r>
-      <w:r>
-        <w:rPr>
-          <w:rFonts w:ascii="Times New Roman" w:cs="Times New Roman" w:eastAsia="Times New Roman" w:hAnsi="Times New Roman"/>
-          <w:sz w:val="24"/>
-          <w:szCs w:val="24"/>
-          <w:rtl/>
-        </w:rPr>
-        <w:t xml:space="preserve"> إلى آخرها (7 مرات)»</w:t>
       </w:r>
     </w:p>
     <w:p>

</xml_diff>

<commit_message>
Move 'ورد شامل للحماية' from Category 6 to be first in Category 7
</commit_message>
<xml_diff>
--- a/خزانة الأدعية.docx
+++ b/خزانة الأدعية.docx
@@ -5446,70 +5446,28 @@
           <w:szCs w:val="24"/>
           <w:rtl/>
         </w:rPr>
-        <w:t xml:space="preserve">ورد شامل للحماية: «بسم الله، بسم الله وبالله، بسم الله خير الأسماء، بسم الله رب الأرض والسماء، بسم الله الذي لا يضر مع اسمه شيء في الأرض ولا في السماء، بسم الله افتتحت وبالله ختمت وبه آمنت، بسم الله أصبحت وعلى الله توكلت، بسم الله على قلبي ونفسي، بسم الله على عقلي وذهني، بسم الله على أهلي ومالي، بسم الله على ما أعطاني ربي، بسم الله الشافي، بسم الله المعافي، بسم الله الوافي، بسم الله الذي لا يضر مع اسمه شيء في الأرض ولا السماء وهو السميع العليم، هو الله الله الله الله الله ربي لا أشرك به شيئًا، الله أكبر الله أكبر الله أكبر الله أكبر، وأعزّ وأجل مما أخاف وأحذر، أسألك اللهم بخيرك من خيرك الذي لا يُعطيه غيرك، عزّ جارك وجلّ ثناؤك ولا إله غيرك. اللهم إني أعوذ بك من شر نفسي، ومن شر كل سلطان، ومن شر كل شيطان مريد، ومن شر كل جبار عنيد، ومن شر كل قضاء سوء، ومن شر كل دابة أنت آخذ بناصيتها، إن ربي على صراط مستقيم وأنت على كل شيء حفيظ، </w:t>
-      </w:r>
-      <w:r>
-        <w:rPr>
-          <w:rFonts w:ascii="Times New Roman" w:cs="Times New Roman" w:eastAsia="Times New Roman" w:hAnsi="Times New Roman"/>
-          <w:b/>
-          <w:bCs/>
-          <w:color w:val="B23A2E"/>
-          <w:sz w:val="24"/>
-          <w:szCs w:val="24"/>
-          <w:rtl/>
-        </w:rPr>
-        <w:t xml:space="preserve">﴿إن ولي الله الذي نزل الكتاب وهو يتولى الصالحين﴾</w:t>
-      </w:r>
-      <w:r>
-        <w:rPr>
-          <w:rFonts w:ascii="Times New Roman" w:cs="Times New Roman" w:eastAsia="Times New Roman" w:hAnsi="Times New Roman"/>
-          <w:sz w:val="24"/>
-          <w:szCs w:val="24"/>
-          <w:rtl/>
-        </w:rPr>
-        <w:t xml:space="preserve">. اللهم إني أستجيرك وأحتجب بك من كل شيء خلقته، وأحترس بك من جميع خلقك وكل ما ذرأت وبرأت، وأفوّض أمري إليك، وأقدّم بين يدي في يومي هذا وليلتي هذه وساعتي هذه وشهري هذا. بسم الله الرحمن الرحيم </w:t>
-      </w:r>
-      <w:r>
-        <w:rPr>
-          <w:rFonts w:ascii="Times New Roman" w:cs="Times New Roman" w:eastAsia="Times New Roman" w:hAnsi="Times New Roman"/>
-          <w:b/>
-          <w:bCs/>
-          <w:color w:val="B23A2E"/>
-          <w:sz w:val="24"/>
-          <w:szCs w:val="24"/>
-          <w:rtl/>
-        </w:rPr>
-        <w:t xml:space="preserve">﴿قُلْ هُوَ اللَّهُ أَحَدٌ اللَّهُ الصَّمَدُ لَمْ يَلِدْ وَلَمْ يُولَدْ وَلَمْ يَكُن لَّهُ كُفُوًا أَحَدٌ﴾</w:t>
-      </w:r>
-      <w:r>
-        <w:rPr>
-          <w:rFonts w:ascii="Times New Roman" w:cs="Times New Roman" w:eastAsia="Times New Roman" w:hAnsi="Times New Roman"/>
-          <w:sz w:val="24"/>
-          <w:szCs w:val="24"/>
-          <w:rtl/>
-        </w:rPr>
-        <w:t xml:space="preserve"> عن أمامي، ومن فوقي، وعن يميني، وعن شمالي، (تُكرر أربع مرات لكل جهة)، ثم آية الكرسي كاملة، ثم آخر آية آل عمران: </w:t>
-      </w:r>
-      <w:r>
-        <w:rPr>
-          <w:rFonts w:ascii="Times New Roman" w:cs="Times New Roman" w:eastAsia="Times New Roman" w:hAnsi="Times New Roman"/>
-          <w:b/>
-          <w:bCs/>
-          <w:color w:val="B23A2E"/>
-          <w:sz w:val="24"/>
-          <w:szCs w:val="24"/>
-          <w:rtl/>
-        </w:rPr>
-        <w:t xml:space="preserve">﴿شَهِدَ اللَّهُ أَنَّهُ لَا إِلَٰهَ إِلَّا هُوَ وَالْمَلَائِكَةُ وَأُولُو الْعِلْمِ قَائِمًا بِالْقِسْطِ﴾</w:t>
-      </w:r>
-      <w:r>
-        <w:rPr>
-          <w:rFonts w:ascii="Times New Roman" w:cs="Times New Roman" w:eastAsia="Times New Roman" w:hAnsi="Times New Roman"/>
-          <w:sz w:val="24"/>
-          <w:szCs w:val="24"/>
-          <w:rtl/>
-        </w:rPr>
-        <w:t xml:space="preserve"> إلى آخرها (7 مرات)»</w:t>
+        <w:t xml:space="preserve">ورد متداول لعقد لسان الشخص المؤذي: «كهيعص: كفايتنا. حم عسق: حمايتنا. </w:t>
+      </w:r>
+      <w:r>
+        <w:rPr>
+          <w:rFonts w:ascii="Times New Roman" w:cs="Times New Roman" w:eastAsia="Times New Roman" w:hAnsi="Times New Roman"/>
+          <w:b/>
+          <w:bCs/>
+          <w:color w:val="B23A2E"/>
+          <w:sz w:val="24"/>
+          <w:szCs w:val="24"/>
+          <w:rtl/>
+        </w:rPr>
+        <w:t xml:space="preserve">﴿فَسَيَكْفِيكَهُمُ اللَّهُ﴾</w:t>
+      </w:r>
+      <w:r>
+        <w:rPr>
+          <w:rFonts w:ascii="Times New Roman" w:cs="Times New Roman" w:eastAsia="Times New Roman" w:hAnsi="Times New Roman"/>
+          <w:sz w:val="24"/>
+          <w:szCs w:val="24"/>
+          <w:rtl/>
+        </w:rPr>
+        <w:t xml:space="preserve">» (×3) «وهو السميع العليم، ولا حول ولا قوة إلا بالله العلي العظيم. اللهم آمين، يا رب العالمين» — يُكرر 7 مرات</w:t>
       </w:r>
     </w:p>
     <w:p>
@@ -5543,28 +5501,7 @@
           <w:szCs w:val="24"/>
           <w:rtl/>
         </w:rPr>
-        <w:t xml:space="preserve">ورد متداول لعقد لسان الشخص المؤذي: «كهيعص: كفايتنا. حم عسق: حمايتنا. </w:t>
-      </w:r>
-      <w:r>
-        <w:rPr>
-          <w:rFonts w:ascii="Times New Roman" w:cs="Times New Roman" w:eastAsia="Times New Roman" w:hAnsi="Times New Roman"/>
-          <w:b/>
-          <w:bCs/>
-          <w:color w:val="B23A2E"/>
-          <w:sz w:val="24"/>
-          <w:szCs w:val="24"/>
-          <w:rtl/>
-        </w:rPr>
-        <w:t xml:space="preserve">﴿فَسَيَكْفِيكَهُمُ اللَّهُ﴾</w:t>
-      </w:r>
-      <w:r>
-        <w:rPr>
-          <w:rFonts w:ascii="Times New Roman" w:cs="Times New Roman" w:eastAsia="Times New Roman" w:hAnsi="Times New Roman"/>
-          <w:sz w:val="24"/>
-          <w:szCs w:val="24"/>
-          <w:rtl/>
-        </w:rPr>
-        <w:t xml:space="preserve">» (×3) «وهو السميع العليم، ولا حول ولا قوة إلا بالله العلي العظيم. اللهم آمين، يا رب العالمين» — يُكرر 7 مرات</w:t>
+        <w:t xml:space="preserve">لتحافظ على أي حد ممكن يكون عينه وحشة: «بسم الله الرحمن الرحيم ... وإذا قرأت القرآن جعلنا بينك وبين الذين لا يؤمنون بالآخرة حجابًا مستورًا» (3 مرات)</w:t>
       </w:r>
     </w:p>
     <w:p>
@@ -5598,7 +5535,7 @@
           <w:szCs w:val="24"/>
           <w:rtl/>
         </w:rPr>
-        <w:t xml:space="preserve">لتحافظ على أي حد ممكن يكون عينه وحشة: «بسم الله الرحمن الرحيم ... وإذا قرأت القرآن جعلنا بينك وبين الذين لا يؤمنون بالآخرة حجابًا مستورًا» (3 مرات)</w:t>
+        <w:t xml:space="preserve">يا كائن قبل كل شيء ويا مكوّن كل شيء، ألبسني درعك الحصين من شر جميع الخلق بفضلك ورحمتك يا أرحم الراحمين (3 مرات) — لإسكات أي شخص يؤذيك</w:t>
       </w:r>
     </w:p>
     <w:p>
@@ -5632,7 +5569,7 @@
           <w:szCs w:val="24"/>
           <w:rtl/>
         </w:rPr>
-        <w:t xml:space="preserve">يا كائن قبل كل شيء ويا مكوّن كل شيء، ألبسني درعك الحصين من شر جميع الخلق بفضلك ورحمتك يا أرحم الراحمين (3 مرات) — لإسكات أي شخص يؤذيك</w:t>
+        <w:t xml:space="preserve">لفك السحر، تُقرأ 7 مرات: «سبحان من ملك فقهر، سيُهزم الجمع ويولّون الدبر، سبحان القوي المقتدر، إني مغلوب فانتصر، ليس لها من دون الله كاشفة»</w:t>
       </w:r>
     </w:p>
     <w:p>
@@ -5666,7 +5603,61 @@
           <w:szCs w:val="24"/>
           <w:rtl/>
         </w:rPr>
-        <w:t xml:space="preserve">لفك السحر، تُقرأ 7 مرات: «سبحان من ملك فقهر، سيُهزم الجمع ويولّون الدبر، سبحان القوي المقتدر، إني مغلوب فانتصر، ليس لها من دون الله كاشفة»</w:t>
+        <w:t xml:space="preserve">عند الدخول على أي شخص تخشاه، تُقرأ هذه الآيات: </w:t>
+      </w:r>
+      <w:r>
+        <w:rPr>
+          <w:rFonts w:ascii="Times New Roman" w:cs="Times New Roman" w:eastAsia="Times New Roman" w:hAnsi="Times New Roman"/>
+          <w:b/>
+          <w:bCs/>
+          <w:color w:val="B23A2E"/>
+          <w:sz w:val="24"/>
+          <w:szCs w:val="24"/>
+          <w:rtl/>
+        </w:rPr>
+        <w:t xml:space="preserve">﴿وَخَشَعَتِ الْأَصْوَاتُ لِلرَّحْمَٰنِ فَلَا تَسْمَعُ إِلَّا هَمْسًا﴾</w:t>
+      </w:r>
+      <w:r>
+        <w:rPr>
+          <w:rFonts w:ascii="Times New Roman" w:cs="Times New Roman" w:eastAsia="Times New Roman" w:hAnsi="Times New Roman"/>
+          <w:sz w:val="24"/>
+          <w:szCs w:val="24"/>
+          <w:rtl/>
+        </w:rPr>
+        <w:t xml:space="preserve">، </w:t>
+      </w:r>
+      <w:r>
+        <w:rPr>
+          <w:rFonts w:ascii="Times New Roman" w:cs="Times New Roman" w:eastAsia="Times New Roman" w:hAnsi="Times New Roman"/>
+          <w:b/>
+          <w:bCs/>
+          <w:color w:val="B23A2E"/>
+          <w:sz w:val="24"/>
+          <w:szCs w:val="24"/>
+          <w:rtl/>
+        </w:rPr>
+        <w:t xml:space="preserve">﴿وَعَنَتِ الْوُجُوهُ لِلْحَيِّ الْقَيُّومِ وَقَدْ خَابَ مَنْ حَمَلَ ظُلْمًا﴾</w:t>
+      </w:r>
+      <w:r>
+        <w:rPr>
+          <w:rFonts w:ascii="Times New Roman" w:cs="Times New Roman" w:eastAsia="Times New Roman" w:hAnsi="Times New Roman"/>
+          <w:sz w:val="24"/>
+          <w:szCs w:val="24"/>
+          <w:rtl/>
+        </w:rPr>
+        <w:t xml:space="preserve">، </w:t>
+      </w:r>
+      <w:r>
+        <w:rPr>
+          <w:rFonts w:ascii="Times New Roman" w:cs="Times New Roman" w:eastAsia="Times New Roman" w:hAnsi="Times New Roman"/>
+          <w:b/>
+          <w:bCs/>
+          <w:color w:val="B23A2E"/>
+          <w:sz w:val="24"/>
+          <w:szCs w:val="24"/>
+          <w:rtl/>
+        </w:rPr>
+        <w:t xml:space="preserve">﴿أَوَلَمْ يَرَوْا أَنَّ اللَّهَ الَّذِي خَلَقَهُمْ هُوَ أَشَدُّ مِنْهُمْ قُوَّةً﴾</w:t>
       </w:r>
     </w:p>
     <w:p>
@@ -5700,61 +5691,7 @@
           <w:szCs w:val="24"/>
           <w:rtl/>
         </w:rPr>
-        <w:t xml:space="preserve">عند الدخول على أي شخص تخشاه، تُقرأ هذه الآيات: </w:t>
-      </w:r>
-      <w:r>
-        <w:rPr>
-          <w:rFonts w:ascii="Times New Roman" w:cs="Times New Roman" w:eastAsia="Times New Roman" w:hAnsi="Times New Roman"/>
-          <w:b/>
-          <w:bCs/>
-          <w:color w:val="B23A2E"/>
-          <w:sz w:val="24"/>
-          <w:szCs w:val="24"/>
-          <w:rtl/>
-        </w:rPr>
-        <w:t xml:space="preserve">﴿وَخَشَعَتِ الْأَصْوَاتُ لِلرَّحْمَٰنِ فَلَا تَسْمَعُ إِلَّا هَمْسًا﴾</w:t>
-      </w:r>
-      <w:r>
-        <w:rPr>
-          <w:rFonts w:ascii="Times New Roman" w:cs="Times New Roman" w:eastAsia="Times New Roman" w:hAnsi="Times New Roman"/>
-          <w:sz w:val="24"/>
-          <w:szCs w:val="24"/>
-          <w:rtl/>
-        </w:rPr>
-        <w:t xml:space="preserve">، </w:t>
-      </w:r>
-      <w:r>
-        <w:rPr>
-          <w:rFonts w:ascii="Times New Roman" w:cs="Times New Roman" w:eastAsia="Times New Roman" w:hAnsi="Times New Roman"/>
-          <w:b/>
-          <w:bCs/>
-          <w:color w:val="B23A2E"/>
-          <w:sz w:val="24"/>
-          <w:szCs w:val="24"/>
-          <w:rtl/>
-        </w:rPr>
-        <w:t xml:space="preserve">﴿وَعَنَتِ الْوُجُوهُ لِلْحَيِّ الْقَيُّومِ وَقَدْ خَابَ مَنْ حَمَلَ ظُلْمًا﴾</w:t>
-      </w:r>
-      <w:r>
-        <w:rPr>
-          <w:rFonts w:ascii="Times New Roman" w:cs="Times New Roman" w:eastAsia="Times New Roman" w:hAnsi="Times New Roman"/>
-          <w:sz w:val="24"/>
-          <w:szCs w:val="24"/>
-          <w:rtl/>
-        </w:rPr>
-        <w:t xml:space="preserve">، </w:t>
-      </w:r>
-      <w:r>
-        <w:rPr>
-          <w:rFonts w:ascii="Times New Roman" w:cs="Times New Roman" w:eastAsia="Times New Roman" w:hAnsi="Times New Roman"/>
-          <w:b/>
-          <w:bCs/>
-          <w:color w:val="B23A2E"/>
-          <w:sz w:val="24"/>
-          <w:szCs w:val="24"/>
-          <w:rtl/>
-        </w:rPr>
-        <w:t xml:space="preserve">﴿أَوَلَمْ يَرَوْا أَنَّ اللَّهَ الَّذِي خَلَقَهُمْ هُوَ أَشَدُّ مِنْهُمْ قُوَّةً﴾</w:t>
+        <w:t xml:space="preserve">من أراد بنا خيرًا فوفّقه لكل خير وأعِنّا على إكرامه، ومن أراد بنا شرًا فأشغله بنفسه واصرفه عنا وعوّضنا عنه، يا رب من يجبر بخاطرنا</w:t>
       </w:r>
     </w:p>
     <w:p>
@@ -5788,7 +5725,7 @@
           <w:szCs w:val="24"/>
           <w:rtl/>
         </w:rPr>
-        <w:t xml:space="preserve">من أراد بنا خيرًا فوفّقه لكل خير وأعِنّا على إكرامه، ومن أراد بنا شرًا فأشغله بنفسه واصرفه عنا وعوّضنا عنه، يا رب من يجبر بخاطرنا</w:t>
+        <w:t xml:space="preserve">لمعرفة حقيقة أي شخص في المنام: تُقرأ سورة الليل والشمس والتين (7 مرات) على كوب ماء، وتُدعى: «اللهم فرّج همي ويسّر أمري، اللهم أرني حقيقة من سحرني» (أو من يقصده)</w:t>
       </w:r>
     </w:p>
     <w:p>
@@ -5822,7 +5759,40 @@
           <w:szCs w:val="24"/>
           <w:rtl/>
         </w:rPr>
-        <w:t xml:space="preserve">لمعرفة حقيقة أي شخص في المنام: تُقرأ سورة الليل والشمس والتين (7 مرات) على كوب ماء، وتُدعى: «اللهم فرّج همي ويسّر أمري، اللهم أرني حقيقة من سحرني» (أو من يقصده)</w:t>
+        <w:t xml:space="preserve">لإبطال السحر (7 مرات): </w:t>
+      </w:r>
+      <w:r>
+        <w:rPr>
+          <w:rFonts w:ascii="Times New Roman" w:cs="Times New Roman" w:eastAsia="Times New Roman" w:hAnsi="Times New Roman"/>
+          <w:b/>
+          <w:bCs/>
+          <w:color w:val="B23A2E"/>
+          <w:sz w:val="24"/>
+          <w:szCs w:val="24"/>
+          <w:rtl/>
+        </w:rPr>
+        <w:t xml:space="preserve">﴿مَا جِئْتُم بِهِ السِّحْرُ إِنَّ اللَّهَ سَيُبْطِلُهُ إِنَّ اللَّهَ لَا يُصْلِحُ عَمَلَ الْمُفْسِدِينَ﴾</w:t>
+      </w:r>
+      <w:r>
+        <w:rPr>
+          <w:rFonts w:ascii="Times New Roman" w:cs="Times New Roman" w:eastAsia="Times New Roman" w:hAnsi="Times New Roman"/>
+          <w:sz w:val="24"/>
+          <w:szCs w:val="24"/>
+          <w:rtl/>
+        </w:rPr>
+        <w:t xml:space="preserve"> و</w:t>
+      </w:r>
+      <w:r>
+        <w:rPr>
+          <w:rFonts w:ascii="Times New Roman" w:cs="Times New Roman" w:eastAsia="Times New Roman" w:hAnsi="Times New Roman"/>
+          <w:b/>
+          <w:bCs/>
+          <w:color w:val="B23A2E"/>
+          <w:sz w:val="24"/>
+          <w:szCs w:val="24"/>
+          <w:rtl/>
+        </w:rPr>
+        <w:t xml:space="preserve">﴿وَيُحِقُّ اللَّهُ الْحَقَّ بِكَلِمَاتِهِ وَلَوْ كَرِهَ الْمُجْرِمُونَ﴾</w:t>
       </w:r>
     </w:p>
     <w:p>
@@ -5856,40 +5826,19 @@
           <w:szCs w:val="24"/>
           <w:rtl/>
         </w:rPr>
-        <w:t xml:space="preserve">لإبطال السحر (7 مرات): </w:t>
-      </w:r>
-      <w:r>
-        <w:rPr>
-          <w:rFonts w:ascii="Times New Roman" w:cs="Times New Roman" w:eastAsia="Times New Roman" w:hAnsi="Times New Roman"/>
-          <w:b/>
-          <w:bCs/>
-          <w:color w:val="B23A2E"/>
-          <w:sz w:val="24"/>
-          <w:szCs w:val="24"/>
-          <w:rtl/>
-        </w:rPr>
-        <w:t xml:space="preserve">﴿مَا جِئْتُم بِهِ السِّحْرُ إِنَّ اللَّهَ سَيُبْطِلُهُ إِنَّ اللَّهَ لَا يُصْلِحُ عَمَلَ الْمُفْسِدِينَ﴾</w:t>
-      </w:r>
-      <w:r>
-        <w:rPr>
-          <w:rFonts w:ascii="Times New Roman" w:cs="Times New Roman" w:eastAsia="Times New Roman" w:hAnsi="Times New Roman"/>
-          <w:sz w:val="24"/>
-          <w:szCs w:val="24"/>
-          <w:rtl/>
-        </w:rPr>
-        <w:t xml:space="preserve"> و</w:t>
-      </w:r>
-      <w:r>
-        <w:rPr>
-          <w:rFonts w:ascii="Times New Roman" w:cs="Times New Roman" w:eastAsia="Times New Roman" w:hAnsi="Times New Roman"/>
-          <w:b/>
-          <w:bCs/>
-          <w:color w:val="B23A2E"/>
-          <w:sz w:val="24"/>
-          <w:szCs w:val="24"/>
-          <w:rtl/>
-        </w:rPr>
-        <w:t xml:space="preserve">﴿وَيُحِقُّ اللَّهُ الْحَقَّ بِكَلِمَاتِهِ وَلَوْ كَرِهَ الْمُجْرِمُونَ﴾</w:t>
+        <w:t xml:space="preserve">للوقاية من الحسد: </w:t>
+      </w:r>
+      <w:r>
+        <w:rPr>
+          <w:rFonts w:ascii="Times New Roman" w:cs="Times New Roman" w:eastAsia="Times New Roman" w:hAnsi="Times New Roman"/>
+          <w:b/>
+          <w:bCs/>
+          <w:color w:val="B23A2E"/>
+          <w:sz w:val="24"/>
+          <w:szCs w:val="24"/>
+          <w:rtl/>
+        </w:rPr>
+        <w:t xml:space="preserve">﴿وَجَعَلَنِي مُبَارَكًا أَيْنَ مَا كُنتُ وَأَوْصَانِي بِالصَّلَاةِ وَالزَّكَاةِ مَا دُمْتُ حَيًّا﴾</w:t>
       </w:r>
     </w:p>
     <w:p>
@@ -5923,19 +5872,7 @@
           <w:szCs w:val="24"/>
           <w:rtl/>
         </w:rPr>
-        <w:t xml:space="preserve">للوقاية من الحسد: </w:t>
-      </w:r>
-      <w:r>
-        <w:rPr>
-          <w:rFonts w:ascii="Times New Roman" w:cs="Times New Roman" w:eastAsia="Times New Roman" w:hAnsi="Times New Roman"/>
-          <w:b/>
-          <w:bCs/>
-          <w:color w:val="B23A2E"/>
-          <w:sz w:val="24"/>
-          <w:szCs w:val="24"/>
-          <w:rtl/>
-        </w:rPr>
-        <w:t xml:space="preserve">﴿وَجَعَلَنِي مُبَارَكًا أَيْنَ مَا كُنتُ وَأَوْصَانِي بِالصَّلَاةِ وَالزَّكَاةِ مَا دُمْتُ حَيًّا﴾</w:t>
+        <w:t xml:space="preserve">أعوذ بكلمات الله التامات التي لا يجاوزهن بر ولا فاجر، من شر ما خلق وذرأ وبرأ، ومن شر ما ينزل من السماء ومن شر ما يعرج فيها، ومن شر ما ذرأ في الأرض وبرأ ومن شر ما يخرج منها، ومن شر فتن الليل والنهار، ومن شر كل طارق يطرق إلا طارقًا يطرق بخير يا رحمن</w:t>
       </w:r>
     </w:p>
     <w:p>
@@ -5969,7 +5906,28 @@
           <w:szCs w:val="24"/>
           <w:rtl/>
         </w:rPr>
-        <w:t xml:space="preserve">أعوذ بكلمات الله التامات التي لا يجاوزهن بر ولا فاجر، من شر ما خلق وذرأ وبرأ، ومن شر ما ينزل من السماء ومن شر ما يعرج فيها، ومن شر ما ذرأ في الأرض وبرأ ومن شر ما يخرج منها، ومن شر فتن الليل والنهار، ومن شر كل طارق يطرق إلا طارقًا يطرق بخير يا رحمن</w:t>
+        <w:t xml:space="preserve">يُقرأ بسبب تعطيل القرين: سورة النبأ (مرة يوميًا)، سورة الطارق (مرة يوميًا)، سورة الواقعة (مرة يوميًا)، «فالله خير حافظًا وهو أرحم الراحمين» (33 مرة)، «أستغفر الله الذي لا إله إلا هو الحي القيوم» (33 مرة)، </w:t>
+      </w:r>
+      <w:r>
+        <w:rPr>
+          <w:rFonts w:ascii="Times New Roman" w:cs="Times New Roman" w:eastAsia="Times New Roman" w:hAnsi="Times New Roman"/>
+          <w:b/>
+          <w:bCs/>
+          <w:color w:val="B23A2E"/>
+          <w:sz w:val="24"/>
+          <w:szCs w:val="24"/>
+          <w:rtl/>
+        </w:rPr>
+        <w:t xml:space="preserve">﴿وَلَقَدْ جَعَلْنَا فِي السَّمَاءِ بُرُوجًا وَزَيَّنَّاهَا لِلنَّاظِرِينَ وَحَفِظْنَاهَا مِن كُلِّ شَيْطَانٍ رَّجِيمٍ﴾</w:t>
+      </w:r>
+      <w:r>
+        <w:rPr>
+          <w:rFonts w:ascii="Times New Roman" w:cs="Times New Roman" w:eastAsia="Times New Roman" w:hAnsi="Times New Roman"/>
+          <w:sz w:val="24"/>
+          <w:szCs w:val="24"/>
+          <w:rtl/>
+        </w:rPr>
+        <w:t xml:space="preserve"> (33 مرة)، «فَسَيَكْفِيكَهُمُ اللَّهُ وَهُوَ السَّمِيعُ الْعَلِيمُ» (33 مرة) — يُوزَّع الورد على مدار اليوم، ثم يُقال 3 مرات: «اللهم إنك أنت الله الكريم الوهاب والمعطي الجواد، فلا ممسك لما أعطيت ولا معطي لما أمسكت، أمري بين يديك، رزقي عليك، فلا تُحوجني إلا إليك»</w:t>
       </w:r>
     </w:p>
     <w:p>
@@ -6003,28 +5961,19 @@
           <w:szCs w:val="24"/>
           <w:rtl/>
         </w:rPr>
-        <w:t xml:space="preserve">يُقرأ بسبب تعطيل القرين: سورة النبأ (مرة يوميًا)، سورة الطارق (مرة يوميًا)، سورة الواقعة (مرة يوميًا)، «فالله خير حافظًا وهو أرحم الراحمين» (33 مرة)، «أستغفر الله الذي لا إله إلا هو الحي القيوم» (33 مرة)، </w:t>
-      </w:r>
-      <w:r>
-        <w:rPr>
-          <w:rFonts w:ascii="Times New Roman" w:cs="Times New Roman" w:eastAsia="Times New Roman" w:hAnsi="Times New Roman"/>
-          <w:b/>
-          <w:bCs/>
-          <w:color w:val="B23A2E"/>
-          <w:sz w:val="24"/>
-          <w:szCs w:val="24"/>
-          <w:rtl/>
-        </w:rPr>
-        <w:t xml:space="preserve">﴿وَلَقَدْ جَعَلْنَا فِي السَّمَاءِ بُرُوجًا وَزَيَّنَّاهَا لِلنَّاظِرِينَ وَحَفِظْنَاهَا مِن كُلِّ شَيْطَانٍ رَّجِيمٍ﴾</w:t>
-      </w:r>
-      <w:r>
-        <w:rPr>
-          <w:rFonts w:ascii="Times New Roman" w:cs="Times New Roman" w:eastAsia="Times New Roman" w:hAnsi="Times New Roman"/>
-          <w:sz w:val="24"/>
-          <w:szCs w:val="24"/>
-          <w:rtl/>
-        </w:rPr>
-        <w:t xml:space="preserve"> (33 مرة)، «فَسَيَكْفِيكَهُمُ اللَّهُ وَهُوَ السَّمِيعُ الْعَلِيمُ» (33 مرة) — يُوزَّع الورد على مدار اليوم، ثم يُقال 3 مرات: «اللهم إنك أنت الله الكريم الوهاب والمعطي الجواد، فلا ممسك لما أعطيت ولا معطي لما أمسكت، أمري بين يديك، رزقي عليك، فلا تُحوجني إلا إليك»</w:t>
+        <w:t xml:space="preserve">تُقرأ 7 مرات إذا خفت من أحد: </w:t>
+      </w:r>
+      <w:r>
+        <w:rPr>
+          <w:rFonts w:ascii="Times New Roman" w:cs="Times New Roman" w:eastAsia="Times New Roman" w:hAnsi="Times New Roman"/>
+          <w:b/>
+          <w:bCs/>
+          <w:color w:val="B23A2E"/>
+          <w:sz w:val="24"/>
+          <w:szCs w:val="24"/>
+          <w:rtl/>
+        </w:rPr>
+        <w:t xml:space="preserve">﴿وَأُفَوِّضُ أَمْرِي إِلَى اللَّهِ إِنَّ اللَّهَ بَصِيرٌ بِالْعِبَادِ﴾</w:t>
       </w:r>
     </w:p>
     <w:p>
@@ -6058,19 +6007,28 @@
           <w:szCs w:val="24"/>
           <w:rtl/>
         </w:rPr>
-        <w:t xml:space="preserve">تُقرأ 7 مرات إذا خفت من أحد: </w:t>
-      </w:r>
-      <w:r>
-        <w:rPr>
-          <w:rFonts w:ascii="Times New Roman" w:cs="Times New Roman" w:eastAsia="Times New Roman" w:hAnsi="Times New Roman"/>
-          <w:b/>
-          <w:bCs/>
-          <w:color w:val="B23A2E"/>
-          <w:sz w:val="24"/>
-          <w:szCs w:val="24"/>
-          <w:rtl/>
-        </w:rPr>
-        <w:t xml:space="preserve">﴿وَأُفَوِّضُ أَمْرِي إِلَى اللَّهِ إِنَّ اللَّهَ بَصِيرٌ بِالْعِبَادِ﴾</w:t>
+        <w:t xml:space="preserve">لإخراج جميع العيون الملتصقة في الجسم، وللعصمة من السحر والعين: </w:t>
+      </w:r>
+      <w:r>
+        <w:rPr>
+          <w:rFonts w:ascii="Times New Roman" w:cs="Times New Roman" w:eastAsia="Times New Roman" w:hAnsi="Times New Roman"/>
+          <w:b/>
+          <w:bCs/>
+          <w:color w:val="B23A2E"/>
+          <w:sz w:val="24"/>
+          <w:szCs w:val="24"/>
+          <w:rtl/>
+        </w:rPr>
+        <w:t xml:space="preserve">﴿وَإِن يَكَادُ الَّذِينَ كَفَرُوا لَيُزْلِقُونَكَ بِأَبْصَارِهِمْ لَمَّا سَمِعُوا الذِّكْرَ وَيَقُولُونَ إِنَّهُ لَمَجْنُونٌ وَمَا هُوَ إِلَّا ذِكْرٌ لِّلْعَالَمِينَ﴾</w:t>
+      </w:r>
+      <w:r>
+        <w:rPr>
+          <w:rFonts w:ascii="Times New Roman" w:cs="Times New Roman" w:eastAsia="Times New Roman" w:hAnsi="Times New Roman"/>
+          <w:sz w:val="24"/>
+          <w:szCs w:val="24"/>
+          <w:rtl/>
+        </w:rPr>
+        <w:t xml:space="preserve"> — تُقرأ 70 مرة على ماء، ويُشرب منه مع وضع اليد على مكان الوجع</w:t>
       </w:r>
     </w:p>
     <w:p>
@@ -6100,32 +6058,23 @@
       <w:r>
         <w:rPr>
           <w:rFonts w:ascii="Times New Roman" w:cs="Times New Roman" w:eastAsia="Times New Roman" w:hAnsi="Times New Roman"/>
-          <w:sz w:val="24"/>
-          <w:szCs w:val="24"/>
-          <w:rtl/>
-        </w:rPr>
-        <w:t xml:space="preserve">لإخراج جميع العيون الملتصقة في الجسم، وللعصمة من السحر والعين: </w:t>
-      </w:r>
-      <w:r>
-        <w:rPr>
-          <w:rFonts w:ascii="Times New Roman" w:cs="Times New Roman" w:eastAsia="Times New Roman" w:hAnsi="Times New Roman"/>
-          <w:b/>
-          <w:bCs/>
-          <w:color w:val="B23A2E"/>
-          <w:sz w:val="24"/>
-          <w:szCs w:val="24"/>
-          <w:rtl/>
-        </w:rPr>
-        <w:t xml:space="preserve">﴿وَإِن يَكَادُ الَّذِينَ كَفَرُوا لَيُزْلِقُونَكَ بِأَبْصَارِهِمْ لَمَّا سَمِعُوا الذِّكْرَ وَيَقُولُونَ إِنَّهُ لَمَجْنُونٌ وَمَا هُوَ إِلَّا ذِكْرٌ لِّلْعَالَمِينَ﴾</w:t>
-      </w:r>
-      <w:r>
-        <w:rPr>
-          <w:rFonts w:ascii="Times New Roman" w:cs="Times New Roman" w:eastAsia="Times New Roman" w:hAnsi="Times New Roman"/>
-          <w:sz w:val="24"/>
-          <w:szCs w:val="24"/>
-          <w:rtl/>
-        </w:rPr>
-        <w:t xml:space="preserve"> — تُقرأ 70 مرة على ماء، ويُشرب منه مع وضع اليد على مكان الوجع</w:t>
+          <w:b/>
+          <w:bCs/>
+          <w:color w:val="B23A2E"/>
+          <w:sz w:val="24"/>
+          <w:szCs w:val="24"/>
+          <w:rtl/>
+        </w:rPr>
+        <w:t xml:space="preserve">﴿وَقَدِمْنَا إِلَىٰ مَا عَمِلُوا مِنْ عَمَلٍ فَجَعَلْنَاهُ هَبَاءً مَّنثُورًا﴾</w:t>
+      </w:r>
+      <w:r>
+        <w:rPr>
+          <w:rFonts w:ascii="Times New Roman" w:cs="Times New Roman" w:eastAsia="Times New Roman" w:hAnsi="Times New Roman"/>
+          <w:sz w:val="24"/>
+          <w:szCs w:val="24"/>
+          <w:rtl/>
+        </w:rPr>
+        <w:t xml:space="preserve"> تُقرأ على ماء 137 مرة لمدة 11 يومًا</w:t>
       </w:r>
     </w:p>
     <w:p>
@@ -6155,23 +6104,23 @@
       <w:r>
         <w:rPr>
           <w:rFonts w:ascii="Times New Roman" w:cs="Times New Roman" w:eastAsia="Times New Roman" w:hAnsi="Times New Roman"/>
-          <w:b/>
-          <w:bCs/>
-          <w:color w:val="B23A2E"/>
-          <w:sz w:val="24"/>
-          <w:szCs w:val="24"/>
-          <w:rtl/>
-        </w:rPr>
-        <w:t xml:space="preserve">﴿وَقَدِمْنَا إِلَىٰ مَا عَمِلُوا مِنْ عَمَلٍ فَجَعَلْنَاهُ هَبَاءً مَّنثُورًا﴾</w:t>
-      </w:r>
-      <w:r>
-        <w:rPr>
-          <w:rFonts w:ascii="Times New Roman" w:cs="Times New Roman" w:eastAsia="Times New Roman" w:hAnsi="Times New Roman"/>
-          <w:sz w:val="24"/>
-          <w:szCs w:val="24"/>
-          <w:rtl/>
-        </w:rPr>
-        <w:t xml:space="preserve"> تُقرأ على ماء 137 مرة لمدة 11 يومًا</w:t>
+          <w:sz w:val="24"/>
+          <w:szCs w:val="24"/>
+          <w:rtl/>
+        </w:rPr>
+        <w:t xml:space="preserve">دعاء الخروج من البيت: </w:t>
+      </w:r>
+      <w:r>
+        <w:rPr>
+          <w:rFonts w:ascii="Times New Roman" w:cs="Times New Roman" w:eastAsia="Times New Roman" w:hAnsi="Times New Roman"/>
+          <w:b/>
+          <w:bCs/>
+          <w:color w:val="B23A2E"/>
+          <w:sz w:val="24"/>
+          <w:szCs w:val="24"/>
+          <w:rtl/>
+        </w:rPr>
+        <w:t xml:space="preserve">﴿حَسْبُنَا اللَّهُ سَيُؤْتِينَا اللَّهُ مِن فَضْلِهِ وَرَسُولُهُ إِنَّا إِلَى اللَّهِ رَاغِبُونَ﴾</w:t>
       </w:r>
     </w:p>
     <w:p>
@@ -6205,19 +6154,7 @@
           <w:szCs w:val="24"/>
           <w:rtl/>
         </w:rPr>
-        <w:t xml:space="preserve">دعاء الخروج من البيت: </w:t>
-      </w:r>
-      <w:r>
-        <w:rPr>
-          <w:rFonts w:ascii="Times New Roman" w:cs="Times New Roman" w:eastAsia="Times New Roman" w:hAnsi="Times New Roman"/>
-          <w:b/>
-          <w:bCs/>
-          <w:color w:val="B23A2E"/>
-          <w:sz w:val="24"/>
-          <w:szCs w:val="24"/>
-          <w:rtl/>
-        </w:rPr>
-        <w:t xml:space="preserve">﴿حَسْبُنَا اللَّهُ سَيُؤْتِينَا اللَّهُ مِن فَضْلِهِ وَرَسُولُهُ إِنَّا إِلَى اللَّهِ رَاغِبُونَ﴾</w:t>
+        <w:t xml:space="preserve">خمس تحصينات يومية: الفاتحة، الإخلاص، المعوذتان، ثم: «بسم الله أرقيك من كل شيء يؤذيك، من شر كل نفس أو عين حاسد، الله يشفيك، بسم الله أرقيك»، «أعيذك بكلمات الله التامة من كل شيطان وهامّة، ومن كل عين لامّة»، «أعيذك بكلمات الله التامات من غضبه وعقابه، ومن شر عباده، ومن همزات الشياطين، وأعوذ بك رب أن يحضرون»، «اللهم ذا السلطان العظيم، والمنّ القديم، وذا الوجه الكريم، ولي الكلمات التامات والدعوات المستجابات، عافنا من أنفس الجن وأعين الإنس»، «أعيذك بكلمات الله التامات التي لا يجاوزهن بر ولا فاجر، من شر ما خلق وذرأ وبرأ، ومن شر ما ينزل من السماء وما يعرج فيها، ومن شر ما ذرأ في الأرض ومن شر ما يخرج منها، ومن شر فتن الليل والنهار، ومن شر طوارق الليل والنهار إلا طارقًا يطرق بخير يا رحمن»، «بسم الله يُبريك من كل داء يؤذيك، من حسد كل حاسد وكل عين، واسم الله يشفيك»</w:t>
       </w:r>
     </w:p>
     <w:p>
@@ -6251,7 +6188,7 @@
           <w:szCs w:val="24"/>
           <w:rtl/>
         </w:rPr>
-        <w:t xml:space="preserve">خمس تحصينات يومية: الفاتحة، الإخلاص، المعوذتان، ثم: «بسم الله أرقيك من كل شيء يؤذيك، من شر كل نفس أو عين حاسد، الله يشفيك، بسم الله أرقيك»، «أعيذك بكلمات الله التامة من كل شيطان وهامّة، ومن كل عين لامّة»، «أعيذك بكلمات الله التامات من غضبه وعقابه، ومن شر عباده، ومن همزات الشياطين، وأعوذ بك رب أن يحضرون»، «اللهم ذا السلطان العظيم، والمنّ القديم، وذا الوجه الكريم، ولي الكلمات التامات والدعوات المستجابات، عافنا من أنفس الجن وأعين الإنس»، «أعيذك بكلمات الله التامات التي لا يجاوزهن بر ولا فاجر، من شر ما خلق وذرأ وبرأ، ومن شر ما ينزل من السماء وما يعرج فيها، ومن شر ما ذرأ في الأرض ومن شر ما يخرج منها، ومن شر فتن الليل والنهار، ومن شر طوارق الليل والنهار إلا طارقًا يطرق بخير يا رحمن»، «بسم الله يُبريك من كل داء يؤذيك، من حسد كل حاسد وكل عين، واسم الله يشفيك»</w:t>
+        <w:t xml:space="preserve">أعوذ بوجه الله العظيم الذي ليس شيء أعظم منه، وبكلمات الله التامات التي لا يجاوزهن بر ولا فاجر، وبأسماء الله الحسنى كلها ما علمت منها وما لم أعلم، من شر ما خلق وذرأ وبرأ، ومن شر كل دابة هو آخذ بناصيتها، إن ربي على صراط مستقيم</w:t>
       </w:r>
     </w:p>
     <w:p>
@@ -6285,7 +6222,7 @@
           <w:szCs w:val="24"/>
           <w:rtl/>
         </w:rPr>
-        <w:t xml:space="preserve">أعوذ بوجه الله العظيم الذي ليس شيء أعظم منه، وبكلمات الله التامات التي لا يجاوزهن بر ولا فاجر، وبأسماء الله الحسنى كلها ما علمت منها وما لم أعلم، من شر ما خلق وذرأ وبرأ، ومن شر كل دابة هو آخذ بناصيتها، إن ربي على صراط مستقيم</w:t>
+        <w:t xml:space="preserve">دعاء الصباح والمساء للحفظ (حديث): «اللهم إني أصبحت في ذمتك وجوارك، اللهم إني أستودعك ديني ونفسي ودنياي وآخرتي وأهلي ومالي، وأعوذ بك يا عظيم من شر خلقك جميعًا، وأعوذ بك من شر ما يُبلس به إبليس وجنوده»</w:t>
       </w:r>
     </w:p>
     <w:p>
@@ -6319,7 +6256,40 @@
           <w:szCs w:val="24"/>
           <w:rtl/>
         </w:rPr>
-        <w:t xml:space="preserve">دعاء الصباح والمساء للحفظ (حديث): «اللهم إني أصبحت في ذمتك وجوارك، اللهم إني أستودعك ديني ونفسي ودنياي وآخرتي وأهلي ومالي، وأعوذ بك يا عظيم من شر خلقك جميعًا، وأعوذ بك من شر ما يُبلس به إبليس وجنوده»</w:t>
+        <w:t xml:space="preserve">للأمن من الحرق والغرق: </w:t>
+      </w:r>
+      <w:r>
+        <w:rPr>
+          <w:rFonts w:ascii="Times New Roman" w:cs="Times New Roman" w:eastAsia="Times New Roman" w:hAnsi="Times New Roman"/>
+          <w:b/>
+          <w:bCs/>
+          <w:color w:val="B23A2E"/>
+          <w:sz w:val="24"/>
+          <w:szCs w:val="24"/>
+          <w:rtl/>
+        </w:rPr>
+        <w:t xml:space="preserve">﴿اللَّهُ الَّذِي نَزَّلَ الْكِتَابَ وَهُوَ يَتَوَلَّى الصَّالِحِينَ﴾</w:t>
+      </w:r>
+      <w:r>
+        <w:rPr>
+          <w:rFonts w:ascii="Times New Roman" w:cs="Times New Roman" w:eastAsia="Times New Roman" w:hAnsi="Times New Roman"/>
+          <w:sz w:val="24"/>
+          <w:szCs w:val="24"/>
+          <w:rtl/>
+        </w:rPr>
+        <w:t xml:space="preserve"> إلى </w:t>
+      </w:r>
+      <w:r>
+        <w:rPr>
+          <w:rFonts w:ascii="Times New Roman" w:cs="Times New Roman" w:eastAsia="Times New Roman" w:hAnsi="Times New Roman"/>
+          <w:b/>
+          <w:bCs/>
+          <w:color w:val="B23A2E"/>
+          <w:sz w:val="24"/>
+          <w:szCs w:val="24"/>
+          <w:rtl/>
+        </w:rPr>
+        <w:t xml:space="preserve">﴿وَالسَّمَاوَاتُ مَطْوِيَّاتٌ بِيَمِينِهِ سُبْحَانَهُ وَتَعَالَىٰ عَمَّا يُشْرِكُونَ﴾</w:t>
       </w:r>
     </w:p>
     <w:p>
@@ -6353,40 +6323,7 @@
           <w:szCs w:val="24"/>
           <w:rtl/>
         </w:rPr>
-        <w:t xml:space="preserve">للأمن من الحرق والغرق: </w:t>
-      </w:r>
-      <w:r>
-        <w:rPr>
-          <w:rFonts w:ascii="Times New Roman" w:cs="Times New Roman" w:eastAsia="Times New Roman" w:hAnsi="Times New Roman"/>
-          <w:b/>
-          <w:bCs/>
-          <w:color w:val="B23A2E"/>
-          <w:sz w:val="24"/>
-          <w:szCs w:val="24"/>
-          <w:rtl/>
-        </w:rPr>
-        <w:t xml:space="preserve">﴿اللَّهُ الَّذِي نَزَّلَ الْكِتَابَ وَهُوَ يَتَوَلَّى الصَّالِحِينَ﴾</w:t>
-      </w:r>
-      <w:r>
-        <w:rPr>
-          <w:rFonts w:ascii="Times New Roman" w:cs="Times New Roman" w:eastAsia="Times New Roman" w:hAnsi="Times New Roman"/>
-          <w:sz w:val="24"/>
-          <w:szCs w:val="24"/>
-          <w:rtl/>
-        </w:rPr>
-        <w:t xml:space="preserve"> إلى </w:t>
-      </w:r>
-      <w:r>
-        <w:rPr>
-          <w:rFonts w:ascii="Times New Roman" w:cs="Times New Roman" w:eastAsia="Times New Roman" w:hAnsi="Times New Roman"/>
-          <w:b/>
-          <w:bCs/>
-          <w:color w:val="B23A2E"/>
-          <w:sz w:val="24"/>
-          <w:szCs w:val="24"/>
-          <w:rtl/>
-        </w:rPr>
-        <w:t xml:space="preserve">﴿وَالسَّمَاوَاتُ مَطْوِيَّاتٌ بِيَمِينِهِ سُبْحَانَهُ وَتَعَالَىٰ عَمَّا يُشْرِكُونَ﴾</w:t>
+        <w:t xml:space="preserve">للحفظ من السوء، يُقال 3 مرات بعد كل صلاة: «أُعيذ نفسي وديني وأهلي ومالي وولدي وإخواني في ديني، وما رزقني ربي، وخواتيم عملي، ومن يعنيني أمره، بالله الواحد الأحد الصمد الذي لم يلد ولم يولد ولم يكن له كفوًا أحد، وبرب الفلق من شر ما خلق ومن شر غاسق إذا وقب ومن شر النفاثات في العقد ومن شر حاسد إذا حسد، وبرب الناس ملك الناس إله الناس من شر الوسواس الخناس الذي يوسوس في صدور الناس من الجنة والناس»</w:t>
       </w:r>
     </w:p>
     <w:p>
@@ -6420,7 +6357,7 @@
           <w:szCs w:val="24"/>
           <w:rtl/>
         </w:rPr>
-        <w:t xml:space="preserve">للحفظ من السوء، يُقال 3 مرات بعد كل صلاة: «أُعيذ نفسي وديني وأهلي ومالي وولدي وإخواني في ديني، وما رزقني ربي، وخواتيم عملي، ومن يعنيني أمره، بالله الواحد الأحد الصمد الذي لم يلد ولم يولد ولم يكن له كفوًا أحد، وبرب الفلق من شر ما خلق ومن شر غاسق إذا وقب ومن شر النفاثات في العقد ومن شر حاسد إذا حسد، وبرب الناس ملك الناس إله الناس من شر الوسواس الخناس الذي يوسوس في صدور الناس من الجنة والناس»</w:t>
+        <w:t xml:space="preserve">إذا خفت أمرًا، فقل: «اللهم إنك لا يكفي منك أحد، وأنت تكفي من كل أحد من خلقك، فاكفني» (وتذكر ما تخاف منه)</w:t>
       </w:r>
     </w:p>
     <w:p>
@@ -6454,7 +6391,7 @@
           <w:szCs w:val="24"/>
           <w:rtl/>
         </w:rPr>
-        <w:t xml:space="preserve">إذا خفت أمرًا، فقل: «اللهم إنك لا يكفي منك أحد، وأنت تكفي من كل أحد من خلقك، فاكفني» (وتذكر ما تخاف منه)</w:t>
+        <w:t xml:space="preserve">دعاء كان يقوله علي بن الحسين زين العابدين: «بسم الله وبالله، ومن الله، وإلى الله، وفي سبيل الله، وعلى ملة رسول الله صلى الله عليه وسلم، اللهم إليك أسلمت نفسي، وإليك وجهت وجهي، وإليك ألجأت ظهري، وإليك فوّضت أمري، اللهم احفظني بحفظ الإيمان من بين يدي ومن خلفي وعن يميني وعن شمالي ومن فوقي ومن تحتي وما قبلي، وادفع عني بحولك وقوتك، فإنه لا حول ولا قوة إلا بك»</w:t>
       </w:r>
     </w:p>
     <w:p>
@@ -6488,7 +6425,19 @@
           <w:szCs w:val="24"/>
           <w:rtl/>
         </w:rPr>
-        <w:t xml:space="preserve">دعاء كان يقوله علي بن الحسين زين العابدين: «بسم الله وبالله، ومن الله، وإلى الله، وفي سبيل الله، وعلى ملة رسول الله صلى الله عليه وسلم، اللهم إليك أسلمت نفسي، وإليك وجهت وجهي، وإليك ألجأت ظهري، وإليك فوّضت أمري، اللهم احفظني بحفظ الإيمان من بين يدي ومن خلفي وعن يميني وعن شمالي ومن فوقي ومن تحتي وما قبلي، وادفع عني بحولك وقوتك، فإنه لا حول ولا قوة إلا بك»</w:t>
+        <w:t xml:space="preserve">عند الغروب: تُهلّل وتستعيذ بالله، ثم تضع يدك على رأسك وتُمرّها على وجهك وتأخذ لحيتك بيدك وتقول: «أحطت على نفسي وأهلي ومالي وولدي، من غائب وشاهد، بالله الذي لا إله إلا هو، عالم الغيب والشهادة، الرحمن الرحيم، الحي القيوم لا تأخذه سنة ولا نوم» ثم تقرأ آية الكرسي إلى </w:t>
+      </w:r>
+      <w:r>
+        <w:rPr>
+          <w:rFonts w:ascii="Times New Roman" w:cs="Times New Roman" w:eastAsia="Times New Roman" w:hAnsi="Times New Roman"/>
+          <w:b/>
+          <w:bCs/>
+          <w:color w:val="B23A2E"/>
+          <w:sz w:val="24"/>
+          <w:szCs w:val="24"/>
+          <w:rtl/>
+        </w:rPr>
+        <w:t xml:space="preserve">﴿الْعَلِيُّ الْعَظِيمُ﴾</w:t>
       </w:r>
     </w:p>
     <w:p>
@@ -6507,52 +6456,6 @@
           <w:rtl/>
         </w:rPr>
         <w:t xml:space="preserve">الدعاء الرابع والعشرون</w:t>
-      </w:r>
-    </w:p>
-    <w:p>
-      <w:pPr>
-        <w:bidi/>
-        <w:spacing w:after="200" w:line="340"/>
-        <w:jc w:val="right"/>
-      </w:pPr>
-      <w:r>
-        <w:rPr>
-          <w:rFonts w:ascii="Times New Roman" w:cs="Times New Roman" w:eastAsia="Times New Roman" w:hAnsi="Times New Roman"/>
-          <w:sz w:val="24"/>
-          <w:szCs w:val="24"/>
-          <w:rtl/>
-        </w:rPr>
-        <w:t xml:space="preserve">عند الغروب: تُهلّل وتستعيذ بالله، ثم تضع يدك على رأسك وتُمرّها على وجهك وتأخذ لحيتك بيدك وتقول: «أحطت على نفسي وأهلي ومالي وولدي، من غائب وشاهد، بالله الذي لا إله إلا هو، عالم الغيب والشهادة، الرحمن الرحيم، الحي القيوم لا تأخذه سنة ولا نوم» ثم تقرأ آية الكرسي إلى </w:t>
-      </w:r>
-      <w:r>
-        <w:rPr>
-          <w:rFonts w:ascii="Times New Roman" w:cs="Times New Roman" w:eastAsia="Times New Roman" w:hAnsi="Times New Roman"/>
-          <w:b/>
-          <w:bCs/>
-          <w:color w:val="B23A2E"/>
-          <w:sz w:val="24"/>
-          <w:szCs w:val="24"/>
-          <w:rtl/>
-        </w:rPr>
-        <w:t xml:space="preserve">﴿الْعَلِيُّ الْعَظِيمُ﴾</w:t>
-      </w:r>
-    </w:p>
-    <w:p>
-      <w:pPr>
-        <w:bidi/>
-        <w:spacing w:after="120" w:before="320"/>
-        <w:jc w:val="right"/>
-      </w:pPr>
-      <w:r>
-        <w:rPr>
-          <w:rFonts w:ascii="Times New Roman" w:cs="Times New Roman" w:eastAsia="Times New Roman" w:hAnsi="Times New Roman"/>
-          <w:b/>
-          <w:bCs/>
-          <w:sz w:val="44"/>
-          <w:szCs w:val="44"/>
-          <w:rtl/>
-        </w:rPr>
-        <w:t xml:space="preserve">الدعاء الخامس والعشرون</w:t>
       </w:r>
     </w:p>
     <w:p>
@@ -6638,6 +6541,103 @@
           <w:szCs w:val="24"/>
           <w:rtl/>
         </w:rPr>
+        <w:t xml:space="preserve">ورد شامل للحماية: «بسم الله، بسم الله وبالله، بسم الله خير الأسماء، بسم الله رب الأرض والسماء، بسم الله الذي لا يضر مع اسمه شيء في الأرض ولا في السماء، بسم الله افتتحت وبالله ختمت وبه آمنت، بسم الله أصبحت وعلى الله توكلت، بسم الله على قلبي ونفسي، بسم الله على عقلي وذهني، بسم الله على أهلي ومالي، بسم الله على ما أعطاني ربي، بسم الله الشافي، بسم الله المعافي، بسم الله الوافي، بسم الله الذي لا يضر مع اسمه شيء في الأرض ولا السماء وهو السميع العليم، هو الله الله الله الله الله ربي لا أشرك به شيئًا، الله أكبر الله أكبر الله أكبر الله أكبر، وأعزّ وأجل مما أخاف وأحذر، أسألك اللهم بخيرك من خيرك الذي لا يُعطيه غيرك، عزّ جارك وجلّ ثناؤك ولا إله غيرك. اللهم إني أعوذ بك من شر نفسي، ومن شر كل سلطان، ومن شر كل شيطان مريد، ومن شر كل جبار عنيد، ومن شر كل قضاء سوء، ومن شر كل دابة أنت آخذ بناصيتها، إن ربي على صراط مستقيم وأنت على كل شيء حفيظ، </w:t>
+      </w:r>
+      <w:r>
+        <w:rPr>
+          <w:rFonts w:ascii="Times New Roman" w:cs="Times New Roman" w:eastAsia="Times New Roman" w:hAnsi="Times New Roman"/>
+          <w:b/>
+          <w:bCs/>
+          <w:color w:val="B23A2E"/>
+          <w:sz w:val="24"/>
+          <w:szCs w:val="24"/>
+          <w:rtl/>
+        </w:rPr>
+        <w:t xml:space="preserve">﴿إن ولي الله الذي نزل الكتاب وهو يتولى الصالحين﴾</w:t>
+      </w:r>
+      <w:r>
+        <w:rPr>
+          <w:rFonts w:ascii="Times New Roman" w:cs="Times New Roman" w:eastAsia="Times New Roman" w:hAnsi="Times New Roman"/>
+          <w:sz w:val="24"/>
+          <w:szCs w:val="24"/>
+          <w:rtl/>
+        </w:rPr>
+        <w:t xml:space="preserve">. اللهم إني أستجيرك وأحتجب بك من كل شيء خلقته، وأحترس بك من جميع خلقك وكل ما ذرأت وبرأت، وأفوّض أمري إليك، وأقدّم بين يدي في يومي هذا وليلتي هذه وساعتي هذه وشهري هذا. بسم الله الرحمن الرحيم </w:t>
+      </w:r>
+      <w:r>
+        <w:rPr>
+          <w:rFonts w:ascii="Times New Roman" w:cs="Times New Roman" w:eastAsia="Times New Roman" w:hAnsi="Times New Roman"/>
+          <w:b/>
+          <w:bCs/>
+          <w:color w:val="B23A2E"/>
+          <w:sz w:val="24"/>
+          <w:szCs w:val="24"/>
+          <w:rtl/>
+        </w:rPr>
+        <w:t xml:space="preserve">﴿قُلْ هُوَ اللَّهُ أَحَدٌ اللَّهُ الصَّمَدُ لَمْ يَلِدْ وَلَمْ يُولَدْ وَلَمْ يَكُن لَّهُ كُفُوًا أَحَدٌ﴾</w:t>
+      </w:r>
+      <w:r>
+        <w:rPr>
+          <w:rFonts w:ascii="Times New Roman" w:cs="Times New Roman" w:eastAsia="Times New Roman" w:hAnsi="Times New Roman"/>
+          <w:sz w:val="24"/>
+          <w:szCs w:val="24"/>
+          <w:rtl/>
+        </w:rPr>
+        <w:t xml:space="preserve"> عن أمامي، ومن فوقي، وعن يميني، وعن شمالي، (تُكرر أربع مرات لكل جهة)، ثم آية الكرسي كاملة، ثم آخر آية آل عمران: </w:t>
+      </w:r>
+      <w:r>
+        <w:rPr>
+          <w:rFonts w:ascii="Times New Roman" w:cs="Times New Roman" w:eastAsia="Times New Roman" w:hAnsi="Times New Roman"/>
+          <w:b/>
+          <w:bCs/>
+          <w:color w:val="B23A2E"/>
+          <w:sz w:val="24"/>
+          <w:szCs w:val="24"/>
+          <w:rtl/>
+        </w:rPr>
+        <w:t xml:space="preserve">﴿شَهِدَ اللَّهُ أَنَّهُ لَا إِلَٰهَ إِلَّا هُوَ وَالْمَلَائِكَةُ وَأُولُو الْعِلْمِ قَائِمًا بِالْقِسْطِ﴾</w:t>
+      </w:r>
+      <w:r>
+        <w:rPr>
+          <w:rFonts w:ascii="Times New Roman" w:cs="Times New Roman" w:eastAsia="Times New Roman" w:hAnsi="Times New Roman"/>
+          <w:sz w:val="24"/>
+          <w:szCs w:val="24"/>
+          <w:rtl/>
+        </w:rPr>
+        <w:t xml:space="preserve"> إلى آخرها (7 مرات)»</w:t>
+      </w:r>
+    </w:p>
+    <w:p>
+      <w:pPr>
+        <w:bidi/>
+        <w:spacing w:after="120" w:before="320"/>
+        <w:jc w:val="right"/>
+      </w:pPr>
+      <w:r>
+        <w:rPr>
+          <w:rFonts w:ascii="Times New Roman" w:cs="Times New Roman" w:eastAsia="Times New Roman" w:hAnsi="Times New Roman"/>
+          <w:b/>
+          <w:bCs/>
+          <w:sz w:val="44"/>
+          <w:szCs w:val="44"/>
+          <w:rtl/>
+        </w:rPr>
+        <w:t xml:space="preserve">الدعاء الثاني</w:t>
+      </w:r>
+    </w:p>
+    <w:p>
+      <w:pPr>
+        <w:bidi/>
+        <w:spacing w:after="200" w:line="340"/>
+        <w:jc w:val="right"/>
+      </w:pPr>
+      <w:r>
+        <w:rPr>
+          <w:rFonts w:ascii="Times New Roman" w:cs="Times New Roman" w:eastAsia="Times New Roman" w:hAnsi="Times New Roman"/>
+          <w:sz w:val="24"/>
+          <w:szCs w:val="24"/>
+          <w:rtl/>
+        </w:rPr>
         <w:t xml:space="preserve">آية الكرسي كاملة (21 مرة)، ثم </w:t>
       </w:r>
       <w:r>
@@ -6698,7 +6698,7 @@
           <w:szCs w:val="44"/>
           <w:rtl/>
         </w:rPr>
-        <w:t xml:space="preserve">الدعاء الثاني</w:t>
+        <w:t xml:space="preserve">الدعاء الثالث</w:t>
       </w:r>
     </w:p>
     <w:p>
@@ -6732,7 +6732,7 @@
           <w:szCs w:val="44"/>
           <w:rtl/>
         </w:rPr>
-        <w:t xml:space="preserve">الدعاء الثالث</w:t>
+        <w:t xml:space="preserve">الدعاء الرابع</w:t>
       </w:r>
     </w:p>
     <w:p>
@@ -6778,7 +6778,7 @@
           <w:szCs w:val="44"/>
           <w:rtl/>
         </w:rPr>
-        <w:t xml:space="preserve">الدعاء الرابع</w:t>
+        <w:t xml:space="preserve">الدعاء الخامس</w:t>
       </w:r>
     </w:p>
     <w:p>
@@ -6812,7 +6812,7 @@
           <w:szCs w:val="44"/>
           <w:rtl/>
         </w:rPr>
-        <w:t xml:space="preserve">الدعاء الخامس</w:t>
+        <w:t xml:space="preserve">الدعاء السادس</w:t>
       </w:r>
     </w:p>
     <w:p>
@@ -6846,7 +6846,7 @@
           <w:szCs w:val="44"/>
           <w:rtl/>
         </w:rPr>
-        <w:t xml:space="preserve">الدعاء السادس</w:t>
+        <w:t xml:space="preserve">الدعاء السابع</w:t>
       </w:r>
     </w:p>
     <w:p>
@@ -6901,7 +6901,7 @@
           <w:szCs w:val="44"/>
           <w:rtl/>
         </w:rPr>
-        <w:t xml:space="preserve">الدعاء السابع</w:t>
+        <w:t xml:space="preserve">الدعاء الثامن</w:t>
       </w:r>
     </w:p>
     <w:p>
@@ -6947,7 +6947,7 @@
           <w:szCs w:val="44"/>
           <w:rtl/>
         </w:rPr>
-        <w:t xml:space="preserve">الدعاء الثامن</w:t>
+        <w:t xml:space="preserve">الدعاء التاسع</w:t>
       </w:r>
     </w:p>
     <w:p>
@@ -7035,7 +7035,7 @@
           <w:szCs w:val="44"/>
           <w:rtl/>
         </w:rPr>
-        <w:t xml:space="preserve">الدعاء التاسع</w:t>
+        <w:t xml:space="preserve">الدعاء العاشر</w:t>
       </w:r>
     </w:p>
     <w:p>
@@ -7069,7 +7069,7 @@
           <w:szCs w:val="44"/>
           <w:rtl/>
         </w:rPr>
-        <w:t xml:space="preserve">الدعاء العاشر</w:t>
+        <w:t xml:space="preserve">الدعاء الحادي عشر</w:t>
       </w:r>
     </w:p>
     <w:p>
@@ -7103,7 +7103,7 @@
           <w:szCs w:val="44"/>
           <w:rtl/>
         </w:rPr>
-        <w:t xml:space="preserve">الدعاء الحادي عشر</w:t>
+        <w:t xml:space="preserve">الدعاء الثاني عشر</w:t>
       </w:r>
     </w:p>
     <w:p>
@@ -7137,7 +7137,7 @@
           <w:szCs w:val="44"/>
           <w:rtl/>
         </w:rPr>
-        <w:t xml:space="preserve">الدعاء الثاني عشر</w:t>
+        <w:t xml:space="preserve">الدعاء الثالث عشر</w:t>
       </w:r>
     </w:p>
     <w:p>
@@ -7171,7 +7171,7 @@
           <w:szCs w:val="44"/>
           <w:rtl/>
         </w:rPr>
-        <w:t xml:space="preserve">الدعاء الثالث عشر</w:t>
+        <w:t xml:space="preserve">الدعاء الرابع عشر</w:t>
       </w:r>
     </w:p>
     <w:p>
@@ -7205,7 +7205,7 @@
           <w:szCs w:val="44"/>
           <w:rtl/>
         </w:rPr>
-        <w:t xml:space="preserve">الدعاء الرابع عشر</w:t>
+        <w:t xml:space="preserve">الدعاء الخامس عشر</w:t>
       </w:r>
     </w:p>
     <w:p>
@@ -7239,7 +7239,7 @@
           <w:szCs w:val="44"/>
           <w:rtl/>
         </w:rPr>
-        <w:t xml:space="preserve">الدعاء الخامس عشر</w:t>
+        <w:t xml:space="preserve">الدعاء السادس عشر</w:t>
       </w:r>
     </w:p>
     <w:p>
@@ -7273,7 +7273,7 @@
           <w:szCs w:val="44"/>
           <w:rtl/>
         </w:rPr>
-        <w:t xml:space="preserve">الدعاء السادس عشر</w:t>
+        <w:t xml:space="preserve">الدعاء السابع عشر</w:t>
       </w:r>
     </w:p>
     <w:p>
@@ -7307,7 +7307,7 @@
           <w:szCs w:val="44"/>
           <w:rtl/>
         </w:rPr>
-        <w:t xml:space="preserve">الدعاء السابع عشر</w:t>
+        <w:t xml:space="preserve">الدعاء الثامن عشر</w:t>
       </w:r>
     </w:p>
     <w:p>
@@ -7341,7 +7341,7 @@
           <w:szCs w:val="44"/>
           <w:rtl/>
         </w:rPr>
-        <w:t xml:space="preserve">الدعاء الثامن عشر</w:t>
+        <w:t xml:space="preserve">الدعاء التاسع عشر</w:t>
       </w:r>
     </w:p>
     <w:p>
@@ -7375,7 +7375,7 @@
           <w:szCs w:val="44"/>
           <w:rtl/>
         </w:rPr>
-        <w:t xml:space="preserve">الدعاء التاسع عشر</w:t>
+        <w:t xml:space="preserve">الدعاء العشرون</w:t>
       </w:r>
     </w:p>
     <w:p>
@@ -7409,7 +7409,7 @@
           <w:szCs w:val="44"/>
           <w:rtl/>
         </w:rPr>
-        <w:t xml:space="preserve">الدعاء العشرون</w:t>
+        <w:t xml:space="preserve">الدعاء الحادي والعشرون</w:t>
       </w:r>
     </w:p>
     <w:p>
@@ -7581,7 +7581,7 @@
           <w:szCs w:val="44"/>
           <w:rtl/>
         </w:rPr>
-        <w:t xml:space="preserve">الدعاء الحادي والعشرون</w:t>
+        <w:t xml:space="preserve">الدعاء الثاني والعشرون</w:t>
       </w:r>
     </w:p>
     <w:p>
@@ -7615,7 +7615,7 @@
           <w:szCs w:val="44"/>
           <w:rtl/>
         </w:rPr>
-        <w:t xml:space="preserve">الدعاء الثاني والعشرون</w:t>
+        <w:t xml:space="preserve">الدعاء الثالث والعشرون</w:t>
       </w:r>
     </w:p>
     <w:p>
@@ -7649,7 +7649,7 @@
           <w:szCs w:val="44"/>
           <w:rtl/>
         </w:rPr>
-        <w:t xml:space="preserve">الدعاء الثالث والعشرون</w:t>
+        <w:t xml:space="preserve">الدعاء الرابع والعشرون</w:t>
       </w:r>
     </w:p>
     <w:p>
@@ -7779,7 +7779,7 @@
           <w:szCs w:val="44"/>
           <w:rtl/>
         </w:rPr>
-        <w:t xml:space="preserve">الدعاء الرابع والعشرون</w:t>
+        <w:t xml:space="preserve">الدعاء الخامس والعشرون</w:t>
       </w:r>
     </w:p>
     <w:p>
@@ -7825,7 +7825,7 @@
           <w:szCs w:val="44"/>
           <w:rtl/>
         </w:rPr>
-        <w:t xml:space="preserve">الدعاء الخامس والعشرون</w:t>
+        <w:t xml:space="preserve">الدعاء السادس والعشرون</w:t>
       </w:r>
     </w:p>
     <w:p>
@@ -7880,7 +7880,7 @@
           <w:szCs w:val="44"/>
           <w:rtl/>
         </w:rPr>
-        <w:t xml:space="preserve">الدعاء السادس والعشرون</w:t>
+        <w:t xml:space="preserve">الدعاء السابع والعشرون</w:t>
       </w:r>
     </w:p>
     <w:p>
@@ -8031,7 +8031,7 @@
           <w:szCs w:val="44"/>
           <w:rtl/>
         </w:rPr>
-        <w:t xml:space="preserve">الدعاء السابع والعشرون</w:t>
+        <w:t xml:space="preserve">الدعاء الثامن والعشرون</w:t>
       </w:r>
     </w:p>
     <w:p>
@@ -8098,7 +8098,7 @@
           <w:szCs w:val="44"/>
           <w:rtl/>
         </w:rPr>
-        <w:t xml:space="preserve">الدعاء الثامن والعشرون</w:t>
+        <w:t xml:space="preserve">الدعاء التاسع والعشرون</w:t>
       </w:r>
     </w:p>
     <w:p>
@@ -8132,7 +8132,7 @@
           <w:szCs w:val="44"/>
           <w:rtl/>
         </w:rPr>
-        <w:t xml:space="preserve">الدعاء التاسع والعشرون</w:t>
+        <w:t xml:space="preserve">الدعاء الثلاثون</w:t>
       </w:r>
     </w:p>
     <w:p>
@@ -8187,7 +8187,7 @@
           <w:szCs w:val="44"/>
           <w:rtl/>
         </w:rPr>
-        <w:t xml:space="preserve">الدعاء الثلاثون</w:t>
+        <w:t xml:space="preserve">الدعاء الحادي والثلاثون</w:t>
       </w:r>
     </w:p>
     <w:p>
@@ -8221,7 +8221,7 @@
           <w:szCs w:val="44"/>
           <w:rtl/>
         </w:rPr>
-        <w:t xml:space="preserve">الدعاء الحادي والثلاثون</w:t>
+        <w:t xml:space="preserve">الدعاء الثاني والثلاثون</w:t>
       </w:r>
     </w:p>
     <w:p>
@@ -8255,7 +8255,7 @@
           <w:szCs w:val="44"/>
           <w:rtl/>
         </w:rPr>
-        <w:t xml:space="preserve">الدعاء الثاني والثلاثون</w:t>
+        <w:t xml:space="preserve">الدعاء الثالث والثلاثون</w:t>
       </w:r>
     </w:p>
     <w:p>

</xml_diff>

<commit_message>
Fix Category 1's 17th dua to Sayyid al-Istighfar
Was incorrectly holding a different (also authentic) hadith about
"القرآن ربيع قلبي". Replaced with the correct Sayyid al-Istighfar text
per the user, and removed the now-redundant duplicate copy that had
also landed in this category, keeping only the original one inside the
istighfar collection elsewhere.
</commit_message>
<xml_diff>
--- a/خزانة الأدعية.docx
+++ b/خزانة الأدعية.docx
@@ -695,7 +695,7 @@
           <w:szCs w:val="24"/>
           <w:rtl/>
         </w:rPr>
-        <w:t xml:space="preserve">اللهم رب، إني أسألك خيرتك على علمك، وأنا عبدك وابن عبدك وابن أمتك، ناصيتي بيدك، ماضٍ في حكمك، عدل في قضاؤك، أسألك بكل اسم هو لك سميت به نفسك أو أنزلته في كتابك أو علمته أحدًا من خلقك أو استأثرت به في علم الغيب عندك، أن تجعل القرآن ربيع قلبي، ونور صدري، وجلاء حزني، وذهاب همي (رواه مسلم)</w:t>
+        <w:t xml:space="preserve">دعاء سيد الاستغفار: اللهم أنت ربي لا إله إلا أنت، خلقتني وأنا عبدك، وأنا على عهدك ووعدك ما استطعت، أعوذ بك من شر ما صنعت، أبوء لك بنعمتك علي، وأبوء لك بذنبي فاغفر لي فإنه لا يغفر الذنوب إلا أنت (رواه البخاري)</w:t>
       </w:r>
     </w:p>
     <w:p>
@@ -981,40 +981,6 @@
           <w:rtl/>
         </w:rPr>
         <w:t xml:space="preserve">الدعاء الرابع والعشرون</w:t>
-      </w:r>
-    </w:p>
-    <w:p>
-      <w:pPr>
-        <w:bidi/>
-        <w:spacing w:after="200" w:line="340"/>
-        <w:jc w:val="right"/>
-      </w:pPr>
-      <w:r>
-        <w:rPr>
-          <w:rFonts w:ascii="Times New Roman" w:cs="Times New Roman" w:eastAsia="Times New Roman" w:hAnsi="Times New Roman"/>
-          <w:sz w:val="24"/>
-          <w:szCs w:val="24"/>
-          <w:rtl/>
-        </w:rPr>
-        <w:t xml:space="preserve">اللهم أنت ربي لا إله إلا أنت، خلقتني وأنا عبدك، وأنا على عهدك ووعدك ما استطعت، أعوذ بك من شر ما صنعت، أبوء لك بنعمتك علي، وأبوء بذنبي فاغفر لي، فإنه لا يغفر الذنوب إلا أنت (رواه البخاري)</w:t>
-      </w:r>
-    </w:p>
-    <w:p>
-      <w:pPr>
-        <w:bidi/>
-        <w:spacing w:after="120" w:before="320"/>
-        <w:jc w:val="right"/>
-      </w:pPr>
-      <w:r>
-        <w:rPr>
-          <w:rFonts w:ascii="Times New Roman" w:cs="Times New Roman" w:eastAsia="Times New Roman" w:hAnsi="Times New Roman"/>
-          <w:b/>
-          <w:bCs/>
-          <w:sz w:val="44"/>
-          <w:szCs w:val="44"/>
-          <w:rtl/>
-        </w:rPr>
-        <w:t xml:space="preserve">الدعاء الخامس والعشرون</w:t>
       </w:r>
     </w:p>
     <w:p>

</xml_diff>

<commit_message>
Add Ayat al-Kursi and the closing verses of Al-Baqarah as the first two entries in Category 1
</commit_message>
<xml_diff>
--- a/خزانة الأدعية.docx
+++ b/خزانة الأدعية.docx
@@ -151,6 +151,98 @@
           <w:szCs w:val="24"/>
           <w:rtl/>
         </w:rPr>
+        <w:t xml:space="preserve">آية الكرسي: </w:t>
+      </w:r>
+      <w:r>
+        <w:rPr>
+          <w:rFonts w:ascii="Times New Roman" w:cs="Times New Roman" w:eastAsia="Times New Roman" w:hAnsi="Times New Roman"/>
+          <w:b/>
+          <w:bCs/>
+          <w:color w:val="B23A2E"/>
+          <w:sz w:val="24"/>
+          <w:szCs w:val="24"/>
+          <w:rtl/>
+        </w:rPr>
+        <w:t xml:space="preserve">﴿اللَّهُ لَا إِلَٰهَ إِلَّا هُوَ الْحَيُّ الْقَيُّومُ لَا تَأْخُذُهُ سِنَةٌ وَلَا نَوْمٌ لَّهُ مَا فِي السَّمَاوَاتِ وَمَا فِي الْأَرْضِ مَن ذَا الَّذِي يَشْفَعُ عِندَهُ إِلَّا بِإِذْنِهِ يَعْلَمُ مَا بَيْنَ أَيْدِيهِمْ وَمَا خَلْفَهُمْ وَلَا يُحِيطُونَ بِشَيْءٍ مِّنْ عِلْمِهِ إِلَّا بِمَا شَاءَ وَسِعَ كُرْسِيُّهُ السَّمَاوَاتِ وَالْأَرْضَ وَلَا يَئُودُهُ حِفْظُهُمَا وَهُوَ الْعَلِيُّ الْعَظِيمُ﴾</w:t>
+      </w:r>
+    </w:p>
+    <w:p>
+      <w:pPr>
+        <w:bidi/>
+        <w:spacing w:after="120" w:before="320"/>
+        <w:jc w:val="right"/>
+      </w:pPr>
+      <w:r>
+        <w:rPr>
+          <w:rFonts w:ascii="Times New Roman" w:cs="Times New Roman" w:eastAsia="Times New Roman" w:hAnsi="Times New Roman"/>
+          <w:b/>
+          <w:bCs/>
+          <w:sz w:val="44"/>
+          <w:szCs w:val="44"/>
+          <w:rtl/>
+        </w:rPr>
+        <w:t xml:space="preserve">الدعاء الثاني</w:t>
+      </w:r>
+    </w:p>
+    <w:p>
+      <w:pPr>
+        <w:bidi/>
+        <w:spacing w:after="200" w:line="340"/>
+        <w:jc w:val="right"/>
+      </w:pPr>
+      <w:r>
+        <w:rPr>
+          <w:rFonts w:ascii="Times New Roman" w:cs="Times New Roman" w:eastAsia="Times New Roman" w:hAnsi="Times New Roman"/>
+          <w:sz w:val="24"/>
+          <w:szCs w:val="24"/>
+          <w:rtl/>
+        </w:rPr>
+        <w:t xml:space="preserve">خواتيم سورة البقرة: </w:t>
+      </w:r>
+      <w:r>
+        <w:rPr>
+          <w:rFonts w:ascii="Times New Roman" w:cs="Times New Roman" w:eastAsia="Times New Roman" w:hAnsi="Times New Roman"/>
+          <w:b/>
+          <w:bCs/>
+          <w:color w:val="B23A2E"/>
+          <w:sz w:val="24"/>
+          <w:szCs w:val="24"/>
+          <w:rtl/>
+        </w:rPr>
+        <w:t xml:space="preserve">﴿آمَنَ الرَّسُولُ بِمَا أُنزِلَ إِلَيْهِ مِن رَّبِّهِ وَالْمُؤْمِنُونَ ۚ كُلٌّ آمَنَ بِاللَّهِ وَمَلَائِكَتِهِ وَكُتُبِهِ وَرُسُلِهِ لَا نُفَرِّقُ بَيْنَ أَحَدٍ مِّن رُّسُلِهِ ۚ وَقَالُوا سَمِعْنَا وَأَطَعْنَا ۖ غُفْرَانَكَ رَبَّنَا وَإِلَيْكَ الْمَصِيرُ * لَا يُكَلِّفُ اللَّهُ نَفْسًا إِلَّا وُسْعَهَا ۚ لَهَا مَا كَسَبَتْ وَعَلَيْهَا مَا اكْتَسَبَتْ ۗ رَبَّنَا لَا تُؤَاخِذْنَا إِن نَّسِينَا أَوْ أَخْطَأْنَا ۚ رَبَّنَا وَلَا تَحْمِلْ عَلَيْنَا إِصْرًا كَمَا حَمَلْتَهُ عَلَى الَّذِينَ مِن قَبْلِنَا ۚ رَبَّنَا وَلَا تُحَمِّلْنَا مَا لَا طَاقَةَ لَنَا بِهِ ۖ وَاعْفُ عَنَّا وَاغْفِرْ لَنَا وَارْحَمْنَا ۚ أَنتَ مَوْلَانَا فَانصُرْنَا عَلَى الْقَوْمِ الْكَافِرِينَ﴾</w:t>
+      </w:r>
+    </w:p>
+    <w:p>
+      <w:pPr>
+        <w:bidi/>
+        <w:spacing w:after="120" w:before="320"/>
+        <w:jc w:val="right"/>
+      </w:pPr>
+      <w:r>
+        <w:rPr>
+          <w:rFonts w:ascii="Times New Roman" w:cs="Times New Roman" w:eastAsia="Times New Roman" w:hAnsi="Times New Roman"/>
+          <w:b/>
+          <w:bCs/>
+          <w:sz w:val="44"/>
+          <w:szCs w:val="44"/>
+          <w:rtl/>
+        </w:rPr>
+        <w:t xml:space="preserve">الدعاء الثالث</w:t>
+      </w:r>
+    </w:p>
+    <w:p>
+      <w:pPr>
+        <w:bidi/>
+        <w:spacing w:after="200" w:line="340"/>
+        <w:jc w:val="right"/>
+      </w:pPr>
+      <w:r>
+        <w:rPr>
+          <w:rFonts w:ascii="Times New Roman" w:cs="Times New Roman" w:eastAsia="Times New Roman" w:hAnsi="Times New Roman"/>
+          <w:sz w:val="24"/>
+          <w:szCs w:val="24"/>
+          <w:rtl/>
+        </w:rPr>
         <w:t xml:space="preserve">أصبحنا (أمسينا) وأصبح (أمسى) الملك لله، والحمد لله، لا إله إلا الله وحده لا شريك له، له الملك وله الحمد وهو على كل شيء قدير، رب أسألك خير هذا اليوم (هذه الليلة) وخير ما بعده، وأعوذ بك من شر هذا اليوم (هذه الليلة) وشر ما بعده، رب أعوذ بك من الكسل وسوء الكبر، رب أعوذ بك من عذاب في النار وعذاب في القبر (رواه مسلم)</w:t>
       </w:r>
     </w:p>
@@ -169,7 +261,7 @@
           <w:szCs w:val="44"/>
           <w:rtl/>
         </w:rPr>
-        <w:t xml:space="preserve">الدعاء الثاني</w:t>
+        <w:t xml:space="preserve">الدعاء الرابع</w:t>
       </w:r>
     </w:p>
     <w:p>
@@ -203,7 +295,7 @@
           <w:szCs w:val="44"/>
           <w:rtl/>
         </w:rPr>
-        <w:t xml:space="preserve">الدعاء الثالث</w:t>
+        <w:t xml:space="preserve">الدعاء الخامس</w:t>
       </w:r>
     </w:p>
     <w:p>
@@ -237,7 +329,7 @@
           <w:szCs w:val="44"/>
           <w:rtl/>
         </w:rPr>
-        <w:t xml:space="preserve">الدعاء الرابع</w:t>
+        <w:t xml:space="preserve">الدعاء السادس</w:t>
       </w:r>
     </w:p>
     <w:p>
@@ -271,7 +363,7 @@
           <w:szCs w:val="44"/>
           <w:rtl/>
         </w:rPr>
-        <w:t xml:space="preserve">الدعاء الخامس</w:t>
+        <w:t xml:space="preserve">الدعاء السابع</w:t>
       </w:r>
     </w:p>
     <w:p>
@@ -305,7 +397,7 @@
           <w:szCs w:val="44"/>
           <w:rtl/>
         </w:rPr>
-        <w:t xml:space="preserve">الدعاء السادس</w:t>
+        <w:t xml:space="preserve">الدعاء الثامن</w:t>
       </w:r>
     </w:p>
     <w:p>
@@ -339,7 +431,7 @@
           <w:szCs w:val="44"/>
           <w:rtl/>
         </w:rPr>
-        <w:t xml:space="preserve">الدعاء السابع</w:t>
+        <w:t xml:space="preserve">الدعاء التاسع</w:t>
       </w:r>
     </w:p>
     <w:p>
@@ -373,7 +465,7 @@
           <w:szCs w:val="44"/>
           <w:rtl/>
         </w:rPr>
-        <w:t xml:space="preserve">الدعاء الثامن</w:t>
+        <w:t xml:space="preserve">الدعاء العاشر</w:t>
       </w:r>
     </w:p>
     <w:p>
@@ -407,7 +499,7 @@
           <w:szCs w:val="44"/>
           <w:rtl/>
         </w:rPr>
-        <w:t xml:space="preserve">الدعاء التاسع</w:t>
+        <w:t xml:space="preserve">الدعاء الحادي عشر</w:t>
       </w:r>
     </w:p>
     <w:p>
@@ -441,7 +533,7 @@
           <w:szCs w:val="44"/>
           <w:rtl/>
         </w:rPr>
-        <w:t xml:space="preserve">الدعاء العاشر</w:t>
+        <w:t xml:space="preserve">الدعاء الثاني عشر</w:t>
       </w:r>
     </w:p>
     <w:p>
@@ -475,7 +567,7 @@
           <w:szCs w:val="44"/>
           <w:rtl/>
         </w:rPr>
-        <w:t xml:space="preserve">الدعاء الحادي عشر</w:t>
+        <w:t xml:space="preserve">الدعاء الثالث عشر</w:t>
       </w:r>
     </w:p>
     <w:p>
@@ -509,7 +601,7 @@
           <w:szCs w:val="44"/>
           <w:rtl/>
         </w:rPr>
-        <w:t xml:space="preserve">الدعاء الثاني عشر</w:t>
+        <w:t xml:space="preserve">الدعاء الرابع عشر</w:t>
       </w:r>
     </w:p>
     <w:p>
@@ -543,7 +635,7 @@
           <w:szCs w:val="44"/>
           <w:rtl/>
         </w:rPr>
-        <w:t xml:space="preserve">الدعاء الثالث عشر</w:t>
+        <w:t xml:space="preserve">الدعاء الخامس عشر</w:t>
       </w:r>
     </w:p>
     <w:p>
@@ -577,7 +669,7 @@
           <w:szCs w:val="44"/>
           <w:rtl/>
         </w:rPr>
-        <w:t xml:space="preserve">الدعاء الرابع عشر</w:t>
+        <w:t xml:space="preserve">الدعاء السادس عشر</w:t>
       </w:r>
     </w:p>
     <w:p>
@@ -611,7 +703,7 @@
           <w:szCs w:val="44"/>
           <w:rtl/>
         </w:rPr>
-        <w:t xml:space="preserve">الدعاء الخامس عشر</w:t>
+        <w:t xml:space="preserve">الدعاء السابع عشر</w:t>
       </w:r>
     </w:p>
     <w:p>
@@ -645,7 +737,7 @@
           <w:szCs w:val="44"/>
           <w:rtl/>
         </w:rPr>
-        <w:t xml:space="preserve">الدعاء السادس عشر</w:t>
+        <w:t xml:space="preserve">الدعاء الثامن عشر</w:t>
       </w:r>
     </w:p>
     <w:p>
@@ -679,7 +771,7 @@
           <w:szCs w:val="44"/>
           <w:rtl/>
         </w:rPr>
-        <w:t xml:space="preserve">الدعاء السابع عشر</w:t>
+        <w:t xml:space="preserve">الدعاء التاسع عشر</w:t>
       </w:r>
     </w:p>
     <w:p>
@@ -713,7 +805,7 @@
           <w:szCs w:val="44"/>
           <w:rtl/>
         </w:rPr>
-        <w:t xml:space="preserve">الدعاء الثامن عشر</w:t>
+        <w:t xml:space="preserve">الدعاء العشرون</w:t>
       </w:r>
     </w:p>
     <w:p>
@@ -747,7 +839,7 @@
           <w:szCs w:val="44"/>
           <w:rtl/>
         </w:rPr>
-        <w:t xml:space="preserve">الدعاء التاسع عشر</w:t>
+        <w:t xml:space="preserve">الدعاء الحادي والعشرون</w:t>
       </w:r>
     </w:p>
     <w:p>
@@ -781,7 +873,7 @@
           <w:szCs w:val="44"/>
           <w:rtl/>
         </w:rPr>
-        <w:t xml:space="preserve">الدعاء العشرون</w:t>
+        <w:t xml:space="preserve">الدعاء الثاني والعشرون</w:t>
       </w:r>
     </w:p>
     <w:p>
@@ -815,7 +907,7 @@
           <w:szCs w:val="44"/>
           <w:rtl/>
         </w:rPr>
-        <w:t xml:space="preserve">الدعاء الحادي والعشرون</w:t>
+        <w:t xml:space="preserve">الدعاء الثالث والعشرون</w:t>
       </w:r>
     </w:p>
     <w:p>
@@ -849,7 +941,7 @@
           <w:szCs w:val="44"/>
           <w:rtl/>
         </w:rPr>
-        <w:t xml:space="preserve">الدعاء الثاني والعشرون</w:t>
+        <w:t xml:space="preserve">الدعاء الرابع والعشرون</w:t>
       </w:r>
     </w:p>
     <w:p>
@@ -883,7 +975,7 @@
           <w:szCs w:val="44"/>
           <w:rtl/>
         </w:rPr>
-        <w:t xml:space="preserve">الدعاء الثالث والعشرون</w:t>
+        <w:t xml:space="preserve">الدعاء الخامس والعشرون</w:t>
       </w:r>
     </w:p>
     <w:p>
@@ -980,7 +1072,7 @@
           <w:szCs w:val="44"/>
           <w:rtl/>
         </w:rPr>
-        <w:t xml:space="preserve">الدعاء الرابع والعشرون</w:t>
+        <w:t xml:space="preserve">الدعاء السادس والعشرون</w:t>
       </w:r>
     </w:p>
     <w:p>

</xml_diff>

<commit_message>
Add 3 duas to Category 1 (morning/evening adhkar)
- الدعاء المستجاب بين الصبح والفجر
- الفاتحة لحضرة النبي + صلاة الفاتح + آية السد وكهيعص/حم عسق (لجعل غشاوة بين الشخص وأعدائه)
- دعاء "اللهم إنك سلطت علينا عدوًا بصيرًا..." (3 مرات)
</commit_message>
<xml_diff>
--- a/خزانة الأدعية.docx
+++ b/خزانة الأدعية.docx
@@ -1341,6 +1341,183 @@
           <w:rtl/>
         </w:rPr>
         <w:t xml:space="preserve">اللهم إني أصبحت أُشهدك، وأُشهد حملة عرشك، وملائكتك، وجميع خلقك، أنك أنت الله لا إله إلا أنت وحدك لا شريك لك، وأن محمدًا عبدك ورسولك، اللهم أنت ربي لا إله إلا أنت، توكلت عليك وأنت رب العرش العظيم، ما شاء الله كان وما لم يشأ لم يكن، ولا حول ولا قوة إلا بالله العلي العظيم، أعلم أن الله على كل شيء قدير، وأن الله قد أحاط بكل شيء علمًا، اللهم إني أعوذ بك من شر نفسي ومن شر كل دابة أنت آخذ بناصيتها، إن ربي على صراط مستقيم (رواه البيهقي ورجاله ثقات)</w:t>
+      </w:r>
+    </w:p>
+    <w:p>
+      <w:pPr>
+        <w:bidi/>
+        <w:spacing w:after="120" w:before="320"/>
+        <w:jc w:val="right"/>
+      </w:pPr>
+      <w:r>
+        <w:rPr>
+          <w:rFonts w:ascii="Times New Roman" w:cs="Times New Roman" w:eastAsia="Times New Roman" w:hAnsi="Times New Roman"/>
+          <w:b/>
+          <w:bCs/>
+          <w:sz w:val="44"/>
+          <w:szCs w:val="44"/>
+          <w:rtl/>
+        </w:rPr>
+        <w:t xml:space="preserve">الدعاء السابع والعشرون</w:t>
+      </w:r>
+    </w:p>
+    <w:p>
+      <w:pPr>
+        <w:bidi/>
+        <w:spacing w:after="200" w:line="340"/>
+        <w:jc w:val="right"/>
+      </w:pPr>
+      <w:r>
+        <w:rPr>
+          <w:rFonts w:ascii="Times New Roman" w:cs="Times New Roman" w:eastAsia="Times New Roman" w:hAnsi="Times New Roman"/>
+          <w:sz w:val="24"/>
+          <w:szCs w:val="24"/>
+          <w:rtl/>
+        </w:rPr>
+        <w:t xml:space="preserve">الدعاء المستجاب بين الصبح والفجر: يا رب، إن لم أُحسن في دعائي فأنت أعلم بحاجاتي، وإن قصرت غاياتي فأنت سبحانك تعلم غاياتي، ولا يخفى عليك شيء من أحوالي، فأجبر خاطري بفيض نعمك. اللهم أعطنا خير ما تعطي السائلين، واجمع لنا صلاح الدنيا والدين، اللهم اذهب عنا الحزن وأزل عنا الهم، واطرد من نفوسنا القلق، اللهم زدنا نورًا في القلب وضياءً في الوجه، اللهم آمين يا رب العالمين</w:t>
+      </w:r>
+    </w:p>
+    <w:p>
+      <w:pPr>
+        <w:bidi/>
+        <w:spacing w:after="120" w:before="320"/>
+        <w:jc w:val="right"/>
+      </w:pPr>
+      <w:r>
+        <w:rPr>
+          <w:rFonts w:ascii="Times New Roman" w:cs="Times New Roman" w:eastAsia="Times New Roman" w:hAnsi="Times New Roman"/>
+          <w:b/>
+          <w:bCs/>
+          <w:sz w:val="44"/>
+          <w:szCs w:val="44"/>
+          <w:rtl/>
+        </w:rPr>
+        <w:t xml:space="preserve">الدعاء الثامن والعشرون</w:t>
+      </w:r>
+    </w:p>
+    <w:p>
+      <w:pPr>
+        <w:bidi/>
+        <w:spacing w:after="200" w:line="340"/>
+        <w:jc w:val="right"/>
+      </w:pPr>
+      <w:r>
+        <w:rPr>
+          <w:rFonts w:ascii="Times New Roman" w:cs="Times New Roman" w:eastAsia="Times New Roman" w:hAnsi="Times New Roman"/>
+          <w:sz w:val="24"/>
+          <w:szCs w:val="24"/>
+          <w:rtl/>
+        </w:rPr>
+        <w:t xml:space="preserve">الفاتحة لحضرة النبي صلى الله عليه وسلم، ثم تُقرأ صلاة الفاتح مرة واحدة: «اللهم صلِّ على سيدنا محمد الفاتح لما أُغلق، والخاتم لما سبق، ناصر الحق بالحق، والهادي إلى صراطك المستقيم، وعلى آله وصحبه حق قدره ومقداره العظيم»، ثم يُقرأ قوله تعالى: </w:t>
+      </w:r>
+      <w:r>
+        <w:rPr>
+          <w:rFonts w:ascii="Times New Roman" w:cs="Times New Roman" w:eastAsia="Times New Roman" w:hAnsi="Times New Roman"/>
+          <w:b/>
+          <w:bCs/>
+          <w:color w:val="B23A2E"/>
+          <w:sz w:val="24"/>
+          <w:szCs w:val="24"/>
+          <w:rtl/>
+        </w:rPr>
+        <w:t xml:space="preserve">﴿وَجَعَلْنَا مِن بَيْنِ أَيْدِيهِمْ سَدًّا وَمِنْ خَلْفِهِمْ سَدًّا فَأَغْشَيْنَاهُمْ فَهُمْ لَا يُبْصِرُونَ﴾</w:t>
+      </w:r>
+      <w:r>
+        <w:rPr>
+          <w:rFonts w:ascii="Times New Roman" w:cs="Times New Roman" w:eastAsia="Times New Roman" w:hAnsi="Times New Roman"/>
+          <w:sz w:val="24"/>
+          <w:szCs w:val="24"/>
+          <w:rtl/>
+        </w:rPr>
+        <w:t xml:space="preserve">، ثم يُقال: «اللهم بحق هذه الآية أن تجعل بيني وبين هؤلاء غشاوة، كما جعلتها بين نبيك محمد وبين أعدائه»، </w:t>
+      </w:r>
+      <w:r>
+        <w:rPr>
+          <w:rFonts w:ascii="Times New Roman" w:cs="Times New Roman" w:eastAsia="Times New Roman" w:hAnsi="Times New Roman"/>
+          <w:b/>
+          <w:bCs/>
+          <w:color w:val="B23A2E"/>
+          <w:sz w:val="24"/>
+          <w:szCs w:val="24"/>
+          <w:rtl/>
+        </w:rPr>
+        <w:t xml:space="preserve">﴿كهيعص﴾</w:t>
+      </w:r>
+      <w:r>
+        <w:rPr>
+          <w:rFonts w:ascii="Times New Roman" w:cs="Times New Roman" w:eastAsia="Times New Roman" w:hAnsi="Times New Roman"/>
+          <w:sz w:val="24"/>
+          <w:szCs w:val="24"/>
+          <w:rtl/>
+        </w:rPr>
+        <w:t xml:space="preserve"> (حُميت)، </w:t>
+      </w:r>
+      <w:r>
+        <w:rPr>
+          <w:rFonts w:ascii="Times New Roman" w:cs="Times New Roman" w:eastAsia="Times New Roman" w:hAnsi="Times New Roman"/>
+          <w:b/>
+          <w:bCs/>
+          <w:color w:val="B23A2E"/>
+          <w:sz w:val="24"/>
+          <w:szCs w:val="24"/>
+          <w:rtl/>
+        </w:rPr>
+        <w:t xml:space="preserve">﴿حم عسق﴾</w:t>
+      </w:r>
+      <w:r>
+        <w:rPr>
+          <w:rFonts w:ascii="Times New Roman" w:cs="Times New Roman" w:eastAsia="Times New Roman" w:hAnsi="Times New Roman"/>
+          <w:sz w:val="24"/>
+          <w:szCs w:val="24"/>
+          <w:rtl/>
+        </w:rPr>
+        <w:t xml:space="preserve"> (كُفيت)</w:t>
+      </w:r>
+    </w:p>
+    <w:p>
+      <w:pPr>
+        <w:bidi/>
+        <w:spacing w:after="120" w:before="320"/>
+        <w:jc w:val="right"/>
+      </w:pPr>
+      <w:r>
+        <w:rPr>
+          <w:rFonts w:ascii="Times New Roman" w:cs="Times New Roman" w:eastAsia="Times New Roman" w:hAnsi="Times New Roman"/>
+          <w:b/>
+          <w:bCs/>
+          <w:sz w:val="44"/>
+          <w:szCs w:val="44"/>
+          <w:rtl/>
+        </w:rPr>
+        <w:t xml:space="preserve">الدعاء التاسع والعشرون</w:t>
+      </w:r>
+    </w:p>
+    <w:p>
+      <w:pPr>
+        <w:bidi/>
+        <w:spacing w:after="200" w:line="340"/>
+        <w:jc w:val="right"/>
+      </w:pPr>
+      <w:r>
+        <w:rPr>
+          <w:rFonts w:ascii="Times New Roman" w:cs="Times New Roman" w:eastAsia="Times New Roman" w:hAnsi="Times New Roman"/>
+          <w:sz w:val="24"/>
+          <w:szCs w:val="24"/>
+          <w:rtl/>
+        </w:rPr>
+        <w:t xml:space="preserve">بسم الله الرحمن الرحيم، الحمد لله رب العالمين، وصلى الله على سيدنا محمد وآله وصحبه وسلم. اللهم إنك سلّطت علينا عدوًا بصيرًا بعيوبنا، مطّلعًا على عوراتنا، يرانا هو وقبيله من حيث لا نراهم، اللهم فأيْئسه منا كما أيّسته من رحمتك، وقنّطه منا كما قنّطته من عفوك، وباعد بيننا وبينه كما باعدت بينه وبين جنتك، إنك على كل شيء قدير </w:t>
+      </w:r>
+      <w:r>
+        <w:rPr>
+          <w:rFonts w:ascii="Times New Roman" w:cs="Times New Roman" w:eastAsia="Times New Roman" w:hAnsi="Times New Roman"/>
+          <w:b/>
+          <w:bCs/>
+          <w:color w:val="3B5BA5"/>
+          <w:sz w:val="24"/>
+          <w:szCs w:val="24"/>
+          <w:rtl/>
+        </w:rPr>
+        <w:t xml:space="preserve">(3 مرات)</w:t>
       </w:r>
     </w:p>
     <w:p>

</xml_diff>

<commit_message>
Add يا وهاب duas to Category 3 and full ayat ibtal al-sihr to Category 7
- Category 3 (الرزق): two "يا وهاب" duas for rizq/health/luck
- Category 7 (الحماية): the fuller 4-passage ayat ibtal al-sihr
  compilation (Al-Baqarah 102, Al-A'raf 117-122, Yunus 79-81, Taha
  65-69), alongside the existing shorter 2-ayah version.
</commit_message>
<xml_diff>
--- a/خزانة الأدعية.docx
+++ b/خزانة الأدعية.docx
@@ -4679,6 +4679,74 @@
     </w:p>
     <w:p>
       <w:pPr>
+        <w:bidi/>
+        <w:spacing w:after="120" w:before="320"/>
+        <w:jc w:val="right"/>
+      </w:pPr>
+      <w:r>
+        <w:rPr>
+          <w:rFonts w:ascii="Times New Roman" w:cs="Times New Roman" w:eastAsia="Times New Roman" w:hAnsi="Times New Roman"/>
+          <w:b/>
+          <w:bCs/>
+          <w:sz w:val="44"/>
+          <w:szCs w:val="44"/>
+          <w:rtl/>
+        </w:rPr>
+        <w:t xml:space="preserve">الدعاء الثاني والثلاثون</w:t>
+      </w:r>
+    </w:p>
+    <w:p>
+      <w:pPr>
+        <w:bidi/>
+        <w:spacing w:after="200" w:line="340"/>
+        <w:jc w:val="right"/>
+      </w:pPr>
+      <w:r>
+        <w:rPr>
+          <w:rFonts w:ascii="Times New Roman" w:cs="Times New Roman" w:eastAsia="Times New Roman" w:hAnsi="Times New Roman"/>
+          <w:sz w:val="24"/>
+          <w:szCs w:val="24"/>
+          <w:rtl/>
+        </w:rPr>
+        <w:t xml:space="preserve">يا وهّاب يا وهّاب يا وهّاب، يا من تقول لشيء كن فيكون، يا واسع يا عليم، افتح لي أبواب الرزق والحظ وكل ما تمنيت، وسخّر لي خلقك وجنودك، يا عزيز يا معزّ. اللهم صبّ عليّ الرزق صبًّا، ومتّعني بما رزقتني وبارك لي فيه. اللهم صبّ الصحة والعافية والراحة في جسدي وروحي، واحفظني من كل ضرر وشر. اللهم صبّ الحظ في حياتي صبًّا، وعزّني وارفع من شأني، يا ذا الجلال والإكرام، يا رزّاق يا ذا القوة المتين</w:t>
+      </w:r>
+    </w:p>
+    <w:p>
+      <w:pPr>
+        <w:bidi/>
+        <w:spacing w:after="120" w:before="320"/>
+        <w:jc w:val="right"/>
+      </w:pPr>
+      <w:r>
+        <w:rPr>
+          <w:rFonts w:ascii="Times New Roman" w:cs="Times New Roman" w:eastAsia="Times New Roman" w:hAnsi="Times New Roman"/>
+          <w:b/>
+          <w:bCs/>
+          <w:sz w:val="44"/>
+          <w:szCs w:val="44"/>
+          <w:rtl/>
+        </w:rPr>
+        <w:t xml:space="preserve">الدعاء الثالث والثلاثون</w:t>
+      </w:r>
+    </w:p>
+    <w:p>
+      <w:pPr>
+        <w:bidi/>
+        <w:spacing w:after="200" w:line="340"/>
+        <w:jc w:val="right"/>
+      </w:pPr>
+      <w:r>
+        <w:rPr>
+          <w:rFonts w:ascii="Times New Roman" w:cs="Times New Roman" w:eastAsia="Times New Roman" w:hAnsi="Times New Roman"/>
+          <w:sz w:val="24"/>
+          <w:szCs w:val="24"/>
+          <w:rtl/>
+        </w:rPr>
+        <w:t xml:space="preserve">اللهم يا وهّاب، يا من وهبت لسليمان مُلكًا لا ينبغي لأحد من بعده، هب لنا من لدنك رحمة وسترًا وفتحًا مبينًا. اللهم هب لنا من خزائنك الواسعة ما تقرّ به أعيننا. اللهم هب لنا رزقًا واسعًا وفيرًا، وفرجًا قريبًا، وأصلح لنا شأننا كله، ولا تكلنا إلى أنفسنا طرفة عين، واجعلنا محاطين بعنايتك، وفي معيتك، وتحت حفظك ورحمتك. اللهم آمين</w:t>
+      </w:r>
+    </w:p>
+    <w:p>
+      <w:pPr>
         <w:pStyle w:val="Heading1"/>
         <w:pageBreakBefore/>
         <w:pBdr>
@@ -10152,6 +10220,124 @@
           <w:rtl/>
         </w:rPr>
         <w:t xml:space="preserve">﴿إِنَّ اللَّهَ يُمْسِكُ السَّمَاوَاتِ وَالْأَرْضَ أَن تَزُولَا وَلَئِن زَالَتَا إِنْ أَمْسَكَهُمَا مِنْ أَحَدٍ مِّن بَعْدِهِ إِنَّهُ كَانَ حَلِيمًا غَفُورًا﴾</w:t>
+      </w:r>
+    </w:p>
+    <w:p>
+      <w:pPr>
+        <w:bidi/>
+        <w:spacing w:after="120" w:before="320"/>
+        <w:jc w:val="right"/>
+      </w:pPr>
+      <w:r>
+        <w:rPr>
+          <w:rFonts w:ascii="Times New Roman" w:cs="Times New Roman" w:eastAsia="Times New Roman" w:hAnsi="Times New Roman"/>
+          <w:b/>
+          <w:bCs/>
+          <w:sz w:val="44"/>
+          <w:szCs w:val="44"/>
+          <w:rtl/>
+        </w:rPr>
+        <w:t xml:space="preserve">الدعاء الخامس والعشرون</w:t>
+      </w:r>
+    </w:p>
+    <w:p>
+      <w:pPr>
+        <w:bidi/>
+        <w:spacing w:after="200" w:line="340"/>
+        <w:jc w:val="right"/>
+      </w:pPr>
+      <w:r>
+        <w:rPr>
+          <w:rFonts w:ascii="Times New Roman" w:cs="Times New Roman" w:eastAsia="Times New Roman" w:hAnsi="Times New Roman"/>
+          <w:sz w:val="24"/>
+          <w:szCs w:val="24"/>
+          <w:rtl/>
+        </w:rPr>
+        <w:t xml:space="preserve">آيات إبطال السحر: </w:t>
+      </w:r>
+      <w:r>
+        <w:rPr>
+          <w:rFonts w:ascii="Times New Roman" w:cs="Times New Roman" w:eastAsia="Times New Roman" w:hAnsi="Times New Roman"/>
+          <w:b/>
+          <w:bCs/>
+          <w:color w:val="B23A2E"/>
+          <w:sz w:val="24"/>
+          <w:szCs w:val="24"/>
+          <w:rtl/>
+        </w:rPr>
+        <w:t xml:space="preserve">﴿وَاتَّبَعُوا مَا تَتْلُو الشَّيَاطِينُ عَلَىٰ مُلْكِ سُلَيْمَانَ وَمَا كَفَرَ سُلَيْمَانُ وَلَٰكِنَّ الشَّيَاطِينَ كَفَرُوا يُعَلِّمُونَ النَّاسَ السِّحْرَ وَمَا أُنزِلَ عَلَى الْمَلَكَيْنِ بِبَابِلَ هَارُوتَ وَمَارُوتَ وَمَا يُعَلِّمَانِ مِنْ أَحَدٍ حَتَّىٰ يَقُولَا إِنَّمَا نَحْنُ فِتْنَةٌ فَلَا تَكْفُرْ فَيَتَعَلَّمُونَ مِنْهُمَا مَا يُفَرِّقُونَ بِهِ بَيْنَ الْمَرْءِ وَزَوْجِهِ وَمَا هُم بِضَارِّينَ بِهِ مِنْ أَحَدٍ إِلَّا بِإِذْنِ اللَّهِ وَيَتَعَلَّمُونَ مَا يَضُرُّهُمْ وَلَا يَنفَعُهُمْ وَلَقَدْ عَلِمُوا لَمَنِ اشْتَرَاهُ مَا لَهُ فِي الْآخِرَةِ مِنْ خَلَاقٍ وَلَبِئْسَ مَا شَرَوْا بِهِ أَنفُسَهُمْ لَوْ كَانُوا يَعْلَمُونَ﴾</w:t>
+      </w:r>
+      <w:r>
+        <w:rPr>
+          <w:rFonts w:ascii="Times New Roman" w:cs="Times New Roman" w:eastAsia="Times New Roman" w:hAnsi="Times New Roman"/>
+          <w:sz w:val="24"/>
+          <w:szCs w:val="24"/>
+          <w:rtl/>
+        </w:rPr>
+        <w:t xml:space="preserve"> (البقرة: 102)، </w:t>
+      </w:r>
+      <w:r>
+        <w:rPr>
+          <w:rFonts w:ascii="Times New Roman" w:cs="Times New Roman" w:eastAsia="Times New Roman" w:hAnsi="Times New Roman"/>
+          <w:b/>
+          <w:bCs/>
+          <w:color w:val="B23A2E"/>
+          <w:sz w:val="24"/>
+          <w:szCs w:val="24"/>
+          <w:rtl/>
+        </w:rPr>
+        <w:t xml:space="preserve">﴿وَأَوْحَيْنَا إِلَىٰ مُوسَىٰ أَنْ أَلْقِ عَصَاكَ فَإِذَا هِيَ تَلْقَفُ مَا يَأْفِكُونَ * فَوَقَعَ الْحَقُّ وَبَطَلَ مَا كَانُوا يَعْمَلُونَ * فَغُلِبُوا هُنَالِكَ وَانقَلَبُوا صَاغِرِينَ * وَأُلْقِيَ السَّحَرَةُ سَاجِدِينَ * قَالُوا آمَنَّا بِرَبِّ الْعَالَمِينَ * رَبِّ مُوسَىٰ وَهَارُونَ﴾</w:t>
+      </w:r>
+      <w:r>
+        <w:rPr>
+          <w:rFonts w:ascii="Times New Roman" w:cs="Times New Roman" w:eastAsia="Times New Roman" w:hAnsi="Times New Roman"/>
+          <w:sz w:val="24"/>
+          <w:szCs w:val="24"/>
+          <w:rtl/>
+        </w:rPr>
+        <w:t xml:space="preserve"> (الأعراف: 117-122)، </w:t>
+      </w:r>
+      <w:r>
+        <w:rPr>
+          <w:rFonts w:ascii="Times New Roman" w:cs="Times New Roman" w:eastAsia="Times New Roman" w:hAnsi="Times New Roman"/>
+          <w:b/>
+          <w:bCs/>
+          <w:color w:val="B23A2E"/>
+          <w:sz w:val="24"/>
+          <w:szCs w:val="24"/>
+          <w:rtl/>
+        </w:rPr>
+        <w:t xml:space="preserve">﴿وَقَالَ فِرْعَوْنُ ائْتُونِي بِكُلِّ سَاحِرٍ عَلِيمٍ * فَلَمَّا جَاءَ السَّحَرَةُ قَالَ لَهُم مُّوسَىٰ أَلْقُوا مَا أَنتُم مُّلْقُونَ * فَلَمَّا أَلْقَوْا قَالَ مُوسَىٰ مَا جِئْتُم بِهِ السِّحْرُ إِنَّ اللَّهَ سَيُبْطِلُهُ إِنَّ اللَّهَ لَا يُصْلِحُ عَمَلَ الْمُفْسِدِينَ * وَيُحِقُّ اللَّهُ الْحَقَّ بِكَلِمَاتِهِ وَلَوْ كَرِهَ الْمُجْرِمُونَ﴾</w:t>
+      </w:r>
+      <w:r>
+        <w:rPr>
+          <w:rFonts w:ascii="Times New Roman" w:cs="Times New Roman" w:eastAsia="Times New Roman" w:hAnsi="Times New Roman"/>
+          <w:sz w:val="24"/>
+          <w:szCs w:val="24"/>
+          <w:rtl/>
+        </w:rPr>
+        <w:t xml:space="preserve"> (يونس: 79-81)، </w:t>
+      </w:r>
+      <w:r>
+        <w:rPr>
+          <w:rFonts w:ascii="Times New Roman" w:cs="Times New Roman" w:eastAsia="Times New Roman" w:hAnsi="Times New Roman"/>
+          <w:b/>
+          <w:bCs/>
+          <w:color w:val="B23A2E"/>
+          <w:sz w:val="24"/>
+          <w:szCs w:val="24"/>
+          <w:rtl/>
+        </w:rPr>
+        <w:t xml:space="preserve">﴿قَالُوا يَا مُوسَىٰ إِمَّا أَن تُلْقِيَ وَإِمَّا أَن نَّكُونَ أَوَّلَ مَنْ أَلْقَىٰ * قَالَ بَلْ أَلْقُوا فَإِذَا حِبَالُهُمْ وَعِصِيُّهُمْ يُخَيَّلُ إِلَيْهِ مِن سِحْرِهِمْ أَنَّهَا تَسْعَىٰ * فَأَوْجَسَ فِي نَفْسِهِ خِيفَةً مُّوسَىٰ * قُلْنَا لَا تَخَفْ إِنَّكَ أَنتَ الْأَعْلَىٰ * وَأَلْقِ مَا فِي يَمِينِكَ تَلْقَفْ مَا صَنَعُوا إِنَّمَا صَنَعُوا كَيْدُ سَاحِرٍ وَلَا يُفْلِحُ السَّاحِرُ حَيْثُ أَتَىٰ﴾</w:t>
+      </w:r>
+      <w:r>
+        <w:rPr>
+          <w:rFonts w:ascii="Times New Roman" w:cs="Times New Roman" w:eastAsia="Times New Roman" w:hAnsi="Times New Roman"/>
+          <w:sz w:val="24"/>
+          <w:szCs w:val="24"/>
+          <w:rtl/>
+        </w:rPr>
+        <w:t xml:space="preserve"> (طه: 65-69)</w:t>
       </w:r>
     </w:p>
     <w:p>

</xml_diff>

<commit_message>
Add 4 duas across Categories 1, 3, and 4
- Category 1: "اللهم أيقظني على رزق لم أتوقعه..."
- Category 3: "اللهم دلني على من أراد بي خيرًا..." and the
  "لن تشتكي من التعطيل" salawat+Fatiha wird
- Category 4: the multi-line ruqya wird ("بسم الله أرقي نفسي...")
</commit_message>
<xml_diff>
--- a/خزانة الأدعية.docx
+++ b/خزانة الأدعية.docx
@@ -1522,6 +1522,40 @@
     </w:p>
     <w:p>
       <w:pPr>
+        <w:bidi/>
+        <w:spacing w:after="120" w:before="320"/>
+        <w:jc w:val="right"/>
+      </w:pPr>
+      <w:r>
+        <w:rPr>
+          <w:rFonts w:ascii="Times New Roman" w:cs="Times New Roman" w:eastAsia="Times New Roman" w:hAnsi="Times New Roman"/>
+          <w:b/>
+          <w:bCs/>
+          <w:sz w:val="44"/>
+          <w:szCs w:val="44"/>
+          <w:rtl/>
+        </w:rPr>
+        <w:t xml:space="preserve">الدعاء الثلاثون</w:t>
+      </w:r>
+    </w:p>
+    <w:p>
+      <w:pPr>
+        <w:bidi/>
+        <w:spacing w:after="200" w:line="340"/>
+        <w:jc w:val="right"/>
+      </w:pPr>
+      <w:r>
+        <w:rPr>
+          <w:rFonts w:ascii="Times New Roman" w:cs="Times New Roman" w:eastAsia="Times New Roman" w:hAnsi="Times New Roman"/>
+          <w:sz w:val="24"/>
+          <w:szCs w:val="24"/>
+          <w:rtl/>
+        </w:rPr>
+        <w:t xml:space="preserve">اللهم أيقظني على رزقٍ لم أتوقعه، وعلى خيرٍ لم أُفكر به، وعلى قضاء حاجاتٍ ظننتها مستحيلة، ارزقني رزقًا من عندك لا حد له، وفرجًا من عندك لا حد له، وخيرًا من عندك لا حدود له</w:t>
+      </w:r>
+    </w:p>
+    <w:p>
+      <w:pPr>
         <w:pStyle w:val="Heading1"/>
         <w:pageBreakBefore/>
         <w:pBdr>
@@ -4747,6 +4781,200 @@
     </w:p>
     <w:p>
       <w:pPr>
+        <w:bidi/>
+        <w:spacing w:after="120" w:before="320"/>
+        <w:jc w:val="right"/>
+      </w:pPr>
+      <w:r>
+        <w:rPr>
+          <w:rFonts w:ascii="Times New Roman" w:cs="Times New Roman" w:eastAsia="Times New Roman" w:hAnsi="Times New Roman"/>
+          <w:b/>
+          <w:bCs/>
+          <w:sz w:val="44"/>
+          <w:szCs w:val="44"/>
+          <w:rtl/>
+        </w:rPr>
+        <w:t xml:space="preserve">الدعاء الرابع والثلاثون</w:t>
+      </w:r>
+    </w:p>
+    <w:p>
+      <w:pPr>
+        <w:bidi/>
+        <w:spacing w:after="200" w:line="340"/>
+        <w:jc w:val="right"/>
+      </w:pPr>
+      <w:r>
+        <w:rPr>
+          <w:rFonts w:ascii="Times New Roman" w:cs="Times New Roman" w:eastAsia="Times New Roman" w:hAnsi="Times New Roman"/>
+          <w:sz w:val="24"/>
+          <w:szCs w:val="24"/>
+          <w:rtl/>
+        </w:rPr>
+        <w:t xml:space="preserve">اللهم دلني على من أراد بي خيرًا ودُلّه علي، اللهم اجمعني بالطيبين أينما وليت وجهي، اللهم سخّر لي الأرض ومن عليها والسماء ومن فيها، اللهم سخّر لي عبادك الصالحين من حولي، اللهم سخّر لي كل من تولى أمري، وارزقني من حظوظ الدنيا أجملها، يا رب العالمين</w:t>
+      </w:r>
+    </w:p>
+    <w:p>
+      <w:pPr>
+        <w:bidi/>
+        <w:spacing w:after="120" w:before="320"/>
+        <w:jc w:val="right"/>
+      </w:pPr>
+      <w:r>
+        <w:rPr>
+          <w:rFonts w:ascii="Times New Roman" w:cs="Times New Roman" w:eastAsia="Times New Roman" w:hAnsi="Times New Roman"/>
+          <w:b/>
+          <w:bCs/>
+          <w:sz w:val="44"/>
+          <w:szCs w:val="44"/>
+          <w:rtl/>
+        </w:rPr>
+        <w:t xml:space="preserve">الدعاء الخامس والثلاثون</w:t>
+      </w:r>
+    </w:p>
+    <w:p>
+      <w:pPr>
+        <w:bidi/>
+        <w:spacing w:after="200" w:line="340"/>
+        <w:jc w:val="right"/>
+      </w:pPr>
+      <w:r>
+        <w:rPr>
+          <w:rFonts w:ascii="Times New Roman" w:cs="Times New Roman" w:eastAsia="Times New Roman" w:hAnsi="Times New Roman"/>
+          <w:sz w:val="24"/>
+          <w:szCs w:val="24"/>
+          <w:rtl/>
+        </w:rPr>
+        <w:t xml:space="preserve">ابدأ بالصلاة على النبي ﷺ وكررها </w:t>
+      </w:r>
+      <w:r>
+        <w:rPr>
+          <w:rFonts w:ascii="Times New Roman" w:cs="Times New Roman" w:eastAsia="Times New Roman" w:hAnsi="Times New Roman"/>
+          <w:b/>
+          <w:bCs/>
+          <w:color w:val="3B5BA5"/>
+          <w:sz w:val="24"/>
+          <w:szCs w:val="24"/>
+          <w:rtl/>
+        </w:rPr>
+        <w:t xml:space="preserve">(7 مرات)</w:t>
+      </w:r>
+      <w:r>
+        <w:rPr>
+          <w:rFonts w:ascii="Times New Roman" w:cs="Times New Roman" w:eastAsia="Times New Roman" w:hAnsi="Times New Roman"/>
+          <w:sz w:val="24"/>
+          <w:szCs w:val="24"/>
+          <w:rtl/>
+        </w:rPr>
+        <w:t xml:space="preserve">: «اللهم صلِّ وسلِّم على سيدنا ومولانا محمد، صلاة تُحلُّ بها عُقدتي، وتُفرَّج بها كربتي، وتُنقذني بها من خِلَّتي، وتُقيل بها عثرتي، وتقضي بها حاجتي»، ثم اقرأ سورة الفاتحة </w:t>
+      </w:r>
+      <w:r>
+        <w:rPr>
+          <w:rFonts w:ascii="Times New Roman" w:cs="Times New Roman" w:eastAsia="Times New Roman" w:hAnsi="Times New Roman"/>
+          <w:b/>
+          <w:bCs/>
+          <w:color w:val="3B5BA5"/>
+          <w:sz w:val="24"/>
+          <w:szCs w:val="24"/>
+          <w:rtl/>
+        </w:rPr>
+        <w:t xml:space="preserve">(7 مرات)</w:t>
+      </w:r>
+      <w:r>
+        <w:rPr>
+          <w:rFonts w:ascii="Times New Roman" w:cs="Times New Roman" w:eastAsia="Times New Roman" w:hAnsi="Times New Roman"/>
+          <w:sz w:val="24"/>
+          <w:szCs w:val="24"/>
+          <w:rtl/>
+        </w:rPr>
+        <w:t xml:space="preserve">، وفي كل مرة تصل إلى قوله تعالى: </w:t>
+      </w:r>
+      <w:r>
+        <w:rPr>
+          <w:rFonts w:ascii="Times New Roman" w:cs="Times New Roman" w:eastAsia="Times New Roman" w:hAnsi="Times New Roman"/>
+          <w:b/>
+          <w:bCs/>
+          <w:color w:val="B23A2E"/>
+          <w:sz w:val="24"/>
+          <w:szCs w:val="24"/>
+          <w:rtl/>
+        </w:rPr>
+        <w:t xml:space="preserve">﴿إِيَّاكَ نَعْبُدُ وَإِيَّاكَ نَسْتَعِينُ﴾</w:t>
+      </w:r>
+      <w:r>
+        <w:rPr>
+          <w:rFonts w:ascii="Times New Roman" w:cs="Times New Roman" w:eastAsia="Times New Roman" w:hAnsi="Times New Roman"/>
+          <w:sz w:val="24"/>
+          <w:szCs w:val="24"/>
+          <w:rtl/>
+        </w:rPr>
+        <w:t xml:space="preserve"> كرّره </w:t>
+      </w:r>
+      <w:r>
+        <w:rPr>
+          <w:rFonts w:ascii="Times New Roman" w:cs="Times New Roman" w:eastAsia="Times New Roman" w:hAnsi="Times New Roman"/>
+          <w:b/>
+          <w:bCs/>
+          <w:color w:val="3B5BA5"/>
+          <w:sz w:val="24"/>
+          <w:szCs w:val="24"/>
+          <w:rtl/>
+        </w:rPr>
+        <w:t xml:space="preserve">(3 مرات)</w:t>
+      </w:r>
+      <w:r>
+        <w:rPr>
+          <w:rFonts w:ascii="Times New Roman" w:cs="Times New Roman" w:eastAsia="Times New Roman" w:hAnsi="Times New Roman"/>
+          <w:sz w:val="24"/>
+          <w:szCs w:val="24"/>
+          <w:rtl/>
+        </w:rPr>
+        <w:t xml:space="preserve">، ثم تُكمل السورة، وبعد الانتهاء قل هذا الدعاء </w:t>
+      </w:r>
+      <w:r>
+        <w:rPr>
+          <w:rFonts w:ascii="Times New Roman" w:cs="Times New Roman" w:eastAsia="Times New Roman" w:hAnsi="Times New Roman"/>
+          <w:b/>
+          <w:bCs/>
+          <w:color w:val="3B5BA5"/>
+          <w:sz w:val="24"/>
+          <w:szCs w:val="24"/>
+          <w:rtl/>
+        </w:rPr>
+        <w:t xml:space="preserve">(3 مرات)</w:t>
+      </w:r>
+      <w:r>
+        <w:rPr>
+          <w:rFonts w:ascii="Times New Roman" w:cs="Times New Roman" w:eastAsia="Times New Roman" w:hAnsi="Times New Roman"/>
+          <w:sz w:val="24"/>
+          <w:szCs w:val="24"/>
+          <w:rtl/>
+        </w:rPr>
+        <w:t xml:space="preserve">: «اللهم ببركة سورة الفاتحة، افتح بيني وبين رزقي وسعادتي، وببركة </w:t>
+      </w:r>
+      <w:r>
+        <w:rPr>
+          <w:rFonts w:ascii="Times New Roman" w:cs="Times New Roman" w:eastAsia="Times New Roman" w:hAnsi="Times New Roman"/>
+          <w:b/>
+          <w:bCs/>
+          <w:color w:val="B23A2E"/>
+          <w:sz w:val="24"/>
+          <w:szCs w:val="24"/>
+          <w:rtl/>
+        </w:rPr>
+        <w:t xml:space="preserve">﴿إِيَّاكَ نَعْبُدُ وَإِيَّاكَ نَسْتَعِينُ﴾</w:t>
+      </w:r>
+      <w:r>
+        <w:rPr>
+          <w:rFonts w:ascii="Times New Roman" w:cs="Times New Roman" w:eastAsia="Times New Roman" w:hAnsi="Times New Roman"/>
+          <w:sz w:val="24"/>
+          <w:szCs w:val="24"/>
+          <w:rtl/>
+        </w:rPr>
+        <w:t xml:space="preserve"> بك أستعين، فأنت الناصر وأنت المعين، وأنت على كل شيء قدير. اللهم اشفني من الحسد والأسحار وسائر الأمراض والأسقام، وارزقني التيسير والقبول، وحقق لي ما أتمنى وزدني من فضلك الواسع يا الله، واكتب آمين لي ولمن أحب»</w:t>
+      </w:r>
+    </w:p>
+    <w:p>
+      <w:pPr>
         <w:pStyle w:val="Heading1"/>
         <w:pageBreakBefore/>
         <w:pBdr>
@@ -6442,6 +6670,292 @@
           <w:rtl/>
         </w:rPr>
         <w:t xml:space="preserve">«اللهم لا تُشمت أعدائي بدائي، واجعل القرآن العظيم دوائي وشفائي، أنت ثقتي ورجائي، واجعل حسن ظني بك شفائي. اللهم ثبّت علي عقلي وديني، وبك يا رب ثبّت لي يقيني، وارزقني رزقًا حلالًا يكفيني، وأبعد عني شر من يؤذيني، ولا تُحوجني لطبيب يداويني. اللهم استرني على وجه الأرض، اللهم ارحمني في بطن الأرض، اللهم اغفر لي يوم العرض عليك. بسم الله الرحمن الرحيم طريقي، والرحمن رفيقي، والرحيم يحرسني من كل شيء يلمسني. اللهم أعوذ بك من شر النفاثات في العقد ومن شر حاسد إذا حسد. اللهم إني عبدك ابن عبدك ابن أمتك، ناصيتي بيدك، ماضٍ في حكمك، عدل في قضاؤك، أسألك بكل اسم هو لك سميت به نفسك أو أنزلته في كتابك أو علمته أحدًا من خلقك أو استأثرت به في علم الغيب عندك أن تجعل القرآن ربيع قلبي، ونور صدري، وجلاء حزني، وذهاب همي. اللهم يا مسهّل الشديد، ويا مليّن الحديد، ويا منجز الوعيد، ويا من هو كل يوم في أمر جديد، أخرجني من حَلَق الضيق إلى أوسع الطريق، بك أدفع ما لا أطيق، ولا حول ولا قوة إلا بالله العلي العظيم. أسألك اللهم بقدرتك التي حفظت بها يونس في بطن الحوت، ورحمتك التي شفيت بها أيوب بعد الابتلاء، ألا تُبقي لي همًا ولا حزنًا ولا ضيقًا ولا سقمًا إلا فرّجته، وإن أصبحت بحزن فأمسِني بفرح، وإن نمت على ضيق فأيقظني على فرج، وإن كنت بحاجة فلا تكلني إلى سواك، وأن تحفظني لمن يحبني وتحفظ لي أحبتي. اللهم إنك لا تُحمّل نفسًا فوق طاقتها، فلا تُحمّلني من كرب الحياة ما لا طاقة لي به، وباعد بيني وبين مصائب الدنيا وتقلّب حوادثها كما باعدت بين المشرق والمغرب. اللهم بشّرني بالخير كما بشّرت يعقوب بيوسف، وبشّرني بالفرح كما بشّرت زكريا بيحيى»</w:t>
+      </w:r>
+    </w:p>
+    <w:p>
+      <w:pPr>
+        <w:bidi/>
+        <w:spacing w:after="120" w:before="320"/>
+        <w:jc w:val="right"/>
+      </w:pPr>
+      <w:r>
+        <w:rPr>
+          <w:rFonts w:ascii="Times New Roman" w:cs="Times New Roman" w:eastAsia="Times New Roman" w:hAnsi="Times New Roman"/>
+          <w:b/>
+          <w:bCs/>
+          <w:sz w:val="44"/>
+          <w:szCs w:val="44"/>
+          <w:rtl/>
+        </w:rPr>
+        <w:t xml:space="preserve">الدعاء الخامس والثلاثون</w:t>
+      </w:r>
+    </w:p>
+    <w:p>
+      <w:pPr>
+        <w:bidi/>
+        <w:spacing w:after="200" w:line="340"/>
+        <w:jc w:val="right"/>
+      </w:pPr>
+      <w:r>
+        <w:rPr>
+          <w:rFonts w:ascii="Times New Roman" w:cs="Times New Roman" w:eastAsia="Times New Roman" w:hAnsi="Times New Roman"/>
+          <w:sz w:val="24"/>
+          <w:szCs w:val="24"/>
+          <w:rtl/>
+        </w:rPr>
+        <w:t xml:space="preserve">بسم الله أرقي نفسي، أعوذ بالله السميع العليم من الشيطان الرجيم: </w:t>
+      </w:r>
+      <w:r>
+        <w:rPr>
+          <w:rFonts w:ascii="Times New Roman" w:cs="Times New Roman" w:eastAsia="Times New Roman" w:hAnsi="Times New Roman"/>
+          <w:b/>
+          <w:bCs/>
+          <w:color w:val="B23A2E"/>
+          <w:sz w:val="24"/>
+          <w:szCs w:val="24"/>
+          <w:rtl/>
+        </w:rPr>
+        <w:t xml:space="preserve">﴿رَبِّ إِنِّي مَغْلُوبٌ فَانتَصِرْ﴾</w:t>
+      </w:r>
+      <w:r>
+        <w:rPr>
+          <w:rFonts w:ascii="Times New Roman" w:cs="Times New Roman" w:eastAsia="Times New Roman" w:hAnsi="Times New Roman"/>
+          <w:sz w:val="24"/>
+          <w:szCs w:val="24"/>
+          <w:rtl/>
+        </w:rPr>
+        <w:t xml:space="preserve"> </w:t>
+      </w:r>
+      <w:r>
+        <w:rPr>
+          <w:rFonts w:ascii="Times New Roman" w:cs="Times New Roman" w:eastAsia="Times New Roman" w:hAnsi="Times New Roman"/>
+          <w:b/>
+          <w:bCs/>
+          <w:color w:val="3B5BA5"/>
+          <w:sz w:val="24"/>
+          <w:szCs w:val="24"/>
+          <w:rtl/>
+        </w:rPr>
+        <w:t xml:space="preserve">(4 مرات)</w:t>
+      </w:r>
+      <w:r>
+        <w:rPr>
+          <w:rFonts w:ascii="Times New Roman" w:cs="Times New Roman" w:eastAsia="Times New Roman" w:hAnsi="Times New Roman"/>
+          <w:sz w:val="24"/>
+          <w:szCs w:val="24"/>
+          <w:rtl/>
+        </w:rPr>
+        <w:t xml:space="preserve">، </w:t>
+      </w:r>
+      <w:r>
+        <w:rPr>
+          <w:rFonts w:ascii="Times New Roman" w:cs="Times New Roman" w:eastAsia="Times New Roman" w:hAnsi="Times New Roman"/>
+          <w:b/>
+          <w:bCs/>
+          <w:color w:val="B23A2E"/>
+          <w:sz w:val="24"/>
+          <w:szCs w:val="24"/>
+          <w:rtl/>
+        </w:rPr>
+        <w:t xml:space="preserve">﴿رَبِّ إِنِّي مَسَّنِيَ الضُّرُّ وَأَنتَ أَرْحَمُ الرَّاحِمِينَ﴾</w:t>
+      </w:r>
+      <w:r>
+        <w:rPr>
+          <w:rFonts w:ascii="Times New Roman" w:cs="Times New Roman" w:eastAsia="Times New Roman" w:hAnsi="Times New Roman"/>
+          <w:sz w:val="24"/>
+          <w:szCs w:val="24"/>
+          <w:rtl/>
+        </w:rPr>
+        <w:t xml:space="preserve"> </w:t>
+      </w:r>
+      <w:r>
+        <w:rPr>
+          <w:rFonts w:ascii="Times New Roman" w:cs="Times New Roman" w:eastAsia="Times New Roman" w:hAnsi="Times New Roman"/>
+          <w:b/>
+          <w:bCs/>
+          <w:color w:val="3B5BA5"/>
+          <w:sz w:val="24"/>
+          <w:szCs w:val="24"/>
+          <w:rtl/>
+        </w:rPr>
+        <w:t xml:space="preserve">(4 مرات)</w:t>
+      </w:r>
+      <w:r>
+        <w:rPr>
+          <w:rFonts w:ascii="Times New Roman" w:cs="Times New Roman" w:eastAsia="Times New Roman" w:hAnsi="Times New Roman"/>
+          <w:sz w:val="24"/>
+          <w:szCs w:val="24"/>
+          <w:rtl/>
+        </w:rPr>
+        <w:t xml:space="preserve">، </w:t>
+      </w:r>
+      <w:r>
+        <w:rPr>
+          <w:rFonts w:ascii="Times New Roman" w:cs="Times New Roman" w:eastAsia="Times New Roman" w:hAnsi="Times New Roman"/>
+          <w:b/>
+          <w:bCs/>
+          <w:color w:val="B23A2E"/>
+          <w:sz w:val="24"/>
+          <w:szCs w:val="24"/>
+          <w:rtl/>
+        </w:rPr>
+        <w:t xml:space="preserve">﴿لَا إِلَٰهَ إِلَّا أَنتَ سُبْحَانَكَ إِنِّي كُنتُ مِنَ الظَّالِمِينَ﴾</w:t>
+      </w:r>
+      <w:r>
+        <w:rPr>
+          <w:rFonts w:ascii="Times New Roman" w:cs="Times New Roman" w:eastAsia="Times New Roman" w:hAnsi="Times New Roman"/>
+          <w:sz w:val="24"/>
+          <w:szCs w:val="24"/>
+          <w:rtl/>
+        </w:rPr>
+        <w:t xml:space="preserve"> </w:t>
+      </w:r>
+      <w:r>
+        <w:rPr>
+          <w:rFonts w:ascii="Times New Roman" w:cs="Times New Roman" w:eastAsia="Times New Roman" w:hAnsi="Times New Roman"/>
+          <w:b/>
+          <w:bCs/>
+          <w:color w:val="3B5BA5"/>
+          <w:sz w:val="24"/>
+          <w:szCs w:val="24"/>
+          <w:rtl/>
+        </w:rPr>
+        <w:t xml:space="preserve">(4 مرات)</w:t>
+      </w:r>
+      <w:r>
+        <w:rPr>
+          <w:rFonts w:ascii="Times New Roman" w:cs="Times New Roman" w:eastAsia="Times New Roman" w:hAnsi="Times New Roman"/>
+          <w:sz w:val="24"/>
+          <w:szCs w:val="24"/>
+          <w:rtl/>
+        </w:rPr>
+        <w:t xml:space="preserve">، «اللهم أنت عفوٌّ تحب العفو فاعف عني» </w:t>
+      </w:r>
+      <w:r>
+        <w:rPr>
+          <w:rFonts w:ascii="Times New Roman" w:cs="Times New Roman" w:eastAsia="Times New Roman" w:hAnsi="Times New Roman"/>
+          <w:b/>
+          <w:bCs/>
+          <w:color w:val="3B5BA5"/>
+          <w:sz w:val="24"/>
+          <w:szCs w:val="24"/>
+          <w:rtl/>
+        </w:rPr>
+        <w:t xml:space="preserve">(4 مرات)</w:t>
+      </w:r>
+      <w:r>
+        <w:rPr>
+          <w:rFonts w:ascii="Times New Roman" w:cs="Times New Roman" w:eastAsia="Times New Roman" w:hAnsi="Times New Roman"/>
+          <w:sz w:val="24"/>
+          <w:szCs w:val="24"/>
+          <w:rtl/>
+        </w:rPr>
+        <w:t xml:space="preserve">، «اللهم فرِّج همي وافتح لي الأبواب المغلقة» </w:t>
+      </w:r>
+      <w:r>
+        <w:rPr>
+          <w:rFonts w:ascii="Times New Roman" w:cs="Times New Roman" w:eastAsia="Times New Roman" w:hAnsi="Times New Roman"/>
+          <w:b/>
+          <w:bCs/>
+          <w:color w:val="3B5BA5"/>
+          <w:sz w:val="24"/>
+          <w:szCs w:val="24"/>
+          <w:rtl/>
+        </w:rPr>
+        <w:t xml:space="preserve">(4 مرات)</w:t>
+      </w:r>
+      <w:r>
+        <w:rPr>
+          <w:rFonts w:ascii="Times New Roman" w:cs="Times New Roman" w:eastAsia="Times New Roman" w:hAnsi="Times New Roman"/>
+          <w:sz w:val="24"/>
+          <w:szCs w:val="24"/>
+          <w:rtl/>
+        </w:rPr>
+        <w:t xml:space="preserve">، «اللهم إني فوّضت أمري إلى الله» </w:t>
+      </w:r>
+      <w:r>
+        <w:rPr>
+          <w:rFonts w:ascii="Times New Roman" w:cs="Times New Roman" w:eastAsia="Times New Roman" w:hAnsi="Times New Roman"/>
+          <w:b/>
+          <w:bCs/>
+          <w:color w:val="3B5BA5"/>
+          <w:sz w:val="24"/>
+          <w:szCs w:val="24"/>
+          <w:rtl/>
+        </w:rPr>
+        <w:t xml:space="preserve">(4 مرات)</w:t>
+      </w:r>
+      <w:r>
+        <w:rPr>
+          <w:rFonts w:ascii="Times New Roman" w:cs="Times New Roman" w:eastAsia="Times New Roman" w:hAnsi="Times New Roman"/>
+          <w:sz w:val="24"/>
+          <w:szCs w:val="24"/>
+          <w:rtl/>
+        </w:rPr>
+        <w:t xml:space="preserve">، صلاة على سيدنا محمد </w:t>
+      </w:r>
+      <w:r>
+        <w:rPr>
+          <w:rFonts w:ascii="Times New Roman" w:cs="Times New Roman" w:eastAsia="Times New Roman" w:hAnsi="Times New Roman"/>
+          <w:b/>
+          <w:bCs/>
+          <w:color w:val="3B5BA5"/>
+          <w:sz w:val="24"/>
+          <w:szCs w:val="24"/>
+          <w:rtl/>
+        </w:rPr>
+        <w:t xml:space="preserve">(10 مرات)</w:t>
+      </w:r>
+      <w:r>
+        <w:rPr>
+          <w:rFonts w:ascii="Times New Roman" w:cs="Times New Roman" w:eastAsia="Times New Roman" w:hAnsi="Times New Roman"/>
+          <w:sz w:val="24"/>
+          <w:szCs w:val="24"/>
+          <w:rtl/>
+        </w:rPr>
+        <w:t xml:space="preserve">، سورة الإخلاص </w:t>
+      </w:r>
+      <w:r>
+        <w:rPr>
+          <w:rFonts w:ascii="Times New Roman" w:cs="Times New Roman" w:eastAsia="Times New Roman" w:hAnsi="Times New Roman"/>
+          <w:b/>
+          <w:bCs/>
+          <w:color w:val="3B5BA5"/>
+          <w:sz w:val="24"/>
+          <w:szCs w:val="24"/>
+          <w:rtl/>
+        </w:rPr>
+        <w:t xml:space="preserve">(3 مرات)</w:t>
+      </w:r>
+      <w:r>
+        <w:rPr>
+          <w:rFonts w:ascii="Times New Roman" w:cs="Times New Roman" w:eastAsia="Times New Roman" w:hAnsi="Times New Roman"/>
+          <w:sz w:val="24"/>
+          <w:szCs w:val="24"/>
+          <w:rtl/>
+        </w:rPr>
+        <w:t xml:space="preserve">، «يا مُغني أغنني وفرّج همي» </w:t>
+      </w:r>
+      <w:r>
+        <w:rPr>
+          <w:rFonts w:ascii="Times New Roman" w:cs="Times New Roman" w:eastAsia="Times New Roman" w:hAnsi="Times New Roman"/>
+          <w:b/>
+          <w:bCs/>
+          <w:color w:val="3B5BA5"/>
+          <w:sz w:val="24"/>
+          <w:szCs w:val="24"/>
+          <w:rtl/>
+        </w:rPr>
+        <w:t xml:space="preserve">(3 مرات)</w:t>
+      </w:r>
+      <w:r>
+        <w:rPr>
+          <w:rFonts w:ascii="Times New Roman" w:cs="Times New Roman" w:eastAsia="Times New Roman" w:hAnsi="Times New Roman"/>
+          <w:sz w:val="24"/>
+          <w:szCs w:val="24"/>
+          <w:rtl/>
+        </w:rPr>
+        <w:t xml:space="preserve">. ثم: «اللهم إني أفوّض أمري إليك، فانتقم لي ممن ظلمني، واجعله في كفايتك، إنك على كل شيء قدير». ثم: «اللهم يا جبار يا قهار يا منتقم، إني أسلّم أمري إليك، فخذ حقي من ظالمي، وأرني فيه عجائب قدرتك، واجعله عبرة لكل من يفكر في ظلمي، واهزمه هزيمة تكون فيها آية لعبادك، يا ذا البطش الشديد، يا قويّ يا عزيز، حسبي الله ونعم الوكيل». ثم: «اللهم إني أجعلك في نحورهم ونعوذ بك من شرورهم»</w:t>
       </w:r>
     </w:p>
     <w:p>

</xml_diff>

<commit_message>
Add 4 new duas to Category 1 after entry 26
- دعاء النبي اليومي (علمًا نافعًا، ورزقًا طيبًا، وعملًا متقبلًا)
- طلب خير اليوم
- طلب التيسير (اقضِ عنا الدين وأغننا من الفقر)
- طلب الهداية والسداد

Co-Authored-By: Claude Sonnet 5 <noreply@anthropic.com>
Claude-Session: https://claude.ai/code/session_015v8MN6VZjbnhmn7ju2JYhZ
</commit_message>
<xml_diff>
--- a/خزانة الأدعية.docx
+++ b/خزانة الأدعية.docx
@@ -1374,6 +1374,142 @@
           <w:szCs w:val="24"/>
           <w:rtl/>
         </w:rPr>
+        <w:t xml:space="preserve">دعاء النبي اليومي: اللهم إني أسألك علمًا نافعًا، ورزقًا طيبًا، وعملًا متقبلًا</w:t>
+      </w:r>
+    </w:p>
+    <w:p>
+      <w:pPr>
+        <w:bidi/>
+        <w:spacing w:after="120" w:before="320"/>
+        <w:jc w:val="right"/>
+      </w:pPr>
+      <w:r>
+        <w:rPr>
+          <w:rFonts w:ascii="Times New Roman" w:cs="Times New Roman" w:eastAsia="Times New Roman" w:hAnsi="Times New Roman"/>
+          <w:b/>
+          <w:bCs/>
+          <w:sz w:val="44"/>
+          <w:szCs w:val="44"/>
+          <w:rtl/>
+        </w:rPr>
+        <w:t xml:space="preserve">الدعاء الثامن والعشرون</w:t>
+      </w:r>
+    </w:p>
+    <w:p>
+      <w:pPr>
+        <w:bidi/>
+        <w:spacing w:after="200" w:line="340"/>
+        <w:jc w:val="right"/>
+      </w:pPr>
+      <w:r>
+        <w:rPr>
+          <w:rFonts w:ascii="Times New Roman" w:cs="Times New Roman" w:eastAsia="Times New Roman" w:hAnsi="Times New Roman"/>
+          <w:sz w:val="24"/>
+          <w:szCs w:val="24"/>
+          <w:rtl/>
+        </w:rPr>
+        <w:t xml:space="preserve">طلب خير اليوم: اللهم إني أسألك خير هذا اليوم فتحه، ونصره، ونوره، وبركته، وهداه، وأعوذ بك من شر ما فيه وشر ما بعده</w:t>
+      </w:r>
+    </w:p>
+    <w:p>
+      <w:pPr>
+        <w:bidi/>
+        <w:spacing w:after="120" w:before="320"/>
+        <w:jc w:val="right"/>
+      </w:pPr>
+      <w:r>
+        <w:rPr>
+          <w:rFonts w:ascii="Times New Roman" w:cs="Times New Roman" w:eastAsia="Times New Roman" w:hAnsi="Times New Roman"/>
+          <w:b/>
+          <w:bCs/>
+          <w:sz w:val="44"/>
+          <w:szCs w:val="44"/>
+          <w:rtl/>
+        </w:rPr>
+        <w:t xml:space="preserve">الدعاء التاسع والعشرون</w:t>
+      </w:r>
+    </w:p>
+    <w:p>
+      <w:pPr>
+        <w:bidi/>
+        <w:spacing w:after="200" w:line="340"/>
+        <w:jc w:val="right"/>
+      </w:pPr>
+      <w:r>
+        <w:rPr>
+          <w:rFonts w:ascii="Times New Roman" w:cs="Times New Roman" w:eastAsia="Times New Roman" w:hAnsi="Times New Roman"/>
+          <w:sz w:val="24"/>
+          <w:szCs w:val="24"/>
+          <w:rtl/>
+        </w:rPr>
+        <w:t xml:space="preserve">طلب التيسير: اللهم رب السماوات السبع، ورب العرش العظيم، اقضِ عنا الدين وأغننا من الفقر</w:t>
+      </w:r>
+    </w:p>
+    <w:p>
+      <w:pPr>
+        <w:bidi/>
+        <w:spacing w:after="120" w:before="320"/>
+        <w:jc w:val="right"/>
+      </w:pPr>
+      <w:r>
+        <w:rPr>
+          <w:rFonts w:ascii="Times New Roman" w:cs="Times New Roman" w:eastAsia="Times New Roman" w:hAnsi="Times New Roman"/>
+          <w:b/>
+          <w:bCs/>
+          <w:sz w:val="44"/>
+          <w:szCs w:val="44"/>
+          <w:rtl/>
+        </w:rPr>
+        <w:t xml:space="preserve">الدعاء الثلاثون</w:t>
+      </w:r>
+    </w:p>
+    <w:p>
+      <w:pPr>
+        <w:bidi/>
+        <w:spacing w:after="200" w:line="340"/>
+        <w:jc w:val="right"/>
+      </w:pPr>
+      <w:r>
+        <w:rPr>
+          <w:rFonts w:ascii="Times New Roman" w:cs="Times New Roman" w:eastAsia="Times New Roman" w:hAnsi="Times New Roman"/>
+          <w:sz w:val="24"/>
+          <w:szCs w:val="24"/>
+          <w:rtl/>
+        </w:rPr>
+        <w:t xml:space="preserve">طلب الهداية والسداد: اللهم إني أسألك الهدى والسداد، وتيسير الأمور كلها</w:t>
+      </w:r>
+    </w:p>
+    <w:p>
+      <w:pPr>
+        <w:bidi/>
+        <w:spacing w:after="120" w:before="320"/>
+        <w:jc w:val="right"/>
+      </w:pPr>
+      <w:r>
+        <w:rPr>
+          <w:rFonts w:ascii="Times New Roman" w:cs="Times New Roman" w:eastAsia="Times New Roman" w:hAnsi="Times New Roman"/>
+          <w:b/>
+          <w:bCs/>
+          <w:sz w:val="44"/>
+          <w:szCs w:val="44"/>
+          <w:rtl/>
+        </w:rPr>
+        <w:t xml:space="preserve">الدعاء الحادي والثلاثون</w:t>
+      </w:r>
+    </w:p>
+    <w:p>
+      <w:pPr>
+        <w:bidi/>
+        <w:spacing w:after="200" w:line="340"/>
+        <w:jc w:val="right"/>
+      </w:pPr>
+      <w:r>
+        <w:rPr>
+          <w:rFonts w:ascii="Times New Roman" w:cs="Times New Roman" w:eastAsia="Times New Roman" w:hAnsi="Times New Roman"/>
+          <w:sz w:val="24"/>
+          <w:szCs w:val="24"/>
+          <w:rtl/>
+        </w:rPr>
         <w:t xml:space="preserve">الدعاء المستجاب بين الصبح والفجر: يا رب، إن لم أُحسن في دعائي فأنت أعلم بحاجاتي، وإن قصرت غاياتي فأنت سبحانك تعلم غاياتي، ولا يخفى عليك شيء من أحوالي، فأجبر خاطري بفيض نعمك. اللهم أعطنا خير ما تعطي السائلين، واجمع لنا صلاح الدنيا والدين، اللهم اذهب عنا الحزن وأزل عنا الهم، واطرد من نفوسنا القلق، اللهم زدنا نورًا في القلب وضياءً في الوجه، اللهم آمين يا رب العالمين</w:t>
       </w:r>
     </w:p>
@@ -1392,7 +1528,7 @@
           <w:szCs w:val="44"/>
           <w:rtl/>
         </w:rPr>
-        <w:t xml:space="preserve">الدعاء الثامن والعشرون</w:t>
+        <w:t xml:space="preserve">الدعاء الثاني والثلاثون</w:t>
       </w:r>
     </w:p>
     <w:p>
@@ -1489,7 +1625,7 @@
           <w:szCs w:val="44"/>
           <w:rtl/>
         </w:rPr>
-        <w:t xml:space="preserve">الدعاء التاسع والعشرون</w:t>
+        <w:t xml:space="preserve">الدعاء الثالث والثلاثون</w:t>
       </w:r>
     </w:p>
     <w:p>
@@ -1535,7 +1671,7 @@
           <w:szCs w:val="44"/>
           <w:rtl/>
         </w:rPr>
-        <w:t xml:space="preserve">الدعاء الثلاثون</w:t>
+        <w:t xml:space="preserve">الدعاء الرابع والثلاثون</w:t>
       </w:r>
     </w:p>
     <w:p>

</xml_diff>

<commit_message>
Update Category 1 dua 24 to the standard Ibrahimic salawat wording
Co-Authored-By: Claude Sonnet 5 <noreply@anthropic.com>
Claude-Session: https://claude.ai/code/session_015v8MN6VZjbnhmn7ju2JYhZ
</commit_message>
<xml_diff>
--- a/خزانة الأدعية.docx
+++ b/خزانة الأدعية.docx
@@ -1167,7 +1167,7 @@
           <w:szCs w:val="24"/>
           <w:rtl/>
         </w:rPr>
-        <w:t xml:space="preserve">اللهم صلِّ على محمد وعلى أزواجه أمهات المؤمنين وآل بيته وذريته، كما صليت على آل إبراهيم إنك حميد مجيد </w:t>
+        <w:t xml:space="preserve">اللهم صلِّ على محمد وعلى آل محمد، كما صليت على إبراهيم وعلى آل إبراهيم، إنك حميد مجيد. اللهم بارك على محمد وعلى آل محمد، كما باركت على إبراهيم وعلى آل إبراهيم، إنك حميد مجيد </w:t>
       </w:r>
       <w:r>
         <w:rPr>
@@ -1188,7 +1188,7 @@
           <w:szCs w:val="24"/>
           <w:rtl/>
         </w:rPr>
-        <w:t xml:space="preserve"> (رواه الطبراني بإسناد جيد)</w:t>
+        <w:t xml:space="preserve"> (رواه البخاري)</w:t>
       </w:r>
     </w:p>
     <w:p>

</xml_diff>

<commit_message>
Move Category 1 dua 25 (Ikhlas/Falaq/Nas) to position 3
Co-Authored-By: Claude Sonnet 5 <noreply@anthropic.com>
Claude-Session: https://claude.ai/code/session_015v8MN6VZjbnhmn7ju2JYhZ
</commit_message>
<xml_diff>
--- a/خزانة الأدعية.docx
+++ b/خزانة الأدعية.docx
@@ -243,6 +243,124 @@
           <w:szCs w:val="24"/>
           <w:rtl/>
         </w:rPr>
+        <w:t xml:space="preserve">بسم الله الرحمن الرحيم: </w:t>
+      </w:r>
+      <w:r>
+        <w:rPr>
+          <w:rFonts w:ascii="Times New Roman" w:cs="Times New Roman" w:eastAsia="Times New Roman" w:hAnsi="Times New Roman"/>
+          <w:b/>
+          <w:bCs/>
+          <w:color w:val="B23A2E"/>
+          <w:sz w:val="24"/>
+          <w:szCs w:val="24"/>
+          <w:rtl/>
+        </w:rPr>
+        <w:t xml:space="preserve">﴿قُلْ هُوَ اللَّهُ أَحَدٌ﴾</w:t>
+      </w:r>
+      <w:r>
+        <w:rPr>
+          <w:rFonts w:ascii="Times New Roman" w:cs="Times New Roman" w:eastAsia="Times New Roman" w:hAnsi="Times New Roman"/>
+          <w:sz w:val="24"/>
+          <w:szCs w:val="24"/>
+          <w:rtl/>
+        </w:rPr>
+        <w:t xml:space="preserve"> (سورة الإخلاص)، و</w:t>
+      </w:r>
+      <w:r>
+        <w:rPr>
+          <w:rFonts w:ascii="Times New Roman" w:cs="Times New Roman" w:eastAsia="Times New Roman" w:hAnsi="Times New Roman"/>
+          <w:b/>
+          <w:bCs/>
+          <w:color w:val="B23A2E"/>
+          <w:sz w:val="24"/>
+          <w:szCs w:val="24"/>
+          <w:rtl/>
+        </w:rPr>
+        <w:t xml:space="preserve">﴿قُلْ أَعُوذُ بِرَبِّ الْفَلَقِ﴾</w:t>
+      </w:r>
+      <w:r>
+        <w:rPr>
+          <w:rFonts w:ascii="Times New Roman" w:cs="Times New Roman" w:eastAsia="Times New Roman" w:hAnsi="Times New Roman"/>
+          <w:sz w:val="24"/>
+          <w:szCs w:val="24"/>
+          <w:rtl/>
+        </w:rPr>
+        <w:t xml:space="preserve"> (سورة الفلق)، وفي المساء: </w:t>
+      </w:r>
+      <w:r>
+        <w:rPr>
+          <w:rFonts w:ascii="Times New Roman" w:cs="Times New Roman" w:eastAsia="Times New Roman" w:hAnsi="Times New Roman"/>
+          <w:b/>
+          <w:bCs/>
+          <w:color w:val="B23A2E"/>
+          <w:sz w:val="24"/>
+          <w:szCs w:val="24"/>
+          <w:rtl/>
+        </w:rPr>
+        <w:t xml:space="preserve">﴿قُلْ أَعُوذُ بِرَبِّ النَّاسِ﴾</w:t>
+      </w:r>
+      <w:r>
+        <w:rPr>
+          <w:rFonts w:ascii="Times New Roman" w:cs="Times New Roman" w:eastAsia="Times New Roman" w:hAnsi="Times New Roman"/>
+          <w:sz w:val="24"/>
+          <w:szCs w:val="24"/>
+          <w:rtl/>
+        </w:rPr>
+        <w:t xml:space="preserve"> (سورة الناس)، أعوذ بذلك من شر ما خلق وذرأ وبرأ </w:t>
+      </w:r>
+      <w:r>
+        <w:rPr>
+          <w:rFonts w:ascii="Times New Roman" w:cs="Times New Roman" w:eastAsia="Times New Roman" w:hAnsi="Times New Roman"/>
+          <w:b/>
+          <w:bCs/>
+          <w:color w:val="3B5BA5"/>
+          <w:sz w:val="24"/>
+          <w:szCs w:val="24"/>
+          <w:rtl/>
+        </w:rPr>
+        <w:t xml:space="preserve">(3 مرات)</w:t>
+      </w:r>
+      <w:r>
+        <w:rPr>
+          <w:rFonts w:ascii="Times New Roman" w:cs="Times New Roman" w:eastAsia="Times New Roman" w:hAnsi="Times New Roman"/>
+          <w:sz w:val="24"/>
+          <w:szCs w:val="24"/>
+          <w:rtl/>
+        </w:rPr>
+        <w:t xml:space="preserve"> (رواه الطبراني بإسناد جيد)</w:t>
+      </w:r>
+    </w:p>
+    <w:p>
+      <w:pPr>
+        <w:bidi/>
+        <w:spacing w:after="120" w:before="320"/>
+        <w:jc w:val="right"/>
+      </w:pPr>
+      <w:r>
+        <w:rPr>
+          <w:rFonts w:ascii="Times New Roman" w:cs="Times New Roman" w:eastAsia="Times New Roman" w:hAnsi="Times New Roman"/>
+          <w:b/>
+          <w:bCs/>
+          <w:sz w:val="44"/>
+          <w:szCs w:val="44"/>
+          <w:rtl/>
+        </w:rPr>
+        <w:t xml:space="preserve">الدعاء الرابع</w:t>
+      </w:r>
+    </w:p>
+    <w:p>
+      <w:pPr>
+        <w:bidi/>
+        <w:spacing w:after="200" w:line="340"/>
+        <w:jc w:val="right"/>
+      </w:pPr>
+      <w:r>
+        <w:rPr>
+          <w:rFonts w:ascii="Times New Roman" w:cs="Times New Roman" w:eastAsia="Times New Roman" w:hAnsi="Times New Roman"/>
+          <w:sz w:val="24"/>
+          <w:szCs w:val="24"/>
+          <w:rtl/>
+        </w:rPr>
         <w:t xml:space="preserve">أصبحنا (أمسينا) وأصبح (أمسى) الملك لله، والحمد لله، لا إله إلا الله وحده لا شريك له، له الملك وله الحمد وهو على كل شيء قدير، رب أسألك خير هذا اليوم (هذه الليلة) وخير ما بعده، وأعوذ بك من شر هذا اليوم (هذه الليلة) وشر ما بعده، رب أعوذ بك من الكسل وسوء الكبر، رب أعوذ بك من عذاب في النار وعذاب في القبر (رواه مسلم)</w:t>
       </w:r>
     </w:p>
@@ -261,7 +379,7 @@
           <w:szCs w:val="44"/>
           <w:rtl/>
         </w:rPr>
-        <w:t xml:space="preserve">الدعاء الرابع</w:t>
+        <w:t xml:space="preserve">الدعاء الخامس</w:t>
       </w:r>
     </w:p>
     <w:p>
@@ -295,7 +413,7 @@
           <w:szCs w:val="44"/>
           <w:rtl/>
         </w:rPr>
-        <w:t xml:space="preserve">الدعاء الخامس</w:t>
+        <w:t xml:space="preserve">الدعاء السادس</w:t>
       </w:r>
     </w:p>
     <w:p>
@@ -350,7 +468,7 @@
           <w:szCs w:val="44"/>
           <w:rtl/>
         </w:rPr>
-        <w:t xml:space="preserve">الدعاء السادس</w:t>
+        <w:t xml:space="preserve">الدعاء السابع</w:t>
       </w:r>
     </w:p>
     <w:p>
@@ -384,7 +502,7 @@
           <w:szCs w:val="44"/>
           <w:rtl/>
         </w:rPr>
-        <w:t xml:space="preserve">الدعاء السابع</w:t>
+        <w:t xml:space="preserve">الدعاء الثامن</w:t>
       </w:r>
     </w:p>
     <w:p>
@@ -418,7 +536,7 @@
           <w:szCs w:val="44"/>
           <w:rtl/>
         </w:rPr>
-        <w:t xml:space="preserve">الدعاء الثامن</w:t>
+        <w:t xml:space="preserve">الدعاء التاسع</w:t>
       </w:r>
     </w:p>
     <w:p>
@@ -473,7 +591,7 @@
           <w:szCs w:val="44"/>
           <w:rtl/>
         </w:rPr>
-        <w:t xml:space="preserve">الدعاء التاسع</w:t>
+        <w:t xml:space="preserve">الدعاء العاشر</w:t>
       </w:r>
     </w:p>
     <w:p>
@@ -507,7 +625,7 @@
           <w:szCs w:val="44"/>
           <w:rtl/>
         </w:rPr>
-        <w:t xml:space="preserve">الدعاء العاشر</w:t>
+        <w:t xml:space="preserve">الدعاء الحادي عشر</w:t>
       </w:r>
     </w:p>
     <w:p>
@@ -562,7 +680,7 @@
           <w:szCs w:val="44"/>
           <w:rtl/>
         </w:rPr>
-        <w:t xml:space="preserve">الدعاء الحادي عشر</w:t>
+        <w:t xml:space="preserve">الدعاء الثاني عشر</w:t>
       </w:r>
     </w:p>
     <w:p>
@@ -617,7 +735,7 @@
           <w:szCs w:val="44"/>
           <w:rtl/>
         </w:rPr>
-        <w:t xml:space="preserve">الدعاء الثاني عشر</w:t>
+        <w:t xml:space="preserve">الدعاء الثالث عشر</w:t>
       </w:r>
     </w:p>
     <w:p>
@@ -651,7 +769,7 @@
           <w:szCs w:val="44"/>
           <w:rtl/>
         </w:rPr>
-        <w:t xml:space="preserve">الدعاء الثالث عشر</w:t>
+        <w:t xml:space="preserve">الدعاء الرابع عشر</w:t>
       </w:r>
     </w:p>
     <w:p>
@@ -706,7 +824,7 @@
           <w:szCs w:val="44"/>
           <w:rtl/>
         </w:rPr>
-        <w:t xml:space="preserve">الدعاء الرابع عشر</w:t>
+        <w:t xml:space="preserve">الدعاء الخامس عشر</w:t>
       </w:r>
     </w:p>
     <w:p>
@@ -740,7 +858,7 @@
           <w:szCs w:val="44"/>
           <w:rtl/>
         </w:rPr>
-        <w:t xml:space="preserve">الدعاء الخامس عشر</w:t>
+        <w:t xml:space="preserve">الدعاء السادس عشر</w:t>
       </w:r>
     </w:p>
     <w:p>
@@ -795,7 +913,7 @@
           <w:szCs w:val="44"/>
           <w:rtl/>
         </w:rPr>
-        <w:t xml:space="preserve">الدعاء السادس عشر</w:t>
+        <w:t xml:space="preserve">الدعاء السابع عشر</w:t>
       </w:r>
     </w:p>
     <w:p>
@@ -850,7 +968,7 @@
           <w:szCs w:val="44"/>
           <w:rtl/>
         </w:rPr>
-        <w:t xml:space="preserve">الدعاء السابع عشر</w:t>
+        <w:t xml:space="preserve">الدعاء الثامن عشر</w:t>
       </w:r>
     </w:p>
     <w:p>
@@ -884,7 +1002,7 @@
           <w:szCs w:val="44"/>
           <w:rtl/>
         </w:rPr>
-        <w:t xml:space="preserve">الدعاء الثامن عشر</w:t>
+        <w:t xml:space="preserve">الدعاء التاسع عشر</w:t>
       </w:r>
     </w:p>
     <w:p>
@@ -918,7 +1036,7 @@
           <w:szCs w:val="44"/>
           <w:rtl/>
         </w:rPr>
-        <w:t xml:space="preserve">الدعاء التاسع عشر</w:t>
+        <w:t xml:space="preserve">الدعاء العشرون</w:t>
       </w:r>
     </w:p>
     <w:p>
@@ -952,7 +1070,7 @@
           <w:szCs w:val="44"/>
           <w:rtl/>
         </w:rPr>
-        <w:t xml:space="preserve">الدعاء العشرون</w:t>
+        <w:t xml:space="preserve">الدعاء الحادي والعشرون</w:t>
       </w:r>
     </w:p>
     <w:p>
@@ -986,7 +1104,7 @@
           <w:szCs w:val="44"/>
           <w:rtl/>
         </w:rPr>
-        <w:t xml:space="preserve">الدعاء الحادي والعشرون</w:t>
+        <w:t xml:space="preserve">الدعاء الثاني والعشرون</w:t>
       </w:r>
     </w:p>
     <w:p>
@@ -1041,7 +1159,7 @@
           <w:szCs w:val="44"/>
           <w:rtl/>
         </w:rPr>
-        <w:t xml:space="preserve">الدعاء الثاني والعشرون</w:t>
+        <w:t xml:space="preserve">الدعاء الثالث والعشرون</w:t>
       </w:r>
     </w:p>
     <w:p>
@@ -1096,7 +1214,7 @@
           <w:szCs w:val="44"/>
           <w:rtl/>
         </w:rPr>
-        <w:t xml:space="preserve">الدعاء الثالث والعشرون</w:t>
+        <w:t xml:space="preserve">الدعاء الرابع والعشرون</w:t>
       </w:r>
     </w:p>
     <w:p>
@@ -1151,7 +1269,7 @@
           <w:szCs w:val="44"/>
           <w:rtl/>
         </w:rPr>
-        <w:t xml:space="preserve">الدعاء الرابع والعشرون</w:t>
+        <w:t xml:space="preserve">الدعاء الخامس والعشرون</w:t>
       </w:r>
     </w:p>
     <w:p>
@@ -1189,124 +1307,6 @@
           <w:rtl/>
         </w:rPr>
         <w:t xml:space="preserve"> (رواه البخاري)</w:t>
-      </w:r>
-    </w:p>
-    <w:p>
-      <w:pPr>
-        <w:bidi/>
-        <w:spacing w:after="120" w:before="320"/>
-        <w:jc w:val="right"/>
-      </w:pPr>
-      <w:r>
-        <w:rPr>
-          <w:rFonts w:ascii="Times New Roman" w:cs="Times New Roman" w:eastAsia="Times New Roman" w:hAnsi="Times New Roman"/>
-          <w:b/>
-          <w:bCs/>
-          <w:sz w:val="44"/>
-          <w:szCs w:val="44"/>
-          <w:rtl/>
-        </w:rPr>
-        <w:t xml:space="preserve">الدعاء الخامس والعشرون</w:t>
-      </w:r>
-    </w:p>
-    <w:p>
-      <w:pPr>
-        <w:bidi/>
-        <w:spacing w:after="200" w:line="340"/>
-        <w:jc w:val="right"/>
-      </w:pPr>
-      <w:r>
-        <w:rPr>
-          <w:rFonts w:ascii="Times New Roman" w:cs="Times New Roman" w:eastAsia="Times New Roman" w:hAnsi="Times New Roman"/>
-          <w:sz w:val="24"/>
-          <w:szCs w:val="24"/>
-          <w:rtl/>
-        </w:rPr>
-        <w:t xml:space="preserve">بسم الله الرحمن الرحيم: </w:t>
-      </w:r>
-      <w:r>
-        <w:rPr>
-          <w:rFonts w:ascii="Times New Roman" w:cs="Times New Roman" w:eastAsia="Times New Roman" w:hAnsi="Times New Roman"/>
-          <w:b/>
-          <w:bCs/>
-          <w:color w:val="B23A2E"/>
-          <w:sz w:val="24"/>
-          <w:szCs w:val="24"/>
-          <w:rtl/>
-        </w:rPr>
-        <w:t xml:space="preserve">﴿قُلْ هُوَ اللَّهُ أَحَدٌ﴾</w:t>
-      </w:r>
-      <w:r>
-        <w:rPr>
-          <w:rFonts w:ascii="Times New Roman" w:cs="Times New Roman" w:eastAsia="Times New Roman" w:hAnsi="Times New Roman"/>
-          <w:sz w:val="24"/>
-          <w:szCs w:val="24"/>
-          <w:rtl/>
-        </w:rPr>
-        <w:t xml:space="preserve"> (سورة الإخلاص)، و</w:t>
-      </w:r>
-      <w:r>
-        <w:rPr>
-          <w:rFonts w:ascii="Times New Roman" w:cs="Times New Roman" w:eastAsia="Times New Roman" w:hAnsi="Times New Roman"/>
-          <w:b/>
-          <w:bCs/>
-          <w:color w:val="B23A2E"/>
-          <w:sz w:val="24"/>
-          <w:szCs w:val="24"/>
-          <w:rtl/>
-        </w:rPr>
-        <w:t xml:space="preserve">﴿قُلْ أَعُوذُ بِرَبِّ الْفَلَقِ﴾</w:t>
-      </w:r>
-      <w:r>
-        <w:rPr>
-          <w:rFonts w:ascii="Times New Roman" w:cs="Times New Roman" w:eastAsia="Times New Roman" w:hAnsi="Times New Roman"/>
-          <w:sz w:val="24"/>
-          <w:szCs w:val="24"/>
-          <w:rtl/>
-        </w:rPr>
-        <w:t xml:space="preserve"> (سورة الفلق)، وفي المساء: </w:t>
-      </w:r>
-      <w:r>
-        <w:rPr>
-          <w:rFonts w:ascii="Times New Roman" w:cs="Times New Roman" w:eastAsia="Times New Roman" w:hAnsi="Times New Roman"/>
-          <w:b/>
-          <w:bCs/>
-          <w:color w:val="B23A2E"/>
-          <w:sz w:val="24"/>
-          <w:szCs w:val="24"/>
-          <w:rtl/>
-        </w:rPr>
-        <w:t xml:space="preserve">﴿قُلْ أَعُوذُ بِرَبِّ النَّاسِ﴾</w:t>
-      </w:r>
-      <w:r>
-        <w:rPr>
-          <w:rFonts w:ascii="Times New Roman" w:cs="Times New Roman" w:eastAsia="Times New Roman" w:hAnsi="Times New Roman"/>
-          <w:sz w:val="24"/>
-          <w:szCs w:val="24"/>
-          <w:rtl/>
-        </w:rPr>
-        <w:t xml:space="preserve"> (سورة الناس)، أعوذ بذلك من شر ما خلق وذرأ وبرأ </w:t>
-      </w:r>
-      <w:r>
-        <w:rPr>
-          <w:rFonts w:ascii="Times New Roman" w:cs="Times New Roman" w:eastAsia="Times New Roman" w:hAnsi="Times New Roman"/>
-          <w:b/>
-          <w:bCs/>
-          <w:color w:val="3B5BA5"/>
-          <w:sz w:val="24"/>
-          <w:szCs w:val="24"/>
-          <w:rtl/>
-        </w:rPr>
-        <w:t xml:space="preserve">(3 مرات)</w:t>
-      </w:r>
-      <w:r>
-        <w:rPr>
-          <w:rFonts w:ascii="Times New Roman" w:cs="Times New Roman" w:eastAsia="Times New Roman" w:hAnsi="Times New Roman"/>
-          <w:sz w:val="24"/>
-          <w:szCs w:val="24"/>
-          <w:rtl/>
-        </w:rPr>
-        <w:t xml:space="preserve"> (رواه الطبراني بإسناد جيد)</w:t>
       </w:r>
     </w:p>
     <w:p>

</xml_diff>

<commit_message>
Merge Category 1 duas 23-25 (three tasbih phrases) into one entry
Co-Authored-By: Claude Sonnet 5 <noreply@anthropic.com>
Claude-Session: https://claude.ai/code/session_015v8MN6VZjbnhmn7ju2JYhZ
</commit_message>
<xml_diff>
--- a/خزانة الأدعية.docx
+++ b/خزانة الأدعية.docx
@@ -1196,7 +1196,49 @@
           <w:szCs w:val="24"/>
           <w:rtl/>
         </w:rPr>
-        <w:t xml:space="preserve"> (رواه مسلم)</w:t>
+        <w:t xml:space="preserve"> (رواه مسلم). سبحان الله العظيم وبحمده </w:t>
+      </w:r>
+      <w:r>
+        <w:rPr>
+          <w:rFonts w:ascii="Times New Roman" w:cs="Times New Roman" w:eastAsia="Times New Roman" w:hAnsi="Times New Roman"/>
+          <w:b/>
+          <w:bCs/>
+          <w:color w:val="3B5BA5"/>
+          <w:sz w:val="24"/>
+          <w:szCs w:val="24"/>
+          <w:rtl/>
+        </w:rPr>
+        <w:t xml:space="preserve">(100 مرة)</w:t>
+      </w:r>
+      <w:r>
+        <w:rPr>
+          <w:rFonts w:ascii="Times New Roman" w:cs="Times New Roman" w:eastAsia="Times New Roman" w:hAnsi="Times New Roman"/>
+          <w:sz w:val="24"/>
+          <w:szCs w:val="24"/>
+          <w:rtl/>
+        </w:rPr>
+        <w:t xml:space="preserve"> (رواه مسلم). سبحان الله والحمد لله ولا إله إلا الله والله أكبر </w:t>
+      </w:r>
+      <w:r>
+        <w:rPr>
+          <w:rFonts w:ascii="Times New Roman" w:cs="Times New Roman" w:eastAsia="Times New Roman" w:hAnsi="Times New Roman"/>
+          <w:b/>
+          <w:bCs/>
+          <w:color w:val="3B5BA5"/>
+          <w:sz w:val="24"/>
+          <w:szCs w:val="24"/>
+          <w:rtl/>
+        </w:rPr>
+        <w:t xml:space="preserve">(100 مرة)</w:t>
+      </w:r>
+      <w:r>
+        <w:rPr>
+          <w:rFonts w:ascii="Times New Roman" w:cs="Times New Roman" w:eastAsia="Times New Roman" w:hAnsi="Times New Roman"/>
+          <w:sz w:val="24"/>
+          <w:szCs w:val="24"/>
+          <w:rtl/>
+        </w:rPr>
+        <w:t xml:space="preserve"> (رواه الترمذي بسند صحيح)</w:t>
       </w:r>
     </w:p>
     <w:p>
@@ -1230,28 +1272,28 @@
           <w:szCs w:val="24"/>
           <w:rtl/>
         </w:rPr>
-        <w:t xml:space="preserve">سبحان الله العظيم وبحمده </w:t>
-      </w:r>
-      <w:r>
-        <w:rPr>
-          <w:rFonts w:ascii="Times New Roman" w:cs="Times New Roman" w:eastAsia="Times New Roman" w:hAnsi="Times New Roman"/>
-          <w:b/>
-          <w:bCs/>
-          <w:color w:val="3B5BA5"/>
-          <w:sz w:val="24"/>
-          <w:szCs w:val="24"/>
-          <w:rtl/>
-        </w:rPr>
-        <w:t xml:space="preserve">(100 مرة)</w:t>
-      </w:r>
-      <w:r>
-        <w:rPr>
-          <w:rFonts w:ascii="Times New Roman" w:cs="Times New Roman" w:eastAsia="Times New Roman" w:hAnsi="Times New Roman"/>
-          <w:sz w:val="24"/>
-          <w:szCs w:val="24"/>
-          <w:rtl/>
-        </w:rPr>
-        <w:t xml:space="preserve"> (رواه مسلم)</w:t>
+        <w:t xml:space="preserve">اللهم صلِّ على محمد وعلى آل محمد، كما صليت على إبراهيم وعلى آل إبراهيم، إنك حميد مجيد. اللهم بارك على محمد وعلى آل محمد، كما باركت على إبراهيم وعلى آل إبراهيم، إنك حميد مجيد </w:t>
+      </w:r>
+      <w:r>
+        <w:rPr>
+          <w:rFonts w:ascii="Times New Roman" w:cs="Times New Roman" w:eastAsia="Times New Roman" w:hAnsi="Times New Roman"/>
+          <w:b/>
+          <w:bCs/>
+          <w:color w:val="3B5BA5"/>
+          <w:sz w:val="24"/>
+          <w:szCs w:val="24"/>
+          <w:rtl/>
+        </w:rPr>
+        <w:t xml:space="preserve">(10 مرات)</w:t>
+      </w:r>
+      <w:r>
+        <w:rPr>
+          <w:rFonts w:ascii="Times New Roman" w:cs="Times New Roman" w:eastAsia="Times New Roman" w:hAnsi="Times New Roman"/>
+          <w:sz w:val="24"/>
+          <w:szCs w:val="24"/>
+          <w:rtl/>
+        </w:rPr>
+        <w:t xml:space="preserve"> (رواه البخاري)</w:t>
       </w:r>
     </w:p>
     <w:p>
@@ -1285,28 +1327,7 @@
           <w:szCs w:val="24"/>
           <w:rtl/>
         </w:rPr>
-        <w:t xml:space="preserve">سبحان الله والحمد لله ولا إله إلا الله والله أكبر </w:t>
-      </w:r>
-      <w:r>
-        <w:rPr>
-          <w:rFonts w:ascii="Times New Roman" w:cs="Times New Roman" w:eastAsia="Times New Roman" w:hAnsi="Times New Roman"/>
-          <w:b/>
-          <w:bCs/>
-          <w:color w:val="3B5BA5"/>
-          <w:sz w:val="24"/>
-          <w:szCs w:val="24"/>
-          <w:rtl/>
-        </w:rPr>
-        <w:t xml:space="preserve">(100 مرة)</w:t>
-      </w:r>
-      <w:r>
-        <w:rPr>
-          <w:rFonts w:ascii="Times New Roman" w:cs="Times New Roman" w:eastAsia="Times New Roman" w:hAnsi="Times New Roman"/>
-          <w:sz w:val="24"/>
-          <w:szCs w:val="24"/>
-          <w:rtl/>
-        </w:rPr>
-        <w:t xml:space="preserve"> (رواه الترمذي بسند صحيح)</w:t>
+        <w:t xml:space="preserve">اللهم إني أصبحت أُشهدك، وأُشهد حملة عرشك، وملائكتك، وجميع خلقك، أنك أنت الله لا إله إلا أنت وحدك لا شريك لك، وأن محمدًا عبدك ورسولك، اللهم أنت ربي لا إله إلا أنت، توكلت عليك وأنت رب العرش العظيم، ما شاء الله كان وما لم يشأ لم يكن، ولا حول ولا قوة إلا بالله العلي العظيم، أعلم أن الله على كل شيء قدير، وأن الله قد أحاط بكل شيء علمًا، اللهم إني أعوذ بك من شر نفسي ومن شر كل دابة أنت آخذ بناصيتها، إن ربي على صراط مستقيم (رواه البيهقي ورجاله ثقات)</w:t>
       </w:r>
     </w:p>
     <w:p>
@@ -1340,28 +1361,7 @@
           <w:szCs w:val="24"/>
           <w:rtl/>
         </w:rPr>
-        <w:t xml:space="preserve">اللهم صلِّ على محمد وعلى آل محمد، كما صليت على إبراهيم وعلى آل إبراهيم، إنك حميد مجيد. اللهم بارك على محمد وعلى آل محمد، كما باركت على إبراهيم وعلى آل إبراهيم، إنك حميد مجيد </w:t>
-      </w:r>
-      <w:r>
-        <w:rPr>
-          <w:rFonts w:ascii="Times New Roman" w:cs="Times New Roman" w:eastAsia="Times New Roman" w:hAnsi="Times New Roman"/>
-          <w:b/>
-          <w:bCs/>
-          <w:color w:val="3B5BA5"/>
-          <w:sz w:val="24"/>
-          <w:szCs w:val="24"/>
-          <w:rtl/>
-        </w:rPr>
-        <w:t xml:space="preserve">(10 مرات)</w:t>
-      </w:r>
-      <w:r>
-        <w:rPr>
-          <w:rFonts w:ascii="Times New Roman" w:cs="Times New Roman" w:eastAsia="Times New Roman" w:hAnsi="Times New Roman"/>
-          <w:sz w:val="24"/>
-          <w:szCs w:val="24"/>
-          <w:rtl/>
-        </w:rPr>
-        <w:t xml:space="preserve"> (رواه البخاري)</w:t>
+        <w:t xml:space="preserve">دعاء النبي اليومي: اللهم إني أسألك علمًا نافعًا، ورزقًا طيبًا، وعملًا متقبلًا</w:t>
       </w:r>
     </w:p>
     <w:p>
@@ -1395,7 +1395,7 @@
           <w:szCs w:val="24"/>
           <w:rtl/>
         </w:rPr>
-        <w:t xml:space="preserve">اللهم إني أصبحت أُشهدك، وأُشهد حملة عرشك، وملائكتك، وجميع خلقك، أنك أنت الله لا إله إلا أنت وحدك لا شريك لك، وأن محمدًا عبدك ورسولك، اللهم أنت ربي لا إله إلا أنت، توكلت عليك وأنت رب العرش العظيم، ما شاء الله كان وما لم يشأ لم يكن، ولا حول ولا قوة إلا بالله العلي العظيم، أعلم أن الله على كل شيء قدير، وأن الله قد أحاط بكل شيء علمًا، اللهم إني أعوذ بك من شر نفسي ومن شر كل دابة أنت آخذ بناصيتها، إن ربي على صراط مستقيم (رواه البيهقي ورجاله ثقات)</w:t>
+        <w:t xml:space="preserve">طلب خير اليوم: اللهم إني أسألك خير هذا اليوم فتحه، ونصره، ونوره، وبركته، وهداه، وأعوذ بك من شر ما فيه وشر ما بعده</w:t>
       </w:r>
     </w:p>
     <w:p>
@@ -1429,7 +1429,7 @@
           <w:szCs w:val="24"/>
           <w:rtl/>
         </w:rPr>
-        <w:t xml:space="preserve">دعاء النبي اليومي: اللهم إني أسألك علمًا نافعًا، ورزقًا طيبًا، وعملًا متقبلًا</w:t>
+        <w:t xml:space="preserve">طلب التيسير: اللهم رب السماوات السبع، ورب العرش العظيم، اقضِ عنا الدين وأغننا من الفقر</w:t>
       </w:r>
     </w:p>
     <w:p>
@@ -1463,7 +1463,7 @@
           <w:szCs w:val="24"/>
           <w:rtl/>
         </w:rPr>
-        <w:t xml:space="preserve">طلب خير اليوم: اللهم إني أسألك خير هذا اليوم فتحه، ونصره، ونوره، وبركته، وهداه، وأعوذ بك من شر ما فيه وشر ما بعده</w:t>
+        <w:t xml:space="preserve">طلب الهداية والسداد: اللهم إني أسألك الهدى والسداد، وتيسير الأمور كلها</w:t>
       </w:r>
     </w:p>
     <w:p>
@@ -1497,7 +1497,7 @@
           <w:szCs w:val="24"/>
           <w:rtl/>
         </w:rPr>
-        <w:t xml:space="preserve">طلب التيسير: اللهم رب السماوات السبع، ورب العرش العظيم، اقضِ عنا الدين وأغننا من الفقر</w:t>
+        <w:t xml:space="preserve">الدعاء المستجاب بين الصبح والفجر: يا رب، إن لم أُحسن في دعائي فأنت أعلم بحاجاتي، وإن قصرت غاياتي فأنت سبحانك تعلم غاياتي، ولا يخفى عليك شيء من أحوالي، فأجبر خاطري بفيض نعمك. اللهم أعطنا خير ما تعطي السائلين، واجمع لنا صلاح الدنيا والدين، اللهم اذهب عنا الحزن وأزل عنا الهم، واطرد من نفوسنا القلق، اللهم زدنا نورًا في القلب وضياءً في الوجه، اللهم آمين يا رب العالمين</w:t>
       </w:r>
     </w:p>
     <w:p>
@@ -1531,7 +1531,70 @@
           <w:szCs w:val="24"/>
           <w:rtl/>
         </w:rPr>
-        <w:t xml:space="preserve">طلب الهداية والسداد: اللهم إني أسألك الهدى والسداد، وتيسير الأمور كلها</w:t>
+        <w:t xml:space="preserve">الفاتحة لحضرة النبي صلى الله عليه وسلم، ثم تُقرأ صلاة الفاتح مرة واحدة: «اللهم صلِّ على سيدنا محمد الفاتح لما أُغلق، والخاتم لما سبق، ناصر الحق بالحق، والهادي إلى صراطك المستقيم، وعلى آله وصحبه حق قدره ومقداره العظيم»، ثم يُقرأ قوله تعالى: </w:t>
+      </w:r>
+      <w:r>
+        <w:rPr>
+          <w:rFonts w:ascii="Times New Roman" w:cs="Times New Roman" w:eastAsia="Times New Roman" w:hAnsi="Times New Roman"/>
+          <w:b/>
+          <w:bCs/>
+          <w:color w:val="B23A2E"/>
+          <w:sz w:val="24"/>
+          <w:szCs w:val="24"/>
+          <w:rtl/>
+        </w:rPr>
+        <w:t xml:space="preserve">﴿وَجَعَلْنَا مِن بَيْنِ أَيْدِيهِمْ سَدًّا وَمِنْ خَلْفِهِمْ سَدًّا فَأَغْشَيْنَاهُمْ فَهُمْ لَا يُبْصِرُونَ﴾</w:t>
+      </w:r>
+      <w:r>
+        <w:rPr>
+          <w:rFonts w:ascii="Times New Roman" w:cs="Times New Roman" w:eastAsia="Times New Roman" w:hAnsi="Times New Roman"/>
+          <w:sz w:val="24"/>
+          <w:szCs w:val="24"/>
+          <w:rtl/>
+        </w:rPr>
+        <w:t xml:space="preserve">، ثم يُقال: «اللهم بحق هذه الآية أن تجعل بيني وبين هؤلاء غشاوة، كما جعلتها بين نبيك محمد وبين أعدائه»، </w:t>
+      </w:r>
+      <w:r>
+        <w:rPr>
+          <w:rFonts w:ascii="Times New Roman" w:cs="Times New Roman" w:eastAsia="Times New Roman" w:hAnsi="Times New Roman"/>
+          <w:b/>
+          <w:bCs/>
+          <w:color w:val="B23A2E"/>
+          <w:sz w:val="24"/>
+          <w:szCs w:val="24"/>
+          <w:rtl/>
+        </w:rPr>
+        <w:t xml:space="preserve">﴿كهيعص﴾</w:t>
+      </w:r>
+      <w:r>
+        <w:rPr>
+          <w:rFonts w:ascii="Times New Roman" w:cs="Times New Roman" w:eastAsia="Times New Roman" w:hAnsi="Times New Roman"/>
+          <w:sz w:val="24"/>
+          <w:szCs w:val="24"/>
+          <w:rtl/>
+        </w:rPr>
+        <w:t xml:space="preserve"> (حُميت)، </w:t>
+      </w:r>
+      <w:r>
+        <w:rPr>
+          <w:rFonts w:ascii="Times New Roman" w:cs="Times New Roman" w:eastAsia="Times New Roman" w:hAnsi="Times New Roman"/>
+          <w:b/>
+          <w:bCs/>
+          <w:color w:val="B23A2E"/>
+          <w:sz w:val="24"/>
+          <w:szCs w:val="24"/>
+          <w:rtl/>
+        </w:rPr>
+        <w:t xml:space="preserve">﴿حم عسق﴾</w:t>
+      </w:r>
+      <w:r>
+        <w:rPr>
+          <w:rFonts w:ascii="Times New Roman" w:cs="Times New Roman" w:eastAsia="Times New Roman" w:hAnsi="Times New Roman"/>
+          <w:sz w:val="24"/>
+          <w:szCs w:val="24"/>
+          <w:rtl/>
+        </w:rPr>
+        <w:t xml:space="preserve"> (كُفيت)</w:t>
       </w:r>
     </w:p>
     <w:p>
@@ -1565,7 +1628,19 @@
           <w:szCs w:val="24"/>
           <w:rtl/>
         </w:rPr>
-        <w:t xml:space="preserve">الدعاء المستجاب بين الصبح والفجر: يا رب، إن لم أُحسن في دعائي فأنت أعلم بحاجاتي، وإن قصرت غاياتي فأنت سبحانك تعلم غاياتي، ولا يخفى عليك شيء من أحوالي، فأجبر خاطري بفيض نعمك. اللهم أعطنا خير ما تعطي السائلين، واجمع لنا صلاح الدنيا والدين، اللهم اذهب عنا الحزن وأزل عنا الهم، واطرد من نفوسنا القلق، اللهم زدنا نورًا في القلب وضياءً في الوجه، اللهم آمين يا رب العالمين</w:t>
+        <w:t xml:space="preserve">بسم الله الرحمن الرحيم، الحمد لله رب العالمين، وصلى الله على سيدنا محمد وآله وصحبه وسلم. اللهم إنك سلّطت علينا عدوًا بصيرًا بعيوبنا، مطّلعًا على عوراتنا، يرانا هو وقبيله من حيث لا نراهم، اللهم فأيْئسه منا كما أيّسته من رحمتك، وقنّطه منا كما قنّطته من عفوك، وباعد بيننا وبينه كما باعدت بينه وبين جنتك، إنك على كل شيء قدير </w:t>
+      </w:r>
+      <w:r>
+        <w:rPr>
+          <w:rFonts w:ascii="Times New Roman" w:cs="Times New Roman" w:eastAsia="Times New Roman" w:hAnsi="Times New Roman"/>
+          <w:b/>
+          <w:bCs/>
+          <w:color w:val="3B5BA5"/>
+          <w:sz w:val="24"/>
+          <w:szCs w:val="24"/>
+          <w:rtl/>
+        </w:rPr>
+        <w:t xml:space="preserve">(3 مرات)</w:t>
       </w:r>
     </w:p>
     <w:p>
@@ -1584,149 +1659,6 @@
           <w:rtl/>
         </w:rPr>
         <w:t xml:space="preserve">الدعاء الثالث والثلاثون</w:t>
-      </w:r>
-    </w:p>
-    <w:p>
-      <w:pPr>
-        <w:bidi/>
-        <w:spacing w:after="200" w:line="340"/>
-        <w:jc w:val="right"/>
-      </w:pPr>
-      <w:r>
-        <w:rPr>
-          <w:rFonts w:ascii="Times New Roman" w:cs="Times New Roman" w:eastAsia="Times New Roman" w:hAnsi="Times New Roman"/>
-          <w:sz w:val="24"/>
-          <w:szCs w:val="24"/>
-          <w:rtl/>
-        </w:rPr>
-        <w:t xml:space="preserve">الفاتحة لحضرة النبي صلى الله عليه وسلم، ثم تُقرأ صلاة الفاتح مرة واحدة: «اللهم صلِّ على سيدنا محمد الفاتح لما أُغلق، والخاتم لما سبق، ناصر الحق بالحق، والهادي إلى صراطك المستقيم، وعلى آله وصحبه حق قدره ومقداره العظيم»، ثم يُقرأ قوله تعالى: </w:t>
-      </w:r>
-      <w:r>
-        <w:rPr>
-          <w:rFonts w:ascii="Times New Roman" w:cs="Times New Roman" w:eastAsia="Times New Roman" w:hAnsi="Times New Roman"/>
-          <w:b/>
-          <w:bCs/>
-          <w:color w:val="B23A2E"/>
-          <w:sz w:val="24"/>
-          <w:szCs w:val="24"/>
-          <w:rtl/>
-        </w:rPr>
-        <w:t xml:space="preserve">﴿وَجَعَلْنَا مِن بَيْنِ أَيْدِيهِمْ سَدًّا وَمِنْ خَلْفِهِمْ سَدًّا فَأَغْشَيْنَاهُمْ فَهُمْ لَا يُبْصِرُونَ﴾</w:t>
-      </w:r>
-      <w:r>
-        <w:rPr>
-          <w:rFonts w:ascii="Times New Roman" w:cs="Times New Roman" w:eastAsia="Times New Roman" w:hAnsi="Times New Roman"/>
-          <w:sz w:val="24"/>
-          <w:szCs w:val="24"/>
-          <w:rtl/>
-        </w:rPr>
-        <w:t xml:space="preserve">، ثم يُقال: «اللهم بحق هذه الآية أن تجعل بيني وبين هؤلاء غشاوة، كما جعلتها بين نبيك محمد وبين أعدائه»، </w:t>
-      </w:r>
-      <w:r>
-        <w:rPr>
-          <w:rFonts w:ascii="Times New Roman" w:cs="Times New Roman" w:eastAsia="Times New Roman" w:hAnsi="Times New Roman"/>
-          <w:b/>
-          <w:bCs/>
-          <w:color w:val="B23A2E"/>
-          <w:sz w:val="24"/>
-          <w:szCs w:val="24"/>
-          <w:rtl/>
-        </w:rPr>
-        <w:t xml:space="preserve">﴿كهيعص﴾</w:t>
-      </w:r>
-      <w:r>
-        <w:rPr>
-          <w:rFonts w:ascii="Times New Roman" w:cs="Times New Roman" w:eastAsia="Times New Roman" w:hAnsi="Times New Roman"/>
-          <w:sz w:val="24"/>
-          <w:szCs w:val="24"/>
-          <w:rtl/>
-        </w:rPr>
-        <w:t xml:space="preserve"> (حُميت)، </w:t>
-      </w:r>
-      <w:r>
-        <w:rPr>
-          <w:rFonts w:ascii="Times New Roman" w:cs="Times New Roman" w:eastAsia="Times New Roman" w:hAnsi="Times New Roman"/>
-          <w:b/>
-          <w:bCs/>
-          <w:color w:val="B23A2E"/>
-          <w:sz w:val="24"/>
-          <w:szCs w:val="24"/>
-          <w:rtl/>
-        </w:rPr>
-        <w:t xml:space="preserve">﴿حم عسق﴾</w:t>
-      </w:r>
-      <w:r>
-        <w:rPr>
-          <w:rFonts w:ascii="Times New Roman" w:cs="Times New Roman" w:eastAsia="Times New Roman" w:hAnsi="Times New Roman"/>
-          <w:sz w:val="24"/>
-          <w:szCs w:val="24"/>
-          <w:rtl/>
-        </w:rPr>
-        <w:t xml:space="preserve"> (كُفيت)</w:t>
-      </w:r>
-    </w:p>
-    <w:p>
-      <w:pPr>
-        <w:bidi/>
-        <w:spacing w:after="120" w:before="320"/>
-        <w:jc w:val="right"/>
-      </w:pPr>
-      <w:r>
-        <w:rPr>
-          <w:rFonts w:ascii="Times New Roman" w:cs="Times New Roman" w:eastAsia="Times New Roman" w:hAnsi="Times New Roman"/>
-          <w:b/>
-          <w:bCs/>
-          <w:sz w:val="44"/>
-          <w:szCs w:val="44"/>
-          <w:rtl/>
-        </w:rPr>
-        <w:t xml:space="preserve">الدعاء الرابع والثلاثون</w:t>
-      </w:r>
-    </w:p>
-    <w:p>
-      <w:pPr>
-        <w:bidi/>
-        <w:spacing w:after="200" w:line="340"/>
-        <w:jc w:val="right"/>
-      </w:pPr>
-      <w:r>
-        <w:rPr>
-          <w:rFonts w:ascii="Times New Roman" w:cs="Times New Roman" w:eastAsia="Times New Roman" w:hAnsi="Times New Roman"/>
-          <w:sz w:val="24"/>
-          <w:szCs w:val="24"/>
-          <w:rtl/>
-        </w:rPr>
-        <w:t xml:space="preserve">بسم الله الرحمن الرحيم، الحمد لله رب العالمين، وصلى الله على سيدنا محمد وآله وصحبه وسلم. اللهم إنك سلّطت علينا عدوًا بصيرًا بعيوبنا، مطّلعًا على عوراتنا، يرانا هو وقبيله من حيث لا نراهم، اللهم فأيْئسه منا كما أيّسته من رحمتك، وقنّطه منا كما قنّطته من عفوك، وباعد بيننا وبينه كما باعدت بينه وبين جنتك، إنك على كل شيء قدير </w:t>
-      </w:r>
-      <w:r>
-        <w:rPr>
-          <w:rFonts w:ascii="Times New Roman" w:cs="Times New Roman" w:eastAsia="Times New Roman" w:hAnsi="Times New Roman"/>
-          <w:b/>
-          <w:bCs/>
-          <w:color w:val="3B5BA5"/>
-          <w:sz w:val="24"/>
-          <w:szCs w:val="24"/>
-          <w:rtl/>
-        </w:rPr>
-        <w:t xml:space="preserve">(3 مرات)</w:t>
-      </w:r>
-    </w:p>
-    <w:p>
-      <w:pPr>
-        <w:bidi/>
-        <w:spacing w:after="120" w:before="320"/>
-        <w:jc w:val="right"/>
-      </w:pPr>
-      <w:r>
-        <w:rPr>
-          <w:rFonts w:ascii="Times New Roman" w:cs="Times New Roman" w:eastAsia="Times New Roman" w:hAnsi="Times New Roman"/>
-          <w:b/>
-          <w:bCs/>
-          <w:sz w:val="44"/>
-          <w:szCs w:val="44"/>
-          <w:rtl/>
-        </w:rPr>
-        <w:t xml:space="preserve">الدعاء الخامس والثلاثون</w:t>
       </w:r>
     </w:p>
     <w:p>

</xml_diff>

<commit_message>
Add (7 مرات) repeat count to Category 1 dua 30
Co-Authored-By: Claude Sonnet 5 <noreply@anthropic.com>
Claude-Session: https://claude.ai/code/session_015v8MN6VZjbnhmn7ju2JYhZ
</commit_message>
<xml_diff>
--- a/خزانة الأدعية.docx
+++ b/خزانة الأدعية.docx
@@ -1497,7 +1497,19 @@
           <w:szCs w:val="24"/>
           <w:rtl/>
         </w:rPr>
-        <w:t xml:space="preserve">رب هب لي من لدنك ما اشتهي وما أريد، فالله أكرم من يُعطي، وأكرم مِن أن لا يستجيب</w:t>
+        <w:t xml:space="preserve">رب هب لي من لدنك ما اشتهي وما أريد، فالله أكرم من يُعطي، وأكرم مِن أن لا يستجيب </w:t>
+      </w:r>
+      <w:r>
+        <w:rPr>
+          <w:rFonts w:ascii="Times New Roman" w:cs="Times New Roman" w:eastAsia="Times New Roman" w:hAnsi="Times New Roman"/>
+          <w:b/>
+          <w:bCs/>
+          <w:color w:val="3B5BA5"/>
+          <w:sz w:val="24"/>
+          <w:szCs w:val="24"/>
+          <w:rtl/>
+        </w:rPr>
+        <w:t xml:space="preserve">(7 مرات)</w:t>
       </w:r>
     </w:p>
     <w:p>

</xml_diff>

<commit_message>
Add anxiety/fear-relief dua ("وليغلبن لطفه خوفي...") to Category 4
Co-Authored-By: Claude Sonnet 5 <noreply@anthropic.com>
Claude-Session: https://claude.ai/code/session_015v8MN6VZjbnhmn7ju2JYhZ
</commit_message>
<xml_diff>
--- a/خزانة الأدعية.docx
+++ b/خزانة الأدعية.docx
@@ -6813,6 +6813,40 @@
           <w:rtl/>
         </w:rPr>
         <w:t xml:space="preserve">. ثم: «اللهم إني أفوّض أمري إليك، فانتقم لي ممن ظلمني، واجعله في كفايتك، إنك على كل شيء قدير». ثم: «اللهم يا جبار يا قهار يا منتقم، إني أسلّم أمري إليك، فخذ حقي من ظالمي، وأرني فيه عجائب قدرتك، واجعله عبرة لكل من يفكر في ظلمي، واهزمه هزيمة تكون فيها آية لعبادك، يا ذا البطش الشديد، يا قويّ يا عزيز، حسبي الله ونعم الوكيل». ثم: «اللهم إني أجعلك في نحورهم ونعوذ بك من شرورهم»</w:t>
+      </w:r>
+    </w:p>
+    <w:p>
+      <w:pPr>
+        <w:bidi/>
+        <w:spacing w:after="120" w:before="320"/>
+        <w:jc w:val="right"/>
+      </w:pPr>
+      <w:r>
+        <w:rPr>
+          <w:rFonts w:ascii="Times New Roman" w:cs="Times New Roman" w:eastAsia="Times New Roman" w:hAnsi="Times New Roman"/>
+          <w:b/>
+          <w:bCs/>
+          <w:sz w:val="44"/>
+          <w:szCs w:val="44"/>
+          <w:rtl/>
+        </w:rPr>
+        <w:t xml:space="preserve">الدعاء الخامس والثلاثون</w:t>
+      </w:r>
+    </w:p>
+    <w:p>
+      <w:pPr>
+        <w:bidi/>
+        <w:spacing w:after="200" w:line="340"/>
+        <w:jc w:val="right"/>
+      </w:pPr>
+      <w:r>
+        <w:rPr>
+          <w:rFonts w:ascii="Times New Roman" w:cs="Times New Roman" w:eastAsia="Times New Roman" w:hAnsi="Times New Roman"/>
+          <w:sz w:val="24"/>
+          <w:szCs w:val="24"/>
+          <w:rtl/>
+        </w:rPr>
+        <w:t xml:space="preserve">إذا كنت قلقًا أو خائفًا من أي حاجة، ردد هذا الدعاء: وليغلبن لطفه خوفي، وليغلبن قدره سوء ظني، لا إله إلا أنت، نعم الرب أنت وبئس العبد أنا، وإذا اللطيف أراد شيئًا قال له كن فيكون مهما كان محال، يا لطيف عبدك ضعيف</w:t>
       </w:r>
     </w:p>
     <w:p>

</xml_diff>